<commit_message>
updates about pdfconverterservice.cs page for using the word updated format
</commit_message>
<xml_diff>
--- a/QuotationApp.API/Templates/QuotationTemplate_Updated - Copy.docx
+++ b/QuotationApp.API/Templates/QuotationTemplate_Updated - Copy.docx
@@ -39,27 +39,7 @@
           <w:sz w:val="22"/>
           <w:szCs w:val="22"/>
         </w:rPr>
-        <w:t xml:space="preserve"> - {{</w:t>
-      </w:r>
-      <w:proofErr w:type="spellStart"/>
-      <w:r>
-        <w:rPr>
-          <w:rFonts w:ascii="Times New Roman" w:hAnsi="Times New Roman" w:cs="Times New Roman"/>
-          <w:color w:val="000000" w:themeColor="text1"/>
-          <w:sz w:val="22"/>
-          <w:szCs w:val="22"/>
-        </w:rPr>
-        <w:t>OrganizationName</w:t>
-      </w:r>
-      <w:proofErr w:type="spellEnd"/>
-      <w:r>
-        <w:rPr>
-          <w:rFonts w:ascii="Times New Roman" w:hAnsi="Times New Roman" w:cs="Times New Roman"/>
-          <w:color w:val="000000" w:themeColor="text1"/>
-          <w:sz w:val="22"/>
-          <w:szCs w:val="22"/>
-        </w:rPr>
-        <w:t>}}</w:t>
+        <w:t xml:space="preserve"> - {{OrganizationName}}</w:t>
       </w:r>
     </w:p>
     <w:p>
@@ -79,7 +59,16 @@
           <w:sz w:val="18"/>
           <w:szCs w:val="18"/>
         </w:rPr>
-        <w:t>Name: {{CONTACT_NAME}}</w:t>
+        <w:t xml:space="preserve">Name: </w:t>
+      </w:r>
+      <w:r>
+        <w:rPr>
+          <w:rFonts w:ascii="Times New Roman" w:hAnsi="Times New Roman" w:cs="Times New Roman"/>
+          <w:color w:val="65AADB"/>
+          <w:sz w:val="18"/>
+          <w:szCs w:val="18"/>
+        </w:rPr>
+        <w:t>{{CONTACT_NAME}}</w:t>
       </w:r>
       <w:r>
         <w:rPr>
@@ -167,31 +156,11 @@
       <w:r>
         <w:rPr>
           <w:rFonts w:ascii="Times New Roman" w:hAnsi="Times New Roman" w:cs="Times New Roman"/>
-          <w:color w:val="000000" w:themeColor="text1"/>
+          <w:color w:val="65AADB"/>
           <w:sz w:val="18"/>
           <w:szCs w:val="18"/>
         </w:rPr>
-        <w:t>{{</w:t>
-      </w:r>
-      <w:proofErr w:type="spellStart"/>
-      <w:r>
-        <w:rPr>
-          <w:rFonts w:ascii="Times New Roman" w:hAnsi="Times New Roman" w:cs="Times New Roman"/>
-          <w:color w:val="000000" w:themeColor="text1"/>
-          <w:sz w:val="18"/>
-          <w:szCs w:val="18"/>
-        </w:rPr>
-        <w:t>QuotationNo</w:t>
-      </w:r>
-      <w:proofErr w:type="spellEnd"/>
-      <w:r>
-        <w:rPr>
-          <w:rFonts w:ascii="Times New Roman" w:hAnsi="Times New Roman" w:cs="Times New Roman"/>
-          <w:color w:val="000000" w:themeColor="text1"/>
-          <w:sz w:val="18"/>
-          <w:szCs w:val="18"/>
-        </w:rPr>
-        <w:t>}}</w:t>
+        <w:t>{{QuotationNo}}</w:t>
       </w:r>
     </w:p>
     <w:p>
@@ -329,7 +298,7 @@
       <w:r>
         <w:rPr>
           <w:rFonts w:ascii="Times New Roman" w:hAnsi="Times New Roman" w:cs="Times New Roman"/>
-          <w:color w:val="000000" w:themeColor="text1"/>
+          <w:color w:val="65AADB"/>
           <w:sz w:val="18"/>
           <w:szCs w:val="18"/>
         </w:rPr>
@@ -339,7 +308,7 @@
       <w:r>
         <w:rPr>
           <w:rFonts w:ascii="Times New Roman" w:hAnsi="Times New Roman" w:cs="Times New Roman"/>
-          <w:color w:val="000000" w:themeColor="text1"/>
+          <w:color w:val="65AADB"/>
           <w:sz w:val="18"/>
           <w:szCs w:val="18"/>
         </w:rPr>
@@ -351,7 +320,7 @@
         <w:spacing w:after="120" w:line="240" w:lineRule="auto"/>
         <w:rPr>
           <w:rFonts w:ascii="Times New Roman" w:hAnsi="Times New Roman" w:cs="Times New Roman"/>
-          <w:color w:val="000000" w:themeColor="text1"/>
+          <w:color w:val="65AADB"/>
           <w:sz w:val="18"/>
           <w:szCs w:val="18"/>
         </w:rPr>
@@ -363,29 +332,28 @@
           <w:sz w:val="18"/>
           <w:szCs w:val="18"/>
         </w:rPr>
-        <w:t>Address: {{CONTACT_ADDRESS}}</w:t>
-      </w:r>
-    </w:p>
-    <w:p>
-      <w:pPr>
-        <w:spacing w:after="200" w:line="240" w:lineRule="auto"/>
-        <w:rPr>
-          <w:rFonts w:ascii="Times New Roman" w:hAnsi="Times New Roman" w:cs="Times New Roman"/>
-          <w:color w:val="000000" w:themeColor="text1"/>
+        <w:t xml:space="preserve">Address: </w:t>
+      </w:r>
+      <w:r>
+        <w:rPr>
+          <w:rFonts w:ascii="Times New Roman" w:hAnsi="Times New Roman" w:cs="Times New Roman"/>
+          <w:color w:val="65AADB"/>
           <w:sz w:val="18"/>
           <w:szCs w:val="18"/>
         </w:rPr>
-      </w:pPr>
-      <w:r>
+        <w:t>{{CONTACT_ADDRESS}}</w:t>
+      </w:r>
+    </w:p>
+    <w:p>
+      <w:pPr>
+        <w:spacing w:after="200" w:line="240" w:lineRule="auto"/>
         <w:rPr>
           <w:rFonts w:ascii="Times New Roman" w:hAnsi="Times New Roman" w:cs="Times New Roman"/>
           <w:color w:val="000000" w:themeColor="text1"/>
           <w:sz w:val="18"/>
           <w:szCs w:val="18"/>
         </w:rPr>
-        <w:t>Contact No.: {{CONTACT_PHONE</w:t>
-      </w:r>
-      <w:proofErr w:type="gramStart"/>
+      </w:pPr>
       <w:r>
         <w:rPr>
           <w:rFonts w:ascii="Times New Roman" w:hAnsi="Times New Roman" w:cs="Times New Roman"/>
@@ -393,17 +361,45 @@
           <w:sz w:val="18"/>
           <w:szCs w:val="18"/>
         </w:rPr>
-        <w:t xml:space="preserve">}}   </w:t>
-      </w:r>
-      <w:proofErr w:type="gramEnd"/>
-      <w:r>
-        <w:rPr>
-          <w:rFonts w:ascii="Times New Roman" w:hAnsi="Times New Roman" w:cs="Times New Roman"/>
-          <w:color w:val="000000" w:themeColor="text1"/>
+        <w:t xml:space="preserve">Contact No.: </w:t>
+      </w:r>
+      <w:r>
+        <w:rPr>
+          <w:rFonts w:ascii="Times New Roman" w:hAnsi="Times New Roman" w:cs="Times New Roman"/>
+          <w:color w:val="65AADB"/>
           <w:sz w:val="18"/>
           <w:szCs w:val="18"/>
         </w:rPr>
-        <w:t>|   Email: {{CONTACT_EMAIL}}</w:t>
+        <w:t>{{CONTACT_PHONE</w:t>
+      </w:r>
+      <w:proofErr w:type="gramStart"/>
+      <w:r>
+        <w:rPr>
+          <w:rFonts w:ascii="Times New Roman" w:hAnsi="Times New Roman" w:cs="Times New Roman"/>
+          <w:color w:val="65AADB"/>
+          <w:sz w:val="18"/>
+          <w:szCs w:val="18"/>
+        </w:rPr>
+        <w:t xml:space="preserve">}}   </w:t>
+      </w:r>
+      <w:proofErr w:type="gramEnd"/>
+      <w:r>
+        <w:rPr>
+          <w:rFonts w:ascii="Times New Roman" w:hAnsi="Times New Roman" w:cs="Times New Roman"/>
+          <w:color w:val="000000" w:themeColor="text1"/>
+          <w:sz w:val="18"/>
+          <w:szCs w:val="18"/>
+        </w:rPr>
+        <w:t xml:space="preserve">|   Email: </w:t>
+      </w:r>
+      <w:r>
+        <w:rPr>
+          <w:rFonts w:ascii="Times New Roman" w:hAnsi="Times New Roman" w:cs="Times New Roman"/>
+          <w:color w:val="65AADB"/>
+          <w:sz w:val="18"/>
+          <w:szCs w:val="18"/>
+        </w:rPr>
+        <w:t>{{CONTACT_EMAIL}}</w:t>
       </w:r>
     </w:p>
     <w:p>
@@ -455,16 +451,23 @@
           <w:rFonts w:ascii="Times New Roman" w:hAnsi="Times New Roman" w:cs="Times New Roman"/>
           <w:b/>
           <w:bCs/>
-          <w:color w:val="000000" w:themeColor="text1"/>
+          <w:color w:val="65AADB"/>
         </w:rPr>
         <w:t>{{MODULE_LIST}}</w:t>
       </w:r>
       <w:r>
         <w:rPr>
           <w:rFonts w:ascii="Times New Roman" w:hAnsi="Times New Roman" w:cs="Times New Roman"/>
-          <w:color w:val="000000" w:themeColor="text1"/>
-        </w:rPr>
-        <w:t xml:space="preserve"> in your organization.</w:t>
+          <w:color w:val="65AADB"/>
+        </w:rPr>
+        <w:t xml:space="preserve"> </w:t>
+      </w:r>
+      <w:r>
+        <w:rPr>
+          <w:rFonts w:ascii="Times New Roman" w:hAnsi="Times New Roman" w:cs="Times New Roman"/>
+          <w:color w:val="000000" w:themeColor="text1"/>
+        </w:rPr>
+        <w:t>in your organization.</w:t>
       </w:r>
     </w:p>
     <w:p>
@@ -503,14 +506,14 @@
           <w:rFonts w:ascii="Times New Roman" w:hAnsi="Times New Roman" w:cs="Times New Roman"/>
           <w:b/>
           <w:bCs/>
-          <w:color w:val="000000" w:themeColor="text1"/>
+          <w:color w:val="65AADB"/>
         </w:rPr>
         <w:t>{{MODULE_LIST}}</w:t>
       </w:r>
       <w:r>
         <w:rPr>
           <w:rFonts w:ascii="Times New Roman" w:hAnsi="Times New Roman" w:cs="Times New Roman"/>
-          <w:color w:val="000000" w:themeColor="text1"/>
+          <w:color w:val="65AADB"/>
         </w:rPr>
         <w:t>.</w:t>
       </w:r>
@@ -585,7 +588,7 @@
           <w:rFonts w:ascii="Times New Roman" w:hAnsi="Times New Roman" w:cs="Times New Roman"/>
           <w:b/>
           <w:bCs/>
-          <w:color w:val="000000" w:themeColor="text1"/>
+          <w:color w:val="65AADB"/>
         </w:rPr>
         <w:t>{{ORG_</w:t>
       </w:r>
@@ -595,14 +598,14 @@
           <w:rFonts w:ascii="Times New Roman" w:hAnsi="Times New Roman" w:cs="Times New Roman"/>
           <w:b/>
           <w:bCs/>
-          <w:color w:val="000000" w:themeColor="text1"/>
+          <w:color w:val="65AADB"/>
         </w:rPr>
         <w:t>NAME}}</w:t>
       </w:r>
       <w:r>
         <w:rPr>
           <w:rFonts w:ascii="Times New Roman" w:hAnsi="Times New Roman" w:cs="Times New Roman"/>
-          <w:color w:val="000000" w:themeColor="text1"/>
+          <w:color w:val="65AADB"/>
         </w:rPr>
         <w:t>.</w:t>
       </w:r>
@@ -682,8 +685,15 @@
       <w:r>
         <w:rPr>
           <w:rFonts w:ascii="Times New Roman" w:hAnsi="Times New Roman" w:cs="Times New Roman"/>
-        </w:rPr>
-        <w:t xml:space="preserve"> replaces manual documentation, significantly accelerates approval process with centralized data management and improved traceability, reduced and lower administrative interfaces.</w:t>
+          <w:color w:val="65AADB"/>
+        </w:rPr>
+        <w:t xml:space="preserve"> </w:t>
+      </w:r>
+      <w:r>
+        <w:rPr>
+          <w:rFonts w:ascii="Times New Roman" w:hAnsi="Times New Roman" w:cs="Times New Roman"/>
+        </w:rPr>
+        <w:t>replaces manual documentation, significantly accelerates approval process with centralized data management and improved traceability, reduced and lower administrative interfaces.</w:t>
       </w:r>
     </w:p>
     <w:p>
@@ -722,7 +732,7 @@
           <w:ilvl w:val="0"/>
           <w:numId w:val="3"/>
         </w:numPr>
-        <w:spacing w:after="80"/>
+        <w:spacing w:after="80" w:line="240" w:lineRule="auto"/>
         <w:rPr>
           <w:rFonts w:ascii="Times New Roman" w:hAnsi="Times New Roman" w:cs="Times New Roman"/>
         </w:rPr>
@@ -741,7 +751,7 @@
           <w:ilvl w:val="0"/>
           <w:numId w:val="3"/>
         </w:numPr>
-        <w:spacing w:after="80"/>
+        <w:spacing w:after="80" w:line="240" w:lineRule="auto"/>
         <w:rPr>
           <w:rFonts w:ascii="Times New Roman" w:hAnsi="Times New Roman" w:cs="Times New Roman"/>
         </w:rPr>
@@ -760,7 +770,7 @@
           <w:ilvl w:val="0"/>
           <w:numId w:val="3"/>
         </w:numPr>
-        <w:spacing w:after="80"/>
+        <w:spacing w:after="80" w:line="240" w:lineRule="auto"/>
         <w:rPr>
           <w:rFonts w:ascii="Times New Roman" w:hAnsi="Times New Roman" w:cs="Times New Roman"/>
         </w:rPr>
@@ -779,7 +789,7 @@
           <w:ilvl w:val="0"/>
           <w:numId w:val="3"/>
         </w:numPr>
-        <w:spacing w:after="200"/>
+        <w:spacing w:after="200" w:line="240" w:lineRule="auto"/>
         <w:rPr>
           <w:rFonts w:ascii="Times New Roman" w:hAnsi="Times New Roman" w:cs="Times New Roman"/>
         </w:rPr>
@@ -811,21 +821,7 @@
         <w:rPr>
           <w:rFonts w:ascii="Times New Roman" w:hAnsi="Times New Roman" w:cs="Times New Roman"/>
         </w:rPr>
-        <w:t xml:space="preserve">Deliverables do not include the source code. Use of the solution is under license from </w:t>
-      </w:r>
-      <w:proofErr w:type="spellStart"/>
-      <w:r>
-        <w:rPr>
-          <w:rFonts w:ascii="Times New Roman" w:hAnsi="Times New Roman" w:cs="Times New Roman"/>
-        </w:rPr>
-        <w:t>BlechTek</w:t>
-      </w:r>
-      <w:proofErr w:type="spellEnd"/>
-      <w:r>
-        <w:rPr>
-          <w:rFonts w:ascii="Times New Roman" w:hAnsi="Times New Roman" w:cs="Times New Roman"/>
-        </w:rPr>
-        <w:t xml:space="preserve"> Software Solutions LLP.</w:t>
+        <w:t>Deliverables do not include the source code. Use of the solution is under license from BlechTek Software Solutions LLP.</w:t>
       </w:r>
     </w:p>
     <w:p>
@@ -889,24 +885,44 @@
           <w:rFonts w:ascii="Times New Roman" w:hAnsi="Times New Roman" w:cs="Times New Roman"/>
           <w:lang w:val="en-US"/>
         </w:rPr>
-        <w:t xml:space="preserve">For </w:t>
-      </w:r>
-      <w:proofErr w:type="spellStart"/>
-      <w:r>
-        <w:rPr>
-          <w:rFonts w:ascii="Times New Roman" w:hAnsi="Times New Roman" w:cs="Times New Roman"/>
-          <w:lang w:val="en-US"/>
-        </w:rPr>
-        <w:t>BlechTek</w:t>
-      </w:r>
-      <w:proofErr w:type="spellEnd"/>
-      <w:r>
-        <w:rPr>
-          <w:rFonts w:ascii="Times New Roman" w:hAnsi="Times New Roman" w:cs="Times New Roman"/>
-          <w:lang w:val="en-US"/>
-        </w:rPr>
-        <w:t xml:space="preserve"> Software Solutions LLP.</w:t>
-      </w:r>
+        <w:t>For BlechTek Software Solutions LLP.</w:t>
+      </w:r>
+    </w:p>
+    <w:p>
+      <w:pPr>
+        <w:spacing w:line="240" w:lineRule="auto"/>
+        <w:rPr>
+          <w:rFonts w:ascii="Times New Roman" w:hAnsi="Times New Roman" w:cs="Times New Roman"/>
+          <w:noProof/>
+        </w:rPr>
+      </w:pPr>
+    </w:p>
+    <w:p>
+      <w:pPr>
+        <w:spacing w:line="240" w:lineRule="auto"/>
+        <w:rPr>
+          <w:rFonts w:ascii="Times New Roman" w:hAnsi="Times New Roman" w:cs="Times New Roman"/>
+          <w:noProof/>
+        </w:rPr>
+      </w:pPr>
+    </w:p>
+    <w:p>
+      <w:pPr>
+        <w:spacing w:line="240" w:lineRule="auto"/>
+        <w:rPr>
+          <w:rFonts w:ascii="Times New Roman" w:hAnsi="Times New Roman" w:cs="Times New Roman"/>
+          <w:noProof/>
+        </w:rPr>
+      </w:pPr>
+    </w:p>
+    <w:p>
+      <w:pPr>
+        <w:spacing w:line="240" w:lineRule="auto"/>
+        <w:rPr>
+          <w:rFonts w:ascii="Times New Roman" w:hAnsi="Times New Roman" w:cs="Times New Roman"/>
+          <w:noProof/>
+        </w:rPr>
+      </w:pPr>
     </w:p>
     <w:p>
       <w:pPr>
@@ -918,45 +934,6 @@
           <w:lang w:val="en-US"/>
         </w:rPr>
       </w:pPr>
-      <w:r>
-        <w:rPr>
-          <w:rFonts w:ascii="Times New Roman" w:hAnsi="Times New Roman" w:cs="Times New Roman"/>
-          <w:noProof/>
-        </w:rPr>
-        <w:drawing>
-          <wp:inline distT="0" distB="0" distL="0" distR="0" wp14:anchorId="3D41E2FB" wp14:editId="1637CFBB">
-            <wp:extent cx="971550" cy="933450"/>
-            <wp:effectExtent l="0" t="0" r="0" b="0"/>
-            <wp:docPr id="66384000" name="Picture 66384000"/>
-            <wp:cNvGraphicFramePr/>
-            <a:graphic xmlns:a="http://schemas.openxmlformats.org/drawingml/2006/main">
-              <a:graphicData uri="http://schemas.openxmlformats.org/drawingml/2006/picture">
-                <pic:pic xmlns:pic="http://schemas.openxmlformats.org/drawingml/2006/picture">
-                  <pic:nvPicPr>
-                    <pic:cNvPr id="97" name="Picture 97"/>
-                    <pic:cNvPicPr/>
-                  </pic:nvPicPr>
-                  <pic:blipFill>
-                    <a:blip r:embed="rId8"/>
-                    <a:stretch>
-                      <a:fillRect/>
-                    </a:stretch>
-                  </pic:blipFill>
-                  <pic:spPr>
-                    <a:xfrm>
-                      <a:off x="0" y="0"/>
-                      <a:ext cx="971788" cy="933679"/>
-                    </a:xfrm>
-                    <a:prstGeom prst="rect">
-                      <a:avLst/>
-                    </a:prstGeom>
-                  </pic:spPr>
-                </pic:pic>
-              </a:graphicData>
-            </a:graphic>
-          </wp:inline>
-        </w:drawing>
-      </w:r>
     </w:p>
     <w:p>
       <w:pPr>
@@ -1015,7 +992,7 @@
     </w:p>
     <w:tbl>
       <w:tblPr>
-        <w:tblW w:w="9768" w:type="dxa"/>
+        <w:tblW w:w="9786" w:type="dxa"/>
         <w:tblBorders>
           <w:top w:val="single" w:sz="4" w:space="0" w:color="auto"/>
           <w:left w:val="single" w:sz="4" w:space="0" w:color="auto"/>
@@ -1031,18 +1008,18 @@
         <w:tblLook w:val="04A0" w:firstRow="1" w:lastRow="0" w:firstColumn="1" w:lastColumn="0" w:noHBand="0" w:noVBand="1"/>
       </w:tblPr>
       <w:tblGrid>
-        <w:gridCol w:w="1696"/>
-        <w:gridCol w:w="6197"/>
-        <w:gridCol w:w="1875"/>
+        <w:gridCol w:w="1697"/>
+        <w:gridCol w:w="6212"/>
+        <w:gridCol w:w="1877"/>
       </w:tblGrid>
       <w:tr>
         <w:trPr>
-          <w:trHeight w:val="60"/>
+          <w:trHeight w:val="20"/>
           <w:tblHeader/>
         </w:trPr>
         <w:tc>
           <w:tcPr>
-            <w:tcW w:w="1696" w:type="dxa"/>
+            <w:tcW w:w="1697" w:type="dxa"/>
             <w:shd w:val="clear" w:color="auto" w:fill="FFFFFF" w:themeFill="background1"/>
             <w:tcMar>
               <w:top w:w="80" w:type="dxa"/>
@@ -1070,7 +1047,7 @@
         </w:tc>
         <w:tc>
           <w:tcPr>
-            <w:tcW w:w="6197" w:type="dxa"/>
+            <w:tcW w:w="6212" w:type="dxa"/>
             <w:tcBorders>
               <w:bottom w:val="single" w:sz="4" w:space="0" w:color="auto"/>
             </w:tcBorders>
@@ -1101,7 +1078,7 @@
         </w:tc>
         <w:tc>
           <w:tcPr>
-            <w:tcW w:w="1875" w:type="dxa"/>
+            <w:tcW w:w="1877" w:type="dxa"/>
             <w:shd w:val="clear" w:color="auto" w:fill="FFFFFF" w:themeFill="background1"/>
             <w:tcMar>
               <w:top w:w="80" w:type="dxa"/>
@@ -1129,12 +1106,12 @@
       </w:tr>
       <w:tr>
         <w:trPr>
-          <w:trHeight w:val="384"/>
+          <w:trHeight w:val="20"/>
           <w:tblHeader/>
         </w:trPr>
         <w:tc>
           <w:tcPr>
-            <w:tcW w:w="1696" w:type="dxa"/>
+            <w:tcW w:w="1697" w:type="dxa"/>
             <w:shd w:val="clear" w:color="auto" w:fill="FFFFFF" w:themeFill="background1"/>
             <w:tcMar>
               <w:top w:w="80" w:type="dxa"/>
@@ -1148,16 +1125,12 @@
             <w:pPr>
               <w:rPr>
                 <w:rFonts w:ascii="Times New Roman" w:hAnsi="Times New Roman" w:cs="Times New Roman"/>
-                <w:b/>
-                <w:bCs/>
                 <w:color w:val="FFFFFF"/>
               </w:rPr>
             </w:pPr>
             <w:r>
               <w:rPr>
                 <w:rFonts w:ascii="Times New Roman" w:hAnsi="Times New Roman" w:cs="Times New Roman"/>
-                <w:b/>
-                <w:bCs/>
               </w:rPr>
               <w:t>{{PILLAR}}</w:t>
             </w:r>
@@ -1165,7 +1138,7 @@
         </w:tc>
         <w:tc>
           <w:tcPr>
-            <w:tcW w:w="6197" w:type="dxa"/>
+            <w:tcW w:w="6212" w:type="dxa"/>
             <w:tcBorders>
               <w:bottom w:val="single" w:sz="4" w:space="0" w:color="auto"/>
             </w:tcBorders>
@@ -1182,16 +1155,12 @@
             <w:pPr>
               <w:rPr>
                 <w:rFonts w:ascii="Times New Roman" w:hAnsi="Times New Roman" w:cs="Times New Roman"/>
-                <w:b/>
-                <w:bCs/>
                 <w:color w:val="FFFFFF"/>
               </w:rPr>
             </w:pPr>
             <w:r>
               <w:rPr>
                 <w:rFonts w:ascii="Times New Roman" w:hAnsi="Times New Roman" w:cs="Times New Roman"/>
-                <w:b/>
-                <w:bCs/>
               </w:rPr>
               <w:t>{{MODULE}}</w:t>
             </w:r>
@@ -1199,7 +1168,7 @@
         </w:tc>
         <w:tc>
           <w:tcPr>
-            <w:tcW w:w="1875" w:type="dxa"/>
+            <w:tcW w:w="1877" w:type="dxa"/>
             <w:shd w:val="clear" w:color="auto" w:fill="FFFFFF" w:themeFill="background1"/>
             <w:tcMar>
               <w:top w:w="80" w:type="dxa"/>
@@ -1213,16 +1182,12 @@
             <w:pPr>
               <w:rPr>
                 <w:rFonts w:ascii="Times New Roman" w:hAnsi="Times New Roman" w:cs="Times New Roman"/>
-                <w:b/>
-                <w:bCs/>
                 <w:color w:val="FFFFFF"/>
               </w:rPr>
             </w:pPr>
             <w:r>
               <w:rPr>
                 <w:rFonts w:ascii="Times New Roman" w:hAnsi="Times New Roman" w:cs="Times New Roman"/>
-                <w:b/>
-                <w:bCs/>
               </w:rPr>
               <w:t>{{SELECTED}}</w:t>
             </w:r>
@@ -1318,7 +1283,7 @@
       </w:tblGrid>
       <w:tr>
         <w:trPr>
-          <w:trHeight w:val="336"/>
+          <w:trHeight w:val="20"/>
           <w:tblHeader/>
         </w:trPr>
         <w:tc>
@@ -1422,7 +1387,7 @@
       </w:tr>
       <w:tr>
         <w:trPr>
-          <w:trHeight w:val="814"/>
+          <w:trHeight w:val="20"/>
         </w:trPr>
         <w:tc>
           <w:tcPr>
@@ -1469,16 +1434,14 @@
             <w:r>
               <w:rPr>
                 <w:rFonts w:ascii="Times New Roman" w:hAnsi="Times New Roman" w:cs="Times New Roman"/>
-                <w:b/>
-                <w:bCs/>
-              </w:rPr>
-              <w:t>Product License</w:t>
-            </w:r>
-            <w:r>
-              <w:rPr>
-                <w:rFonts w:ascii="Times New Roman" w:hAnsi="Times New Roman" w:cs="Times New Roman"/>
-              </w:rPr>
-              <w:t xml:space="preserve"> - {{MODULE_LIST}} (single installation). Scope as listed above.</w:t>
+              </w:rPr>
+              <w:t>Product License -</w:t>
+            </w:r>
+            <w:r>
+              <w:rPr>
+                <w:rFonts w:ascii="Times New Roman" w:hAnsi="Times New Roman" w:cs="Times New Roman"/>
+              </w:rPr>
+              <w:t xml:space="preserve"> {{MODULE_LIST}} (single installation). Scope as listed above.</w:t>
             </w:r>
           </w:p>
           <w:p>
@@ -1536,7 +1499,7 @@
       </w:tr>
       <w:tr>
         <w:trPr>
-          <w:trHeight w:val="547"/>
+          <w:trHeight w:val="20"/>
         </w:trPr>
         <w:tc>
           <w:tcPr>
@@ -1583,16 +1546,14 @@
             <w:r>
               <w:rPr>
                 <w:rFonts w:ascii="Times New Roman" w:hAnsi="Times New Roman" w:cs="Times New Roman"/>
-                <w:b/>
-                <w:bCs/>
-              </w:rPr>
-              <w:t>Customization</w:t>
-            </w:r>
-            <w:r>
-              <w:rPr>
-                <w:rFonts w:ascii="Times New Roman" w:hAnsi="Times New Roman" w:cs="Times New Roman"/>
-              </w:rPr>
-              <w:t xml:space="preserve"> - any additional development beyond scope, charged at INR </w:t>
+              </w:rPr>
+              <w:t>Customization -</w:t>
+            </w:r>
+            <w:r>
+              <w:rPr>
+                <w:rFonts w:ascii="Times New Roman" w:hAnsi="Times New Roman" w:cs="Times New Roman"/>
+              </w:rPr>
+              <w:t xml:space="preserve"> any additional development beyond scope, charged at INR </w:t>
             </w:r>
             <w:r>
               <w:rPr>
@@ -1636,7 +1597,7 @@
       </w:tr>
       <w:tr>
         <w:trPr>
-          <w:trHeight w:val="535"/>
+          <w:trHeight w:val="20"/>
         </w:trPr>
         <w:tc>
           <w:tcPr>
@@ -1683,16 +1644,14 @@
             <w:r>
               <w:rPr>
                 <w:rFonts w:ascii="Times New Roman" w:hAnsi="Times New Roman" w:cs="Times New Roman"/>
-                <w:b/>
-                <w:bCs/>
-              </w:rPr>
-              <w:t>Annual License Renewal</w:t>
-            </w:r>
-            <w:r>
-              <w:rPr>
-                <w:rFonts w:ascii="Times New Roman" w:hAnsi="Times New Roman" w:cs="Times New Roman"/>
-              </w:rPr>
-              <w:t xml:space="preserve"> - covers upgrades, bug fixes &amp; statutory changes. Includes 7 man-days; excess is chargeable.</w:t>
+              </w:rPr>
+              <w:t>Annual License Renewal -</w:t>
+            </w:r>
+            <w:r>
+              <w:rPr>
+                <w:rFonts w:ascii="Times New Roman" w:hAnsi="Times New Roman" w:cs="Times New Roman"/>
+              </w:rPr>
+              <w:t xml:space="preserve"> covers upgrades, bug fixes &amp; statutory changes. Includes 7 man-days; excess is chargeable.</w:t>
             </w:r>
           </w:p>
         </w:tc>
@@ -1718,7 +1677,7 @@
       </w:tr>
       <w:tr>
         <w:trPr>
-          <w:trHeight w:val="279"/>
+          <w:trHeight w:val="20"/>
         </w:trPr>
         <w:tc>
           <w:tcPr>
@@ -1765,8 +1724,6 @@
             <w:r>
               <w:rPr>
                 <w:rFonts w:ascii="Times New Roman" w:hAnsi="Times New Roman" w:cs="Times New Roman"/>
-                <w:b/>
-                <w:bCs/>
               </w:rPr>
               <w:t>Support Services</w:t>
             </w:r>
@@ -1800,7 +1757,7 @@
       </w:tr>
       <w:tr>
         <w:trPr>
-          <w:trHeight w:val="1082"/>
+          <w:trHeight w:val="20"/>
         </w:trPr>
         <w:tc>
           <w:tcPr>
@@ -1847,8 +1804,6 @@
             <w:r>
               <w:rPr>
                 <w:rFonts w:ascii="Times New Roman" w:hAnsi="Times New Roman" w:cs="Times New Roman"/>
-                <w:b/>
-                <w:bCs/>
               </w:rPr>
               <w:t>Payment Terms</w:t>
             </w:r>
@@ -1881,7 +1836,7 @@
               <w:rPr>
                 <w:rFonts w:ascii="Times New Roman" w:hAnsi="Times New Roman" w:cs="Times New Roman"/>
               </w:rPr>
-              <w:t>70% advance with PO</w:t>
+              <w:t xml:space="preserve">70% in Advance along with Purchase Order </w:t>
             </w:r>
           </w:p>
           <w:p>
@@ -1907,7 +1862,31 @@
               <w:rPr>
                 <w:rFonts w:ascii="Times New Roman" w:hAnsi="Times New Roman" w:cs="Times New Roman"/>
               </w:rPr>
-              <w:t>10% on Go-Live.</w:t>
+              <w:t>10% against GO LIVE or One Month from comple</w:t>
+            </w:r>
+            <w:r>
+              <w:rPr>
+                <w:rFonts w:ascii="Times New Roman" w:hAnsi="Times New Roman" w:cs="Times New Roman"/>
+              </w:rPr>
+              <w:t>ti</w:t>
+            </w:r>
+            <w:r>
+              <w:rPr>
+                <w:rFonts w:ascii="Times New Roman" w:hAnsi="Times New Roman" w:cs="Times New Roman"/>
+              </w:rPr>
+              <w:t>on of implementa</w:t>
+            </w:r>
+            <w:r>
+              <w:rPr>
+                <w:rFonts w:ascii="Times New Roman" w:hAnsi="Times New Roman" w:cs="Times New Roman"/>
+              </w:rPr>
+              <w:t>ti</w:t>
+            </w:r>
+            <w:r>
+              <w:rPr>
+                <w:rFonts w:ascii="Times New Roman" w:hAnsi="Times New Roman" w:cs="Times New Roman"/>
+              </w:rPr>
+              <w:t>on.</w:t>
             </w:r>
           </w:p>
         </w:tc>
@@ -1933,7 +1912,7 @@
       </w:tr>
       <w:tr>
         <w:trPr>
-          <w:trHeight w:val="279"/>
+          <w:trHeight w:val="20"/>
         </w:trPr>
         <w:tc>
           <w:tcPr>
@@ -1955,8 +1934,6 @@
             <w:r>
               <w:rPr>
                 <w:rFonts w:ascii="Times New Roman" w:hAnsi="Times New Roman" w:cs="Times New Roman"/>
-                <w:b/>
-                <w:bCs/>
               </w:rPr>
               <w:t>6</w:t>
             </w:r>
@@ -1982,8 +1959,6 @@
             <w:r>
               <w:rPr>
                 <w:rFonts w:ascii="Times New Roman" w:hAnsi="Times New Roman" w:cs="Times New Roman"/>
-                <w:b/>
-                <w:bCs/>
               </w:rPr>
               <w:t>Support Level</w:t>
             </w:r>
@@ -2011,7 +1986,7 @@
       </w:tr>
       <w:tr>
         <w:trPr>
-          <w:trHeight w:val="547"/>
+          <w:trHeight w:val="20"/>
         </w:trPr>
         <w:tc>
           <w:tcPr>
@@ -2052,24 +2027,16 @@
             <w:r>
               <w:rPr>
                 <w:rFonts w:ascii="Times New Roman" w:hAnsi="Times New Roman" w:cs="Times New Roman"/>
+              </w:rPr>
+              <w:t>L1: Telephone Support</w:t>
+            </w:r>
+            <w:r>
+              <w:rPr>
+                <w:rFonts w:ascii="Times New Roman" w:hAnsi="Times New Roman" w:cs="Times New Roman"/>
                 <w:b/>
                 <w:bCs/>
               </w:rPr>
-              <w:t>L1:</w:t>
-            </w:r>
-            <w:r>
-              <w:rPr>
-                <w:rFonts w:ascii="Times New Roman" w:hAnsi="Times New Roman" w:cs="Times New Roman"/>
-              </w:rPr>
               <w:t xml:space="preserve"> </w:t>
-            </w:r>
-            <w:r>
-              <w:rPr>
-                <w:rFonts w:ascii="Times New Roman" w:hAnsi="Times New Roman" w:cs="Times New Roman"/>
-                <w:b/>
-                <w:bCs/>
-              </w:rPr>
-              <w:t xml:space="preserve">Telephone Support </w:t>
             </w:r>
             <w:r>
               <w:rPr>
@@ -2143,7 +2110,7 @@
       </w:tr>
       <w:tr>
         <w:trPr>
-          <w:trHeight w:val="535"/>
+          <w:trHeight w:val="20"/>
         </w:trPr>
         <w:tc>
           <w:tcPr>
@@ -2184,15 +2151,15 @@
             <w:r>
               <w:rPr>
                 <w:rFonts w:ascii="Times New Roman" w:hAnsi="Times New Roman" w:cs="Times New Roman"/>
+              </w:rPr>
+              <w:t>L2: Bugs</w:t>
+            </w:r>
+            <w:r>
+              <w:rPr>
+                <w:rFonts w:ascii="Times New Roman" w:hAnsi="Times New Roman" w:cs="Times New Roman"/>
                 <w:b/>
                 <w:bCs/>
               </w:rPr>
-              <w:t>L2:</w:t>
-            </w:r>
-            <w:r>
-              <w:rPr>
-                <w:rFonts w:ascii="Times New Roman" w:hAnsi="Times New Roman" w:cs="Times New Roman"/>
-              </w:rPr>
               <w:t xml:space="preserve"> </w:t>
             </w:r>
             <w:r>
@@ -2201,48 +2168,26 @@
                 <w:b/>
                 <w:bCs/>
               </w:rPr>
+              <w:t>–</w:t>
+            </w:r>
+          </w:p>
+          <w:p>
+            <w:pPr>
+              <w:rPr>
+                <w:rFonts w:ascii="Times New Roman" w:hAnsi="Times New Roman" w:cs="Times New Roman"/>
+              </w:rPr>
+            </w:pPr>
+            <w:r>
+              <w:rPr>
+                <w:rFonts w:ascii="Times New Roman" w:hAnsi="Times New Roman" w:cs="Times New Roman"/>
+              </w:rPr>
               <w:t xml:space="preserve">Bugs </w:t>
             </w:r>
             <w:r>
               <w:rPr>
                 <w:rFonts w:ascii="Times New Roman" w:hAnsi="Times New Roman" w:cs="Times New Roman"/>
-                <w:b/>
-                <w:bCs/>
-              </w:rPr>
-              <w:t>–</w:t>
-            </w:r>
-          </w:p>
-          <w:p>
-            <w:pPr>
-              <w:rPr>
-                <w:rFonts w:ascii="Times New Roman" w:hAnsi="Times New Roman" w:cs="Times New Roman"/>
-              </w:rPr>
-            </w:pPr>
-            <w:r>
-              <w:rPr>
-                <w:rFonts w:ascii="Times New Roman" w:hAnsi="Times New Roman" w:cs="Times New Roman"/>
-              </w:rPr>
-              <w:t xml:space="preserve">Bugs </w:t>
-            </w:r>
-            <w:r>
-              <w:rPr>
-                <w:rFonts w:ascii="Times New Roman" w:hAnsi="Times New Roman" w:cs="Times New Roman"/>
-              </w:rPr>
-              <w:t xml:space="preserve">Identified by you or by </w:t>
-            </w:r>
-            <w:proofErr w:type="spellStart"/>
-            <w:r>
-              <w:rPr>
-                <w:rFonts w:ascii="Times New Roman" w:hAnsi="Times New Roman" w:cs="Times New Roman"/>
-              </w:rPr>
-              <w:t>BlechTek</w:t>
-            </w:r>
-            <w:proofErr w:type="spellEnd"/>
-            <w:r>
-              <w:rPr>
-                <w:rFonts w:ascii="Times New Roman" w:hAnsi="Times New Roman" w:cs="Times New Roman"/>
-              </w:rPr>
-              <w:t xml:space="preserve"> Software Solutions LLP.</w:t>
+              </w:rPr>
+              <w:t>Identified by you or by BlechTek Software Solutions LLP.</w:t>
             </w:r>
           </w:p>
         </w:tc>
@@ -2274,7 +2219,7 @@
       </w:tr>
       <w:tr>
         <w:trPr>
-          <w:trHeight w:val="814"/>
+          <w:trHeight w:val="20"/>
         </w:trPr>
         <w:tc>
           <w:tcPr>
@@ -2315,24 +2260,16 @@
             <w:r>
               <w:rPr>
                 <w:rFonts w:ascii="Times New Roman" w:hAnsi="Times New Roman" w:cs="Times New Roman"/>
+              </w:rPr>
+              <w:t>L3: Customer Specific Enhancements</w:t>
+            </w:r>
+            <w:r>
+              <w:rPr>
+                <w:rFonts w:ascii="Times New Roman" w:hAnsi="Times New Roman" w:cs="Times New Roman"/>
                 <w:b/>
                 <w:bCs/>
               </w:rPr>
-              <w:t>L3:</w:t>
-            </w:r>
-            <w:r>
-              <w:rPr>
-                <w:rFonts w:ascii="Times New Roman" w:hAnsi="Times New Roman" w:cs="Times New Roman"/>
-              </w:rPr>
-              <w:t xml:space="preserve"> </w:t>
-            </w:r>
-            <w:r>
-              <w:rPr>
-                <w:rFonts w:ascii="Times New Roman" w:hAnsi="Times New Roman" w:cs="Times New Roman"/>
-                <w:b/>
-                <w:bCs/>
-              </w:rPr>
-              <w:t>Customer Specific Enhancements –</w:t>
+              <w:t xml:space="preserve"> –</w:t>
             </w:r>
             <w:r>
               <w:rPr>
@@ -2398,7 +2335,7 @@
       </w:tr>
       <w:tr>
         <w:trPr>
-          <w:trHeight w:val="547"/>
+          <w:trHeight w:val="20"/>
         </w:trPr>
         <w:tc>
           <w:tcPr>
@@ -2439,10 +2376,16 @@
             <w:r>
               <w:rPr>
                 <w:rFonts w:ascii="Times New Roman" w:hAnsi="Times New Roman" w:cs="Times New Roman"/>
+              </w:rPr>
+              <w:t>L4: Product Upgrade</w:t>
+            </w:r>
+            <w:r>
+              <w:rPr>
+                <w:rFonts w:ascii="Times New Roman" w:hAnsi="Times New Roman" w:cs="Times New Roman"/>
                 <w:b/>
                 <w:bCs/>
               </w:rPr>
-              <w:t>L4:</w:t>
+              <w:t xml:space="preserve"> –</w:t>
             </w:r>
             <w:r>
               <w:rPr>
@@ -2450,60 +2393,30 @@
               </w:rPr>
               <w:t xml:space="preserve"> </w:t>
             </w:r>
-            <w:r>
-              <w:rPr>
-                <w:rFonts w:ascii="Times New Roman" w:hAnsi="Times New Roman" w:cs="Times New Roman"/>
-                <w:b/>
-                <w:bCs/>
-              </w:rPr>
-              <w:t>Product Upgrade –</w:t>
-            </w:r>
-            <w:r>
-              <w:rPr>
-                <w:rFonts w:ascii="Times New Roman" w:hAnsi="Times New Roman" w:cs="Times New Roman"/>
-              </w:rPr>
-              <w:t xml:space="preserve"> </w:t>
-            </w:r>
-          </w:p>
-          <w:p>
-            <w:pPr>
-              <w:rPr>
-                <w:rFonts w:ascii="Times New Roman" w:hAnsi="Times New Roman" w:cs="Times New Roman"/>
-              </w:rPr>
-            </w:pPr>
-            <w:r>
-              <w:rPr>
-                <w:rFonts w:ascii="Times New Roman" w:hAnsi="Times New Roman" w:cs="Times New Roman"/>
-              </w:rPr>
-              <w:t xml:space="preserve">Product Upgrade as done by </w:t>
-            </w:r>
-            <w:proofErr w:type="spellStart"/>
-            <w:r>
-              <w:rPr>
-                <w:rFonts w:ascii="Times New Roman" w:hAnsi="Times New Roman" w:cs="Times New Roman"/>
-              </w:rPr>
-              <w:t>BlechTek</w:t>
-            </w:r>
-            <w:proofErr w:type="spellEnd"/>
-            <w:r>
-              <w:rPr>
-                <w:rFonts w:ascii="Times New Roman" w:hAnsi="Times New Roman" w:cs="Times New Roman"/>
-              </w:rPr>
-              <w:t xml:space="preserve"> So ware Solu </w:t>
-            </w:r>
-            <w:proofErr w:type="spellStart"/>
-            <w:r>
-              <w:rPr>
-                <w:rFonts w:ascii="Times New Roman" w:hAnsi="Times New Roman" w:cs="Times New Roman"/>
-              </w:rPr>
-              <w:t>ons</w:t>
-            </w:r>
-            <w:proofErr w:type="spellEnd"/>
-            <w:r>
-              <w:rPr>
-                <w:rFonts w:ascii="Times New Roman" w:hAnsi="Times New Roman" w:cs="Times New Roman"/>
-              </w:rPr>
-              <w:t xml:space="preserve"> LLP on their own  </w:t>
+          </w:p>
+          <w:p>
+            <w:pPr>
+              <w:rPr>
+                <w:rFonts w:ascii="Times New Roman" w:hAnsi="Times New Roman" w:cs="Times New Roman"/>
+              </w:rPr>
+            </w:pPr>
+            <w:r>
+              <w:rPr>
+                <w:rFonts w:ascii="Times New Roman" w:hAnsi="Times New Roman" w:cs="Times New Roman"/>
+              </w:rPr>
+              <w:t>Product Upgrade as done by BlechTek So ware Solu</w:t>
+            </w:r>
+            <w:r>
+              <w:rPr>
+                <w:rFonts w:ascii="Times New Roman" w:hAnsi="Times New Roman" w:cs="Times New Roman"/>
+              </w:rPr>
+              <w:t>ti</w:t>
+            </w:r>
+            <w:r>
+              <w:rPr>
+                <w:rFonts w:ascii="Times New Roman" w:hAnsi="Times New Roman" w:cs="Times New Roman"/>
+              </w:rPr>
+              <w:t xml:space="preserve">ons LLP on their own  </w:t>
             </w:r>
           </w:p>
         </w:tc>
@@ -2547,7 +2460,7 @@
       </w:tr>
       <w:tr>
         <w:trPr>
-          <w:trHeight w:val="547"/>
+          <w:trHeight w:val="20"/>
         </w:trPr>
         <w:tc>
           <w:tcPr>
@@ -2588,51 +2501,29 @@
             <w:r>
               <w:rPr>
                 <w:rFonts w:ascii="Times New Roman" w:hAnsi="Times New Roman" w:cs="Times New Roman"/>
+              </w:rPr>
+              <w:t>L5: Implementation</w:t>
+            </w:r>
+            <w:r>
+              <w:rPr>
+                <w:rFonts w:ascii="Times New Roman" w:hAnsi="Times New Roman" w:cs="Times New Roman"/>
                 <w:b/>
                 <w:bCs/>
               </w:rPr>
-              <w:t>L5:</w:t>
-            </w:r>
-            <w:r>
-              <w:rPr>
-                <w:rFonts w:ascii="Times New Roman" w:hAnsi="Times New Roman" w:cs="Times New Roman"/>
-              </w:rPr>
-              <w:t xml:space="preserve"> </w:t>
-            </w:r>
-            <w:r>
-              <w:rPr>
-                <w:rFonts w:ascii="Times New Roman" w:hAnsi="Times New Roman" w:cs="Times New Roman"/>
-                <w:b/>
-                <w:bCs/>
-              </w:rPr>
-              <w:t>Implementation –</w:t>
-            </w:r>
-          </w:p>
-          <w:p>
-            <w:pPr>
-              <w:rPr>
-                <w:rFonts w:ascii="Times New Roman" w:hAnsi="Times New Roman" w:cs="Times New Roman"/>
-              </w:rPr>
-            </w:pPr>
-            <w:r>
-              <w:rPr>
-                <w:rFonts w:ascii="Times New Roman" w:hAnsi="Times New Roman" w:cs="Times New Roman"/>
-              </w:rPr>
-              <w:t xml:space="preserve">Master </w:t>
-            </w:r>
-            <w:proofErr w:type="spellStart"/>
-            <w:r>
-              <w:rPr>
-                <w:rFonts w:ascii="Times New Roman" w:hAnsi="Times New Roman" w:cs="Times New Roman"/>
-              </w:rPr>
-              <w:t>updation</w:t>
-            </w:r>
-            <w:proofErr w:type="spellEnd"/>
-            <w:r>
-              <w:rPr>
-                <w:rFonts w:ascii="Times New Roman" w:hAnsi="Times New Roman" w:cs="Times New Roman"/>
-              </w:rPr>
-              <w:t>, new feature implementation.</w:t>
+              <w:t xml:space="preserve"> –</w:t>
+            </w:r>
+          </w:p>
+          <w:p>
+            <w:pPr>
+              <w:rPr>
+                <w:rFonts w:ascii="Times New Roman" w:hAnsi="Times New Roman" w:cs="Times New Roman"/>
+              </w:rPr>
+            </w:pPr>
+            <w:r>
+              <w:rPr>
+                <w:rFonts w:ascii="Times New Roman" w:hAnsi="Times New Roman" w:cs="Times New Roman"/>
+              </w:rPr>
+              <w:t>Master updation, new feature implementation.</w:t>
             </w:r>
           </w:p>
         </w:tc>
@@ -2677,7 +2568,7 @@
       </w:tr>
       <w:tr>
         <w:trPr>
-          <w:trHeight w:val="279"/>
+          <w:trHeight w:val="20"/>
         </w:trPr>
         <w:tc>
           <w:tcPr>
@@ -2700,6 +2591,7 @@
               <w:rPr>
                 <w:rFonts w:ascii="Times New Roman" w:hAnsi="Times New Roman" w:cs="Times New Roman"/>
               </w:rPr>
+              <w:lastRenderedPageBreak/>
               <w:t>7</w:t>
             </w:r>
           </w:p>
@@ -2789,7 +2681,7 @@
     <w:tbl>
       <w:tblPr>
         <w:tblStyle w:val="TableGrid"/>
-        <w:tblW w:w="9636" w:type="dxa"/>
+        <w:tblW w:w="9749" w:type="dxa"/>
         <w:tblInd w:w="106" w:type="dxa"/>
         <w:tblCellMar>
           <w:top w:w="14" w:type="dxa"/>
@@ -2799,23 +2691,23 @@
         <w:tblLook w:val="04A0" w:firstRow="1" w:lastRow="0" w:firstColumn="1" w:lastColumn="0" w:noHBand="0" w:noVBand="1"/>
       </w:tblPr>
       <w:tblGrid>
-        <w:gridCol w:w="1922"/>
-        <w:gridCol w:w="949"/>
-        <w:gridCol w:w="949"/>
-        <w:gridCol w:w="872"/>
-        <w:gridCol w:w="872"/>
-        <w:gridCol w:w="872"/>
-        <w:gridCol w:w="872"/>
-        <w:gridCol w:w="1197"/>
-        <w:gridCol w:w="1131"/>
+        <w:gridCol w:w="1945"/>
+        <w:gridCol w:w="960"/>
+        <w:gridCol w:w="960"/>
+        <w:gridCol w:w="882"/>
+        <w:gridCol w:w="882"/>
+        <w:gridCol w:w="882"/>
+        <w:gridCol w:w="882"/>
+        <w:gridCol w:w="1211"/>
+        <w:gridCol w:w="1145"/>
       </w:tblGrid>
       <w:tr>
         <w:trPr>
-          <w:trHeight w:val="217"/>
+          <w:trHeight w:val="237"/>
         </w:trPr>
         <w:tc>
           <w:tcPr>
-            <w:tcW w:w="1922" w:type="dxa"/>
+            <w:tcW w:w="1945" w:type="dxa"/>
             <w:tcBorders>
               <w:top w:val="single" w:sz="4" w:space="0" w:color="000000"/>
               <w:left w:val="single" w:sz="4" w:space="0" w:color="000000"/>
@@ -2838,7 +2730,7 @@
         </w:tc>
         <w:tc>
           <w:tcPr>
-            <w:tcW w:w="949" w:type="dxa"/>
+            <w:tcW w:w="960" w:type="dxa"/>
             <w:tcBorders>
               <w:top w:val="single" w:sz="4" w:space="0" w:color="000000"/>
               <w:left w:val="single" w:sz="4" w:space="0" w:color="000000"/>
@@ -2862,7 +2754,7 @@
         </w:tc>
         <w:tc>
           <w:tcPr>
-            <w:tcW w:w="949" w:type="dxa"/>
+            <w:tcW w:w="960" w:type="dxa"/>
             <w:tcBorders>
               <w:top w:val="single" w:sz="4" w:space="0" w:color="000000"/>
               <w:left w:val="single" w:sz="4" w:space="0" w:color="000000"/>
@@ -2887,7 +2779,7 @@
         </w:tc>
         <w:tc>
           <w:tcPr>
-            <w:tcW w:w="872" w:type="dxa"/>
+            <w:tcW w:w="882" w:type="dxa"/>
             <w:tcBorders>
               <w:top w:val="single" w:sz="4" w:space="0" w:color="000000"/>
               <w:left w:val="single" w:sz="4" w:space="0" w:color="000000"/>
@@ -2912,7 +2804,7 @@
         </w:tc>
         <w:tc>
           <w:tcPr>
-            <w:tcW w:w="872" w:type="dxa"/>
+            <w:tcW w:w="882" w:type="dxa"/>
             <w:tcBorders>
               <w:top w:val="single" w:sz="4" w:space="0" w:color="000000"/>
               <w:left w:val="single" w:sz="4" w:space="0" w:color="000000"/>
@@ -2937,7 +2829,7 @@
         </w:tc>
         <w:tc>
           <w:tcPr>
-            <w:tcW w:w="872" w:type="dxa"/>
+            <w:tcW w:w="882" w:type="dxa"/>
             <w:tcBorders>
               <w:top w:val="single" w:sz="4" w:space="0" w:color="000000"/>
               <w:left w:val="single" w:sz="4" w:space="0" w:color="000000"/>
@@ -2962,7 +2854,7 @@
         </w:tc>
         <w:tc>
           <w:tcPr>
-            <w:tcW w:w="872" w:type="dxa"/>
+            <w:tcW w:w="882" w:type="dxa"/>
             <w:tcBorders>
               <w:top w:val="single" w:sz="4" w:space="0" w:color="000000"/>
               <w:left w:val="single" w:sz="4" w:space="0" w:color="000000"/>
@@ -2987,7 +2879,7 @@
         </w:tc>
         <w:tc>
           <w:tcPr>
-            <w:tcW w:w="1197" w:type="dxa"/>
+            <w:tcW w:w="1211" w:type="dxa"/>
             <w:tcBorders>
               <w:top w:val="single" w:sz="4" w:space="0" w:color="000000"/>
               <w:left w:val="single" w:sz="4" w:space="0" w:color="000000"/>
@@ -3002,25 +2894,17 @@
               <w:ind w:left="23"/>
               <w:jc w:val="center"/>
             </w:pPr>
-            <w:proofErr w:type="spellStart"/>
             <w:r>
               <w:rPr>
                 <w:sz w:val="14"/>
               </w:rPr>
-              <w:t>Avg</w:t>
-            </w:r>
-            <w:proofErr w:type="spellEnd"/>
-            <w:r>
-              <w:rPr>
-                <w:sz w:val="14"/>
-              </w:rPr>
-              <w:t xml:space="preserve"> Cost/ Year</w:t>
-            </w:r>
-          </w:p>
-        </w:tc>
-        <w:tc>
-          <w:tcPr>
-            <w:tcW w:w="1131" w:type="dxa"/>
+              <w:t>Avg Cost/ Year</w:t>
+            </w:r>
+          </w:p>
+        </w:tc>
+        <w:tc>
+          <w:tcPr>
+            <w:tcW w:w="1145" w:type="dxa"/>
             <w:tcBorders>
               <w:top w:val="single" w:sz="4" w:space="0" w:color="000000"/>
               <w:left w:val="single" w:sz="5" w:space="0" w:color="000000"/>
@@ -3046,11 +2930,11 @@
       </w:tr>
       <w:tr>
         <w:trPr>
-          <w:trHeight w:val="215"/>
+          <w:trHeight w:val="235"/>
         </w:trPr>
         <w:tc>
           <w:tcPr>
-            <w:tcW w:w="1922" w:type="dxa"/>
+            <w:tcW w:w="1945" w:type="dxa"/>
             <w:tcBorders>
               <w:top w:val="single" w:sz="5" w:space="0" w:color="000000"/>
               <w:left w:val="single" w:sz="4" w:space="0" w:color="000000"/>
@@ -3073,7 +2957,7 @@
         </w:tc>
         <w:tc>
           <w:tcPr>
-            <w:tcW w:w="949" w:type="dxa"/>
+            <w:tcW w:w="960" w:type="dxa"/>
             <w:tcBorders>
               <w:top w:val="single" w:sz="5" w:space="0" w:color="000000"/>
               <w:left w:val="single" w:sz="4" w:space="0" w:color="000000"/>
@@ -3098,7 +2982,7 @@
         </w:tc>
         <w:tc>
           <w:tcPr>
-            <w:tcW w:w="949" w:type="dxa"/>
+            <w:tcW w:w="960" w:type="dxa"/>
             <w:tcBorders>
               <w:top w:val="single" w:sz="5" w:space="0" w:color="000000"/>
               <w:left w:val="single" w:sz="4" w:space="0" w:color="000000"/>
@@ -3123,7 +3007,7 @@
         </w:tc>
         <w:tc>
           <w:tcPr>
-            <w:tcW w:w="872" w:type="dxa"/>
+            <w:tcW w:w="882" w:type="dxa"/>
             <w:tcBorders>
               <w:top w:val="single" w:sz="5" w:space="0" w:color="000000"/>
               <w:left w:val="single" w:sz="4" w:space="0" w:color="000000"/>
@@ -3148,7 +3032,7 @@
         </w:tc>
         <w:tc>
           <w:tcPr>
-            <w:tcW w:w="872" w:type="dxa"/>
+            <w:tcW w:w="882" w:type="dxa"/>
             <w:tcBorders>
               <w:top w:val="single" w:sz="5" w:space="0" w:color="000000"/>
               <w:left w:val="single" w:sz="4" w:space="0" w:color="000000"/>
@@ -3167,7 +3051,7 @@
         </w:tc>
         <w:tc>
           <w:tcPr>
-            <w:tcW w:w="872" w:type="dxa"/>
+            <w:tcW w:w="882" w:type="dxa"/>
             <w:tcBorders>
               <w:top w:val="single" w:sz="5" w:space="0" w:color="000000"/>
               <w:left w:val="single" w:sz="4" w:space="0" w:color="000000"/>
@@ -3186,7 +3070,7 @@
         </w:tc>
         <w:tc>
           <w:tcPr>
-            <w:tcW w:w="872" w:type="dxa"/>
+            <w:tcW w:w="882" w:type="dxa"/>
             <w:tcBorders>
               <w:top w:val="single" w:sz="5" w:space="0" w:color="000000"/>
               <w:left w:val="single" w:sz="4" w:space="0" w:color="000000"/>
@@ -3205,7 +3089,7 @@
         </w:tc>
         <w:tc>
           <w:tcPr>
-            <w:tcW w:w="1197" w:type="dxa"/>
+            <w:tcW w:w="1211" w:type="dxa"/>
             <w:tcBorders>
               <w:top w:val="single" w:sz="5" w:space="0" w:color="000000"/>
               <w:left w:val="single" w:sz="4" w:space="0" w:color="000000"/>
@@ -3223,7 +3107,7 @@
         </w:tc>
         <w:tc>
           <w:tcPr>
-            <w:tcW w:w="1131" w:type="dxa"/>
+            <w:tcW w:w="1145" w:type="dxa"/>
             <w:tcBorders>
               <w:top w:val="single" w:sz="5" w:space="0" w:color="000000"/>
               <w:left w:val="single" w:sz="5" w:space="0" w:color="000000"/>
@@ -3242,11 +3126,11 @@
       </w:tr>
       <w:tr>
         <w:trPr>
-          <w:trHeight w:val="217"/>
+          <w:trHeight w:val="237"/>
         </w:trPr>
         <w:tc>
           <w:tcPr>
-            <w:tcW w:w="1922" w:type="dxa"/>
+            <w:tcW w:w="1945" w:type="dxa"/>
             <w:tcBorders>
               <w:top w:val="single" w:sz="5" w:space="0" w:color="000000"/>
               <w:left w:val="single" w:sz="4" w:space="0" w:color="000000"/>
@@ -3269,7 +3153,7 @@
         </w:tc>
         <w:tc>
           <w:tcPr>
-            <w:tcW w:w="949" w:type="dxa"/>
+            <w:tcW w:w="960" w:type="dxa"/>
             <w:tcBorders>
               <w:top w:val="single" w:sz="5" w:space="0" w:color="000000"/>
               <w:left w:val="single" w:sz="4" w:space="0" w:color="000000"/>
@@ -3294,7 +3178,7 @@
         </w:tc>
         <w:tc>
           <w:tcPr>
-            <w:tcW w:w="949" w:type="dxa"/>
+            <w:tcW w:w="960" w:type="dxa"/>
             <w:tcBorders>
               <w:top w:val="single" w:sz="5" w:space="0" w:color="000000"/>
               <w:left w:val="single" w:sz="4" w:space="0" w:color="000000"/>
@@ -3313,7 +3197,7 @@
         </w:tc>
         <w:tc>
           <w:tcPr>
-            <w:tcW w:w="872" w:type="dxa"/>
+            <w:tcW w:w="882" w:type="dxa"/>
             <w:tcBorders>
               <w:top w:val="single" w:sz="5" w:space="0" w:color="000000"/>
               <w:left w:val="single" w:sz="4" w:space="0" w:color="000000"/>
@@ -3337,7 +3221,7 @@
         </w:tc>
         <w:tc>
           <w:tcPr>
-            <w:tcW w:w="872" w:type="dxa"/>
+            <w:tcW w:w="882" w:type="dxa"/>
             <w:tcBorders>
               <w:top w:val="single" w:sz="5" w:space="0" w:color="000000"/>
               <w:left w:val="single" w:sz="4" w:space="0" w:color="000000"/>
@@ -3355,7 +3239,7 @@
         </w:tc>
         <w:tc>
           <w:tcPr>
-            <w:tcW w:w="872" w:type="dxa"/>
+            <w:tcW w:w="882" w:type="dxa"/>
             <w:tcBorders>
               <w:top w:val="single" w:sz="5" w:space="0" w:color="000000"/>
               <w:left w:val="single" w:sz="4" w:space="0" w:color="000000"/>
@@ -3373,7 +3257,7 @@
         </w:tc>
         <w:tc>
           <w:tcPr>
-            <w:tcW w:w="872" w:type="dxa"/>
+            <w:tcW w:w="882" w:type="dxa"/>
             <w:tcBorders>
               <w:top w:val="single" w:sz="5" w:space="0" w:color="000000"/>
               <w:left w:val="single" w:sz="4" w:space="0" w:color="000000"/>
@@ -3391,7 +3275,7 @@
         </w:tc>
         <w:tc>
           <w:tcPr>
-            <w:tcW w:w="1197" w:type="dxa"/>
+            <w:tcW w:w="1211" w:type="dxa"/>
             <w:tcBorders>
               <w:top w:val="single" w:sz="5" w:space="0" w:color="000000"/>
               <w:left w:val="single" w:sz="4" w:space="0" w:color="000000"/>
@@ -3409,7 +3293,7 @@
         </w:tc>
         <w:tc>
           <w:tcPr>
-            <w:tcW w:w="1131" w:type="dxa"/>
+            <w:tcW w:w="1145" w:type="dxa"/>
             <w:tcBorders>
               <w:top w:val="single" w:sz="5" w:space="0" w:color="000000"/>
               <w:left w:val="single" w:sz="5" w:space="0" w:color="000000"/>
@@ -3428,11 +3312,11 @@
       </w:tr>
       <w:tr>
         <w:trPr>
-          <w:trHeight w:val="219"/>
+          <w:trHeight w:val="239"/>
         </w:trPr>
         <w:tc>
           <w:tcPr>
-            <w:tcW w:w="1922" w:type="dxa"/>
+            <w:tcW w:w="1945" w:type="dxa"/>
             <w:tcBorders>
               <w:top w:val="single" w:sz="5" w:space="0" w:color="000000"/>
               <w:left w:val="single" w:sz="4" w:space="0" w:color="000000"/>
@@ -3455,7 +3339,7 @@
         </w:tc>
         <w:tc>
           <w:tcPr>
-            <w:tcW w:w="949" w:type="dxa"/>
+            <w:tcW w:w="960" w:type="dxa"/>
             <w:tcBorders>
               <w:top w:val="single" w:sz="5" w:space="0" w:color="000000"/>
               <w:left w:val="single" w:sz="4" w:space="0" w:color="000000"/>
@@ -3480,7 +3364,7 @@
         </w:tc>
         <w:tc>
           <w:tcPr>
-            <w:tcW w:w="949" w:type="dxa"/>
+            <w:tcW w:w="960" w:type="dxa"/>
             <w:tcBorders>
               <w:top w:val="single" w:sz="5" w:space="0" w:color="000000"/>
               <w:left w:val="single" w:sz="4" w:space="0" w:color="000000"/>
@@ -3505,7 +3389,7 @@
         </w:tc>
         <w:tc>
           <w:tcPr>
-            <w:tcW w:w="872" w:type="dxa"/>
+            <w:tcW w:w="882" w:type="dxa"/>
             <w:tcBorders>
               <w:top w:val="single" w:sz="5" w:space="0" w:color="000000"/>
               <w:left w:val="single" w:sz="4" w:space="0" w:color="000000"/>
@@ -3523,7 +3407,7 @@
         </w:tc>
         <w:tc>
           <w:tcPr>
-            <w:tcW w:w="872" w:type="dxa"/>
+            <w:tcW w:w="882" w:type="dxa"/>
             <w:tcBorders>
               <w:top w:val="single" w:sz="5" w:space="0" w:color="000000"/>
               <w:left w:val="single" w:sz="4" w:space="0" w:color="000000"/>
@@ -3541,7 +3425,7 @@
         </w:tc>
         <w:tc>
           <w:tcPr>
-            <w:tcW w:w="872" w:type="dxa"/>
+            <w:tcW w:w="882" w:type="dxa"/>
             <w:tcBorders>
               <w:top w:val="single" w:sz="5" w:space="0" w:color="000000"/>
               <w:left w:val="single" w:sz="4" w:space="0" w:color="000000"/>
@@ -3559,7 +3443,7 @@
         </w:tc>
         <w:tc>
           <w:tcPr>
-            <w:tcW w:w="872" w:type="dxa"/>
+            <w:tcW w:w="882" w:type="dxa"/>
             <w:tcBorders>
               <w:top w:val="single" w:sz="5" w:space="0" w:color="000000"/>
               <w:left w:val="single" w:sz="4" w:space="0" w:color="000000"/>
@@ -3577,7 +3461,7 @@
         </w:tc>
         <w:tc>
           <w:tcPr>
-            <w:tcW w:w="1197" w:type="dxa"/>
+            <w:tcW w:w="1211" w:type="dxa"/>
             <w:tcBorders>
               <w:top w:val="single" w:sz="5" w:space="0" w:color="000000"/>
               <w:left w:val="single" w:sz="4" w:space="0" w:color="000000"/>
@@ -3595,7 +3479,7 @@
         </w:tc>
         <w:tc>
           <w:tcPr>
-            <w:tcW w:w="1131" w:type="dxa"/>
+            <w:tcW w:w="1145" w:type="dxa"/>
             <w:tcBorders>
               <w:top w:val="single" w:sz="5" w:space="0" w:color="000000"/>
               <w:left w:val="single" w:sz="5" w:space="0" w:color="000000"/>
@@ -3652,56 +3536,657 @@
         <w:t xml:space="preserve"> </w:t>
       </w:r>
     </w:p>
-    <w:p>
-      <w:pPr>
-        <w:spacing w:after="160" w:line="259" w:lineRule="auto"/>
-      </w:pPr>
-    </w:p>
-    <w:p>
-      <w:pPr>
-        <w:spacing w:before="300" w:after="150"/>
-        <w:rPr>
-          <w:rFonts w:ascii="Times New Roman" w:hAnsi="Times New Roman" w:cs="Times New Roman"/>
-          <w:color w:val="000000" w:themeColor="text1"/>
-        </w:rPr>
-      </w:pPr>
-    </w:p>
-    <w:p>
-      <w:pPr>
-        <w:spacing w:before="300" w:after="150"/>
-        <w:rPr>
-          <w:rFonts w:ascii="Times New Roman" w:hAnsi="Times New Roman" w:cs="Times New Roman"/>
-          <w:color w:val="000000" w:themeColor="text1"/>
-        </w:rPr>
-      </w:pPr>
-    </w:p>
-    <w:p>
-      <w:pPr>
-        <w:spacing w:before="300" w:after="150"/>
-        <w:rPr>
-          <w:rFonts w:ascii="Times New Roman" w:hAnsi="Times New Roman" w:cs="Times New Roman"/>
-          <w:color w:val="000000" w:themeColor="text1"/>
-        </w:rPr>
-      </w:pPr>
-    </w:p>
-    <w:p>
-      <w:pPr>
-        <w:spacing w:before="300" w:after="150"/>
-        <w:rPr>
-          <w:rFonts w:ascii="Times New Roman" w:hAnsi="Times New Roman" w:cs="Times New Roman"/>
-          <w:color w:val="000000" w:themeColor="text1"/>
-        </w:rPr>
-      </w:pPr>
-    </w:p>
-    <w:p>
-      <w:pPr>
-        <w:spacing w:before="300" w:after="150"/>
-        <w:rPr>
-          <w:rFonts w:ascii="Times New Roman" w:hAnsi="Times New Roman" w:cs="Times New Roman"/>
-          <w:color w:val="000000" w:themeColor="text1"/>
-        </w:rPr>
-      </w:pPr>
-    </w:p>
+    <w:tbl>
+      <w:tblPr>
+        <w:tblStyle w:val="TableGrid0"/>
+        <w:tblW w:w="0" w:type="auto"/>
+        <w:tblLook w:val="04A0" w:firstRow="1" w:lastRow="0" w:firstColumn="1" w:lastColumn="0" w:noHBand="0" w:noVBand="1"/>
+      </w:tblPr>
+      <w:tblGrid>
+        <w:gridCol w:w="2734"/>
+        <w:gridCol w:w="3626"/>
+        <w:gridCol w:w="3670"/>
+      </w:tblGrid>
+      <w:tr>
+        <w:trPr>
+          <w:trHeight w:val="759"/>
+        </w:trPr>
+        <w:tc>
+          <w:tcPr>
+            <w:tcW w:w="2830" w:type="dxa"/>
+          </w:tcPr>
+          <w:p>
+            <w:pPr>
+              <w:spacing w:after="160" w:line="259" w:lineRule="auto"/>
+              <w:jc w:val="center"/>
+              <w:rPr>
+                <w:rFonts w:ascii="Times New Roman" w:hAnsi="Times New Roman" w:cs="Times New Roman"/>
+              </w:rPr>
+            </w:pPr>
+            <w:r>
+              <w:rPr>
+                <w:rFonts w:ascii="Times New Roman" w:hAnsi="Times New Roman" w:cs="Times New Roman"/>
+              </w:rPr>
+              <w:t>Main Stages</w:t>
+            </w:r>
+          </w:p>
+        </w:tc>
+        <w:tc>
+          <w:tcPr>
+            <w:tcW w:w="3626" w:type="dxa"/>
+            <w:tcBorders>
+              <w:bottom w:val="single" w:sz="2" w:space="0" w:color="auto"/>
+            </w:tcBorders>
+          </w:tcPr>
+          <w:p>
+            <w:pPr>
+              <w:spacing w:after="160" w:line="259" w:lineRule="auto"/>
+              <w:rPr>
+                <w:rFonts w:ascii="Times New Roman" w:hAnsi="Times New Roman" w:cs="Times New Roman"/>
+              </w:rPr>
+            </w:pPr>
+            <w:r>
+              <w:rPr>
+                <w:rFonts w:ascii="Times New Roman" w:hAnsi="Times New Roman" w:cs="Times New Roman"/>
+              </w:rPr>
+              <w:t>Month 1</w:t>
+            </w:r>
+          </w:p>
+          <w:tbl>
+            <w:tblPr>
+              <w:tblStyle w:val="TableGrid0"/>
+              <w:tblpPr w:leftFromText="180" w:rightFromText="180" w:vertAnchor="text" w:horzAnchor="margin" w:tblpY="40"/>
+              <w:tblOverlap w:val="never"/>
+              <w:tblW w:w="3397" w:type="dxa"/>
+              <w:tblLook w:val="04A0" w:firstRow="1" w:lastRow="0" w:firstColumn="1" w:lastColumn="0" w:noHBand="0" w:noVBand="1"/>
+            </w:tblPr>
+            <w:tblGrid>
+              <w:gridCol w:w="952"/>
+              <w:gridCol w:w="886"/>
+              <w:gridCol w:w="851"/>
+              <w:gridCol w:w="708"/>
+            </w:tblGrid>
+            <w:tr>
+              <w:trPr>
+                <w:trHeight w:val="405"/>
+              </w:trPr>
+              <w:tc>
+                <w:tcPr>
+                  <w:tcW w:w="952" w:type="dxa"/>
+                </w:tcPr>
+                <w:p>
+                  <w:pPr>
+                    <w:spacing w:after="160" w:line="259" w:lineRule="auto"/>
+                    <w:rPr>
+                      <w:rFonts w:ascii="Times New Roman" w:hAnsi="Times New Roman" w:cs="Times New Roman"/>
+                    </w:rPr>
+                  </w:pPr>
+                  <w:r>
+                    <w:rPr>
+                      <w:rFonts w:ascii="Times New Roman" w:hAnsi="Times New Roman" w:cs="Times New Roman"/>
+                    </w:rPr>
+                    <w:t>WK1</w:t>
+                  </w:r>
+                </w:p>
+              </w:tc>
+              <w:tc>
+                <w:tcPr>
+                  <w:tcW w:w="886" w:type="dxa"/>
+                </w:tcPr>
+                <w:p>
+                  <w:pPr>
+                    <w:spacing w:after="160" w:line="259" w:lineRule="auto"/>
+                    <w:rPr>
+                      <w:rFonts w:ascii="Times New Roman" w:hAnsi="Times New Roman" w:cs="Times New Roman"/>
+                    </w:rPr>
+                  </w:pPr>
+                  <w:r>
+                    <w:rPr>
+                      <w:rFonts w:ascii="Times New Roman" w:hAnsi="Times New Roman" w:cs="Times New Roman"/>
+                    </w:rPr>
+                    <w:t>WK2</w:t>
+                  </w:r>
+                </w:p>
+              </w:tc>
+              <w:tc>
+                <w:tcPr>
+                  <w:tcW w:w="851" w:type="dxa"/>
+                </w:tcPr>
+                <w:p>
+                  <w:pPr>
+                    <w:spacing w:after="160" w:line="259" w:lineRule="auto"/>
+                    <w:rPr>
+                      <w:rFonts w:ascii="Times New Roman" w:hAnsi="Times New Roman" w:cs="Times New Roman"/>
+                    </w:rPr>
+                  </w:pPr>
+                  <w:r>
+                    <w:rPr>
+                      <w:rFonts w:ascii="Times New Roman" w:hAnsi="Times New Roman" w:cs="Times New Roman"/>
+                    </w:rPr>
+                    <w:t>WK3</w:t>
+                  </w:r>
+                </w:p>
+              </w:tc>
+              <w:tc>
+                <w:tcPr>
+                  <w:tcW w:w="708" w:type="dxa"/>
+                </w:tcPr>
+                <w:p>
+                  <w:pPr>
+                    <w:spacing w:after="160" w:line="259" w:lineRule="auto"/>
+                    <w:rPr>
+                      <w:rFonts w:ascii="Times New Roman" w:hAnsi="Times New Roman" w:cs="Times New Roman"/>
+                    </w:rPr>
+                  </w:pPr>
+                  <w:r>
+                    <w:rPr>
+                      <w:rFonts w:ascii="Times New Roman" w:hAnsi="Times New Roman" w:cs="Times New Roman"/>
+                    </w:rPr>
+                    <w:t>WK4</w:t>
+                  </w:r>
+                </w:p>
+              </w:tc>
+            </w:tr>
+          </w:tbl>
+          <w:p>
+            <w:pPr>
+              <w:spacing w:after="160" w:line="259" w:lineRule="auto"/>
+              <w:rPr>
+                <w:rFonts w:ascii="Times New Roman" w:hAnsi="Times New Roman" w:cs="Times New Roman"/>
+              </w:rPr>
+            </w:pPr>
+          </w:p>
+        </w:tc>
+        <w:tc>
+          <w:tcPr>
+            <w:tcW w:w="3574" w:type="dxa"/>
+          </w:tcPr>
+          <w:p>
+            <w:pPr>
+              <w:spacing w:after="160" w:line="259" w:lineRule="auto"/>
+              <w:rPr>
+                <w:rFonts w:ascii="Times New Roman" w:hAnsi="Times New Roman" w:cs="Times New Roman"/>
+              </w:rPr>
+            </w:pPr>
+            <w:r>
+              <w:rPr>
+                <w:rFonts w:ascii="Times New Roman" w:hAnsi="Times New Roman" w:cs="Times New Roman"/>
+              </w:rPr>
+              <w:t>Month 2</w:t>
+            </w:r>
+          </w:p>
+          <w:tbl>
+            <w:tblPr>
+              <w:tblStyle w:val="TableGrid0"/>
+              <w:tblpPr w:leftFromText="180" w:rightFromText="180" w:vertAnchor="text" w:tblpY="25"/>
+              <w:tblOverlap w:val="never"/>
+              <w:tblW w:w="3444" w:type="dxa"/>
+              <w:tblLook w:val="04A0" w:firstRow="1" w:lastRow="0" w:firstColumn="1" w:lastColumn="0" w:noHBand="0" w:noVBand="1"/>
+            </w:tblPr>
+            <w:tblGrid>
+              <w:gridCol w:w="861"/>
+              <w:gridCol w:w="861"/>
+              <w:gridCol w:w="861"/>
+              <w:gridCol w:w="861"/>
+            </w:tblGrid>
+            <w:tr>
+              <w:trPr>
+                <w:trHeight w:val="415"/>
+              </w:trPr>
+              <w:tc>
+                <w:tcPr>
+                  <w:tcW w:w="861" w:type="dxa"/>
+                </w:tcPr>
+                <w:p>
+                  <w:pPr>
+                    <w:spacing w:after="160" w:line="259" w:lineRule="auto"/>
+                    <w:rPr>
+                      <w:rFonts w:ascii="Times New Roman" w:hAnsi="Times New Roman" w:cs="Times New Roman"/>
+                    </w:rPr>
+                  </w:pPr>
+                  <w:r>
+                    <w:rPr>
+                      <w:rFonts w:ascii="Times New Roman" w:hAnsi="Times New Roman" w:cs="Times New Roman"/>
+                    </w:rPr>
+                    <w:t>WK1</w:t>
+                  </w:r>
+                </w:p>
+              </w:tc>
+              <w:tc>
+                <w:tcPr>
+                  <w:tcW w:w="861" w:type="dxa"/>
+                </w:tcPr>
+                <w:p>
+                  <w:pPr>
+                    <w:spacing w:after="160" w:line="259" w:lineRule="auto"/>
+                    <w:rPr>
+                      <w:rFonts w:ascii="Times New Roman" w:hAnsi="Times New Roman" w:cs="Times New Roman"/>
+                    </w:rPr>
+                  </w:pPr>
+                  <w:r>
+                    <w:rPr>
+                      <w:rFonts w:ascii="Times New Roman" w:hAnsi="Times New Roman" w:cs="Times New Roman"/>
+                    </w:rPr>
+                    <w:t>WK2</w:t>
+                  </w:r>
+                </w:p>
+              </w:tc>
+              <w:tc>
+                <w:tcPr>
+                  <w:tcW w:w="861" w:type="dxa"/>
+                </w:tcPr>
+                <w:p>
+                  <w:pPr>
+                    <w:spacing w:after="160" w:line="259" w:lineRule="auto"/>
+                    <w:rPr>
+                      <w:rFonts w:ascii="Times New Roman" w:hAnsi="Times New Roman" w:cs="Times New Roman"/>
+                    </w:rPr>
+                  </w:pPr>
+                  <w:r>
+                    <w:rPr>
+                      <w:rFonts w:ascii="Times New Roman" w:hAnsi="Times New Roman" w:cs="Times New Roman"/>
+                    </w:rPr>
+                    <w:t>WK3</w:t>
+                  </w:r>
+                </w:p>
+              </w:tc>
+              <w:tc>
+                <w:tcPr>
+                  <w:tcW w:w="861" w:type="dxa"/>
+                </w:tcPr>
+                <w:p>
+                  <w:pPr>
+                    <w:spacing w:after="160" w:line="259" w:lineRule="auto"/>
+                    <w:rPr>
+                      <w:rFonts w:ascii="Times New Roman" w:hAnsi="Times New Roman" w:cs="Times New Roman"/>
+                    </w:rPr>
+                  </w:pPr>
+                  <w:r>
+                    <w:rPr>
+                      <w:rFonts w:ascii="Times New Roman" w:hAnsi="Times New Roman" w:cs="Times New Roman"/>
+                    </w:rPr>
+                    <w:t>WK4</w:t>
+                  </w:r>
+                </w:p>
+              </w:tc>
+            </w:tr>
+          </w:tbl>
+          <w:p>
+            <w:pPr>
+              <w:spacing w:after="160" w:line="259" w:lineRule="auto"/>
+              <w:rPr>
+                <w:rFonts w:ascii="Times New Roman" w:hAnsi="Times New Roman" w:cs="Times New Roman"/>
+              </w:rPr>
+            </w:pPr>
+          </w:p>
+        </w:tc>
+      </w:tr>
+      <w:tr>
+        <w:trPr>
+          <w:trHeight w:val="393"/>
+        </w:trPr>
+        <w:tc>
+          <w:tcPr>
+            <w:tcW w:w="2830" w:type="dxa"/>
+          </w:tcPr>
+          <w:p>
+            <w:pPr>
+              <w:spacing w:after="160" w:line="259" w:lineRule="auto"/>
+              <w:rPr>
+                <w:rFonts w:ascii="Times New Roman" w:hAnsi="Times New Roman" w:cs="Times New Roman"/>
+              </w:rPr>
+            </w:pPr>
+            <w:r>
+              <w:rPr>
+                <w:rFonts w:ascii="Times New Roman" w:hAnsi="Times New Roman" w:cs="Times New Roman"/>
+              </w:rPr>
+              <w:t>Pre-Implementation Visits</w:t>
+            </w:r>
+          </w:p>
+        </w:tc>
+        <w:tc>
+          <w:tcPr>
+            <w:tcW w:w="3626" w:type="dxa"/>
+            <w:tcBorders>
+              <w:top w:val="single" w:sz="2" w:space="0" w:color="auto"/>
+            </w:tcBorders>
+          </w:tcPr>
+          <w:p>
+            <w:pPr>
+              <w:spacing w:after="160" w:line="259" w:lineRule="auto"/>
+              <w:rPr>
+                <w:rFonts w:ascii="Times New Roman" w:hAnsi="Times New Roman" w:cs="Times New Roman"/>
+              </w:rPr>
+            </w:pPr>
+          </w:p>
+        </w:tc>
+        <w:tc>
+          <w:tcPr>
+            <w:tcW w:w="3574" w:type="dxa"/>
+          </w:tcPr>
+          <w:p>
+            <w:pPr>
+              <w:spacing w:after="160" w:line="259" w:lineRule="auto"/>
+              <w:rPr>
+                <w:rFonts w:ascii="Times New Roman" w:hAnsi="Times New Roman" w:cs="Times New Roman"/>
+              </w:rPr>
+            </w:pPr>
+          </w:p>
+        </w:tc>
+      </w:tr>
+      <w:tr>
+        <w:trPr>
+          <w:trHeight w:val="393"/>
+        </w:trPr>
+        <w:tc>
+          <w:tcPr>
+            <w:tcW w:w="2830" w:type="dxa"/>
+          </w:tcPr>
+          <w:p>
+            <w:pPr>
+              <w:spacing w:after="160" w:line="259" w:lineRule="auto"/>
+              <w:rPr>
+                <w:rFonts w:ascii="Times New Roman" w:hAnsi="Times New Roman" w:cs="Times New Roman"/>
+              </w:rPr>
+            </w:pPr>
+            <w:r>
+              <w:rPr>
+                <w:rFonts w:ascii="Times New Roman" w:hAnsi="Times New Roman" w:cs="Times New Roman"/>
+              </w:rPr>
+              <w:t>Master Preparations</w:t>
+            </w:r>
+          </w:p>
+        </w:tc>
+        <w:tc>
+          <w:tcPr>
+            <w:tcW w:w="3626" w:type="dxa"/>
+          </w:tcPr>
+          <w:p>
+            <w:pPr>
+              <w:spacing w:after="160" w:line="259" w:lineRule="auto"/>
+              <w:rPr>
+                <w:rFonts w:ascii="Times New Roman" w:hAnsi="Times New Roman" w:cs="Times New Roman"/>
+              </w:rPr>
+            </w:pPr>
+          </w:p>
+        </w:tc>
+        <w:tc>
+          <w:tcPr>
+            <w:tcW w:w="3574" w:type="dxa"/>
+          </w:tcPr>
+          <w:p>
+            <w:pPr>
+              <w:spacing w:after="160" w:line="259" w:lineRule="auto"/>
+              <w:rPr>
+                <w:rFonts w:ascii="Times New Roman" w:hAnsi="Times New Roman" w:cs="Times New Roman"/>
+              </w:rPr>
+            </w:pPr>
+          </w:p>
+        </w:tc>
+      </w:tr>
+      <w:tr>
+        <w:trPr>
+          <w:trHeight w:val="393"/>
+        </w:trPr>
+        <w:tc>
+          <w:tcPr>
+            <w:tcW w:w="2830" w:type="dxa"/>
+          </w:tcPr>
+          <w:p>
+            <w:pPr>
+              <w:spacing w:after="160" w:line="259" w:lineRule="auto"/>
+              <w:rPr>
+                <w:rFonts w:ascii="Times New Roman" w:hAnsi="Times New Roman" w:cs="Times New Roman"/>
+              </w:rPr>
+            </w:pPr>
+            <w:r>
+              <w:rPr>
+                <w:rFonts w:ascii="Times New Roman" w:hAnsi="Times New Roman" w:cs="Times New Roman"/>
+              </w:rPr>
+              <w:t>{{MODULE_LIST}}</w:t>
+            </w:r>
+            <w:r>
+              <w:rPr>
+                <w:rFonts w:ascii="Times New Roman" w:hAnsi="Times New Roman" w:cs="Times New Roman"/>
+              </w:rPr>
+              <w:t xml:space="preserve"> </w:t>
+            </w:r>
+            <w:r>
+              <w:rPr>
+                <w:rFonts w:ascii="Times New Roman" w:hAnsi="Times New Roman" w:cs="Times New Roman"/>
+              </w:rPr>
+              <w:t>Configuration &amp; Set Up</w:t>
+            </w:r>
+          </w:p>
+        </w:tc>
+        <w:tc>
+          <w:tcPr>
+            <w:tcW w:w="3626" w:type="dxa"/>
+          </w:tcPr>
+          <w:p>
+            <w:pPr>
+              <w:spacing w:after="160" w:line="259" w:lineRule="auto"/>
+              <w:rPr>
+                <w:rFonts w:ascii="Times New Roman" w:hAnsi="Times New Roman" w:cs="Times New Roman"/>
+              </w:rPr>
+            </w:pPr>
+          </w:p>
+        </w:tc>
+        <w:tc>
+          <w:tcPr>
+            <w:tcW w:w="3574" w:type="dxa"/>
+          </w:tcPr>
+          <w:p>
+            <w:pPr>
+              <w:spacing w:after="160" w:line="259" w:lineRule="auto"/>
+              <w:rPr>
+                <w:rFonts w:ascii="Times New Roman" w:hAnsi="Times New Roman" w:cs="Times New Roman"/>
+              </w:rPr>
+            </w:pPr>
+          </w:p>
+        </w:tc>
+      </w:tr>
+      <w:tr>
+        <w:trPr>
+          <w:trHeight w:val="393"/>
+        </w:trPr>
+        <w:tc>
+          <w:tcPr>
+            <w:tcW w:w="2830" w:type="dxa"/>
+          </w:tcPr>
+          <w:p>
+            <w:pPr>
+              <w:spacing w:after="160" w:line="259" w:lineRule="auto"/>
+              <w:rPr>
+                <w:rFonts w:ascii="Times New Roman" w:hAnsi="Times New Roman" w:cs="Times New Roman"/>
+              </w:rPr>
+            </w:pPr>
+            <w:r>
+              <w:rPr>
+                <w:rFonts w:ascii="Times New Roman" w:hAnsi="Times New Roman" w:cs="Times New Roman"/>
+              </w:rPr>
+              <w:t>Trainings and Pilot run</w:t>
+            </w:r>
+          </w:p>
+        </w:tc>
+        <w:tc>
+          <w:tcPr>
+            <w:tcW w:w="3626" w:type="dxa"/>
+          </w:tcPr>
+          <w:p>
+            <w:pPr>
+              <w:spacing w:after="160" w:line="259" w:lineRule="auto"/>
+              <w:rPr>
+                <w:rFonts w:ascii="Times New Roman" w:hAnsi="Times New Roman" w:cs="Times New Roman"/>
+              </w:rPr>
+            </w:pPr>
+          </w:p>
+        </w:tc>
+        <w:tc>
+          <w:tcPr>
+            <w:tcW w:w="3574" w:type="dxa"/>
+          </w:tcPr>
+          <w:p>
+            <w:pPr>
+              <w:spacing w:after="160" w:line="259" w:lineRule="auto"/>
+              <w:rPr>
+                <w:rFonts w:ascii="Times New Roman" w:hAnsi="Times New Roman" w:cs="Times New Roman"/>
+              </w:rPr>
+            </w:pPr>
+          </w:p>
+        </w:tc>
+      </w:tr>
+      <w:tr>
+        <w:trPr>
+          <w:trHeight w:val="377"/>
+        </w:trPr>
+        <w:tc>
+          <w:tcPr>
+            <w:tcW w:w="2830" w:type="dxa"/>
+          </w:tcPr>
+          <w:p>
+            <w:pPr>
+              <w:spacing w:after="160" w:line="259" w:lineRule="auto"/>
+              <w:rPr>
+                <w:rFonts w:ascii="Times New Roman" w:hAnsi="Times New Roman" w:cs="Times New Roman"/>
+              </w:rPr>
+            </w:pPr>
+            <w:r>
+              <w:rPr>
+                <w:rFonts w:ascii="Times New Roman" w:hAnsi="Times New Roman" w:cs="Times New Roman"/>
+              </w:rPr>
+              <w:t>Data Preparation for Go-Live</w:t>
+            </w:r>
+          </w:p>
+        </w:tc>
+        <w:tc>
+          <w:tcPr>
+            <w:tcW w:w="3626" w:type="dxa"/>
+          </w:tcPr>
+          <w:p>
+            <w:pPr>
+              <w:spacing w:after="160" w:line="259" w:lineRule="auto"/>
+              <w:rPr>
+                <w:rFonts w:ascii="Times New Roman" w:hAnsi="Times New Roman" w:cs="Times New Roman"/>
+              </w:rPr>
+            </w:pPr>
+          </w:p>
+        </w:tc>
+        <w:tc>
+          <w:tcPr>
+            <w:tcW w:w="3574" w:type="dxa"/>
+          </w:tcPr>
+          <w:p>
+            <w:pPr>
+              <w:spacing w:after="160" w:line="259" w:lineRule="auto"/>
+              <w:rPr>
+                <w:rFonts w:ascii="Times New Roman" w:hAnsi="Times New Roman" w:cs="Times New Roman"/>
+              </w:rPr>
+            </w:pPr>
+          </w:p>
+        </w:tc>
+      </w:tr>
+      <w:tr>
+        <w:trPr>
+          <w:trHeight w:val="393"/>
+        </w:trPr>
+        <w:tc>
+          <w:tcPr>
+            <w:tcW w:w="2830" w:type="dxa"/>
+          </w:tcPr>
+          <w:p>
+            <w:pPr>
+              <w:spacing w:after="160" w:line="259" w:lineRule="auto"/>
+              <w:rPr>
+                <w:rFonts w:ascii="Times New Roman" w:hAnsi="Times New Roman" w:cs="Times New Roman"/>
+              </w:rPr>
+            </w:pPr>
+            <w:r>
+              <w:rPr>
+                <w:rFonts w:ascii="Times New Roman" w:hAnsi="Times New Roman" w:cs="Times New Roman"/>
+              </w:rPr>
+              <w:t>Go-Live</w:t>
+            </w:r>
+          </w:p>
+        </w:tc>
+        <w:tc>
+          <w:tcPr>
+            <w:tcW w:w="3626" w:type="dxa"/>
+          </w:tcPr>
+          <w:p>
+            <w:pPr>
+              <w:spacing w:after="160" w:line="259" w:lineRule="auto"/>
+              <w:rPr>
+                <w:rFonts w:ascii="Times New Roman" w:hAnsi="Times New Roman" w:cs="Times New Roman"/>
+              </w:rPr>
+            </w:pPr>
+          </w:p>
+        </w:tc>
+        <w:tc>
+          <w:tcPr>
+            <w:tcW w:w="3574" w:type="dxa"/>
+          </w:tcPr>
+          <w:p>
+            <w:pPr>
+              <w:spacing w:after="160" w:line="259" w:lineRule="auto"/>
+              <w:rPr>
+                <w:rFonts w:ascii="Times New Roman" w:hAnsi="Times New Roman" w:cs="Times New Roman"/>
+              </w:rPr>
+            </w:pPr>
+          </w:p>
+        </w:tc>
+      </w:tr>
+      <w:tr>
+        <w:trPr>
+          <w:trHeight w:val="65"/>
+        </w:trPr>
+        <w:tc>
+          <w:tcPr>
+            <w:tcW w:w="2830" w:type="dxa"/>
+          </w:tcPr>
+          <w:p>
+            <w:pPr>
+              <w:spacing w:after="160" w:line="259" w:lineRule="auto"/>
+              <w:rPr>
+                <w:rFonts w:ascii="Times New Roman" w:hAnsi="Times New Roman" w:cs="Times New Roman"/>
+              </w:rPr>
+            </w:pPr>
+            <w:r>
+              <w:rPr>
+                <w:rFonts w:ascii="Times New Roman" w:hAnsi="Times New Roman" w:cs="Times New Roman"/>
+              </w:rPr>
+              <w:t>Go-Live Support</w:t>
+            </w:r>
+          </w:p>
+        </w:tc>
+        <w:tc>
+          <w:tcPr>
+            <w:tcW w:w="3626" w:type="dxa"/>
+          </w:tcPr>
+          <w:p>
+            <w:pPr>
+              <w:spacing w:after="160" w:line="259" w:lineRule="auto"/>
+              <w:rPr>
+                <w:rFonts w:ascii="Times New Roman" w:hAnsi="Times New Roman" w:cs="Times New Roman"/>
+              </w:rPr>
+            </w:pPr>
+          </w:p>
+        </w:tc>
+        <w:tc>
+          <w:tcPr>
+            <w:tcW w:w="3574" w:type="dxa"/>
+          </w:tcPr>
+          <w:p>
+            <w:pPr>
+              <w:spacing w:after="160" w:line="259" w:lineRule="auto"/>
+              <w:rPr>
+                <w:rFonts w:ascii="Times New Roman" w:hAnsi="Times New Roman" w:cs="Times New Roman"/>
+              </w:rPr>
+            </w:pPr>
+          </w:p>
+        </w:tc>
+      </w:tr>
+    </w:tbl>
     <w:p>
       <w:pPr>
         <w:spacing w:before="300" w:after="150"/>
@@ -3869,7 +4354,6 @@
         </w:rPr>
         <w:t xml:space="preserve"> </w:t>
       </w:r>
-      <w:proofErr w:type="gramStart"/>
       <w:r>
         <w:rPr>
           <w:rFonts w:ascii="Times New Roman" w:hAnsi="Times New Roman" w:cs="Times New Roman"/>
@@ -3877,7 +4361,6 @@
         </w:rPr>
         <w:t>Organization</w:t>
       </w:r>
-      <w:proofErr w:type="gramEnd"/>
     </w:p>
     <w:p>
       <w:pPr>
@@ -4017,6 +4500,12 @@
           <w:rFonts w:ascii="Times New Roman" w:hAnsi="Times New Roman" w:cs="Times New Roman"/>
         </w:rPr>
       </w:pPr>
+      <w:r>
+        <w:rPr>
+          <w:rFonts w:ascii="Times New Roman" w:hAnsi="Times New Roman" w:cs="Times New Roman"/>
+        </w:rPr>
+        <w:t>Source Code remains the property of BleckTek Software Solutions LLP. The customer shall not claim any right in or to any patent, copyright, trademark or other proprietary right of the original manufacturer, developer or licensor. The software, hardware or other goods supplies are in accordance with the export laws of the respective countries, and diversion contrary to these laws or regulations is prohibited.</w:t>
+      </w:r>
     </w:p>
     <w:p>
       <w:pPr>
@@ -4025,26 +4514,6 @@
           <w:rFonts w:ascii="Times New Roman" w:hAnsi="Times New Roman" w:cs="Times New Roman"/>
         </w:rPr>
       </w:pPr>
-      <w:r>
-        <w:rPr>
-          <w:rFonts w:ascii="Times New Roman" w:hAnsi="Times New Roman" w:cs="Times New Roman"/>
-        </w:rPr>
-        <w:t xml:space="preserve">Source Code remains the property of </w:t>
-      </w:r>
-      <w:proofErr w:type="spellStart"/>
-      <w:r>
-        <w:rPr>
-          <w:rFonts w:ascii="Times New Roman" w:hAnsi="Times New Roman" w:cs="Times New Roman"/>
-        </w:rPr>
-        <w:t>BleckTek</w:t>
-      </w:r>
-      <w:proofErr w:type="spellEnd"/>
-      <w:r>
-        <w:rPr>
-          <w:rFonts w:ascii="Times New Roman" w:hAnsi="Times New Roman" w:cs="Times New Roman"/>
-        </w:rPr>
-        <w:t xml:space="preserve"> Software Solutions LLP. The customer shall not claim any right in or to any patent, copyright, trademark or other proprietary right of the original manufacturer, developer or licensor. The software, hardware or other goods supplies are in accordance with the export laws of the respective countries, and diversion contrary to these laws or regulations is prohibited.</w:t>
-      </w:r>
     </w:p>
     <w:p>
       <w:pPr>
@@ -4053,6 +4522,14 @@
           <w:rFonts w:ascii="Times New Roman" w:hAnsi="Times New Roman" w:cs="Times New Roman"/>
         </w:rPr>
       </w:pPr>
+    </w:p>
+    <w:p>
+      <w:pPr>
+        <w:spacing w:before="300" w:after="150"/>
+        <w:rPr>
+          <w:rFonts w:ascii="Times New Roman" w:hAnsi="Times New Roman" w:cs="Times New Roman"/>
+        </w:rPr>
+      </w:pPr>
       <w:r>
         <w:rPr>
           <w:rFonts w:ascii="Times New Roman" w:hAnsi="Times New Roman" w:cs="Times New Roman"/>
@@ -4083,19 +4560,11 @@
           <w:rFonts w:ascii="Times New Roman" w:hAnsi="Times New Roman" w:cs="Times New Roman"/>
         </w:rPr>
       </w:pPr>
-      <w:proofErr w:type="spellStart"/>
-      <w:r>
-        <w:rPr>
-          <w:rFonts w:ascii="Times New Roman" w:hAnsi="Times New Roman" w:cs="Times New Roman"/>
-        </w:rPr>
-        <w:t>BlechTek</w:t>
-      </w:r>
-      <w:proofErr w:type="spellEnd"/>
-      <w:r>
-        <w:rPr>
-          <w:rFonts w:ascii="Times New Roman" w:hAnsi="Times New Roman" w:cs="Times New Roman"/>
-        </w:rPr>
-        <w:t xml:space="preserve"> Software Solutions LLP agrees to maintain the confidentiality of all insights gained into your organization.</w:t>
+      <w:r>
+        <w:rPr>
+          <w:rFonts w:ascii="Times New Roman" w:hAnsi="Times New Roman" w:cs="Times New Roman"/>
+        </w:rPr>
+        <w:t>BlechTek Software Solutions LLP agrees to maintain the confidentiality of all insights gained into your organization.</w:t>
       </w:r>
     </w:p>
     <w:p>
@@ -4106,6 +4575,27 @@
           <w:color w:val="000000" w:themeColor="text1"/>
         </w:rPr>
       </w:pPr>
+      <w:r>
+        <w:rPr>
+          <w:rFonts w:ascii="Times New Roman" w:hAnsi="Times New Roman" w:cs="Times New Roman"/>
+          <w:color w:val="000000" w:themeColor="text1"/>
+        </w:rPr>
+        <w:t>2. License</w:t>
+      </w:r>
+    </w:p>
+    <w:p>
+      <w:pPr>
+        <w:spacing w:after="60"/>
+        <w:rPr>
+          <w:rFonts w:ascii="Times New Roman" w:hAnsi="Times New Roman" w:cs="Times New Roman"/>
+        </w:rPr>
+      </w:pPr>
+      <w:r>
+        <w:rPr>
+          <w:rFonts w:ascii="Times New Roman" w:hAnsi="Times New Roman" w:cs="Times New Roman"/>
+        </w:rPr>
+        <w:t>You are responsible for holding valid licenses for any Operating System software required.</w:t>
+      </w:r>
     </w:p>
     <w:p>
       <w:pPr>
@@ -4120,7 +4610,7 @@
           <w:rFonts w:ascii="Times New Roman" w:hAnsi="Times New Roman" w:cs="Times New Roman"/>
           <w:color w:val="000000" w:themeColor="text1"/>
         </w:rPr>
-        <w:t>2. License</w:t>
+        <w:t>3. Ownership of Source Code</w:t>
       </w:r>
     </w:p>
     <w:p>
@@ -4134,7 +4624,7 @@
         <w:rPr>
           <w:rFonts w:ascii="Times New Roman" w:hAnsi="Times New Roman" w:cs="Times New Roman"/>
         </w:rPr>
-        <w:t>You are responsible for holding valid licenses for any Operating System software required.</w:t>
+        <w:t>Source Code remains the property of BlechTek Software Solutions LLP. The customer shall not claim any right in or to any patent, copyright, trademark or other proprietary right of the original manufacturer, developer or licensor. The software, hardware or other goods supplied are in accordance with the export laws of the respective countries, and diversion contrary to these laws or regulations is prohibited.</w:t>
       </w:r>
     </w:p>
     <w:p>
@@ -4145,15 +4635,27 @@
           <w:color w:val="000000" w:themeColor="text1"/>
         </w:rPr>
       </w:pPr>
+      <w:r>
+        <w:rPr>
+          <w:rFonts w:ascii="Times New Roman" w:hAnsi="Times New Roman" w:cs="Times New Roman"/>
+          <w:color w:val="000000" w:themeColor="text1"/>
+        </w:rPr>
+        <w:t>4. Warranty</w:t>
+      </w:r>
     </w:p>
     <w:p>
       <w:pPr>
         <w:spacing w:before="160" w:after="40"/>
         <w:rPr>
           <w:rFonts w:ascii="Times New Roman" w:hAnsi="Times New Roman" w:cs="Times New Roman"/>
-          <w:color w:val="000000" w:themeColor="text1"/>
-        </w:rPr>
-      </w:pPr>
+        </w:rPr>
+      </w:pPr>
+      <w:r>
+        <w:rPr>
+          <w:rFonts w:ascii="Times New Roman" w:hAnsi="Times New Roman" w:cs="Times New Roman"/>
+        </w:rPr>
+        <w:t xml:space="preserve">BlechTek Software Solutions LLP offers a Standard Warranty against Development defects for the period of 3 Months from the Date of Installation. And BlechTek Software Solutions LLP is not responsible for the loss of Data due to any Platform related or Cyber Security Issues or Virus problems. </w:t>
+      </w:r>
     </w:p>
     <w:p>
       <w:pPr>
@@ -4168,7 +4670,65 @@
           <w:rFonts w:ascii="Times New Roman" w:hAnsi="Times New Roman" w:cs="Times New Roman"/>
           <w:color w:val="000000" w:themeColor="text1"/>
         </w:rPr>
-        <w:t>3. Ownership of Source Code</w:t>
+        <w:t>5. Installation of Software</w:t>
+      </w:r>
+    </w:p>
+    <w:p>
+      <w:pPr>
+        <w:spacing w:before="160" w:after="40"/>
+        <w:rPr>
+          <w:rFonts w:ascii="Times New Roman" w:hAnsi="Times New Roman" w:cs="Times New Roman"/>
+        </w:rPr>
+      </w:pPr>
+      <w:r>
+        <w:rPr>
+          <w:rFonts w:ascii="Times New Roman" w:hAnsi="Times New Roman" w:cs="Times New Roman"/>
+          <w:u w:val="single" w:color="000000"/>
+        </w:rPr>
+        <w:t>Definition</w:t>
+      </w:r>
+      <w:r>
+        <w:rPr>
+          <w:rFonts w:ascii="Times New Roman" w:hAnsi="Times New Roman" w:cs="Times New Roman"/>
+        </w:rPr>
+        <w:t>: The Software will be considered as installed when it is loaded on the Server.</w:t>
+      </w:r>
+    </w:p>
+    <w:p>
+      <w:pPr>
+        <w:ind w:right="273"/>
+        <w:rPr>
+          <w:rFonts w:ascii="Times New Roman" w:hAnsi="Times New Roman" w:cs="Times New Roman"/>
+        </w:rPr>
+      </w:pPr>
+      <w:r>
+        <w:rPr>
+          <w:rFonts w:ascii="Times New Roman" w:hAnsi="Times New Roman" w:cs="Times New Roman"/>
+          <w:u w:val="single" w:color="000000"/>
+        </w:rPr>
+        <w:t>Installation pre-requisites (in case of on-premise Server)</w:t>
+      </w:r>
+      <w:r>
+        <w:rPr>
+          <w:rFonts w:ascii="Times New Roman" w:hAnsi="Times New Roman" w:cs="Times New Roman"/>
+        </w:rPr>
+        <w:t xml:space="preserve">: We will install the Software only after we receive the Site readiness report from you. A Copy of which will be forwarded to you along with our Order Acceptance / Request for Installation. </w:t>
+      </w:r>
+    </w:p>
+    <w:p>
+      <w:pPr>
+        <w:spacing w:before="160" w:after="40"/>
+        <w:rPr>
+          <w:rFonts w:ascii="Times New Roman" w:hAnsi="Times New Roman" w:cs="Times New Roman"/>
+          <w:color w:val="000000" w:themeColor="text1"/>
+        </w:rPr>
+      </w:pPr>
+      <w:r>
+        <w:rPr>
+          <w:rFonts w:ascii="Times New Roman" w:hAnsi="Times New Roman" w:cs="Times New Roman"/>
+          <w:color w:val="000000" w:themeColor="text1"/>
+        </w:rPr>
+        <w:t>6. Excused Performance</w:t>
       </w:r>
     </w:p>
     <w:p>
@@ -4182,21 +4742,31 @@
         <w:rPr>
           <w:rFonts w:ascii="Times New Roman" w:hAnsi="Times New Roman" w:cs="Times New Roman"/>
         </w:rPr>
-        <w:t xml:space="preserve">Source Code remains the property of </w:t>
-      </w:r>
-      <w:proofErr w:type="spellStart"/>
-      <w:r>
-        <w:rPr>
-          <w:rFonts w:ascii="Times New Roman" w:hAnsi="Times New Roman" w:cs="Times New Roman"/>
-        </w:rPr>
-        <w:t>BlechTek</w:t>
-      </w:r>
-      <w:proofErr w:type="spellEnd"/>
-      <w:r>
-        <w:rPr>
-          <w:rFonts w:ascii="Times New Roman" w:hAnsi="Times New Roman" w:cs="Times New Roman"/>
-        </w:rPr>
-        <w:t xml:space="preserve"> Software Solutions LLP. The customer shall not claim any right in or to any patent, copyright, trademark or other proprietary right of the original manufacturer, developer or licensor. The software, hardware or other goods supplied are in accordance with the export laws of the respective countries, and diversion contrary to these laws or regulations is prohibited.</w:t>
+        <w:t xml:space="preserve">BlechTek shall not be liable or deemed to be in default for any delay or failure in performance under this Contract or interruption of services due to strike or </w:t>
+      </w:r>
+      <w:r>
+        <w:rPr>
+          <w:rFonts w:ascii="Times New Roman" w:hAnsi="Times New Roman" w:cs="Times New Roman"/>
+        </w:rPr>
+        <w:t>labour</w:t>
+      </w:r>
+      <w:r>
+        <w:rPr>
+          <w:rFonts w:ascii="Times New Roman" w:hAnsi="Times New Roman" w:cs="Times New Roman"/>
+        </w:rPr>
+        <w:t xml:space="preserve"> disputes, riots, war, fire, acts of God or governmental regulations. BlechTek should not be held responsible, directly or indirectly for </w:t>
+      </w:r>
+      <w:r>
+        <w:rPr>
+          <w:rFonts w:ascii="Times New Roman" w:hAnsi="Times New Roman" w:cs="Times New Roman"/>
+        </w:rPr>
+        <w:t>non-performance</w:t>
+      </w:r>
+      <w:r>
+        <w:rPr>
+          <w:rFonts w:ascii="Times New Roman" w:hAnsi="Times New Roman" w:cs="Times New Roman"/>
+        </w:rPr>
+        <w:t xml:space="preserve"> of our software due to failure or malfunction of computer or telecommunications hardware, network or related equipment at your installation site.</w:t>
       </w:r>
     </w:p>
     <w:p>
@@ -4212,117 +4782,7 @@
           <w:rFonts w:ascii="Times New Roman" w:hAnsi="Times New Roman" w:cs="Times New Roman"/>
           <w:color w:val="000000" w:themeColor="text1"/>
         </w:rPr>
-        <w:t>4. Warranty</w:t>
-      </w:r>
-    </w:p>
-    <w:p>
-      <w:pPr>
-        <w:spacing w:before="160" w:after="40"/>
-        <w:rPr>
-          <w:rFonts w:ascii="Times New Roman" w:hAnsi="Times New Roman" w:cs="Times New Roman"/>
-        </w:rPr>
-      </w:pPr>
-      <w:proofErr w:type="spellStart"/>
-      <w:r>
-        <w:rPr>
-          <w:rFonts w:ascii="Times New Roman" w:hAnsi="Times New Roman" w:cs="Times New Roman"/>
-        </w:rPr>
-        <w:t>BlechTek</w:t>
-      </w:r>
-      <w:proofErr w:type="spellEnd"/>
-      <w:r>
-        <w:rPr>
-          <w:rFonts w:ascii="Times New Roman" w:hAnsi="Times New Roman" w:cs="Times New Roman"/>
-        </w:rPr>
-        <w:t xml:space="preserve"> Software Solutions LLP offers a Standard Warranty against Development defects for the period of 3 Months from the Date of Installation. And </w:t>
-      </w:r>
-      <w:proofErr w:type="spellStart"/>
-      <w:r>
-        <w:rPr>
-          <w:rFonts w:ascii="Times New Roman" w:hAnsi="Times New Roman" w:cs="Times New Roman"/>
-        </w:rPr>
-        <w:t>BlechTek</w:t>
-      </w:r>
-      <w:proofErr w:type="spellEnd"/>
-      <w:r>
-        <w:rPr>
-          <w:rFonts w:ascii="Times New Roman" w:hAnsi="Times New Roman" w:cs="Times New Roman"/>
-        </w:rPr>
-        <w:t xml:space="preserve"> Software Solutions LLP is not responsible for the loss of Data due to any Platform related or Cyber Security Issues or Virus problems. </w:t>
-      </w:r>
-    </w:p>
-    <w:p>
-      <w:pPr>
-        <w:spacing w:before="160" w:after="40"/>
-        <w:rPr>
-          <w:rFonts w:ascii="Times New Roman" w:hAnsi="Times New Roman" w:cs="Times New Roman"/>
-          <w:color w:val="000000" w:themeColor="text1"/>
-        </w:rPr>
-      </w:pPr>
-      <w:r>
-        <w:rPr>
-          <w:rFonts w:ascii="Times New Roman" w:hAnsi="Times New Roman" w:cs="Times New Roman"/>
-          <w:color w:val="000000" w:themeColor="text1"/>
-        </w:rPr>
-        <w:t>5. Installation of Software</w:t>
-      </w:r>
-    </w:p>
-    <w:p>
-      <w:pPr>
-        <w:spacing w:before="160" w:after="40"/>
-        <w:rPr>
-          <w:rFonts w:ascii="Times New Roman" w:hAnsi="Times New Roman" w:cs="Times New Roman"/>
-        </w:rPr>
-      </w:pPr>
-      <w:r>
-        <w:rPr>
-          <w:rFonts w:ascii="Times New Roman" w:hAnsi="Times New Roman" w:cs="Times New Roman"/>
-          <w:u w:val="single" w:color="000000"/>
-        </w:rPr>
-        <w:t>Definition</w:t>
-      </w:r>
-      <w:r>
-        <w:rPr>
-          <w:rFonts w:ascii="Times New Roman" w:hAnsi="Times New Roman" w:cs="Times New Roman"/>
-        </w:rPr>
-        <w:t>: The Software will be considered as installed when it is loaded on the Server.</w:t>
-      </w:r>
-    </w:p>
-    <w:p>
-      <w:pPr>
-        <w:ind w:right="273"/>
-        <w:rPr>
-          <w:rFonts w:ascii="Times New Roman" w:hAnsi="Times New Roman" w:cs="Times New Roman"/>
-        </w:rPr>
-      </w:pPr>
-      <w:r>
-        <w:rPr>
-          <w:rFonts w:ascii="Times New Roman" w:hAnsi="Times New Roman" w:cs="Times New Roman"/>
-          <w:u w:val="single" w:color="000000"/>
-        </w:rPr>
-        <w:t>Installation pre-requisites (in case of on-premise Server)</w:t>
-      </w:r>
-      <w:r>
-        <w:rPr>
-          <w:rFonts w:ascii="Times New Roman" w:hAnsi="Times New Roman" w:cs="Times New Roman"/>
-        </w:rPr>
-        <w:t xml:space="preserve">: We will install the Software only after we receive the Site readiness report from you. A Copy of which will be forwarded to you along with our Order Acceptance / Request for Installation. </w:t>
-      </w:r>
-    </w:p>
-    <w:p>
-      <w:pPr>
-        <w:spacing w:before="160" w:after="40"/>
-        <w:rPr>
-          <w:rFonts w:ascii="Times New Roman" w:hAnsi="Times New Roman" w:cs="Times New Roman"/>
-          <w:color w:val="000000" w:themeColor="text1"/>
-        </w:rPr>
-      </w:pPr>
-      <w:r>
-        <w:rPr>
-          <w:rFonts w:ascii="Times New Roman" w:hAnsi="Times New Roman" w:cs="Times New Roman"/>
-          <w:color w:val="000000" w:themeColor="text1"/>
-        </w:rPr>
-        <w:t>6. Excused Performance</w:t>
+        <w:t>7. Discontinuation of Contract</w:t>
       </w:r>
     </w:p>
     <w:p>
@@ -4332,107 +4792,12 @@
           <w:rFonts w:ascii="Times New Roman" w:hAnsi="Times New Roman" w:cs="Times New Roman"/>
         </w:rPr>
       </w:pPr>
-      <w:proofErr w:type="spellStart"/>
-      <w:r>
-        <w:rPr>
-          <w:rFonts w:ascii="Times New Roman" w:hAnsi="Times New Roman" w:cs="Times New Roman"/>
-        </w:rPr>
-        <w:t>BlechTek</w:t>
-      </w:r>
-      <w:proofErr w:type="spellEnd"/>
-      <w:r>
-        <w:rPr>
-          <w:rFonts w:ascii="Times New Roman" w:hAnsi="Times New Roman" w:cs="Times New Roman"/>
-        </w:rPr>
-        <w:t xml:space="preserve"> shall not be liable or deemed to be in default for any delay or failure in performance under this Contract or interruption of services due to strike or </w:t>
-      </w:r>
-      <w:proofErr w:type="spellStart"/>
-      <w:r>
-        <w:rPr>
-          <w:rFonts w:ascii="Times New Roman" w:hAnsi="Times New Roman" w:cs="Times New Roman"/>
-        </w:rPr>
-        <w:t>labor</w:t>
-      </w:r>
-      <w:proofErr w:type="spellEnd"/>
-      <w:r>
-        <w:rPr>
-          <w:rFonts w:ascii="Times New Roman" w:hAnsi="Times New Roman" w:cs="Times New Roman"/>
-        </w:rPr>
-        <w:t xml:space="preserve"> disputes, riots, war, fire, acts of God or governmental regulations. </w:t>
-      </w:r>
-      <w:proofErr w:type="spellStart"/>
-      <w:r>
-        <w:rPr>
-          <w:rFonts w:ascii="Times New Roman" w:hAnsi="Times New Roman" w:cs="Times New Roman"/>
-        </w:rPr>
-        <w:t>BlechTek</w:t>
-      </w:r>
-      <w:proofErr w:type="spellEnd"/>
-      <w:r>
-        <w:rPr>
-          <w:rFonts w:ascii="Times New Roman" w:hAnsi="Times New Roman" w:cs="Times New Roman"/>
-        </w:rPr>
-        <w:t xml:space="preserve"> should not be held responsible, directly or indirectly for </w:t>
-      </w:r>
-      <w:proofErr w:type="spellStart"/>
-      <w:r>
-        <w:rPr>
-          <w:rFonts w:ascii="Times New Roman" w:hAnsi="Times New Roman" w:cs="Times New Roman"/>
-        </w:rPr>
-        <w:t>nonperformance</w:t>
-      </w:r>
-      <w:proofErr w:type="spellEnd"/>
-      <w:r>
-        <w:rPr>
-          <w:rFonts w:ascii="Times New Roman" w:hAnsi="Times New Roman" w:cs="Times New Roman"/>
-        </w:rPr>
-        <w:t xml:space="preserve"> of our software due to failure or malfunction of computer or telecommunications hardware, network or related equipment at your installation site.</w:t>
-      </w:r>
-    </w:p>
-    <w:p>
-      <w:pPr>
-        <w:spacing w:before="160" w:after="40"/>
-        <w:rPr>
-          <w:rFonts w:ascii="Times New Roman" w:hAnsi="Times New Roman" w:cs="Times New Roman"/>
-          <w:color w:val="000000" w:themeColor="text1"/>
-        </w:rPr>
-      </w:pPr>
-      <w:r>
-        <w:rPr>
-          <w:rFonts w:ascii="Times New Roman" w:hAnsi="Times New Roman" w:cs="Times New Roman"/>
-          <w:color w:val="000000" w:themeColor="text1"/>
-        </w:rPr>
-        <w:t>7. Discontinuation of Contract</w:t>
-      </w:r>
-    </w:p>
-    <w:p>
-      <w:pPr>
-        <w:spacing w:after="60"/>
-        <w:rPr>
-          <w:rFonts w:ascii="Times New Roman" w:hAnsi="Times New Roman" w:cs="Times New Roman"/>
-        </w:rPr>
-      </w:pPr>
-      <w:r>
-        <w:rPr>
-          <w:rFonts w:ascii="Times New Roman" w:hAnsi="Times New Roman" w:cs="Times New Roman"/>
-        </w:rPr>
-        <w:t xml:space="preserve">You will be required to pay the balance amount to </w:t>
-      </w:r>
-      <w:proofErr w:type="spellStart"/>
-      <w:r>
-        <w:rPr>
-          <w:rFonts w:ascii="Times New Roman" w:hAnsi="Times New Roman" w:cs="Times New Roman"/>
-        </w:rPr>
-        <w:t>BlechTek</w:t>
-      </w:r>
-      <w:proofErr w:type="spellEnd"/>
-      <w:r>
-        <w:rPr>
-          <w:rFonts w:ascii="Times New Roman" w:hAnsi="Times New Roman" w:cs="Times New Roman"/>
-        </w:rPr>
-        <w:t xml:space="preserve"> immediately in case of the </w:t>
-      </w:r>
-      <w:proofErr w:type="gramStart"/>
+      <w:r>
+        <w:rPr>
+          <w:rFonts w:ascii="Times New Roman" w:hAnsi="Times New Roman" w:cs="Times New Roman"/>
+        </w:rPr>
+        <w:t xml:space="preserve">You will be required to pay the balance amount to BlechTek immediately in case of the </w:t>
+      </w:r>
       <w:r>
         <w:rPr>
           <w:rFonts w:ascii="Times New Roman" w:hAnsi="Times New Roman" w:cs="Times New Roman"/>
@@ -4443,9 +4808,8 @@
         <w:rPr>
           <w:rFonts w:ascii="Times New Roman" w:hAnsi="Times New Roman" w:cs="Times New Roman"/>
         </w:rPr>
-        <w:t>..</w:t>
-      </w:r>
-      <w:proofErr w:type="gramEnd"/>
+        <w:t>...</w:t>
+      </w:r>
     </w:p>
     <w:p>
       <w:pPr>
@@ -4463,16 +4827,14 @@
         <w:rPr>
           <w:rFonts w:ascii="Times New Roman" w:hAnsi="Times New Roman" w:cs="Times New Roman"/>
         </w:rPr>
-        <w:t xml:space="preserve">discontinuation of the contract for reasons that are not related to </w:t>
-      </w:r>
-      <w:proofErr w:type="spellStart"/>
-      <w:r>
-        <w:rPr>
-          <w:rFonts w:ascii="Times New Roman" w:hAnsi="Times New Roman" w:cs="Times New Roman"/>
-        </w:rPr>
-        <w:t>BlechTek</w:t>
-      </w:r>
-      <w:proofErr w:type="spellEnd"/>
+        <w:t>D</w:t>
+      </w:r>
+      <w:r>
+        <w:rPr>
+          <w:rFonts w:ascii="Times New Roman" w:hAnsi="Times New Roman" w:cs="Times New Roman"/>
+        </w:rPr>
+        <w:t>iscontinuation of the contract for reasons that are not related to BlechTek</w:t>
+      </w:r>
     </w:p>
     <w:p>
       <w:pPr>
@@ -4526,183 +4888,162 @@
         <w:rPr>
           <w:rFonts w:ascii="Times New Roman" w:hAnsi="Times New Roman" w:cs="Times New Roman"/>
         </w:rPr>
-        <w:t xml:space="preserve">In case of deduction of TDS Amount, </w:t>
-      </w:r>
-      <w:proofErr w:type="gramStart"/>
-      <w:r>
-        <w:rPr>
-          <w:rFonts w:ascii="Times New Roman" w:hAnsi="Times New Roman" w:cs="Times New Roman"/>
-        </w:rPr>
-        <w:t>You</w:t>
-      </w:r>
-      <w:proofErr w:type="gramEnd"/>
+        <w:t xml:space="preserve">In case of deduction of TDS Amount, You have to give us the TDS certificate immediately along with our Payment. If we do not receive the TDS Certificate within 6 months or by the end of the Financial Year, you </w:t>
+      </w:r>
+    </w:p>
+    <w:p>
+      <w:pPr>
+        <w:spacing w:before="160" w:after="40"/>
+        <w:rPr>
+          <w:rFonts w:ascii="Times New Roman" w:hAnsi="Times New Roman" w:cs="Times New Roman"/>
+          <w:color w:val="000000" w:themeColor="text1"/>
+        </w:rPr>
+      </w:pPr>
+      <w:r>
+        <w:rPr>
+          <w:rFonts w:ascii="Times New Roman" w:hAnsi="Times New Roman" w:cs="Times New Roman"/>
+          <w:color w:val="000000" w:themeColor="text1"/>
+        </w:rPr>
+        <w:t>9. Validity of the Offer</w:t>
+      </w:r>
+    </w:p>
+    <w:p>
+      <w:pPr>
+        <w:spacing w:after="60"/>
+        <w:rPr>
+          <w:rFonts w:ascii="Times New Roman" w:hAnsi="Times New Roman" w:cs="Times New Roman"/>
+        </w:rPr>
+      </w:pPr>
+      <w:r>
+        <w:rPr>
+          <w:rFonts w:ascii="Times New Roman" w:hAnsi="Times New Roman" w:cs="Times New Roman"/>
+        </w:rPr>
+        <w:t>This offer is valid up to {{VALIDATION_DATE}}.</w:t>
+      </w:r>
+    </w:p>
+    <w:p>
+      <w:pPr>
+        <w:spacing w:before="160" w:after="40"/>
+        <w:rPr>
+          <w:rFonts w:ascii="Times New Roman" w:hAnsi="Times New Roman" w:cs="Times New Roman"/>
+          <w:color w:val="000000" w:themeColor="text1"/>
+        </w:rPr>
+      </w:pPr>
+    </w:p>
+    <w:p>
+      <w:pPr>
+        <w:spacing w:before="160" w:after="40"/>
+        <w:rPr>
+          <w:rFonts w:ascii="Times New Roman" w:hAnsi="Times New Roman" w:cs="Times New Roman"/>
+          <w:color w:val="000000" w:themeColor="text1"/>
+        </w:rPr>
+      </w:pPr>
+    </w:p>
+    <w:p>
+      <w:pPr>
+        <w:spacing w:before="160" w:after="40"/>
+        <w:rPr>
+          <w:rFonts w:ascii="Times New Roman" w:hAnsi="Times New Roman" w:cs="Times New Roman"/>
+          <w:color w:val="000000" w:themeColor="text1"/>
+        </w:rPr>
+      </w:pPr>
+      <w:r>
+        <w:rPr>
+          <w:rFonts w:ascii="Times New Roman" w:hAnsi="Times New Roman" w:cs="Times New Roman"/>
+          <w:color w:val="000000" w:themeColor="text1"/>
+        </w:rPr>
+        <w:t>10. Suggestions by Auditors / Consultants</w:t>
+      </w:r>
+    </w:p>
+    <w:p>
+      <w:pPr>
+        <w:spacing w:before="160" w:after="40"/>
+        <w:rPr>
+          <w:rFonts w:ascii="Times New Roman" w:hAnsi="Times New Roman" w:cs="Times New Roman"/>
+        </w:rPr>
+      </w:pPr>
+      <w:r>
+        <w:rPr>
+          <w:rFonts w:ascii="Times New Roman" w:hAnsi="Times New Roman" w:cs="Times New Roman"/>
+        </w:rPr>
+        <w:t xml:space="preserve">Any suggestions by your Auditors and / or Consultants should be discussed before the finalization of the Order. If any suggestions are made after the finalization of the order, the same will be considered only after the completion of this </w:t>
+      </w:r>
+      <w:r>
+        <w:rPr>
+          <w:rFonts w:ascii="Times New Roman" w:hAnsi="Times New Roman" w:cs="Times New Roman"/>
+        </w:rPr>
+        <w:t>Order and</w:t>
+      </w:r>
+      <w:r>
+        <w:rPr>
+          <w:rFonts w:ascii="Times New Roman" w:hAnsi="Times New Roman" w:cs="Times New Roman"/>
+        </w:rPr>
+        <w:t xml:space="preserve"> would be charged extra. </w:t>
+      </w:r>
+    </w:p>
+    <w:p>
+      <w:pPr>
+        <w:spacing w:before="160" w:after="40"/>
+        <w:rPr>
+          <w:rFonts w:ascii="Times New Roman" w:hAnsi="Times New Roman" w:cs="Times New Roman"/>
+          <w:color w:val="000000" w:themeColor="text1"/>
+        </w:rPr>
+      </w:pPr>
+      <w:r>
+        <w:rPr>
+          <w:rFonts w:ascii="Times New Roman" w:hAnsi="Times New Roman" w:cs="Times New Roman"/>
+          <w:color w:val="000000" w:themeColor="text1"/>
+        </w:rPr>
+        <w:t>11. Legal</w:t>
+      </w:r>
+    </w:p>
+    <w:p>
+      <w:pPr>
+        <w:spacing w:after="60"/>
+        <w:rPr>
+          <w:rFonts w:ascii="Times New Roman" w:hAnsi="Times New Roman" w:cs="Times New Roman"/>
+        </w:rPr>
+      </w:pPr>
+      <w:r>
+        <w:rPr>
+          <w:rFonts w:ascii="Times New Roman" w:hAnsi="Times New Roman" w:cs="Times New Roman"/>
+        </w:rPr>
+        <w:t>Any disputes arising out of in relation to this order is subject to jurisdiction of courts at Pune, Maharashtra.</w:t>
+      </w:r>
+    </w:p>
+    <w:p>
+      <w:pPr>
+        <w:spacing w:before="300" w:after="40"/>
+        <w:rPr>
+          <w:rFonts w:ascii="Times New Roman" w:hAnsi="Times New Roman" w:cs="Times New Roman"/>
+        </w:rPr>
+      </w:pPr>
+      <w:r>
+        <w:rPr>
+          <w:rFonts w:ascii="Times New Roman" w:hAnsi="Times New Roman" w:cs="Times New Roman"/>
+        </w:rPr>
+        <w:t xml:space="preserve">We hope this document aligns with our discussions. Please feel free to reach out for any clarification. </w:t>
+      </w:r>
+    </w:p>
+    <w:p>
+      <w:pPr>
+        <w:spacing w:before="300" w:after="40" w:line="360" w:lineRule="auto"/>
+        <w:rPr>
+          <w:rFonts w:ascii="Times New Roman" w:hAnsi="Times New Roman" w:cs="Times New Roman"/>
+        </w:rPr>
+      </w:pPr>
+      <w:r>
+        <w:rPr>
+          <w:rFonts w:ascii="Times New Roman" w:hAnsi="Times New Roman" w:cs="Times New Roman"/>
+        </w:rPr>
+        <w:t>Thanking you in anticipation.</w:t>
+      </w:r>
       <w:r>
         <w:rPr>
           <w:rFonts w:ascii="Times New Roman" w:hAnsi="Times New Roman" w:cs="Times New Roman"/>
         </w:rPr>
         <w:t xml:space="preserve"> </w:t>
       </w:r>
-      <w:proofErr w:type="gramStart"/>
-      <w:r>
-        <w:rPr>
-          <w:rFonts w:ascii="Times New Roman" w:hAnsi="Times New Roman" w:cs="Times New Roman"/>
-        </w:rPr>
-        <w:t>have to</w:t>
-      </w:r>
-      <w:proofErr w:type="gramEnd"/>
-      <w:r>
-        <w:rPr>
-          <w:rFonts w:ascii="Times New Roman" w:hAnsi="Times New Roman" w:cs="Times New Roman"/>
-        </w:rPr>
-        <w:t xml:space="preserve"> give us the TDS certificate immediately along with our Payment. If we do not receive the TDS Certificate within 6 months or by the end of the Financial Year, you </w:t>
-      </w:r>
-    </w:p>
-    <w:p>
-      <w:pPr>
-        <w:spacing w:before="160" w:after="40"/>
-        <w:rPr>
-          <w:rFonts w:ascii="Times New Roman" w:hAnsi="Times New Roman" w:cs="Times New Roman"/>
-          <w:color w:val="000000" w:themeColor="text1"/>
-        </w:rPr>
-      </w:pPr>
-      <w:r>
-        <w:rPr>
-          <w:rFonts w:ascii="Times New Roman" w:hAnsi="Times New Roman" w:cs="Times New Roman"/>
-          <w:color w:val="000000" w:themeColor="text1"/>
-        </w:rPr>
-        <w:t>9. Validity of the Offer</w:t>
-      </w:r>
-    </w:p>
-    <w:p>
-      <w:pPr>
-        <w:spacing w:after="60"/>
-        <w:rPr>
-          <w:rFonts w:ascii="Times New Roman" w:hAnsi="Times New Roman" w:cs="Times New Roman"/>
-        </w:rPr>
-      </w:pPr>
-      <w:r>
-        <w:rPr>
-          <w:rFonts w:ascii="Times New Roman" w:hAnsi="Times New Roman" w:cs="Times New Roman"/>
-        </w:rPr>
-        <w:t>This offer is valid up to {{VALIDATION_DATE}}.</w:t>
-      </w:r>
-    </w:p>
-    <w:p>
-      <w:pPr>
-        <w:spacing w:before="160" w:after="40"/>
-        <w:rPr>
-          <w:rFonts w:ascii="Times New Roman" w:hAnsi="Times New Roman" w:cs="Times New Roman"/>
-          <w:color w:val="000000" w:themeColor="text1"/>
-        </w:rPr>
-      </w:pPr>
-      <w:r>
-        <w:rPr>
-          <w:rFonts w:ascii="Times New Roman" w:hAnsi="Times New Roman" w:cs="Times New Roman"/>
-          <w:color w:val="000000" w:themeColor="text1"/>
-        </w:rPr>
-        <w:t>10. Suggestions by Auditors / Consultants</w:t>
-      </w:r>
-    </w:p>
-    <w:p>
-      <w:pPr>
-        <w:spacing w:before="160" w:after="40"/>
-        <w:rPr>
-          <w:rFonts w:ascii="Times New Roman" w:hAnsi="Times New Roman" w:cs="Times New Roman"/>
-        </w:rPr>
-      </w:pPr>
-      <w:r>
-        <w:rPr>
-          <w:rFonts w:ascii="Times New Roman" w:hAnsi="Times New Roman" w:cs="Times New Roman"/>
-        </w:rPr>
-        <w:t xml:space="preserve">Any suggestions by your Auditors and / or Consultants should be discussed before the finalization of the Order. If any suggestions are made after the finalization of the order, the same will be considered only after the completion of this </w:t>
-      </w:r>
-      <w:proofErr w:type="gramStart"/>
-      <w:r>
-        <w:rPr>
-          <w:rFonts w:ascii="Times New Roman" w:hAnsi="Times New Roman" w:cs="Times New Roman"/>
-        </w:rPr>
-        <w:t>Order, and</w:t>
-      </w:r>
-      <w:proofErr w:type="gramEnd"/>
-      <w:r>
-        <w:rPr>
-          <w:rFonts w:ascii="Times New Roman" w:hAnsi="Times New Roman" w:cs="Times New Roman"/>
-        </w:rPr>
-        <w:t xml:space="preserve"> would be charged extra. </w:t>
-      </w:r>
-    </w:p>
-    <w:p>
-      <w:pPr>
-        <w:spacing w:before="160" w:after="40"/>
-        <w:rPr>
-          <w:rFonts w:ascii="Times New Roman" w:hAnsi="Times New Roman" w:cs="Times New Roman"/>
-          <w:color w:val="000000" w:themeColor="text1"/>
-        </w:rPr>
-      </w:pPr>
-      <w:r>
-        <w:rPr>
-          <w:rFonts w:ascii="Times New Roman" w:hAnsi="Times New Roman" w:cs="Times New Roman"/>
-          <w:color w:val="000000" w:themeColor="text1"/>
-        </w:rPr>
-        <w:t>11. Legal</w:t>
-      </w:r>
-    </w:p>
-    <w:p>
-      <w:pPr>
-        <w:spacing w:after="60"/>
-        <w:rPr>
-          <w:rFonts w:ascii="Times New Roman" w:hAnsi="Times New Roman" w:cs="Times New Roman"/>
-        </w:rPr>
-      </w:pPr>
-      <w:r>
-        <w:rPr>
-          <w:rFonts w:ascii="Times New Roman" w:hAnsi="Times New Roman" w:cs="Times New Roman"/>
-        </w:rPr>
-        <w:t>Any disputes arising out of in relation to this order is subject to jurisdiction of courts at Pune, Maharashtra.</w:t>
-      </w:r>
-    </w:p>
-    <w:p>
-      <w:pPr>
-        <w:spacing w:before="300" w:after="40"/>
-        <w:rPr>
-          <w:rFonts w:ascii="Times New Roman" w:hAnsi="Times New Roman" w:cs="Times New Roman"/>
-        </w:rPr>
-      </w:pPr>
-    </w:p>
-    <w:p>
-      <w:pPr>
-        <w:spacing w:before="300" w:after="40"/>
-        <w:rPr>
-          <w:rFonts w:ascii="Times New Roman" w:hAnsi="Times New Roman" w:cs="Times New Roman"/>
-        </w:rPr>
-      </w:pPr>
-      <w:r>
-        <w:rPr>
-          <w:rFonts w:ascii="Times New Roman" w:hAnsi="Times New Roman" w:cs="Times New Roman"/>
-        </w:rPr>
-        <w:lastRenderedPageBreak/>
-        <w:t xml:space="preserve">We hope this document aligns with our discussions. Please feel free to reach out for any clarification. </w:t>
-      </w:r>
-    </w:p>
-    <w:p>
-      <w:pPr>
-        <w:spacing w:before="300" w:after="40" w:line="360" w:lineRule="auto"/>
-        <w:rPr>
-          <w:rFonts w:ascii="Times New Roman" w:hAnsi="Times New Roman" w:cs="Times New Roman"/>
-        </w:rPr>
-      </w:pPr>
-      <w:r>
-        <w:rPr>
-          <w:rFonts w:ascii="Times New Roman" w:hAnsi="Times New Roman" w:cs="Times New Roman"/>
-        </w:rPr>
-        <w:t>Thanking you in anticipation.</w:t>
-      </w:r>
-      <w:r>
-        <w:rPr>
-          <w:rFonts w:ascii="Times New Roman" w:hAnsi="Times New Roman" w:cs="Times New Roman"/>
-        </w:rPr>
-        <w:t xml:space="preserve"> </w:t>
-      </w:r>
       <w:r>
         <w:rPr>
           <w:rFonts w:ascii="Times New Roman" w:hAnsi="Times New Roman" w:cs="Times New Roman"/>
@@ -4723,23 +5064,7 @@
           <w:rFonts w:ascii="Times New Roman" w:hAnsi="Times New Roman" w:cs="Times New Roman"/>
           <w:color w:val="000000" w:themeColor="text1"/>
         </w:rPr>
-        <w:t xml:space="preserve">For </w:t>
-      </w:r>
-      <w:proofErr w:type="spellStart"/>
-      <w:r>
-        <w:rPr>
-          <w:rFonts w:ascii="Times New Roman" w:hAnsi="Times New Roman" w:cs="Times New Roman"/>
-          <w:color w:val="000000" w:themeColor="text1"/>
-        </w:rPr>
-        <w:t>BlechTek</w:t>
-      </w:r>
-      <w:proofErr w:type="spellEnd"/>
-      <w:r>
-        <w:rPr>
-          <w:rFonts w:ascii="Times New Roman" w:hAnsi="Times New Roman" w:cs="Times New Roman"/>
-          <w:color w:val="000000" w:themeColor="text1"/>
-        </w:rPr>
-        <w:t xml:space="preserve"> Software Solutions LLP</w:t>
+        <w:t>For BlechTek Software Solutions LLP</w:t>
       </w:r>
     </w:p>
     <w:p>
@@ -4747,53 +5072,59 @@
         <w:spacing w:after="20"/>
         <w:rPr>
           <w:rFonts w:ascii="Times New Roman" w:hAnsi="Times New Roman" w:cs="Times New Roman"/>
-        </w:rPr>
-      </w:pPr>
-      <w:r>
-        <w:rPr>
-          <w:rFonts w:ascii="Times New Roman" w:hAnsi="Times New Roman" w:cs="Times New Roman"/>
           <w:noProof/>
         </w:rPr>
-        <w:drawing>
-          <wp:inline distT="0" distB="0" distL="0" distR="0" wp14:anchorId="5F628F96" wp14:editId="632B5E55">
-            <wp:extent cx="1045464" cy="1033272"/>
-            <wp:effectExtent l="0" t="0" r="0" b="0"/>
-            <wp:docPr id="97" name="Picture 97"/>
-            <wp:cNvGraphicFramePr/>
-            <a:graphic xmlns:a="http://schemas.openxmlformats.org/drawingml/2006/main">
-              <a:graphicData uri="http://schemas.openxmlformats.org/drawingml/2006/picture">
-                <pic:pic xmlns:pic="http://schemas.openxmlformats.org/drawingml/2006/picture">
-                  <pic:nvPicPr>
-                    <pic:cNvPr id="97" name="Picture 97"/>
-                    <pic:cNvPicPr/>
-                  </pic:nvPicPr>
-                  <pic:blipFill>
-                    <a:blip r:embed="rId8"/>
-                    <a:stretch>
-                      <a:fillRect/>
-                    </a:stretch>
-                  </pic:blipFill>
-                  <pic:spPr>
-                    <a:xfrm>
-                      <a:off x="0" y="0"/>
-                      <a:ext cx="1045464" cy="1033272"/>
-                    </a:xfrm>
-                    <a:prstGeom prst="rect">
-                      <a:avLst/>
-                    </a:prstGeom>
-                  </pic:spPr>
-                </pic:pic>
-              </a:graphicData>
-            </a:graphic>
-          </wp:inline>
-        </w:drawing>
-      </w:r>
+      </w:pPr>
     </w:p>
     <w:p>
       <w:pPr>
         <w:spacing w:after="20"/>
         <w:rPr>
           <w:rFonts w:ascii="Times New Roman" w:hAnsi="Times New Roman" w:cs="Times New Roman"/>
+          <w:noProof/>
+        </w:rPr>
+      </w:pPr>
+    </w:p>
+    <w:p>
+      <w:pPr>
+        <w:spacing w:after="20"/>
+        <w:rPr>
+          <w:rFonts w:ascii="Times New Roman" w:hAnsi="Times New Roman" w:cs="Times New Roman"/>
+          <w:noProof/>
+        </w:rPr>
+      </w:pPr>
+    </w:p>
+    <w:p>
+      <w:pPr>
+        <w:spacing w:after="20"/>
+        <w:rPr>
+          <w:rFonts w:ascii="Times New Roman" w:hAnsi="Times New Roman" w:cs="Times New Roman"/>
+          <w:noProof/>
+        </w:rPr>
+      </w:pPr>
+    </w:p>
+    <w:p>
+      <w:pPr>
+        <w:spacing w:after="20"/>
+        <w:rPr>
+          <w:rFonts w:ascii="Times New Roman" w:hAnsi="Times New Roman" w:cs="Times New Roman"/>
+          <w:noProof/>
+        </w:rPr>
+      </w:pPr>
+    </w:p>
+    <w:p>
+      <w:pPr>
+        <w:spacing w:after="20"/>
+        <w:rPr>
+          <w:rFonts w:ascii="Times New Roman" w:hAnsi="Times New Roman" w:cs="Times New Roman"/>
+        </w:rPr>
+      </w:pPr>
+    </w:p>
+    <w:p>
+      <w:pPr>
+        <w:spacing w:after="20"/>
+        <w:rPr>
+          <w:rFonts w:ascii="Times New Roman" w:hAnsi="Times New Roman" w:cs="Times New Roman"/>
         </w:rPr>
       </w:pPr>
       <w:r>
@@ -4820,12 +5151,12 @@
       </w:r>
     </w:p>
     <w:sectPr>
-      <w:headerReference w:type="even" r:id="rId9"/>
-      <w:headerReference w:type="default" r:id="rId10"/>
-      <w:footerReference w:type="even" r:id="rId11"/>
-      <w:footerReference w:type="default" r:id="rId12"/>
-      <w:headerReference w:type="first" r:id="rId13"/>
-      <w:footerReference w:type="first" r:id="rId14"/>
+      <w:headerReference w:type="even" r:id="rId8"/>
+      <w:headerReference w:type="default" r:id="rId9"/>
+      <w:footerReference w:type="even" r:id="rId10"/>
+      <w:footerReference w:type="default" r:id="rId11"/>
+      <w:headerReference w:type="first" r:id="rId12"/>
+      <w:footerReference w:type="first" r:id="rId13"/>
       <w:pgSz w:w="12240" w:h="15840"/>
       <w:pgMar w:top="1000" w:right="1100" w:bottom="1000" w:left="1100" w:header="680" w:footer="737" w:gutter="0"/>
       <w:cols w:space="720"/>
@@ -4880,24 +5211,37 @@
   <w:p>
     <w:pPr>
       <w:jc w:val="center"/>
+      <w:rPr>
+        <w:rFonts w:ascii="Times New Roman" w:hAnsi="Times New Roman" w:cs="Times New Roman"/>
+        <w:color w:val="000000" w:themeColor="text1"/>
+      </w:rPr>
     </w:pPr>
-    <w:proofErr w:type="spellStart"/>
     <w:r>
       <w:rPr>
-        <w:color w:val="5B6478"/>
-        <w:sz w:val="16"/>
-        <w:szCs w:val="16"/>
+        <w:rFonts w:ascii="Times New Roman" w:hAnsi="Times New Roman" w:cs="Times New Roman"/>
+        <w:color w:val="000000" w:themeColor="text1"/>
       </w:rPr>
-      <w:t>BlechTek</w:t>
+      <w:t>BlechTek Software Solutions LLP</w:t>
     </w:r>
-    <w:proofErr w:type="spellEnd"/>
+  </w:p>
+  <w:p>
+    <w:pPr>
+      <w:jc w:val="center"/>
+      <w:rPr>
+        <w:rFonts w:ascii="Times New Roman" w:hAnsi="Times New Roman" w:cs="Times New Roman"/>
+        <w:color w:val="000000" w:themeColor="text1"/>
+        <w:sz w:val="18"/>
+        <w:szCs w:val="18"/>
+      </w:rPr>
+    </w:pPr>
     <w:r>
       <w:rPr>
-        <w:color w:val="5B6478"/>
-        <w:sz w:val="16"/>
-        <w:szCs w:val="16"/>
+        <w:rFonts w:ascii="Times New Roman" w:hAnsi="Times New Roman" w:cs="Times New Roman"/>
+        <w:color w:val="000000" w:themeColor="text1"/>
+        <w:sz w:val="18"/>
+        <w:szCs w:val="18"/>
       </w:rPr>
-      <w:t xml:space="preserve"> Software Solutions LLP</w:t>
+      <w:t xml:space="preserve">Address: S.NO. 257/2/2A/4 ABC Business Center, S Floor, Opp. WindMill Village Road, </w:t>
     </w:r>
   </w:p>
   <w:p>
@@ -4911,83 +5255,12 @@
     </w:pPr>
     <w:r>
       <w:rPr>
-        <w:color w:val="5B6478"/>
-        <w:sz w:val="14"/>
-        <w:szCs w:val="14"/>
+        <w:rFonts w:ascii="Times New Roman" w:hAnsi="Times New Roman" w:cs="Times New Roman"/>
+        <w:color w:val="000000" w:themeColor="text1"/>
+        <w:sz w:val="18"/>
+        <w:szCs w:val="18"/>
       </w:rPr>
-      <w:t xml:space="preserve">Address: S.NO. 257/2/2A/4 ABC Business </w:t>
-    </w:r>
-    <w:proofErr w:type="spellStart"/>
-    <w:r>
-      <w:rPr>
-        <w:color w:val="5B6478"/>
-        <w:sz w:val="14"/>
-        <w:szCs w:val="14"/>
-      </w:rPr>
-      <w:t>Center</w:t>
-    </w:r>
-    <w:proofErr w:type="spellEnd"/>
-    <w:r>
-      <w:rPr>
-        <w:color w:val="5B6478"/>
-        <w:sz w:val="14"/>
-        <w:szCs w:val="14"/>
-      </w:rPr>
-      <w:t xml:space="preserve">, S Floor, Opp. </w:t>
-    </w:r>
-    <w:proofErr w:type="spellStart"/>
-    <w:r>
-      <w:rPr>
-        <w:color w:val="5B6478"/>
-        <w:sz w:val="14"/>
-        <w:szCs w:val="14"/>
-      </w:rPr>
-      <w:t>WindMill</w:t>
-    </w:r>
-    <w:proofErr w:type="spellEnd"/>
-    <w:r>
-      <w:rPr>
-        <w:color w:val="5B6478"/>
-        <w:sz w:val="14"/>
-        <w:szCs w:val="14"/>
-      </w:rPr>
-      <w:t xml:space="preserve"> Village Road, </w:t>
-    </w:r>
-    <w:proofErr w:type="spellStart"/>
-    <w:r>
-      <w:rPr>
-        <w:color w:val="5B6478"/>
-        <w:sz w:val="14"/>
-        <w:szCs w:val="14"/>
-      </w:rPr>
-      <w:t>WindMill</w:t>
-    </w:r>
-    <w:proofErr w:type="spellEnd"/>
-    <w:r>
-      <w:rPr>
-        <w:color w:val="5B6478"/>
-        <w:sz w:val="14"/>
-        <w:szCs w:val="14"/>
-      </w:rPr>
-      <w:t xml:space="preserve"> Village, </w:t>
-    </w:r>
-    <w:proofErr w:type="spellStart"/>
-    <w:r>
-      <w:rPr>
-        <w:color w:val="5B6478"/>
-        <w:sz w:val="14"/>
-        <w:szCs w:val="14"/>
-      </w:rPr>
-      <w:t>Bavdhan</w:t>
-    </w:r>
-    <w:proofErr w:type="spellEnd"/>
-    <w:r>
-      <w:rPr>
-        <w:color w:val="5B6478"/>
-        <w:sz w:val="14"/>
-        <w:szCs w:val="14"/>
-      </w:rPr>
-      <w:t>, Pune 411021, Maharashtra</w:t>
+      <w:t>WindMill Village, Bavdhan, Pune 411021, Maharashtra</w:t>
     </w:r>
     <w:r>
       <w:rPr>
@@ -5033,14 +5306,111 @@
   <w:p>
     <w:pPr>
       <w:jc w:val="center"/>
+      <w:rPr>
+        <w:rFonts w:ascii="Times New Roman" w:hAnsi="Times New Roman" w:cs="Times New Roman"/>
+        <w:color w:val="000000" w:themeColor="text1"/>
+        <w:sz w:val="18"/>
+        <w:szCs w:val="18"/>
+      </w:rPr>
     </w:pPr>
     <w:r>
       <w:rPr>
-        <w:color w:val="5B6478"/>
-        <w:sz w:val="14"/>
-        <w:szCs w:val="14"/>
+        <w:rFonts w:ascii="Times New Roman" w:hAnsi="Times New Roman" w:cs="Times New Roman"/>
+        <w:color w:val="000000" w:themeColor="text1"/>
+        <w:sz w:val="18"/>
+        <w:szCs w:val="18"/>
       </w:rPr>
-      <w:t>LLP No.: ACD-6620 | GST NO.: 27ABCFB0283B1Z0 | MSME Certificate No.: UDYAM-MH-26-0746115</w:t>
+      <w:t>LLP No.: ACD-6620</w:t>
+    </w:r>
+    <w:r>
+      <w:rPr>
+        <w:rFonts w:ascii="Times New Roman" w:hAnsi="Times New Roman" w:cs="Times New Roman"/>
+        <w:color w:val="000000" w:themeColor="text1"/>
+        <w:sz w:val="18"/>
+        <w:szCs w:val="18"/>
+      </w:rPr>
+      <w:t xml:space="preserve">   </w:t>
+    </w:r>
+    <w:r>
+      <w:rPr>
+        <w:rFonts w:ascii="Times New Roman" w:hAnsi="Times New Roman" w:cs="Times New Roman"/>
+        <w:color w:val="000000" w:themeColor="text1"/>
+        <w:sz w:val="18"/>
+        <w:szCs w:val="18"/>
+      </w:rPr>
+      <w:t xml:space="preserve"> |</w:t>
+    </w:r>
+    <w:r>
+      <w:rPr>
+        <w:rFonts w:ascii="Times New Roman" w:hAnsi="Times New Roman" w:cs="Times New Roman"/>
+        <w:color w:val="000000" w:themeColor="text1"/>
+        <w:sz w:val="18"/>
+        <w:szCs w:val="18"/>
+      </w:rPr>
+      <w:t xml:space="preserve"> </w:t>
+    </w:r>
+    <w:r>
+      <w:rPr>
+        <w:rFonts w:ascii="Times New Roman" w:hAnsi="Times New Roman" w:cs="Times New Roman"/>
+        <w:color w:val="000000" w:themeColor="text1"/>
+        <w:sz w:val="18"/>
+        <w:szCs w:val="18"/>
+      </w:rPr>
+      <w:t xml:space="preserve"> </w:t>
+    </w:r>
+    <w:r>
+      <w:rPr>
+        <w:rFonts w:ascii="Times New Roman" w:hAnsi="Times New Roman" w:cs="Times New Roman"/>
+        <w:color w:val="000000" w:themeColor="text1"/>
+        <w:sz w:val="18"/>
+        <w:szCs w:val="18"/>
+      </w:rPr>
+      <w:t xml:space="preserve"> </w:t>
+    </w:r>
+    <w:r>
+      <w:rPr>
+        <w:rFonts w:ascii="Times New Roman" w:hAnsi="Times New Roman" w:cs="Times New Roman"/>
+        <w:color w:val="000000" w:themeColor="text1"/>
+        <w:sz w:val="18"/>
+        <w:szCs w:val="18"/>
+      </w:rPr>
+      <w:t>GST NO.: 27ABCFB0283B1Z0</w:t>
+    </w:r>
+    <w:r>
+      <w:rPr>
+        <w:rFonts w:ascii="Times New Roman" w:hAnsi="Times New Roman" w:cs="Times New Roman"/>
+        <w:color w:val="000000" w:themeColor="text1"/>
+        <w:sz w:val="18"/>
+        <w:szCs w:val="18"/>
+      </w:rPr>
+      <w:t xml:space="preserve">   </w:t>
+    </w:r>
+    <w:r>
+      <w:rPr>
+        <w:rFonts w:ascii="Times New Roman" w:hAnsi="Times New Roman" w:cs="Times New Roman"/>
+        <w:color w:val="000000" w:themeColor="text1"/>
+        <w:sz w:val="18"/>
+        <w:szCs w:val="18"/>
+      </w:rPr>
+      <w:t xml:space="preserve"> | </w:t>
+    </w:r>
+    <w:r>
+      <w:rPr>
+        <w:rFonts w:ascii="Times New Roman" w:hAnsi="Times New Roman" w:cs="Times New Roman"/>
+        <w:color w:val="000000" w:themeColor="text1"/>
+        <w:sz w:val="18"/>
+        <w:szCs w:val="18"/>
+      </w:rPr>
+      <w:t xml:space="preserve">   </w:t>
+    </w:r>
+    <w:r>
+      <w:rPr>
+        <w:rFonts w:ascii="Times New Roman" w:hAnsi="Times New Roman" w:cs="Times New Roman"/>
+        <w:color w:val="000000" w:themeColor="text1"/>
+        <w:sz w:val="18"/>
+        <w:szCs w:val="18"/>
+      </w:rPr>
+      <w:t>MSME Certificate No.: UDYAM-MH-26-0746115</w:t>
     </w:r>
   </w:p>
 </w:ftr>
@@ -5929,6 +6299,7 @@
   <w:style w:type="paragraph" w:default="1" w:styleId="Normal">
     <w:name w:val="Normal"/>
     <w:qFormat/>
+    <w:rsid w:val="00BC150E"/>
   </w:style>
   <w:style w:type="paragraph" w:styleId="Heading1">
     <w:name w:val="heading 1"/>
@@ -6547,6 +6918,25 @@
       <w:color w:val="0F4761" w:themeColor="accent1" w:themeShade="BF"/>
     </w:rPr>
   </w:style>
+  <w:style w:type="table" w:styleId="TableGrid0">
+    <w:name w:val="Table Grid"/>
+    <w:basedOn w:val="TableNormal"/>
+    <w:uiPriority w:val="39"/>
+    <w:rsid w:val="00493816"/>
+    <w:pPr>
+      <w:spacing w:line="240" w:lineRule="auto"/>
+    </w:pPr>
+    <w:tblPr>
+      <w:tblBorders>
+        <w:top w:val="single" w:sz="4" w:space="0" w:color="auto"/>
+        <w:left w:val="single" w:sz="4" w:space="0" w:color="auto"/>
+        <w:bottom w:val="single" w:sz="4" w:space="0" w:color="auto"/>
+        <w:right w:val="single" w:sz="4" w:space="0" w:color="auto"/>
+        <w:insideH w:val="single" w:sz="4" w:space="0" w:color="auto"/>
+        <w:insideV w:val="single" w:sz="4" w:space="0" w:color="auto"/>
+      </w:tblBorders>
+    </w:tblPr>
+  </w:style>
 </w:styles>
 </file>
 

</xml_diff>

<commit_message>
updates about price of implementation part
</commit_message>
<xml_diff>
--- a/QuotationApp.API/Templates/QuotationTemplate_Updated - Copy.docx
+++ b/QuotationApp.API/Templates/QuotationTemplate_Updated - Copy.docx
@@ -284,7 +284,6 @@
         </w:rPr>
         <w:tab/>
       </w:r>
-      <w:proofErr w:type="gramStart"/>
       <w:r>
         <w:rPr>
           <w:rFonts w:ascii="Times New Roman" w:hAnsi="Times New Roman" w:cs="Times New Roman"/>
@@ -302,37 +301,56 @@
           <w:sz w:val="18"/>
           <w:szCs w:val="18"/>
         </w:rPr>
-        <w:t>{{</w:t>
-      </w:r>
-      <w:proofErr w:type="gramEnd"/>
-      <w:r>
+        <w:t>{{Date}}</w:t>
+      </w:r>
+    </w:p>
+    <w:p>
+      <w:pPr>
+        <w:spacing w:after="120" w:line="240" w:lineRule="auto"/>
         <w:rPr>
           <w:rFonts w:ascii="Times New Roman" w:hAnsi="Times New Roman" w:cs="Times New Roman"/>
           <w:color w:val="65AADB"/>
           <w:sz w:val="18"/>
           <w:szCs w:val="18"/>
         </w:rPr>
-        <w:t>Date}}</w:t>
-      </w:r>
-    </w:p>
-    <w:p>
-      <w:pPr>
-        <w:spacing w:after="120" w:line="240" w:lineRule="auto"/>
+      </w:pPr>
+      <w:r>
+        <w:rPr>
+          <w:rFonts w:ascii="Times New Roman" w:hAnsi="Times New Roman" w:cs="Times New Roman"/>
+          <w:color w:val="000000" w:themeColor="text1"/>
+          <w:sz w:val="18"/>
+          <w:szCs w:val="18"/>
+        </w:rPr>
+        <w:t xml:space="preserve">Address: </w:t>
+      </w:r>
+      <w:r>
         <w:rPr>
           <w:rFonts w:ascii="Times New Roman" w:hAnsi="Times New Roman" w:cs="Times New Roman"/>
           <w:color w:val="65AADB"/>
           <w:sz w:val="18"/>
           <w:szCs w:val="18"/>
         </w:rPr>
-      </w:pPr>
-      <w:r>
+        <w:t>{{CONTACT_ADDRESS}}</w:t>
+      </w:r>
+    </w:p>
+    <w:p>
+      <w:pPr>
+        <w:spacing w:after="200" w:line="240" w:lineRule="auto"/>
         <w:rPr>
           <w:rFonts w:ascii="Times New Roman" w:hAnsi="Times New Roman" w:cs="Times New Roman"/>
           <w:color w:val="000000" w:themeColor="text1"/>
           <w:sz w:val="18"/>
           <w:szCs w:val="18"/>
         </w:rPr>
-        <w:t xml:space="preserve">Address: </w:t>
+      </w:pPr>
+      <w:r>
+        <w:rPr>
+          <w:rFonts w:ascii="Times New Roman" w:hAnsi="Times New Roman" w:cs="Times New Roman"/>
+          <w:color w:val="000000" w:themeColor="text1"/>
+          <w:sz w:val="18"/>
+          <w:szCs w:val="18"/>
+        </w:rPr>
+        <w:t xml:space="preserve">Contact No.: </w:t>
       </w:r>
       <w:r>
         <w:rPr>
@@ -341,27 +359,16 @@
           <w:sz w:val="18"/>
           <w:szCs w:val="18"/>
         </w:rPr>
-        <w:t>{{CONTACT_ADDRESS}}</w:t>
-      </w:r>
-    </w:p>
-    <w:p>
-      <w:pPr>
-        <w:spacing w:after="200" w:line="240" w:lineRule="auto"/>
+        <w:t xml:space="preserve">{{CONTACT_PHONE}}   </w:t>
+      </w:r>
+      <w:r>
         <w:rPr>
           <w:rFonts w:ascii="Times New Roman" w:hAnsi="Times New Roman" w:cs="Times New Roman"/>
           <w:color w:val="000000" w:themeColor="text1"/>
           <w:sz w:val="18"/>
           <w:szCs w:val="18"/>
         </w:rPr>
-      </w:pPr>
-      <w:r>
-        <w:rPr>
-          <w:rFonts w:ascii="Times New Roman" w:hAnsi="Times New Roman" w:cs="Times New Roman"/>
-          <w:color w:val="000000" w:themeColor="text1"/>
-          <w:sz w:val="18"/>
-          <w:szCs w:val="18"/>
-        </w:rPr>
-        <w:t xml:space="preserve">Contact No.: </w:t>
+        <w:t xml:space="preserve">|   Email: </w:t>
       </w:r>
       <w:r>
         <w:rPr>
@@ -370,35 +377,6 @@
           <w:sz w:val="18"/>
           <w:szCs w:val="18"/>
         </w:rPr>
-        <w:t>{{CONTACT_PHONE</w:t>
-      </w:r>
-      <w:proofErr w:type="gramStart"/>
-      <w:r>
-        <w:rPr>
-          <w:rFonts w:ascii="Times New Roman" w:hAnsi="Times New Roman" w:cs="Times New Roman"/>
-          <w:color w:val="65AADB"/>
-          <w:sz w:val="18"/>
-          <w:szCs w:val="18"/>
-        </w:rPr>
-        <w:t xml:space="preserve">}}   </w:t>
-      </w:r>
-      <w:proofErr w:type="gramEnd"/>
-      <w:r>
-        <w:rPr>
-          <w:rFonts w:ascii="Times New Roman" w:hAnsi="Times New Roman" w:cs="Times New Roman"/>
-          <w:color w:val="000000" w:themeColor="text1"/>
-          <w:sz w:val="18"/>
-          <w:szCs w:val="18"/>
-        </w:rPr>
-        <w:t xml:space="preserve">|   Email: </w:t>
-      </w:r>
-      <w:r>
-        <w:rPr>
-          <w:rFonts w:ascii="Times New Roman" w:hAnsi="Times New Roman" w:cs="Times New Roman"/>
-          <w:color w:val="65AADB"/>
-          <w:sz w:val="18"/>
-          <w:szCs w:val="18"/>
-        </w:rPr>
         <w:t>{{CONTACT_EMAIL}}</w:t>
       </w:r>
     </w:p>
@@ -563,25 +541,7 @@
           <w:color w:val="000000" w:themeColor="text1"/>
           <w:lang w:val="en-US"/>
         </w:rPr>
-        <w:t>We discussed the current challenges and solutions CQUAL can provide</w:t>
-      </w:r>
-      <w:proofErr w:type="gramStart"/>
-      <w:r>
-        <w:rPr>
-          <w:rFonts w:ascii="Times New Roman" w:hAnsi="Times New Roman" w:cs="Times New Roman"/>
-          <w:color w:val="000000" w:themeColor="text1"/>
-          <w:lang w:val="en-US"/>
-        </w:rPr>
-        <w:t>, based</w:t>
-      </w:r>
-      <w:proofErr w:type="gramEnd"/>
-      <w:r>
-        <w:rPr>
-          <w:rFonts w:ascii="Times New Roman" w:hAnsi="Times New Roman" w:cs="Times New Roman"/>
-          <w:color w:val="000000" w:themeColor="text1"/>
-          <w:lang w:val="en-US"/>
-        </w:rPr>
-        <w:t xml:space="preserve"> on our brief discussions, please find attached a Preliminary Business Proposal for the required changeover at </w:t>
+        <w:t xml:space="preserve">We discussed the current challenges and solutions CQUAL can provide, based on our brief discussions, please find attached a Preliminary Business Proposal for the required changeover at </w:t>
       </w:r>
       <w:r>
         <w:rPr>
@@ -1203,6 +1163,308 @@
         </w:rPr>
       </w:pPr>
     </w:p>
+    <w:p>
+      <w:pPr>
+        <w:spacing w:after="200"/>
+        <w:rPr>
+          <w:rFonts w:ascii="Times New Roman" w:hAnsi="Times New Roman" w:cs="Times New Roman"/>
+        </w:rPr>
+      </w:pPr>
+      <w:r>
+        <w:rPr>
+          <w:rFonts w:ascii="Times New Roman" w:hAnsi="Times New Roman" w:cs="Times New Roman"/>
+        </w:rPr>
+        <w:t>Additional Scope:</w:t>
+      </w:r>
+    </w:p>
+    <w:tbl>
+      <w:tblPr>
+        <w:tblStyle w:val="TableGrid0"/>
+        <w:tblW w:w="9837" w:type="dxa"/>
+        <w:tblInd w:w="-5" w:type="dxa"/>
+        <w:tblLayout w:type="fixed"/>
+        <w:tblLook w:val="04A0" w:firstRow="1" w:lastRow="0" w:firstColumn="1" w:lastColumn="0" w:noHBand="0" w:noVBand="1"/>
+      </w:tblPr>
+      <w:tblGrid>
+        <w:gridCol w:w="1802"/>
+        <w:gridCol w:w="2218"/>
+        <w:gridCol w:w="1802"/>
+        <w:gridCol w:w="1248"/>
+        <w:gridCol w:w="1386"/>
+        <w:gridCol w:w="1381"/>
+      </w:tblGrid>
+      <w:tr>
+        <w:trPr>
+          <w:trHeight w:val="514"/>
+        </w:trPr>
+        <w:tc>
+          <w:tcPr>
+            <w:tcW w:w="1802" w:type="dxa"/>
+          </w:tcPr>
+          <w:p>
+            <w:pPr>
+              <w:spacing w:after="240" w:line="276" w:lineRule="auto"/>
+              <w:rPr>
+                <w:rFonts w:ascii="Times New Roman" w:hAnsi="Times New Roman" w:cs="Times New Roman"/>
+                <w:color w:val="000000" w:themeColor="text1"/>
+              </w:rPr>
+            </w:pPr>
+            <w:r>
+              <w:rPr>
+                <w:rFonts w:ascii="Times New Roman" w:hAnsi="Times New Roman" w:cs="Times New Roman"/>
+                <w:color w:val="000000" w:themeColor="text1"/>
+              </w:rPr>
+              <w:t>Requirements</w:t>
+            </w:r>
+          </w:p>
+        </w:tc>
+        <w:tc>
+          <w:tcPr>
+            <w:tcW w:w="2218" w:type="dxa"/>
+          </w:tcPr>
+          <w:p>
+            <w:pPr>
+              <w:spacing w:after="240" w:line="276" w:lineRule="auto"/>
+              <w:rPr>
+                <w:rFonts w:ascii="Times New Roman" w:hAnsi="Times New Roman" w:cs="Times New Roman"/>
+                <w:color w:val="000000" w:themeColor="text1"/>
+              </w:rPr>
+            </w:pPr>
+            <w:r>
+              <w:rPr>
+                <w:rFonts w:ascii="Times New Roman" w:hAnsi="Times New Roman" w:cs="Times New Roman"/>
+                <w:color w:val="000000" w:themeColor="text1"/>
+              </w:rPr>
+              <w:t>Module</w:t>
+            </w:r>
+          </w:p>
+        </w:tc>
+        <w:tc>
+          <w:tcPr>
+            <w:tcW w:w="1802" w:type="dxa"/>
+          </w:tcPr>
+          <w:p>
+            <w:pPr>
+              <w:spacing w:after="240" w:line="276" w:lineRule="auto"/>
+              <w:rPr>
+                <w:rFonts w:ascii="Times New Roman" w:hAnsi="Times New Roman" w:cs="Times New Roman"/>
+                <w:color w:val="000000" w:themeColor="text1"/>
+              </w:rPr>
+            </w:pPr>
+            <w:r>
+              <w:rPr>
+                <w:rFonts w:ascii="Times New Roman" w:hAnsi="Times New Roman" w:cs="Times New Roman"/>
+                <w:color w:val="000000" w:themeColor="text1"/>
+              </w:rPr>
+              <w:t xml:space="preserve">No. of </w:t>
+            </w:r>
+            <w:proofErr w:type="gramStart"/>
+            <w:r>
+              <w:rPr>
+                <w:rFonts w:ascii="Times New Roman" w:hAnsi="Times New Roman" w:cs="Times New Roman"/>
+                <w:color w:val="000000" w:themeColor="text1"/>
+              </w:rPr>
+              <w:t>Man Power</w:t>
+            </w:r>
+            <w:proofErr w:type="gramEnd"/>
+          </w:p>
+        </w:tc>
+        <w:tc>
+          <w:tcPr>
+            <w:tcW w:w="1248" w:type="dxa"/>
+          </w:tcPr>
+          <w:p>
+            <w:pPr>
+              <w:spacing w:after="240" w:line="276" w:lineRule="auto"/>
+              <w:rPr>
+                <w:rFonts w:ascii="Times New Roman" w:hAnsi="Times New Roman" w:cs="Times New Roman"/>
+                <w:color w:val="000000" w:themeColor="text1"/>
+              </w:rPr>
+            </w:pPr>
+            <w:r>
+              <w:rPr>
+                <w:rFonts w:ascii="Times New Roman" w:hAnsi="Times New Roman" w:cs="Times New Roman"/>
+                <w:color w:val="000000" w:themeColor="text1"/>
+              </w:rPr>
+              <w:t>No. of Days</w:t>
+            </w:r>
+          </w:p>
+        </w:tc>
+        <w:tc>
+          <w:tcPr>
+            <w:tcW w:w="1386" w:type="dxa"/>
+          </w:tcPr>
+          <w:p>
+            <w:pPr>
+              <w:spacing w:after="240" w:line="276" w:lineRule="auto"/>
+              <w:rPr>
+                <w:rFonts w:ascii="Times New Roman" w:hAnsi="Times New Roman" w:cs="Times New Roman"/>
+                <w:color w:val="000000" w:themeColor="text1"/>
+              </w:rPr>
+            </w:pPr>
+            <w:r>
+              <w:rPr>
+                <w:rFonts w:ascii="Times New Roman" w:hAnsi="Times New Roman" w:cs="Times New Roman"/>
+                <w:color w:val="000000" w:themeColor="text1"/>
+              </w:rPr>
+              <w:t xml:space="preserve">Rate </w:t>
+            </w:r>
+          </w:p>
+        </w:tc>
+        <w:tc>
+          <w:tcPr>
+            <w:tcW w:w="1381" w:type="dxa"/>
+          </w:tcPr>
+          <w:p>
+            <w:pPr>
+              <w:spacing w:after="240" w:line="276" w:lineRule="auto"/>
+              <w:rPr>
+                <w:rFonts w:ascii="Times New Roman" w:hAnsi="Times New Roman" w:cs="Times New Roman"/>
+                <w:color w:val="000000" w:themeColor="text1"/>
+              </w:rPr>
+            </w:pPr>
+            <w:r>
+              <w:rPr>
+                <w:rFonts w:ascii="Times New Roman" w:hAnsi="Times New Roman" w:cs="Times New Roman"/>
+                <w:color w:val="000000" w:themeColor="text1"/>
+              </w:rPr>
+              <w:t>Amount</w:t>
+            </w:r>
+          </w:p>
+        </w:tc>
+      </w:tr>
+      <w:tr>
+        <w:trPr>
+          <w:trHeight w:val="1028"/>
+        </w:trPr>
+        <w:tc>
+          <w:tcPr>
+            <w:tcW w:w="1802" w:type="dxa"/>
+          </w:tcPr>
+          <w:p>
+            <w:pPr>
+              <w:spacing w:after="240" w:line="276" w:lineRule="auto"/>
+              <w:rPr>
+                <w:rFonts w:ascii="Times New Roman" w:hAnsi="Times New Roman" w:cs="Times New Roman"/>
+                <w:color w:val="000000" w:themeColor="text1"/>
+              </w:rPr>
+            </w:pPr>
+            <w:r>
+              <w:rPr>
+                <w:rFonts w:ascii="Times New Roman" w:hAnsi="Times New Roman" w:cs="Times New Roman"/>
+                <w:color w:val="000000" w:themeColor="text1"/>
+              </w:rPr>
+              <w:t>{{ADD_SCOPE_REQUIREMENT}}</w:t>
+            </w:r>
+          </w:p>
+        </w:tc>
+        <w:tc>
+          <w:tcPr>
+            <w:tcW w:w="2218" w:type="dxa"/>
+          </w:tcPr>
+          <w:p>
+            <w:pPr>
+              <w:spacing w:after="240" w:line="276" w:lineRule="auto"/>
+              <w:rPr>
+                <w:rFonts w:ascii="Times New Roman" w:hAnsi="Times New Roman" w:cs="Times New Roman"/>
+                <w:color w:val="000000" w:themeColor="text1"/>
+              </w:rPr>
+            </w:pPr>
+            <w:r>
+              <w:rPr>
+                <w:rFonts w:ascii="Times New Roman" w:hAnsi="Times New Roman" w:cs="Times New Roman"/>
+                <w:color w:val="000000" w:themeColor="text1"/>
+              </w:rPr>
+              <w:t>{{ADD_SCOPE_MODULE}}</w:t>
+            </w:r>
+          </w:p>
+        </w:tc>
+        <w:tc>
+          <w:tcPr>
+            <w:tcW w:w="1802" w:type="dxa"/>
+          </w:tcPr>
+          <w:p>
+            <w:pPr>
+              <w:spacing w:after="240" w:line="276" w:lineRule="auto"/>
+              <w:rPr>
+                <w:rFonts w:ascii="Times New Roman" w:hAnsi="Times New Roman" w:cs="Times New Roman"/>
+                <w:color w:val="000000" w:themeColor="text1"/>
+              </w:rPr>
+            </w:pPr>
+            <w:r>
+              <w:rPr>
+                <w:rFonts w:ascii="Times New Roman" w:hAnsi="Times New Roman" w:cs="Times New Roman"/>
+                <w:color w:val="000000" w:themeColor="text1"/>
+              </w:rPr>
+              <w:t>{{ADD_SCOPE_MANPOWER}}</w:t>
+            </w:r>
+          </w:p>
+        </w:tc>
+        <w:tc>
+          <w:tcPr>
+            <w:tcW w:w="1248" w:type="dxa"/>
+          </w:tcPr>
+          <w:p>
+            <w:pPr>
+              <w:spacing w:after="240" w:line="276" w:lineRule="auto"/>
+              <w:rPr>
+                <w:rFonts w:ascii="Times New Roman" w:hAnsi="Times New Roman" w:cs="Times New Roman"/>
+                <w:color w:val="000000" w:themeColor="text1"/>
+              </w:rPr>
+            </w:pPr>
+            <w:r>
+              <w:rPr>
+                <w:rFonts w:ascii="Times New Roman" w:hAnsi="Times New Roman" w:cs="Times New Roman"/>
+                <w:color w:val="000000" w:themeColor="text1"/>
+              </w:rPr>
+              <w:t>{{ADD_SCOPE_DAYS}}</w:t>
+            </w:r>
+          </w:p>
+        </w:tc>
+        <w:tc>
+          <w:tcPr>
+            <w:tcW w:w="1386" w:type="dxa"/>
+          </w:tcPr>
+          <w:p>
+            <w:pPr>
+              <w:spacing w:after="240" w:line="276" w:lineRule="auto"/>
+              <w:rPr>
+                <w:rFonts w:ascii="Times New Roman" w:hAnsi="Times New Roman" w:cs="Times New Roman"/>
+                <w:color w:val="000000" w:themeColor="text1"/>
+              </w:rPr>
+            </w:pPr>
+            <w:r>
+              <w:rPr>
+                <w:rFonts w:ascii="Times New Roman" w:hAnsi="Times New Roman" w:cs="Times New Roman"/>
+                <w:color w:val="000000" w:themeColor="text1"/>
+              </w:rPr>
+              <w:t>{{ADD_SCOPE_RATE}}</w:t>
+            </w:r>
+          </w:p>
+        </w:tc>
+        <w:tc>
+          <w:tcPr>
+            <w:tcW w:w="1381" w:type="dxa"/>
+          </w:tcPr>
+          <w:p>
+            <w:pPr>
+              <w:spacing w:after="240" w:line="276" w:lineRule="auto"/>
+              <w:rPr>
+                <w:rFonts w:ascii="Times New Roman" w:hAnsi="Times New Roman" w:cs="Times New Roman"/>
+                <w:color w:val="000000" w:themeColor="text1"/>
+              </w:rPr>
+            </w:pPr>
+            <w:r>
+              <w:rPr>
+                <w:rFonts w:ascii="Times New Roman" w:hAnsi="Times New Roman" w:cs="Times New Roman"/>
+                <w:color w:val="000000" w:themeColor="text1"/>
+              </w:rPr>
+              <w:t>{{ADD_SCOPE_AMOUNT}}</w:t>
+            </w:r>
+          </w:p>
+        </w:tc>
+      </w:tr>
+    </w:tbl>
     <w:p>
       <w:pPr>
         <w:spacing w:before="300" w:after="150"/>
@@ -2288,6 +2550,7 @@
               <w:rPr>
                 <w:rFonts w:ascii="Times New Roman" w:hAnsi="Times New Roman" w:cs="Times New Roman"/>
               </w:rPr>
+              <w:lastRenderedPageBreak/>
               <w:t>New/Change in Document Prin ng format, New/Changes in Reports, New/Change in Reports</w:t>
             </w:r>
           </w:p>
@@ -2315,6 +2578,7 @@
               <w:rPr>
                 <w:rFonts w:ascii="Times New Roman" w:hAnsi="Times New Roman" w:cs="Times New Roman"/>
               </w:rPr>
+              <w:lastRenderedPageBreak/>
               <w:t xml:space="preserve">Chargeable  </w:t>
             </w:r>
           </w:p>
@@ -2591,7 +2855,6 @@
               <w:rPr>
                 <w:rFonts w:ascii="Times New Roman" w:hAnsi="Times New Roman" w:cs="Times New Roman"/>
               </w:rPr>
-              <w:lastRenderedPageBreak/>
               <w:t>7</w:t>
             </w:r>
           </w:p>
@@ -3508,15 +3771,20 @@
     <w:p>
       <w:pPr>
         <w:spacing w:after="160" w:line="259" w:lineRule="auto"/>
-      </w:pPr>
-      <w:r>
-        <w:rPr>
+        <w:rPr>
+          <w:rFonts w:ascii="Times New Roman" w:hAnsi="Times New Roman" w:cs="Times New Roman"/>
+        </w:rPr>
+      </w:pPr>
+      <w:r>
+        <w:rPr>
+          <w:rFonts w:ascii="Times New Roman" w:hAnsi="Times New Roman" w:cs="Times New Roman"/>
           <w:w w:val="101"/>
         </w:rPr>
         <w:t>Time</w:t>
       </w:r>
       <w:r>
         <w:rPr>
+          <w:rFonts w:ascii="Times New Roman" w:hAnsi="Times New Roman" w:cs="Times New Roman"/>
           <w:spacing w:val="-3"/>
           <w:w w:val="101"/>
         </w:rPr>
@@ -3524,12 +3792,14 @@
       </w:r>
       <w:r>
         <w:rPr>
+          <w:rFonts w:ascii="Times New Roman" w:hAnsi="Times New Roman" w:cs="Times New Roman"/>
           <w:w w:val="101"/>
         </w:rPr>
         <w:t>Estimate</w:t>
       </w:r>
       <w:r>
         <w:rPr>
+          <w:rFonts w:ascii="Times New Roman" w:hAnsi="Times New Roman" w:cs="Times New Roman"/>
           <w:spacing w:val="-5"/>
           <w:w w:val="101"/>
         </w:rPr>
@@ -4373,6 +4643,7 @@
         <w:rPr>
           <w:rFonts w:ascii="Times New Roman" w:hAnsi="Times New Roman" w:cs="Times New Roman"/>
         </w:rPr>
+        <w:lastRenderedPageBreak/>
         <w:t>You</w:t>
       </w:r>
       <w:r>
@@ -4874,6 +5145,7 @@
           <w:rFonts w:ascii="Times New Roman" w:hAnsi="Times New Roman" w:cs="Times New Roman"/>
           <w:color w:val="000000" w:themeColor="text1"/>
         </w:rPr>
+        <w:lastRenderedPageBreak/>
         <w:t>8. TDS</w:t>
       </w:r>
     </w:p>

</xml_diff>

<commit_message>
updates about price of implementation table for show and hide the Additional Scope: table part
</commit_message>
<xml_diff>
--- a/QuotationApp.API/Templates/QuotationTemplate_Updated - Copy.docx
+++ b/QuotationApp.API/Templates/QuotationTemplate_Updated - Copy.docx
@@ -952,7 +952,7 @@
     </w:p>
     <w:tbl>
       <w:tblPr>
-        <w:tblW w:w="9786" w:type="dxa"/>
+        <w:tblW w:w="9995" w:type="dxa"/>
         <w:tblBorders>
           <w:top w:val="single" w:sz="4" w:space="0" w:color="auto"/>
           <w:left w:val="single" w:sz="4" w:space="0" w:color="auto"/>
@@ -968,18 +968,18 @@
         <w:tblLook w:val="04A0" w:firstRow="1" w:lastRow="0" w:firstColumn="1" w:lastColumn="0" w:noHBand="0" w:noVBand="1"/>
       </w:tblPr>
       <w:tblGrid>
-        <w:gridCol w:w="1697"/>
-        <w:gridCol w:w="6212"/>
-        <w:gridCol w:w="1877"/>
+        <w:gridCol w:w="1733"/>
+        <w:gridCol w:w="6345"/>
+        <w:gridCol w:w="1917"/>
       </w:tblGrid>
       <w:tr>
         <w:trPr>
-          <w:trHeight w:val="20"/>
+          <w:trHeight w:val="22"/>
           <w:tblHeader/>
         </w:trPr>
         <w:tc>
           <w:tcPr>
-            <w:tcW w:w="1697" w:type="dxa"/>
+            <w:tcW w:w="1733" w:type="dxa"/>
             <w:shd w:val="clear" w:color="auto" w:fill="FFFFFF" w:themeFill="background1"/>
             <w:tcMar>
               <w:top w:w="80" w:type="dxa"/>
@@ -1007,7 +1007,7 @@
         </w:tc>
         <w:tc>
           <w:tcPr>
-            <w:tcW w:w="6212" w:type="dxa"/>
+            <w:tcW w:w="6345" w:type="dxa"/>
             <w:tcBorders>
               <w:bottom w:val="single" w:sz="4" w:space="0" w:color="auto"/>
             </w:tcBorders>
@@ -1038,7 +1038,7 @@
         </w:tc>
         <w:tc>
           <w:tcPr>
-            <w:tcW w:w="1877" w:type="dxa"/>
+            <w:tcW w:w="1917" w:type="dxa"/>
             <w:shd w:val="clear" w:color="auto" w:fill="FFFFFF" w:themeFill="background1"/>
             <w:tcMar>
               <w:top w:w="80" w:type="dxa"/>
@@ -1066,12 +1066,12 @@
       </w:tr>
       <w:tr>
         <w:trPr>
-          <w:trHeight w:val="20"/>
+          <w:trHeight w:val="22"/>
           <w:tblHeader/>
         </w:trPr>
         <w:tc>
           <w:tcPr>
-            <w:tcW w:w="1697" w:type="dxa"/>
+            <w:tcW w:w="1733" w:type="dxa"/>
             <w:shd w:val="clear" w:color="auto" w:fill="FFFFFF" w:themeFill="background1"/>
             <w:tcMar>
               <w:top w:w="80" w:type="dxa"/>
@@ -1098,7 +1098,7 @@
         </w:tc>
         <w:tc>
           <w:tcPr>
-            <w:tcW w:w="6212" w:type="dxa"/>
+            <w:tcW w:w="6345" w:type="dxa"/>
             <w:tcBorders>
               <w:bottom w:val="single" w:sz="4" w:space="0" w:color="auto"/>
             </w:tcBorders>
@@ -1128,7 +1128,7 @@
         </w:tc>
         <w:tc>
           <w:tcPr>
-            <w:tcW w:w="1877" w:type="dxa"/>
+            <w:tcW w:w="1917" w:type="dxa"/>
             <w:shd w:val="clear" w:color="auto" w:fill="FFFFFF" w:themeFill="background1"/>
             <w:tcMar>
               <w:top w:w="80" w:type="dxa"/>
@@ -1180,30 +1180,30 @@
     <w:tbl>
       <w:tblPr>
         <w:tblStyle w:val="TableGrid0"/>
-        <w:tblW w:w="9837" w:type="dxa"/>
+        <w:tblW w:w="10013" w:type="dxa"/>
         <w:tblInd w:w="-5" w:type="dxa"/>
         <w:tblLayout w:type="fixed"/>
         <w:tblLook w:val="04A0" w:firstRow="1" w:lastRow="0" w:firstColumn="1" w:lastColumn="0" w:noHBand="0" w:noVBand="1"/>
       </w:tblPr>
       <w:tblGrid>
-        <w:gridCol w:w="1802"/>
-        <w:gridCol w:w="2218"/>
-        <w:gridCol w:w="1802"/>
-        <w:gridCol w:w="1248"/>
-        <w:gridCol w:w="1386"/>
-        <w:gridCol w:w="1381"/>
+        <w:gridCol w:w="1834"/>
+        <w:gridCol w:w="2258"/>
+        <w:gridCol w:w="1834"/>
+        <w:gridCol w:w="1270"/>
+        <w:gridCol w:w="1411"/>
+        <w:gridCol w:w="1406"/>
       </w:tblGrid>
       <w:tr>
         <w:trPr>
-          <w:trHeight w:val="514"/>
+          <w:trHeight w:val="308"/>
         </w:trPr>
         <w:tc>
           <w:tcPr>
-            <w:tcW w:w="1802" w:type="dxa"/>
-          </w:tcPr>
-          <w:p>
-            <w:pPr>
-              <w:spacing w:after="240" w:line="276" w:lineRule="auto"/>
+            <w:tcW w:w="1834" w:type="dxa"/>
+          </w:tcPr>
+          <w:p>
+            <w:pPr>
+              <w:spacing w:line="276" w:lineRule="auto"/>
               <w:rPr>
                 <w:rFonts w:ascii="Times New Roman" w:hAnsi="Times New Roman" w:cs="Times New Roman"/>
                 <w:color w:val="000000" w:themeColor="text1"/>
@@ -1220,11 +1220,11 @@
         </w:tc>
         <w:tc>
           <w:tcPr>
-            <w:tcW w:w="2218" w:type="dxa"/>
-          </w:tcPr>
-          <w:p>
-            <w:pPr>
-              <w:spacing w:after="240" w:line="276" w:lineRule="auto"/>
+            <w:tcW w:w="2258" w:type="dxa"/>
+          </w:tcPr>
+          <w:p>
+            <w:pPr>
+              <w:spacing w:line="276" w:lineRule="auto"/>
               <w:rPr>
                 <w:rFonts w:ascii="Times New Roman" w:hAnsi="Times New Roman" w:cs="Times New Roman"/>
                 <w:color w:val="000000" w:themeColor="text1"/>
@@ -1241,11 +1241,11 @@
         </w:tc>
         <w:tc>
           <w:tcPr>
-            <w:tcW w:w="1802" w:type="dxa"/>
-          </w:tcPr>
-          <w:p>
-            <w:pPr>
-              <w:spacing w:after="240" w:line="276" w:lineRule="auto"/>
+            <w:tcW w:w="1834" w:type="dxa"/>
+          </w:tcPr>
+          <w:p>
+            <w:pPr>
+              <w:spacing w:line="276" w:lineRule="auto"/>
               <w:rPr>
                 <w:rFonts w:ascii="Times New Roman" w:hAnsi="Times New Roman" w:cs="Times New Roman"/>
                 <w:color w:val="000000" w:themeColor="text1"/>
@@ -1256,68 +1256,59 @@
                 <w:rFonts w:ascii="Times New Roman" w:hAnsi="Times New Roman" w:cs="Times New Roman"/>
                 <w:color w:val="000000" w:themeColor="text1"/>
               </w:rPr>
-              <w:t xml:space="preserve">No. of </w:t>
-            </w:r>
-            <w:proofErr w:type="gramStart"/>
-            <w:r>
+              <w:t>No. of Man Power</w:t>
+            </w:r>
+          </w:p>
+        </w:tc>
+        <w:tc>
+          <w:tcPr>
+            <w:tcW w:w="1270" w:type="dxa"/>
+          </w:tcPr>
+          <w:p>
+            <w:pPr>
+              <w:spacing w:line="276" w:lineRule="auto"/>
               <w:rPr>
                 <w:rFonts w:ascii="Times New Roman" w:hAnsi="Times New Roman" w:cs="Times New Roman"/>
                 <w:color w:val="000000" w:themeColor="text1"/>
               </w:rPr>
-              <w:t>Man Power</w:t>
-            </w:r>
-            <w:proofErr w:type="gramEnd"/>
-          </w:p>
-        </w:tc>
-        <w:tc>
-          <w:tcPr>
-            <w:tcW w:w="1248" w:type="dxa"/>
-          </w:tcPr>
-          <w:p>
-            <w:pPr>
-              <w:spacing w:after="240" w:line="276" w:lineRule="auto"/>
+            </w:pPr>
+            <w:r>
               <w:rPr>
                 <w:rFonts w:ascii="Times New Roman" w:hAnsi="Times New Roman" w:cs="Times New Roman"/>
                 <w:color w:val="000000" w:themeColor="text1"/>
               </w:rPr>
-            </w:pPr>
-            <w:r>
+              <w:t>No. of Days</w:t>
+            </w:r>
+          </w:p>
+        </w:tc>
+        <w:tc>
+          <w:tcPr>
+            <w:tcW w:w="1411" w:type="dxa"/>
+          </w:tcPr>
+          <w:p>
+            <w:pPr>
+              <w:spacing w:line="276" w:lineRule="auto"/>
               <w:rPr>
                 <w:rFonts w:ascii="Times New Roman" w:hAnsi="Times New Roman" w:cs="Times New Roman"/>
                 <w:color w:val="000000" w:themeColor="text1"/>
               </w:rPr>
-              <w:t>No. of Days</w:t>
-            </w:r>
-          </w:p>
-        </w:tc>
-        <w:tc>
-          <w:tcPr>
-            <w:tcW w:w="1386" w:type="dxa"/>
-          </w:tcPr>
-          <w:p>
-            <w:pPr>
-              <w:spacing w:after="240" w:line="276" w:lineRule="auto"/>
+            </w:pPr>
+            <w:r>
               <w:rPr>
                 <w:rFonts w:ascii="Times New Roman" w:hAnsi="Times New Roman" w:cs="Times New Roman"/>
                 <w:color w:val="000000" w:themeColor="text1"/>
               </w:rPr>
-            </w:pPr>
-            <w:r>
-              <w:rPr>
-                <w:rFonts w:ascii="Times New Roman" w:hAnsi="Times New Roman" w:cs="Times New Roman"/>
-                <w:color w:val="000000" w:themeColor="text1"/>
-              </w:rPr>
-              <w:t xml:space="preserve">Rate </w:t>
-            </w:r>
-          </w:p>
-        </w:tc>
-        <w:tc>
-          <w:tcPr>
-            <w:tcW w:w="1381" w:type="dxa"/>
-          </w:tcPr>
-          <w:p>
-            <w:pPr>
-              <w:spacing w:after="240" w:line="276" w:lineRule="auto"/>
+              <w:t>Rate</w:t>
+            </w:r>
+          </w:p>
+        </w:tc>
+        <w:tc>
+          <w:tcPr>
+            <w:tcW w:w="1406" w:type="dxa"/>
+          </w:tcPr>
+          <w:p>
+            <w:pPr>
+              <w:spacing w:line="276" w:lineRule="auto"/>
               <w:rPr>
                 <w:rFonts w:ascii="Times New Roman" w:hAnsi="Times New Roman" w:cs="Times New Roman"/>
                 <w:color w:val="000000" w:themeColor="text1"/>
@@ -1335,15 +1326,15 @@
       </w:tr>
       <w:tr>
         <w:trPr>
-          <w:trHeight w:val="1028"/>
+          <w:trHeight w:val="1136"/>
         </w:trPr>
         <w:tc>
           <w:tcPr>
-            <w:tcW w:w="1802" w:type="dxa"/>
-          </w:tcPr>
-          <w:p>
-            <w:pPr>
-              <w:spacing w:after="240" w:line="276" w:lineRule="auto"/>
+            <w:tcW w:w="1834" w:type="dxa"/>
+          </w:tcPr>
+          <w:p>
+            <w:pPr>
+              <w:spacing w:before="240" w:after="240"/>
               <w:rPr>
                 <w:rFonts w:ascii="Times New Roman" w:hAnsi="Times New Roman" w:cs="Times New Roman"/>
                 <w:color w:val="000000" w:themeColor="text1"/>
@@ -1360,11 +1351,11 @@
         </w:tc>
         <w:tc>
           <w:tcPr>
-            <w:tcW w:w="2218" w:type="dxa"/>
-          </w:tcPr>
-          <w:p>
-            <w:pPr>
-              <w:spacing w:after="240" w:line="276" w:lineRule="auto"/>
+            <w:tcW w:w="2258" w:type="dxa"/>
+          </w:tcPr>
+          <w:p>
+            <w:pPr>
+              <w:spacing w:before="240" w:after="240"/>
               <w:rPr>
                 <w:rFonts w:ascii="Times New Roman" w:hAnsi="Times New Roman" w:cs="Times New Roman"/>
                 <w:color w:val="000000" w:themeColor="text1"/>
@@ -1381,11 +1372,11 @@
         </w:tc>
         <w:tc>
           <w:tcPr>
-            <w:tcW w:w="1802" w:type="dxa"/>
-          </w:tcPr>
-          <w:p>
-            <w:pPr>
-              <w:spacing w:after="240" w:line="276" w:lineRule="auto"/>
+            <w:tcW w:w="1834" w:type="dxa"/>
+          </w:tcPr>
+          <w:p>
+            <w:pPr>
+              <w:spacing w:before="240" w:after="240"/>
               <w:rPr>
                 <w:rFonts w:ascii="Times New Roman" w:hAnsi="Times New Roman" w:cs="Times New Roman"/>
                 <w:color w:val="000000" w:themeColor="text1"/>
@@ -1402,11 +1393,11 @@
         </w:tc>
         <w:tc>
           <w:tcPr>
-            <w:tcW w:w="1248" w:type="dxa"/>
-          </w:tcPr>
-          <w:p>
-            <w:pPr>
-              <w:spacing w:after="240" w:line="276" w:lineRule="auto"/>
+            <w:tcW w:w="1270" w:type="dxa"/>
+          </w:tcPr>
+          <w:p>
+            <w:pPr>
+              <w:spacing w:before="240" w:after="240"/>
               <w:rPr>
                 <w:rFonts w:ascii="Times New Roman" w:hAnsi="Times New Roman" w:cs="Times New Roman"/>
                 <w:color w:val="000000" w:themeColor="text1"/>
@@ -1423,11 +1414,11 @@
         </w:tc>
         <w:tc>
           <w:tcPr>
-            <w:tcW w:w="1386" w:type="dxa"/>
-          </w:tcPr>
-          <w:p>
-            <w:pPr>
-              <w:spacing w:after="240" w:line="276" w:lineRule="auto"/>
+            <w:tcW w:w="1411" w:type="dxa"/>
+          </w:tcPr>
+          <w:p>
+            <w:pPr>
+              <w:spacing w:before="240" w:after="240"/>
               <w:rPr>
                 <w:rFonts w:ascii="Times New Roman" w:hAnsi="Times New Roman" w:cs="Times New Roman"/>
                 <w:color w:val="000000" w:themeColor="text1"/>
@@ -1444,11 +1435,11 @@
         </w:tc>
         <w:tc>
           <w:tcPr>
-            <w:tcW w:w="1381" w:type="dxa"/>
-          </w:tcPr>
-          <w:p>
-            <w:pPr>
-              <w:spacing w:after="240" w:line="276" w:lineRule="auto"/>
+            <w:tcW w:w="1406" w:type="dxa"/>
+          </w:tcPr>
+          <w:p>
+            <w:pPr>
+              <w:spacing w:before="240" w:after="240"/>
               <w:rPr>
                 <w:rFonts w:ascii="Times New Roman" w:hAnsi="Times New Roman" w:cs="Times New Roman"/>
                 <w:color w:val="000000" w:themeColor="text1"/>
@@ -1522,7 +1513,7 @@
       <w:tblPr>
         <w:tblpPr w:leftFromText="180" w:rightFromText="180" w:vertAnchor="text" w:tblpY="1"/>
         <w:tblOverlap w:val="never"/>
-        <w:tblW w:w="9799" w:type="dxa"/>
+        <w:tblW w:w="9992" w:type="dxa"/>
         <w:tblBorders>
           <w:top w:val="single" w:sz="4" w:space="0" w:color="auto"/>
           <w:left w:val="single" w:sz="4" w:space="0" w:color="auto"/>
@@ -1539,9 +1530,9 @@
         <w:tblLook w:val="04A0" w:firstRow="1" w:lastRow="0" w:firstColumn="1" w:lastColumn="0" w:noHBand="0" w:noVBand="1"/>
       </w:tblPr>
       <w:tblGrid>
-        <w:gridCol w:w="988"/>
-        <w:gridCol w:w="5670"/>
-        <w:gridCol w:w="3141"/>
+        <w:gridCol w:w="1007"/>
+        <w:gridCol w:w="6360"/>
+        <w:gridCol w:w="2625"/>
       </w:tblGrid>
       <w:tr>
         <w:trPr>
@@ -1550,7 +1541,7 @@
         </w:trPr>
         <w:tc>
           <w:tcPr>
-            <w:tcW w:w="988" w:type="dxa"/>
+            <w:tcW w:w="1007" w:type="dxa"/>
             <w:shd w:val="clear" w:color="auto" w:fill="FFFFFF" w:themeFill="background1"/>
             <w:tcMar>
               <w:top w:w="80" w:type="dxa"/>
@@ -1562,6 +1553,7 @@
           </w:tcPr>
           <w:p>
             <w:pPr>
+              <w:spacing w:line="240" w:lineRule="auto"/>
               <w:rPr>
                 <w:rFonts w:ascii="Times New Roman" w:hAnsi="Times New Roman" w:cs="Times New Roman"/>
                 <w:color w:val="000000" w:themeColor="text1"/>
@@ -1578,7 +1570,7 @@
         </w:tc>
         <w:tc>
           <w:tcPr>
-            <w:tcW w:w="5670" w:type="dxa"/>
+            <w:tcW w:w="6360" w:type="dxa"/>
             <w:shd w:val="clear" w:color="auto" w:fill="FFFFFF" w:themeFill="background1"/>
             <w:tcMar>
               <w:top w:w="80" w:type="dxa"/>
@@ -1590,6 +1582,7 @@
           </w:tcPr>
           <w:p>
             <w:pPr>
+              <w:spacing w:line="240" w:lineRule="auto"/>
               <w:rPr>
                 <w:rFonts w:ascii="Times New Roman" w:hAnsi="Times New Roman" w:cs="Times New Roman"/>
                 <w:color w:val="000000" w:themeColor="text1"/>
@@ -1606,7 +1599,7 @@
         </w:tc>
         <w:tc>
           <w:tcPr>
-            <w:tcW w:w="3141" w:type="dxa"/>
+            <w:tcW w:w="2625" w:type="dxa"/>
             <w:shd w:val="clear" w:color="auto" w:fill="FFFFFF" w:themeFill="background1"/>
             <w:tcMar>
               <w:top w:w="80" w:type="dxa"/>
@@ -1618,6 +1611,7 @@
           </w:tcPr>
           <w:p>
             <w:pPr>
+              <w:spacing w:line="240" w:lineRule="auto"/>
               <w:rPr>
                 <w:rFonts w:ascii="Times New Roman" w:hAnsi="Times New Roman" w:cs="Times New Roman"/>
                 <w:color w:val="000000" w:themeColor="text1"/>
@@ -1653,7 +1647,7 @@
         </w:trPr>
         <w:tc>
           <w:tcPr>
-            <w:tcW w:w="988" w:type="dxa"/>
+            <w:tcW w:w="1007" w:type="dxa"/>
             <w:shd w:val="clear" w:color="auto" w:fill="FFFFFF" w:themeFill="background1"/>
             <w:tcMar>
               <w:top w:w="80" w:type="dxa"/>
@@ -1678,7 +1672,7 @@
         </w:tc>
         <w:tc>
           <w:tcPr>
-            <w:tcW w:w="5670" w:type="dxa"/>
+            <w:tcW w:w="6360" w:type="dxa"/>
             <w:shd w:val="clear" w:color="auto" w:fill="FFFFFF" w:themeFill="background1"/>
             <w:tcMar>
               <w:top w:w="80" w:type="dxa"/>
@@ -1697,32 +1691,99 @@
               <w:rPr>
                 <w:rFonts w:ascii="Times New Roman" w:hAnsi="Times New Roman" w:cs="Times New Roman"/>
               </w:rPr>
-              <w:t>Product License -</w:t>
-            </w:r>
-            <w:r>
-              <w:rPr>
-                <w:rFonts w:ascii="Times New Roman" w:hAnsi="Times New Roman" w:cs="Times New Roman"/>
-              </w:rPr>
-              <w:t xml:space="preserve"> {{MODULE_LIST}} (single installation). Scope as listed above.</w:t>
-            </w:r>
-          </w:p>
-          <w:p>
-            <w:pPr>
-              <w:rPr>
-                <w:rFonts w:ascii="Times New Roman" w:hAnsi="Times New Roman" w:cs="Times New Roman"/>
-              </w:rPr>
-            </w:pPr>
-            <w:r>
-              <w:rPr>
-                <w:rFonts w:ascii="Times New Roman" w:hAnsi="Times New Roman" w:cs="Times New Roman"/>
-              </w:rPr>
-              <w:t>{{MODULE_DETAILS}}</w:t>
-            </w:r>
-          </w:p>
-        </w:tc>
-        <w:tc>
-          <w:tcPr>
-            <w:tcW w:w="3141" w:type="dxa"/>
+              <w:t xml:space="preserve">CQUAL </w:t>
+            </w:r>
+            <w:r>
+              <w:rPr>
+                <w:rFonts w:ascii="Times New Roman" w:hAnsi="Times New Roman" w:cs="Times New Roman"/>
+              </w:rPr>
+              <w:t>{</w:t>
+            </w:r>
+            <w:r>
+              <w:rPr>
+                <w:rFonts w:ascii="Times New Roman" w:hAnsi="Times New Roman" w:cs="Times New Roman"/>
+              </w:rPr>
+              <w:t>{MODULE_</w:t>
+            </w:r>
+            <w:r>
+              <w:rPr>
+                <w:rFonts w:ascii="Times New Roman" w:hAnsi="Times New Roman" w:cs="Times New Roman"/>
+              </w:rPr>
+              <w:t>NAME</w:t>
+            </w:r>
+            <w:r>
+              <w:rPr>
+                <w:rFonts w:ascii="Times New Roman" w:hAnsi="Times New Roman" w:cs="Times New Roman"/>
+              </w:rPr>
+              <w:t>}}</w:t>
+            </w:r>
+          </w:p>
+          <w:p>
+            <w:pPr>
+              <w:rPr>
+                <w:rFonts w:ascii="Times New Roman" w:hAnsi="Times New Roman" w:cs="Times New Roman"/>
+              </w:rPr>
+            </w:pPr>
+            <w:r>
+              <w:rPr>
+                <w:rFonts w:ascii="Times New Roman" w:hAnsi="Times New Roman" w:cs="Times New Roman"/>
+              </w:rPr>
+              <w:t>Product License applicable for single site -</w:t>
+            </w:r>
+            <w:r>
+              <w:rPr>
+                <w:rFonts w:ascii="Times New Roman" w:hAnsi="Times New Roman" w:cs="Times New Roman"/>
+              </w:rPr>
+              <w:t xml:space="preserve"> </w:t>
+            </w:r>
+            <w:r>
+              <w:rPr>
+                <w:rFonts w:ascii="Times New Roman" w:hAnsi="Times New Roman" w:cs="Times New Roman"/>
+              </w:rPr>
+              <w:t>{{NO_OF_USERS</w:t>
+            </w:r>
+            <w:r>
+              <w:rPr>
+                <w:rFonts w:ascii="Times New Roman" w:hAnsi="Times New Roman" w:cs="Times New Roman"/>
+              </w:rPr>
+              <w:t>}}</w:t>
+            </w:r>
+            <w:r>
+              <w:rPr>
+                <w:rFonts w:ascii="Times New Roman" w:hAnsi="Times New Roman" w:cs="Times New Roman"/>
+              </w:rPr>
+              <w:t xml:space="preserve"> Users</w:t>
+            </w:r>
+          </w:p>
+          <w:p>
+            <w:pPr>
+              <w:rPr>
+                <w:rFonts w:ascii="Times New Roman" w:hAnsi="Times New Roman" w:cs="Times New Roman"/>
+              </w:rPr>
+            </w:pPr>
+            <w:r>
+              <w:rPr>
+                <w:rFonts w:ascii="Times New Roman" w:hAnsi="Times New Roman" w:cs="Times New Roman"/>
+              </w:rPr>
+              <w:t>Discount ({{MODULE_DISCOUNT_PCT</w:t>
+            </w:r>
+            <w:r>
+              <w:rPr>
+                <w:rFonts w:ascii="Times New Roman" w:hAnsi="Times New Roman" w:cs="Times New Roman"/>
+              </w:rPr>
+              <w:t>}} %</w:t>
+            </w:r>
+            <w:r>
+              <w:rPr>
+                <w:rFonts w:ascii="Times New Roman" w:hAnsi="Times New Roman" w:cs="Times New Roman"/>
+              </w:rPr>
+              <w:t>):</w:t>
+            </w:r>
+          </w:p>
+        </w:tc>
+        <w:tc>
+          <w:tcPr>
+            <w:tcW w:w="2625" w:type="dxa"/>
             <w:shd w:val="clear" w:color="auto" w:fill="FFFFFF" w:themeFill="background1"/>
             <w:tcMar>
               <w:top w:w="80" w:type="dxa"/>
@@ -1741,20 +1802,27 @@
               <w:rPr>
                 <w:rFonts w:ascii="Times New Roman" w:hAnsi="Times New Roman" w:cs="Times New Roman"/>
               </w:rPr>
-              <w:t>{{MODULE_PRICING}}</w:t>
-            </w:r>
-          </w:p>
-          <w:p>
-            <w:pPr>
-              <w:rPr>
-                <w:rFonts w:ascii="Times New Roman" w:hAnsi="Times New Roman" w:cs="Times New Roman"/>
-              </w:rPr>
-            </w:pPr>
-            <w:r>
-              <w:rPr>
-                <w:rFonts w:ascii="Times New Roman" w:hAnsi="Times New Roman" w:cs="Times New Roman"/>
-              </w:rPr>
-              <w:t>{{OVERALL_PRICING}}</w:t>
+              <w:t>{{MODULE_PRICE}}</w:t>
+            </w:r>
+          </w:p>
+          <w:p>
+            <w:pPr>
+              <w:rPr>
+                <w:rFonts w:ascii="Times New Roman" w:hAnsi="Times New Roman" w:cs="Times New Roman"/>
+              </w:rPr>
+            </w:pPr>
+          </w:p>
+          <w:p>
+            <w:pPr>
+              <w:rPr>
+                <w:rFonts w:ascii="Times New Roman" w:hAnsi="Times New Roman" w:cs="Times New Roman"/>
+              </w:rPr>
+            </w:pPr>
+            <w:r>
+              <w:rPr>
+                <w:rFonts w:ascii="Times New Roman" w:hAnsi="Times New Roman" w:cs="Times New Roman"/>
+              </w:rPr>
+              <w:t>{{MODULE_DISCOUNT}}</w:t>
             </w:r>
           </w:p>
         </w:tc>
@@ -1765,7 +1833,7 @@
         </w:trPr>
         <w:tc>
           <w:tcPr>
-            <w:tcW w:w="988" w:type="dxa"/>
+            <w:tcW w:w="1007" w:type="dxa"/>
             <w:shd w:val="clear" w:color="auto" w:fill="FFFFFF" w:themeFill="background1"/>
             <w:tcMar>
               <w:top w:w="80" w:type="dxa"/>
@@ -1784,13 +1852,13 @@
               <w:rPr>
                 <w:rFonts w:ascii="Times New Roman" w:hAnsi="Times New Roman" w:cs="Times New Roman"/>
               </w:rPr>
-              <w:t>2</w:t>
-            </w:r>
-          </w:p>
-        </w:tc>
-        <w:tc>
-          <w:tcPr>
-            <w:tcW w:w="5670" w:type="dxa"/>
+              <w:t xml:space="preserve"> 1.1</w:t>
+            </w:r>
+          </w:p>
+        </w:tc>
+        <w:tc>
+          <w:tcPr>
+            <w:tcW w:w="6360" w:type="dxa"/>
             <w:shd w:val="clear" w:color="auto" w:fill="FFFFFF" w:themeFill="background1"/>
             <w:tcMar>
               <w:top w:w="80" w:type="dxa"/>
@@ -1809,31 +1877,55 @@
               <w:rPr>
                 <w:rFonts w:ascii="Times New Roman" w:hAnsi="Times New Roman" w:cs="Times New Roman"/>
               </w:rPr>
-              <w:t>Customization -</w:t>
-            </w:r>
-            <w:r>
-              <w:rPr>
-                <w:rFonts w:ascii="Times New Roman" w:hAnsi="Times New Roman" w:cs="Times New Roman"/>
-              </w:rPr>
-              <w:t xml:space="preserve"> any additional development beyond scope, charged at INR </w:t>
-            </w:r>
-            <w:r>
-              <w:rPr>
-                <w:rFonts w:ascii="Times New Roman" w:hAnsi="Times New Roman" w:cs="Times New Roman"/>
-              </w:rPr>
-              <w:t>8</w:t>
-            </w:r>
-            <w:r>
-              <w:rPr>
-                <w:rFonts w:ascii="Times New Roman" w:hAnsi="Times New Roman" w:cs="Times New Roman"/>
-              </w:rPr>
-              <w:t>,000 / man-day.</w:t>
-            </w:r>
-          </w:p>
-        </w:tc>
-        <w:tc>
-          <w:tcPr>
-            <w:tcW w:w="3141" w:type="dxa"/>
+              <w:t>Implementation (</w:t>
+            </w:r>
+            <w:r>
+              <w:rPr>
+                <w:rFonts w:ascii="Times New Roman" w:hAnsi="Times New Roman" w:cs="Times New Roman"/>
+              </w:rPr>
+              <w:t>{{NO_OF_USERS</w:t>
+            </w:r>
+            <w:r>
+              <w:rPr>
+                <w:rFonts w:ascii="Times New Roman" w:hAnsi="Times New Roman" w:cs="Times New Roman"/>
+              </w:rPr>
+              <w:t>}}</w:t>
+            </w:r>
+            <w:r>
+              <w:rPr>
+                <w:rFonts w:ascii="Times New Roman" w:hAnsi="Times New Roman" w:cs="Times New Roman"/>
+              </w:rPr>
+              <w:t xml:space="preserve"> Man</w:t>
+            </w:r>
+            <w:r>
+              <w:rPr>
+                <w:rFonts w:ascii="Times New Roman" w:hAnsi="Times New Roman" w:cs="Times New Roman"/>
+              </w:rPr>
+              <w:t xml:space="preserve"> Day * </w:t>
+            </w:r>
+            <w:r>
+              <w:rPr>
+                <w:rFonts w:ascii="Times New Roman" w:hAnsi="Times New Roman" w:cs="Times New Roman"/>
+              </w:rPr>
+              <w:t>{{IMPL_RATE}}</w:t>
+            </w:r>
+            <w:r>
+              <w:rPr>
+                <w:rFonts w:ascii="Times New Roman" w:hAnsi="Times New Roman" w:cs="Times New Roman"/>
+              </w:rPr>
+              <w:t xml:space="preserve"> </w:t>
+            </w:r>
+            <w:r>
+              <w:rPr>
+                <w:rFonts w:ascii="Times New Roman" w:hAnsi="Times New Roman" w:cs="Times New Roman"/>
+              </w:rPr>
+              <w:t>per Man Day)</w:t>
+            </w:r>
+          </w:p>
+        </w:tc>
+        <w:tc>
+          <w:tcPr>
+            <w:tcW w:w="2625" w:type="dxa"/>
             <w:shd w:val="clear" w:color="auto" w:fill="FFFFFF" w:themeFill="background1"/>
             <w:tcMar>
               <w:top w:w="80" w:type="dxa"/>
@@ -1852,7 +1944,7 @@
               <w:rPr>
                 <w:rFonts w:ascii="Times New Roman" w:hAnsi="Times New Roman" w:cs="Times New Roman"/>
               </w:rPr>
-              <w:t>TBD</w:t>
+              <w:t>{{IMPL_TOTAL}}</w:t>
             </w:r>
           </w:p>
         </w:tc>
@@ -1863,7 +1955,7 @@
         </w:trPr>
         <w:tc>
           <w:tcPr>
-            <w:tcW w:w="988" w:type="dxa"/>
+            <w:tcW w:w="1007" w:type="dxa"/>
             <w:shd w:val="clear" w:color="auto" w:fill="FFFFFF" w:themeFill="background1"/>
             <w:tcMar>
               <w:top w:w="80" w:type="dxa"/>
@@ -1878,17 +1970,11 @@
                 <w:rFonts w:ascii="Times New Roman" w:hAnsi="Times New Roman" w:cs="Times New Roman"/>
               </w:rPr>
             </w:pPr>
-            <w:r>
-              <w:rPr>
-                <w:rFonts w:ascii="Times New Roman" w:hAnsi="Times New Roman" w:cs="Times New Roman"/>
-              </w:rPr>
-              <w:t>3</w:t>
-            </w:r>
-          </w:p>
-        </w:tc>
-        <w:tc>
-          <w:tcPr>
-            <w:tcW w:w="5670" w:type="dxa"/>
+          </w:p>
+        </w:tc>
+        <w:tc>
+          <w:tcPr>
+            <w:tcW w:w="6360" w:type="dxa"/>
             <w:shd w:val="clear" w:color="auto" w:fill="FFFFFF" w:themeFill="background1"/>
             <w:tcMar>
               <w:top w:w="80" w:type="dxa"/>
@@ -1907,19 +1993,19 @@
               <w:rPr>
                 <w:rFonts w:ascii="Times New Roman" w:hAnsi="Times New Roman" w:cs="Times New Roman"/>
               </w:rPr>
-              <w:t>Annual License Renewal -</w:t>
-            </w:r>
-            <w:r>
-              <w:rPr>
-                <w:rFonts w:ascii="Times New Roman" w:hAnsi="Times New Roman" w:cs="Times New Roman"/>
-              </w:rPr>
-              <w:t xml:space="preserve"> covers upgrades, bug fixes &amp; statutory changes. Includes 7 man-days; excess is chargeable.</w:t>
-            </w:r>
-          </w:p>
-        </w:tc>
-        <w:tc>
-          <w:tcPr>
-            <w:tcW w:w="3141" w:type="dxa"/>
+              <w:t>Module Subtotal</w:t>
+            </w:r>
+            <w:r>
+              <w:rPr>
+                <w:rFonts w:ascii="Times New Roman" w:hAnsi="Times New Roman" w:cs="Times New Roman"/>
+              </w:rPr>
+              <w:t>:</w:t>
+            </w:r>
+          </w:p>
+        </w:tc>
+        <w:tc>
+          <w:tcPr>
+            <w:tcW w:w="2625" w:type="dxa"/>
             <w:shd w:val="clear" w:color="auto" w:fill="FFFFFF" w:themeFill="background1"/>
             <w:tcMar>
               <w:top w:w="80" w:type="dxa"/>
@@ -1934,6 +2020,12 @@
                 <w:rFonts w:ascii="Times New Roman" w:hAnsi="Times New Roman" w:cs="Times New Roman"/>
               </w:rPr>
             </w:pPr>
+            <w:r>
+              <w:rPr>
+                <w:rFonts w:ascii="Times New Roman" w:hAnsi="Times New Roman" w:cs="Times New Roman"/>
+              </w:rPr>
+              <w:t>{{MODULE_SUBTOTAL}}</w:t>
+            </w:r>
           </w:p>
         </w:tc>
       </w:tr>
@@ -1943,7 +2035,7 @@
         </w:trPr>
         <w:tc>
           <w:tcPr>
-            <w:tcW w:w="988" w:type="dxa"/>
+            <w:tcW w:w="1007" w:type="dxa"/>
             <w:shd w:val="clear" w:color="auto" w:fill="FFFFFF" w:themeFill="background1"/>
             <w:tcMar>
               <w:top w:w="80" w:type="dxa"/>
@@ -1958,17 +2050,11 @@
                 <w:rFonts w:ascii="Times New Roman" w:hAnsi="Times New Roman" w:cs="Times New Roman"/>
               </w:rPr>
             </w:pPr>
-            <w:r>
-              <w:rPr>
-                <w:rFonts w:ascii="Times New Roman" w:hAnsi="Times New Roman" w:cs="Times New Roman"/>
-              </w:rPr>
-              <w:t>4</w:t>
-            </w:r>
-          </w:p>
-        </w:tc>
-        <w:tc>
-          <w:tcPr>
-            <w:tcW w:w="5670" w:type="dxa"/>
+          </w:p>
+        </w:tc>
+        <w:tc>
+          <w:tcPr>
+            <w:tcW w:w="6360" w:type="dxa"/>
             <w:shd w:val="clear" w:color="auto" w:fill="FFFFFF" w:themeFill="background1"/>
             <w:tcMar>
               <w:top w:w="80" w:type="dxa"/>
@@ -1987,19 +2073,13 @@
               <w:rPr>
                 <w:rFonts w:ascii="Times New Roman" w:hAnsi="Times New Roman" w:cs="Times New Roman"/>
               </w:rPr>
-              <w:t>Support Services</w:t>
-            </w:r>
-            <w:r>
-              <w:rPr>
-                <w:rFonts w:ascii="Times New Roman" w:hAnsi="Times New Roman" w:cs="Times New Roman"/>
-              </w:rPr>
-              <w:t xml:space="preserve"> - commence 1 month after Go-Live.</w:t>
-            </w:r>
-          </w:p>
-        </w:tc>
-        <w:tc>
-          <w:tcPr>
-            <w:tcW w:w="3141" w:type="dxa"/>
+              <w:t>Total of All Modules Final Price:</w:t>
+            </w:r>
+          </w:p>
+        </w:tc>
+        <w:tc>
+          <w:tcPr>
+            <w:tcW w:w="2625" w:type="dxa"/>
             <w:shd w:val="clear" w:color="auto" w:fill="FFFFFF" w:themeFill="background1"/>
             <w:tcMar>
               <w:top w:w="80" w:type="dxa"/>
@@ -2014,6 +2094,12 @@
                 <w:rFonts w:ascii="Times New Roman" w:hAnsi="Times New Roman" w:cs="Times New Roman"/>
               </w:rPr>
             </w:pPr>
+            <w:r>
+              <w:rPr>
+                <w:rFonts w:ascii="Times New Roman" w:hAnsi="Times New Roman" w:cs="Times New Roman"/>
+              </w:rPr>
+              <w:t>{{OVERALL_VALUE}}</w:t>
+            </w:r>
           </w:p>
         </w:tc>
       </w:tr>
@@ -2023,7 +2109,7 @@
         </w:trPr>
         <w:tc>
           <w:tcPr>
-            <w:tcW w:w="988" w:type="dxa"/>
+            <w:tcW w:w="1007" w:type="dxa"/>
             <w:shd w:val="clear" w:color="auto" w:fill="FFFFFF" w:themeFill="background1"/>
             <w:tcMar>
               <w:top w:w="80" w:type="dxa"/>
@@ -2042,13 +2128,13 @@
               <w:rPr>
                 <w:rFonts w:ascii="Times New Roman" w:hAnsi="Times New Roman" w:cs="Times New Roman"/>
               </w:rPr>
-              <w:t>5</w:t>
-            </w:r>
-          </w:p>
-        </w:tc>
-        <w:tc>
-          <w:tcPr>
-            <w:tcW w:w="5670" w:type="dxa"/>
+              <w:t>2</w:t>
+            </w:r>
+          </w:p>
+        </w:tc>
+        <w:tc>
+          <w:tcPr>
+            <w:tcW w:w="6360" w:type="dxa"/>
             <w:shd w:val="clear" w:color="auto" w:fill="FFFFFF" w:themeFill="background1"/>
             <w:tcMar>
               <w:top w:w="80" w:type="dxa"/>
@@ -2067,94 +2153,13 @@
               <w:rPr>
                 <w:rFonts w:ascii="Times New Roman" w:hAnsi="Times New Roman" w:cs="Times New Roman"/>
               </w:rPr>
-              <w:t>Payment Terms</w:t>
-            </w:r>
-            <w:r>
-              <w:rPr>
-                <w:rFonts w:ascii="Times New Roman" w:hAnsi="Times New Roman" w:cs="Times New Roman"/>
-              </w:rPr>
-              <w:t xml:space="preserve"> </w:t>
-            </w:r>
-            <w:r>
-              <w:rPr>
-                <w:rFonts w:ascii="Times New Roman" w:hAnsi="Times New Roman" w:cs="Times New Roman"/>
-              </w:rPr>
-              <w:t>–</w:t>
-            </w:r>
-            <w:r>
-              <w:rPr>
-                <w:rFonts w:ascii="Times New Roman" w:hAnsi="Times New Roman" w:cs="Times New Roman"/>
-              </w:rPr>
-              <w:t xml:space="preserve"> </w:t>
-            </w:r>
-          </w:p>
-          <w:p>
-            <w:pPr>
-              <w:rPr>
-                <w:rFonts w:ascii="Times New Roman" w:hAnsi="Times New Roman" w:cs="Times New Roman"/>
-              </w:rPr>
-            </w:pPr>
-            <w:r>
-              <w:rPr>
-                <w:rFonts w:ascii="Times New Roman" w:hAnsi="Times New Roman" w:cs="Times New Roman"/>
-              </w:rPr>
-              <w:t xml:space="preserve">70% in Advance along with Purchase Order </w:t>
-            </w:r>
-          </w:p>
-          <w:p>
-            <w:pPr>
-              <w:rPr>
-                <w:rFonts w:ascii="Times New Roman" w:hAnsi="Times New Roman" w:cs="Times New Roman"/>
-              </w:rPr>
-            </w:pPr>
-            <w:r>
-              <w:rPr>
-                <w:rFonts w:ascii="Times New Roman" w:hAnsi="Times New Roman" w:cs="Times New Roman"/>
-              </w:rPr>
-              <w:t>20% on implementation</w:t>
-            </w:r>
-          </w:p>
-          <w:p>
-            <w:pPr>
-              <w:rPr>
-                <w:rFonts w:ascii="Times New Roman" w:hAnsi="Times New Roman" w:cs="Times New Roman"/>
-              </w:rPr>
-            </w:pPr>
-            <w:r>
-              <w:rPr>
-                <w:rFonts w:ascii="Times New Roman" w:hAnsi="Times New Roman" w:cs="Times New Roman"/>
-              </w:rPr>
-              <w:t>10% against GO LIVE or One Month from comple</w:t>
-            </w:r>
-            <w:r>
-              <w:rPr>
-                <w:rFonts w:ascii="Times New Roman" w:hAnsi="Times New Roman" w:cs="Times New Roman"/>
-              </w:rPr>
-              <w:t>ti</w:t>
-            </w:r>
-            <w:r>
-              <w:rPr>
-                <w:rFonts w:ascii="Times New Roman" w:hAnsi="Times New Roman" w:cs="Times New Roman"/>
-              </w:rPr>
-              <w:t>on of implementa</w:t>
-            </w:r>
-            <w:r>
-              <w:rPr>
-                <w:rFonts w:ascii="Times New Roman" w:hAnsi="Times New Roman" w:cs="Times New Roman"/>
-              </w:rPr>
-              <w:t>ti</w:t>
-            </w:r>
-            <w:r>
-              <w:rPr>
-                <w:rFonts w:ascii="Times New Roman" w:hAnsi="Times New Roman" w:cs="Times New Roman"/>
-              </w:rPr>
-              <w:t>on.</w:t>
-            </w:r>
-          </w:p>
-        </w:tc>
-        <w:tc>
-          <w:tcPr>
-            <w:tcW w:w="3141" w:type="dxa"/>
+              <w:t>Customization</w:t>
+            </w:r>
+          </w:p>
+        </w:tc>
+        <w:tc>
+          <w:tcPr>
+            <w:tcW w:w="2625" w:type="dxa"/>
             <w:shd w:val="clear" w:color="auto" w:fill="FFFFFF" w:themeFill="background1"/>
             <w:tcMar>
               <w:top w:w="80" w:type="dxa"/>
@@ -2169,6 +2174,12 @@
                 <w:rFonts w:ascii="Times New Roman" w:hAnsi="Times New Roman" w:cs="Times New Roman"/>
               </w:rPr>
             </w:pPr>
+            <w:r>
+              <w:rPr>
+                <w:rFonts w:ascii="Times New Roman" w:hAnsi="Times New Roman" w:cs="Times New Roman"/>
+              </w:rPr>
+              <w:t>TBD</w:t>
+            </w:r>
           </w:p>
         </w:tc>
       </w:tr>
@@ -2178,7 +2189,7 @@
         </w:trPr>
         <w:tc>
           <w:tcPr>
-            <w:tcW w:w="988" w:type="dxa"/>
+            <w:tcW w:w="1007" w:type="dxa"/>
             <w:shd w:val="clear" w:color="auto" w:fill="FFFFFF" w:themeFill="background1"/>
             <w:tcMar>
               <w:top w:w="80" w:type="dxa"/>
@@ -2197,13 +2208,13 @@
               <w:rPr>
                 <w:rFonts w:ascii="Times New Roman" w:hAnsi="Times New Roman" w:cs="Times New Roman"/>
               </w:rPr>
-              <w:t>6</w:t>
-            </w:r>
-          </w:p>
-        </w:tc>
-        <w:tc>
-          <w:tcPr>
-            <w:tcW w:w="5670" w:type="dxa"/>
+              <w:t xml:space="preserve"> 2.1</w:t>
+            </w:r>
+          </w:p>
+        </w:tc>
+        <w:tc>
+          <w:tcPr>
+            <w:tcW w:w="6360" w:type="dxa"/>
             <w:shd w:val="clear" w:color="auto" w:fill="FFFFFF" w:themeFill="background1"/>
             <w:tcMar>
               <w:top w:w="80" w:type="dxa"/>
@@ -2222,13 +2233,13 @@
               <w:rPr>
                 <w:rFonts w:ascii="Times New Roman" w:hAnsi="Times New Roman" w:cs="Times New Roman"/>
               </w:rPr>
-              <w:t>Support Level</w:t>
-            </w:r>
-          </w:p>
-        </w:tc>
-        <w:tc>
-          <w:tcPr>
-            <w:tcW w:w="3141" w:type="dxa"/>
+              <w:t>In case of any additional development required which will be consider 8000 per man day additional to above proposal.</w:t>
+            </w:r>
+          </w:p>
+        </w:tc>
+        <w:tc>
+          <w:tcPr>
+            <w:tcW w:w="2625" w:type="dxa"/>
             <w:shd w:val="clear" w:color="auto" w:fill="FFFFFF" w:themeFill="background1"/>
             <w:tcMar>
               <w:top w:w="80" w:type="dxa"/>
@@ -2252,7 +2263,7 @@
         </w:trPr>
         <w:tc>
           <w:tcPr>
-            <w:tcW w:w="988" w:type="dxa"/>
+            <w:tcW w:w="1007" w:type="dxa"/>
             <w:shd w:val="clear" w:color="auto" w:fill="FFFFFF" w:themeFill="background1"/>
             <w:tcMar>
               <w:top w:w="80" w:type="dxa"/>
@@ -2267,11 +2278,17 @@
                 <w:rFonts w:ascii="Times New Roman" w:hAnsi="Times New Roman" w:cs="Times New Roman"/>
               </w:rPr>
             </w:pPr>
-          </w:p>
-        </w:tc>
-        <w:tc>
-          <w:tcPr>
-            <w:tcW w:w="5670" w:type="dxa"/>
+            <w:r>
+              <w:rPr>
+                <w:rFonts w:ascii="Times New Roman" w:hAnsi="Times New Roman" w:cs="Times New Roman"/>
+              </w:rPr>
+              <w:t>3</w:t>
+            </w:r>
+          </w:p>
+        </w:tc>
+        <w:tc>
+          <w:tcPr>
+            <w:tcW w:w="6360" w:type="dxa"/>
             <w:shd w:val="clear" w:color="auto" w:fill="FFFFFF" w:themeFill="background1"/>
             <w:tcMar>
               <w:top w:w="80" w:type="dxa"/>
@@ -2290,48 +2307,13 @@
               <w:rPr>
                 <w:rFonts w:ascii="Times New Roman" w:hAnsi="Times New Roman" w:cs="Times New Roman"/>
               </w:rPr>
-              <w:t>L1: Telephone Support</w:t>
-            </w:r>
-            <w:r>
-              <w:rPr>
-                <w:rFonts w:ascii="Times New Roman" w:hAnsi="Times New Roman" w:cs="Times New Roman"/>
-                <w:b/>
-                <w:bCs/>
-              </w:rPr>
-              <w:t xml:space="preserve"> </w:t>
-            </w:r>
-            <w:r>
-              <w:rPr>
-                <w:rFonts w:ascii="Times New Roman" w:hAnsi="Times New Roman" w:cs="Times New Roman"/>
-                <w:b/>
-                <w:bCs/>
-              </w:rPr>
-              <w:t>–</w:t>
-            </w:r>
-            <w:r>
-              <w:rPr>
-                <w:rFonts w:ascii="Times New Roman" w:hAnsi="Times New Roman" w:cs="Times New Roman"/>
-              </w:rPr>
-              <w:t xml:space="preserve"> </w:t>
-            </w:r>
-          </w:p>
-          <w:p>
-            <w:pPr>
-              <w:rPr>
-                <w:rFonts w:ascii="Times New Roman" w:hAnsi="Times New Roman" w:cs="Times New Roman"/>
-              </w:rPr>
-            </w:pPr>
-            <w:r>
-              <w:rPr>
-                <w:rFonts w:ascii="Times New Roman" w:hAnsi="Times New Roman" w:cs="Times New Roman"/>
-              </w:rPr>
-              <w:t>Queries, understanding a feature, problem solving, etc.</w:t>
-            </w:r>
-          </w:p>
-        </w:tc>
-        <w:tc>
-          <w:tcPr>
-            <w:tcW w:w="3141" w:type="dxa"/>
+              <w:t>Renewal and Support from next year onwards</w:t>
+            </w:r>
+          </w:p>
+        </w:tc>
+        <w:tc>
+          <w:tcPr>
+            <w:tcW w:w="2625" w:type="dxa"/>
             <w:shd w:val="clear" w:color="auto" w:fill="FFFFFF" w:themeFill="background1"/>
             <w:tcMar>
               <w:top w:w="80" w:type="dxa"/>
@@ -2342,31 +2324,10 @@
           </w:tcPr>
           <w:p>
             <w:pPr>
-              <w:spacing w:line="259" w:lineRule="auto"/>
-              <w:ind w:left="1"/>
-              <w:rPr>
-                <w:rFonts w:ascii="Times New Roman" w:hAnsi="Times New Roman" w:cs="Times New Roman"/>
-              </w:rPr>
-            </w:pPr>
-            <w:r>
-              <w:rPr>
-                <w:rFonts w:ascii="Times New Roman" w:hAnsi="Times New Roman" w:cs="Times New Roman"/>
-              </w:rPr>
-              <w:t xml:space="preserve">Chargeable  </w:t>
-            </w:r>
-          </w:p>
-          <w:p>
-            <w:pPr>
-              <w:rPr>
-                <w:rFonts w:ascii="Times New Roman" w:hAnsi="Times New Roman" w:cs="Times New Roman"/>
-              </w:rPr>
-            </w:pPr>
-            <w:r>
-              <w:rPr>
-                <w:rFonts w:ascii="Times New Roman" w:hAnsi="Times New Roman" w:cs="Times New Roman"/>
-              </w:rPr>
-              <w:t>As per Sr. No. 4</w:t>
-            </w:r>
+              <w:rPr>
+                <w:rFonts w:ascii="Times New Roman" w:hAnsi="Times New Roman" w:cs="Times New Roman"/>
+              </w:rPr>
+            </w:pPr>
           </w:p>
         </w:tc>
       </w:tr>
@@ -2376,7 +2337,7 @@
         </w:trPr>
         <w:tc>
           <w:tcPr>
-            <w:tcW w:w="988" w:type="dxa"/>
+            <w:tcW w:w="1007" w:type="dxa"/>
             <w:shd w:val="clear" w:color="auto" w:fill="FFFFFF" w:themeFill="background1"/>
             <w:tcMar>
               <w:top w:w="80" w:type="dxa"/>
@@ -2391,11 +2352,29 @@
                 <w:rFonts w:ascii="Times New Roman" w:hAnsi="Times New Roman" w:cs="Times New Roman"/>
               </w:rPr>
             </w:pPr>
-          </w:p>
-        </w:tc>
-        <w:tc>
-          <w:tcPr>
-            <w:tcW w:w="5670" w:type="dxa"/>
+            <w:r>
+              <w:rPr>
+                <w:rFonts w:ascii="Times New Roman" w:hAnsi="Times New Roman" w:cs="Times New Roman"/>
+              </w:rPr>
+              <w:t xml:space="preserve"> </w:t>
+            </w:r>
+            <w:r>
+              <w:rPr>
+                <w:rFonts w:ascii="Times New Roman" w:hAnsi="Times New Roman" w:cs="Times New Roman"/>
+              </w:rPr>
+              <w:t>3</w:t>
+            </w:r>
+            <w:r>
+              <w:rPr>
+                <w:rFonts w:ascii="Times New Roman" w:hAnsi="Times New Roman" w:cs="Times New Roman"/>
+              </w:rPr>
+              <w:t>.1</w:t>
+            </w:r>
+          </w:p>
+        </w:tc>
+        <w:tc>
+          <w:tcPr>
+            <w:tcW w:w="6360" w:type="dxa"/>
             <w:shd w:val="clear" w:color="auto" w:fill="FFFFFF" w:themeFill="background1"/>
             <w:tcMar>
               <w:top w:w="80" w:type="dxa"/>
@@ -2414,48 +2393,26 @@
               <w:rPr>
                 <w:rFonts w:ascii="Times New Roman" w:hAnsi="Times New Roman" w:cs="Times New Roman"/>
               </w:rPr>
-              <w:t>L2: Bugs</w:t>
-            </w:r>
-            <w:r>
-              <w:rPr>
-                <w:rFonts w:ascii="Times New Roman" w:hAnsi="Times New Roman" w:cs="Times New Roman"/>
-                <w:b/>
-                <w:bCs/>
-              </w:rPr>
-              <w:t xml:space="preserve"> </w:t>
-            </w:r>
-            <w:r>
-              <w:rPr>
-                <w:rFonts w:ascii="Times New Roman" w:hAnsi="Times New Roman" w:cs="Times New Roman"/>
-                <w:b/>
-                <w:bCs/>
-              </w:rPr>
-              <w:t>–</w:t>
-            </w:r>
-          </w:p>
-          <w:p>
-            <w:pPr>
-              <w:rPr>
-                <w:rFonts w:ascii="Times New Roman" w:hAnsi="Times New Roman" w:cs="Times New Roman"/>
-              </w:rPr>
-            </w:pPr>
-            <w:r>
-              <w:rPr>
-                <w:rFonts w:ascii="Times New Roman" w:hAnsi="Times New Roman" w:cs="Times New Roman"/>
-              </w:rPr>
-              <w:t xml:space="preserve">Bugs </w:t>
-            </w:r>
-            <w:r>
-              <w:rPr>
-                <w:rFonts w:ascii="Times New Roman" w:hAnsi="Times New Roman" w:cs="Times New Roman"/>
-              </w:rPr>
-              <w:t>Identified by you or by BlechTek Software Solutions LLP.</w:t>
-            </w:r>
-          </w:p>
-        </w:tc>
-        <w:tc>
-          <w:tcPr>
-            <w:tcW w:w="3141" w:type="dxa"/>
+              <w:t xml:space="preserve">The License renewal would be required to be done every Year These renewal fees will facilitate to have the Product Upgrades, which would cover improvements, bug fixes, and changes in AIAG VDA compliances. </w:t>
+            </w:r>
+          </w:p>
+          <w:p>
+            <w:pPr>
+              <w:rPr>
+                <w:rFonts w:ascii="Times New Roman" w:hAnsi="Times New Roman" w:cs="Times New Roman"/>
+              </w:rPr>
+            </w:pPr>
+            <w:r>
+              <w:rPr>
+                <w:rFonts w:ascii="Times New Roman" w:hAnsi="Times New Roman" w:cs="Times New Roman"/>
+              </w:rPr>
+              <w:t xml:space="preserve">Support of 7 Man days is included in this price.  </w:t>
+            </w:r>
+          </w:p>
+        </w:tc>
+        <w:tc>
+          <w:tcPr>
+            <w:tcW w:w="2625" w:type="dxa"/>
             <w:shd w:val="clear" w:color="auto" w:fill="FFFFFF" w:themeFill="background1"/>
             <w:tcMar>
               <w:top w:w="80" w:type="dxa"/>
@@ -2474,8 +2431,27 @@
               <w:rPr>
                 <w:rFonts w:ascii="Times New Roman" w:hAnsi="Times New Roman" w:cs="Times New Roman"/>
               </w:rPr>
-              <w:t>Free, under License Fee Renewal</w:t>
-            </w:r>
+              <w:t>{{MODULE_</w:t>
+            </w:r>
+            <w:r>
+              <w:rPr>
+                <w:rFonts w:ascii="Times New Roman" w:hAnsi="Times New Roman" w:cs="Times New Roman"/>
+              </w:rPr>
+              <w:t>NAME</w:t>
+            </w:r>
+            <w:r>
+              <w:rPr>
+                <w:rFonts w:ascii="Times New Roman" w:hAnsi="Times New Roman" w:cs="Times New Roman"/>
+              </w:rPr>
+              <w:t>}}</w:t>
+            </w:r>
+          </w:p>
+          <w:p>
+            <w:pPr>
+              <w:rPr>
+                <w:rFonts w:ascii="Times New Roman" w:hAnsi="Times New Roman" w:cs="Times New Roman"/>
+              </w:rPr>
+            </w:pPr>
           </w:p>
         </w:tc>
       </w:tr>
@@ -2485,7 +2461,7 @@
         </w:trPr>
         <w:tc>
           <w:tcPr>
-            <w:tcW w:w="988" w:type="dxa"/>
+            <w:tcW w:w="1007" w:type="dxa"/>
             <w:shd w:val="clear" w:color="auto" w:fill="FFFFFF" w:themeFill="background1"/>
             <w:tcMar>
               <w:top w:w="80" w:type="dxa"/>
@@ -2500,11 +2476,17 @@
                 <w:rFonts w:ascii="Times New Roman" w:hAnsi="Times New Roman" w:cs="Times New Roman"/>
               </w:rPr>
             </w:pPr>
-          </w:p>
-        </w:tc>
-        <w:tc>
-          <w:tcPr>
-            <w:tcW w:w="5670" w:type="dxa"/>
+            <w:r>
+              <w:rPr>
+                <w:rFonts w:ascii="Times New Roman" w:hAnsi="Times New Roman" w:cs="Times New Roman"/>
+              </w:rPr>
+              <w:t>4</w:t>
+            </w:r>
+          </w:p>
+        </w:tc>
+        <w:tc>
+          <w:tcPr>
+            <w:tcW w:w="6360" w:type="dxa"/>
             <w:shd w:val="clear" w:color="auto" w:fill="FFFFFF" w:themeFill="background1"/>
             <w:tcMar>
               <w:top w:w="80" w:type="dxa"/>
@@ -2523,41 +2505,13 @@
               <w:rPr>
                 <w:rFonts w:ascii="Times New Roman" w:hAnsi="Times New Roman" w:cs="Times New Roman"/>
               </w:rPr>
-              <w:t>L3: Customer Specific Enhancements</w:t>
-            </w:r>
-            <w:r>
-              <w:rPr>
-                <w:rFonts w:ascii="Times New Roman" w:hAnsi="Times New Roman" w:cs="Times New Roman"/>
-                <w:b/>
-                <w:bCs/>
-              </w:rPr>
-              <w:t xml:space="preserve"> –</w:t>
-            </w:r>
-            <w:r>
-              <w:rPr>
-                <w:rFonts w:ascii="Times New Roman" w:hAnsi="Times New Roman" w:cs="Times New Roman"/>
-              </w:rPr>
-              <w:t xml:space="preserve"> </w:t>
-            </w:r>
-          </w:p>
-          <w:p>
-            <w:pPr>
-              <w:rPr>
-                <w:rFonts w:ascii="Times New Roman" w:hAnsi="Times New Roman" w:cs="Times New Roman"/>
-              </w:rPr>
-            </w:pPr>
-            <w:r>
-              <w:rPr>
-                <w:rFonts w:ascii="Times New Roman" w:hAnsi="Times New Roman" w:cs="Times New Roman"/>
-              </w:rPr>
-              <w:lastRenderedPageBreak/>
-              <w:t>New/Change in Document Prin ng format, New/Changes in Reports, New/Change in Reports</w:t>
-            </w:r>
-          </w:p>
-        </w:tc>
-        <w:tc>
-          <w:tcPr>
-            <w:tcW w:w="3141" w:type="dxa"/>
+              <w:t>Support Services</w:t>
+            </w:r>
+          </w:p>
+        </w:tc>
+        <w:tc>
+          <w:tcPr>
+            <w:tcW w:w="2625" w:type="dxa"/>
             <w:shd w:val="clear" w:color="auto" w:fill="FFFFFF" w:themeFill="background1"/>
             <w:tcMar>
               <w:top w:w="80" w:type="dxa"/>
@@ -2568,31 +2522,15 @@
           </w:tcPr>
           <w:p>
             <w:pPr>
-              <w:spacing w:line="259" w:lineRule="auto"/>
-              <w:ind w:left="1"/>
-              <w:rPr>
-                <w:rFonts w:ascii="Times New Roman" w:hAnsi="Times New Roman" w:cs="Times New Roman"/>
-              </w:rPr>
-            </w:pPr>
-            <w:r>
-              <w:rPr>
-                <w:rFonts w:ascii="Times New Roman" w:hAnsi="Times New Roman" w:cs="Times New Roman"/>
-              </w:rPr>
-              <w:lastRenderedPageBreak/>
-              <w:t xml:space="preserve">Chargeable  </w:t>
-            </w:r>
-          </w:p>
-          <w:p>
-            <w:pPr>
-              <w:rPr>
-                <w:rFonts w:ascii="Times New Roman" w:hAnsi="Times New Roman" w:cs="Times New Roman"/>
-              </w:rPr>
-            </w:pPr>
-            <w:r>
-              <w:rPr>
-                <w:rFonts w:ascii="Times New Roman" w:hAnsi="Times New Roman" w:cs="Times New Roman"/>
-              </w:rPr>
-              <w:t>As per Sr. No. 4</w:t>
+              <w:rPr>
+                <w:rFonts w:ascii="Times New Roman" w:hAnsi="Times New Roman" w:cs="Times New Roman"/>
+              </w:rPr>
+            </w:pPr>
+            <w:r>
+              <w:rPr>
+                <w:rFonts w:ascii="Times New Roman" w:hAnsi="Times New Roman" w:cs="Times New Roman"/>
+              </w:rPr>
+              <w:t>8000 per Man Day</w:t>
             </w:r>
           </w:p>
         </w:tc>
@@ -2603,7 +2541,7 @@
         </w:trPr>
         <w:tc>
           <w:tcPr>
-            <w:tcW w:w="988" w:type="dxa"/>
+            <w:tcW w:w="1007" w:type="dxa"/>
             <w:shd w:val="clear" w:color="auto" w:fill="FFFFFF" w:themeFill="background1"/>
             <w:tcMar>
               <w:top w:w="80" w:type="dxa"/>
@@ -2618,11 +2556,17 @@
                 <w:rFonts w:ascii="Times New Roman" w:hAnsi="Times New Roman" w:cs="Times New Roman"/>
               </w:rPr>
             </w:pPr>
-          </w:p>
-        </w:tc>
-        <w:tc>
-          <w:tcPr>
-            <w:tcW w:w="5670" w:type="dxa"/>
+            <w:r>
+              <w:rPr>
+                <w:rFonts w:ascii="Times New Roman" w:hAnsi="Times New Roman" w:cs="Times New Roman"/>
+              </w:rPr>
+              <w:t xml:space="preserve"> 4.1</w:t>
+            </w:r>
+          </w:p>
+        </w:tc>
+        <w:tc>
+          <w:tcPr>
+            <w:tcW w:w="6360" w:type="dxa"/>
             <w:shd w:val="clear" w:color="auto" w:fill="FFFFFF" w:themeFill="background1"/>
             <w:tcMar>
               <w:top w:w="80" w:type="dxa"/>
@@ -2641,52 +2585,27 @@
               <w:rPr>
                 <w:rFonts w:ascii="Times New Roman" w:hAnsi="Times New Roman" w:cs="Times New Roman"/>
               </w:rPr>
-              <w:t>L4: Product Upgrade</w:t>
-            </w:r>
-            <w:r>
-              <w:rPr>
-                <w:rFonts w:ascii="Times New Roman" w:hAnsi="Times New Roman" w:cs="Times New Roman"/>
-                <w:b/>
-                <w:bCs/>
-              </w:rPr>
-              <w:t xml:space="preserve"> –</w:t>
-            </w:r>
-            <w:r>
-              <w:rPr>
-                <w:rFonts w:ascii="Times New Roman" w:hAnsi="Times New Roman" w:cs="Times New Roman"/>
-              </w:rPr>
-              <w:t xml:space="preserve"> </w:t>
-            </w:r>
-          </w:p>
-          <w:p>
-            <w:pPr>
-              <w:rPr>
-                <w:rFonts w:ascii="Times New Roman" w:hAnsi="Times New Roman" w:cs="Times New Roman"/>
-              </w:rPr>
-            </w:pPr>
-            <w:r>
-              <w:rPr>
-                <w:rFonts w:ascii="Times New Roman" w:hAnsi="Times New Roman" w:cs="Times New Roman"/>
-              </w:rPr>
-              <w:t>Product Upgrade as done by BlechTek So ware Solu</w:t>
-            </w:r>
-            <w:r>
-              <w:rPr>
-                <w:rFonts w:ascii="Times New Roman" w:hAnsi="Times New Roman" w:cs="Times New Roman"/>
-              </w:rPr>
-              <w:t>ti</w:t>
-            </w:r>
-            <w:r>
-              <w:rPr>
-                <w:rFonts w:ascii="Times New Roman" w:hAnsi="Times New Roman" w:cs="Times New Roman"/>
-              </w:rPr>
-              <w:t xml:space="preserve">ons LLP on their own  </w:t>
-            </w:r>
-          </w:p>
-        </w:tc>
-        <w:tc>
-          <w:tcPr>
-            <w:tcW w:w="3141" w:type="dxa"/>
+              <w:t xml:space="preserve">First Year - These Services start a er 1 Month from start of Go Live. Subsequent Years – A er </w:t>
+            </w:r>
+            <w:proofErr w:type="spellStart"/>
+            <w:r>
+              <w:rPr>
+                <w:rFonts w:ascii="Times New Roman" w:hAnsi="Times New Roman" w:cs="Times New Roman"/>
+              </w:rPr>
+              <w:t>comple</w:t>
+            </w:r>
+            <w:proofErr w:type="spellEnd"/>
+            <w:r>
+              <w:rPr>
+                <w:rFonts w:ascii="Times New Roman" w:hAnsi="Times New Roman" w:cs="Times New Roman"/>
+              </w:rPr>
+              <w:t xml:space="preserve"> on of 7 Man Days</w:t>
+            </w:r>
+          </w:p>
+        </w:tc>
+        <w:tc>
+          <w:tcPr>
+            <w:tcW w:w="2625" w:type="dxa"/>
             <w:shd w:val="clear" w:color="auto" w:fill="FFFFFF" w:themeFill="background1"/>
             <w:tcMar>
               <w:top w:w="80" w:type="dxa"/>
@@ -2701,24 +2620,6 @@
                 <w:rFonts w:ascii="Times New Roman" w:hAnsi="Times New Roman" w:cs="Times New Roman"/>
               </w:rPr>
             </w:pPr>
-            <w:r>
-              <w:rPr>
-                <w:rFonts w:ascii="Times New Roman" w:hAnsi="Times New Roman" w:cs="Times New Roman"/>
-              </w:rPr>
-              <w:t>Free, under License Fee</w:t>
-            </w:r>
-            <w:r>
-              <w:rPr>
-                <w:rFonts w:ascii="Times New Roman" w:hAnsi="Times New Roman" w:cs="Times New Roman"/>
-              </w:rPr>
-              <w:t>`</w:t>
-            </w:r>
-            <w:r>
-              <w:rPr>
-                <w:rFonts w:ascii="Times New Roman" w:hAnsi="Times New Roman" w:cs="Times New Roman"/>
-              </w:rPr>
-              <w:t xml:space="preserve"> Renewal</w:t>
-            </w:r>
           </w:p>
         </w:tc>
       </w:tr>
@@ -2728,7 +2629,7 @@
         </w:trPr>
         <w:tc>
           <w:tcPr>
-            <w:tcW w:w="988" w:type="dxa"/>
+            <w:tcW w:w="1007" w:type="dxa"/>
             <w:shd w:val="clear" w:color="auto" w:fill="FFFFFF" w:themeFill="background1"/>
             <w:tcMar>
               <w:top w:w="80" w:type="dxa"/>
@@ -2743,11 +2644,17 @@
                 <w:rFonts w:ascii="Times New Roman" w:hAnsi="Times New Roman" w:cs="Times New Roman"/>
               </w:rPr>
             </w:pPr>
-          </w:p>
-        </w:tc>
-        <w:tc>
-          <w:tcPr>
-            <w:tcW w:w="5670" w:type="dxa"/>
+            <w:r>
+              <w:rPr>
+                <w:rFonts w:ascii="Times New Roman" w:hAnsi="Times New Roman" w:cs="Times New Roman"/>
+              </w:rPr>
+              <w:t>5</w:t>
+            </w:r>
+          </w:p>
+        </w:tc>
+        <w:tc>
+          <w:tcPr>
+            <w:tcW w:w="6360" w:type="dxa"/>
             <w:shd w:val="clear" w:color="auto" w:fill="FFFFFF" w:themeFill="background1"/>
             <w:tcMar>
               <w:top w:w="80" w:type="dxa"/>
@@ -2766,34 +2673,13 @@
               <w:rPr>
                 <w:rFonts w:ascii="Times New Roman" w:hAnsi="Times New Roman" w:cs="Times New Roman"/>
               </w:rPr>
-              <w:t>L5: Implementation</w:t>
-            </w:r>
-            <w:r>
-              <w:rPr>
-                <w:rFonts w:ascii="Times New Roman" w:hAnsi="Times New Roman" w:cs="Times New Roman"/>
-                <w:b/>
-                <w:bCs/>
-              </w:rPr>
-              <w:t xml:space="preserve"> –</w:t>
-            </w:r>
-          </w:p>
-          <w:p>
-            <w:pPr>
-              <w:rPr>
-                <w:rFonts w:ascii="Times New Roman" w:hAnsi="Times New Roman" w:cs="Times New Roman"/>
-              </w:rPr>
-            </w:pPr>
-            <w:r>
-              <w:rPr>
-                <w:rFonts w:ascii="Times New Roman" w:hAnsi="Times New Roman" w:cs="Times New Roman"/>
-              </w:rPr>
-              <w:t>Master updation, new feature implementation.</w:t>
-            </w:r>
-          </w:p>
-        </w:tc>
-        <w:tc>
-          <w:tcPr>
-            <w:tcW w:w="3141" w:type="dxa"/>
+              <w:t>Payment Terms</w:t>
+            </w:r>
+          </w:p>
+        </w:tc>
+        <w:tc>
+          <w:tcPr>
+            <w:tcW w:w="2625" w:type="dxa"/>
             <w:shd w:val="clear" w:color="auto" w:fill="FFFFFF" w:themeFill="background1"/>
             <w:tcMar>
               <w:top w:w="80" w:type="dxa"/>
@@ -2808,25 +2694,6 @@
                 <w:rFonts w:ascii="Times New Roman" w:hAnsi="Times New Roman" w:cs="Times New Roman"/>
               </w:rPr>
             </w:pPr>
-            <w:r>
-              <w:rPr>
-                <w:rFonts w:ascii="Times New Roman" w:hAnsi="Times New Roman" w:cs="Times New Roman"/>
-              </w:rPr>
-              <w:t xml:space="preserve">Chargeable  </w:t>
-            </w:r>
-          </w:p>
-          <w:p>
-            <w:pPr>
-              <w:rPr>
-                <w:rFonts w:ascii="Times New Roman" w:hAnsi="Times New Roman" w:cs="Times New Roman"/>
-              </w:rPr>
-            </w:pPr>
-            <w:r>
-              <w:rPr>
-                <w:rFonts w:ascii="Times New Roman" w:hAnsi="Times New Roman" w:cs="Times New Roman"/>
-              </w:rPr>
-              <w:t>As per Sr. No. 4</w:t>
-            </w:r>
           </w:p>
         </w:tc>
       </w:tr>
@@ -2836,7 +2703,7 @@
         </w:trPr>
         <w:tc>
           <w:tcPr>
-            <w:tcW w:w="988" w:type="dxa"/>
+            <w:tcW w:w="1007" w:type="dxa"/>
             <w:shd w:val="clear" w:color="auto" w:fill="FFFFFF" w:themeFill="background1"/>
             <w:tcMar>
               <w:top w:w="80" w:type="dxa"/>
@@ -2855,13 +2722,14 @@
               <w:rPr>
                 <w:rFonts w:ascii="Times New Roman" w:hAnsi="Times New Roman" w:cs="Times New Roman"/>
               </w:rPr>
-              <w:t>7</w:t>
-            </w:r>
-          </w:p>
-        </w:tc>
-        <w:tc>
-          <w:tcPr>
-            <w:tcW w:w="5670" w:type="dxa"/>
+              <w:lastRenderedPageBreak/>
+              <w:t xml:space="preserve"> 5.1</w:t>
+            </w:r>
+          </w:p>
+        </w:tc>
+        <w:tc>
+          <w:tcPr>
+            <w:tcW w:w="6360" w:type="dxa"/>
             <w:shd w:val="clear" w:color="auto" w:fill="FFFFFF" w:themeFill="background1"/>
             <w:tcMar>
               <w:top w:w="80" w:type="dxa"/>
@@ -2880,13 +2748,13 @@
               <w:rPr>
                 <w:rFonts w:ascii="Times New Roman" w:hAnsi="Times New Roman" w:cs="Times New Roman"/>
               </w:rPr>
-              <w:t>Taxes</w:t>
-            </w:r>
-          </w:p>
-        </w:tc>
-        <w:tc>
-          <w:tcPr>
-            <w:tcW w:w="3141" w:type="dxa"/>
+              <w:t xml:space="preserve">70% in Advance along with Purchase Order </w:t>
+            </w:r>
+          </w:p>
+        </w:tc>
+        <w:tc>
+          <w:tcPr>
+            <w:tcW w:w="2625" w:type="dxa"/>
             <w:shd w:val="clear" w:color="auto" w:fill="FFFFFF" w:themeFill="background1"/>
             <w:tcMar>
               <w:top w:w="80" w:type="dxa"/>
@@ -2901,6 +2769,914 @@
                 <w:rFonts w:ascii="Times New Roman" w:hAnsi="Times New Roman" w:cs="Times New Roman"/>
               </w:rPr>
             </w:pPr>
+          </w:p>
+        </w:tc>
+      </w:tr>
+      <w:tr>
+        <w:trPr>
+          <w:trHeight w:val="20"/>
+        </w:trPr>
+        <w:tc>
+          <w:tcPr>
+            <w:tcW w:w="1007" w:type="dxa"/>
+            <w:shd w:val="clear" w:color="auto" w:fill="FFFFFF" w:themeFill="background1"/>
+            <w:tcMar>
+              <w:top w:w="80" w:type="dxa"/>
+              <w:left w:w="120" w:type="dxa"/>
+              <w:bottom w:w="80" w:type="dxa"/>
+              <w:right w:w="120" w:type="dxa"/>
+            </w:tcMar>
+          </w:tcPr>
+          <w:p>
+            <w:pPr>
+              <w:rPr>
+                <w:rFonts w:ascii="Times New Roman" w:hAnsi="Times New Roman" w:cs="Times New Roman"/>
+              </w:rPr>
+            </w:pPr>
+            <w:r>
+              <w:rPr>
+                <w:rFonts w:ascii="Times New Roman" w:hAnsi="Times New Roman" w:cs="Times New Roman"/>
+              </w:rPr>
+              <w:t xml:space="preserve"> 5.2</w:t>
+            </w:r>
+          </w:p>
+        </w:tc>
+        <w:tc>
+          <w:tcPr>
+            <w:tcW w:w="6360" w:type="dxa"/>
+            <w:shd w:val="clear" w:color="auto" w:fill="FFFFFF" w:themeFill="background1"/>
+            <w:tcMar>
+              <w:top w:w="80" w:type="dxa"/>
+              <w:left w:w="120" w:type="dxa"/>
+              <w:bottom w:w="80" w:type="dxa"/>
+              <w:right w:w="120" w:type="dxa"/>
+            </w:tcMar>
+          </w:tcPr>
+          <w:p>
+            <w:pPr>
+              <w:rPr>
+                <w:rFonts w:ascii="Times New Roman" w:hAnsi="Times New Roman" w:cs="Times New Roman"/>
+              </w:rPr>
+            </w:pPr>
+            <w:r>
+              <w:rPr>
+                <w:rFonts w:ascii="Times New Roman" w:hAnsi="Times New Roman" w:cs="Times New Roman"/>
+              </w:rPr>
+              <w:t xml:space="preserve">20% on </w:t>
+            </w:r>
+            <w:r>
+              <w:rPr>
+                <w:rFonts w:ascii="Times New Roman" w:hAnsi="Times New Roman" w:cs="Times New Roman"/>
+              </w:rPr>
+              <w:t>I</w:t>
+            </w:r>
+            <w:r>
+              <w:rPr>
+                <w:rFonts w:ascii="Times New Roman" w:hAnsi="Times New Roman" w:cs="Times New Roman"/>
+              </w:rPr>
+              <w:t>mplementation</w:t>
+            </w:r>
+          </w:p>
+        </w:tc>
+        <w:tc>
+          <w:tcPr>
+            <w:tcW w:w="2625" w:type="dxa"/>
+            <w:shd w:val="clear" w:color="auto" w:fill="FFFFFF" w:themeFill="background1"/>
+            <w:tcMar>
+              <w:top w:w="80" w:type="dxa"/>
+              <w:left w:w="120" w:type="dxa"/>
+              <w:bottom w:w="80" w:type="dxa"/>
+              <w:right w:w="120" w:type="dxa"/>
+            </w:tcMar>
+          </w:tcPr>
+          <w:p>
+            <w:pPr>
+              <w:rPr>
+                <w:rFonts w:ascii="Times New Roman" w:hAnsi="Times New Roman" w:cs="Times New Roman"/>
+              </w:rPr>
+            </w:pPr>
+          </w:p>
+        </w:tc>
+      </w:tr>
+      <w:tr>
+        <w:trPr>
+          <w:trHeight w:val="20"/>
+        </w:trPr>
+        <w:tc>
+          <w:tcPr>
+            <w:tcW w:w="1007" w:type="dxa"/>
+            <w:shd w:val="clear" w:color="auto" w:fill="FFFFFF" w:themeFill="background1"/>
+            <w:tcMar>
+              <w:top w:w="80" w:type="dxa"/>
+              <w:left w:w="120" w:type="dxa"/>
+              <w:bottom w:w="80" w:type="dxa"/>
+              <w:right w:w="120" w:type="dxa"/>
+            </w:tcMar>
+          </w:tcPr>
+          <w:p>
+            <w:pPr>
+              <w:rPr>
+                <w:rFonts w:ascii="Times New Roman" w:hAnsi="Times New Roman" w:cs="Times New Roman"/>
+              </w:rPr>
+            </w:pPr>
+            <w:r>
+              <w:rPr>
+                <w:rFonts w:ascii="Times New Roman" w:hAnsi="Times New Roman" w:cs="Times New Roman"/>
+              </w:rPr>
+              <w:t xml:space="preserve"> 5.3</w:t>
+            </w:r>
+          </w:p>
+        </w:tc>
+        <w:tc>
+          <w:tcPr>
+            <w:tcW w:w="6360" w:type="dxa"/>
+            <w:shd w:val="clear" w:color="auto" w:fill="FFFFFF" w:themeFill="background1"/>
+            <w:tcMar>
+              <w:top w:w="80" w:type="dxa"/>
+              <w:left w:w="120" w:type="dxa"/>
+              <w:bottom w:w="80" w:type="dxa"/>
+              <w:right w:w="120" w:type="dxa"/>
+            </w:tcMar>
+          </w:tcPr>
+          <w:p>
+            <w:pPr>
+              <w:rPr>
+                <w:rFonts w:ascii="Times New Roman" w:hAnsi="Times New Roman" w:cs="Times New Roman"/>
+              </w:rPr>
+            </w:pPr>
+            <w:r>
+              <w:rPr>
+                <w:rFonts w:ascii="Times New Roman" w:hAnsi="Times New Roman" w:cs="Times New Roman"/>
+              </w:rPr>
+              <w:t>10% against GO LIVE or One Month from completion of implementation.</w:t>
+            </w:r>
+          </w:p>
+        </w:tc>
+        <w:tc>
+          <w:tcPr>
+            <w:tcW w:w="2625" w:type="dxa"/>
+            <w:shd w:val="clear" w:color="auto" w:fill="FFFFFF" w:themeFill="background1"/>
+            <w:tcMar>
+              <w:top w:w="80" w:type="dxa"/>
+              <w:left w:w="120" w:type="dxa"/>
+              <w:bottom w:w="80" w:type="dxa"/>
+              <w:right w:w="120" w:type="dxa"/>
+            </w:tcMar>
+          </w:tcPr>
+          <w:p>
+            <w:pPr>
+              <w:rPr>
+                <w:rFonts w:ascii="Times New Roman" w:hAnsi="Times New Roman" w:cs="Times New Roman"/>
+              </w:rPr>
+            </w:pPr>
+          </w:p>
+        </w:tc>
+      </w:tr>
+      <w:tr>
+        <w:trPr>
+          <w:trHeight w:val="20"/>
+        </w:trPr>
+        <w:tc>
+          <w:tcPr>
+            <w:tcW w:w="1007" w:type="dxa"/>
+            <w:shd w:val="clear" w:color="auto" w:fill="FFFFFF" w:themeFill="background1"/>
+            <w:tcMar>
+              <w:top w:w="80" w:type="dxa"/>
+              <w:left w:w="120" w:type="dxa"/>
+              <w:bottom w:w="80" w:type="dxa"/>
+              <w:right w:w="120" w:type="dxa"/>
+            </w:tcMar>
+          </w:tcPr>
+          <w:p>
+            <w:pPr>
+              <w:rPr>
+                <w:rFonts w:ascii="Times New Roman" w:hAnsi="Times New Roman" w:cs="Times New Roman"/>
+              </w:rPr>
+            </w:pPr>
+            <w:r>
+              <w:rPr>
+                <w:rFonts w:ascii="Times New Roman" w:hAnsi="Times New Roman" w:cs="Times New Roman"/>
+              </w:rPr>
+              <w:t>6</w:t>
+            </w:r>
+          </w:p>
+        </w:tc>
+        <w:tc>
+          <w:tcPr>
+            <w:tcW w:w="6360" w:type="dxa"/>
+            <w:shd w:val="clear" w:color="auto" w:fill="FFFFFF" w:themeFill="background1"/>
+            <w:tcMar>
+              <w:top w:w="80" w:type="dxa"/>
+              <w:left w:w="120" w:type="dxa"/>
+              <w:bottom w:w="80" w:type="dxa"/>
+              <w:right w:w="120" w:type="dxa"/>
+            </w:tcMar>
+          </w:tcPr>
+          <w:p>
+            <w:pPr>
+              <w:rPr>
+                <w:rFonts w:ascii="Times New Roman" w:hAnsi="Times New Roman" w:cs="Times New Roman"/>
+              </w:rPr>
+            </w:pPr>
+            <w:r>
+              <w:rPr>
+                <w:rFonts w:ascii="Times New Roman" w:hAnsi="Times New Roman" w:cs="Times New Roman"/>
+              </w:rPr>
+              <w:t>Support Level</w:t>
+            </w:r>
+          </w:p>
+        </w:tc>
+        <w:tc>
+          <w:tcPr>
+            <w:tcW w:w="2625" w:type="dxa"/>
+            <w:shd w:val="clear" w:color="auto" w:fill="FFFFFF" w:themeFill="background1"/>
+            <w:tcMar>
+              <w:top w:w="80" w:type="dxa"/>
+              <w:left w:w="120" w:type="dxa"/>
+              <w:bottom w:w="80" w:type="dxa"/>
+              <w:right w:w="120" w:type="dxa"/>
+            </w:tcMar>
+          </w:tcPr>
+          <w:p>
+            <w:pPr>
+              <w:rPr>
+                <w:rFonts w:ascii="Times New Roman" w:hAnsi="Times New Roman" w:cs="Times New Roman"/>
+              </w:rPr>
+            </w:pPr>
+          </w:p>
+        </w:tc>
+      </w:tr>
+      <w:tr>
+        <w:trPr>
+          <w:trHeight w:val="20"/>
+        </w:trPr>
+        <w:tc>
+          <w:tcPr>
+            <w:tcW w:w="1007" w:type="dxa"/>
+            <w:shd w:val="clear" w:color="auto" w:fill="FFFFFF" w:themeFill="background1"/>
+            <w:tcMar>
+              <w:top w:w="80" w:type="dxa"/>
+              <w:left w:w="120" w:type="dxa"/>
+              <w:bottom w:w="80" w:type="dxa"/>
+              <w:right w:w="120" w:type="dxa"/>
+            </w:tcMar>
+          </w:tcPr>
+          <w:p>
+            <w:pPr>
+              <w:rPr>
+                <w:rFonts w:ascii="Times New Roman" w:hAnsi="Times New Roman" w:cs="Times New Roman"/>
+              </w:rPr>
+            </w:pPr>
+            <w:r>
+              <w:rPr>
+                <w:rFonts w:ascii="Times New Roman" w:hAnsi="Times New Roman" w:cs="Times New Roman"/>
+              </w:rPr>
+              <w:t xml:space="preserve"> 6.1</w:t>
+            </w:r>
+          </w:p>
+        </w:tc>
+        <w:tc>
+          <w:tcPr>
+            <w:tcW w:w="6360" w:type="dxa"/>
+            <w:shd w:val="clear" w:color="auto" w:fill="FFFFFF" w:themeFill="background1"/>
+            <w:tcMar>
+              <w:top w:w="80" w:type="dxa"/>
+              <w:left w:w="120" w:type="dxa"/>
+              <w:bottom w:w="80" w:type="dxa"/>
+              <w:right w:w="120" w:type="dxa"/>
+            </w:tcMar>
+          </w:tcPr>
+          <w:p>
+            <w:pPr>
+              <w:rPr>
+                <w:rFonts w:ascii="Times New Roman" w:hAnsi="Times New Roman" w:cs="Times New Roman"/>
+              </w:rPr>
+            </w:pPr>
+            <w:r>
+              <w:rPr>
+                <w:rFonts w:ascii="Times New Roman" w:hAnsi="Times New Roman" w:cs="Times New Roman"/>
+              </w:rPr>
+              <w:t>L1: Telephone Support</w:t>
+            </w:r>
+            <w:r>
+              <w:rPr>
+                <w:rFonts w:ascii="Times New Roman" w:hAnsi="Times New Roman" w:cs="Times New Roman"/>
+                <w:b/>
+                <w:bCs/>
+              </w:rPr>
+              <w:t xml:space="preserve"> </w:t>
+            </w:r>
+            <w:r>
+              <w:rPr>
+                <w:rFonts w:ascii="Times New Roman" w:hAnsi="Times New Roman" w:cs="Times New Roman"/>
+                <w:b/>
+                <w:bCs/>
+              </w:rPr>
+              <w:t>–</w:t>
+            </w:r>
+            <w:r>
+              <w:rPr>
+                <w:rFonts w:ascii="Times New Roman" w:hAnsi="Times New Roman" w:cs="Times New Roman"/>
+              </w:rPr>
+              <w:t xml:space="preserve"> </w:t>
+            </w:r>
+          </w:p>
+          <w:p>
+            <w:pPr>
+              <w:rPr>
+                <w:rFonts w:ascii="Times New Roman" w:hAnsi="Times New Roman" w:cs="Times New Roman"/>
+              </w:rPr>
+            </w:pPr>
+            <w:r>
+              <w:rPr>
+                <w:rFonts w:ascii="Times New Roman" w:hAnsi="Times New Roman" w:cs="Times New Roman"/>
+              </w:rPr>
+              <w:t>Queries, understanding a feature, problem solving, etc.</w:t>
+            </w:r>
+          </w:p>
+        </w:tc>
+        <w:tc>
+          <w:tcPr>
+            <w:tcW w:w="2625" w:type="dxa"/>
+            <w:shd w:val="clear" w:color="auto" w:fill="FFFFFF" w:themeFill="background1"/>
+            <w:tcMar>
+              <w:top w:w="80" w:type="dxa"/>
+              <w:left w:w="120" w:type="dxa"/>
+              <w:bottom w:w="80" w:type="dxa"/>
+              <w:right w:w="120" w:type="dxa"/>
+            </w:tcMar>
+          </w:tcPr>
+          <w:p>
+            <w:pPr>
+              <w:spacing w:line="259" w:lineRule="auto"/>
+              <w:ind w:left="1"/>
+              <w:rPr>
+                <w:rFonts w:ascii="Times New Roman" w:hAnsi="Times New Roman" w:cs="Times New Roman"/>
+              </w:rPr>
+            </w:pPr>
+            <w:r>
+              <w:rPr>
+                <w:rFonts w:ascii="Times New Roman" w:hAnsi="Times New Roman" w:cs="Times New Roman"/>
+              </w:rPr>
+              <w:t xml:space="preserve">Chargeable  </w:t>
+            </w:r>
+          </w:p>
+          <w:p>
+            <w:pPr>
+              <w:rPr>
+                <w:rFonts w:ascii="Times New Roman" w:hAnsi="Times New Roman" w:cs="Times New Roman"/>
+              </w:rPr>
+            </w:pPr>
+            <w:r>
+              <w:rPr>
+                <w:rFonts w:ascii="Times New Roman" w:hAnsi="Times New Roman" w:cs="Times New Roman"/>
+              </w:rPr>
+              <w:t>As per Sr. No. 4</w:t>
+            </w:r>
+          </w:p>
+        </w:tc>
+      </w:tr>
+      <w:tr>
+        <w:trPr>
+          <w:trHeight w:val="20"/>
+        </w:trPr>
+        <w:tc>
+          <w:tcPr>
+            <w:tcW w:w="1007" w:type="dxa"/>
+            <w:shd w:val="clear" w:color="auto" w:fill="FFFFFF" w:themeFill="background1"/>
+            <w:tcMar>
+              <w:top w:w="80" w:type="dxa"/>
+              <w:left w:w="120" w:type="dxa"/>
+              <w:bottom w:w="80" w:type="dxa"/>
+              <w:right w:w="120" w:type="dxa"/>
+            </w:tcMar>
+          </w:tcPr>
+          <w:p>
+            <w:pPr>
+              <w:rPr>
+                <w:rFonts w:ascii="Times New Roman" w:hAnsi="Times New Roman" w:cs="Times New Roman"/>
+              </w:rPr>
+            </w:pPr>
+            <w:r>
+              <w:rPr>
+                <w:rFonts w:ascii="Times New Roman" w:hAnsi="Times New Roman" w:cs="Times New Roman"/>
+              </w:rPr>
+              <w:t xml:space="preserve"> 6.2</w:t>
+            </w:r>
+          </w:p>
+        </w:tc>
+        <w:tc>
+          <w:tcPr>
+            <w:tcW w:w="6360" w:type="dxa"/>
+            <w:shd w:val="clear" w:color="auto" w:fill="FFFFFF" w:themeFill="background1"/>
+            <w:tcMar>
+              <w:top w:w="80" w:type="dxa"/>
+              <w:left w:w="120" w:type="dxa"/>
+              <w:bottom w:w="80" w:type="dxa"/>
+              <w:right w:w="120" w:type="dxa"/>
+            </w:tcMar>
+          </w:tcPr>
+          <w:p>
+            <w:pPr>
+              <w:rPr>
+                <w:rFonts w:ascii="Times New Roman" w:hAnsi="Times New Roman" w:cs="Times New Roman"/>
+              </w:rPr>
+            </w:pPr>
+            <w:r>
+              <w:rPr>
+                <w:rFonts w:ascii="Times New Roman" w:hAnsi="Times New Roman" w:cs="Times New Roman"/>
+              </w:rPr>
+              <w:t>L2: Bugs</w:t>
+            </w:r>
+            <w:r>
+              <w:rPr>
+                <w:rFonts w:ascii="Times New Roman" w:hAnsi="Times New Roman" w:cs="Times New Roman"/>
+                <w:b/>
+                <w:bCs/>
+              </w:rPr>
+              <w:t xml:space="preserve"> </w:t>
+            </w:r>
+            <w:r>
+              <w:rPr>
+                <w:rFonts w:ascii="Times New Roman" w:hAnsi="Times New Roman" w:cs="Times New Roman"/>
+                <w:b/>
+                <w:bCs/>
+              </w:rPr>
+              <w:t>–</w:t>
+            </w:r>
+          </w:p>
+          <w:p>
+            <w:pPr>
+              <w:rPr>
+                <w:rFonts w:ascii="Times New Roman" w:hAnsi="Times New Roman" w:cs="Times New Roman"/>
+              </w:rPr>
+            </w:pPr>
+            <w:r>
+              <w:rPr>
+                <w:rFonts w:ascii="Times New Roman" w:hAnsi="Times New Roman" w:cs="Times New Roman"/>
+              </w:rPr>
+              <w:t xml:space="preserve">Bugs </w:t>
+            </w:r>
+            <w:r>
+              <w:rPr>
+                <w:rFonts w:ascii="Times New Roman" w:hAnsi="Times New Roman" w:cs="Times New Roman"/>
+              </w:rPr>
+              <w:t>Identified by you or by BlechTek Software Solutions LLP.</w:t>
+            </w:r>
+          </w:p>
+        </w:tc>
+        <w:tc>
+          <w:tcPr>
+            <w:tcW w:w="2625" w:type="dxa"/>
+            <w:shd w:val="clear" w:color="auto" w:fill="FFFFFF" w:themeFill="background1"/>
+            <w:tcMar>
+              <w:top w:w="80" w:type="dxa"/>
+              <w:left w:w="120" w:type="dxa"/>
+              <w:bottom w:w="80" w:type="dxa"/>
+              <w:right w:w="120" w:type="dxa"/>
+            </w:tcMar>
+          </w:tcPr>
+          <w:p>
+            <w:pPr>
+              <w:rPr>
+                <w:rFonts w:ascii="Times New Roman" w:hAnsi="Times New Roman" w:cs="Times New Roman"/>
+              </w:rPr>
+            </w:pPr>
+            <w:r>
+              <w:rPr>
+                <w:rFonts w:ascii="Times New Roman" w:hAnsi="Times New Roman" w:cs="Times New Roman"/>
+              </w:rPr>
+              <w:t>Free, under License Fee Renewal</w:t>
+            </w:r>
+          </w:p>
+        </w:tc>
+      </w:tr>
+      <w:tr>
+        <w:trPr>
+          <w:trHeight w:val="20"/>
+        </w:trPr>
+        <w:tc>
+          <w:tcPr>
+            <w:tcW w:w="1007" w:type="dxa"/>
+            <w:shd w:val="clear" w:color="auto" w:fill="FFFFFF" w:themeFill="background1"/>
+            <w:tcMar>
+              <w:top w:w="80" w:type="dxa"/>
+              <w:left w:w="120" w:type="dxa"/>
+              <w:bottom w:w="80" w:type="dxa"/>
+              <w:right w:w="120" w:type="dxa"/>
+            </w:tcMar>
+          </w:tcPr>
+          <w:p>
+            <w:pPr>
+              <w:rPr>
+                <w:rFonts w:ascii="Times New Roman" w:hAnsi="Times New Roman" w:cs="Times New Roman"/>
+              </w:rPr>
+            </w:pPr>
+            <w:r>
+              <w:rPr>
+                <w:rFonts w:ascii="Times New Roman" w:hAnsi="Times New Roman" w:cs="Times New Roman"/>
+              </w:rPr>
+              <w:t xml:space="preserve"> 6.3</w:t>
+            </w:r>
+          </w:p>
+        </w:tc>
+        <w:tc>
+          <w:tcPr>
+            <w:tcW w:w="6360" w:type="dxa"/>
+            <w:shd w:val="clear" w:color="auto" w:fill="FFFFFF" w:themeFill="background1"/>
+            <w:tcMar>
+              <w:top w:w="80" w:type="dxa"/>
+              <w:left w:w="120" w:type="dxa"/>
+              <w:bottom w:w="80" w:type="dxa"/>
+              <w:right w:w="120" w:type="dxa"/>
+            </w:tcMar>
+          </w:tcPr>
+          <w:p>
+            <w:pPr>
+              <w:rPr>
+                <w:rFonts w:ascii="Times New Roman" w:hAnsi="Times New Roman" w:cs="Times New Roman"/>
+              </w:rPr>
+            </w:pPr>
+            <w:r>
+              <w:rPr>
+                <w:rFonts w:ascii="Times New Roman" w:hAnsi="Times New Roman" w:cs="Times New Roman"/>
+              </w:rPr>
+              <w:t>L3: Customer Specific Enhancements</w:t>
+            </w:r>
+            <w:r>
+              <w:rPr>
+                <w:rFonts w:ascii="Times New Roman" w:hAnsi="Times New Roman" w:cs="Times New Roman"/>
+                <w:b/>
+                <w:bCs/>
+              </w:rPr>
+              <w:t xml:space="preserve"> –</w:t>
+            </w:r>
+            <w:r>
+              <w:rPr>
+                <w:rFonts w:ascii="Times New Roman" w:hAnsi="Times New Roman" w:cs="Times New Roman"/>
+              </w:rPr>
+              <w:t xml:space="preserve"> </w:t>
+            </w:r>
+          </w:p>
+          <w:p>
+            <w:pPr>
+              <w:rPr>
+                <w:rFonts w:ascii="Times New Roman" w:hAnsi="Times New Roman" w:cs="Times New Roman"/>
+              </w:rPr>
+            </w:pPr>
+            <w:r>
+              <w:rPr>
+                <w:rFonts w:ascii="Times New Roman" w:hAnsi="Times New Roman" w:cs="Times New Roman"/>
+              </w:rPr>
+              <w:t>New/Change in Document Prin ng format, New/Changes in Reports, New/Change in Reports</w:t>
+            </w:r>
+          </w:p>
+        </w:tc>
+        <w:tc>
+          <w:tcPr>
+            <w:tcW w:w="2625" w:type="dxa"/>
+            <w:shd w:val="clear" w:color="auto" w:fill="FFFFFF" w:themeFill="background1"/>
+            <w:tcMar>
+              <w:top w:w="80" w:type="dxa"/>
+              <w:left w:w="120" w:type="dxa"/>
+              <w:bottom w:w="80" w:type="dxa"/>
+              <w:right w:w="120" w:type="dxa"/>
+            </w:tcMar>
+          </w:tcPr>
+          <w:p>
+            <w:pPr>
+              <w:spacing w:line="259" w:lineRule="auto"/>
+              <w:ind w:left="1"/>
+              <w:rPr>
+                <w:rFonts w:ascii="Times New Roman" w:hAnsi="Times New Roman" w:cs="Times New Roman"/>
+              </w:rPr>
+            </w:pPr>
+            <w:r>
+              <w:rPr>
+                <w:rFonts w:ascii="Times New Roman" w:hAnsi="Times New Roman" w:cs="Times New Roman"/>
+              </w:rPr>
+              <w:t xml:space="preserve">Chargeable  </w:t>
+            </w:r>
+          </w:p>
+          <w:p>
+            <w:pPr>
+              <w:rPr>
+                <w:rFonts w:ascii="Times New Roman" w:hAnsi="Times New Roman" w:cs="Times New Roman"/>
+              </w:rPr>
+            </w:pPr>
+            <w:r>
+              <w:rPr>
+                <w:rFonts w:ascii="Times New Roman" w:hAnsi="Times New Roman" w:cs="Times New Roman"/>
+              </w:rPr>
+              <w:t>As per Sr. No. 4</w:t>
+            </w:r>
+          </w:p>
+        </w:tc>
+      </w:tr>
+      <w:tr>
+        <w:trPr>
+          <w:trHeight w:val="20"/>
+        </w:trPr>
+        <w:tc>
+          <w:tcPr>
+            <w:tcW w:w="1007" w:type="dxa"/>
+            <w:shd w:val="clear" w:color="auto" w:fill="FFFFFF" w:themeFill="background1"/>
+            <w:tcMar>
+              <w:top w:w="80" w:type="dxa"/>
+              <w:left w:w="120" w:type="dxa"/>
+              <w:bottom w:w="80" w:type="dxa"/>
+              <w:right w:w="120" w:type="dxa"/>
+            </w:tcMar>
+          </w:tcPr>
+          <w:p>
+            <w:pPr>
+              <w:rPr>
+                <w:rFonts w:ascii="Times New Roman" w:hAnsi="Times New Roman" w:cs="Times New Roman"/>
+              </w:rPr>
+            </w:pPr>
+            <w:r>
+              <w:rPr>
+                <w:rFonts w:ascii="Times New Roman" w:hAnsi="Times New Roman" w:cs="Times New Roman"/>
+              </w:rPr>
+              <w:t xml:space="preserve"> 6.4</w:t>
+            </w:r>
+          </w:p>
+        </w:tc>
+        <w:tc>
+          <w:tcPr>
+            <w:tcW w:w="6360" w:type="dxa"/>
+            <w:shd w:val="clear" w:color="auto" w:fill="FFFFFF" w:themeFill="background1"/>
+            <w:tcMar>
+              <w:top w:w="80" w:type="dxa"/>
+              <w:left w:w="120" w:type="dxa"/>
+              <w:bottom w:w="80" w:type="dxa"/>
+              <w:right w:w="120" w:type="dxa"/>
+            </w:tcMar>
+          </w:tcPr>
+          <w:p>
+            <w:pPr>
+              <w:rPr>
+                <w:rFonts w:ascii="Times New Roman" w:hAnsi="Times New Roman" w:cs="Times New Roman"/>
+              </w:rPr>
+            </w:pPr>
+            <w:r>
+              <w:rPr>
+                <w:rFonts w:ascii="Times New Roman" w:hAnsi="Times New Roman" w:cs="Times New Roman"/>
+              </w:rPr>
+              <w:t>L4: Product Upgrade</w:t>
+            </w:r>
+            <w:r>
+              <w:rPr>
+                <w:rFonts w:ascii="Times New Roman" w:hAnsi="Times New Roman" w:cs="Times New Roman"/>
+                <w:b/>
+                <w:bCs/>
+              </w:rPr>
+              <w:t xml:space="preserve"> –</w:t>
+            </w:r>
+            <w:r>
+              <w:rPr>
+                <w:rFonts w:ascii="Times New Roman" w:hAnsi="Times New Roman" w:cs="Times New Roman"/>
+              </w:rPr>
+              <w:t xml:space="preserve"> </w:t>
+            </w:r>
+          </w:p>
+          <w:p>
+            <w:pPr>
+              <w:rPr>
+                <w:rFonts w:ascii="Times New Roman" w:hAnsi="Times New Roman" w:cs="Times New Roman"/>
+              </w:rPr>
+            </w:pPr>
+            <w:r>
+              <w:rPr>
+                <w:rFonts w:ascii="Times New Roman" w:hAnsi="Times New Roman" w:cs="Times New Roman"/>
+              </w:rPr>
+              <w:t>Product Upgrade as done by BlechTek So ware Solu</w:t>
+            </w:r>
+            <w:r>
+              <w:rPr>
+                <w:rFonts w:ascii="Times New Roman" w:hAnsi="Times New Roman" w:cs="Times New Roman"/>
+              </w:rPr>
+              <w:t>ti</w:t>
+            </w:r>
+            <w:r>
+              <w:rPr>
+                <w:rFonts w:ascii="Times New Roman" w:hAnsi="Times New Roman" w:cs="Times New Roman"/>
+              </w:rPr>
+              <w:t xml:space="preserve">ons LLP on their own  </w:t>
+            </w:r>
+          </w:p>
+        </w:tc>
+        <w:tc>
+          <w:tcPr>
+            <w:tcW w:w="2625" w:type="dxa"/>
+            <w:shd w:val="clear" w:color="auto" w:fill="FFFFFF" w:themeFill="background1"/>
+            <w:tcMar>
+              <w:top w:w="80" w:type="dxa"/>
+              <w:left w:w="120" w:type="dxa"/>
+              <w:bottom w:w="80" w:type="dxa"/>
+              <w:right w:w="120" w:type="dxa"/>
+            </w:tcMar>
+          </w:tcPr>
+          <w:p>
+            <w:pPr>
+              <w:rPr>
+                <w:rFonts w:ascii="Times New Roman" w:hAnsi="Times New Roman" w:cs="Times New Roman"/>
+              </w:rPr>
+            </w:pPr>
+            <w:r>
+              <w:rPr>
+                <w:rFonts w:ascii="Times New Roman" w:hAnsi="Times New Roman" w:cs="Times New Roman"/>
+              </w:rPr>
+              <w:t>Free, under License Fee Renewal</w:t>
+            </w:r>
+          </w:p>
+        </w:tc>
+      </w:tr>
+      <w:tr>
+        <w:trPr>
+          <w:trHeight w:val="20"/>
+        </w:trPr>
+        <w:tc>
+          <w:tcPr>
+            <w:tcW w:w="1007" w:type="dxa"/>
+            <w:shd w:val="clear" w:color="auto" w:fill="FFFFFF" w:themeFill="background1"/>
+            <w:tcMar>
+              <w:top w:w="80" w:type="dxa"/>
+              <w:left w:w="120" w:type="dxa"/>
+              <w:bottom w:w="80" w:type="dxa"/>
+              <w:right w:w="120" w:type="dxa"/>
+            </w:tcMar>
+          </w:tcPr>
+          <w:p>
+            <w:pPr>
+              <w:rPr>
+                <w:rFonts w:ascii="Times New Roman" w:hAnsi="Times New Roman" w:cs="Times New Roman"/>
+              </w:rPr>
+            </w:pPr>
+            <w:r>
+              <w:rPr>
+                <w:rFonts w:ascii="Times New Roman" w:hAnsi="Times New Roman" w:cs="Times New Roman"/>
+              </w:rPr>
+              <w:t xml:space="preserve"> 6.5</w:t>
+            </w:r>
+          </w:p>
+        </w:tc>
+        <w:tc>
+          <w:tcPr>
+            <w:tcW w:w="6360" w:type="dxa"/>
+            <w:shd w:val="clear" w:color="auto" w:fill="FFFFFF" w:themeFill="background1"/>
+            <w:tcMar>
+              <w:top w:w="80" w:type="dxa"/>
+              <w:left w:w="120" w:type="dxa"/>
+              <w:bottom w:w="80" w:type="dxa"/>
+              <w:right w:w="120" w:type="dxa"/>
+            </w:tcMar>
+          </w:tcPr>
+          <w:p>
+            <w:pPr>
+              <w:rPr>
+                <w:rFonts w:ascii="Times New Roman" w:hAnsi="Times New Roman" w:cs="Times New Roman"/>
+              </w:rPr>
+            </w:pPr>
+            <w:r>
+              <w:rPr>
+                <w:rFonts w:ascii="Times New Roman" w:hAnsi="Times New Roman" w:cs="Times New Roman"/>
+              </w:rPr>
+              <w:t>L5: Implementation</w:t>
+            </w:r>
+            <w:r>
+              <w:rPr>
+                <w:rFonts w:ascii="Times New Roman" w:hAnsi="Times New Roman" w:cs="Times New Roman"/>
+                <w:b/>
+                <w:bCs/>
+              </w:rPr>
+              <w:t xml:space="preserve"> –</w:t>
+            </w:r>
+          </w:p>
+          <w:p>
+            <w:pPr>
+              <w:rPr>
+                <w:rFonts w:ascii="Times New Roman" w:hAnsi="Times New Roman" w:cs="Times New Roman"/>
+              </w:rPr>
+            </w:pPr>
+            <w:r>
+              <w:rPr>
+                <w:rFonts w:ascii="Times New Roman" w:hAnsi="Times New Roman" w:cs="Times New Roman"/>
+              </w:rPr>
+              <w:t>Master updation, new feature implementation.</w:t>
+            </w:r>
+          </w:p>
+        </w:tc>
+        <w:tc>
+          <w:tcPr>
+            <w:tcW w:w="2625" w:type="dxa"/>
+            <w:shd w:val="clear" w:color="auto" w:fill="FFFFFF" w:themeFill="background1"/>
+            <w:tcMar>
+              <w:top w:w="80" w:type="dxa"/>
+              <w:left w:w="120" w:type="dxa"/>
+              <w:bottom w:w="80" w:type="dxa"/>
+              <w:right w:w="120" w:type="dxa"/>
+            </w:tcMar>
+          </w:tcPr>
+          <w:p>
+            <w:pPr>
+              <w:rPr>
+                <w:rFonts w:ascii="Times New Roman" w:hAnsi="Times New Roman" w:cs="Times New Roman"/>
+              </w:rPr>
+            </w:pPr>
+            <w:r>
+              <w:rPr>
+                <w:rFonts w:ascii="Times New Roman" w:hAnsi="Times New Roman" w:cs="Times New Roman"/>
+              </w:rPr>
+              <w:t xml:space="preserve">Chargeable  </w:t>
+            </w:r>
+          </w:p>
+          <w:p>
+            <w:pPr>
+              <w:rPr>
+                <w:rFonts w:ascii="Times New Roman" w:hAnsi="Times New Roman" w:cs="Times New Roman"/>
+              </w:rPr>
+            </w:pPr>
+            <w:r>
+              <w:rPr>
+                <w:rFonts w:ascii="Times New Roman" w:hAnsi="Times New Roman" w:cs="Times New Roman"/>
+              </w:rPr>
+              <w:t>As per Sr. No. 4</w:t>
+            </w:r>
+          </w:p>
+        </w:tc>
+      </w:tr>
+      <w:tr>
+        <w:trPr>
+          <w:trHeight w:val="20"/>
+        </w:trPr>
+        <w:tc>
+          <w:tcPr>
+            <w:tcW w:w="1007" w:type="dxa"/>
+            <w:shd w:val="clear" w:color="auto" w:fill="FFFFFF" w:themeFill="background1"/>
+            <w:tcMar>
+              <w:top w:w="80" w:type="dxa"/>
+              <w:left w:w="120" w:type="dxa"/>
+              <w:bottom w:w="80" w:type="dxa"/>
+              <w:right w:w="120" w:type="dxa"/>
+            </w:tcMar>
+          </w:tcPr>
+          <w:p>
+            <w:pPr>
+              <w:rPr>
+                <w:rFonts w:ascii="Times New Roman" w:hAnsi="Times New Roman" w:cs="Times New Roman"/>
+              </w:rPr>
+            </w:pPr>
+            <w:r>
+              <w:rPr>
+                <w:rFonts w:ascii="Times New Roman" w:hAnsi="Times New Roman" w:cs="Times New Roman"/>
+              </w:rPr>
+              <w:t>7</w:t>
+            </w:r>
+          </w:p>
+        </w:tc>
+        <w:tc>
+          <w:tcPr>
+            <w:tcW w:w="6360" w:type="dxa"/>
+            <w:shd w:val="clear" w:color="auto" w:fill="FFFFFF" w:themeFill="background1"/>
+            <w:tcMar>
+              <w:top w:w="80" w:type="dxa"/>
+              <w:left w:w="120" w:type="dxa"/>
+              <w:bottom w:w="80" w:type="dxa"/>
+              <w:right w:w="120" w:type="dxa"/>
+            </w:tcMar>
+          </w:tcPr>
+          <w:p>
+            <w:pPr>
+              <w:rPr>
+                <w:rFonts w:ascii="Times New Roman" w:hAnsi="Times New Roman" w:cs="Times New Roman"/>
+              </w:rPr>
+            </w:pPr>
+            <w:r>
+              <w:rPr>
+                <w:rFonts w:ascii="Times New Roman" w:hAnsi="Times New Roman" w:cs="Times New Roman"/>
+              </w:rPr>
+              <w:t>Taxes</w:t>
+            </w:r>
+          </w:p>
+        </w:tc>
+        <w:tc>
+          <w:tcPr>
+            <w:tcW w:w="2625" w:type="dxa"/>
+            <w:shd w:val="clear" w:color="auto" w:fill="FFFFFF" w:themeFill="background1"/>
+            <w:tcMar>
+              <w:top w:w="80" w:type="dxa"/>
+              <w:left w:w="120" w:type="dxa"/>
+              <w:bottom w:w="80" w:type="dxa"/>
+              <w:right w:w="120" w:type="dxa"/>
+            </w:tcMar>
+          </w:tcPr>
+          <w:p>
+            <w:pPr>
+              <w:rPr>
+                <w:rFonts w:ascii="Times New Roman" w:hAnsi="Times New Roman" w:cs="Times New Roman"/>
+              </w:rPr>
+            </w:pPr>
             <w:r>
               <w:rPr>
                 <w:rFonts w:ascii="Times New Roman" w:hAnsi="Times New Roman" w:cs="Times New Roman"/>
@@ -2944,7 +3720,7 @@
     <w:tbl>
       <w:tblPr>
         <w:tblStyle w:val="TableGrid"/>
-        <w:tblW w:w="9749" w:type="dxa"/>
+        <w:tblW w:w="9925" w:type="dxa"/>
         <w:tblInd w:w="106" w:type="dxa"/>
         <w:tblCellMar>
           <w:top w:w="14" w:type="dxa"/>
@@ -2954,23 +3730,23 @@
         <w:tblLook w:val="04A0" w:firstRow="1" w:lastRow="0" w:firstColumn="1" w:lastColumn="0" w:noHBand="0" w:noVBand="1"/>
       </w:tblPr>
       <w:tblGrid>
-        <w:gridCol w:w="1945"/>
-        <w:gridCol w:w="960"/>
-        <w:gridCol w:w="960"/>
-        <w:gridCol w:w="882"/>
-        <w:gridCol w:w="882"/>
-        <w:gridCol w:w="882"/>
-        <w:gridCol w:w="882"/>
-        <w:gridCol w:w="1211"/>
-        <w:gridCol w:w="1145"/>
+        <w:gridCol w:w="1980"/>
+        <w:gridCol w:w="886"/>
+        <w:gridCol w:w="851"/>
+        <w:gridCol w:w="850"/>
+        <w:gridCol w:w="851"/>
+        <w:gridCol w:w="850"/>
+        <w:gridCol w:w="851"/>
+        <w:gridCol w:w="1417"/>
+        <w:gridCol w:w="1389"/>
       </w:tblGrid>
       <w:tr>
         <w:trPr>
-          <w:trHeight w:val="237"/>
+          <w:trHeight w:val="250"/>
         </w:trPr>
         <w:tc>
           <w:tcPr>
-            <w:tcW w:w="1945" w:type="dxa"/>
+            <w:tcW w:w="1980" w:type="dxa"/>
             <w:tcBorders>
               <w:top w:val="single" w:sz="4" w:space="0" w:color="000000"/>
               <w:left w:val="single" w:sz="4" w:space="0" w:color="000000"/>
@@ -2982,10 +3758,17 @@
           <w:p>
             <w:pPr>
               <w:spacing w:line="259" w:lineRule="auto"/>
-            </w:pPr>
-            <w:r>
-              <w:rPr>
-                <w:sz w:val="14"/>
+              <w:rPr>
+                <w:rFonts w:ascii="Times New Roman" w:hAnsi="Times New Roman" w:cs="Times New Roman"/>
+                <w:sz w:val="20"/>
+                <w:szCs w:val="20"/>
+              </w:rPr>
+            </w:pPr>
+            <w:r>
+              <w:rPr>
+                <w:rFonts w:ascii="Times New Roman" w:hAnsi="Times New Roman" w:cs="Times New Roman"/>
+                <w:sz w:val="20"/>
+                <w:szCs w:val="20"/>
               </w:rPr>
               <w:t>CQUAL Product Platform</w:t>
             </w:r>
@@ -2993,7 +3776,7 @@
         </w:tc>
         <w:tc>
           <w:tcPr>
-            <w:tcW w:w="960" w:type="dxa"/>
+            <w:tcW w:w="886" w:type="dxa"/>
             <w:tcBorders>
               <w:top w:val="single" w:sz="4" w:space="0" w:color="000000"/>
               <w:left w:val="single" w:sz="4" w:space="0" w:color="000000"/>
@@ -3006,10 +3789,17 @@
             <w:pPr>
               <w:spacing w:line="259" w:lineRule="auto"/>
               <w:ind w:left="1"/>
-            </w:pPr>
-            <w:r>
-              <w:rPr>
-                <w:sz w:val="14"/>
+              <w:rPr>
+                <w:rFonts w:ascii="Times New Roman" w:hAnsi="Times New Roman" w:cs="Times New Roman"/>
+                <w:sz w:val="20"/>
+                <w:szCs w:val="20"/>
+              </w:rPr>
+            </w:pPr>
+            <w:r>
+              <w:rPr>
+                <w:rFonts w:ascii="Times New Roman" w:hAnsi="Times New Roman" w:cs="Times New Roman"/>
+                <w:sz w:val="20"/>
+                <w:szCs w:val="20"/>
               </w:rPr>
               <w:t>No of Users</w:t>
             </w:r>
@@ -3017,7 +3807,7 @@
         </w:tc>
         <w:tc>
           <w:tcPr>
-            <w:tcW w:w="960" w:type="dxa"/>
+            <w:tcW w:w="851" w:type="dxa"/>
             <w:tcBorders>
               <w:top w:val="single" w:sz="4" w:space="0" w:color="000000"/>
               <w:left w:val="single" w:sz="4" w:space="0" w:color="000000"/>
@@ -3031,10 +3821,17 @@
               <w:spacing w:line="259" w:lineRule="auto"/>
               <w:ind w:left="28"/>
               <w:jc w:val="center"/>
-            </w:pPr>
-            <w:r>
-              <w:rPr>
-                <w:sz w:val="14"/>
+              <w:rPr>
+                <w:rFonts w:ascii="Times New Roman" w:hAnsi="Times New Roman" w:cs="Times New Roman"/>
+                <w:sz w:val="20"/>
+                <w:szCs w:val="20"/>
+              </w:rPr>
+            </w:pPr>
+            <w:r>
+              <w:rPr>
+                <w:rFonts w:ascii="Times New Roman" w:hAnsi="Times New Roman" w:cs="Times New Roman"/>
+                <w:sz w:val="20"/>
+                <w:szCs w:val="20"/>
               </w:rPr>
               <w:t>Y1</w:t>
             </w:r>
@@ -3042,7 +3839,7 @@
         </w:tc>
         <w:tc>
           <w:tcPr>
-            <w:tcW w:w="882" w:type="dxa"/>
+            <w:tcW w:w="850" w:type="dxa"/>
             <w:tcBorders>
               <w:top w:val="single" w:sz="4" w:space="0" w:color="000000"/>
               <w:left w:val="single" w:sz="4" w:space="0" w:color="000000"/>
@@ -3056,10 +3853,17 @@
               <w:spacing w:line="259" w:lineRule="auto"/>
               <w:ind w:left="32"/>
               <w:jc w:val="center"/>
-            </w:pPr>
-            <w:r>
-              <w:rPr>
-                <w:sz w:val="14"/>
+              <w:rPr>
+                <w:rFonts w:ascii="Times New Roman" w:hAnsi="Times New Roman" w:cs="Times New Roman"/>
+                <w:sz w:val="20"/>
+                <w:szCs w:val="20"/>
+              </w:rPr>
+            </w:pPr>
+            <w:r>
+              <w:rPr>
+                <w:rFonts w:ascii="Times New Roman" w:hAnsi="Times New Roman" w:cs="Times New Roman"/>
+                <w:sz w:val="20"/>
+                <w:szCs w:val="20"/>
               </w:rPr>
               <w:t>Y2</w:t>
             </w:r>
@@ -3067,7 +3871,7 @@
         </w:tc>
         <w:tc>
           <w:tcPr>
-            <w:tcW w:w="882" w:type="dxa"/>
+            <w:tcW w:w="851" w:type="dxa"/>
             <w:tcBorders>
               <w:top w:val="single" w:sz="4" w:space="0" w:color="000000"/>
               <w:left w:val="single" w:sz="4" w:space="0" w:color="000000"/>
@@ -3081,10 +3885,17 @@
               <w:spacing w:line="259" w:lineRule="auto"/>
               <w:ind w:left="33"/>
               <w:jc w:val="center"/>
-            </w:pPr>
-            <w:r>
-              <w:rPr>
-                <w:sz w:val="14"/>
+              <w:rPr>
+                <w:rFonts w:ascii="Times New Roman" w:hAnsi="Times New Roman" w:cs="Times New Roman"/>
+                <w:sz w:val="20"/>
+                <w:szCs w:val="20"/>
+              </w:rPr>
+            </w:pPr>
+            <w:r>
+              <w:rPr>
+                <w:rFonts w:ascii="Times New Roman" w:hAnsi="Times New Roman" w:cs="Times New Roman"/>
+                <w:sz w:val="20"/>
+                <w:szCs w:val="20"/>
               </w:rPr>
               <w:t>Y3</w:t>
             </w:r>
@@ -3092,7 +3903,7 @@
         </w:tc>
         <w:tc>
           <w:tcPr>
-            <w:tcW w:w="882" w:type="dxa"/>
+            <w:tcW w:w="850" w:type="dxa"/>
             <w:tcBorders>
               <w:top w:val="single" w:sz="4" w:space="0" w:color="000000"/>
               <w:left w:val="single" w:sz="4" w:space="0" w:color="000000"/>
@@ -3106,10 +3917,17 @@
               <w:spacing w:line="259" w:lineRule="auto"/>
               <w:ind w:left="31"/>
               <w:jc w:val="center"/>
-            </w:pPr>
-            <w:r>
-              <w:rPr>
-                <w:sz w:val="14"/>
+              <w:rPr>
+                <w:rFonts w:ascii="Times New Roman" w:hAnsi="Times New Roman" w:cs="Times New Roman"/>
+                <w:sz w:val="20"/>
+                <w:szCs w:val="20"/>
+              </w:rPr>
+            </w:pPr>
+            <w:r>
+              <w:rPr>
+                <w:rFonts w:ascii="Times New Roman" w:hAnsi="Times New Roman" w:cs="Times New Roman"/>
+                <w:sz w:val="20"/>
+                <w:szCs w:val="20"/>
               </w:rPr>
               <w:t>Y4</w:t>
             </w:r>
@@ -3117,7 +3935,7 @@
         </w:tc>
         <w:tc>
           <w:tcPr>
-            <w:tcW w:w="882" w:type="dxa"/>
+            <w:tcW w:w="851" w:type="dxa"/>
             <w:tcBorders>
               <w:top w:val="single" w:sz="4" w:space="0" w:color="000000"/>
               <w:left w:val="single" w:sz="4" w:space="0" w:color="000000"/>
@@ -3131,10 +3949,17 @@
               <w:spacing w:line="259" w:lineRule="auto"/>
               <w:ind w:left="32"/>
               <w:jc w:val="center"/>
-            </w:pPr>
-            <w:r>
-              <w:rPr>
-                <w:sz w:val="14"/>
+              <w:rPr>
+                <w:rFonts w:ascii="Times New Roman" w:hAnsi="Times New Roman" w:cs="Times New Roman"/>
+                <w:sz w:val="20"/>
+                <w:szCs w:val="20"/>
+              </w:rPr>
+            </w:pPr>
+            <w:r>
+              <w:rPr>
+                <w:rFonts w:ascii="Times New Roman" w:hAnsi="Times New Roman" w:cs="Times New Roman"/>
+                <w:sz w:val="20"/>
+                <w:szCs w:val="20"/>
               </w:rPr>
               <w:t>Y5</w:t>
             </w:r>
@@ -3142,7 +3967,7 @@
         </w:tc>
         <w:tc>
           <w:tcPr>
-            <w:tcW w:w="1211" w:type="dxa"/>
+            <w:tcW w:w="1417" w:type="dxa"/>
             <w:tcBorders>
               <w:top w:val="single" w:sz="4" w:space="0" w:color="000000"/>
               <w:left w:val="single" w:sz="4" w:space="0" w:color="000000"/>
@@ -3156,10 +3981,17 @@
               <w:spacing w:line="259" w:lineRule="auto"/>
               <w:ind w:left="23"/>
               <w:jc w:val="center"/>
-            </w:pPr>
-            <w:r>
-              <w:rPr>
-                <w:sz w:val="14"/>
+              <w:rPr>
+                <w:rFonts w:ascii="Times New Roman" w:hAnsi="Times New Roman" w:cs="Times New Roman"/>
+                <w:sz w:val="20"/>
+                <w:szCs w:val="20"/>
+              </w:rPr>
+            </w:pPr>
+            <w:r>
+              <w:rPr>
+                <w:rFonts w:ascii="Times New Roman" w:hAnsi="Times New Roman" w:cs="Times New Roman"/>
+                <w:sz w:val="20"/>
+                <w:szCs w:val="20"/>
               </w:rPr>
               <w:t>Avg Cost/ Year</w:t>
             </w:r>
@@ -3167,7 +3999,7 @@
         </w:tc>
         <w:tc>
           <w:tcPr>
-            <w:tcW w:w="1145" w:type="dxa"/>
+            <w:tcW w:w="1389" w:type="dxa"/>
             <w:tcBorders>
               <w:top w:val="single" w:sz="4" w:space="0" w:color="000000"/>
               <w:left w:val="single" w:sz="5" w:space="0" w:color="000000"/>
@@ -3181,23 +4013,30 @@
               <w:spacing w:line="259" w:lineRule="auto"/>
               <w:ind w:left="26"/>
               <w:jc w:val="both"/>
-            </w:pPr>
-            <w:r>
-              <w:rPr>
-                <w:sz w:val="14"/>
-              </w:rPr>
-              <w:t>Cost /User /Year</w:t>
+              <w:rPr>
+                <w:rFonts w:ascii="Times New Roman" w:hAnsi="Times New Roman" w:cs="Times New Roman"/>
+                <w:sz w:val="20"/>
+                <w:szCs w:val="20"/>
+              </w:rPr>
+            </w:pPr>
+            <w:r>
+              <w:rPr>
+                <w:rFonts w:ascii="Times New Roman" w:hAnsi="Times New Roman" w:cs="Times New Roman"/>
+                <w:sz w:val="20"/>
+                <w:szCs w:val="20"/>
+              </w:rPr>
+              <w:t>Cost/User /Year</w:t>
             </w:r>
           </w:p>
         </w:tc>
       </w:tr>
       <w:tr>
         <w:trPr>
-          <w:trHeight w:val="235"/>
+          <w:trHeight w:val="248"/>
         </w:trPr>
         <w:tc>
           <w:tcPr>
-            <w:tcW w:w="1945" w:type="dxa"/>
+            <w:tcW w:w="1980" w:type="dxa"/>
             <w:tcBorders>
               <w:top w:val="single" w:sz="5" w:space="0" w:color="000000"/>
               <w:left w:val="single" w:sz="4" w:space="0" w:color="000000"/>
@@ -3209,10 +4048,17 @@
           <w:p>
             <w:pPr>
               <w:spacing w:line="259" w:lineRule="auto"/>
-            </w:pPr>
-            <w:r>
-              <w:rPr>
-                <w:sz w:val="14"/>
+              <w:rPr>
+                <w:rFonts w:ascii="Times New Roman" w:hAnsi="Times New Roman" w:cs="Times New Roman"/>
+                <w:sz w:val="20"/>
+                <w:szCs w:val="20"/>
+              </w:rPr>
+            </w:pPr>
+            <w:r>
+              <w:rPr>
+                <w:rFonts w:ascii="Times New Roman" w:hAnsi="Times New Roman" w:cs="Times New Roman"/>
+                <w:sz w:val="20"/>
+                <w:szCs w:val="20"/>
               </w:rPr>
               <w:t>LPA</w:t>
             </w:r>
@@ -3220,7 +4066,7 @@
         </w:tc>
         <w:tc>
           <w:tcPr>
-            <w:tcW w:w="960" w:type="dxa"/>
+            <w:tcW w:w="886" w:type="dxa"/>
             <w:tcBorders>
               <w:top w:val="single" w:sz="5" w:space="0" w:color="000000"/>
               <w:left w:val="single" w:sz="4" w:space="0" w:color="000000"/>
@@ -3234,10 +4080,17 @@
               <w:spacing w:line="259" w:lineRule="auto"/>
               <w:ind w:left="27"/>
               <w:jc w:val="center"/>
-            </w:pPr>
-            <w:r>
-              <w:rPr>
-                <w:sz w:val="14"/>
+              <w:rPr>
+                <w:rFonts w:ascii="Times New Roman" w:hAnsi="Times New Roman" w:cs="Times New Roman"/>
+                <w:sz w:val="20"/>
+                <w:szCs w:val="20"/>
+              </w:rPr>
+            </w:pPr>
+            <w:r>
+              <w:rPr>
+                <w:rFonts w:ascii="Times New Roman" w:hAnsi="Times New Roman" w:cs="Times New Roman"/>
+                <w:sz w:val="20"/>
+                <w:szCs w:val="20"/>
               </w:rPr>
               <w:t>20</w:t>
             </w:r>
@@ -3245,7 +4098,7 @@
         </w:tc>
         <w:tc>
           <w:tcPr>
-            <w:tcW w:w="960" w:type="dxa"/>
+            <w:tcW w:w="851" w:type="dxa"/>
             <w:tcBorders>
               <w:top w:val="single" w:sz="5" w:space="0" w:color="000000"/>
               <w:left w:val="single" w:sz="4" w:space="0" w:color="000000"/>
@@ -3259,10 +4112,17 @@
               <w:spacing w:line="259" w:lineRule="auto"/>
               <w:ind w:left="25"/>
               <w:jc w:val="both"/>
-            </w:pPr>
-            <w:r>
-              <w:rPr>
-                <w:sz w:val="14"/>
+              <w:rPr>
+                <w:rFonts w:ascii="Times New Roman" w:hAnsi="Times New Roman" w:cs="Times New Roman"/>
+                <w:sz w:val="20"/>
+                <w:szCs w:val="20"/>
+              </w:rPr>
+            </w:pPr>
+            <w:r>
+              <w:rPr>
+                <w:rFonts w:ascii="Times New Roman" w:hAnsi="Times New Roman" w:cs="Times New Roman"/>
+                <w:sz w:val="20"/>
+                <w:szCs w:val="20"/>
               </w:rPr>
               <w:t xml:space="preserve">    </w:t>
             </w:r>
@@ -3270,7 +4130,7 @@
         </w:tc>
         <w:tc>
           <w:tcPr>
-            <w:tcW w:w="882" w:type="dxa"/>
+            <w:tcW w:w="850" w:type="dxa"/>
             <w:tcBorders>
               <w:top w:val="single" w:sz="5" w:space="0" w:color="000000"/>
               <w:left w:val="single" w:sz="4" w:space="0" w:color="000000"/>
@@ -3284,10 +4144,17 @@
               <w:spacing w:line="259" w:lineRule="auto"/>
               <w:ind w:left="25"/>
               <w:jc w:val="both"/>
-            </w:pPr>
-            <w:r>
-              <w:rPr>
-                <w:sz w:val="14"/>
+              <w:rPr>
+                <w:rFonts w:ascii="Times New Roman" w:hAnsi="Times New Roman" w:cs="Times New Roman"/>
+                <w:sz w:val="20"/>
+                <w:szCs w:val="20"/>
+              </w:rPr>
+            </w:pPr>
+            <w:r>
+              <w:rPr>
+                <w:rFonts w:ascii="Times New Roman" w:hAnsi="Times New Roman" w:cs="Times New Roman"/>
+                <w:sz w:val="20"/>
+                <w:szCs w:val="20"/>
               </w:rPr>
               <w:t xml:space="preserve"> </w:t>
             </w:r>
@@ -3295,7 +4162,7 @@
         </w:tc>
         <w:tc>
           <w:tcPr>
-            <w:tcW w:w="882" w:type="dxa"/>
+            <w:tcW w:w="851" w:type="dxa"/>
             <w:tcBorders>
               <w:top w:val="single" w:sz="5" w:space="0" w:color="000000"/>
               <w:left w:val="single" w:sz="4" w:space="0" w:color="000000"/>
@@ -3309,12 +4176,17 @@
               <w:spacing w:line="259" w:lineRule="auto"/>
               <w:ind w:left="25"/>
               <w:jc w:val="both"/>
-            </w:pPr>
-          </w:p>
-        </w:tc>
-        <w:tc>
-          <w:tcPr>
-            <w:tcW w:w="882" w:type="dxa"/>
+              <w:rPr>
+                <w:rFonts w:ascii="Times New Roman" w:hAnsi="Times New Roman" w:cs="Times New Roman"/>
+                <w:sz w:val="20"/>
+                <w:szCs w:val="20"/>
+              </w:rPr>
+            </w:pPr>
+          </w:p>
+        </w:tc>
+        <w:tc>
+          <w:tcPr>
+            <w:tcW w:w="850" w:type="dxa"/>
             <w:tcBorders>
               <w:top w:val="single" w:sz="5" w:space="0" w:color="000000"/>
               <w:left w:val="single" w:sz="4" w:space="0" w:color="000000"/>
@@ -3328,12 +4200,17 @@
               <w:spacing w:line="259" w:lineRule="auto"/>
               <w:ind w:left="25"/>
               <w:jc w:val="both"/>
-            </w:pPr>
-          </w:p>
-        </w:tc>
-        <w:tc>
-          <w:tcPr>
-            <w:tcW w:w="882" w:type="dxa"/>
+              <w:rPr>
+                <w:rFonts w:ascii="Times New Roman" w:hAnsi="Times New Roman" w:cs="Times New Roman"/>
+                <w:sz w:val="20"/>
+                <w:szCs w:val="20"/>
+              </w:rPr>
+            </w:pPr>
+          </w:p>
+        </w:tc>
+        <w:tc>
+          <w:tcPr>
+            <w:tcW w:w="851" w:type="dxa"/>
             <w:tcBorders>
               <w:top w:val="single" w:sz="5" w:space="0" w:color="000000"/>
               <w:left w:val="single" w:sz="4" w:space="0" w:color="000000"/>
@@ -3347,12 +4224,17 @@
               <w:spacing w:line="259" w:lineRule="auto"/>
               <w:ind w:left="25"/>
               <w:jc w:val="both"/>
-            </w:pPr>
-          </w:p>
-        </w:tc>
-        <w:tc>
-          <w:tcPr>
-            <w:tcW w:w="1211" w:type="dxa"/>
+              <w:rPr>
+                <w:rFonts w:ascii="Times New Roman" w:hAnsi="Times New Roman" w:cs="Times New Roman"/>
+                <w:sz w:val="20"/>
+                <w:szCs w:val="20"/>
+              </w:rPr>
+            </w:pPr>
+          </w:p>
+        </w:tc>
+        <w:tc>
+          <w:tcPr>
+            <w:tcW w:w="1417" w:type="dxa"/>
             <w:tcBorders>
               <w:top w:val="single" w:sz="5" w:space="0" w:color="000000"/>
               <w:left w:val="single" w:sz="4" w:space="0" w:color="000000"/>
@@ -3365,12 +4247,17 @@
             <w:pPr>
               <w:spacing w:line="259" w:lineRule="auto"/>
               <w:ind w:left="25"/>
-            </w:pPr>
-          </w:p>
-        </w:tc>
-        <w:tc>
-          <w:tcPr>
-            <w:tcW w:w="1145" w:type="dxa"/>
+              <w:rPr>
+                <w:rFonts w:ascii="Times New Roman" w:hAnsi="Times New Roman" w:cs="Times New Roman"/>
+                <w:sz w:val="20"/>
+                <w:szCs w:val="20"/>
+              </w:rPr>
+            </w:pPr>
+          </w:p>
+        </w:tc>
+        <w:tc>
+          <w:tcPr>
+            <w:tcW w:w="1389" w:type="dxa"/>
             <w:tcBorders>
               <w:top w:val="single" w:sz="5" w:space="0" w:color="000000"/>
               <w:left w:val="single" w:sz="5" w:space="0" w:color="000000"/>
@@ -3383,17 +4270,22 @@
             <w:pPr>
               <w:spacing w:line="259" w:lineRule="auto"/>
               <w:ind w:left="26"/>
+              <w:rPr>
+                <w:rFonts w:ascii="Times New Roman" w:hAnsi="Times New Roman" w:cs="Times New Roman"/>
+                <w:sz w:val="20"/>
+                <w:szCs w:val="20"/>
+              </w:rPr>
             </w:pPr>
           </w:p>
         </w:tc>
       </w:tr>
       <w:tr>
         <w:trPr>
-          <w:trHeight w:val="237"/>
+          <w:trHeight w:val="250"/>
         </w:trPr>
         <w:tc>
           <w:tcPr>
-            <w:tcW w:w="1945" w:type="dxa"/>
+            <w:tcW w:w="1980" w:type="dxa"/>
             <w:tcBorders>
               <w:top w:val="single" w:sz="5" w:space="0" w:color="000000"/>
               <w:left w:val="single" w:sz="4" w:space="0" w:color="000000"/>
@@ -3405,10 +4297,17 @@
           <w:p>
             <w:pPr>
               <w:spacing w:line="259" w:lineRule="auto"/>
-            </w:pPr>
-            <w:r>
-              <w:rPr>
-                <w:sz w:val="14"/>
+              <w:rPr>
+                <w:rFonts w:ascii="Times New Roman" w:hAnsi="Times New Roman" w:cs="Times New Roman"/>
+                <w:sz w:val="20"/>
+                <w:szCs w:val="20"/>
+              </w:rPr>
+            </w:pPr>
+            <w:r>
+              <w:rPr>
+                <w:rFonts w:ascii="Times New Roman" w:hAnsi="Times New Roman" w:cs="Times New Roman"/>
+                <w:sz w:val="20"/>
+                <w:szCs w:val="20"/>
               </w:rPr>
               <w:t>Internal Audit Management</w:t>
             </w:r>
@@ -3416,7 +4315,7 @@
         </w:tc>
         <w:tc>
           <w:tcPr>
-            <w:tcW w:w="960" w:type="dxa"/>
+            <w:tcW w:w="886" w:type="dxa"/>
             <w:tcBorders>
               <w:top w:val="single" w:sz="5" w:space="0" w:color="000000"/>
               <w:left w:val="single" w:sz="4" w:space="0" w:color="000000"/>
@@ -3430,10 +4329,17 @@
               <w:spacing w:line="259" w:lineRule="auto"/>
               <w:ind w:left="27"/>
               <w:jc w:val="center"/>
-            </w:pPr>
-            <w:r>
-              <w:rPr>
-                <w:sz w:val="14"/>
+              <w:rPr>
+                <w:rFonts w:ascii="Times New Roman" w:hAnsi="Times New Roman" w:cs="Times New Roman"/>
+                <w:sz w:val="20"/>
+                <w:szCs w:val="20"/>
+              </w:rPr>
+            </w:pPr>
+            <w:r>
+              <w:rPr>
+                <w:rFonts w:ascii="Times New Roman" w:hAnsi="Times New Roman" w:cs="Times New Roman"/>
+                <w:sz w:val="20"/>
+                <w:szCs w:val="20"/>
               </w:rPr>
               <w:t>20</w:t>
             </w:r>
@@ -3441,7 +4347,7 @@
         </w:tc>
         <w:tc>
           <w:tcPr>
-            <w:tcW w:w="960" w:type="dxa"/>
+            <w:tcW w:w="851" w:type="dxa"/>
             <w:tcBorders>
               <w:top w:val="single" w:sz="5" w:space="0" w:color="000000"/>
               <w:left w:val="single" w:sz="4" w:space="0" w:color="000000"/>
@@ -3455,12 +4361,17 @@
               <w:spacing w:line="259" w:lineRule="auto"/>
               <w:ind w:left="25"/>
               <w:jc w:val="both"/>
-            </w:pPr>
-          </w:p>
-        </w:tc>
-        <w:tc>
-          <w:tcPr>
-            <w:tcW w:w="882" w:type="dxa"/>
+              <w:rPr>
+                <w:rFonts w:ascii="Times New Roman" w:hAnsi="Times New Roman" w:cs="Times New Roman"/>
+                <w:sz w:val="20"/>
+                <w:szCs w:val="20"/>
+              </w:rPr>
+            </w:pPr>
+          </w:p>
+        </w:tc>
+        <w:tc>
+          <w:tcPr>
+            <w:tcW w:w="850" w:type="dxa"/>
             <w:tcBorders>
               <w:top w:val="single" w:sz="5" w:space="0" w:color="000000"/>
               <w:left w:val="single" w:sz="4" w:space="0" w:color="000000"/>
@@ -3473,10 +4384,17 @@
             <w:pPr>
               <w:spacing w:line="259" w:lineRule="auto"/>
               <w:ind w:left="25"/>
-            </w:pPr>
-            <w:r>
-              <w:rPr>
-                <w:sz w:val="14"/>
+              <w:rPr>
+                <w:rFonts w:ascii="Times New Roman" w:hAnsi="Times New Roman" w:cs="Times New Roman"/>
+                <w:sz w:val="20"/>
+                <w:szCs w:val="20"/>
+              </w:rPr>
+            </w:pPr>
+            <w:r>
+              <w:rPr>
+                <w:rFonts w:ascii="Times New Roman" w:hAnsi="Times New Roman" w:cs="Times New Roman"/>
+                <w:sz w:val="20"/>
+                <w:szCs w:val="20"/>
               </w:rPr>
               <w:t xml:space="preserve">      </w:t>
             </w:r>
@@ -3484,7 +4402,7 @@
         </w:tc>
         <w:tc>
           <w:tcPr>
-            <w:tcW w:w="882" w:type="dxa"/>
+            <w:tcW w:w="851" w:type="dxa"/>
             <w:tcBorders>
               <w:top w:val="single" w:sz="5" w:space="0" w:color="000000"/>
               <w:left w:val="single" w:sz="4" w:space="0" w:color="000000"/>
@@ -3497,12 +4415,17 @@
             <w:pPr>
               <w:spacing w:line="259" w:lineRule="auto"/>
               <w:ind w:left="25"/>
-            </w:pPr>
-          </w:p>
-        </w:tc>
-        <w:tc>
-          <w:tcPr>
-            <w:tcW w:w="882" w:type="dxa"/>
+              <w:rPr>
+                <w:rFonts w:ascii="Times New Roman" w:hAnsi="Times New Roman" w:cs="Times New Roman"/>
+                <w:sz w:val="20"/>
+                <w:szCs w:val="20"/>
+              </w:rPr>
+            </w:pPr>
+          </w:p>
+        </w:tc>
+        <w:tc>
+          <w:tcPr>
+            <w:tcW w:w="850" w:type="dxa"/>
             <w:tcBorders>
               <w:top w:val="single" w:sz="5" w:space="0" w:color="000000"/>
               <w:left w:val="single" w:sz="4" w:space="0" w:color="000000"/>
@@ -3515,12 +4438,17 @@
             <w:pPr>
               <w:spacing w:line="259" w:lineRule="auto"/>
               <w:ind w:left="25"/>
-            </w:pPr>
-          </w:p>
-        </w:tc>
-        <w:tc>
-          <w:tcPr>
-            <w:tcW w:w="882" w:type="dxa"/>
+              <w:rPr>
+                <w:rFonts w:ascii="Times New Roman" w:hAnsi="Times New Roman" w:cs="Times New Roman"/>
+                <w:sz w:val="20"/>
+                <w:szCs w:val="20"/>
+              </w:rPr>
+            </w:pPr>
+          </w:p>
+        </w:tc>
+        <w:tc>
+          <w:tcPr>
+            <w:tcW w:w="851" w:type="dxa"/>
             <w:tcBorders>
               <w:top w:val="single" w:sz="5" w:space="0" w:color="000000"/>
               <w:left w:val="single" w:sz="4" w:space="0" w:color="000000"/>
@@ -3533,12 +4461,17 @@
             <w:pPr>
               <w:spacing w:line="259" w:lineRule="auto"/>
               <w:ind w:left="25"/>
-            </w:pPr>
-          </w:p>
-        </w:tc>
-        <w:tc>
-          <w:tcPr>
-            <w:tcW w:w="1211" w:type="dxa"/>
+              <w:rPr>
+                <w:rFonts w:ascii="Times New Roman" w:hAnsi="Times New Roman" w:cs="Times New Roman"/>
+                <w:sz w:val="20"/>
+                <w:szCs w:val="20"/>
+              </w:rPr>
+            </w:pPr>
+          </w:p>
+        </w:tc>
+        <w:tc>
+          <w:tcPr>
+            <w:tcW w:w="1417" w:type="dxa"/>
             <w:tcBorders>
               <w:top w:val="single" w:sz="5" w:space="0" w:color="000000"/>
               <w:left w:val="single" w:sz="4" w:space="0" w:color="000000"/>
@@ -3551,12 +4484,17 @@
             <w:pPr>
               <w:spacing w:line="259" w:lineRule="auto"/>
               <w:ind w:left="25"/>
-            </w:pPr>
-          </w:p>
-        </w:tc>
-        <w:tc>
-          <w:tcPr>
-            <w:tcW w:w="1145" w:type="dxa"/>
+              <w:rPr>
+                <w:rFonts w:ascii="Times New Roman" w:hAnsi="Times New Roman" w:cs="Times New Roman"/>
+                <w:sz w:val="20"/>
+                <w:szCs w:val="20"/>
+              </w:rPr>
+            </w:pPr>
+          </w:p>
+        </w:tc>
+        <w:tc>
+          <w:tcPr>
+            <w:tcW w:w="1389" w:type="dxa"/>
             <w:tcBorders>
               <w:top w:val="single" w:sz="5" w:space="0" w:color="000000"/>
               <w:left w:val="single" w:sz="5" w:space="0" w:color="000000"/>
@@ -3569,17 +4507,22 @@
             <w:pPr>
               <w:spacing w:line="259" w:lineRule="auto"/>
               <w:ind w:left="26"/>
+              <w:rPr>
+                <w:rFonts w:ascii="Times New Roman" w:hAnsi="Times New Roman" w:cs="Times New Roman"/>
+                <w:sz w:val="20"/>
+                <w:szCs w:val="20"/>
+              </w:rPr>
             </w:pPr>
           </w:p>
         </w:tc>
       </w:tr>
       <w:tr>
         <w:trPr>
-          <w:trHeight w:val="239"/>
+          <w:trHeight w:val="252"/>
         </w:trPr>
         <w:tc>
           <w:tcPr>
-            <w:tcW w:w="1945" w:type="dxa"/>
+            <w:tcW w:w="1980" w:type="dxa"/>
             <w:tcBorders>
               <w:top w:val="single" w:sz="5" w:space="0" w:color="000000"/>
               <w:left w:val="single" w:sz="4" w:space="0" w:color="000000"/>
@@ -3591,10 +4534,17 @@
           <w:p>
             <w:pPr>
               <w:spacing w:line="259" w:lineRule="auto"/>
-            </w:pPr>
-            <w:r>
-              <w:rPr>
-                <w:sz w:val="14"/>
+              <w:rPr>
+                <w:rFonts w:ascii="Times New Roman" w:hAnsi="Times New Roman" w:cs="Times New Roman"/>
+                <w:sz w:val="20"/>
+                <w:szCs w:val="20"/>
+              </w:rPr>
+            </w:pPr>
+            <w:r>
+              <w:rPr>
+                <w:rFonts w:ascii="Times New Roman" w:hAnsi="Times New Roman" w:cs="Times New Roman"/>
+                <w:sz w:val="20"/>
+                <w:szCs w:val="20"/>
               </w:rPr>
               <w:t>KPI I MRM</w:t>
             </w:r>
@@ -3602,7 +4552,7 @@
         </w:tc>
         <w:tc>
           <w:tcPr>
-            <w:tcW w:w="960" w:type="dxa"/>
+            <w:tcW w:w="886" w:type="dxa"/>
             <w:tcBorders>
               <w:top w:val="single" w:sz="5" w:space="0" w:color="000000"/>
               <w:left w:val="single" w:sz="4" w:space="0" w:color="000000"/>
@@ -3616,10 +4566,17 @@
               <w:spacing w:line="259" w:lineRule="auto"/>
               <w:ind w:left="27"/>
               <w:jc w:val="center"/>
-            </w:pPr>
-            <w:r>
-              <w:rPr>
-                <w:sz w:val="14"/>
+              <w:rPr>
+                <w:rFonts w:ascii="Times New Roman" w:hAnsi="Times New Roman" w:cs="Times New Roman"/>
+                <w:sz w:val="20"/>
+                <w:szCs w:val="20"/>
+              </w:rPr>
+            </w:pPr>
+            <w:r>
+              <w:rPr>
+                <w:rFonts w:ascii="Times New Roman" w:hAnsi="Times New Roman" w:cs="Times New Roman"/>
+                <w:sz w:val="20"/>
+                <w:szCs w:val="20"/>
               </w:rPr>
               <w:t>20</w:t>
             </w:r>
@@ -3627,7 +4584,7 @@
         </w:tc>
         <w:tc>
           <w:tcPr>
-            <w:tcW w:w="960" w:type="dxa"/>
+            <w:tcW w:w="851" w:type="dxa"/>
             <w:tcBorders>
               <w:top w:val="single" w:sz="5" w:space="0" w:color="000000"/>
               <w:left w:val="single" w:sz="4" w:space="0" w:color="000000"/>
@@ -3641,10 +4598,17 @@
               <w:spacing w:line="259" w:lineRule="auto"/>
               <w:ind w:left="25"/>
               <w:jc w:val="both"/>
-            </w:pPr>
-            <w:r>
-              <w:rPr>
-                <w:sz w:val="14"/>
+              <w:rPr>
+                <w:rFonts w:ascii="Times New Roman" w:hAnsi="Times New Roman" w:cs="Times New Roman"/>
+                <w:sz w:val="20"/>
+                <w:szCs w:val="20"/>
+              </w:rPr>
+            </w:pPr>
+            <w:r>
+              <w:rPr>
+                <w:rFonts w:ascii="Times New Roman" w:hAnsi="Times New Roman" w:cs="Times New Roman"/>
+                <w:sz w:val="20"/>
+                <w:szCs w:val="20"/>
               </w:rPr>
               <w:t xml:space="preserve">    </w:t>
             </w:r>
@@ -3652,7 +4616,7 @@
         </w:tc>
         <w:tc>
           <w:tcPr>
-            <w:tcW w:w="882" w:type="dxa"/>
+            <w:tcW w:w="850" w:type="dxa"/>
             <w:tcBorders>
               <w:top w:val="single" w:sz="5" w:space="0" w:color="000000"/>
               <w:left w:val="single" w:sz="4" w:space="0" w:color="000000"/>
@@ -3665,12 +4629,17 @@
             <w:pPr>
               <w:spacing w:line="259" w:lineRule="auto"/>
               <w:ind w:left="25"/>
-            </w:pPr>
-          </w:p>
-        </w:tc>
-        <w:tc>
-          <w:tcPr>
-            <w:tcW w:w="882" w:type="dxa"/>
+              <w:rPr>
+                <w:rFonts w:ascii="Times New Roman" w:hAnsi="Times New Roman" w:cs="Times New Roman"/>
+                <w:sz w:val="20"/>
+                <w:szCs w:val="20"/>
+              </w:rPr>
+            </w:pPr>
+          </w:p>
+        </w:tc>
+        <w:tc>
+          <w:tcPr>
+            <w:tcW w:w="851" w:type="dxa"/>
             <w:tcBorders>
               <w:top w:val="single" w:sz="5" w:space="0" w:color="000000"/>
               <w:left w:val="single" w:sz="4" w:space="0" w:color="000000"/>
@@ -3683,12 +4652,17 @@
             <w:pPr>
               <w:spacing w:line="259" w:lineRule="auto"/>
               <w:ind w:left="25"/>
-            </w:pPr>
-          </w:p>
-        </w:tc>
-        <w:tc>
-          <w:tcPr>
-            <w:tcW w:w="882" w:type="dxa"/>
+              <w:rPr>
+                <w:rFonts w:ascii="Times New Roman" w:hAnsi="Times New Roman" w:cs="Times New Roman"/>
+                <w:sz w:val="20"/>
+                <w:szCs w:val="20"/>
+              </w:rPr>
+            </w:pPr>
+          </w:p>
+        </w:tc>
+        <w:tc>
+          <w:tcPr>
+            <w:tcW w:w="850" w:type="dxa"/>
             <w:tcBorders>
               <w:top w:val="single" w:sz="5" w:space="0" w:color="000000"/>
               <w:left w:val="single" w:sz="4" w:space="0" w:color="000000"/>
@@ -3701,12 +4675,17 @@
             <w:pPr>
               <w:spacing w:line="259" w:lineRule="auto"/>
               <w:ind w:left="25"/>
-            </w:pPr>
-          </w:p>
-        </w:tc>
-        <w:tc>
-          <w:tcPr>
-            <w:tcW w:w="882" w:type="dxa"/>
+              <w:rPr>
+                <w:rFonts w:ascii="Times New Roman" w:hAnsi="Times New Roman" w:cs="Times New Roman"/>
+                <w:sz w:val="20"/>
+                <w:szCs w:val="20"/>
+              </w:rPr>
+            </w:pPr>
+          </w:p>
+        </w:tc>
+        <w:tc>
+          <w:tcPr>
+            <w:tcW w:w="851" w:type="dxa"/>
             <w:tcBorders>
               <w:top w:val="single" w:sz="5" w:space="0" w:color="000000"/>
               <w:left w:val="single" w:sz="4" w:space="0" w:color="000000"/>
@@ -3719,12 +4698,17 @@
             <w:pPr>
               <w:spacing w:line="259" w:lineRule="auto"/>
               <w:ind w:left="25"/>
-            </w:pPr>
-          </w:p>
-        </w:tc>
-        <w:tc>
-          <w:tcPr>
-            <w:tcW w:w="1211" w:type="dxa"/>
+              <w:rPr>
+                <w:rFonts w:ascii="Times New Roman" w:hAnsi="Times New Roman" w:cs="Times New Roman"/>
+                <w:sz w:val="20"/>
+                <w:szCs w:val="20"/>
+              </w:rPr>
+            </w:pPr>
+          </w:p>
+        </w:tc>
+        <w:tc>
+          <w:tcPr>
+            <w:tcW w:w="1417" w:type="dxa"/>
             <w:tcBorders>
               <w:top w:val="single" w:sz="5" w:space="0" w:color="000000"/>
               <w:left w:val="single" w:sz="4" w:space="0" w:color="000000"/>
@@ -3737,12 +4721,17 @@
             <w:pPr>
               <w:spacing w:line="259" w:lineRule="auto"/>
               <w:ind w:left="25"/>
-            </w:pPr>
-          </w:p>
-        </w:tc>
-        <w:tc>
-          <w:tcPr>
-            <w:tcW w:w="1145" w:type="dxa"/>
+              <w:rPr>
+                <w:rFonts w:ascii="Times New Roman" w:hAnsi="Times New Roman" w:cs="Times New Roman"/>
+                <w:sz w:val="20"/>
+                <w:szCs w:val="20"/>
+              </w:rPr>
+            </w:pPr>
+          </w:p>
+        </w:tc>
+        <w:tc>
+          <w:tcPr>
+            <w:tcW w:w="1389" w:type="dxa"/>
             <w:tcBorders>
               <w:top w:val="single" w:sz="5" w:space="0" w:color="000000"/>
               <w:left w:val="single" w:sz="5" w:space="0" w:color="000000"/>
@@ -3755,6 +4744,11 @@
             <w:pPr>
               <w:spacing w:line="259" w:lineRule="auto"/>
               <w:ind w:left="26"/>
+              <w:rPr>
+                <w:rFonts w:ascii="Times New Roman" w:hAnsi="Times New Roman" w:cs="Times New Roman"/>
+                <w:sz w:val="20"/>
+                <w:szCs w:val="20"/>
+              </w:rPr>
             </w:pPr>
           </w:p>
         </w:tc>
@@ -4213,6 +5207,7 @@
               <w:rPr>
                 <w:rFonts w:ascii="Times New Roman" w:hAnsi="Times New Roman" w:cs="Times New Roman"/>
               </w:rPr>
+              <w:lastRenderedPageBreak/>
               <w:t>{{MODULE_LIST}}</w:t>
             </w:r>
             <w:r>
@@ -4462,174 +5457,298 @@
         <w:spacing w:before="300" w:after="150"/>
         <w:rPr>
           <w:rFonts w:ascii="Times New Roman" w:hAnsi="Times New Roman" w:cs="Times New Roman"/>
-          <w:color w:val="000000" w:themeColor="text1"/>
-        </w:rPr>
-      </w:pPr>
+          <w:w w:val="101"/>
+        </w:rPr>
+      </w:pPr>
+      <w:r>
+        <w:rPr>
+          <w:rFonts w:ascii="Times New Roman" w:hAnsi="Times New Roman" w:cs="Times New Roman"/>
+          <w:w w:val="101"/>
+        </w:rPr>
+        <w:t>We</w:t>
+      </w:r>
+      <w:r>
+        <w:rPr>
+          <w:rFonts w:ascii="Times New Roman" w:hAnsi="Times New Roman" w:cs="Times New Roman"/>
+          <w:spacing w:val="-5"/>
+          <w:w w:val="101"/>
+        </w:rPr>
+        <w:t xml:space="preserve"> </w:t>
+      </w:r>
+      <w:r>
+        <w:rPr>
+          <w:rFonts w:ascii="Times New Roman" w:hAnsi="Times New Roman" w:cs="Times New Roman"/>
+          <w:w w:val="101"/>
+        </w:rPr>
+        <w:t>agree</w:t>
+      </w:r>
+      <w:r>
+        <w:rPr>
+          <w:rFonts w:ascii="Times New Roman" w:hAnsi="Times New Roman" w:cs="Times New Roman"/>
+          <w:spacing w:val="-6"/>
+          <w:w w:val="101"/>
+        </w:rPr>
+        <w:t xml:space="preserve"> </w:t>
+      </w:r>
+      <w:r>
+        <w:rPr>
+          <w:rFonts w:ascii="Times New Roman" w:hAnsi="Times New Roman" w:cs="Times New Roman"/>
+          <w:w w:val="101"/>
+        </w:rPr>
+        <w:t>to</w:t>
+      </w:r>
+      <w:r>
+        <w:rPr>
+          <w:rFonts w:ascii="Times New Roman" w:hAnsi="Times New Roman" w:cs="Times New Roman"/>
+          <w:spacing w:val="-2"/>
+          <w:w w:val="101"/>
+        </w:rPr>
+        <w:t xml:space="preserve"> </w:t>
+      </w:r>
+      <w:r>
+        <w:rPr>
+          <w:rFonts w:ascii="Times New Roman" w:hAnsi="Times New Roman" w:cs="Times New Roman"/>
+          <w:w w:val="101"/>
+        </w:rPr>
+        <w:t>maintain</w:t>
+      </w:r>
+      <w:r>
+        <w:rPr>
+          <w:rFonts w:ascii="Times New Roman" w:hAnsi="Times New Roman" w:cs="Times New Roman"/>
+          <w:spacing w:val="-5"/>
+          <w:w w:val="101"/>
+        </w:rPr>
+        <w:t xml:space="preserve"> </w:t>
+      </w:r>
+      <w:r>
+        <w:rPr>
+          <w:rFonts w:ascii="Times New Roman" w:hAnsi="Times New Roman" w:cs="Times New Roman"/>
+          <w:w w:val="101"/>
+        </w:rPr>
+        <w:t>the</w:t>
+      </w:r>
+      <w:r>
+        <w:rPr>
+          <w:rFonts w:ascii="Times New Roman" w:hAnsi="Times New Roman" w:cs="Times New Roman"/>
+          <w:spacing w:val="-5"/>
+          <w:w w:val="101"/>
+        </w:rPr>
+        <w:t xml:space="preserve"> </w:t>
+      </w:r>
+      <w:r>
+        <w:rPr>
+          <w:rFonts w:ascii="Times New Roman" w:hAnsi="Times New Roman" w:cs="Times New Roman"/>
+          <w:w w:val="101"/>
+        </w:rPr>
+        <w:t>secrecy</w:t>
+      </w:r>
+      <w:r>
+        <w:rPr>
+          <w:rFonts w:ascii="Times New Roman" w:hAnsi="Times New Roman" w:cs="Times New Roman"/>
+          <w:spacing w:val="-3"/>
+          <w:w w:val="101"/>
+        </w:rPr>
+        <w:t xml:space="preserve"> </w:t>
+      </w:r>
+      <w:r>
+        <w:rPr>
+          <w:rFonts w:ascii="Times New Roman" w:hAnsi="Times New Roman" w:cs="Times New Roman"/>
+          <w:w w:val="101"/>
+        </w:rPr>
+        <w:t>of</w:t>
+      </w:r>
+      <w:r>
+        <w:rPr>
+          <w:rFonts w:ascii="Times New Roman" w:hAnsi="Times New Roman" w:cs="Times New Roman"/>
+          <w:spacing w:val="-5"/>
+          <w:w w:val="101"/>
+        </w:rPr>
+        <w:t xml:space="preserve"> </w:t>
+      </w:r>
+      <w:r>
+        <w:rPr>
+          <w:rFonts w:ascii="Times New Roman" w:hAnsi="Times New Roman" w:cs="Times New Roman"/>
+          <w:w w:val="101"/>
+        </w:rPr>
+        <w:t>insight</w:t>
+      </w:r>
+      <w:r>
+        <w:rPr>
+          <w:rFonts w:ascii="Times New Roman" w:hAnsi="Times New Roman" w:cs="Times New Roman"/>
+          <w:spacing w:val="-2"/>
+          <w:w w:val="101"/>
+        </w:rPr>
+        <w:t xml:space="preserve"> </w:t>
+      </w:r>
+      <w:r>
+        <w:rPr>
+          <w:rFonts w:ascii="Times New Roman" w:hAnsi="Times New Roman" w:cs="Times New Roman"/>
+          <w:w w:val="101"/>
+        </w:rPr>
+        <w:t>into</w:t>
+      </w:r>
+      <w:r>
+        <w:rPr>
+          <w:rFonts w:ascii="Times New Roman" w:hAnsi="Times New Roman" w:cs="Times New Roman"/>
+          <w:spacing w:val="-5"/>
+          <w:w w:val="101"/>
+        </w:rPr>
+        <w:t xml:space="preserve"> </w:t>
+      </w:r>
+      <w:r>
+        <w:rPr>
+          <w:rFonts w:ascii="Times New Roman" w:hAnsi="Times New Roman" w:cs="Times New Roman"/>
+          <w:w w:val="101"/>
+        </w:rPr>
+        <w:t>your</w:t>
+      </w:r>
+      <w:r>
+        <w:rPr>
+          <w:rFonts w:ascii="Times New Roman" w:hAnsi="Times New Roman" w:cs="Times New Roman"/>
+          <w:spacing w:val="-5"/>
+          <w:w w:val="101"/>
+        </w:rPr>
+        <w:t xml:space="preserve"> </w:t>
+      </w:r>
+      <w:proofErr w:type="gramStart"/>
+      <w:r>
+        <w:rPr>
+          <w:rFonts w:ascii="Times New Roman" w:hAnsi="Times New Roman" w:cs="Times New Roman"/>
+          <w:w w:val="101"/>
+        </w:rPr>
+        <w:t>Organization</w:t>
+      </w:r>
+      <w:proofErr w:type="gramEnd"/>
     </w:p>
     <w:p>
       <w:pPr>
         <w:spacing w:before="300" w:after="150"/>
         <w:rPr>
           <w:rFonts w:ascii="Times New Roman" w:hAnsi="Times New Roman" w:cs="Times New Roman"/>
-          <w:w w:val="101"/>
-        </w:rPr>
-      </w:pPr>
-      <w:r>
-        <w:rPr>
-          <w:rFonts w:ascii="Times New Roman" w:hAnsi="Times New Roman" w:cs="Times New Roman"/>
-          <w:w w:val="101"/>
-        </w:rPr>
-        <w:t>We</w:t>
+        </w:rPr>
+      </w:pPr>
+      <w:r>
+        <w:rPr>
+          <w:rFonts w:ascii="Times New Roman" w:hAnsi="Times New Roman" w:cs="Times New Roman"/>
+        </w:rPr>
+        <w:t>You</w:t>
+      </w:r>
+      <w:r>
+        <w:rPr>
+          <w:rFonts w:ascii="Times New Roman" w:hAnsi="Times New Roman" w:cs="Times New Roman"/>
+          <w:spacing w:val="-2"/>
+        </w:rPr>
+        <w:t xml:space="preserve"> </w:t>
+      </w:r>
+      <w:r>
+        <w:rPr>
+          <w:rFonts w:ascii="Times New Roman" w:hAnsi="Times New Roman" w:cs="Times New Roman"/>
+        </w:rPr>
+        <w:t>should</w:t>
+      </w:r>
+      <w:r>
+        <w:rPr>
+          <w:rFonts w:ascii="Times New Roman" w:hAnsi="Times New Roman" w:cs="Times New Roman"/>
+          <w:spacing w:val="-2"/>
+        </w:rPr>
+        <w:t xml:space="preserve"> </w:t>
+      </w:r>
+      <w:r>
+        <w:rPr>
+          <w:rFonts w:ascii="Times New Roman" w:hAnsi="Times New Roman" w:cs="Times New Roman"/>
+        </w:rPr>
+        <w:t>hold</w:t>
+      </w:r>
+      <w:r>
+        <w:rPr>
+          <w:rFonts w:ascii="Times New Roman" w:hAnsi="Times New Roman" w:cs="Times New Roman"/>
+          <w:spacing w:val="-6"/>
+        </w:rPr>
+        <w:t xml:space="preserve"> </w:t>
+      </w:r>
+      <w:r>
+        <w:rPr>
+          <w:rFonts w:ascii="Times New Roman" w:hAnsi="Times New Roman" w:cs="Times New Roman"/>
+        </w:rPr>
+        <w:t>Licenses</w:t>
+      </w:r>
+      <w:r>
+        <w:rPr>
+          <w:rFonts w:ascii="Times New Roman" w:hAnsi="Times New Roman" w:cs="Times New Roman"/>
+          <w:spacing w:val="-3"/>
+        </w:rPr>
+        <w:t xml:space="preserve"> </w:t>
+      </w:r>
+      <w:r>
+        <w:rPr>
+          <w:rFonts w:ascii="Times New Roman" w:hAnsi="Times New Roman" w:cs="Times New Roman"/>
+        </w:rPr>
+        <w:t>of</w:t>
+      </w:r>
+      <w:r>
+        <w:rPr>
+          <w:rFonts w:ascii="Times New Roman" w:hAnsi="Times New Roman" w:cs="Times New Roman"/>
+          <w:spacing w:val="-6"/>
+        </w:rPr>
+        <w:t xml:space="preserve"> </w:t>
+      </w:r>
+      <w:r>
+        <w:rPr>
+          <w:rFonts w:ascii="Times New Roman" w:hAnsi="Times New Roman" w:cs="Times New Roman"/>
+        </w:rPr>
+        <w:t>any</w:t>
+      </w:r>
+      <w:r>
+        <w:rPr>
+          <w:rFonts w:ascii="Times New Roman" w:hAnsi="Times New Roman" w:cs="Times New Roman"/>
+          <w:spacing w:val="-3"/>
+        </w:rPr>
+        <w:t xml:space="preserve"> </w:t>
+      </w:r>
+      <w:r>
+        <w:rPr>
+          <w:rFonts w:ascii="Times New Roman" w:hAnsi="Times New Roman" w:cs="Times New Roman"/>
+        </w:rPr>
+        <w:t>Operating</w:t>
       </w:r>
       <w:r>
         <w:rPr>
           <w:rFonts w:ascii="Times New Roman" w:hAnsi="Times New Roman" w:cs="Times New Roman"/>
           <w:spacing w:val="-5"/>
-          <w:w w:val="101"/>
         </w:rPr>
         <w:t xml:space="preserve"> </w:t>
       </w:r>
       <w:r>
         <w:rPr>
           <w:rFonts w:ascii="Times New Roman" w:hAnsi="Times New Roman" w:cs="Times New Roman"/>
-          <w:w w:val="101"/>
-        </w:rPr>
-        <w:t>agree</w:t>
+        </w:rPr>
+        <w:t>System</w:t>
+      </w:r>
+      <w:r>
+        <w:rPr>
+          <w:rFonts w:ascii="Times New Roman" w:hAnsi="Times New Roman" w:cs="Times New Roman"/>
+          <w:spacing w:val="-5"/>
+        </w:rPr>
+        <w:t xml:space="preserve"> </w:t>
+      </w:r>
+      <w:r>
+        <w:rPr>
+          <w:rFonts w:ascii="Times New Roman" w:hAnsi="Times New Roman" w:cs="Times New Roman"/>
+        </w:rPr>
+        <w:t>Software</w:t>
       </w:r>
       <w:r>
         <w:rPr>
           <w:rFonts w:ascii="Times New Roman" w:hAnsi="Times New Roman" w:cs="Times New Roman"/>
           <w:spacing w:val="-6"/>
-          <w:w w:val="101"/>
         </w:rPr>
         <w:t xml:space="preserve"> </w:t>
       </w:r>
       <w:r>
         <w:rPr>
           <w:rFonts w:ascii="Times New Roman" w:hAnsi="Times New Roman" w:cs="Times New Roman"/>
-          <w:w w:val="101"/>
-        </w:rPr>
-        <w:t>to</w:t>
-      </w:r>
-      <w:r>
-        <w:rPr>
-          <w:rFonts w:ascii="Times New Roman" w:hAnsi="Times New Roman" w:cs="Times New Roman"/>
-          <w:spacing w:val="-2"/>
-          <w:w w:val="101"/>
-        </w:rPr>
-        <w:t xml:space="preserve"> </w:t>
-      </w:r>
-      <w:r>
-        <w:rPr>
-          <w:rFonts w:ascii="Times New Roman" w:hAnsi="Times New Roman" w:cs="Times New Roman"/>
-          <w:w w:val="101"/>
-        </w:rPr>
-        <w:t>maintain</w:t>
-      </w:r>
-      <w:r>
-        <w:rPr>
-          <w:rFonts w:ascii="Times New Roman" w:hAnsi="Times New Roman" w:cs="Times New Roman"/>
-          <w:spacing w:val="-5"/>
-          <w:w w:val="101"/>
-        </w:rPr>
-        <w:t xml:space="preserve"> </w:t>
-      </w:r>
-      <w:r>
-        <w:rPr>
-          <w:rFonts w:ascii="Times New Roman" w:hAnsi="Times New Roman" w:cs="Times New Roman"/>
-          <w:w w:val="101"/>
-        </w:rPr>
-        <w:t>the</w:t>
-      </w:r>
-      <w:r>
-        <w:rPr>
-          <w:rFonts w:ascii="Times New Roman" w:hAnsi="Times New Roman" w:cs="Times New Roman"/>
-          <w:spacing w:val="-5"/>
-          <w:w w:val="101"/>
-        </w:rPr>
-        <w:t xml:space="preserve"> </w:t>
-      </w:r>
-      <w:r>
-        <w:rPr>
-          <w:rFonts w:ascii="Times New Roman" w:hAnsi="Times New Roman" w:cs="Times New Roman"/>
-          <w:w w:val="101"/>
-        </w:rPr>
-        <w:t>secrecy</w:t>
-      </w:r>
-      <w:r>
-        <w:rPr>
-          <w:rFonts w:ascii="Times New Roman" w:hAnsi="Times New Roman" w:cs="Times New Roman"/>
-          <w:spacing w:val="-3"/>
-          <w:w w:val="101"/>
-        </w:rPr>
-        <w:t xml:space="preserve"> </w:t>
-      </w:r>
-      <w:r>
-        <w:rPr>
-          <w:rFonts w:ascii="Times New Roman" w:hAnsi="Times New Roman" w:cs="Times New Roman"/>
-          <w:w w:val="101"/>
-        </w:rPr>
-        <w:t>of</w:t>
-      </w:r>
-      <w:r>
-        <w:rPr>
-          <w:rFonts w:ascii="Times New Roman" w:hAnsi="Times New Roman" w:cs="Times New Roman"/>
-          <w:spacing w:val="-5"/>
-          <w:w w:val="101"/>
-        </w:rPr>
-        <w:t xml:space="preserve"> </w:t>
-      </w:r>
-      <w:r>
-        <w:rPr>
-          <w:rFonts w:ascii="Times New Roman" w:hAnsi="Times New Roman" w:cs="Times New Roman"/>
-          <w:w w:val="101"/>
-        </w:rPr>
-        <w:t>insight</w:t>
-      </w:r>
-      <w:r>
-        <w:rPr>
-          <w:rFonts w:ascii="Times New Roman" w:hAnsi="Times New Roman" w:cs="Times New Roman"/>
-          <w:spacing w:val="-2"/>
-          <w:w w:val="101"/>
-        </w:rPr>
-        <w:t xml:space="preserve"> </w:t>
-      </w:r>
-      <w:r>
-        <w:rPr>
-          <w:rFonts w:ascii="Times New Roman" w:hAnsi="Times New Roman" w:cs="Times New Roman"/>
-          <w:w w:val="101"/>
-        </w:rPr>
-        <w:t>into</w:t>
-      </w:r>
-      <w:r>
-        <w:rPr>
-          <w:rFonts w:ascii="Times New Roman" w:hAnsi="Times New Roman" w:cs="Times New Roman"/>
-          <w:spacing w:val="-5"/>
-          <w:w w:val="101"/>
-        </w:rPr>
-        <w:t xml:space="preserve"> </w:t>
-      </w:r>
-      <w:r>
-        <w:rPr>
-          <w:rFonts w:ascii="Times New Roman" w:hAnsi="Times New Roman" w:cs="Times New Roman"/>
-          <w:w w:val="101"/>
-        </w:rPr>
-        <w:t>your</w:t>
-      </w:r>
-      <w:r>
-        <w:rPr>
-          <w:rFonts w:ascii="Times New Roman" w:hAnsi="Times New Roman" w:cs="Times New Roman"/>
-          <w:spacing w:val="-5"/>
-          <w:w w:val="101"/>
-        </w:rPr>
-        <w:t xml:space="preserve"> </w:t>
-      </w:r>
-      <w:r>
-        <w:rPr>
-          <w:rFonts w:ascii="Times New Roman" w:hAnsi="Times New Roman" w:cs="Times New Roman"/>
-          <w:w w:val="101"/>
-        </w:rPr>
-        <w:t>Organization</w:t>
+        </w:rPr>
+        <w:t>required.</w:t>
       </w:r>
     </w:p>
     <w:p>
@@ -4643,125 +5762,7 @@
         <w:rPr>
           <w:rFonts w:ascii="Times New Roman" w:hAnsi="Times New Roman" w:cs="Times New Roman"/>
         </w:rPr>
-        <w:lastRenderedPageBreak/>
-        <w:t>You</w:t>
-      </w:r>
-      <w:r>
-        <w:rPr>
-          <w:rFonts w:ascii="Times New Roman" w:hAnsi="Times New Roman" w:cs="Times New Roman"/>
-          <w:spacing w:val="-2"/>
-        </w:rPr>
-        <w:t xml:space="preserve"> </w:t>
-      </w:r>
-      <w:r>
-        <w:rPr>
-          <w:rFonts w:ascii="Times New Roman" w:hAnsi="Times New Roman" w:cs="Times New Roman"/>
-        </w:rPr>
-        <w:t>should</w:t>
-      </w:r>
-      <w:r>
-        <w:rPr>
-          <w:rFonts w:ascii="Times New Roman" w:hAnsi="Times New Roman" w:cs="Times New Roman"/>
-          <w:spacing w:val="-2"/>
-        </w:rPr>
-        <w:t xml:space="preserve"> </w:t>
-      </w:r>
-      <w:r>
-        <w:rPr>
-          <w:rFonts w:ascii="Times New Roman" w:hAnsi="Times New Roman" w:cs="Times New Roman"/>
-        </w:rPr>
-        <w:t>hold</w:t>
-      </w:r>
-      <w:r>
-        <w:rPr>
-          <w:rFonts w:ascii="Times New Roman" w:hAnsi="Times New Roman" w:cs="Times New Roman"/>
-          <w:spacing w:val="-6"/>
-        </w:rPr>
-        <w:t xml:space="preserve"> </w:t>
-      </w:r>
-      <w:r>
-        <w:rPr>
-          <w:rFonts w:ascii="Times New Roman" w:hAnsi="Times New Roman" w:cs="Times New Roman"/>
-        </w:rPr>
-        <w:t>Licenses</w:t>
-      </w:r>
-      <w:r>
-        <w:rPr>
-          <w:rFonts w:ascii="Times New Roman" w:hAnsi="Times New Roman" w:cs="Times New Roman"/>
-          <w:spacing w:val="-3"/>
-        </w:rPr>
-        <w:t xml:space="preserve"> </w:t>
-      </w:r>
-      <w:r>
-        <w:rPr>
-          <w:rFonts w:ascii="Times New Roman" w:hAnsi="Times New Roman" w:cs="Times New Roman"/>
-        </w:rPr>
-        <w:t>of</w:t>
-      </w:r>
-      <w:r>
-        <w:rPr>
-          <w:rFonts w:ascii="Times New Roman" w:hAnsi="Times New Roman" w:cs="Times New Roman"/>
-          <w:spacing w:val="-6"/>
-        </w:rPr>
-        <w:t xml:space="preserve"> </w:t>
-      </w:r>
-      <w:r>
-        <w:rPr>
-          <w:rFonts w:ascii="Times New Roman" w:hAnsi="Times New Roman" w:cs="Times New Roman"/>
-        </w:rPr>
-        <w:t>any</w:t>
-      </w:r>
-      <w:r>
-        <w:rPr>
-          <w:rFonts w:ascii="Times New Roman" w:hAnsi="Times New Roman" w:cs="Times New Roman"/>
-          <w:spacing w:val="-3"/>
-        </w:rPr>
-        <w:t xml:space="preserve"> </w:t>
-      </w:r>
-      <w:r>
-        <w:rPr>
-          <w:rFonts w:ascii="Times New Roman" w:hAnsi="Times New Roman" w:cs="Times New Roman"/>
-        </w:rPr>
-        <w:t>Operating</w:t>
-      </w:r>
-      <w:r>
-        <w:rPr>
-          <w:rFonts w:ascii="Times New Roman" w:hAnsi="Times New Roman" w:cs="Times New Roman"/>
-          <w:spacing w:val="-5"/>
-        </w:rPr>
-        <w:t xml:space="preserve"> </w:t>
-      </w:r>
-      <w:r>
-        <w:rPr>
-          <w:rFonts w:ascii="Times New Roman" w:hAnsi="Times New Roman" w:cs="Times New Roman"/>
-        </w:rPr>
-        <w:t>System</w:t>
-      </w:r>
-      <w:r>
-        <w:rPr>
-          <w:rFonts w:ascii="Times New Roman" w:hAnsi="Times New Roman" w:cs="Times New Roman"/>
-          <w:spacing w:val="-5"/>
-        </w:rPr>
-        <w:t xml:space="preserve"> </w:t>
-      </w:r>
-      <w:r>
-        <w:rPr>
-          <w:rFonts w:ascii="Times New Roman" w:hAnsi="Times New Roman" w:cs="Times New Roman"/>
-        </w:rPr>
-        <w:t>Software</w:t>
-      </w:r>
-      <w:r>
-        <w:rPr>
-          <w:rFonts w:ascii="Times New Roman" w:hAnsi="Times New Roman" w:cs="Times New Roman"/>
-          <w:spacing w:val="-6"/>
-        </w:rPr>
-        <w:t xml:space="preserve"> </w:t>
-      </w:r>
-      <w:r>
-        <w:rPr>
-          <w:rFonts w:ascii="Times New Roman" w:hAnsi="Times New Roman" w:cs="Times New Roman"/>
-        </w:rPr>
-        <w:t>required.</w:t>
+        <w:t>Source Code remains the property of BleckTek Software Solutions LLP. The customer shall not claim any right in or to any patent, copyright, trademark or other proprietary right of the original manufacturer, developer or licensor. The software, hardware or other goods supplies are in accordance with the export laws of the respective countries, and diversion contrary to these laws or regulations is prohibited.</w:t>
       </w:r>
     </w:p>
     <w:p>
@@ -4775,97 +5776,113 @@
         <w:rPr>
           <w:rFonts w:ascii="Times New Roman" w:hAnsi="Times New Roman" w:cs="Times New Roman"/>
         </w:rPr>
-        <w:t>Source Code remains the property of BleckTek Software Solutions LLP. The customer shall not claim any right in or to any patent, copyright, trademark or other proprietary right of the original manufacturer, developer or licensor. The software, hardware or other goods supplies are in accordance with the export laws of the respective countries, and diversion contrary to these laws or regulations is prohibited.</w:t>
+        <w:t xml:space="preserve">Terms and Conditions  </w:t>
       </w:r>
     </w:p>
     <w:p>
       <w:pPr>
-        <w:spacing w:before="300" w:after="150"/>
-        <w:rPr>
-          <w:rFonts w:ascii="Times New Roman" w:hAnsi="Times New Roman" w:cs="Times New Roman"/>
-        </w:rPr>
-      </w:pPr>
+        <w:spacing w:before="160" w:after="40"/>
+        <w:rPr>
+          <w:rFonts w:ascii="Times New Roman" w:hAnsi="Times New Roman" w:cs="Times New Roman"/>
+          <w:color w:val="000000" w:themeColor="text1"/>
+        </w:rPr>
+      </w:pPr>
+      <w:r>
+        <w:rPr>
+          <w:rFonts w:ascii="Times New Roman" w:hAnsi="Times New Roman" w:cs="Times New Roman"/>
+          <w:color w:val="000000" w:themeColor="text1"/>
+        </w:rPr>
+        <w:t>1. Confidentiality</w:t>
+      </w:r>
     </w:p>
     <w:p>
       <w:pPr>
-        <w:spacing w:before="300" w:after="150"/>
-        <w:rPr>
-          <w:rFonts w:ascii="Times New Roman" w:hAnsi="Times New Roman" w:cs="Times New Roman"/>
-        </w:rPr>
-      </w:pPr>
+        <w:spacing w:after="60"/>
+        <w:rPr>
+          <w:rFonts w:ascii="Times New Roman" w:hAnsi="Times New Roman" w:cs="Times New Roman"/>
+        </w:rPr>
+      </w:pPr>
+      <w:r>
+        <w:rPr>
+          <w:rFonts w:ascii="Times New Roman" w:hAnsi="Times New Roman" w:cs="Times New Roman"/>
+        </w:rPr>
+        <w:t>BlechTek Software Solutions LLP agrees to maintain the confidentiality of all insights gained into your organization.</w:t>
+      </w:r>
     </w:p>
     <w:p>
       <w:pPr>
-        <w:spacing w:before="300" w:after="150"/>
-        <w:rPr>
-          <w:rFonts w:ascii="Times New Roman" w:hAnsi="Times New Roman" w:cs="Times New Roman"/>
-        </w:rPr>
-      </w:pPr>
-      <w:r>
-        <w:rPr>
-          <w:rFonts w:ascii="Times New Roman" w:hAnsi="Times New Roman" w:cs="Times New Roman"/>
-        </w:rPr>
-        <w:t xml:space="preserve">Terms and Conditions  </w:t>
+        <w:spacing w:before="160" w:after="40"/>
+        <w:rPr>
+          <w:rFonts w:ascii="Times New Roman" w:hAnsi="Times New Roman" w:cs="Times New Roman"/>
+          <w:color w:val="000000" w:themeColor="text1"/>
+        </w:rPr>
+      </w:pPr>
+      <w:r>
+        <w:rPr>
+          <w:rFonts w:ascii="Times New Roman" w:hAnsi="Times New Roman" w:cs="Times New Roman"/>
+          <w:color w:val="000000" w:themeColor="text1"/>
+        </w:rPr>
+        <w:t>2. License</w:t>
       </w:r>
     </w:p>
     <w:p>
       <w:pPr>
-        <w:spacing w:before="160" w:after="40"/>
-        <w:rPr>
-          <w:rFonts w:ascii="Times New Roman" w:hAnsi="Times New Roman" w:cs="Times New Roman"/>
-          <w:color w:val="000000" w:themeColor="text1"/>
-        </w:rPr>
-      </w:pPr>
-      <w:r>
-        <w:rPr>
-          <w:rFonts w:ascii="Times New Roman" w:hAnsi="Times New Roman" w:cs="Times New Roman"/>
-          <w:color w:val="000000" w:themeColor="text1"/>
-        </w:rPr>
-        <w:t>1. Confidentiality</w:t>
+        <w:spacing w:after="60"/>
+        <w:rPr>
+          <w:rFonts w:ascii="Times New Roman" w:hAnsi="Times New Roman" w:cs="Times New Roman"/>
+        </w:rPr>
+      </w:pPr>
+      <w:r>
+        <w:rPr>
+          <w:rFonts w:ascii="Times New Roman" w:hAnsi="Times New Roman" w:cs="Times New Roman"/>
+        </w:rPr>
+        <w:t>You are responsible for holding valid licenses for any Operating System software required.</w:t>
       </w:r>
     </w:p>
     <w:p>
       <w:pPr>
-        <w:spacing w:after="60"/>
-        <w:rPr>
-          <w:rFonts w:ascii="Times New Roman" w:hAnsi="Times New Roman" w:cs="Times New Roman"/>
-        </w:rPr>
-      </w:pPr>
-      <w:r>
-        <w:rPr>
-          <w:rFonts w:ascii="Times New Roman" w:hAnsi="Times New Roman" w:cs="Times New Roman"/>
-        </w:rPr>
-        <w:t>BlechTek Software Solutions LLP agrees to maintain the confidentiality of all insights gained into your organization.</w:t>
+        <w:spacing w:before="160" w:after="40"/>
+        <w:rPr>
+          <w:rFonts w:ascii="Times New Roman" w:hAnsi="Times New Roman" w:cs="Times New Roman"/>
+          <w:color w:val="000000" w:themeColor="text1"/>
+        </w:rPr>
+      </w:pPr>
+      <w:r>
+        <w:rPr>
+          <w:rFonts w:ascii="Times New Roman" w:hAnsi="Times New Roman" w:cs="Times New Roman"/>
+          <w:color w:val="000000" w:themeColor="text1"/>
+        </w:rPr>
+        <w:t>3. Ownership of Source Code</w:t>
       </w:r>
     </w:p>
     <w:p>
       <w:pPr>
-        <w:spacing w:before="160" w:after="40"/>
-        <w:rPr>
-          <w:rFonts w:ascii="Times New Roman" w:hAnsi="Times New Roman" w:cs="Times New Roman"/>
-          <w:color w:val="000000" w:themeColor="text1"/>
-        </w:rPr>
-      </w:pPr>
-      <w:r>
-        <w:rPr>
-          <w:rFonts w:ascii="Times New Roman" w:hAnsi="Times New Roman" w:cs="Times New Roman"/>
-          <w:color w:val="000000" w:themeColor="text1"/>
-        </w:rPr>
-        <w:t>2. License</w:t>
+        <w:spacing w:after="60"/>
+        <w:rPr>
+          <w:rFonts w:ascii="Times New Roman" w:hAnsi="Times New Roman" w:cs="Times New Roman"/>
+        </w:rPr>
+      </w:pPr>
+      <w:r>
+        <w:rPr>
+          <w:rFonts w:ascii="Times New Roman" w:hAnsi="Times New Roman" w:cs="Times New Roman"/>
+        </w:rPr>
+        <w:t>Source Code remains the property of BlechTek Software Solutions LLP. The customer shall not claim any right in or to any patent, copyright, trademark or other proprietary right of the original manufacturer, developer or licensor. The software, hardware or other goods supplied are in accordance with the export laws of the respective countries, and diversion contrary to these laws or regulations is prohibited.</w:t>
       </w:r>
     </w:p>
     <w:p>
       <w:pPr>
-        <w:spacing w:after="60"/>
-        <w:rPr>
-          <w:rFonts w:ascii="Times New Roman" w:hAnsi="Times New Roman" w:cs="Times New Roman"/>
-        </w:rPr>
-      </w:pPr>
-      <w:r>
-        <w:rPr>
-          <w:rFonts w:ascii="Times New Roman" w:hAnsi="Times New Roman" w:cs="Times New Roman"/>
-        </w:rPr>
-        <w:t>You are responsible for holding valid licenses for any Operating System software required.</w:t>
+        <w:spacing w:before="160" w:after="40"/>
+        <w:rPr>
+          <w:rFonts w:ascii="Times New Roman" w:hAnsi="Times New Roman" w:cs="Times New Roman"/>
+          <w:color w:val="000000" w:themeColor="text1"/>
+        </w:rPr>
+      </w:pPr>
+      <w:r>
+        <w:rPr>
+          <w:rFonts w:ascii="Times New Roman" w:hAnsi="Times New Roman" w:cs="Times New Roman"/>
+          <w:color w:val="000000" w:themeColor="text1"/>
+        </w:rPr>
+        <w:t>4. Warranty</w:t>
       </w:r>
     </w:p>
     <w:p>
@@ -4873,29 +5890,29 @@
         <w:spacing w:before="160" w:after="40"/>
         <w:rPr>
           <w:rFonts w:ascii="Times New Roman" w:hAnsi="Times New Roman" w:cs="Times New Roman"/>
-          <w:color w:val="000000" w:themeColor="text1"/>
-        </w:rPr>
-      </w:pPr>
-      <w:r>
-        <w:rPr>
-          <w:rFonts w:ascii="Times New Roman" w:hAnsi="Times New Roman" w:cs="Times New Roman"/>
-          <w:color w:val="000000" w:themeColor="text1"/>
-        </w:rPr>
-        <w:t>3. Ownership of Source Code</w:t>
+        </w:rPr>
+      </w:pPr>
+      <w:r>
+        <w:rPr>
+          <w:rFonts w:ascii="Times New Roman" w:hAnsi="Times New Roman" w:cs="Times New Roman"/>
+        </w:rPr>
+        <w:t xml:space="preserve">BlechTek Software Solutions LLP offers a Standard Warranty against Development defects for the period of 3 Months from the Date of Installation. And BlechTek Software Solutions LLP is not responsible for the loss of Data due to any Platform related or Cyber Security Issues or Virus problems. </w:t>
       </w:r>
     </w:p>
     <w:p>
       <w:pPr>
-        <w:spacing w:after="60"/>
-        <w:rPr>
-          <w:rFonts w:ascii="Times New Roman" w:hAnsi="Times New Roman" w:cs="Times New Roman"/>
-        </w:rPr>
-      </w:pPr>
-      <w:r>
-        <w:rPr>
-          <w:rFonts w:ascii="Times New Roman" w:hAnsi="Times New Roman" w:cs="Times New Roman"/>
-        </w:rPr>
-        <w:t>Source Code remains the property of BlechTek Software Solutions LLP. The customer shall not claim any right in or to any patent, copyright, trademark or other proprietary right of the original manufacturer, developer or licensor. The software, hardware or other goods supplied are in accordance with the export laws of the respective countries, and diversion contrary to these laws or regulations is prohibited.</w:t>
+        <w:spacing w:before="160" w:after="40"/>
+        <w:rPr>
+          <w:rFonts w:ascii="Times New Roman" w:hAnsi="Times New Roman" w:cs="Times New Roman"/>
+          <w:color w:val="000000" w:themeColor="text1"/>
+        </w:rPr>
+      </w:pPr>
+      <w:r>
+        <w:rPr>
+          <w:rFonts w:ascii="Times New Roman" w:hAnsi="Times New Roman" w:cs="Times New Roman"/>
+          <w:color w:val="000000" w:themeColor="text1"/>
+        </w:rPr>
+        <w:t>5. Installation of Software</w:t>
       </w:r>
     </w:p>
     <w:p>
@@ -4903,29 +5920,41 @@
         <w:spacing w:before="160" w:after="40"/>
         <w:rPr>
           <w:rFonts w:ascii="Times New Roman" w:hAnsi="Times New Roman" w:cs="Times New Roman"/>
-          <w:color w:val="000000" w:themeColor="text1"/>
-        </w:rPr>
-      </w:pPr>
-      <w:r>
-        <w:rPr>
-          <w:rFonts w:ascii="Times New Roman" w:hAnsi="Times New Roman" w:cs="Times New Roman"/>
-          <w:color w:val="000000" w:themeColor="text1"/>
-        </w:rPr>
-        <w:t>4. Warranty</w:t>
+        </w:rPr>
+      </w:pPr>
+      <w:r>
+        <w:rPr>
+          <w:rFonts w:ascii="Times New Roman" w:hAnsi="Times New Roman" w:cs="Times New Roman"/>
+          <w:u w:val="single" w:color="000000"/>
+        </w:rPr>
+        <w:t>Definition</w:t>
+      </w:r>
+      <w:r>
+        <w:rPr>
+          <w:rFonts w:ascii="Times New Roman" w:hAnsi="Times New Roman" w:cs="Times New Roman"/>
+        </w:rPr>
+        <w:t>: The Software will be considered as installed when it is loaded on the Server.</w:t>
       </w:r>
     </w:p>
     <w:p>
       <w:pPr>
-        <w:spacing w:before="160" w:after="40"/>
-        <w:rPr>
-          <w:rFonts w:ascii="Times New Roman" w:hAnsi="Times New Roman" w:cs="Times New Roman"/>
-        </w:rPr>
-      </w:pPr>
-      <w:r>
-        <w:rPr>
-          <w:rFonts w:ascii="Times New Roman" w:hAnsi="Times New Roman" w:cs="Times New Roman"/>
-        </w:rPr>
-        <w:t xml:space="preserve">BlechTek Software Solutions LLP offers a Standard Warranty against Development defects for the period of 3 Months from the Date of Installation. And BlechTek Software Solutions LLP is not responsible for the loss of Data due to any Platform related or Cyber Security Issues or Virus problems. </w:t>
+        <w:ind w:right="273"/>
+        <w:rPr>
+          <w:rFonts w:ascii="Times New Roman" w:hAnsi="Times New Roman" w:cs="Times New Roman"/>
+        </w:rPr>
+      </w:pPr>
+      <w:r>
+        <w:rPr>
+          <w:rFonts w:ascii="Times New Roman" w:hAnsi="Times New Roman" w:cs="Times New Roman"/>
+          <w:u w:val="single" w:color="000000"/>
+        </w:rPr>
+        <w:t>Installation pre-requisites (in case of on-premise Server)</w:t>
+      </w:r>
+      <w:r>
+        <w:rPr>
+          <w:rFonts w:ascii="Times New Roman" w:hAnsi="Times New Roman" w:cs="Times New Roman"/>
+        </w:rPr>
+        <w:t xml:space="preserve">: We will install the Software only after we receive the Site readiness report from you. A Copy of which will be forwarded to you along with our Order Acceptance / Request for Installation. </w:t>
       </w:r>
     </w:p>
     <w:p>
@@ -4941,104 +5970,56 @@
           <w:rFonts w:ascii="Times New Roman" w:hAnsi="Times New Roman" w:cs="Times New Roman"/>
           <w:color w:val="000000" w:themeColor="text1"/>
         </w:rPr>
-        <w:t>5. Installation of Software</w:t>
+        <w:t>6. Excused Performance</w:t>
       </w:r>
     </w:p>
     <w:p>
       <w:pPr>
-        <w:spacing w:before="160" w:after="40"/>
-        <w:rPr>
-          <w:rFonts w:ascii="Times New Roman" w:hAnsi="Times New Roman" w:cs="Times New Roman"/>
-        </w:rPr>
-      </w:pPr>
-      <w:r>
-        <w:rPr>
-          <w:rFonts w:ascii="Times New Roman" w:hAnsi="Times New Roman" w:cs="Times New Roman"/>
-          <w:u w:val="single" w:color="000000"/>
-        </w:rPr>
-        <w:t>Definition</w:t>
-      </w:r>
-      <w:r>
-        <w:rPr>
-          <w:rFonts w:ascii="Times New Roman" w:hAnsi="Times New Roman" w:cs="Times New Roman"/>
-        </w:rPr>
-        <w:t>: The Software will be considered as installed when it is loaded on the Server.</w:t>
+        <w:spacing w:after="60"/>
+        <w:rPr>
+          <w:rFonts w:ascii="Times New Roman" w:hAnsi="Times New Roman" w:cs="Times New Roman"/>
+        </w:rPr>
+      </w:pPr>
+      <w:r>
+        <w:rPr>
+          <w:rFonts w:ascii="Times New Roman" w:hAnsi="Times New Roman" w:cs="Times New Roman"/>
+        </w:rPr>
+        <w:lastRenderedPageBreak/>
+        <w:t xml:space="preserve">BlechTek shall not be liable or deemed to be in default for any delay or failure in performance under this Contract or interruption of services due to strike or </w:t>
+      </w:r>
+      <w:r>
+        <w:rPr>
+          <w:rFonts w:ascii="Times New Roman" w:hAnsi="Times New Roman" w:cs="Times New Roman"/>
+        </w:rPr>
+        <w:t>labour</w:t>
+      </w:r>
+      <w:r>
+        <w:rPr>
+          <w:rFonts w:ascii="Times New Roman" w:hAnsi="Times New Roman" w:cs="Times New Roman"/>
+        </w:rPr>
+        <w:t xml:space="preserve"> disputes, riots, war, fire, acts of God or governmental regulations. BlechTek should not be held responsible, directly or indirectly for </w:t>
+      </w:r>
+      <w:r>
+        <w:rPr>
+          <w:rFonts w:ascii="Times New Roman" w:hAnsi="Times New Roman" w:cs="Times New Roman"/>
+        </w:rPr>
+        <w:t>non-performance</w:t>
+      </w:r>
+      <w:r>
+        <w:rPr>
+          <w:rFonts w:ascii="Times New Roman" w:hAnsi="Times New Roman" w:cs="Times New Roman"/>
+        </w:rPr>
+        <w:t xml:space="preserve"> of our software due to failure or malfunction of computer or telecommunications hardware, network or related equipment at your installation site.</w:t>
       </w:r>
     </w:p>
     <w:p>
       <w:pPr>
-        <w:ind w:right="273"/>
-        <w:rPr>
-          <w:rFonts w:ascii="Times New Roman" w:hAnsi="Times New Roman" w:cs="Times New Roman"/>
-        </w:rPr>
-      </w:pPr>
-      <w:r>
-        <w:rPr>
-          <w:rFonts w:ascii="Times New Roman" w:hAnsi="Times New Roman" w:cs="Times New Roman"/>
-          <w:u w:val="single" w:color="000000"/>
-        </w:rPr>
-        <w:t>Installation pre-requisites (in case of on-premise Server)</w:t>
-      </w:r>
-      <w:r>
-        <w:rPr>
-          <w:rFonts w:ascii="Times New Roman" w:hAnsi="Times New Roman" w:cs="Times New Roman"/>
-        </w:rPr>
-        <w:t xml:space="preserve">: We will install the Software only after we receive the Site readiness report from you. A Copy of which will be forwarded to you along with our Order Acceptance / Request for Installation. </w:t>
-      </w:r>
-    </w:p>
-    <w:p>
-      <w:pPr>
         <w:spacing w:before="160" w:after="40"/>
         <w:rPr>
           <w:rFonts w:ascii="Times New Roman" w:hAnsi="Times New Roman" w:cs="Times New Roman"/>
           <w:color w:val="000000" w:themeColor="text1"/>
         </w:rPr>
       </w:pPr>
-      <w:r>
-        <w:rPr>
-          <w:rFonts w:ascii="Times New Roman" w:hAnsi="Times New Roman" w:cs="Times New Roman"/>
-          <w:color w:val="000000" w:themeColor="text1"/>
-        </w:rPr>
-        <w:t>6. Excused Performance</w:t>
-      </w:r>
-    </w:p>
-    <w:p>
-      <w:pPr>
-        <w:spacing w:after="60"/>
-        <w:rPr>
-          <w:rFonts w:ascii="Times New Roman" w:hAnsi="Times New Roman" w:cs="Times New Roman"/>
-        </w:rPr>
-      </w:pPr>
-      <w:r>
-        <w:rPr>
-          <w:rFonts w:ascii="Times New Roman" w:hAnsi="Times New Roman" w:cs="Times New Roman"/>
-        </w:rPr>
-        <w:t xml:space="preserve">BlechTek shall not be liable or deemed to be in default for any delay or failure in performance under this Contract or interruption of services due to strike or </w:t>
-      </w:r>
-      <w:r>
-        <w:rPr>
-          <w:rFonts w:ascii="Times New Roman" w:hAnsi="Times New Roman" w:cs="Times New Roman"/>
-        </w:rPr>
-        <w:t>labour</w:t>
-      </w:r>
-      <w:r>
-        <w:rPr>
-          <w:rFonts w:ascii="Times New Roman" w:hAnsi="Times New Roman" w:cs="Times New Roman"/>
-        </w:rPr>
-        <w:t xml:space="preserve"> disputes, riots, war, fire, acts of God or governmental regulations. BlechTek should not be held responsible, directly or indirectly for </w:t>
-      </w:r>
-      <w:r>
-        <w:rPr>
-          <w:rFonts w:ascii="Times New Roman" w:hAnsi="Times New Roman" w:cs="Times New Roman"/>
-        </w:rPr>
-        <w:t>non-performance</w:t>
-      </w:r>
-      <w:r>
-        <w:rPr>
-          <w:rFonts w:ascii="Times New Roman" w:hAnsi="Times New Roman" w:cs="Times New Roman"/>
-        </w:rPr>
-        <w:t xml:space="preserve"> of our software due to failure or malfunction of computer or telecommunications hardware, network or related equipment at your installation site.</w:t>
-      </w:r>
     </w:p>
     <w:p>
       <w:pPr>
@@ -5145,7 +6126,6 @@
           <w:rFonts w:ascii="Times New Roman" w:hAnsi="Times New Roman" w:cs="Times New Roman"/>
           <w:color w:val="000000" w:themeColor="text1"/>
         </w:rPr>
-        <w:lastRenderedPageBreak/>
         <w:t>8. TDS</w:t>
       </w:r>
     </w:p>
@@ -5192,24 +6172,6 @@
         </w:rPr>
         <w:t>This offer is valid up to {{VALIDATION_DATE}}.</w:t>
       </w:r>
-    </w:p>
-    <w:p>
-      <w:pPr>
-        <w:spacing w:before="160" w:after="40"/>
-        <w:rPr>
-          <w:rFonts w:ascii="Times New Roman" w:hAnsi="Times New Roman" w:cs="Times New Roman"/>
-          <w:color w:val="000000" w:themeColor="text1"/>
-        </w:rPr>
-      </w:pPr>
-    </w:p>
-    <w:p>
-      <w:pPr>
-        <w:spacing w:before="160" w:after="40"/>
-        <w:rPr>
-          <w:rFonts w:ascii="Times New Roman" w:hAnsi="Times New Roman" w:cs="Times New Roman"/>
-          <w:color w:val="000000" w:themeColor="text1"/>
-        </w:rPr>
-      </w:pPr>
     </w:p>
     <w:p>
       <w:pPr>
@@ -6571,7 +7533,7 @@
   <w:style w:type="paragraph" w:default="1" w:styleId="Normal">
     <w:name w:val="Normal"/>
     <w:qFormat/>
-    <w:rsid w:val="00BC150E"/>
+    <w:rsid w:val="007F787B"/>
   </w:style>
   <w:style w:type="paragraph" w:styleId="Heading1">
     <w:name w:val="heading 1"/>

</xml_diff>

<commit_message>
updates in word template
</commit_message>
<xml_diff>
--- a/QuotationApp.API/Templates/QuotationTemplate_Updated - Copy.docx
+++ b/QuotationApp.API/Templates/QuotationTemplate_Updated - Copy.docx
@@ -42,9 +42,212 @@
         <w:t xml:space="preserve"> - {{OrganizationName}}</w:t>
       </w:r>
     </w:p>
+    <w:tbl>
+      <w:tblPr>
+        <w:tblStyle w:val="TableGrid"/>
+        <w:tblW w:w="10154" w:type="dxa"/>
+        <w:tblInd w:w="5" w:type="dxa"/>
+        <w:tblLook w:val="04A0" w:firstRow="1" w:lastRow="0" w:firstColumn="1" w:lastColumn="0" w:noHBand="0" w:noVBand="1"/>
+      </w:tblPr>
+      <w:tblGrid>
+        <w:gridCol w:w="7019"/>
+        <w:gridCol w:w="3135"/>
+      </w:tblGrid>
+      <w:tr>
+        <w:trPr>
+          <w:trHeight w:val="341"/>
+        </w:trPr>
+        <w:tc>
+          <w:tcPr>
+            <w:tcW w:w="7019" w:type="dxa"/>
+          </w:tcPr>
+          <w:p>
+            <w:pPr>
+              <w:spacing w:line="360" w:lineRule="auto"/>
+            </w:pPr>
+            <w:r>
+              <w:rPr>
+                <w:rFonts w:ascii="Times New Roman" w:hAnsi="Times New Roman" w:cs="Times New Roman"/>
+                <w:color w:val="000000" w:themeColor="text1"/>
+                <w:sz w:val="18"/>
+                <w:szCs w:val="18"/>
+              </w:rPr>
+              <w:t xml:space="preserve">Name: </w:t>
+            </w:r>
+            <w:r>
+              <w:rPr>
+                <w:rFonts w:ascii="Times New Roman" w:hAnsi="Times New Roman" w:cs="Times New Roman"/>
+                <w:color w:val="65AADB"/>
+                <w:sz w:val="18"/>
+                <w:szCs w:val="18"/>
+              </w:rPr>
+              <w:t>{{CONTACT_NAME}}</w:t>
+            </w:r>
+          </w:p>
+        </w:tc>
+        <w:tc>
+          <w:tcPr>
+            <w:tcW w:w="3135" w:type="dxa"/>
+          </w:tcPr>
+          <w:p>
+            <w:pPr>
+              <w:spacing w:line="360" w:lineRule="auto"/>
+            </w:pPr>
+            <w:r>
+              <w:rPr>
+                <w:rFonts w:ascii="Times New Roman" w:hAnsi="Times New Roman" w:cs="Times New Roman"/>
+                <w:color w:val="000000" w:themeColor="text1"/>
+                <w:sz w:val="18"/>
+                <w:szCs w:val="18"/>
+                <w:lang w:val="en-US"/>
+              </w:rPr>
+              <w:t xml:space="preserve">Quotation No: </w:t>
+            </w:r>
+            <w:r>
+              <w:rPr>
+                <w:rFonts w:ascii="Times New Roman" w:hAnsi="Times New Roman" w:cs="Times New Roman"/>
+                <w:color w:val="65AADB"/>
+                <w:sz w:val="18"/>
+                <w:szCs w:val="18"/>
+              </w:rPr>
+              <w:t>{{QuotationNo}}</w:t>
+            </w:r>
+          </w:p>
+        </w:tc>
+      </w:tr>
+      <w:tr>
+        <w:trPr>
+          <w:trHeight w:val="341"/>
+        </w:trPr>
+        <w:tc>
+          <w:tcPr>
+            <w:tcW w:w="7019" w:type="dxa"/>
+          </w:tcPr>
+          <w:p>
+            <w:pPr>
+              <w:spacing w:line="360" w:lineRule="auto"/>
+            </w:pPr>
+            <w:r>
+              <w:rPr>
+                <w:rFonts w:ascii="Times New Roman" w:hAnsi="Times New Roman" w:cs="Times New Roman"/>
+                <w:color w:val="000000" w:themeColor="text1"/>
+                <w:sz w:val="18"/>
+                <w:szCs w:val="18"/>
+              </w:rPr>
+              <w:t xml:space="preserve">Address: </w:t>
+            </w:r>
+            <w:r>
+              <w:rPr>
+                <w:rFonts w:ascii="Times New Roman" w:hAnsi="Times New Roman" w:cs="Times New Roman"/>
+                <w:color w:val="65AADB"/>
+                <w:sz w:val="18"/>
+                <w:szCs w:val="18"/>
+              </w:rPr>
+              <w:t>{{CONTACT_ADDRESS}}</w:t>
+            </w:r>
+          </w:p>
+        </w:tc>
+        <w:tc>
+          <w:tcPr>
+            <w:tcW w:w="3135" w:type="dxa"/>
+          </w:tcPr>
+          <w:p>
+            <w:pPr>
+              <w:spacing w:line="360" w:lineRule="auto"/>
+            </w:pPr>
+            <w:r>
+              <w:rPr>
+                <w:rFonts w:ascii="Times New Roman" w:hAnsi="Times New Roman" w:cs="Times New Roman"/>
+                <w:color w:val="000000" w:themeColor="text1"/>
+                <w:sz w:val="18"/>
+                <w:szCs w:val="18"/>
+                <w:lang w:val="en-US"/>
+              </w:rPr>
+              <w:t xml:space="preserve">Date: </w:t>
+            </w:r>
+            <w:r>
+              <w:rPr>
+                <w:rFonts w:ascii="Times New Roman" w:hAnsi="Times New Roman" w:cs="Times New Roman"/>
+                <w:color w:val="65AADB"/>
+                <w:sz w:val="18"/>
+                <w:szCs w:val="18"/>
+              </w:rPr>
+              <w:t>{{Date}}</w:t>
+            </w:r>
+          </w:p>
+        </w:tc>
+      </w:tr>
+      <w:tr>
+        <w:trPr>
+          <w:trHeight w:val="414"/>
+        </w:trPr>
+        <w:tc>
+          <w:tcPr>
+            <w:tcW w:w="7019" w:type="dxa"/>
+          </w:tcPr>
+          <w:p>
+            <w:pPr>
+              <w:spacing w:after="200" w:line="360" w:lineRule="auto"/>
+              <w:rPr>
+                <w:rFonts w:ascii="Times New Roman" w:hAnsi="Times New Roman" w:cs="Times New Roman"/>
+                <w:color w:val="000000" w:themeColor="text1"/>
+                <w:sz w:val="18"/>
+                <w:szCs w:val="18"/>
+              </w:rPr>
+            </w:pPr>
+            <w:r>
+              <w:rPr>
+                <w:rFonts w:ascii="Times New Roman" w:hAnsi="Times New Roman" w:cs="Times New Roman"/>
+                <w:color w:val="000000" w:themeColor="text1"/>
+                <w:sz w:val="18"/>
+                <w:szCs w:val="18"/>
+              </w:rPr>
+              <w:t xml:space="preserve">Contact No.: </w:t>
+            </w:r>
+            <w:r>
+              <w:rPr>
+                <w:rFonts w:ascii="Times New Roman" w:hAnsi="Times New Roman" w:cs="Times New Roman"/>
+                <w:color w:val="65AADB"/>
+                <w:sz w:val="18"/>
+                <w:szCs w:val="18"/>
+              </w:rPr>
+              <w:t xml:space="preserve">{{CONTACT_PHONE}}  </w:t>
+            </w:r>
+            <w:r>
+              <w:rPr>
+                <w:rFonts w:ascii="Times New Roman" w:hAnsi="Times New Roman" w:cs="Times New Roman"/>
+                <w:color w:val="000000" w:themeColor="text1"/>
+                <w:sz w:val="18"/>
+                <w:szCs w:val="18"/>
+              </w:rPr>
+              <w:t xml:space="preserve">|   Email: </w:t>
+            </w:r>
+            <w:r>
+              <w:rPr>
+                <w:rFonts w:ascii="Times New Roman" w:hAnsi="Times New Roman" w:cs="Times New Roman"/>
+                <w:color w:val="65AADB"/>
+                <w:sz w:val="18"/>
+                <w:szCs w:val="18"/>
+              </w:rPr>
+              <w:t>{{CONTACT_EMAIL}}</w:t>
+            </w:r>
+          </w:p>
+        </w:tc>
+        <w:tc>
+          <w:tcPr>
+            <w:tcW w:w="3135" w:type="dxa"/>
+          </w:tcPr>
+          <w:p>
+            <w:pPr>
+              <w:spacing w:line="360" w:lineRule="auto"/>
+            </w:pPr>
+          </w:p>
+        </w:tc>
+      </w:tr>
+    </w:tbl>
     <w:p>
       <w:pPr>
-        <w:spacing w:line="360" w:lineRule="auto"/>
+        <w:spacing w:after="200"/>
         <w:rPr>
           <w:rFonts w:ascii="Times New Roman" w:hAnsi="Times New Roman" w:cs="Times New Roman"/>
           <w:color w:val="000000" w:themeColor="text1"/>
@@ -59,344 +262,6 @@
           <w:sz w:val="18"/>
           <w:szCs w:val="18"/>
         </w:rPr>
-        <w:t xml:space="preserve">Name: </w:t>
-      </w:r>
-      <w:r>
-        <w:rPr>
-          <w:rFonts w:ascii="Times New Roman" w:hAnsi="Times New Roman" w:cs="Times New Roman"/>
-          <w:color w:val="65AADB"/>
-          <w:sz w:val="18"/>
-          <w:szCs w:val="18"/>
-        </w:rPr>
-        <w:t>{{CONTACT_NAME}}</w:t>
-      </w:r>
-      <w:r>
-        <w:rPr>
-          <w:rFonts w:ascii="Times New Roman" w:hAnsi="Times New Roman" w:cs="Times New Roman"/>
-          <w:color w:val="000000" w:themeColor="text1"/>
-          <w:sz w:val="18"/>
-          <w:szCs w:val="18"/>
-        </w:rPr>
-        <w:tab/>
-      </w:r>
-      <w:r>
-        <w:rPr>
-          <w:rFonts w:ascii="Times New Roman" w:hAnsi="Times New Roman" w:cs="Times New Roman"/>
-          <w:color w:val="000000" w:themeColor="text1"/>
-          <w:sz w:val="18"/>
-          <w:szCs w:val="18"/>
-        </w:rPr>
-        <w:tab/>
-      </w:r>
-      <w:r>
-        <w:rPr>
-          <w:rFonts w:ascii="Times New Roman" w:hAnsi="Times New Roman" w:cs="Times New Roman"/>
-          <w:color w:val="000000" w:themeColor="text1"/>
-          <w:sz w:val="18"/>
-          <w:szCs w:val="18"/>
-        </w:rPr>
-        <w:tab/>
-      </w:r>
-      <w:r>
-        <w:rPr>
-          <w:rFonts w:ascii="Times New Roman" w:hAnsi="Times New Roman" w:cs="Times New Roman"/>
-          <w:color w:val="000000" w:themeColor="text1"/>
-          <w:sz w:val="18"/>
-          <w:szCs w:val="18"/>
-        </w:rPr>
-        <w:tab/>
-      </w:r>
-      <w:r>
-        <w:rPr>
-          <w:rFonts w:ascii="Times New Roman" w:hAnsi="Times New Roman" w:cs="Times New Roman"/>
-          <w:color w:val="000000" w:themeColor="text1"/>
-          <w:sz w:val="18"/>
-          <w:szCs w:val="18"/>
-        </w:rPr>
-        <w:tab/>
-      </w:r>
-      <w:r>
-        <w:rPr>
-          <w:rFonts w:ascii="Times New Roman" w:hAnsi="Times New Roman" w:cs="Times New Roman"/>
-          <w:color w:val="000000" w:themeColor="text1"/>
-          <w:sz w:val="18"/>
-          <w:szCs w:val="18"/>
-        </w:rPr>
-        <w:tab/>
-      </w:r>
-      <w:r>
-        <w:rPr>
-          <w:rFonts w:ascii="Times New Roman" w:hAnsi="Times New Roman" w:cs="Times New Roman"/>
-          <w:color w:val="000000" w:themeColor="text1"/>
-          <w:sz w:val="18"/>
-          <w:szCs w:val="18"/>
-        </w:rPr>
-        <w:tab/>
-      </w:r>
-      <w:r>
-        <w:rPr>
-          <w:rFonts w:ascii="Times New Roman" w:hAnsi="Times New Roman" w:cs="Times New Roman"/>
-          <w:color w:val="000000" w:themeColor="text1"/>
-          <w:sz w:val="18"/>
-          <w:szCs w:val="18"/>
-          <w:lang w:val="en-US"/>
-        </w:rPr>
-        <w:t>Quotation No:</w:t>
-      </w:r>
-      <w:r>
-        <w:rPr>
-          <w:rFonts w:ascii="Times New Roman" w:hAnsi="Times New Roman" w:cs="Times New Roman"/>
-          <w:color w:val="000000" w:themeColor="text1"/>
-          <w:sz w:val="18"/>
-          <w:szCs w:val="18"/>
-          <w:lang w:val="en-US"/>
-        </w:rPr>
-        <w:t xml:space="preserve"> </w:t>
-      </w:r>
-      <w:r>
-        <w:rPr>
-          <w:rFonts w:ascii="Times New Roman" w:hAnsi="Times New Roman" w:cs="Times New Roman"/>
-          <w:color w:val="65AADB"/>
-          <w:sz w:val="18"/>
-          <w:szCs w:val="18"/>
-        </w:rPr>
-        <w:t>{{QuotationNo}}</w:t>
-      </w:r>
-    </w:p>
-    <w:p>
-      <w:pPr>
-        <w:spacing w:line="360" w:lineRule="auto"/>
-        <w:rPr>
-          <w:rFonts w:ascii="Times New Roman" w:hAnsi="Times New Roman" w:cs="Times New Roman"/>
-          <w:color w:val="000000" w:themeColor="text1"/>
-          <w:sz w:val="18"/>
-          <w:szCs w:val="18"/>
-          <w:lang w:val="en-US"/>
-        </w:rPr>
-      </w:pPr>
-      <w:r>
-        <w:rPr>
-          <w:rFonts w:ascii="Times New Roman" w:hAnsi="Times New Roman" w:cs="Times New Roman"/>
-          <w:color w:val="000000" w:themeColor="text1"/>
-          <w:sz w:val="18"/>
-          <w:szCs w:val="18"/>
-          <w:lang w:val="en-US"/>
-        </w:rPr>
-        <w:t xml:space="preserve">  </w:t>
-      </w:r>
-      <w:r>
-        <w:rPr>
-          <w:rFonts w:ascii="Times New Roman" w:hAnsi="Times New Roman" w:cs="Times New Roman"/>
-          <w:color w:val="000000" w:themeColor="text1"/>
-          <w:sz w:val="18"/>
-          <w:szCs w:val="18"/>
-          <w:lang w:val="en-US"/>
-        </w:rPr>
-        <w:tab/>
-      </w:r>
-      <w:r>
-        <w:rPr>
-          <w:rFonts w:ascii="Times New Roman" w:hAnsi="Times New Roman" w:cs="Times New Roman"/>
-          <w:color w:val="000000" w:themeColor="text1"/>
-          <w:sz w:val="18"/>
-          <w:szCs w:val="18"/>
-          <w:lang w:val="en-US"/>
-        </w:rPr>
-        <w:tab/>
-      </w:r>
-      <w:r>
-        <w:rPr>
-          <w:rFonts w:ascii="Times New Roman" w:hAnsi="Times New Roman" w:cs="Times New Roman"/>
-          <w:color w:val="000000" w:themeColor="text1"/>
-          <w:sz w:val="18"/>
-          <w:szCs w:val="18"/>
-          <w:lang w:val="en-US"/>
-        </w:rPr>
-        <w:tab/>
-      </w:r>
-      <w:r>
-        <w:rPr>
-          <w:rFonts w:ascii="Times New Roman" w:hAnsi="Times New Roman" w:cs="Times New Roman"/>
-          <w:color w:val="000000" w:themeColor="text1"/>
-          <w:sz w:val="18"/>
-          <w:szCs w:val="18"/>
-          <w:lang w:val="en-US"/>
-        </w:rPr>
-        <w:tab/>
-      </w:r>
-      <w:r>
-        <w:rPr>
-          <w:rFonts w:ascii="Times New Roman" w:hAnsi="Times New Roman" w:cs="Times New Roman"/>
-          <w:color w:val="000000" w:themeColor="text1"/>
-          <w:sz w:val="18"/>
-          <w:szCs w:val="18"/>
-          <w:lang w:val="en-US"/>
-        </w:rPr>
-        <w:tab/>
-      </w:r>
-      <w:r>
-        <w:rPr>
-          <w:rFonts w:ascii="Times New Roman" w:hAnsi="Times New Roman" w:cs="Times New Roman"/>
-          <w:color w:val="000000" w:themeColor="text1"/>
-          <w:sz w:val="18"/>
-          <w:szCs w:val="18"/>
-          <w:lang w:val="en-US"/>
-        </w:rPr>
-        <w:tab/>
-      </w:r>
-      <w:r>
-        <w:rPr>
-          <w:rFonts w:ascii="Times New Roman" w:hAnsi="Times New Roman" w:cs="Times New Roman"/>
-          <w:color w:val="000000" w:themeColor="text1"/>
-          <w:sz w:val="18"/>
-          <w:szCs w:val="18"/>
-          <w:lang w:val="en-US"/>
-        </w:rPr>
-        <w:tab/>
-      </w:r>
-      <w:r>
-        <w:rPr>
-          <w:rFonts w:ascii="Times New Roman" w:hAnsi="Times New Roman" w:cs="Times New Roman"/>
-          <w:color w:val="000000" w:themeColor="text1"/>
-          <w:sz w:val="18"/>
-          <w:szCs w:val="18"/>
-          <w:lang w:val="en-US"/>
-        </w:rPr>
-        <w:tab/>
-      </w:r>
-      <w:r>
-        <w:rPr>
-          <w:rFonts w:ascii="Times New Roman" w:hAnsi="Times New Roman" w:cs="Times New Roman"/>
-          <w:color w:val="000000" w:themeColor="text1"/>
-          <w:sz w:val="18"/>
-          <w:szCs w:val="18"/>
-          <w:lang w:val="en-US"/>
-        </w:rPr>
-        <w:tab/>
-      </w:r>
-      <w:r>
-        <w:rPr>
-          <w:rFonts w:ascii="Times New Roman" w:hAnsi="Times New Roman" w:cs="Times New Roman"/>
-          <w:color w:val="000000" w:themeColor="text1"/>
-          <w:sz w:val="18"/>
-          <w:szCs w:val="18"/>
-          <w:lang w:val="en-US"/>
-        </w:rPr>
-        <w:tab/>
-      </w:r>
-      <w:r>
-        <w:rPr>
-          <w:rFonts w:ascii="Times New Roman" w:hAnsi="Times New Roman" w:cs="Times New Roman"/>
-          <w:color w:val="000000" w:themeColor="text1"/>
-          <w:sz w:val="18"/>
-          <w:szCs w:val="18"/>
-          <w:lang w:val="en-US"/>
-        </w:rPr>
-        <w:t xml:space="preserve">Date: </w:t>
-      </w:r>
-      <w:r>
-        <w:rPr>
-          <w:rFonts w:ascii="Times New Roman" w:hAnsi="Times New Roman" w:cs="Times New Roman"/>
-          <w:color w:val="65AADB"/>
-          <w:sz w:val="18"/>
-          <w:szCs w:val="18"/>
-        </w:rPr>
-        <w:t>{{Date}}</w:t>
-      </w:r>
-    </w:p>
-    <w:p>
-      <w:pPr>
-        <w:spacing w:after="120" w:line="240" w:lineRule="auto"/>
-        <w:rPr>
-          <w:rFonts w:ascii="Times New Roman" w:hAnsi="Times New Roman" w:cs="Times New Roman"/>
-          <w:color w:val="65AADB"/>
-          <w:sz w:val="18"/>
-          <w:szCs w:val="18"/>
-        </w:rPr>
-      </w:pPr>
-      <w:r>
-        <w:rPr>
-          <w:rFonts w:ascii="Times New Roman" w:hAnsi="Times New Roman" w:cs="Times New Roman"/>
-          <w:color w:val="000000" w:themeColor="text1"/>
-          <w:sz w:val="18"/>
-          <w:szCs w:val="18"/>
-        </w:rPr>
-        <w:t xml:space="preserve">Address: </w:t>
-      </w:r>
-      <w:r>
-        <w:rPr>
-          <w:rFonts w:ascii="Times New Roman" w:hAnsi="Times New Roman" w:cs="Times New Roman"/>
-          <w:color w:val="65AADB"/>
-          <w:sz w:val="18"/>
-          <w:szCs w:val="18"/>
-        </w:rPr>
-        <w:t>{{CONTACT_ADDRESS}}</w:t>
-      </w:r>
-    </w:p>
-    <w:p>
-      <w:pPr>
-        <w:spacing w:after="200" w:line="240" w:lineRule="auto"/>
-        <w:rPr>
-          <w:rFonts w:ascii="Times New Roman" w:hAnsi="Times New Roman" w:cs="Times New Roman"/>
-          <w:color w:val="000000" w:themeColor="text1"/>
-          <w:sz w:val="18"/>
-          <w:szCs w:val="18"/>
-        </w:rPr>
-      </w:pPr>
-      <w:r>
-        <w:rPr>
-          <w:rFonts w:ascii="Times New Roman" w:hAnsi="Times New Roman" w:cs="Times New Roman"/>
-          <w:color w:val="000000" w:themeColor="text1"/>
-          <w:sz w:val="18"/>
-          <w:szCs w:val="18"/>
-        </w:rPr>
-        <w:t xml:space="preserve">Contact No.: </w:t>
-      </w:r>
-      <w:r>
-        <w:rPr>
-          <w:rFonts w:ascii="Times New Roman" w:hAnsi="Times New Roman" w:cs="Times New Roman"/>
-          <w:color w:val="65AADB"/>
-          <w:sz w:val="18"/>
-          <w:szCs w:val="18"/>
-        </w:rPr>
-        <w:t xml:space="preserve">{{CONTACT_PHONE}}   </w:t>
-      </w:r>
-      <w:r>
-        <w:rPr>
-          <w:rFonts w:ascii="Times New Roman" w:hAnsi="Times New Roman" w:cs="Times New Roman"/>
-          <w:color w:val="000000" w:themeColor="text1"/>
-          <w:sz w:val="18"/>
-          <w:szCs w:val="18"/>
-        </w:rPr>
-        <w:t xml:space="preserve">|   Email: </w:t>
-      </w:r>
-      <w:r>
-        <w:rPr>
-          <w:rFonts w:ascii="Times New Roman" w:hAnsi="Times New Roman" w:cs="Times New Roman"/>
-          <w:color w:val="65AADB"/>
-          <w:sz w:val="18"/>
-          <w:szCs w:val="18"/>
-        </w:rPr>
-        <w:t>{{CONTACT_EMAIL}}</w:t>
-      </w:r>
-    </w:p>
-    <w:p>
-      <w:pPr>
-        <w:spacing w:after="200"/>
-        <w:rPr>
-          <w:rFonts w:ascii="Times New Roman" w:hAnsi="Times New Roman" w:cs="Times New Roman"/>
-          <w:color w:val="000000" w:themeColor="text1"/>
-          <w:sz w:val="18"/>
-          <w:szCs w:val="18"/>
-        </w:rPr>
-      </w:pPr>
-      <w:r>
-        <w:rPr>
-          <w:rFonts w:ascii="Times New Roman" w:hAnsi="Times New Roman" w:cs="Times New Roman"/>
-          <w:color w:val="000000" w:themeColor="text1"/>
-          <w:sz w:val="18"/>
-          <w:szCs w:val="18"/>
-        </w:rPr>
         <w:pict w14:anchorId="23C204BC">
           <v:rect id="_x0000_i1025" style="width:502pt;height:1.5pt;mso-position-horizontal:absolute;mso-position-horizontal-relative:text;mso-position-vertical:absolute;mso-position-vertical-relative:text" o:hralign="center" o:hrstd="t" o:hrnoshade="t" o:hr="t" fillcolor="#4e95d9 [1631]" stroked="f"/>
         </w:pict>
@@ -550,26 +415,15 @@
           <w:bCs/>
           <w:color w:val="65AADB"/>
         </w:rPr>
-        <w:t>{{ORG_</w:t>
-      </w:r>
-      <w:proofErr w:type="gramStart"/>
-      <w:r>
-        <w:rPr>
-          <w:rFonts w:ascii="Times New Roman" w:hAnsi="Times New Roman" w:cs="Times New Roman"/>
-          <w:b/>
-          <w:bCs/>
+        <w:t>{{ORG_NAME}}</w:t>
+      </w:r>
+      <w:r>
+        <w:rPr>
+          <w:rFonts w:ascii="Times New Roman" w:hAnsi="Times New Roman" w:cs="Times New Roman"/>
           <w:color w:val="65AADB"/>
         </w:rPr>
-        <w:t>NAME}}</w:t>
-      </w:r>
-      <w:r>
-        <w:rPr>
-          <w:rFonts w:ascii="Times New Roman" w:hAnsi="Times New Roman" w:cs="Times New Roman"/>
-          <w:color w:val="65AADB"/>
-        </w:rPr>
         <w:t>.</w:t>
       </w:r>
-      <w:proofErr w:type="gramEnd"/>
     </w:p>
     <w:p>
       <w:pPr>
@@ -1338,12 +1192,16 @@
               <w:rPr>
                 <w:rFonts w:ascii="Times New Roman" w:hAnsi="Times New Roman" w:cs="Times New Roman"/>
                 <w:color w:val="000000" w:themeColor="text1"/>
+                <w:sz w:val="18"/>
+                <w:szCs w:val="18"/>
               </w:rPr>
             </w:pPr>
             <w:r>
               <w:rPr>
                 <w:rFonts w:ascii="Times New Roman" w:hAnsi="Times New Roman" w:cs="Times New Roman"/>
                 <w:color w:val="000000" w:themeColor="text1"/>
+                <w:sz w:val="18"/>
+                <w:szCs w:val="18"/>
               </w:rPr>
               <w:t>{{ADD_SCOPE_REQUIREMENT}}</w:t>
             </w:r>
@@ -1359,12 +1217,16 @@
               <w:rPr>
                 <w:rFonts w:ascii="Times New Roman" w:hAnsi="Times New Roman" w:cs="Times New Roman"/>
                 <w:color w:val="000000" w:themeColor="text1"/>
+                <w:sz w:val="18"/>
+                <w:szCs w:val="18"/>
               </w:rPr>
             </w:pPr>
             <w:r>
               <w:rPr>
                 <w:rFonts w:ascii="Times New Roman" w:hAnsi="Times New Roman" w:cs="Times New Roman"/>
                 <w:color w:val="000000" w:themeColor="text1"/>
+                <w:sz w:val="18"/>
+                <w:szCs w:val="18"/>
               </w:rPr>
               <w:t>{{ADD_SCOPE_MODULE}}</w:t>
             </w:r>
@@ -1380,12 +1242,16 @@
               <w:rPr>
                 <w:rFonts w:ascii="Times New Roman" w:hAnsi="Times New Roman" w:cs="Times New Roman"/>
                 <w:color w:val="000000" w:themeColor="text1"/>
+                <w:sz w:val="18"/>
+                <w:szCs w:val="18"/>
               </w:rPr>
             </w:pPr>
             <w:r>
               <w:rPr>
                 <w:rFonts w:ascii="Times New Roman" w:hAnsi="Times New Roman" w:cs="Times New Roman"/>
                 <w:color w:val="000000" w:themeColor="text1"/>
+                <w:sz w:val="18"/>
+                <w:szCs w:val="18"/>
               </w:rPr>
               <w:t>{{ADD_SCOPE_MANPOWER}}</w:t>
             </w:r>
@@ -1401,12 +1267,16 @@
               <w:rPr>
                 <w:rFonts w:ascii="Times New Roman" w:hAnsi="Times New Roman" w:cs="Times New Roman"/>
                 <w:color w:val="000000" w:themeColor="text1"/>
+                <w:sz w:val="18"/>
+                <w:szCs w:val="18"/>
               </w:rPr>
             </w:pPr>
             <w:r>
               <w:rPr>
                 <w:rFonts w:ascii="Times New Roman" w:hAnsi="Times New Roman" w:cs="Times New Roman"/>
                 <w:color w:val="000000" w:themeColor="text1"/>
+                <w:sz w:val="18"/>
+                <w:szCs w:val="18"/>
               </w:rPr>
               <w:t>{{ADD_SCOPE_DAYS}}</w:t>
             </w:r>
@@ -1422,12 +1292,16 @@
               <w:rPr>
                 <w:rFonts w:ascii="Times New Roman" w:hAnsi="Times New Roman" w:cs="Times New Roman"/>
                 <w:color w:val="000000" w:themeColor="text1"/>
+                <w:sz w:val="18"/>
+                <w:szCs w:val="18"/>
               </w:rPr>
             </w:pPr>
             <w:r>
               <w:rPr>
                 <w:rFonts w:ascii="Times New Roman" w:hAnsi="Times New Roman" w:cs="Times New Roman"/>
                 <w:color w:val="000000" w:themeColor="text1"/>
+                <w:sz w:val="18"/>
+                <w:szCs w:val="18"/>
               </w:rPr>
               <w:t>{{ADD_SCOPE_RATE}}</w:t>
             </w:r>
@@ -1443,12 +1317,16 @@
               <w:rPr>
                 <w:rFonts w:ascii="Times New Roman" w:hAnsi="Times New Roman" w:cs="Times New Roman"/>
                 <w:color w:val="000000" w:themeColor="text1"/>
+                <w:sz w:val="18"/>
+                <w:szCs w:val="18"/>
               </w:rPr>
             </w:pPr>
             <w:r>
               <w:rPr>
                 <w:rFonts w:ascii="Times New Roman" w:hAnsi="Times New Roman" w:cs="Times New Roman"/>
                 <w:color w:val="000000" w:themeColor="text1"/>
+                <w:sz w:val="18"/>
+                <w:szCs w:val="18"/>
               </w:rPr>
               <w:t>{{ADD_SCOPE_AMOUNT}}</w:t>
             </w:r>
@@ -1755,31 +1633,6 @@
               <w:t xml:space="preserve"> Users</w:t>
             </w:r>
           </w:p>
-          <w:p>
-            <w:pPr>
-              <w:rPr>
-                <w:rFonts w:ascii="Times New Roman" w:hAnsi="Times New Roman" w:cs="Times New Roman"/>
-              </w:rPr>
-            </w:pPr>
-            <w:r>
-              <w:rPr>
-                <w:rFonts w:ascii="Times New Roman" w:hAnsi="Times New Roman" w:cs="Times New Roman"/>
-              </w:rPr>
-              <w:t>Discount ({{MODULE_DISCOUNT_PCT</w:t>
-            </w:r>
-            <w:r>
-              <w:rPr>
-                <w:rFonts w:ascii="Times New Roman" w:hAnsi="Times New Roman" w:cs="Times New Roman"/>
-              </w:rPr>
-              <w:t>}} %</w:t>
-            </w:r>
-            <w:r>
-              <w:rPr>
-                <w:rFonts w:ascii="Times New Roman" w:hAnsi="Times New Roman" w:cs="Times New Roman"/>
-              </w:rPr>
-              <w:t>):</w:t>
-            </w:r>
-          </w:p>
         </w:tc>
         <w:tc>
           <w:tcPr>
@@ -1812,19 +1665,6 @@
               </w:rPr>
             </w:pPr>
           </w:p>
-          <w:p>
-            <w:pPr>
-              <w:rPr>
-                <w:rFonts w:ascii="Times New Roman" w:hAnsi="Times New Roman" w:cs="Times New Roman"/>
-              </w:rPr>
-            </w:pPr>
-            <w:r>
-              <w:rPr>
-                <w:rFonts w:ascii="Times New Roman" w:hAnsi="Times New Roman" w:cs="Times New Roman"/>
-              </w:rPr>
-              <w:t>{{MODULE_DISCOUNT}}</w:t>
-            </w:r>
-          </w:p>
         </w:tc>
       </w:tr>
       <w:tr>
@@ -1848,12 +1688,6 @@
                 <w:rFonts w:ascii="Times New Roman" w:hAnsi="Times New Roman" w:cs="Times New Roman"/>
               </w:rPr>
             </w:pPr>
-            <w:r>
-              <w:rPr>
-                <w:rFonts w:ascii="Times New Roman" w:hAnsi="Times New Roman" w:cs="Times New Roman"/>
-              </w:rPr>
-              <w:t xml:space="preserve"> 1.1</w:t>
-            </w:r>
           </w:p>
         </w:tc>
         <w:tc>
@@ -1877,49 +1711,7 @@
               <w:rPr>
                 <w:rFonts w:ascii="Times New Roman" w:hAnsi="Times New Roman" w:cs="Times New Roman"/>
               </w:rPr>
-              <w:t>Implementation (</w:t>
-            </w:r>
-            <w:r>
-              <w:rPr>
-                <w:rFonts w:ascii="Times New Roman" w:hAnsi="Times New Roman" w:cs="Times New Roman"/>
-              </w:rPr>
-              <w:t>{{NO_OF_USERS</w:t>
-            </w:r>
-            <w:r>
-              <w:rPr>
-                <w:rFonts w:ascii="Times New Roman" w:hAnsi="Times New Roman" w:cs="Times New Roman"/>
-              </w:rPr>
-              <w:t>}}</w:t>
-            </w:r>
-            <w:r>
-              <w:rPr>
-                <w:rFonts w:ascii="Times New Roman" w:hAnsi="Times New Roman" w:cs="Times New Roman"/>
-              </w:rPr>
-              <w:t xml:space="preserve"> Man</w:t>
-            </w:r>
-            <w:r>
-              <w:rPr>
-                <w:rFonts w:ascii="Times New Roman" w:hAnsi="Times New Roman" w:cs="Times New Roman"/>
-              </w:rPr>
-              <w:t xml:space="preserve"> Day * </w:t>
-            </w:r>
-            <w:r>
-              <w:rPr>
-                <w:rFonts w:ascii="Times New Roman" w:hAnsi="Times New Roman" w:cs="Times New Roman"/>
-              </w:rPr>
-              <w:t>{{IMPL_RATE}}</w:t>
-            </w:r>
-            <w:r>
-              <w:rPr>
-                <w:rFonts w:ascii="Times New Roman" w:hAnsi="Times New Roman" w:cs="Times New Roman"/>
-              </w:rPr>
-              <w:t xml:space="preserve"> </w:t>
-            </w:r>
-            <w:r>
-              <w:rPr>
-                <w:rFonts w:ascii="Times New Roman" w:hAnsi="Times New Roman" w:cs="Times New Roman"/>
-              </w:rPr>
-              <w:t>per Man Day)</w:t>
+              <w:t>Discount ({{MODULE_DISCOUNT_PCT}} %):</w:t>
             </w:r>
           </w:p>
         </w:tc>
@@ -1944,7 +1736,7 @@
               <w:rPr>
                 <w:rFonts w:ascii="Times New Roman" w:hAnsi="Times New Roman" w:cs="Times New Roman"/>
               </w:rPr>
-              <w:t>{{IMPL_TOTAL}}</w:t>
+              <w:t>{{MODULE_DISCOUNT}}</w:t>
             </w:r>
           </w:p>
         </w:tc>
@@ -1970,6 +1762,12 @@
                 <w:rFonts w:ascii="Times New Roman" w:hAnsi="Times New Roman" w:cs="Times New Roman"/>
               </w:rPr>
             </w:pPr>
+            <w:r>
+              <w:rPr>
+                <w:rFonts w:ascii="Times New Roman" w:hAnsi="Times New Roman" w:cs="Times New Roman"/>
+              </w:rPr>
+              <w:t xml:space="preserve"> 1.1</w:t>
+            </w:r>
           </w:p>
         </w:tc>
         <w:tc>
@@ -1993,13 +1791,49 @@
               <w:rPr>
                 <w:rFonts w:ascii="Times New Roman" w:hAnsi="Times New Roman" w:cs="Times New Roman"/>
               </w:rPr>
-              <w:t>Module Subtotal</w:t>
-            </w:r>
-            <w:r>
-              <w:rPr>
-                <w:rFonts w:ascii="Times New Roman" w:hAnsi="Times New Roman" w:cs="Times New Roman"/>
-              </w:rPr>
-              <w:t>:</w:t>
+              <w:t>Implementation (</w:t>
+            </w:r>
+            <w:r>
+              <w:rPr>
+                <w:rFonts w:ascii="Times New Roman" w:hAnsi="Times New Roman" w:cs="Times New Roman"/>
+              </w:rPr>
+              <w:t>{{NO_OF_USERS</w:t>
+            </w:r>
+            <w:r>
+              <w:rPr>
+                <w:rFonts w:ascii="Times New Roman" w:hAnsi="Times New Roman" w:cs="Times New Roman"/>
+              </w:rPr>
+              <w:t>}}</w:t>
+            </w:r>
+            <w:r>
+              <w:rPr>
+                <w:rFonts w:ascii="Times New Roman" w:hAnsi="Times New Roman" w:cs="Times New Roman"/>
+              </w:rPr>
+              <w:t xml:space="preserve"> Man</w:t>
+            </w:r>
+            <w:r>
+              <w:rPr>
+                <w:rFonts w:ascii="Times New Roman" w:hAnsi="Times New Roman" w:cs="Times New Roman"/>
+              </w:rPr>
+              <w:t xml:space="preserve"> Day * </w:t>
+            </w:r>
+            <w:r>
+              <w:rPr>
+                <w:rFonts w:ascii="Times New Roman" w:hAnsi="Times New Roman" w:cs="Times New Roman"/>
+              </w:rPr>
+              <w:t>{{IMPL_RATE}}</w:t>
+            </w:r>
+            <w:r>
+              <w:rPr>
+                <w:rFonts w:ascii="Times New Roman" w:hAnsi="Times New Roman" w:cs="Times New Roman"/>
+              </w:rPr>
+              <w:t xml:space="preserve"> </w:t>
+            </w:r>
+            <w:r>
+              <w:rPr>
+                <w:rFonts w:ascii="Times New Roman" w:hAnsi="Times New Roman" w:cs="Times New Roman"/>
+              </w:rPr>
+              <w:t>per Man Day)</w:t>
             </w:r>
           </w:p>
         </w:tc>
@@ -2024,7 +1858,7 @@
               <w:rPr>
                 <w:rFonts w:ascii="Times New Roman" w:hAnsi="Times New Roman" w:cs="Times New Roman"/>
               </w:rPr>
-              <w:t>{{MODULE_SUBTOTAL}}</w:t>
+              <w:t>{{IMPL_TOTAL}}</w:t>
             </w:r>
           </w:p>
         </w:tc>
@@ -2073,7 +1907,13 @@
               <w:rPr>
                 <w:rFonts w:ascii="Times New Roman" w:hAnsi="Times New Roman" w:cs="Times New Roman"/>
               </w:rPr>
-              <w:t>Total of All Modules Final Price:</w:t>
+              <w:t>Module Subtotal</w:t>
+            </w:r>
+            <w:r>
+              <w:rPr>
+                <w:rFonts w:ascii="Times New Roman" w:hAnsi="Times New Roman" w:cs="Times New Roman"/>
+              </w:rPr>
+              <w:t>:</w:t>
             </w:r>
           </w:p>
         </w:tc>
@@ -2098,7 +1938,7 @@
               <w:rPr>
                 <w:rFonts w:ascii="Times New Roman" w:hAnsi="Times New Roman" w:cs="Times New Roman"/>
               </w:rPr>
-              <w:t>{{OVERALL_VALUE}}</w:t>
+              <w:t>{{MODULE_SUBTOTAL}}</w:t>
             </w:r>
           </w:p>
         </w:tc>
@@ -2124,12 +1964,6 @@
                 <w:rFonts w:ascii="Times New Roman" w:hAnsi="Times New Roman" w:cs="Times New Roman"/>
               </w:rPr>
             </w:pPr>
-            <w:r>
-              <w:rPr>
-                <w:rFonts w:ascii="Times New Roman" w:hAnsi="Times New Roman" w:cs="Times New Roman"/>
-              </w:rPr>
-              <w:t>2</w:t>
-            </w:r>
           </w:p>
         </w:tc>
         <w:tc>
@@ -2153,7 +1987,7 @@
               <w:rPr>
                 <w:rFonts w:ascii="Times New Roman" w:hAnsi="Times New Roman" w:cs="Times New Roman"/>
               </w:rPr>
-              <w:t>Customization</w:t>
+              <w:t>Total of All Modules Final Price:</w:t>
             </w:r>
           </w:p>
         </w:tc>
@@ -2178,7 +2012,7 @@
               <w:rPr>
                 <w:rFonts w:ascii="Times New Roman" w:hAnsi="Times New Roman" w:cs="Times New Roman"/>
               </w:rPr>
-              <w:t>TBD</w:t>
+              <w:t>{{OVERALL_VALUE}}</w:t>
             </w:r>
           </w:p>
         </w:tc>
@@ -2208,7 +2042,7 @@
               <w:rPr>
                 <w:rFonts w:ascii="Times New Roman" w:hAnsi="Times New Roman" w:cs="Times New Roman"/>
               </w:rPr>
-              <w:t xml:space="preserve"> 2.1</w:t>
+              <w:t>2</w:t>
             </w:r>
           </w:p>
         </w:tc>
@@ -2233,7 +2067,7 @@
               <w:rPr>
                 <w:rFonts w:ascii="Times New Roman" w:hAnsi="Times New Roman" w:cs="Times New Roman"/>
               </w:rPr>
-              <w:t>In case of any additional development required which will be consider 8000 per man day additional to above proposal.</w:t>
+              <w:t>Customization</w:t>
             </w:r>
           </w:p>
         </w:tc>
@@ -2254,6 +2088,12 @@
                 <w:rFonts w:ascii="Times New Roman" w:hAnsi="Times New Roman" w:cs="Times New Roman"/>
               </w:rPr>
             </w:pPr>
+            <w:r>
+              <w:rPr>
+                <w:rFonts w:ascii="Times New Roman" w:hAnsi="Times New Roman" w:cs="Times New Roman"/>
+              </w:rPr>
+              <w:t>TBD</w:t>
+            </w:r>
           </w:p>
         </w:tc>
       </w:tr>
@@ -2282,7 +2122,7 @@
               <w:rPr>
                 <w:rFonts w:ascii="Times New Roman" w:hAnsi="Times New Roman" w:cs="Times New Roman"/>
               </w:rPr>
-              <w:t>3</w:t>
+              <w:t xml:space="preserve"> 2.1</w:t>
             </w:r>
           </w:p>
         </w:tc>
@@ -2307,7 +2147,7 @@
               <w:rPr>
                 <w:rFonts w:ascii="Times New Roman" w:hAnsi="Times New Roman" w:cs="Times New Roman"/>
               </w:rPr>
-              <w:t>Renewal and Support from next year onwards</w:t>
+              <w:t>In case of any additional development required which will be consider 8000 per man day additional to above proposal.</w:t>
             </w:r>
           </w:p>
         </w:tc>
@@ -2356,19 +2196,7 @@
               <w:rPr>
                 <w:rFonts w:ascii="Times New Roman" w:hAnsi="Times New Roman" w:cs="Times New Roman"/>
               </w:rPr>
-              <w:t xml:space="preserve"> </w:t>
-            </w:r>
-            <w:r>
-              <w:rPr>
-                <w:rFonts w:ascii="Times New Roman" w:hAnsi="Times New Roman" w:cs="Times New Roman"/>
-              </w:rPr>
               <w:t>3</w:t>
-            </w:r>
-            <w:r>
-              <w:rPr>
-                <w:rFonts w:ascii="Times New Roman" w:hAnsi="Times New Roman" w:cs="Times New Roman"/>
-              </w:rPr>
-              <w:t>.1</w:t>
             </w:r>
           </w:p>
         </w:tc>
@@ -2393,20 +2221,7 @@
               <w:rPr>
                 <w:rFonts w:ascii="Times New Roman" w:hAnsi="Times New Roman" w:cs="Times New Roman"/>
               </w:rPr>
-              <w:t xml:space="preserve">The License renewal would be required to be done every Year These renewal fees will facilitate to have the Product Upgrades, which would cover improvements, bug fixes, and changes in AIAG VDA compliances. </w:t>
-            </w:r>
-          </w:p>
-          <w:p>
-            <w:pPr>
-              <w:rPr>
-                <w:rFonts w:ascii="Times New Roman" w:hAnsi="Times New Roman" w:cs="Times New Roman"/>
-              </w:rPr>
-            </w:pPr>
-            <w:r>
-              <w:rPr>
-                <w:rFonts w:ascii="Times New Roman" w:hAnsi="Times New Roman" w:cs="Times New Roman"/>
-              </w:rPr>
-              <w:t xml:space="preserve">Support of 7 Man days is included in this price.  </w:t>
+              <w:t>Renewal and Support from next year onwards</w:t>
             </w:r>
           </w:p>
         </w:tc>
@@ -2427,31 +2242,6 @@
                 <w:rFonts w:ascii="Times New Roman" w:hAnsi="Times New Roman" w:cs="Times New Roman"/>
               </w:rPr>
             </w:pPr>
-            <w:r>
-              <w:rPr>
-                <w:rFonts w:ascii="Times New Roman" w:hAnsi="Times New Roman" w:cs="Times New Roman"/>
-              </w:rPr>
-              <w:t>{{MODULE_</w:t>
-            </w:r>
-            <w:r>
-              <w:rPr>
-                <w:rFonts w:ascii="Times New Roman" w:hAnsi="Times New Roman" w:cs="Times New Roman"/>
-              </w:rPr>
-              <w:t>NAME</w:t>
-            </w:r>
-            <w:r>
-              <w:rPr>
-                <w:rFonts w:ascii="Times New Roman" w:hAnsi="Times New Roman" w:cs="Times New Roman"/>
-              </w:rPr>
-              <w:t>}}</w:t>
-            </w:r>
-          </w:p>
-          <w:p>
-            <w:pPr>
-              <w:rPr>
-                <w:rFonts w:ascii="Times New Roman" w:hAnsi="Times New Roman" w:cs="Times New Roman"/>
-              </w:rPr>
-            </w:pPr>
           </w:p>
         </w:tc>
       </w:tr>
@@ -2480,7 +2270,19 @@
               <w:rPr>
                 <w:rFonts w:ascii="Times New Roman" w:hAnsi="Times New Roman" w:cs="Times New Roman"/>
               </w:rPr>
-              <w:t>4</w:t>
+              <w:t xml:space="preserve"> </w:t>
+            </w:r>
+            <w:r>
+              <w:rPr>
+                <w:rFonts w:ascii="Times New Roman" w:hAnsi="Times New Roman" w:cs="Times New Roman"/>
+              </w:rPr>
+              <w:t>3</w:t>
+            </w:r>
+            <w:r>
+              <w:rPr>
+                <w:rFonts w:ascii="Times New Roman" w:hAnsi="Times New Roman" w:cs="Times New Roman"/>
+              </w:rPr>
+              <w:t>.1</w:t>
             </w:r>
           </w:p>
         </w:tc>
@@ -2505,7 +2307,20 @@
               <w:rPr>
                 <w:rFonts w:ascii="Times New Roman" w:hAnsi="Times New Roman" w:cs="Times New Roman"/>
               </w:rPr>
-              <w:t>Support Services</w:t>
+              <w:t xml:space="preserve">The License renewal would be required to be done every Year These renewal fees will facilitate to have the Product Upgrades, which would cover improvements, bug fixes, and changes in AIAG VDA compliances. </w:t>
+            </w:r>
+          </w:p>
+          <w:p>
+            <w:pPr>
+              <w:rPr>
+                <w:rFonts w:ascii="Times New Roman" w:hAnsi="Times New Roman" w:cs="Times New Roman"/>
+              </w:rPr>
+            </w:pPr>
+            <w:r>
+              <w:rPr>
+                <w:rFonts w:ascii="Times New Roman" w:hAnsi="Times New Roman" w:cs="Times New Roman"/>
+              </w:rPr>
+              <w:t xml:space="preserve">Support of 7 Man days is included in this price.  </w:t>
             </w:r>
           </w:p>
         </w:tc>
@@ -2530,8 +2345,27 @@
               <w:rPr>
                 <w:rFonts w:ascii="Times New Roman" w:hAnsi="Times New Roman" w:cs="Times New Roman"/>
               </w:rPr>
-              <w:t>8000 per Man Day</w:t>
-            </w:r>
+              <w:t>{{MODULE_</w:t>
+            </w:r>
+            <w:r>
+              <w:rPr>
+                <w:rFonts w:ascii="Times New Roman" w:hAnsi="Times New Roman" w:cs="Times New Roman"/>
+              </w:rPr>
+              <w:t>NAME</w:t>
+            </w:r>
+            <w:r>
+              <w:rPr>
+                <w:rFonts w:ascii="Times New Roman" w:hAnsi="Times New Roman" w:cs="Times New Roman"/>
+              </w:rPr>
+              <w:t>}}</w:t>
+            </w:r>
+          </w:p>
+          <w:p>
+            <w:pPr>
+              <w:rPr>
+                <w:rFonts w:ascii="Times New Roman" w:hAnsi="Times New Roman" w:cs="Times New Roman"/>
+              </w:rPr>
+            </w:pPr>
           </w:p>
         </w:tc>
       </w:tr>
@@ -2560,7 +2394,7 @@
               <w:rPr>
                 <w:rFonts w:ascii="Times New Roman" w:hAnsi="Times New Roman" w:cs="Times New Roman"/>
               </w:rPr>
-              <w:t xml:space="preserve"> 4.1</w:t>
+              <w:t>4</w:t>
             </w:r>
           </w:p>
         </w:tc>
@@ -2585,21 +2419,7 @@
               <w:rPr>
                 <w:rFonts w:ascii="Times New Roman" w:hAnsi="Times New Roman" w:cs="Times New Roman"/>
               </w:rPr>
-              <w:t xml:space="preserve">First Year - These Services start a er 1 Month from start of Go Live. Subsequent Years – A er </w:t>
-            </w:r>
-            <w:proofErr w:type="spellStart"/>
-            <w:r>
-              <w:rPr>
-                <w:rFonts w:ascii="Times New Roman" w:hAnsi="Times New Roman" w:cs="Times New Roman"/>
-              </w:rPr>
-              <w:t>comple</w:t>
-            </w:r>
-            <w:proofErr w:type="spellEnd"/>
-            <w:r>
-              <w:rPr>
-                <w:rFonts w:ascii="Times New Roman" w:hAnsi="Times New Roman" w:cs="Times New Roman"/>
-              </w:rPr>
-              <w:t xml:space="preserve"> on of 7 Man Days</w:t>
+              <w:t>Support Services</w:t>
             </w:r>
           </w:p>
         </w:tc>
@@ -2620,6 +2440,12 @@
                 <w:rFonts w:ascii="Times New Roman" w:hAnsi="Times New Roman" w:cs="Times New Roman"/>
               </w:rPr>
             </w:pPr>
+            <w:r>
+              <w:rPr>
+                <w:rFonts w:ascii="Times New Roman" w:hAnsi="Times New Roman" w:cs="Times New Roman"/>
+              </w:rPr>
+              <w:t>8000 per Man Day</w:t>
+            </w:r>
           </w:p>
         </w:tc>
       </w:tr>
@@ -2648,7 +2474,7 @@
               <w:rPr>
                 <w:rFonts w:ascii="Times New Roman" w:hAnsi="Times New Roman" w:cs="Times New Roman"/>
               </w:rPr>
-              <w:t>5</w:t>
+              <w:t xml:space="preserve"> 4.1</w:t>
             </w:r>
           </w:p>
         </w:tc>
@@ -2673,7 +2499,7 @@
               <w:rPr>
                 <w:rFonts w:ascii="Times New Roman" w:hAnsi="Times New Roman" w:cs="Times New Roman"/>
               </w:rPr>
-              <w:t>Payment Terms</w:t>
+              <w:t>First Year - These Services start a er 1 Month from start of Go Live. Subsequent Years – A er comple on of 7 Man Days</w:t>
             </w:r>
           </w:p>
         </w:tc>
@@ -2723,7 +2549,7 @@
                 <w:rFonts w:ascii="Times New Roman" w:hAnsi="Times New Roman" w:cs="Times New Roman"/>
               </w:rPr>
               <w:lastRenderedPageBreak/>
-              <w:t xml:space="preserve"> 5.1</w:t>
+              <w:t>5</w:t>
             </w:r>
           </w:p>
         </w:tc>
@@ -2748,7 +2574,7 @@
               <w:rPr>
                 <w:rFonts w:ascii="Times New Roman" w:hAnsi="Times New Roman" w:cs="Times New Roman"/>
               </w:rPr>
-              <w:t xml:space="preserve">70% in Advance along with Purchase Order </w:t>
+              <w:t>Payment Terms</w:t>
             </w:r>
           </w:p>
         </w:tc>
@@ -2797,7 +2623,7 @@
               <w:rPr>
                 <w:rFonts w:ascii="Times New Roman" w:hAnsi="Times New Roman" w:cs="Times New Roman"/>
               </w:rPr>
-              <w:t xml:space="preserve"> 5.2</w:t>
+              <w:t xml:space="preserve"> 5.1</w:t>
             </w:r>
           </w:p>
         </w:tc>
@@ -2822,19 +2648,7 @@
               <w:rPr>
                 <w:rFonts w:ascii="Times New Roman" w:hAnsi="Times New Roman" w:cs="Times New Roman"/>
               </w:rPr>
-              <w:t xml:space="preserve">20% on </w:t>
-            </w:r>
-            <w:r>
-              <w:rPr>
-                <w:rFonts w:ascii="Times New Roman" w:hAnsi="Times New Roman" w:cs="Times New Roman"/>
-              </w:rPr>
-              <w:t>I</w:t>
-            </w:r>
-            <w:r>
-              <w:rPr>
-                <w:rFonts w:ascii="Times New Roman" w:hAnsi="Times New Roman" w:cs="Times New Roman"/>
-              </w:rPr>
-              <w:t>mplementation</w:t>
+              <w:t xml:space="preserve">70% in Advance along with Purchase Order </w:t>
             </w:r>
           </w:p>
         </w:tc>
@@ -2883,7 +2697,7 @@
               <w:rPr>
                 <w:rFonts w:ascii="Times New Roman" w:hAnsi="Times New Roman" w:cs="Times New Roman"/>
               </w:rPr>
-              <w:t xml:space="preserve"> 5.3</w:t>
+              <w:t xml:space="preserve"> 5.2</w:t>
             </w:r>
           </w:p>
         </w:tc>
@@ -2908,7 +2722,19 @@
               <w:rPr>
                 <w:rFonts w:ascii="Times New Roman" w:hAnsi="Times New Roman" w:cs="Times New Roman"/>
               </w:rPr>
-              <w:t>10% against GO LIVE or One Month from completion of implementation.</w:t>
+              <w:t xml:space="preserve">20% on </w:t>
+            </w:r>
+            <w:r>
+              <w:rPr>
+                <w:rFonts w:ascii="Times New Roman" w:hAnsi="Times New Roman" w:cs="Times New Roman"/>
+              </w:rPr>
+              <w:t>I</w:t>
+            </w:r>
+            <w:r>
+              <w:rPr>
+                <w:rFonts w:ascii="Times New Roman" w:hAnsi="Times New Roman" w:cs="Times New Roman"/>
+              </w:rPr>
+              <w:t>mplementation</w:t>
             </w:r>
           </w:p>
         </w:tc>
@@ -2957,7 +2783,7 @@
               <w:rPr>
                 <w:rFonts w:ascii="Times New Roman" w:hAnsi="Times New Roman" w:cs="Times New Roman"/>
               </w:rPr>
-              <w:t>6</w:t>
+              <w:t xml:space="preserve"> 5.3</w:t>
             </w:r>
           </w:p>
         </w:tc>
@@ -2982,7 +2808,7 @@
               <w:rPr>
                 <w:rFonts w:ascii="Times New Roman" w:hAnsi="Times New Roman" w:cs="Times New Roman"/>
               </w:rPr>
-              <w:t>Support Level</w:t>
+              <w:t>10% against GO LIVE or One Month from completion of implementation.</w:t>
             </w:r>
           </w:p>
         </w:tc>
@@ -3031,7 +2857,7 @@
               <w:rPr>
                 <w:rFonts w:ascii="Times New Roman" w:hAnsi="Times New Roman" w:cs="Times New Roman"/>
               </w:rPr>
-              <w:t xml:space="preserve"> 6.1</w:t>
+              <w:t>6</w:t>
             </w:r>
           </w:p>
         </w:tc>
@@ -3056,42 +2882,7 @@
               <w:rPr>
                 <w:rFonts w:ascii="Times New Roman" w:hAnsi="Times New Roman" w:cs="Times New Roman"/>
               </w:rPr>
-              <w:t>L1: Telephone Support</w:t>
-            </w:r>
-            <w:r>
-              <w:rPr>
-                <w:rFonts w:ascii="Times New Roman" w:hAnsi="Times New Roman" w:cs="Times New Roman"/>
-                <w:b/>
-                <w:bCs/>
-              </w:rPr>
-              <w:t xml:space="preserve"> </w:t>
-            </w:r>
-            <w:r>
-              <w:rPr>
-                <w:rFonts w:ascii="Times New Roman" w:hAnsi="Times New Roman" w:cs="Times New Roman"/>
-                <w:b/>
-                <w:bCs/>
-              </w:rPr>
-              <w:t>–</w:t>
-            </w:r>
-            <w:r>
-              <w:rPr>
-                <w:rFonts w:ascii="Times New Roman" w:hAnsi="Times New Roman" w:cs="Times New Roman"/>
-              </w:rPr>
-              <w:t xml:space="preserve"> </w:t>
-            </w:r>
-          </w:p>
-          <w:p>
-            <w:pPr>
-              <w:rPr>
-                <w:rFonts w:ascii="Times New Roman" w:hAnsi="Times New Roman" w:cs="Times New Roman"/>
-              </w:rPr>
-            </w:pPr>
-            <w:r>
-              <w:rPr>
-                <w:rFonts w:ascii="Times New Roman" w:hAnsi="Times New Roman" w:cs="Times New Roman"/>
-              </w:rPr>
-              <w:t>Queries, understanding a feature, problem solving, etc.</w:t>
+              <w:t>Support Level</w:t>
             </w:r>
           </w:p>
         </w:tc>
@@ -3108,31 +2899,10 @@
           </w:tcPr>
           <w:p>
             <w:pPr>
-              <w:spacing w:line="259" w:lineRule="auto"/>
-              <w:ind w:left="1"/>
-              <w:rPr>
-                <w:rFonts w:ascii="Times New Roman" w:hAnsi="Times New Roman" w:cs="Times New Roman"/>
-              </w:rPr>
-            </w:pPr>
-            <w:r>
-              <w:rPr>
-                <w:rFonts w:ascii="Times New Roman" w:hAnsi="Times New Roman" w:cs="Times New Roman"/>
-              </w:rPr>
-              <w:t xml:space="preserve">Chargeable  </w:t>
-            </w:r>
-          </w:p>
-          <w:p>
-            <w:pPr>
-              <w:rPr>
-                <w:rFonts w:ascii="Times New Roman" w:hAnsi="Times New Roman" w:cs="Times New Roman"/>
-              </w:rPr>
-            </w:pPr>
-            <w:r>
-              <w:rPr>
-                <w:rFonts w:ascii="Times New Roman" w:hAnsi="Times New Roman" w:cs="Times New Roman"/>
-              </w:rPr>
-              <w:t>As per Sr. No. 4</w:t>
-            </w:r>
+              <w:rPr>
+                <w:rFonts w:ascii="Times New Roman" w:hAnsi="Times New Roman" w:cs="Times New Roman"/>
+              </w:rPr>
+            </w:pPr>
           </w:p>
         </w:tc>
       </w:tr>
@@ -3161,7 +2931,7 @@
               <w:rPr>
                 <w:rFonts w:ascii="Times New Roman" w:hAnsi="Times New Roman" w:cs="Times New Roman"/>
               </w:rPr>
-              <w:t xml:space="preserve"> 6.2</w:t>
+              <w:t xml:space="preserve"> 6.1</w:t>
             </w:r>
           </w:p>
         </w:tc>
@@ -3186,7 +2956,7 @@
               <w:rPr>
                 <w:rFonts w:ascii="Times New Roman" w:hAnsi="Times New Roman" w:cs="Times New Roman"/>
               </w:rPr>
-              <w:t>L2: Bugs</w:t>
+              <w:t>L1: Telephone Support</w:t>
             </w:r>
             <w:r>
               <w:rPr>
@@ -3204,24 +2974,24 @@
               </w:rPr>
               <w:t>–</w:t>
             </w:r>
-          </w:p>
-          <w:p>
-            <w:pPr>
-              <w:rPr>
-                <w:rFonts w:ascii="Times New Roman" w:hAnsi="Times New Roman" w:cs="Times New Roman"/>
-              </w:rPr>
-            </w:pPr>
-            <w:r>
-              <w:rPr>
-                <w:rFonts w:ascii="Times New Roman" w:hAnsi="Times New Roman" w:cs="Times New Roman"/>
-              </w:rPr>
-              <w:t xml:space="preserve">Bugs </w:t>
-            </w:r>
-            <w:r>
-              <w:rPr>
-                <w:rFonts w:ascii="Times New Roman" w:hAnsi="Times New Roman" w:cs="Times New Roman"/>
-              </w:rPr>
-              <w:t>Identified by you or by BlechTek Software Solutions LLP.</w:t>
+            <w:r>
+              <w:rPr>
+                <w:rFonts w:ascii="Times New Roman" w:hAnsi="Times New Roman" w:cs="Times New Roman"/>
+              </w:rPr>
+              <w:t xml:space="preserve"> </w:t>
+            </w:r>
+          </w:p>
+          <w:p>
+            <w:pPr>
+              <w:rPr>
+                <w:rFonts w:ascii="Times New Roman" w:hAnsi="Times New Roman" w:cs="Times New Roman"/>
+              </w:rPr>
+            </w:pPr>
+            <w:r>
+              <w:rPr>
+                <w:rFonts w:ascii="Times New Roman" w:hAnsi="Times New Roman" w:cs="Times New Roman"/>
+              </w:rPr>
+              <w:t>Queries, understanding a feature, problem solving, etc.</w:t>
             </w:r>
           </w:p>
         </w:tc>
@@ -3238,15 +3008,30 @@
           </w:tcPr>
           <w:p>
             <w:pPr>
-              <w:rPr>
-                <w:rFonts w:ascii="Times New Roman" w:hAnsi="Times New Roman" w:cs="Times New Roman"/>
-              </w:rPr>
-            </w:pPr>
-            <w:r>
-              <w:rPr>
-                <w:rFonts w:ascii="Times New Roman" w:hAnsi="Times New Roman" w:cs="Times New Roman"/>
-              </w:rPr>
-              <w:t>Free, under License Fee Renewal</w:t>
+              <w:spacing w:line="259" w:lineRule="auto"/>
+              <w:ind w:left="1"/>
+              <w:rPr>
+                <w:rFonts w:ascii="Times New Roman" w:hAnsi="Times New Roman" w:cs="Times New Roman"/>
+              </w:rPr>
+            </w:pPr>
+            <w:r>
+              <w:rPr>
+                <w:rFonts w:ascii="Times New Roman" w:hAnsi="Times New Roman" w:cs="Times New Roman"/>
+              </w:rPr>
+              <w:t xml:space="preserve">Chargeable  </w:t>
+            </w:r>
+          </w:p>
+          <w:p>
+            <w:pPr>
+              <w:rPr>
+                <w:rFonts w:ascii="Times New Roman" w:hAnsi="Times New Roman" w:cs="Times New Roman"/>
+              </w:rPr>
+            </w:pPr>
+            <w:r>
+              <w:rPr>
+                <w:rFonts w:ascii="Times New Roman" w:hAnsi="Times New Roman" w:cs="Times New Roman"/>
+              </w:rPr>
+              <w:t>As per Sr. No. 4</w:t>
             </w:r>
           </w:p>
         </w:tc>
@@ -3276,7 +3061,7 @@
               <w:rPr>
                 <w:rFonts w:ascii="Times New Roman" w:hAnsi="Times New Roman" w:cs="Times New Roman"/>
               </w:rPr>
-              <w:t xml:space="preserve"> 6.3</w:t>
+              <w:t xml:space="preserve"> 6.2</w:t>
             </w:r>
           </w:p>
         </w:tc>
@@ -3301,7 +3086,7 @@
               <w:rPr>
                 <w:rFonts w:ascii="Times New Roman" w:hAnsi="Times New Roman" w:cs="Times New Roman"/>
               </w:rPr>
-              <w:t>L3: Customer Specific Enhancements</w:t>
+              <w:t>L2: Bugs</w:t>
             </w:r>
             <w:r>
               <w:rPr>
@@ -3309,26 +3094,34 @@
                 <w:b/>
                 <w:bCs/>
               </w:rPr>
-              <w:t xml:space="preserve"> –</w:t>
-            </w:r>
-            <w:r>
-              <w:rPr>
-                <w:rFonts w:ascii="Times New Roman" w:hAnsi="Times New Roman" w:cs="Times New Roman"/>
-              </w:rPr>
               <w:t xml:space="preserve"> </w:t>
             </w:r>
-          </w:p>
-          <w:p>
-            <w:pPr>
-              <w:rPr>
-                <w:rFonts w:ascii="Times New Roman" w:hAnsi="Times New Roman" w:cs="Times New Roman"/>
-              </w:rPr>
-            </w:pPr>
-            <w:r>
-              <w:rPr>
-                <w:rFonts w:ascii="Times New Roman" w:hAnsi="Times New Roman" w:cs="Times New Roman"/>
-              </w:rPr>
-              <w:t>New/Change in Document Prin ng format, New/Changes in Reports, New/Change in Reports</w:t>
+            <w:r>
+              <w:rPr>
+                <w:rFonts w:ascii="Times New Roman" w:hAnsi="Times New Roman" w:cs="Times New Roman"/>
+                <w:b/>
+                <w:bCs/>
+              </w:rPr>
+              <w:t>–</w:t>
+            </w:r>
+          </w:p>
+          <w:p>
+            <w:pPr>
+              <w:rPr>
+                <w:rFonts w:ascii="Times New Roman" w:hAnsi="Times New Roman" w:cs="Times New Roman"/>
+              </w:rPr>
+            </w:pPr>
+            <w:r>
+              <w:rPr>
+                <w:rFonts w:ascii="Times New Roman" w:hAnsi="Times New Roman" w:cs="Times New Roman"/>
+              </w:rPr>
+              <w:t xml:space="preserve">Bugs </w:t>
+            </w:r>
+            <w:r>
+              <w:rPr>
+                <w:rFonts w:ascii="Times New Roman" w:hAnsi="Times New Roman" w:cs="Times New Roman"/>
+              </w:rPr>
+              <w:t>Identified by you or by BlechTek Software Solutions LLP.</w:t>
             </w:r>
           </w:p>
         </w:tc>
@@ -3345,30 +3138,15 @@
           </w:tcPr>
           <w:p>
             <w:pPr>
-              <w:spacing w:line="259" w:lineRule="auto"/>
-              <w:ind w:left="1"/>
-              <w:rPr>
-                <w:rFonts w:ascii="Times New Roman" w:hAnsi="Times New Roman" w:cs="Times New Roman"/>
-              </w:rPr>
-            </w:pPr>
-            <w:r>
-              <w:rPr>
-                <w:rFonts w:ascii="Times New Roman" w:hAnsi="Times New Roman" w:cs="Times New Roman"/>
-              </w:rPr>
-              <w:t xml:space="preserve">Chargeable  </w:t>
-            </w:r>
-          </w:p>
-          <w:p>
-            <w:pPr>
-              <w:rPr>
-                <w:rFonts w:ascii="Times New Roman" w:hAnsi="Times New Roman" w:cs="Times New Roman"/>
-              </w:rPr>
-            </w:pPr>
-            <w:r>
-              <w:rPr>
-                <w:rFonts w:ascii="Times New Roman" w:hAnsi="Times New Roman" w:cs="Times New Roman"/>
-              </w:rPr>
-              <w:t>As per Sr. No. 4</w:t>
+              <w:rPr>
+                <w:rFonts w:ascii="Times New Roman" w:hAnsi="Times New Roman" w:cs="Times New Roman"/>
+              </w:rPr>
+            </w:pPr>
+            <w:r>
+              <w:rPr>
+                <w:rFonts w:ascii="Times New Roman" w:hAnsi="Times New Roman" w:cs="Times New Roman"/>
+              </w:rPr>
+              <w:t>Free, under License Fee Renewal</w:t>
             </w:r>
           </w:p>
         </w:tc>
@@ -3398,7 +3176,7 @@
               <w:rPr>
                 <w:rFonts w:ascii="Times New Roman" w:hAnsi="Times New Roman" w:cs="Times New Roman"/>
               </w:rPr>
-              <w:t xml:space="preserve"> 6.4</w:t>
+              <w:t xml:space="preserve"> 6.3</w:t>
             </w:r>
           </w:p>
         </w:tc>
@@ -3423,7 +3201,7 @@
               <w:rPr>
                 <w:rFonts w:ascii="Times New Roman" w:hAnsi="Times New Roman" w:cs="Times New Roman"/>
               </w:rPr>
-              <w:t>L4: Product Upgrade</w:t>
+              <w:t>L3: Customer Specific Enhancements</w:t>
             </w:r>
             <w:r>
               <w:rPr>
@@ -3450,19 +3228,7 @@
               <w:rPr>
                 <w:rFonts w:ascii="Times New Roman" w:hAnsi="Times New Roman" w:cs="Times New Roman"/>
               </w:rPr>
-              <w:t>Product Upgrade as done by BlechTek So ware Solu</w:t>
-            </w:r>
-            <w:r>
-              <w:rPr>
-                <w:rFonts w:ascii="Times New Roman" w:hAnsi="Times New Roman" w:cs="Times New Roman"/>
-              </w:rPr>
-              <w:t>ti</w:t>
-            </w:r>
-            <w:r>
-              <w:rPr>
-                <w:rFonts w:ascii="Times New Roman" w:hAnsi="Times New Roman" w:cs="Times New Roman"/>
-              </w:rPr>
-              <w:t xml:space="preserve">ons LLP on their own  </w:t>
+              <w:t>New/Change in Document Prin ng format, New/Changes in Reports, New/Change in Reports</w:t>
             </w:r>
           </w:p>
         </w:tc>
@@ -3479,15 +3245,30 @@
           </w:tcPr>
           <w:p>
             <w:pPr>
-              <w:rPr>
-                <w:rFonts w:ascii="Times New Roman" w:hAnsi="Times New Roman" w:cs="Times New Roman"/>
-              </w:rPr>
-            </w:pPr>
-            <w:r>
-              <w:rPr>
-                <w:rFonts w:ascii="Times New Roman" w:hAnsi="Times New Roman" w:cs="Times New Roman"/>
-              </w:rPr>
-              <w:t>Free, under License Fee Renewal</w:t>
+              <w:spacing w:line="259" w:lineRule="auto"/>
+              <w:ind w:left="1"/>
+              <w:rPr>
+                <w:rFonts w:ascii="Times New Roman" w:hAnsi="Times New Roman" w:cs="Times New Roman"/>
+              </w:rPr>
+            </w:pPr>
+            <w:r>
+              <w:rPr>
+                <w:rFonts w:ascii="Times New Roman" w:hAnsi="Times New Roman" w:cs="Times New Roman"/>
+              </w:rPr>
+              <w:t xml:space="preserve">Chargeable  </w:t>
+            </w:r>
+          </w:p>
+          <w:p>
+            <w:pPr>
+              <w:rPr>
+                <w:rFonts w:ascii="Times New Roman" w:hAnsi="Times New Roman" w:cs="Times New Roman"/>
+              </w:rPr>
+            </w:pPr>
+            <w:r>
+              <w:rPr>
+                <w:rFonts w:ascii="Times New Roman" w:hAnsi="Times New Roman" w:cs="Times New Roman"/>
+              </w:rPr>
+              <w:t>As per Sr. No. 4</w:t>
             </w:r>
           </w:p>
         </w:tc>
@@ -3517,7 +3298,7 @@
               <w:rPr>
                 <w:rFonts w:ascii="Times New Roman" w:hAnsi="Times New Roman" w:cs="Times New Roman"/>
               </w:rPr>
-              <w:t xml:space="preserve"> 6.5</w:t>
+              <w:t xml:space="preserve"> 6.4</w:t>
             </w:r>
           </w:p>
         </w:tc>
@@ -3542,7 +3323,7 @@
               <w:rPr>
                 <w:rFonts w:ascii="Times New Roman" w:hAnsi="Times New Roman" w:cs="Times New Roman"/>
               </w:rPr>
-              <w:t>L5: Implementation</w:t>
+              <w:t>L4: Product Upgrade</w:t>
             </w:r>
             <w:r>
               <w:rPr>
@@ -3552,18 +3333,36 @@
               </w:rPr>
               <w:t xml:space="preserve"> –</w:t>
             </w:r>
-          </w:p>
-          <w:p>
-            <w:pPr>
-              <w:rPr>
-                <w:rFonts w:ascii="Times New Roman" w:hAnsi="Times New Roman" w:cs="Times New Roman"/>
-              </w:rPr>
-            </w:pPr>
-            <w:r>
-              <w:rPr>
-                <w:rFonts w:ascii="Times New Roman" w:hAnsi="Times New Roman" w:cs="Times New Roman"/>
-              </w:rPr>
-              <w:t>Master updation, new feature implementation.</w:t>
+            <w:r>
+              <w:rPr>
+                <w:rFonts w:ascii="Times New Roman" w:hAnsi="Times New Roman" w:cs="Times New Roman"/>
+              </w:rPr>
+              <w:t xml:space="preserve"> </w:t>
+            </w:r>
+          </w:p>
+          <w:p>
+            <w:pPr>
+              <w:rPr>
+                <w:rFonts w:ascii="Times New Roman" w:hAnsi="Times New Roman" w:cs="Times New Roman"/>
+              </w:rPr>
+            </w:pPr>
+            <w:r>
+              <w:rPr>
+                <w:rFonts w:ascii="Times New Roman" w:hAnsi="Times New Roman" w:cs="Times New Roman"/>
+              </w:rPr>
+              <w:t>Product Upgrade as done by BlechTek So ware Solu</w:t>
+            </w:r>
+            <w:r>
+              <w:rPr>
+                <w:rFonts w:ascii="Times New Roman" w:hAnsi="Times New Roman" w:cs="Times New Roman"/>
+              </w:rPr>
+              <w:t>ti</w:t>
+            </w:r>
+            <w:r>
+              <w:rPr>
+                <w:rFonts w:ascii="Times New Roman" w:hAnsi="Times New Roman" w:cs="Times New Roman"/>
+              </w:rPr>
+              <w:t xml:space="preserve">ons LLP on their own  </w:t>
             </w:r>
           </w:p>
         </w:tc>
@@ -3588,20 +3387,7 @@
               <w:rPr>
                 <w:rFonts w:ascii="Times New Roman" w:hAnsi="Times New Roman" w:cs="Times New Roman"/>
               </w:rPr>
-              <w:t xml:space="preserve">Chargeable  </w:t>
-            </w:r>
-          </w:p>
-          <w:p>
-            <w:pPr>
-              <w:rPr>
-                <w:rFonts w:ascii="Times New Roman" w:hAnsi="Times New Roman" w:cs="Times New Roman"/>
-              </w:rPr>
-            </w:pPr>
-            <w:r>
-              <w:rPr>
-                <w:rFonts w:ascii="Times New Roman" w:hAnsi="Times New Roman" w:cs="Times New Roman"/>
-              </w:rPr>
-              <w:t>As per Sr. No. 4</w:t>
+              <w:t>Free, under License Fee Renewal</w:t>
             </w:r>
           </w:p>
         </w:tc>
@@ -3631,7 +3417,7 @@
               <w:rPr>
                 <w:rFonts w:ascii="Times New Roman" w:hAnsi="Times New Roman" w:cs="Times New Roman"/>
               </w:rPr>
-              <w:t>7</w:t>
+              <w:t xml:space="preserve"> 6.5</w:t>
             </w:r>
           </w:p>
         </w:tc>
@@ -3656,7 +3442,28 @@
               <w:rPr>
                 <w:rFonts w:ascii="Times New Roman" w:hAnsi="Times New Roman" w:cs="Times New Roman"/>
               </w:rPr>
-              <w:t>Taxes</w:t>
+              <w:t>L5: Implementation</w:t>
+            </w:r>
+            <w:r>
+              <w:rPr>
+                <w:rFonts w:ascii="Times New Roman" w:hAnsi="Times New Roman" w:cs="Times New Roman"/>
+                <w:b/>
+                <w:bCs/>
+              </w:rPr>
+              <w:t xml:space="preserve"> –</w:t>
+            </w:r>
+          </w:p>
+          <w:p>
+            <w:pPr>
+              <w:rPr>
+                <w:rFonts w:ascii="Times New Roman" w:hAnsi="Times New Roman" w:cs="Times New Roman"/>
+              </w:rPr>
+            </w:pPr>
+            <w:r>
+              <w:rPr>
+                <w:rFonts w:ascii="Times New Roman" w:hAnsi="Times New Roman" w:cs="Times New Roman"/>
+              </w:rPr>
+              <w:t>Master updation, new feature implementation.</w:t>
             </w:r>
           </w:p>
         </w:tc>
@@ -3681,20 +3488,105 @@
               <w:rPr>
                 <w:rFonts w:ascii="Times New Roman" w:hAnsi="Times New Roman" w:cs="Times New Roman"/>
               </w:rPr>
+              <w:t xml:space="preserve">Chargeable  </w:t>
+            </w:r>
+          </w:p>
+          <w:p>
+            <w:pPr>
+              <w:rPr>
+                <w:rFonts w:ascii="Times New Roman" w:hAnsi="Times New Roman" w:cs="Times New Roman"/>
+              </w:rPr>
+            </w:pPr>
+            <w:r>
+              <w:rPr>
+                <w:rFonts w:ascii="Times New Roman" w:hAnsi="Times New Roman" w:cs="Times New Roman"/>
+              </w:rPr>
+              <w:t>As per Sr. No. 4</w:t>
+            </w:r>
+          </w:p>
+        </w:tc>
+      </w:tr>
+      <w:tr>
+        <w:trPr>
+          <w:trHeight w:val="20"/>
+        </w:trPr>
+        <w:tc>
+          <w:tcPr>
+            <w:tcW w:w="1007" w:type="dxa"/>
+            <w:shd w:val="clear" w:color="auto" w:fill="FFFFFF" w:themeFill="background1"/>
+            <w:tcMar>
+              <w:top w:w="80" w:type="dxa"/>
+              <w:left w:w="120" w:type="dxa"/>
+              <w:bottom w:w="80" w:type="dxa"/>
+              <w:right w:w="120" w:type="dxa"/>
+            </w:tcMar>
+          </w:tcPr>
+          <w:p>
+            <w:pPr>
+              <w:rPr>
+                <w:rFonts w:ascii="Times New Roman" w:hAnsi="Times New Roman" w:cs="Times New Roman"/>
+              </w:rPr>
+            </w:pPr>
+            <w:r>
+              <w:rPr>
+                <w:rFonts w:ascii="Times New Roman" w:hAnsi="Times New Roman" w:cs="Times New Roman"/>
+              </w:rPr>
+              <w:t>7</w:t>
+            </w:r>
+          </w:p>
+        </w:tc>
+        <w:tc>
+          <w:tcPr>
+            <w:tcW w:w="6360" w:type="dxa"/>
+            <w:shd w:val="clear" w:color="auto" w:fill="FFFFFF" w:themeFill="background1"/>
+            <w:tcMar>
+              <w:top w:w="80" w:type="dxa"/>
+              <w:left w:w="120" w:type="dxa"/>
+              <w:bottom w:w="80" w:type="dxa"/>
+              <w:right w:w="120" w:type="dxa"/>
+            </w:tcMar>
+          </w:tcPr>
+          <w:p>
+            <w:pPr>
+              <w:rPr>
+                <w:rFonts w:ascii="Times New Roman" w:hAnsi="Times New Roman" w:cs="Times New Roman"/>
+              </w:rPr>
+            </w:pPr>
+            <w:r>
+              <w:rPr>
+                <w:rFonts w:ascii="Times New Roman" w:hAnsi="Times New Roman" w:cs="Times New Roman"/>
+              </w:rPr>
+              <w:t>Taxes</w:t>
+            </w:r>
+          </w:p>
+        </w:tc>
+        <w:tc>
+          <w:tcPr>
+            <w:tcW w:w="2625" w:type="dxa"/>
+            <w:shd w:val="clear" w:color="auto" w:fill="FFFFFF" w:themeFill="background1"/>
+            <w:tcMar>
+              <w:top w:w="80" w:type="dxa"/>
+              <w:left w:w="120" w:type="dxa"/>
+              <w:bottom w:w="80" w:type="dxa"/>
+              <w:right w:w="120" w:type="dxa"/>
+            </w:tcMar>
+          </w:tcPr>
+          <w:p>
+            <w:pPr>
+              <w:rPr>
+                <w:rFonts w:ascii="Times New Roman" w:hAnsi="Times New Roman" w:cs="Times New Roman"/>
+              </w:rPr>
+            </w:pPr>
+            <w:r>
+              <w:rPr>
+                <w:rFonts w:ascii="Times New Roman" w:hAnsi="Times New Roman" w:cs="Times New Roman"/>
+              </w:rPr>
               <w:t>As Applicable</w:t>
             </w:r>
           </w:p>
         </w:tc>
       </w:tr>
     </w:tbl>
-    <w:p>
-      <w:pPr>
-        <w:spacing w:after="200"/>
-        <w:rPr>
-          <w:rFonts w:ascii="Times New Roman" w:hAnsi="Times New Roman" w:cs="Times New Roman"/>
-        </w:rPr>
-      </w:pPr>
-    </w:p>
     <w:p>
       <w:pPr>
         <w:spacing w:after="200"/>
@@ -3720,8 +3612,8 @@
     <w:tbl>
       <w:tblPr>
         <w:tblStyle w:val="TableGrid"/>
-        <w:tblW w:w="9925" w:type="dxa"/>
-        <w:tblInd w:w="106" w:type="dxa"/>
+        <w:tblW w:w="10036" w:type="dxa"/>
+        <w:tblInd w:w="-5" w:type="dxa"/>
         <w:tblCellMar>
           <w:top w:w="14" w:type="dxa"/>
           <w:left w:w="28" w:type="dxa"/>
@@ -3730,15 +3622,15 @@
         <w:tblLook w:val="04A0" w:firstRow="1" w:lastRow="0" w:firstColumn="1" w:lastColumn="0" w:noHBand="0" w:noVBand="1"/>
       </w:tblPr>
       <w:tblGrid>
-        <w:gridCol w:w="1980"/>
-        <w:gridCol w:w="886"/>
+        <w:gridCol w:w="2029"/>
+        <w:gridCol w:w="1591"/>
+        <w:gridCol w:w="916"/>
         <w:gridCol w:w="851"/>
         <w:gridCol w:w="850"/>
         <w:gridCol w:w="851"/>
-        <w:gridCol w:w="850"/>
-        <w:gridCol w:w="851"/>
-        <w:gridCol w:w="1417"/>
-        <w:gridCol w:w="1389"/>
+        <w:gridCol w:w="992"/>
+        <w:gridCol w:w="992"/>
+        <w:gridCol w:w="964"/>
       </w:tblGrid>
       <w:tr>
         <w:trPr>
@@ -3746,7 +3638,7 @@
         </w:trPr>
         <w:tc>
           <w:tcPr>
-            <w:tcW w:w="1980" w:type="dxa"/>
+            <w:tcW w:w="2029" w:type="dxa"/>
             <w:tcBorders>
               <w:top w:val="single" w:sz="4" w:space="0" w:color="000000"/>
               <w:left w:val="single" w:sz="4" w:space="0" w:color="000000"/>
@@ -3760,15 +3652,15 @@
               <w:spacing w:line="259" w:lineRule="auto"/>
               <w:rPr>
                 <w:rFonts w:ascii="Times New Roman" w:hAnsi="Times New Roman" w:cs="Times New Roman"/>
-                <w:sz w:val="20"/>
-                <w:szCs w:val="20"/>
-              </w:rPr>
-            </w:pPr>
-            <w:r>
-              <w:rPr>
-                <w:rFonts w:ascii="Times New Roman" w:hAnsi="Times New Roman" w:cs="Times New Roman"/>
-                <w:sz w:val="20"/>
-                <w:szCs w:val="20"/>
+                <w:sz w:val="18"/>
+                <w:szCs w:val="18"/>
+              </w:rPr>
+            </w:pPr>
+            <w:r>
+              <w:rPr>
+                <w:rFonts w:ascii="Times New Roman" w:hAnsi="Times New Roman" w:cs="Times New Roman"/>
+                <w:sz w:val="18"/>
+                <w:szCs w:val="18"/>
               </w:rPr>
               <w:t>CQUAL Product Platform</w:t>
             </w:r>
@@ -3776,7 +3668,7 @@
         </w:tc>
         <w:tc>
           <w:tcPr>
-            <w:tcW w:w="886" w:type="dxa"/>
+            <w:tcW w:w="1591" w:type="dxa"/>
             <w:tcBorders>
               <w:top w:val="single" w:sz="4" w:space="0" w:color="000000"/>
               <w:left w:val="single" w:sz="4" w:space="0" w:color="000000"/>
@@ -3791,17 +3683,49 @@
               <w:ind w:left="1"/>
               <w:rPr>
                 <w:rFonts w:ascii="Times New Roman" w:hAnsi="Times New Roman" w:cs="Times New Roman"/>
-                <w:sz w:val="20"/>
-                <w:szCs w:val="20"/>
-              </w:rPr>
-            </w:pPr>
-            <w:r>
-              <w:rPr>
-                <w:rFonts w:ascii="Times New Roman" w:hAnsi="Times New Roman" w:cs="Times New Roman"/>
-                <w:sz w:val="20"/>
-                <w:szCs w:val="20"/>
+                <w:sz w:val="18"/>
+                <w:szCs w:val="18"/>
+              </w:rPr>
+            </w:pPr>
+            <w:r>
+              <w:rPr>
+                <w:rFonts w:ascii="Times New Roman" w:hAnsi="Times New Roman" w:cs="Times New Roman"/>
+                <w:sz w:val="18"/>
+                <w:szCs w:val="18"/>
               </w:rPr>
               <w:t>No of Users</w:t>
+            </w:r>
+          </w:p>
+        </w:tc>
+        <w:tc>
+          <w:tcPr>
+            <w:tcW w:w="916" w:type="dxa"/>
+            <w:tcBorders>
+              <w:top w:val="single" w:sz="4" w:space="0" w:color="000000"/>
+              <w:left w:val="single" w:sz="4" w:space="0" w:color="000000"/>
+              <w:bottom w:val="single" w:sz="5" w:space="0" w:color="000000"/>
+              <w:right w:val="single" w:sz="4" w:space="0" w:color="000000"/>
+            </w:tcBorders>
+            <w:shd w:val="clear" w:color="auto" w:fill="D9D9D9"/>
+          </w:tcPr>
+          <w:p>
+            <w:pPr>
+              <w:spacing w:line="259" w:lineRule="auto"/>
+              <w:ind w:left="28"/>
+              <w:jc w:val="center"/>
+              <w:rPr>
+                <w:rFonts w:ascii="Times New Roman" w:hAnsi="Times New Roman" w:cs="Times New Roman"/>
+                <w:sz w:val="18"/>
+                <w:szCs w:val="18"/>
+              </w:rPr>
+            </w:pPr>
+            <w:r>
+              <w:rPr>
+                <w:rFonts w:ascii="Times New Roman" w:hAnsi="Times New Roman" w:cs="Times New Roman"/>
+                <w:sz w:val="18"/>
+                <w:szCs w:val="18"/>
+              </w:rPr>
+              <w:t>Y1</w:t>
             </w:r>
           </w:p>
         </w:tc>
@@ -3819,21 +3743,21 @@
           <w:p>
             <w:pPr>
               <w:spacing w:line="259" w:lineRule="auto"/>
-              <w:ind w:left="28"/>
+              <w:ind w:left="32"/>
               <w:jc w:val="center"/>
               <w:rPr>
                 <w:rFonts w:ascii="Times New Roman" w:hAnsi="Times New Roman" w:cs="Times New Roman"/>
-                <w:sz w:val="20"/>
-                <w:szCs w:val="20"/>
-              </w:rPr>
-            </w:pPr>
-            <w:r>
-              <w:rPr>
-                <w:rFonts w:ascii="Times New Roman" w:hAnsi="Times New Roman" w:cs="Times New Roman"/>
-                <w:sz w:val="20"/>
-                <w:szCs w:val="20"/>
-              </w:rPr>
-              <w:t>Y1</w:t>
+                <w:sz w:val="18"/>
+                <w:szCs w:val="18"/>
+              </w:rPr>
+            </w:pPr>
+            <w:r>
+              <w:rPr>
+                <w:rFonts w:ascii="Times New Roman" w:hAnsi="Times New Roman" w:cs="Times New Roman"/>
+                <w:sz w:val="18"/>
+                <w:szCs w:val="18"/>
+              </w:rPr>
+              <w:t>Y2</w:t>
             </w:r>
           </w:p>
         </w:tc>
@@ -3851,21 +3775,21 @@
           <w:p>
             <w:pPr>
               <w:spacing w:line="259" w:lineRule="auto"/>
-              <w:ind w:left="32"/>
+              <w:ind w:left="33"/>
               <w:jc w:val="center"/>
               <w:rPr>
                 <w:rFonts w:ascii="Times New Roman" w:hAnsi="Times New Roman" w:cs="Times New Roman"/>
-                <w:sz w:val="20"/>
-                <w:szCs w:val="20"/>
-              </w:rPr>
-            </w:pPr>
-            <w:r>
-              <w:rPr>
-                <w:rFonts w:ascii="Times New Roman" w:hAnsi="Times New Roman" w:cs="Times New Roman"/>
-                <w:sz w:val="20"/>
-                <w:szCs w:val="20"/>
-              </w:rPr>
-              <w:t>Y2</w:t>
+                <w:sz w:val="18"/>
+                <w:szCs w:val="18"/>
+              </w:rPr>
+            </w:pPr>
+            <w:r>
+              <w:rPr>
+                <w:rFonts w:ascii="Times New Roman" w:hAnsi="Times New Roman" w:cs="Times New Roman"/>
+                <w:sz w:val="18"/>
+                <w:szCs w:val="18"/>
+              </w:rPr>
+              <w:t>Y3</w:t>
             </w:r>
           </w:p>
         </w:tc>
@@ -3883,27 +3807,27 @@
           <w:p>
             <w:pPr>
               <w:spacing w:line="259" w:lineRule="auto"/>
-              <w:ind w:left="33"/>
+              <w:ind w:left="31"/>
               <w:jc w:val="center"/>
               <w:rPr>
                 <w:rFonts w:ascii="Times New Roman" w:hAnsi="Times New Roman" w:cs="Times New Roman"/>
-                <w:sz w:val="20"/>
-                <w:szCs w:val="20"/>
-              </w:rPr>
-            </w:pPr>
-            <w:r>
-              <w:rPr>
-                <w:rFonts w:ascii="Times New Roman" w:hAnsi="Times New Roman" w:cs="Times New Roman"/>
-                <w:sz w:val="20"/>
-                <w:szCs w:val="20"/>
-              </w:rPr>
-              <w:t>Y3</w:t>
-            </w:r>
-          </w:p>
-        </w:tc>
-        <w:tc>
-          <w:tcPr>
-            <w:tcW w:w="850" w:type="dxa"/>
+                <w:sz w:val="18"/>
+                <w:szCs w:val="18"/>
+              </w:rPr>
+            </w:pPr>
+            <w:r>
+              <w:rPr>
+                <w:rFonts w:ascii="Times New Roman" w:hAnsi="Times New Roman" w:cs="Times New Roman"/>
+                <w:sz w:val="18"/>
+                <w:szCs w:val="18"/>
+              </w:rPr>
+              <w:t>Y4</w:t>
+            </w:r>
+          </w:p>
+        </w:tc>
+        <w:tc>
+          <w:tcPr>
+            <w:tcW w:w="992" w:type="dxa"/>
             <w:tcBorders>
               <w:top w:val="single" w:sz="4" w:space="0" w:color="000000"/>
               <w:left w:val="single" w:sz="4" w:space="0" w:color="000000"/>
@@ -3915,51 +3839,19 @@
           <w:p>
             <w:pPr>
               <w:spacing w:line="259" w:lineRule="auto"/>
-              <w:ind w:left="31"/>
-              <w:jc w:val="center"/>
-              <w:rPr>
-                <w:rFonts w:ascii="Times New Roman" w:hAnsi="Times New Roman" w:cs="Times New Roman"/>
-                <w:sz w:val="20"/>
-                <w:szCs w:val="20"/>
-              </w:rPr>
-            </w:pPr>
-            <w:r>
-              <w:rPr>
-                <w:rFonts w:ascii="Times New Roman" w:hAnsi="Times New Roman" w:cs="Times New Roman"/>
-                <w:sz w:val="20"/>
-                <w:szCs w:val="20"/>
-              </w:rPr>
-              <w:t>Y4</w:t>
-            </w:r>
-          </w:p>
-        </w:tc>
-        <w:tc>
-          <w:tcPr>
-            <w:tcW w:w="851" w:type="dxa"/>
-            <w:tcBorders>
-              <w:top w:val="single" w:sz="4" w:space="0" w:color="000000"/>
-              <w:left w:val="single" w:sz="4" w:space="0" w:color="000000"/>
-              <w:bottom w:val="single" w:sz="5" w:space="0" w:color="000000"/>
-              <w:right w:val="single" w:sz="4" w:space="0" w:color="000000"/>
-            </w:tcBorders>
-            <w:shd w:val="clear" w:color="auto" w:fill="D9D9D9"/>
-          </w:tcPr>
-          <w:p>
-            <w:pPr>
-              <w:spacing w:line="259" w:lineRule="auto"/>
               <w:ind w:left="32"/>
               <w:jc w:val="center"/>
               <w:rPr>
                 <w:rFonts w:ascii="Times New Roman" w:hAnsi="Times New Roman" w:cs="Times New Roman"/>
-                <w:sz w:val="20"/>
-                <w:szCs w:val="20"/>
-              </w:rPr>
-            </w:pPr>
-            <w:r>
-              <w:rPr>
-                <w:rFonts w:ascii="Times New Roman" w:hAnsi="Times New Roman" w:cs="Times New Roman"/>
-                <w:sz w:val="20"/>
-                <w:szCs w:val="20"/>
+                <w:sz w:val="18"/>
+                <w:szCs w:val="18"/>
+              </w:rPr>
+            </w:pPr>
+            <w:r>
+              <w:rPr>
+                <w:rFonts w:ascii="Times New Roman" w:hAnsi="Times New Roman" w:cs="Times New Roman"/>
+                <w:sz w:val="18"/>
+                <w:szCs w:val="18"/>
               </w:rPr>
               <w:t>Y5</w:t>
             </w:r>
@@ -3967,7 +3859,7 @@
         </w:tc>
         <w:tc>
           <w:tcPr>
-            <w:tcW w:w="1417" w:type="dxa"/>
+            <w:tcW w:w="992" w:type="dxa"/>
             <w:tcBorders>
               <w:top w:val="single" w:sz="4" w:space="0" w:color="000000"/>
               <w:left w:val="single" w:sz="4" w:space="0" w:color="000000"/>
@@ -3983,15 +3875,15 @@
               <w:jc w:val="center"/>
               <w:rPr>
                 <w:rFonts w:ascii="Times New Roman" w:hAnsi="Times New Roman" w:cs="Times New Roman"/>
-                <w:sz w:val="20"/>
-                <w:szCs w:val="20"/>
-              </w:rPr>
-            </w:pPr>
-            <w:r>
-              <w:rPr>
-                <w:rFonts w:ascii="Times New Roman" w:hAnsi="Times New Roman" w:cs="Times New Roman"/>
-                <w:sz w:val="20"/>
-                <w:szCs w:val="20"/>
+                <w:sz w:val="18"/>
+                <w:szCs w:val="18"/>
+              </w:rPr>
+            </w:pPr>
+            <w:r>
+              <w:rPr>
+                <w:rFonts w:ascii="Times New Roman" w:hAnsi="Times New Roman" w:cs="Times New Roman"/>
+                <w:sz w:val="18"/>
+                <w:szCs w:val="18"/>
               </w:rPr>
               <w:t>Avg Cost/ Year</w:t>
             </w:r>
@@ -3999,7 +3891,7 @@
         </w:tc>
         <w:tc>
           <w:tcPr>
-            <w:tcW w:w="1389" w:type="dxa"/>
+            <w:tcW w:w="964" w:type="dxa"/>
             <w:tcBorders>
               <w:top w:val="single" w:sz="4" w:space="0" w:color="000000"/>
               <w:left w:val="single" w:sz="5" w:space="0" w:color="000000"/>
@@ -4015,15 +3907,15 @@
               <w:jc w:val="both"/>
               <w:rPr>
                 <w:rFonts w:ascii="Times New Roman" w:hAnsi="Times New Roman" w:cs="Times New Roman"/>
-                <w:sz w:val="20"/>
-                <w:szCs w:val="20"/>
-              </w:rPr>
-            </w:pPr>
-            <w:r>
-              <w:rPr>
-                <w:rFonts w:ascii="Times New Roman" w:hAnsi="Times New Roman" w:cs="Times New Roman"/>
-                <w:sz w:val="20"/>
-                <w:szCs w:val="20"/>
+                <w:sz w:val="18"/>
+                <w:szCs w:val="18"/>
+              </w:rPr>
+            </w:pPr>
+            <w:r>
+              <w:rPr>
+                <w:rFonts w:ascii="Times New Roman" w:hAnsi="Times New Roman" w:cs="Times New Roman"/>
+                <w:sz w:val="18"/>
+                <w:szCs w:val="18"/>
               </w:rPr>
               <w:t>Cost/User /Year</w:t>
             </w:r>
@@ -4036,7 +3928,7 @@
         </w:trPr>
         <w:tc>
           <w:tcPr>
-            <w:tcW w:w="1980" w:type="dxa"/>
+            <w:tcW w:w="2029" w:type="dxa"/>
             <w:tcBorders>
               <w:top w:val="single" w:sz="5" w:space="0" w:color="000000"/>
               <w:left w:val="single" w:sz="4" w:space="0" w:color="000000"/>
@@ -4047,26 +3939,25 @@
           </w:tcPr>
           <w:p>
             <w:pPr>
-              <w:spacing w:line="259" w:lineRule="auto"/>
-              <w:rPr>
-                <w:rFonts w:ascii="Times New Roman" w:hAnsi="Times New Roman" w:cs="Times New Roman"/>
-                <w:sz w:val="20"/>
-                <w:szCs w:val="20"/>
-              </w:rPr>
-            </w:pPr>
-            <w:r>
-              <w:rPr>
-                <w:rFonts w:ascii="Times New Roman" w:hAnsi="Times New Roman" w:cs="Times New Roman"/>
-                <w:sz w:val="20"/>
-                <w:szCs w:val="20"/>
-              </w:rPr>
-              <w:t>LPA</w:t>
-            </w:r>
-          </w:p>
-        </w:tc>
-        <w:tc>
-          <w:tcPr>
-            <w:tcW w:w="886" w:type="dxa"/>
+              <w:rPr>
+                <w:rFonts w:ascii="Times New Roman" w:hAnsi="Times New Roman" w:cs="Times New Roman"/>
+                <w:sz w:val="18"/>
+                <w:szCs w:val="18"/>
+              </w:rPr>
+            </w:pPr>
+            <w:r>
+              <w:rPr>
+                <w:rFonts w:ascii="Times New Roman" w:hAnsi="Times New Roman" w:cs="Times New Roman"/>
+                <w:sz w:val="18"/>
+                <w:szCs w:val="18"/>
+              </w:rPr>
+              <w:t>{{MODULE_NAME}}</w:t>
+            </w:r>
+          </w:p>
+        </w:tc>
+        <w:tc>
+          <w:tcPr>
+            <w:tcW w:w="1591" w:type="dxa"/>
             <w:tcBorders>
               <w:top w:val="single" w:sz="5" w:space="0" w:color="000000"/>
               <w:left w:val="single" w:sz="4" w:space="0" w:color="000000"/>
@@ -4082,17 +3973,51 @@
               <w:jc w:val="center"/>
               <w:rPr>
                 <w:rFonts w:ascii="Times New Roman" w:hAnsi="Times New Roman" w:cs="Times New Roman"/>
-                <w:sz w:val="20"/>
-                <w:szCs w:val="20"/>
-              </w:rPr>
-            </w:pPr>
-            <w:r>
-              <w:rPr>
-                <w:rFonts w:ascii="Times New Roman" w:hAnsi="Times New Roman" w:cs="Times New Roman"/>
-                <w:sz w:val="20"/>
-                <w:szCs w:val="20"/>
-              </w:rPr>
-              <w:t>20</w:t>
+                <w:sz w:val="18"/>
+                <w:szCs w:val="18"/>
+              </w:rPr>
+            </w:pPr>
+            <w:r>
+              <w:rPr>
+                <w:rFonts w:ascii="Times New Roman" w:hAnsi="Times New Roman" w:cs="Times New Roman"/>
+                <w:i/>
+                <w:iCs/>
+                <w:sz w:val="18"/>
+                <w:szCs w:val="18"/>
+              </w:rPr>
+              <w:t>{{NO_OF_USERS}}</w:t>
+            </w:r>
+          </w:p>
+        </w:tc>
+        <w:tc>
+          <w:tcPr>
+            <w:tcW w:w="916" w:type="dxa"/>
+            <w:tcBorders>
+              <w:top w:val="single" w:sz="5" w:space="0" w:color="000000"/>
+              <w:left w:val="single" w:sz="4" w:space="0" w:color="000000"/>
+              <w:bottom w:val="single" w:sz="5" w:space="0" w:color="000000"/>
+              <w:right w:val="single" w:sz="4" w:space="0" w:color="000000"/>
+            </w:tcBorders>
+            <w:shd w:val="clear" w:color="auto" w:fill="DAE9F8"/>
+          </w:tcPr>
+          <w:p>
+            <w:pPr>
+              <w:spacing w:line="259" w:lineRule="auto"/>
+              <w:ind w:left="25"/>
+              <w:jc w:val="both"/>
+              <w:rPr>
+                <w:rFonts w:ascii="Times New Roman" w:hAnsi="Times New Roman" w:cs="Times New Roman"/>
+                <w:sz w:val="18"/>
+                <w:szCs w:val="18"/>
+              </w:rPr>
+            </w:pPr>
+            <w:r>
+              <w:rPr>
+                <w:rFonts w:ascii="Times New Roman" w:hAnsi="Times New Roman" w:cs="Times New Roman"/>
+                <w:sz w:val="18"/>
+                <w:szCs w:val="18"/>
+              </w:rPr>
+              <w:t xml:space="preserve">    </w:t>
             </w:r>
           </w:p>
         </w:tc>
@@ -4114,17 +4039,17 @@
               <w:jc w:val="both"/>
               <w:rPr>
                 <w:rFonts w:ascii="Times New Roman" w:hAnsi="Times New Roman" w:cs="Times New Roman"/>
-                <w:sz w:val="20"/>
-                <w:szCs w:val="20"/>
-              </w:rPr>
-            </w:pPr>
-            <w:r>
-              <w:rPr>
-                <w:rFonts w:ascii="Times New Roman" w:hAnsi="Times New Roman" w:cs="Times New Roman"/>
-                <w:sz w:val="20"/>
-                <w:szCs w:val="20"/>
-              </w:rPr>
-              <w:t xml:space="preserve">    </w:t>
+                <w:sz w:val="18"/>
+                <w:szCs w:val="18"/>
+              </w:rPr>
+            </w:pPr>
+            <w:r>
+              <w:rPr>
+                <w:rFonts w:ascii="Times New Roman" w:hAnsi="Times New Roman" w:cs="Times New Roman"/>
+                <w:sz w:val="18"/>
+                <w:szCs w:val="18"/>
+              </w:rPr>
+              <w:t xml:space="preserve"> </w:t>
             </w:r>
           </w:p>
         </w:tc>
@@ -4146,18 +4071,10 @@
               <w:jc w:val="both"/>
               <w:rPr>
                 <w:rFonts w:ascii="Times New Roman" w:hAnsi="Times New Roman" w:cs="Times New Roman"/>
-                <w:sz w:val="20"/>
-                <w:szCs w:val="20"/>
-              </w:rPr>
-            </w:pPr>
-            <w:r>
-              <w:rPr>
-                <w:rFonts w:ascii="Times New Roman" w:hAnsi="Times New Roman" w:cs="Times New Roman"/>
-                <w:sz w:val="20"/>
-                <w:szCs w:val="20"/>
-              </w:rPr>
-              <w:t xml:space="preserve"> </w:t>
-            </w:r>
+                <w:sz w:val="18"/>
+                <w:szCs w:val="18"/>
+              </w:rPr>
+            </w:pPr>
           </w:p>
         </w:tc>
         <w:tc>
@@ -4178,15 +4095,15 @@
               <w:jc w:val="both"/>
               <w:rPr>
                 <w:rFonts w:ascii="Times New Roman" w:hAnsi="Times New Roman" w:cs="Times New Roman"/>
-                <w:sz w:val="20"/>
-                <w:szCs w:val="20"/>
-              </w:rPr>
-            </w:pPr>
-          </w:p>
-        </w:tc>
-        <w:tc>
-          <w:tcPr>
-            <w:tcW w:w="850" w:type="dxa"/>
+                <w:sz w:val="18"/>
+                <w:szCs w:val="18"/>
+              </w:rPr>
+            </w:pPr>
+          </w:p>
+        </w:tc>
+        <w:tc>
+          <w:tcPr>
+            <w:tcW w:w="992" w:type="dxa"/>
             <w:tcBorders>
               <w:top w:val="single" w:sz="5" w:space="0" w:color="000000"/>
               <w:left w:val="single" w:sz="4" w:space="0" w:color="000000"/>
@@ -4202,39 +4119,15 @@
               <w:jc w:val="both"/>
               <w:rPr>
                 <w:rFonts w:ascii="Times New Roman" w:hAnsi="Times New Roman" w:cs="Times New Roman"/>
-                <w:sz w:val="20"/>
-                <w:szCs w:val="20"/>
-              </w:rPr>
-            </w:pPr>
-          </w:p>
-        </w:tc>
-        <w:tc>
-          <w:tcPr>
-            <w:tcW w:w="851" w:type="dxa"/>
-            <w:tcBorders>
-              <w:top w:val="single" w:sz="5" w:space="0" w:color="000000"/>
-              <w:left w:val="single" w:sz="4" w:space="0" w:color="000000"/>
-              <w:bottom w:val="single" w:sz="5" w:space="0" w:color="000000"/>
-              <w:right w:val="single" w:sz="4" w:space="0" w:color="000000"/>
-            </w:tcBorders>
-            <w:shd w:val="clear" w:color="auto" w:fill="DAE9F8"/>
-          </w:tcPr>
-          <w:p>
-            <w:pPr>
-              <w:spacing w:line="259" w:lineRule="auto"/>
-              <w:ind w:left="25"/>
-              <w:jc w:val="both"/>
-              <w:rPr>
-                <w:rFonts w:ascii="Times New Roman" w:hAnsi="Times New Roman" w:cs="Times New Roman"/>
-                <w:sz w:val="20"/>
-                <w:szCs w:val="20"/>
-              </w:rPr>
-            </w:pPr>
-          </w:p>
-        </w:tc>
-        <w:tc>
-          <w:tcPr>
-            <w:tcW w:w="1417" w:type="dxa"/>
+                <w:sz w:val="18"/>
+                <w:szCs w:val="18"/>
+              </w:rPr>
+            </w:pPr>
+          </w:p>
+        </w:tc>
+        <w:tc>
+          <w:tcPr>
+            <w:tcW w:w="992" w:type="dxa"/>
             <w:tcBorders>
               <w:top w:val="single" w:sz="5" w:space="0" w:color="000000"/>
               <w:left w:val="single" w:sz="4" w:space="0" w:color="000000"/>
@@ -4249,15 +4142,15 @@
               <w:ind w:left="25"/>
               <w:rPr>
                 <w:rFonts w:ascii="Times New Roman" w:hAnsi="Times New Roman" w:cs="Times New Roman"/>
-                <w:sz w:val="20"/>
-                <w:szCs w:val="20"/>
-              </w:rPr>
-            </w:pPr>
-          </w:p>
-        </w:tc>
-        <w:tc>
-          <w:tcPr>
-            <w:tcW w:w="1389" w:type="dxa"/>
+                <w:sz w:val="18"/>
+                <w:szCs w:val="18"/>
+              </w:rPr>
+            </w:pPr>
+          </w:p>
+        </w:tc>
+        <w:tc>
+          <w:tcPr>
+            <w:tcW w:w="964" w:type="dxa"/>
             <w:tcBorders>
               <w:top w:val="single" w:sz="5" w:space="0" w:color="000000"/>
               <w:left w:val="single" w:sz="5" w:space="0" w:color="000000"/>
@@ -4272,482 +4165,8 @@
               <w:ind w:left="26"/>
               <w:rPr>
                 <w:rFonts w:ascii="Times New Roman" w:hAnsi="Times New Roman" w:cs="Times New Roman"/>
-                <w:sz w:val="20"/>
-                <w:szCs w:val="20"/>
-              </w:rPr>
-            </w:pPr>
-          </w:p>
-        </w:tc>
-      </w:tr>
-      <w:tr>
-        <w:trPr>
-          <w:trHeight w:val="250"/>
-        </w:trPr>
-        <w:tc>
-          <w:tcPr>
-            <w:tcW w:w="1980" w:type="dxa"/>
-            <w:tcBorders>
-              <w:top w:val="single" w:sz="5" w:space="0" w:color="000000"/>
-              <w:left w:val="single" w:sz="4" w:space="0" w:color="000000"/>
-              <w:bottom w:val="single" w:sz="5" w:space="0" w:color="000000"/>
-              <w:right w:val="single" w:sz="4" w:space="0" w:color="000000"/>
-            </w:tcBorders>
-            <w:shd w:val="clear" w:color="auto" w:fill="DAE9F8"/>
-          </w:tcPr>
-          <w:p>
-            <w:pPr>
-              <w:spacing w:line="259" w:lineRule="auto"/>
-              <w:rPr>
-                <w:rFonts w:ascii="Times New Roman" w:hAnsi="Times New Roman" w:cs="Times New Roman"/>
-                <w:sz w:val="20"/>
-                <w:szCs w:val="20"/>
-              </w:rPr>
-            </w:pPr>
-            <w:r>
-              <w:rPr>
-                <w:rFonts w:ascii="Times New Roman" w:hAnsi="Times New Roman" w:cs="Times New Roman"/>
-                <w:sz w:val="20"/>
-                <w:szCs w:val="20"/>
-              </w:rPr>
-              <w:t>Internal Audit Management</w:t>
-            </w:r>
-          </w:p>
-        </w:tc>
-        <w:tc>
-          <w:tcPr>
-            <w:tcW w:w="886" w:type="dxa"/>
-            <w:tcBorders>
-              <w:top w:val="single" w:sz="5" w:space="0" w:color="000000"/>
-              <w:left w:val="single" w:sz="4" w:space="0" w:color="000000"/>
-              <w:bottom w:val="single" w:sz="5" w:space="0" w:color="000000"/>
-              <w:right w:val="single" w:sz="4" w:space="0" w:color="000000"/>
-            </w:tcBorders>
-            <w:shd w:val="clear" w:color="auto" w:fill="DAE9F8"/>
-          </w:tcPr>
-          <w:p>
-            <w:pPr>
-              <w:spacing w:line="259" w:lineRule="auto"/>
-              <w:ind w:left="27"/>
-              <w:jc w:val="center"/>
-              <w:rPr>
-                <w:rFonts w:ascii="Times New Roman" w:hAnsi="Times New Roman" w:cs="Times New Roman"/>
-                <w:sz w:val="20"/>
-                <w:szCs w:val="20"/>
-              </w:rPr>
-            </w:pPr>
-            <w:r>
-              <w:rPr>
-                <w:rFonts w:ascii="Times New Roman" w:hAnsi="Times New Roman" w:cs="Times New Roman"/>
-                <w:sz w:val="20"/>
-                <w:szCs w:val="20"/>
-              </w:rPr>
-              <w:t>20</w:t>
-            </w:r>
-          </w:p>
-        </w:tc>
-        <w:tc>
-          <w:tcPr>
-            <w:tcW w:w="851" w:type="dxa"/>
-            <w:tcBorders>
-              <w:top w:val="single" w:sz="5" w:space="0" w:color="000000"/>
-              <w:left w:val="single" w:sz="4" w:space="0" w:color="000000"/>
-              <w:bottom w:val="single" w:sz="5" w:space="0" w:color="000000"/>
-              <w:right w:val="single" w:sz="4" w:space="0" w:color="000000"/>
-            </w:tcBorders>
-            <w:shd w:val="clear" w:color="auto" w:fill="DAE9F8"/>
-          </w:tcPr>
-          <w:p>
-            <w:pPr>
-              <w:spacing w:line="259" w:lineRule="auto"/>
-              <w:ind w:left="25"/>
-              <w:jc w:val="both"/>
-              <w:rPr>
-                <w:rFonts w:ascii="Times New Roman" w:hAnsi="Times New Roman" w:cs="Times New Roman"/>
-                <w:sz w:val="20"/>
-                <w:szCs w:val="20"/>
-              </w:rPr>
-            </w:pPr>
-          </w:p>
-        </w:tc>
-        <w:tc>
-          <w:tcPr>
-            <w:tcW w:w="850" w:type="dxa"/>
-            <w:tcBorders>
-              <w:top w:val="single" w:sz="5" w:space="0" w:color="000000"/>
-              <w:left w:val="single" w:sz="4" w:space="0" w:color="000000"/>
-              <w:bottom w:val="single" w:sz="5" w:space="0" w:color="000000"/>
-              <w:right w:val="single" w:sz="4" w:space="0" w:color="000000"/>
-            </w:tcBorders>
-            <w:shd w:val="clear" w:color="auto" w:fill="DAE9F8"/>
-          </w:tcPr>
-          <w:p>
-            <w:pPr>
-              <w:spacing w:line="259" w:lineRule="auto"/>
-              <w:ind w:left="25"/>
-              <w:rPr>
-                <w:rFonts w:ascii="Times New Roman" w:hAnsi="Times New Roman" w:cs="Times New Roman"/>
-                <w:sz w:val="20"/>
-                <w:szCs w:val="20"/>
-              </w:rPr>
-            </w:pPr>
-            <w:r>
-              <w:rPr>
-                <w:rFonts w:ascii="Times New Roman" w:hAnsi="Times New Roman" w:cs="Times New Roman"/>
-                <w:sz w:val="20"/>
-                <w:szCs w:val="20"/>
-              </w:rPr>
-              <w:t xml:space="preserve">      </w:t>
-            </w:r>
-          </w:p>
-        </w:tc>
-        <w:tc>
-          <w:tcPr>
-            <w:tcW w:w="851" w:type="dxa"/>
-            <w:tcBorders>
-              <w:top w:val="single" w:sz="5" w:space="0" w:color="000000"/>
-              <w:left w:val="single" w:sz="4" w:space="0" w:color="000000"/>
-              <w:bottom w:val="single" w:sz="5" w:space="0" w:color="000000"/>
-              <w:right w:val="single" w:sz="4" w:space="0" w:color="000000"/>
-            </w:tcBorders>
-            <w:shd w:val="clear" w:color="auto" w:fill="DAE9F8"/>
-          </w:tcPr>
-          <w:p>
-            <w:pPr>
-              <w:spacing w:line="259" w:lineRule="auto"/>
-              <w:ind w:left="25"/>
-              <w:rPr>
-                <w:rFonts w:ascii="Times New Roman" w:hAnsi="Times New Roman" w:cs="Times New Roman"/>
-                <w:sz w:val="20"/>
-                <w:szCs w:val="20"/>
-              </w:rPr>
-            </w:pPr>
-          </w:p>
-        </w:tc>
-        <w:tc>
-          <w:tcPr>
-            <w:tcW w:w="850" w:type="dxa"/>
-            <w:tcBorders>
-              <w:top w:val="single" w:sz="5" w:space="0" w:color="000000"/>
-              <w:left w:val="single" w:sz="4" w:space="0" w:color="000000"/>
-              <w:bottom w:val="single" w:sz="5" w:space="0" w:color="000000"/>
-              <w:right w:val="single" w:sz="4" w:space="0" w:color="000000"/>
-            </w:tcBorders>
-            <w:shd w:val="clear" w:color="auto" w:fill="DAE9F8"/>
-          </w:tcPr>
-          <w:p>
-            <w:pPr>
-              <w:spacing w:line="259" w:lineRule="auto"/>
-              <w:ind w:left="25"/>
-              <w:rPr>
-                <w:rFonts w:ascii="Times New Roman" w:hAnsi="Times New Roman" w:cs="Times New Roman"/>
-                <w:sz w:val="20"/>
-                <w:szCs w:val="20"/>
-              </w:rPr>
-            </w:pPr>
-          </w:p>
-        </w:tc>
-        <w:tc>
-          <w:tcPr>
-            <w:tcW w:w="851" w:type="dxa"/>
-            <w:tcBorders>
-              <w:top w:val="single" w:sz="5" w:space="0" w:color="000000"/>
-              <w:left w:val="single" w:sz="4" w:space="0" w:color="000000"/>
-              <w:bottom w:val="single" w:sz="5" w:space="0" w:color="000000"/>
-              <w:right w:val="single" w:sz="4" w:space="0" w:color="000000"/>
-            </w:tcBorders>
-            <w:shd w:val="clear" w:color="auto" w:fill="DAE9F8"/>
-          </w:tcPr>
-          <w:p>
-            <w:pPr>
-              <w:spacing w:line="259" w:lineRule="auto"/>
-              <w:ind w:left="25"/>
-              <w:rPr>
-                <w:rFonts w:ascii="Times New Roman" w:hAnsi="Times New Roman" w:cs="Times New Roman"/>
-                <w:sz w:val="20"/>
-                <w:szCs w:val="20"/>
-              </w:rPr>
-            </w:pPr>
-          </w:p>
-        </w:tc>
-        <w:tc>
-          <w:tcPr>
-            <w:tcW w:w="1417" w:type="dxa"/>
-            <w:tcBorders>
-              <w:top w:val="single" w:sz="5" w:space="0" w:color="000000"/>
-              <w:left w:val="single" w:sz="4" w:space="0" w:color="000000"/>
-              <w:bottom w:val="single" w:sz="5" w:space="0" w:color="000000"/>
-              <w:right w:val="single" w:sz="5" w:space="0" w:color="000000"/>
-            </w:tcBorders>
-            <w:shd w:val="clear" w:color="auto" w:fill="DAE9F8"/>
-          </w:tcPr>
-          <w:p>
-            <w:pPr>
-              <w:spacing w:line="259" w:lineRule="auto"/>
-              <w:ind w:left="25"/>
-              <w:rPr>
-                <w:rFonts w:ascii="Times New Roman" w:hAnsi="Times New Roman" w:cs="Times New Roman"/>
-                <w:sz w:val="20"/>
-                <w:szCs w:val="20"/>
-              </w:rPr>
-            </w:pPr>
-          </w:p>
-        </w:tc>
-        <w:tc>
-          <w:tcPr>
-            <w:tcW w:w="1389" w:type="dxa"/>
-            <w:tcBorders>
-              <w:top w:val="single" w:sz="5" w:space="0" w:color="000000"/>
-              <w:left w:val="single" w:sz="5" w:space="0" w:color="000000"/>
-              <w:bottom w:val="single" w:sz="5" w:space="0" w:color="000000"/>
-              <w:right w:val="single" w:sz="5" w:space="0" w:color="000000"/>
-            </w:tcBorders>
-            <w:shd w:val="clear" w:color="auto" w:fill="DAE9F8"/>
-          </w:tcPr>
-          <w:p>
-            <w:pPr>
-              <w:spacing w:line="259" w:lineRule="auto"/>
-              <w:ind w:left="26"/>
-              <w:rPr>
-                <w:rFonts w:ascii="Times New Roman" w:hAnsi="Times New Roman" w:cs="Times New Roman"/>
-                <w:sz w:val="20"/>
-                <w:szCs w:val="20"/>
-              </w:rPr>
-            </w:pPr>
-          </w:p>
-        </w:tc>
-      </w:tr>
-      <w:tr>
-        <w:trPr>
-          <w:trHeight w:val="252"/>
-        </w:trPr>
-        <w:tc>
-          <w:tcPr>
-            <w:tcW w:w="1980" w:type="dxa"/>
-            <w:tcBorders>
-              <w:top w:val="single" w:sz="5" w:space="0" w:color="000000"/>
-              <w:left w:val="single" w:sz="4" w:space="0" w:color="000000"/>
-              <w:bottom w:val="single" w:sz="5" w:space="0" w:color="000000"/>
-              <w:right w:val="single" w:sz="4" w:space="0" w:color="000000"/>
-            </w:tcBorders>
-            <w:shd w:val="clear" w:color="auto" w:fill="DAE9F8"/>
-          </w:tcPr>
-          <w:p>
-            <w:pPr>
-              <w:spacing w:line="259" w:lineRule="auto"/>
-              <w:rPr>
-                <w:rFonts w:ascii="Times New Roman" w:hAnsi="Times New Roman" w:cs="Times New Roman"/>
-                <w:sz w:val="20"/>
-                <w:szCs w:val="20"/>
-              </w:rPr>
-            </w:pPr>
-            <w:r>
-              <w:rPr>
-                <w:rFonts w:ascii="Times New Roman" w:hAnsi="Times New Roman" w:cs="Times New Roman"/>
-                <w:sz w:val="20"/>
-                <w:szCs w:val="20"/>
-              </w:rPr>
-              <w:t>KPI I MRM</w:t>
-            </w:r>
-          </w:p>
-        </w:tc>
-        <w:tc>
-          <w:tcPr>
-            <w:tcW w:w="886" w:type="dxa"/>
-            <w:tcBorders>
-              <w:top w:val="single" w:sz="5" w:space="0" w:color="000000"/>
-              <w:left w:val="single" w:sz="4" w:space="0" w:color="000000"/>
-              <w:bottom w:val="single" w:sz="5" w:space="0" w:color="000000"/>
-              <w:right w:val="single" w:sz="4" w:space="0" w:color="000000"/>
-            </w:tcBorders>
-            <w:shd w:val="clear" w:color="auto" w:fill="DAE9F8"/>
-          </w:tcPr>
-          <w:p>
-            <w:pPr>
-              <w:spacing w:line="259" w:lineRule="auto"/>
-              <w:ind w:left="27"/>
-              <w:jc w:val="center"/>
-              <w:rPr>
-                <w:rFonts w:ascii="Times New Roman" w:hAnsi="Times New Roman" w:cs="Times New Roman"/>
-                <w:sz w:val="20"/>
-                <w:szCs w:val="20"/>
-              </w:rPr>
-            </w:pPr>
-            <w:r>
-              <w:rPr>
-                <w:rFonts w:ascii="Times New Roman" w:hAnsi="Times New Roman" w:cs="Times New Roman"/>
-                <w:sz w:val="20"/>
-                <w:szCs w:val="20"/>
-              </w:rPr>
-              <w:t>20</w:t>
-            </w:r>
-          </w:p>
-        </w:tc>
-        <w:tc>
-          <w:tcPr>
-            <w:tcW w:w="851" w:type="dxa"/>
-            <w:tcBorders>
-              <w:top w:val="single" w:sz="5" w:space="0" w:color="000000"/>
-              <w:left w:val="single" w:sz="4" w:space="0" w:color="000000"/>
-              <w:bottom w:val="single" w:sz="5" w:space="0" w:color="000000"/>
-              <w:right w:val="single" w:sz="4" w:space="0" w:color="000000"/>
-            </w:tcBorders>
-            <w:shd w:val="clear" w:color="auto" w:fill="DAE9F8"/>
-          </w:tcPr>
-          <w:p>
-            <w:pPr>
-              <w:spacing w:line="259" w:lineRule="auto"/>
-              <w:ind w:left="25"/>
-              <w:jc w:val="both"/>
-              <w:rPr>
-                <w:rFonts w:ascii="Times New Roman" w:hAnsi="Times New Roman" w:cs="Times New Roman"/>
-                <w:sz w:val="20"/>
-                <w:szCs w:val="20"/>
-              </w:rPr>
-            </w:pPr>
-            <w:r>
-              <w:rPr>
-                <w:rFonts w:ascii="Times New Roman" w:hAnsi="Times New Roman" w:cs="Times New Roman"/>
-                <w:sz w:val="20"/>
-                <w:szCs w:val="20"/>
-              </w:rPr>
-              <w:t xml:space="preserve">    </w:t>
-            </w:r>
-          </w:p>
-        </w:tc>
-        <w:tc>
-          <w:tcPr>
-            <w:tcW w:w="850" w:type="dxa"/>
-            <w:tcBorders>
-              <w:top w:val="single" w:sz="5" w:space="0" w:color="000000"/>
-              <w:left w:val="single" w:sz="4" w:space="0" w:color="000000"/>
-              <w:bottom w:val="single" w:sz="5" w:space="0" w:color="000000"/>
-              <w:right w:val="single" w:sz="4" w:space="0" w:color="000000"/>
-            </w:tcBorders>
-            <w:shd w:val="clear" w:color="auto" w:fill="DAE9F8"/>
-          </w:tcPr>
-          <w:p>
-            <w:pPr>
-              <w:spacing w:line="259" w:lineRule="auto"/>
-              <w:ind w:left="25"/>
-              <w:rPr>
-                <w:rFonts w:ascii="Times New Roman" w:hAnsi="Times New Roman" w:cs="Times New Roman"/>
-                <w:sz w:val="20"/>
-                <w:szCs w:val="20"/>
-              </w:rPr>
-            </w:pPr>
-          </w:p>
-        </w:tc>
-        <w:tc>
-          <w:tcPr>
-            <w:tcW w:w="851" w:type="dxa"/>
-            <w:tcBorders>
-              <w:top w:val="single" w:sz="5" w:space="0" w:color="000000"/>
-              <w:left w:val="single" w:sz="4" w:space="0" w:color="000000"/>
-              <w:bottom w:val="single" w:sz="5" w:space="0" w:color="000000"/>
-              <w:right w:val="single" w:sz="4" w:space="0" w:color="000000"/>
-            </w:tcBorders>
-            <w:shd w:val="clear" w:color="auto" w:fill="DAE9F8"/>
-          </w:tcPr>
-          <w:p>
-            <w:pPr>
-              <w:spacing w:line="259" w:lineRule="auto"/>
-              <w:ind w:left="25"/>
-              <w:rPr>
-                <w:rFonts w:ascii="Times New Roman" w:hAnsi="Times New Roman" w:cs="Times New Roman"/>
-                <w:sz w:val="20"/>
-                <w:szCs w:val="20"/>
-              </w:rPr>
-            </w:pPr>
-          </w:p>
-        </w:tc>
-        <w:tc>
-          <w:tcPr>
-            <w:tcW w:w="850" w:type="dxa"/>
-            <w:tcBorders>
-              <w:top w:val="single" w:sz="5" w:space="0" w:color="000000"/>
-              <w:left w:val="single" w:sz="4" w:space="0" w:color="000000"/>
-              <w:bottom w:val="single" w:sz="5" w:space="0" w:color="000000"/>
-              <w:right w:val="single" w:sz="4" w:space="0" w:color="000000"/>
-            </w:tcBorders>
-            <w:shd w:val="clear" w:color="auto" w:fill="DAE9F8"/>
-          </w:tcPr>
-          <w:p>
-            <w:pPr>
-              <w:spacing w:line="259" w:lineRule="auto"/>
-              <w:ind w:left="25"/>
-              <w:rPr>
-                <w:rFonts w:ascii="Times New Roman" w:hAnsi="Times New Roman" w:cs="Times New Roman"/>
-                <w:sz w:val="20"/>
-                <w:szCs w:val="20"/>
-              </w:rPr>
-            </w:pPr>
-          </w:p>
-        </w:tc>
-        <w:tc>
-          <w:tcPr>
-            <w:tcW w:w="851" w:type="dxa"/>
-            <w:tcBorders>
-              <w:top w:val="single" w:sz="5" w:space="0" w:color="000000"/>
-              <w:left w:val="single" w:sz="4" w:space="0" w:color="000000"/>
-              <w:bottom w:val="single" w:sz="5" w:space="0" w:color="000000"/>
-              <w:right w:val="single" w:sz="4" w:space="0" w:color="000000"/>
-            </w:tcBorders>
-            <w:shd w:val="clear" w:color="auto" w:fill="DAE9F8"/>
-          </w:tcPr>
-          <w:p>
-            <w:pPr>
-              <w:spacing w:line="259" w:lineRule="auto"/>
-              <w:ind w:left="25"/>
-              <w:rPr>
-                <w:rFonts w:ascii="Times New Roman" w:hAnsi="Times New Roman" w:cs="Times New Roman"/>
-                <w:sz w:val="20"/>
-                <w:szCs w:val="20"/>
-              </w:rPr>
-            </w:pPr>
-          </w:p>
-        </w:tc>
-        <w:tc>
-          <w:tcPr>
-            <w:tcW w:w="1417" w:type="dxa"/>
-            <w:tcBorders>
-              <w:top w:val="single" w:sz="5" w:space="0" w:color="000000"/>
-              <w:left w:val="single" w:sz="4" w:space="0" w:color="000000"/>
-              <w:bottom w:val="single" w:sz="5" w:space="0" w:color="000000"/>
-              <w:right w:val="single" w:sz="5" w:space="0" w:color="000000"/>
-            </w:tcBorders>
-            <w:shd w:val="clear" w:color="auto" w:fill="DAE9F8"/>
-          </w:tcPr>
-          <w:p>
-            <w:pPr>
-              <w:spacing w:line="259" w:lineRule="auto"/>
-              <w:ind w:left="25"/>
-              <w:rPr>
-                <w:rFonts w:ascii="Times New Roman" w:hAnsi="Times New Roman" w:cs="Times New Roman"/>
-                <w:sz w:val="20"/>
-                <w:szCs w:val="20"/>
-              </w:rPr>
-            </w:pPr>
-          </w:p>
-        </w:tc>
-        <w:tc>
-          <w:tcPr>
-            <w:tcW w:w="1389" w:type="dxa"/>
-            <w:tcBorders>
-              <w:top w:val="single" w:sz="5" w:space="0" w:color="000000"/>
-              <w:left w:val="single" w:sz="5" w:space="0" w:color="000000"/>
-              <w:bottom w:val="single" w:sz="5" w:space="0" w:color="000000"/>
-              <w:right w:val="single" w:sz="5" w:space="0" w:color="000000"/>
-            </w:tcBorders>
-            <w:shd w:val="clear" w:color="auto" w:fill="DAE9F8"/>
-          </w:tcPr>
-          <w:p>
-            <w:pPr>
-              <w:spacing w:line="259" w:lineRule="auto"/>
-              <w:ind w:left="26"/>
-              <w:rPr>
-                <w:rFonts w:ascii="Times New Roman" w:hAnsi="Times New Roman" w:cs="Times New Roman"/>
-                <w:sz w:val="20"/>
-                <w:szCs w:val="20"/>
+                <w:sz w:val="18"/>
+                <w:szCs w:val="18"/>
               </w:rPr>
             </w:pPr>
           </w:p>
@@ -4756,73 +4175,48 @@
     </w:tbl>
     <w:p>
       <w:pPr>
-        <w:spacing w:after="200"/>
-        <w:rPr>
-          <w:rFonts w:ascii="Times New Roman" w:hAnsi="Times New Roman" w:cs="Times New Roman"/>
-        </w:rPr>
-      </w:pPr>
-    </w:p>
-    <w:p>
-      <w:pPr>
-        <w:spacing w:after="160" w:line="259" w:lineRule="auto"/>
-        <w:rPr>
-          <w:rFonts w:ascii="Times New Roman" w:hAnsi="Times New Roman" w:cs="Times New Roman"/>
-        </w:rPr>
-      </w:pPr>
-      <w:r>
+        <w:spacing w:before="300" w:after="150"/>
         <w:rPr>
           <w:rFonts w:ascii="Times New Roman" w:hAnsi="Times New Roman" w:cs="Times New Roman"/>
           <w:w w:val="101"/>
         </w:rPr>
-        <w:t>Time</w:t>
-      </w:r>
-      <w:r>
-        <w:rPr>
-          <w:rFonts w:ascii="Times New Roman" w:hAnsi="Times New Roman" w:cs="Times New Roman"/>
-          <w:spacing w:val="-3"/>
+      </w:pPr>
+      <w:r>
+        <w:rPr>
+          <w:rFonts w:ascii="Times New Roman" w:hAnsi="Times New Roman" w:cs="Times New Roman"/>
           <w:w w:val="101"/>
         </w:rPr>
-        <w:t xml:space="preserve"> </w:t>
-      </w:r>
-      <w:r>
-        <w:rPr>
-          <w:rFonts w:ascii="Times New Roman" w:hAnsi="Times New Roman" w:cs="Times New Roman"/>
-          <w:w w:val="101"/>
-        </w:rPr>
-        <w:t>Estimate</w:t>
-      </w:r>
-      <w:r>
-        <w:rPr>
-          <w:rFonts w:ascii="Times New Roman" w:hAnsi="Times New Roman" w:cs="Times New Roman"/>
-          <w:spacing w:val="-5"/>
-          <w:w w:val="101"/>
-        </w:rPr>
-        <w:t xml:space="preserve"> </w:t>
+        <w:t>Time Estimate</w:t>
       </w:r>
     </w:p>
     <w:tbl>
       <w:tblPr>
         <w:tblStyle w:val="TableGrid0"/>
-        <w:tblW w:w="0" w:type="auto"/>
+        <w:tblW w:w="10063" w:type="dxa"/>
         <w:tblLook w:val="04A0" w:firstRow="1" w:lastRow="0" w:firstColumn="1" w:lastColumn="0" w:noHBand="0" w:noVBand="1"/>
       </w:tblPr>
       <w:tblGrid>
-        <w:gridCol w:w="2734"/>
-        <w:gridCol w:w="3626"/>
-        <w:gridCol w:w="3670"/>
+        <w:gridCol w:w="4162"/>
+        <w:gridCol w:w="744"/>
+        <w:gridCol w:w="744"/>
+        <w:gridCol w:w="744"/>
+        <w:gridCol w:w="745"/>
+        <w:gridCol w:w="744"/>
+        <w:gridCol w:w="744"/>
+        <w:gridCol w:w="744"/>
+        <w:gridCol w:w="692"/>
       </w:tblGrid>
       <w:tr>
         <w:trPr>
-          <w:trHeight w:val="759"/>
+          <w:trHeight w:val="305"/>
         </w:trPr>
         <w:tc>
           <w:tcPr>
-            <w:tcW w:w="2830" w:type="dxa"/>
-          </w:tcPr>
-          <w:p>
-            <w:pPr>
-              <w:spacing w:after="160" w:line="259" w:lineRule="auto"/>
-              <w:jc w:val="center"/>
+            <w:tcW w:w="4162" w:type="dxa"/>
+            <w:vMerge w:val="restart"/>
+          </w:tcPr>
+          <w:p>
+            <w:pPr>
               <w:rPr>
                 <w:rFonts w:ascii="Times New Roman" w:hAnsi="Times New Roman" w:cs="Times New Roman"/>
               </w:rPr>
@@ -4837,14 +4231,11 @@
         </w:tc>
         <w:tc>
           <w:tcPr>
-            <w:tcW w:w="3626" w:type="dxa"/>
-            <w:tcBorders>
-              <w:bottom w:val="single" w:sz="2" w:space="0" w:color="auto"/>
-            </w:tcBorders>
-          </w:tcPr>
-          <w:p>
-            <w:pPr>
-              <w:spacing w:after="160" w:line="259" w:lineRule="auto"/>
+            <w:tcW w:w="2977" w:type="dxa"/>
+            <w:gridSpan w:val="4"/>
+          </w:tcPr>
+          <w:p>
+            <w:pPr>
               <w:rPr>
                 <w:rFonts w:ascii="Times New Roman" w:hAnsi="Times New Roman" w:cs="Times New Roman"/>
               </w:rPr>
@@ -4856,118 +4247,14 @@
               <w:t>Month 1</w:t>
             </w:r>
           </w:p>
-          <w:tbl>
-            <w:tblPr>
-              <w:tblStyle w:val="TableGrid0"/>
-              <w:tblpPr w:leftFromText="180" w:rightFromText="180" w:vertAnchor="text" w:horzAnchor="margin" w:tblpY="40"/>
-              <w:tblOverlap w:val="never"/>
-              <w:tblW w:w="3397" w:type="dxa"/>
-              <w:tblLook w:val="04A0" w:firstRow="1" w:lastRow="0" w:firstColumn="1" w:lastColumn="0" w:noHBand="0" w:noVBand="1"/>
-            </w:tblPr>
-            <w:tblGrid>
-              <w:gridCol w:w="952"/>
-              <w:gridCol w:w="886"/>
-              <w:gridCol w:w="851"/>
-              <w:gridCol w:w="708"/>
-            </w:tblGrid>
-            <w:tr>
-              <w:trPr>
-                <w:trHeight w:val="405"/>
-              </w:trPr>
-              <w:tc>
-                <w:tcPr>
-                  <w:tcW w:w="952" w:type="dxa"/>
-                </w:tcPr>
-                <w:p>
-                  <w:pPr>
-                    <w:spacing w:after="160" w:line="259" w:lineRule="auto"/>
-                    <w:rPr>
-                      <w:rFonts w:ascii="Times New Roman" w:hAnsi="Times New Roman" w:cs="Times New Roman"/>
-                    </w:rPr>
-                  </w:pPr>
-                  <w:r>
-                    <w:rPr>
-                      <w:rFonts w:ascii="Times New Roman" w:hAnsi="Times New Roman" w:cs="Times New Roman"/>
-                    </w:rPr>
-                    <w:t>WK1</w:t>
-                  </w:r>
-                </w:p>
-              </w:tc>
-              <w:tc>
-                <w:tcPr>
-                  <w:tcW w:w="886" w:type="dxa"/>
-                </w:tcPr>
-                <w:p>
-                  <w:pPr>
-                    <w:spacing w:after="160" w:line="259" w:lineRule="auto"/>
-                    <w:rPr>
-                      <w:rFonts w:ascii="Times New Roman" w:hAnsi="Times New Roman" w:cs="Times New Roman"/>
-                    </w:rPr>
-                  </w:pPr>
-                  <w:r>
-                    <w:rPr>
-                      <w:rFonts w:ascii="Times New Roman" w:hAnsi="Times New Roman" w:cs="Times New Roman"/>
-                    </w:rPr>
-                    <w:t>WK2</w:t>
-                  </w:r>
-                </w:p>
-              </w:tc>
-              <w:tc>
-                <w:tcPr>
-                  <w:tcW w:w="851" w:type="dxa"/>
-                </w:tcPr>
-                <w:p>
-                  <w:pPr>
-                    <w:spacing w:after="160" w:line="259" w:lineRule="auto"/>
-                    <w:rPr>
-                      <w:rFonts w:ascii="Times New Roman" w:hAnsi="Times New Roman" w:cs="Times New Roman"/>
-                    </w:rPr>
-                  </w:pPr>
-                  <w:r>
-                    <w:rPr>
-                      <w:rFonts w:ascii="Times New Roman" w:hAnsi="Times New Roman" w:cs="Times New Roman"/>
-                    </w:rPr>
-                    <w:t>WK3</w:t>
-                  </w:r>
-                </w:p>
-              </w:tc>
-              <w:tc>
-                <w:tcPr>
-                  <w:tcW w:w="708" w:type="dxa"/>
-                </w:tcPr>
-                <w:p>
-                  <w:pPr>
-                    <w:spacing w:after="160" w:line="259" w:lineRule="auto"/>
-                    <w:rPr>
-                      <w:rFonts w:ascii="Times New Roman" w:hAnsi="Times New Roman" w:cs="Times New Roman"/>
-                    </w:rPr>
-                  </w:pPr>
-                  <w:r>
-                    <w:rPr>
-                      <w:rFonts w:ascii="Times New Roman" w:hAnsi="Times New Roman" w:cs="Times New Roman"/>
-                    </w:rPr>
-                    <w:t>WK4</w:t>
-                  </w:r>
-                </w:p>
-              </w:tc>
-            </w:tr>
-          </w:tbl>
-          <w:p>
-            <w:pPr>
-              <w:spacing w:after="160" w:line="259" w:lineRule="auto"/>
-              <w:rPr>
-                <w:rFonts w:ascii="Times New Roman" w:hAnsi="Times New Roman" w:cs="Times New Roman"/>
-              </w:rPr>
-            </w:pPr>
-          </w:p>
-        </w:tc>
-        <w:tc>
-          <w:tcPr>
-            <w:tcW w:w="3574" w:type="dxa"/>
-          </w:tcPr>
-          <w:p>
-            <w:pPr>
-              <w:spacing w:after="160" w:line="259" w:lineRule="auto"/>
+        </w:tc>
+        <w:tc>
+          <w:tcPr>
+            <w:tcW w:w="2924" w:type="dxa"/>
+            <w:gridSpan w:val="4"/>
+          </w:tcPr>
+          <w:p>
+            <w:pPr>
               <w:rPr>
                 <w:rFonts w:ascii="Times New Roman" w:hAnsi="Times New Roman" w:cs="Times New Roman"/>
               </w:rPr>
@@ -4978,209 +4265,283 @@
               </w:rPr>
               <w:t>Month 2</w:t>
             </w:r>
-          </w:p>
-          <w:tbl>
-            <w:tblPr>
-              <w:tblStyle w:val="TableGrid0"/>
-              <w:tblpPr w:leftFromText="180" w:rightFromText="180" w:vertAnchor="text" w:tblpY="25"/>
-              <w:tblOverlap w:val="never"/>
-              <w:tblW w:w="3444" w:type="dxa"/>
-              <w:tblLook w:val="04A0" w:firstRow="1" w:lastRow="0" w:firstColumn="1" w:lastColumn="0" w:noHBand="0" w:noVBand="1"/>
-            </w:tblPr>
-            <w:tblGrid>
-              <w:gridCol w:w="861"/>
-              <w:gridCol w:w="861"/>
-              <w:gridCol w:w="861"/>
-              <w:gridCol w:w="861"/>
-            </w:tblGrid>
-            <w:tr>
-              <w:trPr>
-                <w:trHeight w:val="415"/>
-              </w:trPr>
-              <w:tc>
-                <w:tcPr>
-                  <w:tcW w:w="861" w:type="dxa"/>
-                </w:tcPr>
-                <w:p>
-                  <w:pPr>
-                    <w:spacing w:after="160" w:line="259" w:lineRule="auto"/>
-                    <w:rPr>
-                      <w:rFonts w:ascii="Times New Roman" w:hAnsi="Times New Roman" w:cs="Times New Roman"/>
-                    </w:rPr>
-                  </w:pPr>
-                  <w:r>
-                    <w:rPr>
-                      <w:rFonts w:ascii="Times New Roman" w:hAnsi="Times New Roman" w:cs="Times New Roman"/>
-                    </w:rPr>
-                    <w:t>WK1</w:t>
-                  </w:r>
-                </w:p>
-              </w:tc>
-              <w:tc>
-                <w:tcPr>
-                  <w:tcW w:w="861" w:type="dxa"/>
-                </w:tcPr>
-                <w:p>
-                  <w:pPr>
-                    <w:spacing w:after="160" w:line="259" w:lineRule="auto"/>
-                    <w:rPr>
-                      <w:rFonts w:ascii="Times New Roman" w:hAnsi="Times New Roman" w:cs="Times New Roman"/>
-                    </w:rPr>
-                  </w:pPr>
-                  <w:r>
-                    <w:rPr>
-                      <w:rFonts w:ascii="Times New Roman" w:hAnsi="Times New Roman" w:cs="Times New Roman"/>
-                    </w:rPr>
-                    <w:t>WK2</w:t>
-                  </w:r>
-                </w:p>
-              </w:tc>
-              <w:tc>
-                <w:tcPr>
-                  <w:tcW w:w="861" w:type="dxa"/>
-                </w:tcPr>
-                <w:p>
-                  <w:pPr>
-                    <w:spacing w:after="160" w:line="259" w:lineRule="auto"/>
-                    <w:rPr>
-                      <w:rFonts w:ascii="Times New Roman" w:hAnsi="Times New Roman" w:cs="Times New Roman"/>
-                    </w:rPr>
-                  </w:pPr>
-                  <w:r>
-                    <w:rPr>
-                      <w:rFonts w:ascii="Times New Roman" w:hAnsi="Times New Roman" w:cs="Times New Roman"/>
-                    </w:rPr>
-                    <w:t>WK3</w:t>
-                  </w:r>
-                </w:p>
-              </w:tc>
-              <w:tc>
-                <w:tcPr>
-                  <w:tcW w:w="861" w:type="dxa"/>
-                </w:tcPr>
-                <w:p>
-                  <w:pPr>
-                    <w:spacing w:after="160" w:line="259" w:lineRule="auto"/>
-                    <w:rPr>
-                      <w:rFonts w:ascii="Times New Roman" w:hAnsi="Times New Roman" w:cs="Times New Roman"/>
-                    </w:rPr>
-                  </w:pPr>
-                  <w:r>
-                    <w:rPr>
-                      <w:rFonts w:ascii="Times New Roman" w:hAnsi="Times New Roman" w:cs="Times New Roman"/>
-                    </w:rPr>
-                    <w:t>WK4</w:t>
-                  </w:r>
-                </w:p>
-              </w:tc>
-            </w:tr>
-          </w:tbl>
-          <w:p>
-            <w:pPr>
-              <w:spacing w:after="160" w:line="259" w:lineRule="auto"/>
-              <w:rPr>
-                <w:rFonts w:ascii="Times New Roman" w:hAnsi="Times New Roman" w:cs="Times New Roman"/>
-              </w:rPr>
-            </w:pPr>
           </w:p>
         </w:tc>
       </w:tr>
       <w:tr>
         <w:trPr>
-          <w:trHeight w:val="393"/>
+          <w:trHeight w:val="305"/>
         </w:trPr>
         <w:tc>
           <w:tcPr>
-            <w:tcW w:w="2830" w:type="dxa"/>
-          </w:tcPr>
-          <w:p>
-            <w:pPr>
-              <w:spacing w:after="160" w:line="259" w:lineRule="auto"/>
-              <w:rPr>
-                <w:rFonts w:ascii="Times New Roman" w:hAnsi="Times New Roman" w:cs="Times New Roman"/>
-              </w:rPr>
-            </w:pPr>
-            <w:r>
-              <w:rPr>
-                <w:rFonts w:ascii="Times New Roman" w:hAnsi="Times New Roman" w:cs="Times New Roman"/>
-              </w:rPr>
-              <w:t>Pre-Implementation Visits</w:t>
-            </w:r>
-          </w:p>
-        </w:tc>
-        <w:tc>
-          <w:tcPr>
-            <w:tcW w:w="3626" w:type="dxa"/>
-            <w:tcBorders>
-              <w:top w:val="single" w:sz="2" w:space="0" w:color="auto"/>
-            </w:tcBorders>
-          </w:tcPr>
-          <w:p>
-            <w:pPr>
-              <w:spacing w:after="160" w:line="259" w:lineRule="auto"/>
-              <w:rPr>
-                <w:rFonts w:ascii="Times New Roman" w:hAnsi="Times New Roman" w:cs="Times New Roman"/>
-              </w:rPr>
-            </w:pPr>
-          </w:p>
-        </w:tc>
-        <w:tc>
-          <w:tcPr>
-            <w:tcW w:w="3574" w:type="dxa"/>
-          </w:tcPr>
-          <w:p>
-            <w:pPr>
-              <w:spacing w:after="160" w:line="259" w:lineRule="auto"/>
-              <w:rPr>
-                <w:rFonts w:ascii="Times New Roman" w:hAnsi="Times New Roman" w:cs="Times New Roman"/>
-              </w:rPr>
-            </w:pPr>
+            <w:tcW w:w="4162" w:type="dxa"/>
+            <w:vMerge/>
+          </w:tcPr>
+          <w:p>
+            <w:pPr>
+              <w:rPr>
+                <w:rFonts w:ascii="Times New Roman" w:hAnsi="Times New Roman" w:cs="Times New Roman"/>
+              </w:rPr>
+            </w:pPr>
+          </w:p>
+        </w:tc>
+        <w:tc>
+          <w:tcPr>
+            <w:tcW w:w="744" w:type="dxa"/>
+          </w:tcPr>
+          <w:p>
+            <w:pPr>
+              <w:rPr>
+                <w:rFonts w:ascii="Times New Roman" w:hAnsi="Times New Roman" w:cs="Times New Roman"/>
+              </w:rPr>
+            </w:pPr>
+            <w:r>
+              <w:rPr>
+                <w:rFonts w:ascii="Times New Roman" w:hAnsi="Times New Roman" w:cs="Times New Roman"/>
+              </w:rPr>
+              <w:t>WK1</w:t>
+            </w:r>
+          </w:p>
+        </w:tc>
+        <w:tc>
+          <w:tcPr>
+            <w:tcW w:w="744" w:type="dxa"/>
+          </w:tcPr>
+          <w:p>
+            <w:pPr>
+              <w:rPr>
+                <w:rFonts w:ascii="Times New Roman" w:hAnsi="Times New Roman" w:cs="Times New Roman"/>
+              </w:rPr>
+            </w:pPr>
+            <w:r>
+              <w:rPr>
+                <w:rFonts w:ascii="Times New Roman" w:hAnsi="Times New Roman" w:cs="Times New Roman"/>
+              </w:rPr>
+              <w:t>WK2</w:t>
+            </w:r>
+          </w:p>
+        </w:tc>
+        <w:tc>
+          <w:tcPr>
+            <w:tcW w:w="744" w:type="dxa"/>
+          </w:tcPr>
+          <w:p>
+            <w:pPr>
+              <w:rPr>
+                <w:rFonts w:ascii="Times New Roman" w:hAnsi="Times New Roman" w:cs="Times New Roman"/>
+              </w:rPr>
+            </w:pPr>
+            <w:r>
+              <w:rPr>
+                <w:rFonts w:ascii="Times New Roman" w:hAnsi="Times New Roman" w:cs="Times New Roman"/>
+              </w:rPr>
+              <w:t>WK3</w:t>
+            </w:r>
+          </w:p>
+        </w:tc>
+        <w:tc>
+          <w:tcPr>
+            <w:tcW w:w="743" w:type="dxa"/>
+          </w:tcPr>
+          <w:p>
+            <w:pPr>
+              <w:rPr>
+                <w:rFonts w:ascii="Times New Roman" w:hAnsi="Times New Roman" w:cs="Times New Roman"/>
+              </w:rPr>
+            </w:pPr>
+            <w:r>
+              <w:rPr>
+                <w:rFonts w:ascii="Times New Roman" w:hAnsi="Times New Roman" w:cs="Times New Roman"/>
+              </w:rPr>
+              <w:t>WK4</w:t>
+            </w:r>
+          </w:p>
+        </w:tc>
+        <w:tc>
+          <w:tcPr>
+            <w:tcW w:w="744" w:type="dxa"/>
+          </w:tcPr>
+          <w:p>
+            <w:pPr>
+              <w:rPr>
+                <w:rFonts w:ascii="Times New Roman" w:hAnsi="Times New Roman" w:cs="Times New Roman"/>
+              </w:rPr>
+            </w:pPr>
+            <w:r>
+              <w:rPr>
+                <w:rFonts w:ascii="Times New Roman" w:hAnsi="Times New Roman" w:cs="Times New Roman"/>
+              </w:rPr>
+              <w:t>WK1</w:t>
+            </w:r>
+          </w:p>
+        </w:tc>
+        <w:tc>
+          <w:tcPr>
+            <w:tcW w:w="744" w:type="dxa"/>
+          </w:tcPr>
+          <w:p>
+            <w:pPr>
+              <w:rPr>
+                <w:rFonts w:ascii="Times New Roman" w:hAnsi="Times New Roman" w:cs="Times New Roman"/>
+              </w:rPr>
+            </w:pPr>
+            <w:r>
+              <w:rPr>
+                <w:rFonts w:ascii="Times New Roman" w:hAnsi="Times New Roman" w:cs="Times New Roman"/>
+              </w:rPr>
+              <w:t>WK2</w:t>
+            </w:r>
+          </w:p>
+        </w:tc>
+        <w:tc>
+          <w:tcPr>
+            <w:tcW w:w="744" w:type="dxa"/>
+          </w:tcPr>
+          <w:p>
+            <w:pPr>
+              <w:rPr>
+                <w:rFonts w:ascii="Times New Roman" w:hAnsi="Times New Roman" w:cs="Times New Roman"/>
+              </w:rPr>
+            </w:pPr>
+            <w:r>
+              <w:rPr>
+                <w:rFonts w:ascii="Times New Roman" w:hAnsi="Times New Roman" w:cs="Times New Roman"/>
+              </w:rPr>
+              <w:t>WK3</w:t>
+            </w:r>
+          </w:p>
+        </w:tc>
+        <w:tc>
+          <w:tcPr>
+            <w:tcW w:w="690" w:type="dxa"/>
+          </w:tcPr>
+          <w:p>
+            <w:pPr>
+              <w:rPr>
+                <w:rFonts w:ascii="Times New Roman" w:hAnsi="Times New Roman" w:cs="Times New Roman"/>
+              </w:rPr>
+            </w:pPr>
+            <w:r>
+              <w:rPr>
+                <w:rFonts w:ascii="Times New Roman" w:hAnsi="Times New Roman" w:cs="Times New Roman"/>
+              </w:rPr>
+              <w:t>WK4</w:t>
+            </w:r>
           </w:p>
         </w:tc>
       </w:tr>
       <w:tr>
         <w:trPr>
-          <w:trHeight w:val="393"/>
+          <w:trHeight w:val="305"/>
         </w:trPr>
         <w:tc>
           <w:tcPr>
-            <w:tcW w:w="2830" w:type="dxa"/>
-          </w:tcPr>
-          <w:p>
-            <w:pPr>
-              <w:spacing w:after="160" w:line="259" w:lineRule="auto"/>
-              <w:rPr>
-                <w:rFonts w:ascii="Times New Roman" w:hAnsi="Times New Roman" w:cs="Times New Roman"/>
-              </w:rPr>
-            </w:pPr>
-            <w:r>
-              <w:rPr>
-                <w:rFonts w:ascii="Times New Roman" w:hAnsi="Times New Roman" w:cs="Times New Roman"/>
-              </w:rPr>
-              <w:t>Master Preparations</w:t>
-            </w:r>
-          </w:p>
-        </w:tc>
-        <w:tc>
-          <w:tcPr>
-            <w:tcW w:w="3626" w:type="dxa"/>
-          </w:tcPr>
-          <w:p>
-            <w:pPr>
-              <w:spacing w:after="160" w:line="259" w:lineRule="auto"/>
-              <w:rPr>
-                <w:rFonts w:ascii="Times New Roman" w:hAnsi="Times New Roman" w:cs="Times New Roman"/>
-              </w:rPr>
-            </w:pPr>
-          </w:p>
-        </w:tc>
-        <w:tc>
-          <w:tcPr>
-            <w:tcW w:w="3574" w:type="dxa"/>
-          </w:tcPr>
-          <w:p>
-            <w:pPr>
-              <w:spacing w:after="160" w:line="259" w:lineRule="auto"/>
+            <w:tcW w:w="4162" w:type="dxa"/>
+          </w:tcPr>
+          <w:p>
+            <w:pPr>
+              <w:rPr>
+                <w:rFonts w:ascii="Times New Roman" w:hAnsi="Times New Roman" w:cs="Times New Roman"/>
+              </w:rPr>
+            </w:pPr>
+            <w:r>
+              <w:rPr>
+                <w:rFonts w:ascii="Times New Roman" w:hAnsi="Times New Roman" w:cs="Times New Roman"/>
+              </w:rPr>
+              <w:t>Pre-Implementation Visits</w:t>
+            </w:r>
+          </w:p>
+        </w:tc>
+        <w:tc>
+          <w:tcPr>
+            <w:tcW w:w="744" w:type="dxa"/>
+          </w:tcPr>
+          <w:p>
+            <w:pPr>
+              <w:rPr>
+                <w:rFonts w:ascii="Times New Roman" w:hAnsi="Times New Roman" w:cs="Times New Roman"/>
+              </w:rPr>
+            </w:pPr>
+          </w:p>
+        </w:tc>
+        <w:tc>
+          <w:tcPr>
+            <w:tcW w:w="744" w:type="dxa"/>
+          </w:tcPr>
+          <w:p>
+            <w:pPr>
+              <w:rPr>
+                <w:rFonts w:ascii="Times New Roman" w:hAnsi="Times New Roman" w:cs="Times New Roman"/>
+              </w:rPr>
+            </w:pPr>
+          </w:p>
+        </w:tc>
+        <w:tc>
+          <w:tcPr>
+            <w:tcW w:w="744" w:type="dxa"/>
+          </w:tcPr>
+          <w:p>
+            <w:pPr>
+              <w:rPr>
+                <w:rFonts w:ascii="Times New Roman" w:hAnsi="Times New Roman" w:cs="Times New Roman"/>
+              </w:rPr>
+            </w:pPr>
+          </w:p>
+        </w:tc>
+        <w:tc>
+          <w:tcPr>
+            <w:tcW w:w="743" w:type="dxa"/>
+          </w:tcPr>
+          <w:p>
+            <w:pPr>
+              <w:rPr>
+                <w:rFonts w:ascii="Times New Roman" w:hAnsi="Times New Roman" w:cs="Times New Roman"/>
+              </w:rPr>
+            </w:pPr>
+          </w:p>
+        </w:tc>
+        <w:tc>
+          <w:tcPr>
+            <w:tcW w:w="744" w:type="dxa"/>
+          </w:tcPr>
+          <w:p>
+            <w:pPr>
+              <w:rPr>
+                <w:rFonts w:ascii="Times New Roman" w:hAnsi="Times New Roman" w:cs="Times New Roman"/>
+              </w:rPr>
+            </w:pPr>
+          </w:p>
+        </w:tc>
+        <w:tc>
+          <w:tcPr>
+            <w:tcW w:w="744" w:type="dxa"/>
+          </w:tcPr>
+          <w:p>
+            <w:pPr>
+              <w:rPr>
+                <w:rFonts w:ascii="Times New Roman" w:hAnsi="Times New Roman" w:cs="Times New Roman"/>
+              </w:rPr>
+            </w:pPr>
+          </w:p>
+        </w:tc>
+        <w:tc>
+          <w:tcPr>
+            <w:tcW w:w="744" w:type="dxa"/>
+          </w:tcPr>
+          <w:p>
+            <w:pPr>
+              <w:rPr>
+                <w:rFonts w:ascii="Times New Roman" w:hAnsi="Times New Roman" w:cs="Times New Roman"/>
+              </w:rPr>
+            </w:pPr>
+          </w:p>
+        </w:tc>
+        <w:tc>
+          <w:tcPr>
+            <w:tcW w:w="690" w:type="dxa"/>
+          </w:tcPr>
+          <w:p>
+            <w:pPr>
               <w:rPr>
                 <w:rFonts w:ascii="Times New Roman" w:hAnsi="Times New Roman" w:cs="Times New Roman"/>
               </w:rPr>
@@ -5190,60 +4551,116 @@
       </w:tr>
       <w:tr>
         <w:trPr>
-          <w:trHeight w:val="393"/>
+          <w:trHeight w:val="305"/>
         </w:trPr>
         <w:tc>
           <w:tcPr>
-            <w:tcW w:w="2830" w:type="dxa"/>
-          </w:tcPr>
-          <w:p>
-            <w:pPr>
-              <w:spacing w:after="160" w:line="259" w:lineRule="auto"/>
-              <w:rPr>
-                <w:rFonts w:ascii="Times New Roman" w:hAnsi="Times New Roman" w:cs="Times New Roman"/>
-              </w:rPr>
-            </w:pPr>
-            <w:r>
-              <w:rPr>
-                <w:rFonts w:ascii="Times New Roman" w:hAnsi="Times New Roman" w:cs="Times New Roman"/>
-              </w:rPr>
-              <w:lastRenderedPageBreak/>
-              <w:t>{{MODULE_LIST}}</w:t>
-            </w:r>
-            <w:r>
-              <w:rPr>
-                <w:rFonts w:ascii="Times New Roman" w:hAnsi="Times New Roman" w:cs="Times New Roman"/>
-              </w:rPr>
-              <w:t xml:space="preserve"> </w:t>
-            </w:r>
-            <w:r>
-              <w:rPr>
-                <w:rFonts w:ascii="Times New Roman" w:hAnsi="Times New Roman" w:cs="Times New Roman"/>
-              </w:rPr>
-              <w:t>Configuration &amp; Set Up</w:t>
-            </w:r>
-          </w:p>
-        </w:tc>
-        <w:tc>
-          <w:tcPr>
-            <w:tcW w:w="3626" w:type="dxa"/>
-          </w:tcPr>
-          <w:p>
-            <w:pPr>
-              <w:spacing w:after="160" w:line="259" w:lineRule="auto"/>
-              <w:rPr>
-                <w:rFonts w:ascii="Times New Roman" w:hAnsi="Times New Roman" w:cs="Times New Roman"/>
-              </w:rPr>
-            </w:pPr>
-          </w:p>
-        </w:tc>
-        <w:tc>
-          <w:tcPr>
-            <w:tcW w:w="3574" w:type="dxa"/>
-          </w:tcPr>
-          <w:p>
-            <w:pPr>
-              <w:spacing w:after="160" w:line="259" w:lineRule="auto"/>
+            <w:tcW w:w="4162" w:type="dxa"/>
+          </w:tcPr>
+          <w:p>
+            <w:pPr>
+              <w:rPr>
+                <w:rFonts w:ascii="Times New Roman" w:hAnsi="Times New Roman" w:cs="Times New Roman"/>
+              </w:rPr>
+            </w:pPr>
+            <w:r>
+              <w:rPr>
+                <w:rFonts w:ascii="Times New Roman" w:hAnsi="Times New Roman" w:cs="Times New Roman"/>
+              </w:rPr>
+              <w:t>Master Preparations</w:t>
+            </w:r>
+          </w:p>
+        </w:tc>
+        <w:tc>
+          <w:tcPr>
+            <w:tcW w:w="744" w:type="dxa"/>
+          </w:tcPr>
+          <w:p>
+            <w:pPr>
+              <w:rPr>
+                <w:rFonts w:ascii="Times New Roman" w:hAnsi="Times New Roman" w:cs="Times New Roman"/>
+              </w:rPr>
+            </w:pPr>
+          </w:p>
+        </w:tc>
+        <w:tc>
+          <w:tcPr>
+            <w:tcW w:w="744" w:type="dxa"/>
+          </w:tcPr>
+          <w:p>
+            <w:pPr>
+              <w:rPr>
+                <w:rFonts w:ascii="Times New Roman" w:hAnsi="Times New Roman" w:cs="Times New Roman"/>
+              </w:rPr>
+            </w:pPr>
+          </w:p>
+        </w:tc>
+        <w:tc>
+          <w:tcPr>
+            <w:tcW w:w="744" w:type="dxa"/>
+          </w:tcPr>
+          <w:p>
+            <w:pPr>
+              <w:rPr>
+                <w:rFonts w:ascii="Times New Roman" w:hAnsi="Times New Roman" w:cs="Times New Roman"/>
+              </w:rPr>
+            </w:pPr>
+          </w:p>
+        </w:tc>
+        <w:tc>
+          <w:tcPr>
+            <w:tcW w:w="743" w:type="dxa"/>
+          </w:tcPr>
+          <w:p>
+            <w:pPr>
+              <w:rPr>
+                <w:rFonts w:ascii="Times New Roman" w:hAnsi="Times New Roman" w:cs="Times New Roman"/>
+              </w:rPr>
+            </w:pPr>
+          </w:p>
+        </w:tc>
+        <w:tc>
+          <w:tcPr>
+            <w:tcW w:w="744" w:type="dxa"/>
+          </w:tcPr>
+          <w:p>
+            <w:pPr>
+              <w:rPr>
+                <w:rFonts w:ascii="Times New Roman" w:hAnsi="Times New Roman" w:cs="Times New Roman"/>
+              </w:rPr>
+            </w:pPr>
+          </w:p>
+        </w:tc>
+        <w:tc>
+          <w:tcPr>
+            <w:tcW w:w="744" w:type="dxa"/>
+          </w:tcPr>
+          <w:p>
+            <w:pPr>
+              <w:rPr>
+                <w:rFonts w:ascii="Times New Roman" w:hAnsi="Times New Roman" w:cs="Times New Roman"/>
+              </w:rPr>
+            </w:pPr>
+          </w:p>
+        </w:tc>
+        <w:tc>
+          <w:tcPr>
+            <w:tcW w:w="744" w:type="dxa"/>
+          </w:tcPr>
+          <w:p>
+            <w:pPr>
+              <w:rPr>
+                <w:rFonts w:ascii="Times New Roman" w:hAnsi="Times New Roman" w:cs="Times New Roman"/>
+              </w:rPr>
+            </w:pPr>
+          </w:p>
+        </w:tc>
+        <w:tc>
+          <w:tcPr>
+            <w:tcW w:w="690" w:type="dxa"/>
+          </w:tcPr>
+          <w:p>
+            <w:pPr>
               <w:rPr>
                 <w:rFonts w:ascii="Times New Roman" w:hAnsi="Times New Roman" w:cs="Times New Roman"/>
               </w:rPr>
@@ -5253,47 +4670,116 @@
       </w:tr>
       <w:tr>
         <w:trPr>
-          <w:trHeight w:val="393"/>
+          <w:trHeight w:val="305"/>
         </w:trPr>
         <w:tc>
           <w:tcPr>
-            <w:tcW w:w="2830" w:type="dxa"/>
-          </w:tcPr>
-          <w:p>
-            <w:pPr>
-              <w:spacing w:after="160" w:line="259" w:lineRule="auto"/>
-              <w:rPr>
-                <w:rFonts w:ascii="Times New Roman" w:hAnsi="Times New Roman" w:cs="Times New Roman"/>
-              </w:rPr>
-            </w:pPr>
-            <w:r>
-              <w:rPr>
-                <w:rFonts w:ascii="Times New Roman" w:hAnsi="Times New Roman" w:cs="Times New Roman"/>
-              </w:rPr>
-              <w:t>Trainings and Pilot run</w:t>
-            </w:r>
-          </w:p>
-        </w:tc>
-        <w:tc>
-          <w:tcPr>
-            <w:tcW w:w="3626" w:type="dxa"/>
-          </w:tcPr>
-          <w:p>
-            <w:pPr>
-              <w:spacing w:after="160" w:line="259" w:lineRule="auto"/>
-              <w:rPr>
-                <w:rFonts w:ascii="Times New Roman" w:hAnsi="Times New Roman" w:cs="Times New Roman"/>
-              </w:rPr>
-            </w:pPr>
-          </w:p>
-        </w:tc>
-        <w:tc>
-          <w:tcPr>
-            <w:tcW w:w="3574" w:type="dxa"/>
-          </w:tcPr>
-          <w:p>
-            <w:pPr>
-              <w:spacing w:after="160" w:line="259" w:lineRule="auto"/>
+            <w:tcW w:w="4162" w:type="dxa"/>
+          </w:tcPr>
+          <w:p>
+            <w:pPr>
+              <w:rPr>
+                <w:rFonts w:ascii="Times New Roman" w:hAnsi="Times New Roman" w:cs="Times New Roman"/>
+              </w:rPr>
+            </w:pPr>
+            <w:r>
+              <w:rPr>
+                <w:rFonts w:ascii="Times New Roman" w:hAnsi="Times New Roman" w:cs="Times New Roman"/>
+              </w:rPr>
+              <w:t>{{MODULE_LIST}} Configuration &amp; Set Up</w:t>
+            </w:r>
+          </w:p>
+        </w:tc>
+        <w:tc>
+          <w:tcPr>
+            <w:tcW w:w="744" w:type="dxa"/>
+          </w:tcPr>
+          <w:p>
+            <w:pPr>
+              <w:rPr>
+                <w:rFonts w:ascii="Times New Roman" w:hAnsi="Times New Roman" w:cs="Times New Roman"/>
+              </w:rPr>
+            </w:pPr>
+          </w:p>
+        </w:tc>
+        <w:tc>
+          <w:tcPr>
+            <w:tcW w:w="744" w:type="dxa"/>
+          </w:tcPr>
+          <w:p>
+            <w:pPr>
+              <w:rPr>
+                <w:rFonts w:ascii="Times New Roman" w:hAnsi="Times New Roman" w:cs="Times New Roman"/>
+              </w:rPr>
+            </w:pPr>
+          </w:p>
+        </w:tc>
+        <w:tc>
+          <w:tcPr>
+            <w:tcW w:w="744" w:type="dxa"/>
+          </w:tcPr>
+          <w:p>
+            <w:pPr>
+              <w:rPr>
+                <w:rFonts w:ascii="Times New Roman" w:hAnsi="Times New Roman" w:cs="Times New Roman"/>
+              </w:rPr>
+            </w:pPr>
+          </w:p>
+        </w:tc>
+        <w:tc>
+          <w:tcPr>
+            <w:tcW w:w="743" w:type="dxa"/>
+          </w:tcPr>
+          <w:p>
+            <w:pPr>
+              <w:rPr>
+                <w:rFonts w:ascii="Times New Roman" w:hAnsi="Times New Roman" w:cs="Times New Roman"/>
+              </w:rPr>
+            </w:pPr>
+          </w:p>
+        </w:tc>
+        <w:tc>
+          <w:tcPr>
+            <w:tcW w:w="744" w:type="dxa"/>
+          </w:tcPr>
+          <w:p>
+            <w:pPr>
+              <w:rPr>
+                <w:rFonts w:ascii="Times New Roman" w:hAnsi="Times New Roman" w:cs="Times New Roman"/>
+              </w:rPr>
+            </w:pPr>
+          </w:p>
+        </w:tc>
+        <w:tc>
+          <w:tcPr>
+            <w:tcW w:w="744" w:type="dxa"/>
+          </w:tcPr>
+          <w:p>
+            <w:pPr>
+              <w:rPr>
+                <w:rFonts w:ascii="Times New Roman" w:hAnsi="Times New Roman" w:cs="Times New Roman"/>
+              </w:rPr>
+            </w:pPr>
+          </w:p>
+        </w:tc>
+        <w:tc>
+          <w:tcPr>
+            <w:tcW w:w="744" w:type="dxa"/>
+          </w:tcPr>
+          <w:p>
+            <w:pPr>
+              <w:rPr>
+                <w:rFonts w:ascii="Times New Roman" w:hAnsi="Times New Roman" w:cs="Times New Roman"/>
+              </w:rPr>
+            </w:pPr>
+          </w:p>
+        </w:tc>
+        <w:tc>
+          <w:tcPr>
+            <w:tcW w:w="690" w:type="dxa"/>
+          </w:tcPr>
+          <w:p>
+            <w:pPr>
               <w:rPr>
                 <w:rFonts w:ascii="Times New Roman" w:hAnsi="Times New Roman" w:cs="Times New Roman"/>
               </w:rPr>
@@ -5303,47 +4789,116 @@
       </w:tr>
       <w:tr>
         <w:trPr>
-          <w:trHeight w:val="377"/>
+          <w:trHeight w:val="305"/>
         </w:trPr>
         <w:tc>
           <w:tcPr>
-            <w:tcW w:w="2830" w:type="dxa"/>
-          </w:tcPr>
-          <w:p>
-            <w:pPr>
-              <w:spacing w:after="160" w:line="259" w:lineRule="auto"/>
-              <w:rPr>
-                <w:rFonts w:ascii="Times New Roman" w:hAnsi="Times New Roman" w:cs="Times New Roman"/>
-              </w:rPr>
-            </w:pPr>
-            <w:r>
-              <w:rPr>
-                <w:rFonts w:ascii="Times New Roman" w:hAnsi="Times New Roman" w:cs="Times New Roman"/>
-              </w:rPr>
-              <w:t>Data Preparation for Go-Live</w:t>
-            </w:r>
-          </w:p>
-        </w:tc>
-        <w:tc>
-          <w:tcPr>
-            <w:tcW w:w="3626" w:type="dxa"/>
-          </w:tcPr>
-          <w:p>
-            <w:pPr>
-              <w:spacing w:after="160" w:line="259" w:lineRule="auto"/>
-              <w:rPr>
-                <w:rFonts w:ascii="Times New Roman" w:hAnsi="Times New Roman" w:cs="Times New Roman"/>
-              </w:rPr>
-            </w:pPr>
-          </w:p>
-        </w:tc>
-        <w:tc>
-          <w:tcPr>
-            <w:tcW w:w="3574" w:type="dxa"/>
-          </w:tcPr>
-          <w:p>
-            <w:pPr>
-              <w:spacing w:after="160" w:line="259" w:lineRule="auto"/>
+            <w:tcW w:w="4162" w:type="dxa"/>
+          </w:tcPr>
+          <w:p>
+            <w:pPr>
+              <w:rPr>
+                <w:rFonts w:ascii="Times New Roman" w:hAnsi="Times New Roman" w:cs="Times New Roman"/>
+              </w:rPr>
+            </w:pPr>
+            <w:r>
+              <w:rPr>
+                <w:rFonts w:ascii="Times New Roman" w:hAnsi="Times New Roman" w:cs="Times New Roman"/>
+              </w:rPr>
+              <w:t>Trainings and Pilot run</w:t>
+            </w:r>
+          </w:p>
+        </w:tc>
+        <w:tc>
+          <w:tcPr>
+            <w:tcW w:w="744" w:type="dxa"/>
+          </w:tcPr>
+          <w:p>
+            <w:pPr>
+              <w:rPr>
+                <w:rFonts w:ascii="Times New Roman" w:hAnsi="Times New Roman" w:cs="Times New Roman"/>
+              </w:rPr>
+            </w:pPr>
+          </w:p>
+        </w:tc>
+        <w:tc>
+          <w:tcPr>
+            <w:tcW w:w="744" w:type="dxa"/>
+          </w:tcPr>
+          <w:p>
+            <w:pPr>
+              <w:rPr>
+                <w:rFonts w:ascii="Times New Roman" w:hAnsi="Times New Roman" w:cs="Times New Roman"/>
+              </w:rPr>
+            </w:pPr>
+          </w:p>
+        </w:tc>
+        <w:tc>
+          <w:tcPr>
+            <w:tcW w:w="744" w:type="dxa"/>
+          </w:tcPr>
+          <w:p>
+            <w:pPr>
+              <w:rPr>
+                <w:rFonts w:ascii="Times New Roman" w:hAnsi="Times New Roman" w:cs="Times New Roman"/>
+              </w:rPr>
+            </w:pPr>
+          </w:p>
+        </w:tc>
+        <w:tc>
+          <w:tcPr>
+            <w:tcW w:w="743" w:type="dxa"/>
+          </w:tcPr>
+          <w:p>
+            <w:pPr>
+              <w:rPr>
+                <w:rFonts w:ascii="Times New Roman" w:hAnsi="Times New Roman" w:cs="Times New Roman"/>
+              </w:rPr>
+            </w:pPr>
+          </w:p>
+        </w:tc>
+        <w:tc>
+          <w:tcPr>
+            <w:tcW w:w="744" w:type="dxa"/>
+          </w:tcPr>
+          <w:p>
+            <w:pPr>
+              <w:rPr>
+                <w:rFonts w:ascii="Times New Roman" w:hAnsi="Times New Roman" w:cs="Times New Roman"/>
+              </w:rPr>
+            </w:pPr>
+          </w:p>
+        </w:tc>
+        <w:tc>
+          <w:tcPr>
+            <w:tcW w:w="744" w:type="dxa"/>
+          </w:tcPr>
+          <w:p>
+            <w:pPr>
+              <w:rPr>
+                <w:rFonts w:ascii="Times New Roman" w:hAnsi="Times New Roman" w:cs="Times New Roman"/>
+              </w:rPr>
+            </w:pPr>
+          </w:p>
+        </w:tc>
+        <w:tc>
+          <w:tcPr>
+            <w:tcW w:w="744" w:type="dxa"/>
+          </w:tcPr>
+          <w:p>
+            <w:pPr>
+              <w:rPr>
+                <w:rFonts w:ascii="Times New Roman" w:hAnsi="Times New Roman" w:cs="Times New Roman"/>
+              </w:rPr>
+            </w:pPr>
+          </w:p>
+        </w:tc>
+        <w:tc>
+          <w:tcPr>
+            <w:tcW w:w="690" w:type="dxa"/>
+          </w:tcPr>
+          <w:p>
+            <w:pPr>
               <w:rPr>
                 <w:rFonts w:ascii="Times New Roman" w:hAnsi="Times New Roman" w:cs="Times New Roman"/>
               </w:rPr>
@@ -5353,47 +4908,116 @@
       </w:tr>
       <w:tr>
         <w:trPr>
-          <w:trHeight w:val="393"/>
+          <w:trHeight w:val="322"/>
         </w:trPr>
         <w:tc>
           <w:tcPr>
-            <w:tcW w:w="2830" w:type="dxa"/>
-          </w:tcPr>
-          <w:p>
-            <w:pPr>
-              <w:spacing w:after="160" w:line="259" w:lineRule="auto"/>
-              <w:rPr>
-                <w:rFonts w:ascii="Times New Roman" w:hAnsi="Times New Roman" w:cs="Times New Roman"/>
-              </w:rPr>
-            </w:pPr>
-            <w:r>
-              <w:rPr>
-                <w:rFonts w:ascii="Times New Roman" w:hAnsi="Times New Roman" w:cs="Times New Roman"/>
-              </w:rPr>
-              <w:t>Go-Live</w:t>
-            </w:r>
-          </w:p>
-        </w:tc>
-        <w:tc>
-          <w:tcPr>
-            <w:tcW w:w="3626" w:type="dxa"/>
-          </w:tcPr>
-          <w:p>
-            <w:pPr>
-              <w:spacing w:after="160" w:line="259" w:lineRule="auto"/>
-              <w:rPr>
-                <w:rFonts w:ascii="Times New Roman" w:hAnsi="Times New Roman" w:cs="Times New Roman"/>
-              </w:rPr>
-            </w:pPr>
-          </w:p>
-        </w:tc>
-        <w:tc>
-          <w:tcPr>
-            <w:tcW w:w="3574" w:type="dxa"/>
-          </w:tcPr>
-          <w:p>
-            <w:pPr>
-              <w:spacing w:after="160" w:line="259" w:lineRule="auto"/>
+            <w:tcW w:w="4162" w:type="dxa"/>
+          </w:tcPr>
+          <w:p>
+            <w:pPr>
+              <w:rPr>
+                <w:rFonts w:ascii="Times New Roman" w:hAnsi="Times New Roman" w:cs="Times New Roman"/>
+              </w:rPr>
+            </w:pPr>
+            <w:r>
+              <w:rPr>
+                <w:rFonts w:ascii="Times New Roman" w:hAnsi="Times New Roman" w:cs="Times New Roman"/>
+              </w:rPr>
+              <w:t>Data Preparation for Go-Live</w:t>
+            </w:r>
+          </w:p>
+        </w:tc>
+        <w:tc>
+          <w:tcPr>
+            <w:tcW w:w="744" w:type="dxa"/>
+          </w:tcPr>
+          <w:p>
+            <w:pPr>
+              <w:rPr>
+                <w:rFonts w:ascii="Times New Roman" w:hAnsi="Times New Roman" w:cs="Times New Roman"/>
+              </w:rPr>
+            </w:pPr>
+          </w:p>
+        </w:tc>
+        <w:tc>
+          <w:tcPr>
+            <w:tcW w:w="744" w:type="dxa"/>
+          </w:tcPr>
+          <w:p>
+            <w:pPr>
+              <w:rPr>
+                <w:rFonts w:ascii="Times New Roman" w:hAnsi="Times New Roman" w:cs="Times New Roman"/>
+              </w:rPr>
+            </w:pPr>
+          </w:p>
+        </w:tc>
+        <w:tc>
+          <w:tcPr>
+            <w:tcW w:w="744" w:type="dxa"/>
+          </w:tcPr>
+          <w:p>
+            <w:pPr>
+              <w:rPr>
+                <w:rFonts w:ascii="Times New Roman" w:hAnsi="Times New Roman" w:cs="Times New Roman"/>
+              </w:rPr>
+            </w:pPr>
+          </w:p>
+        </w:tc>
+        <w:tc>
+          <w:tcPr>
+            <w:tcW w:w="743" w:type="dxa"/>
+          </w:tcPr>
+          <w:p>
+            <w:pPr>
+              <w:rPr>
+                <w:rFonts w:ascii="Times New Roman" w:hAnsi="Times New Roman" w:cs="Times New Roman"/>
+              </w:rPr>
+            </w:pPr>
+          </w:p>
+        </w:tc>
+        <w:tc>
+          <w:tcPr>
+            <w:tcW w:w="744" w:type="dxa"/>
+          </w:tcPr>
+          <w:p>
+            <w:pPr>
+              <w:rPr>
+                <w:rFonts w:ascii="Times New Roman" w:hAnsi="Times New Roman" w:cs="Times New Roman"/>
+              </w:rPr>
+            </w:pPr>
+          </w:p>
+        </w:tc>
+        <w:tc>
+          <w:tcPr>
+            <w:tcW w:w="744" w:type="dxa"/>
+          </w:tcPr>
+          <w:p>
+            <w:pPr>
+              <w:rPr>
+                <w:rFonts w:ascii="Times New Roman" w:hAnsi="Times New Roman" w:cs="Times New Roman"/>
+              </w:rPr>
+            </w:pPr>
+          </w:p>
+        </w:tc>
+        <w:tc>
+          <w:tcPr>
+            <w:tcW w:w="744" w:type="dxa"/>
+          </w:tcPr>
+          <w:p>
+            <w:pPr>
+              <w:rPr>
+                <w:rFonts w:ascii="Times New Roman" w:hAnsi="Times New Roman" w:cs="Times New Roman"/>
+              </w:rPr>
+            </w:pPr>
+          </w:p>
+        </w:tc>
+        <w:tc>
+          <w:tcPr>
+            <w:tcW w:w="690" w:type="dxa"/>
+          </w:tcPr>
+          <w:p>
+            <w:pPr>
               <w:rPr>
                 <w:rFonts w:ascii="Times New Roman" w:hAnsi="Times New Roman" w:cs="Times New Roman"/>
               </w:rPr>
@@ -5403,15 +5027,133 @@
       </w:tr>
       <w:tr>
         <w:trPr>
-          <w:trHeight w:val="65"/>
+          <w:trHeight w:val="305"/>
         </w:trPr>
         <w:tc>
           <w:tcPr>
-            <w:tcW w:w="2830" w:type="dxa"/>
-          </w:tcPr>
-          <w:p>
-            <w:pPr>
-              <w:spacing w:after="160" w:line="259" w:lineRule="auto"/>
+            <w:tcW w:w="4162" w:type="dxa"/>
+          </w:tcPr>
+          <w:p>
+            <w:pPr>
+              <w:rPr>
+                <w:rFonts w:ascii="Times New Roman" w:hAnsi="Times New Roman" w:cs="Times New Roman"/>
+              </w:rPr>
+            </w:pPr>
+            <w:r>
+              <w:rPr>
+                <w:rFonts w:ascii="Times New Roman" w:hAnsi="Times New Roman" w:cs="Times New Roman"/>
+              </w:rPr>
+              <w:t>Go-Live</w:t>
+            </w:r>
+          </w:p>
+        </w:tc>
+        <w:tc>
+          <w:tcPr>
+            <w:tcW w:w="744" w:type="dxa"/>
+          </w:tcPr>
+          <w:p>
+            <w:pPr>
+              <w:rPr>
+                <w:rFonts w:ascii="Times New Roman" w:hAnsi="Times New Roman" w:cs="Times New Roman"/>
+              </w:rPr>
+            </w:pPr>
+          </w:p>
+        </w:tc>
+        <w:tc>
+          <w:tcPr>
+            <w:tcW w:w="744" w:type="dxa"/>
+          </w:tcPr>
+          <w:p>
+            <w:pPr>
+              <w:rPr>
+                <w:rFonts w:ascii="Times New Roman" w:hAnsi="Times New Roman" w:cs="Times New Roman"/>
+              </w:rPr>
+            </w:pPr>
+          </w:p>
+        </w:tc>
+        <w:tc>
+          <w:tcPr>
+            <w:tcW w:w="744" w:type="dxa"/>
+          </w:tcPr>
+          <w:p>
+            <w:pPr>
+              <w:rPr>
+                <w:rFonts w:ascii="Times New Roman" w:hAnsi="Times New Roman" w:cs="Times New Roman"/>
+              </w:rPr>
+            </w:pPr>
+          </w:p>
+        </w:tc>
+        <w:tc>
+          <w:tcPr>
+            <w:tcW w:w="743" w:type="dxa"/>
+          </w:tcPr>
+          <w:p>
+            <w:pPr>
+              <w:rPr>
+                <w:rFonts w:ascii="Times New Roman" w:hAnsi="Times New Roman" w:cs="Times New Roman"/>
+              </w:rPr>
+            </w:pPr>
+          </w:p>
+        </w:tc>
+        <w:tc>
+          <w:tcPr>
+            <w:tcW w:w="744" w:type="dxa"/>
+          </w:tcPr>
+          <w:p>
+            <w:pPr>
+              <w:rPr>
+                <w:rFonts w:ascii="Times New Roman" w:hAnsi="Times New Roman" w:cs="Times New Roman"/>
+              </w:rPr>
+            </w:pPr>
+          </w:p>
+        </w:tc>
+        <w:tc>
+          <w:tcPr>
+            <w:tcW w:w="744" w:type="dxa"/>
+          </w:tcPr>
+          <w:p>
+            <w:pPr>
+              <w:rPr>
+                <w:rFonts w:ascii="Times New Roman" w:hAnsi="Times New Roman" w:cs="Times New Roman"/>
+              </w:rPr>
+            </w:pPr>
+          </w:p>
+        </w:tc>
+        <w:tc>
+          <w:tcPr>
+            <w:tcW w:w="744" w:type="dxa"/>
+          </w:tcPr>
+          <w:p>
+            <w:pPr>
+              <w:rPr>
+                <w:rFonts w:ascii="Times New Roman" w:hAnsi="Times New Roman" w:cs="Times New Roman"/>
+              </w:rPr>
+            </w:pPr>
+          </w:p>
+        </w:tc>
+        <w:tc>
+          <w:tcPr>
+            <w:tcW w:w="690" w:type="dxa"/>
+          </w:tcPr>
+          <w:p>
+            <w:pPr>
+              <w:rPr>
+                <w:rFonts w:ascii="Times New Roman" w:hAnsi="Times New Roman" w:cs="Times New Roman"/>
+              </w:rPr>
+            </w:pPr>
+          </w:p>
+        </w:tc>
+      </w:tr>
+      <w:tr>
+        <w:trPr>
+          <w:trHeight w:val="305"/>
+        </w:trPr>
+        <w:tc>
+          <w:tcPr>
+            <w:tcW w:w="4162" w:type="dxa"/>
+          </w:tcPr>
+          <w:p>
+            <w:pPr>
               <w:rPr>
                 <w:rFonts w:ascii="Times New Roman" w:hAnsi="Times New Roman" w:cs="Times New Roman"/>
               </w:rPr>
@@ -5426,24 +5168,94 @@
         </w:tc>
         <w:tc>
           <w:tcPr>
-            <w:tcW w:w="3626" w:type="dxa"/>
-          </w:tcPr>
-          <w:p>
-            <w:pPr>
-              <w:spacing w:after="160" w:line="259" w:lineRule="auto"/>
-              <w:rPr>
-                <w:rFonts w:ascii="Times New Roman" w:hAnsi="Times New Roman" w:cs="Times New Roman"/>
-              </w:rPr>
-            </w:pPr>
-          </w:p>
-        </w:tc>
-        <w:tc>
-          <w:tcPr>
-            <w:tcW w:w="3574" w:type="dxa"/>
-          </w:tcPr>
-          <w:p>
-            <w:pPr>
-              <w:spacing w:after="160" w:line="259" w:lineRule="auto"/>
+            <w:tcW w:w="744" w:type="dxa"/>
+          </w:tcPr>
+          <w:p>
+            <w:pPr>
+              <w:rPr>
+                <w:rFonts w:ascii="Times New Roman" w:hAnsi="Times New Roman" w:cs="Times New Roman"/>
+              </w:rPr>
+            </w:pPr>
+          </w:p>
+        </w:tc>
+        <w:tc>
+          <w:tcPr>
+            <w:tcW w:w="744" w:type="dxa"/>
+          </w:tcPr>
+          <w:p>
+            <w:pPr>
+              <w:rPr>
+                <w:rFonts w:ascii="Times New Roman" w:hAnsi="Times New Roman" w:cs="Times New Roman"/>
+              </w:rPr>
+            </w:pPr>
+          </w:p>
+        </w:tc>
+        <w:tc>
+          <w:tcPr>
+            <w:tcW w:w="744" w:type="dxa"/>
+          </w:tcPr>
+          <w:p>
+            <w:pPr>
+              <w:rPr>
+                <w:rFonts w:ascii="Times New Roman" w:hAnsi="Times New Roman" w:cs="Times New Roman"/>
+              </w:rPr>
+            </w:pPr>
+          </w:p>
+        </w:tc>
+        <w:tc>
+          <w:tcPr>
+            <w:tcW w:w="743" w:type="dxa"/>
+          </w:tcPr>
+          <w:p>
+            <w:pPr>
+              <w:rPr>
+                <w:rFonts w:ascii="Times New Roman" w:hAnsi="Times New Roman" w:cs="Times New Roman"/>
+              </w:rPr>
+            </w:pPr>
+          </w:p>
+        </w:tc>
+        <w:tc>
+          <w:tcPr>
+            <w:tcW w:w="744" w:type="dxa"/>
+          </w:tcPr>
+          <w:p>
+            <w:pPr>
+              <w:rPr>
+                <w:rFonts w:ascii="Times New Roman" w:hAnsi="Times New Roman" w:cs="Times New Roman"/>
+              </w:rPr>
+            </w:pPr>
+          </w:p>
+        </w:tc>
+        <w:tc>
+          <w:tcPr>
+            <w:tcW w:w="744" w:type="dxa"/>
+          </w:tcPr>
+          <w:p>
+            <w:pPr>
+              <w:rPr>
+                <w:rFonts w:ascii="Times New Roman" w:hAnsi="Times New Roman" w:cs="Times New Roman"/>
+              </w:rPr>
+            </w:pPr>
+          </w:p>
+        </w:tc>
+        <w:tc>
+          <w:tcPr>
+            <w:tcW w:w="744" w:type="dxa"/>
+          </w:tcPr>
+          <w:p>
+            <w:pPr>
+              <w:rPr>
+                <w:rFonts w:ascii="Times New Roman" w:hAnsi="Times New Roman" w:cs="Times New Roman"/>
+              </w:rPr>
+            </w:pPr>
+          </w:p>
+        </w:tc>
+        <w:tc>
+          <w:tcPr>
+            <w:tcW w:w="690" w:type="dxa"/>
+          </w:tcPr>
+          <w:p>
+            <w:pPr>
               <w:rPr>
                 <w:rFonts w:ascii="Times New Roman" w:hAnsi="Times New Roman" w:cs="Times New Roman"/>
               </w:rPr>
@@ -5460,6 +5272,15 @@
           <w:w w:val="101"/>
         </w:rPr>
       </w:pPr>
+    </w:p>
+    <w:p>
+      <w:pPr>
+        <w:spacing w:before="300" w:after="150"/>
+        <w:rPr>
+          <w:rFonts w:ascii="Times New Roman" w:hAnsi="Times New Roman" w:cs="Times New Roman"/>
+          <w:w w:val="101"/>
+        </w:rPr>
+      </w:pPr>
       <w:r>
         <w:rPr>
           <w:rFonts w:ascii="Times New Roman" w:hAnsi="Times New Roman" w:cs="Times New Roman"/>
@@ -5610,7 +5431,6 @@
         </w:rPr>
         <w:t xml:space="preserve"> </w:t>
       </w:r>
-      <w:proofErr w:type="gramStart"/>
       <w:r>
         <w:rPr>
           <w:rFonts w:ascii="Times New Roman" w:hAnsi="Times New Roman" w:cs="Times New Roman"/>
@@ -5618,7 +5438,6 @@
         </w:rPr>
         <w:t>Organization</w:t>
       </w:r>
-      <w:proofErr w:type="gramEnd"/>
     </w:p>
     <w:p>
       <w:pPr>
@@ -5984,7 +5803,6 @@
         <w:rPr>
           <w:rFonts w:ascii="Times New Roman" w:hAnsi="Times New Roman" w:cs="Times New Roman"/>
         </w:rPr>
-        <w:lastRenderedPageBreak/>
         <w:t xml:space="preserve">BlechTek shall not be liable or deemed to be in default for any delay or failure in performance under this Contract or interruption of services due to strike or </w:t>
       </w:r>
       <w:r>
@@ -6011,15 +5829,6 @@
         </w:rPr>
         <w:t xml:space="preserve"> of our software due to failure or malfunction of computer or telecommunications hardware, network or related equipment at your installation site.</w:t>
       </w:r>
-    </w:p>
-    <w:p>
-      <w:pPr>
-        <w:spacing w:before="160" w:after="40"/>
-        <w:rPr>
-          <w:rFonts w:ascii="Times New Roman" w:hAnsi="Times New Roman" w:cs="Times New Roman"/>
-          <w:color w:val="000000" w:themeColor="text1"/>
-        </w:rPr>
-      </w:pPr>
     </w:p>
     <w:p>
       <w:pPr>
@@ -6112,6 +5921,15 @@
         </w:rPr>
         <w:t>the contract is stalled by you at any stage for a period of more than 60 days.</w:t>
       </w:r>
+    </w:p>
+    <w:p>
+      <w:pPr>
+        <w:spacing w:before="160" w:after="40"/>
+        <w:rPr>
+          <w:rFonts w:ascii="Times New Roman" w:hAnsi="Times New Roman" w:cs="Times New Roman"/>
+          <w:color w:val="000000" w:themeColor="text1"/>
+        </w:rPr>
+      </w:pPr>
     </w:p>
     <w:p>
       <w:pPr>
@@ -7533,7 +7351,7 @@
   <w:style w:type="paragraph" w:default="1" w:styleId="Normal">
     <w:name w:val="Normal"/>
     <w:qFormat/>
-    <w:rsid w:val="007F787B"/>
+    <w:rsid w:val="00240486"/>
   </w:style>
   <w:style w:type="paragraph" w:styleId="Heading1">
     <w:name w:val="heading 1"/>

</xml_diff>

<commit_message>
updates in Time Estimate (Gantt) chart updates to store and shown mdoule wise only showing one module name not repeated name for each rows
</commit_message>
<xml_diff>
--- a/QuotationApp.API/Templates/QuotationTemplate_Updated - Copy.docx
+++ b/QuotationApp.API/Templates/QuotationTemplate_Updated - Copy.docx
@@ -2,17 +2,6 @@
 <file path=word/document.xml><?xml version="1.0" encoding="utf-8"?>
 <w:document xmlns:wpc="http://schemas.microsoft.com/office/word/2010/wordprocessingCanvas" xmlns:cx="http://schemas.microsoft.com/office/drawing/2014/chartex" xmlns:cx1="http://schemas.microsoft.com/office/drawing/2015/9/8/chartex" xmlns:cx2="http://schemas.microsoft.com/office/drawing/2015/10/21/chartex" xmlns:cx3="http://schemas.microsoft.com/office/drawing/2016/5/9/chartex" xmlns:cx4="http://schemas.microsoft.com/office/drawing/2016/5/10/chartex" xmlns:cx5="http://schemas.microsoft.com/office/drawing/2016/5/11/chartex" xmlns:cx6="http://schemas.microsoft.com/office/drawing/2016/5/12/chartex" xmlns:cx7="http://schemas.microsoft.com/office/drawing/2016/5/13/chartex" xmlns:cx8="http://schemas.microsoft.com/office/drawing/2016/5/14/chartex" xmlns:mc="http://schemas.openxmlformats.org/markup-compatibility/2006" xmlns:aink="http://schemas.microsoft.com/office/drawing/2016/ink" xmlns:am3d="http://schemas.microsoft.com/office/drawing/2017/model3d" xmlns:o="urn:schemas-microsoft-com:office:office" xmlns:oel="http://schemas.microsoft.com/office/2019/extlst" xmlns:r="http://schemas.openxmlformats.org/officeDocument/2006/relationships" xmlns:m="http://schemas.openxmlformats.org/officeDocument/2006/math" xmlns:v="urn:schemas-microsoft-com:vml" xmlns:wp14="http://schemas.microsoft.com/office/word/2010/wordprocessingDrawing" xmlns:wp="http://schemas.openxmlformats.org/drawingml/2006/wordprocessingDrawing" xmlns:w10="urn:schemas-microsoft-com:office:word" xmlns:w="http://schemas.openxmlformats.org/wordprocessingml/2006/main" xmlns:w14="http://schemas.microsoft.com/office/word/2010/wordml" xmlns:w15="http://schemas.microsoft.com/office/word/2012/wordml" xmlns:w16cex="http://schemas.microsoft.com/office/word/2018/wordml/cex" xmlns:w16cid="http://schemas.microsoft.com/office/word/2016/wordml/cid" xmlns:w16="http://schemas.microsoft.com/office/word/2018/wordml" xmlns:w16du="http://schemas.microsoft.com/office/word/2023/wordml/word16du" xmlns:w16sdtdh="http://schemas.microsoft.com/office/word/2020/wordml/sdtdatahash" xmlns:w16sdtfl="http://schemas.microsoft.com/office/word/2024/wordml/sdtformatlock" xmlns:w16se="http://schemas.microsoft.com/office/word/2015/wordml/symex" xmlns:wpg="http://schemas.microsoft.com/office/word/2010/wordprocessingGroup" xmlns:wpi="http://schemas.microsoft.com/office/word/2010/wordprocessingInk" xmlns:wne="http://schemas.microsoft.com/office/word/2006/wordml" xmlns:wps="http://schemas.microsoft.com/office/word/2010/wordprocessingShape" mc:Ignorable="w14 w15 w16se w16cid w16 w16cex w16sdtdh w16sdtfl w16du wp14">
   <w:body>
-    <w:p>
-      <w:pPr>
-        <w:spacing w:after="120"/>
-        <w:rPr>
-          <w:rFonts w:ascii="Times New Roman" w:hAnsi="Times New Roman" w:cs="Times New Roman"/>
-          <w:b/>
-          <w:bCs/>
-          <w:color w:val="65AADB"/>
-        </w:rPr>
-      </w:pPr>
-    </w:p>
     <w:p>
       <w:pPr>
         <w:spacing w:after="120"/>
@@ -101,7 +90,18 @@
                 <w:szCs w:val="18"/>
                 <w:lang w:val="en-US"/>
               </w:rPr>
-              <w:t xml:space="preserve">Quotation No: </w:t>
+              <w:t xml:space="preserve">Quotation </w:t>
+            </w:r>
+            <w:proofErr w:type="gramStart"/>
+            <w:r>
+              <w:rPr>
+                <w:rFonts w:ascii="Times New Roman" w:hAnsi="Times New Roman" w:cs="Times New Roman"/>
+                <w:color w:val="000000" w:themeColor="text1"/>
+                <w:sz w:val="18"/>
+                <w:szCs w:val="18"/>
+                <w:lang w:val="en-US"/>
+              </w:rPr>
+              <w:t xml:space="preserve">No: </w:t>
             </w:r>
             <w:r>
               <w:rPr>
@@ -110,7 +110,17 @@
                 <w:sz w:val="18"/>
                 <w:szCs w:val="18"/>
               </w:rPr>
-              <w:t>{{QuotationNo}}</w:t>
+              <w:t>{{</w:t>
+            </w:r>
+            <w:proofErr w:type="gramEnd"/>
+            <w:r>
+              <w:rPr>
+                <w:rFonts w:ascii="Times New Roman" w:hAnsi="Times New Roman" w:cs="Times New Roman"/>
+                <w:color w:val="65AADB"/>
+                <w:sz w:val="18"/>
+                <w:szCs w:val="18"/>
+              </w:rPr>
+              <w:t>QuotationNo}}</w:t>
             </w:r>
           </w:p>
         </w:tc>
@@ -155,6 +165,7 @@
             <w:pPr>
               <w:spacing w:line="360" w:lineRule="auto"/>
             </w:pPr>
+            <w:proofErr w:type="gramStart"/>
             <w:r>
               <w:rPr>
                 <w:rFonts w:ascii="Times New Roman" w:hAnsi="Times New Roman" w:cs="Times New Roman"/>
@@ -172,7 +183,17 @@
                 <w:sz w:val="18"/>
                 <w:szCs w:val="18"/>
               </w:rPr>
-              <w:t>{{Date}}</w:t>
+              <w:t>{{</w:t>
+            </w:r>
+            <w:proofErr w:type="gramEnd"/>
+            <w:r>
+              <w:rPr>
+                <w:rFonts w:ascii="Times New Roman" w:hAnsi="Times New Roman" w:cs="Times New Roman"/>
+                <w:color w:val="65AADB"/>
+                <w:sz w:val="18"/>
+                <w:szCs w:val="18"/>
+              </w:rPr>
+              <w:t>Date}}</w:t>
             </w:r>
           </w:p>
         </w:tc>
@@ -211,7 +232,17 @@
                 <w:sz w:val="18"/>
                 <w:szCs w:val="18"/>
               </w:rPr>
-              <w:t xml:space="preserve">{{CONTACT_PHONE}}  </w:t>
+              <w:t>{{CONTACT_PHONE</w:t>
+            </w:r>
+            <w:proofErr w:type="gramStart"/>
+            <w:r>
+              <w:rPr>
+                <w:rFonts w:ascii="Times New Roman" w:hAnsi="Times New Roman" w:cs="Times New Roman"/>
+                <w:color w:val="65AADB"/>
+                <w:sz w:val="18"/>
+                <w:szCs w:val="18"/>
+              </w:rPr>
+              <w:t xml:space="preserve">}}  </w:t>
             </w:r>
             <w:r>
               <w:rPr>
@@ -220,7 +251,17 @@
                 <w:sz w:val="18"/>
                 <w:szCs w:val="18"/>
               </w:rPr>
-              <w:t xml:space="preserve">|   Email: </w:t>
+              <w:t>|</w:t>
+            </w:r>
+            <w:proofErr w:type="gramEnd"/>
+            <w:r>
+              <w:rPr>
+                <w:rFonts w:ascii="Times New Roman" w:hAnsi="Times New Roman" w:cs="Times New Roman"/>
+                <w:color w:val="000000" w:themeColor="text1"/>
+                <w:sz w:val="18"/>
+                <w:szCs w:val="18"/>
+              </w:rPr>
+              <w:t xml:space="preserve">   Email: </w:t>
             </w:r>
             <w:r>
               <w:rPr>
@@ -415,15 +456,26 @@
           <w:bCs/>
           <w:color w:val="65AADB"/>
         </w:rPr>
-        <w:t>{{ORG_NAME}}</w:t>
-      </w:r>
-      <w:r>
-        <w:rPr>
-          <w:rFonts w:ascii="Times New Roman" w:hAnsi="Times New Roman" w:cs="Times New Roman"/>
+        <w:t>{{ORG_</w:t>
+      </w:r>
+      <w:proofErr w:type="gramStart"/>
+      <w:r>
+        <w:rPr>
+          <w:rFonts w:ascii="Times New Roman" w:hAnsi="Times New Roman" w:cs="Times New Roman"/>
+          <w:b/>
+          <w:bCs/>
           <w:color w:val="65AADB"/>
         </w:rPr>
+        <w:t>NAME}}</w:t>
+      </w:r>
+      <w:r>
+        <w:rPr>
+          <w:rFonts w:ascii="Times New Roman" w:hAnsi="Times New Roman" w:cs="Times New Roman"/>
+          <w:color w:val="65AADB"/>
+        </w:rPr>
         <w:t>.</w:t>
       </w:r>
+      <w:proofErr w:type="gramEnd"/>
     </w:p>
     <w:p>
       <w:pPr>
@@ -751,26 +803,14 @@
     </w:p>
     <w:p>
       <w:pPr>
-        <w:spacing w:after="200"/>
-        <w:rPr>
-          <w:rFonts w:ascii="Times New Roman" w:hAnsi="Times New Roman" w:cs="Times New Roman"/>
+        <w:spacing w:line="240" w:lineRule="auto"/>
+        <w:rPr>
+          <w:rFonts w:ascii="Times New Roman" w:hAnsi="Times New Roman" w:cs="Times New Roman"/>
+          <w:b/>
+          <w:bCs/>
           <w:lang w:val="en-US"/>
         </w:rPr>
       </w:pPr>
-      <w:r>
-        <w:rPr>
-          <w:rFonts w:ascii="Times New Roman" w:hAnsi="Times New Roman" w:cs="Times New Roman"/>
-          <w:lang w:val="en-US"/>
-        </w:rPr>
-        <w:t> </w:t>
-      </w:r>
-      <w:r>
-        <w:rPr>
-          <w:rFonts w:ascii="Times New Roman" w:hAnsi="Times New Roman" w:cs="Times New Roman"/>
-          <w:lang w:val="en-US"/>
-        </w:rPr>
-        <w:t>Sushama Inamdar</w:t>
-      </w:r>
     </w:p>
     <w:p>
       <w:pPr>
@@ -780,6 +820,20 @@
           <w:lang w:val="en-US"/>
         </w:rPr>
       </w:pPr>
+      <w:r>
+        <w:rPr>
+          <w:rFonts w:ascii="Times New Roman" w:hAnsi="Times New Roman" w:cs="Times New Roman"/>
+          <w:lang w:val="en-US"/>
+        </w:rPr>
+        <w:t> </w:t>
+      </w:r>
+      <w:r>
+        <w:rPr>
+          <w:rFonts w:ascii="Times New Roman" w:hAnsi="Times New Roman" w:cs="Times New Roman"/>
+          <w:lang w:val="en-US"/>
+        </w:rPr>
+        <w:t>Sushama Inamdar</w:t>
+      </w:r>
     </w:p>
     <w:p>
       <w:pPr>
@@ -794,6 +848,7 @@
           <w:rFonts w:ascii="Times New Roman" w:hAnsi="Times New Roman" w:cs="Times New Roman"/>
           <w:color w:val="000000" w:themeColor="text1"/>
         </w:rPr>
+        <w:lastRenderedPageBreak/>
         <w:t>Scope</w:t>
       </w:r>
       <w:r>
@@ -2499,7 +2554,21 @@
               <w:rPr>
                 <w:rFonts w:ascii="Times New Roman" w:hAnsi="Times New Roman" w:cs="Times New Roman"/>
               </w:rPr>
-              <w:t>First Year - These Services start a er 1 Month from start of Go Live. Subsequent Years – A er comple on of 7 Man Days</w:t>
+              <w:t xml:space="preserve">First Year - These Services start a er 1 Month from start of Go Live. Subsequent Years – A er </w:t>
+            </w:r>
+            <w:proofErr w:type="spellStart"/>
+            <w:r>
+              <w:rPr>
+                <w:rFonts w:ascii="Times New Roman" w:hAnsi="Times New Roman" w:cs="Times New Roman"/>
+              </w:rPr>
+              <w:t>comple</w:t>
+            </w:r>
+            <w:proofErr w:type="spellEnd"/>
+            <w:r>
+              <w:rPr>
+                <w:rFonts w:ascii="Times New Roman" w:hAnsi="Times New Roman" w:cs="Times New Roman"/>
+              </w:rPr>
+              <w:t xml:space="preserve"> on of 7 Man Days</w:t>
             </w:r>
           </w:p>
         </w:tc>
@@ -2548,7 +2617,6 @@
               <w:rPr>
                 <w:rFonts w:ascii="Times New Roman" w:hAnsi="Times New Roman" w:cs="Times New Roman"/>
               </w:rPr>
-              <w:lastRenderedPageBreak/>
               <w:t>5</w:t>
             </w:r>
           </w:p>
@@ -2623,6 +2691,7 @@
               <w:rPr>
                 <w:rFonts w:ascii="Times New Roman" w:hAnsi="Times New Roman" w:cs="Times New Roman"/>
               </w:rPr>
+              <w:lastRenderedPageBreak/>
               <w:t xml:space="preserve"> 5.1</w:t>
             </w:r>
           </w:p>
@@ -5272,20 +5341,12 @@
           <w:w w:val="101"/>
         </w:rPr>
       </w:pPr>
-    </w:p>
-    <w:p>
-      <w:pPr>
-        <w:spacing w:before="300" w:after="150"/>
+      <w:r>
         <w:rPr>
           <w:rFonts w:ascii="Times New Roman" w:hAnsi="Times New Roman" w:cs="Times New Roman"/>
           <w:w w:val="101"/>
         </w:rPr>
-      </w:pPr>
-      <w:r>
-        <w:rPr>
-          <w:rFonts w:ascii="Times New Roman" w:hAnsi="Times New Roman" w:cs="Times New Roman"/>
-          <w:w w:val="101"/>
-        </w:rPr>
+        <w:lastRenderedPageBreak/>
         <w:t>We</w:t>
       </w:r>
       <w:r>
@@ -5431,6 +5492,7 @@
         </w:rPr>
         <w:t xml:space="preserve"> </w:t>
       </w:r>
+      <w:proofErr w:type="gramStart"/>
       <w:r>
         <w:rPr>
           <w:rFonts w:ascii="Times New Roman" w:hAnsi="Times New Roman" w:cs="Times New Roman"/>
@@ -5438,6 +5500,7 @@
         </w:rPr>
         <w:t>Organization</w:t>
       </w:r>
+      <w:proofErr w:type="gramEnd"/>
     </w:p>
     <w:p>
       <w:pPr>
@@ -5930,6 +5993,14 @@
           <w:color w:val="000000" w:themeColor="text1"/>
         </w:rPr>
       </w:pPr>
+      <w:r>
+        <w:rPr>
+          <w:rFonts w:ascii="Times New Roman" w:hAnsi="Times New Roman" w:cs="Times New Roman"/>
+          <w:color w:val="000000" w:themeColor="text1"/>
+        </w:rPr>
+        <w:lastRenderedPageBreak/>
+        <w:t>8. TDS</w:t>
+      </w:r>
     </w:p>
     <w:p>
       <w:pPr>
@@ -5942,23 +6013,36 @@
       <w:r>
         <w:rPr>
           <w:rFonts w:ascii="Times New Roman" w:hAnsi="Times New Roman" w:cs="Times New Roman"/>
-          <w:color w:val="000000" w:themeColor="text1"/>
-        </w:rPr>
-        <w:t>8. TDS</w:t>
-      </w:r>
-    </w:p>
-    <w:p>
-      <w:pPr>
-        <w:spacing w:before="160" w:after="40"/>
-        <w:rPr>
-          <w:rFonts w:ascii="Times New Roman" w:hAnsi="Times New Roman" w:cs="Times New Roman"/>
-        </w:rPr>
-      </w:pPr>
-      <w:r>
-        <w:rPr>
-          <w:rFonts w:ascii="Times New Roman" w:hAnsi="Times New Roman" w:cs="Times New Roman"/>
-        </w:rPr>
-        <w:t xml:space="preserve">In case of deduction of TDS Amount, You have to give us the TDS certificate immediately along with our Payment. If we do not receive the TDS Certificate within 6 months or by the end of the Financial Year, you </w:t>
+        </w:rPr>
+        <w:t xml:space="preserve">In case of deduction of TDS Amount, </w:t>
+      </w:r>
+      <w:proofErr w:type="gramStart"/>
+      <w:r>
+        <w:rPr>
+          <w:rFonts w:ascii="Times New Roman" w:hAnsi="Times New Roman" w:cs="Times New Roman"/>
+        </w:rPr>
+        <w:t>You</w:t>
+      </w:r>
+      <w:proofErr w:type="gramEnd"/>
+      <w:r>
+        <w:rPr>
+          <w:rFonts w:ascii="Times New Roman" w:hAnsi="Times New Roman" w:cs="Times New Roman"/>
+        </w:rPr>
+        <w:t xml:space="preserve"> </w:t>
+      </w:r>
+      <w:proofErr w:type="gramStart"/>
+      <w:r>
+        <w:rPr>
+          <w:rFonts w:ascii="Times New Roman" w:hAnsi="Times New Roman" w:cs="Times New Roman"/>
+        </w:rPr>
+        <w:t>have to</w:t>
+      </w:r>
+      <w:proofErr w:type="gramEnd"/>
+      <w:r>
+        <w:rPr>
+          <w:rFonts w:ascii="Times New Roman" w:hAnsi="Times New Roman" w:cs="Times New Roman"/>
+        </w:rPr>
+        <w:t xml:space="preserve"> give us the TDS certificate immediately along with our Payment. If we do not receive the TDS Certificate within 6 months or by the end of the Financial Year, you </w:t>
       </w:r>
     </w:p>
     <w:p>
@@ -6210,7 +6294,7 @@
       <w:headerReference w:type="first" r:id="rId12"/>
       <w:footerReference w:type="first" r:id="rId13"/>
       <w:pgSz w:w="12240" w:h="15840"/>
-      <w:pgMar w:top="1000" w:right="1100" w:bottom="1000" w:left="1100" w:header="680" w:footer="737" w:gutter="0"/>
+      <w:pgMar w:top="1000" w:right="1100" w:bottom="1000" w:left="1100" w:header="964" w:footer="340" w:gutter="0"/>
       <w:cols w:space="720"/>
       <w:docGrid w:linePitch="360"/>
     </w:sectPr>
@@ -6300,9 +6384,10 @@
     <w:pPr>
       <w:jc w:val="center"/>
       <w:rPr>
-        <w:color w:val="5B6478"/>
-        <w:sz w:val="14"/>
-        <w:szCs w:val="14"/>
+        <w:rFonts w:ascii="Times New Roman" w:hAnsi="Times New Roman" w:cs="Times New Roman"/>
+        <w:color w:val="000000" w:themeColor="text1"/>
+        <w:sz w:val="18"/>
+        <w:szCs w:val="18"/>
       </w:rPr>
     </w:pPr>
     <w:r>
@@ -6314,6 +6399,27 @@
       </w:rPr>
       <w:t>WindMill Village, Bavdhan, Pune 411021, Maharashtra</w:t>
     </w:r>
+  </w:p>
+  <w:p>
+    <w:pPr>
+      <w:jc w:val="center"/>
+      <w:rPr>
+        <w:rFonts w:ascii="Times New Roman" w:hAnsi="Times New Roman" w:cs="Times New Roman"/>
+        <w:color w:val="000000" w:themeColor="text1"/>
+        <w:sz w:val="18"/>
+        <w:szCs w:val="18"/>
+      </w:rPr>
+    </w:pPr>
+  </w:p>
+  <w:p>
+    <w:pPr>
+      <w:jc w:val="center"/>
+      <w:rPr>
+        <w:color w:val="5B6478"/>
+        <w:sz w:val="14"/>
+        <w:szCs w:val="14"/>
+      </w:rPr>
+    </w:pPr>
     <w:r>
       <w:rPr>
         <w:noProof/>
@@ -6322,7 +6428,7 @@
         <wp:inline distT="0" distB="0" distL="0" distR="0" wp14:anchorId="0C7DB755" wp14:editId="4C568021">
           <wp:extent cx="6375400" cy="47625"/>
           <wp:effectExtent l="0" t="0" r="6350" b="9525"/>
-          <wp:docPr id="1" name="Footer Line"/>
+          <wp:docPr id="1622519558" name="Footer Line"/>
           <wp:cNvGraphicFramePr>
             <a:graphicFrameLocks xmlns:a="http://schemas.openxmlformats.org/drawingml/2006/main" noChangeAspect="1"/>
           </wp:cNvGraphicFramePr>
@@ -6517,68 +6623,23 @@
 <w:hdr xmlns:wpc="http://schemas.microsoft.com/office/word/2010/wordprocessingCanvas" xmlns:cx="http://schemas.microsoft.com/office/drawing/2014/chartex" xmlns:cx1="http://schemas.microsoft.com/office/drawing/2015/9/8/chartex" xmlns:cx2="http://schemas.microsoft.com/office/drawing/2015/10/21/chartex" xmlns:cx3="http://schemas.microsoft.com/office/drawing/2016/5/9/chartex" xmlns:cx4="http://schemas.microsoft.com/office/drawing/2016/5/10/chartex" xmlns:cx5="http://schemas.microsoft.com/office/drawing/2016/5/11/chartex" xmlns:cx6="http://schemas.microsoft.com/office/drawing/2016/5/12/chartex" xmlns:cx7="http://schemas.microsoft.com/office/drawing/2016/5/13/chartex" xmlns:cx8="http://schemas.microsoft.com/office/drawing/2016/5/14/chartex" xmlns:mc="http://schemas.openxmlformats.org/markup-compatibility/2006" xmlns:aink="http://schemas.microsoft.com/office/drawing/2016/ink" xmlns:am3d="http://schemas.microsoft.com/office/drawing/2017/model3d" xmlns:o="urn:schemas-microsoft-com:office:office" xmlns:oel="http://schemas.microsoft.com/office/2019/extlst" xmlns:r="http://schemas.openxmlformats.org/officeDocument/2006/relationships" xmlns:m="http://schemas.openxmlformats.org/officeDocument/2006/math" xmlns:v="urn:schemas-microsoft-com:vml" xmlns:wp14="http://schemas.microsoft.com/office/word/2010/wordprocessingDrawing" xmlns:wp="http://schemas.openxmlformats.org/drawingml/2006/wordprocessingDrawing" xmlns:w10="urn:schemas-microsoft-com:office:word" xmlns:w="http://schemas.openxmlformats.org/wordprocessingml/2006/main" xmlns:w14="http://schemas.microsoft.com/office/word/2010/wordml" xmlns:w15="http://schemas.microsoft.com/office/word/2012/wordml" xmlns:w16cex="http://schemas.microsoft.com/office/word/2018/wordml/cex" xmlns:w16cid="http://schemas.microsoft.com/office/word/2016/wordml/cid" xmlns:w16="http://schemas.microsoft.com/office/word/2018/wordml" xmlns:w16du="http://schemas.microsoft.com/office/word/2023/wordml/word16du" xmlns:w16sdtdh="http://schemas.microsoft.com/office/word/2020/wordml/sdtdatahash" xmlns:w16sdtfl="http://schemas.microsoft.com/office/word/2024/wordml/sdtformatlock" xmlns:w16se="http://schemas.microsoft.com/office/word/2015/wordml/symex" xmlns:wpg="http://schemas.microsoft.com/office/word/2010/wordprocessingGroup" xmlns:wpi="http://schemas.microsoft.com/office/word/2010/wordprocessingInk" xmlns:wne="http://schemas.microsoft.com/office/word/2006/wordml" xmlns:wps="http://schemas.microsoft.com/office/word/2010/wordprocessingShape" mc:Ignorable="w14 w15 w16se w16cid w16 w16cex w16sdtdh w16sdtfl w16du wp14">
   <w:p>
     <w:pPr>
-      <w:tabs>
-        <w:tab w:val="right" w:pos="9026"/>
-      </w:tabs>
+      <w:pStyle w:val="Header"/>
+      <w:rPr>
+        <w:rFonts w:ascii="Times New Roman" w:hAnsi="Times New Roman" w:cs="Times New Roman"/>
+      </w:rPr>
     </w:pPr>
     <w:r>
       <w:rPr>
         <w:noProof/>
       </w:rPr>
       <w:drawing>
-        <wp:anchor distT="0" distB="0" distL="114300" distR="114300" simplePos="0" relativeHeight="251661312" behindDoc="0" locked="0" layoutInCell="1" allowOverlap="1" wp14:anchorId="666FBD31" wp14:editId="35E7A410">
+        <wp:anchor distT="0" distB="0" distL="114300" distR="114300" simplePos="0" relativeHeight="251663360" behindDoc="0" locked="0" layoutInCell="1" allowOverlap="0" wp14:anchorId="0B6759F3" wp14:editId="47C321C3">
           <wp:simplePos x="0" y="0"/>
-          <wp:positionH relativeFrom="column">
-            <wp:posOffset>1398021</wp:posOffset>
-          </wp:positionH>
-          <wp:positionV relativeFrom="paragraph">
-            <wp:posOffset>2949243</wp:posOffset>
-          </wp:positionV>
-          <wp:extent cx="2912249" cy="3307021"/>
-          <wp:effectExtent l="0" t="0" r="0" b="0"/>
-          <wp:wrapNone/>
-          <wp:docPr id="592" name="Picture 1"/>
-          <wp:cNvGraphicFramePr/>
-          <a:graphic xmlns:a="http://schemas.openxmlformats.org/drawingml/2006/main">
-            <a:graphicData uri="http://schemas.openxmlformats.org/drawingml/2006/picture">
-              <pic:pic xmlns:pic="http://schemas.openxmlformats.org/drawingml/2006/picture">
-                <pic:nvPicPr>
-                  <pic:cNvPr id="592" name="Picture 592"/>
-                  <pic:cNvPicPr/>
-                </pic:nvPicPr>
-                <pic:blipFill>
-                  <a:blip r:embed="rId1"/>
-                  <a:stretch>
-                    <a:fillRect/>
-                  </a:stretch>
-                </pic:blipFill>
-                <pic:spPr>
-                  <a:xfrm>
-                    <a:off x="0" y="0"/>
-                    <a:ext cx="2912249" cy="3307021"/>
-                  </a:xfrm>
-                  <a:prstGeom prst="rect">
-                    <a:avLst/>
-                  </a:prstGeom>
-                </pic:spPr>
-              </pic:pic>
-            </a:graphicData>
-          </a:graphic>
-        </wp:anchor>
-      </w:drawing>
-    </w:r>
-    <w:r>
-      <w:rPr>
-        <w:noProof/>
-      </w:rPr>
-      <w:drawing>
-        <wp:anchor distT="0" distB="0" distL="114300" distR="114300" simplePos="0" relativeHeight="251659264" behindDoc="0" locked="0" layoutInCell="1" allowOverlap="0" wp14:anchorId="72C9EF95" wp14:editId="652DBCE7">
-          <wp:simplePos x="0" y="0"/>
-          <wp:positionH relativeFrom="margin">
-            <wp:align>left</wp:align>
+          <wp:positionH relativeFrom="page">
+            <wp:posOffset>819150</wp:posOffset>
           </wp:positionH>
           <wp:positionV relativeFrom="page">
-            <wp:posOffset>384589</wp:posOffset>
+            <wp:posOffset>503555</wp:posOffset>
           </wp:positionV>
           <wp:extent cx="1475232" cy="438912"/>
           <wp:effectExtent l="0" t="0" r="0" b="0"/>
@@ -6593,6 +6654,72 @@
                   <pic:cNvPicPr/>
                 </pic:nvPicPr>
                 <pic:blipFill>
+                  <a:blip r:embed="rId1"/>
+                  <a:stretch>
+                    <a:fillRect/>
+                  </a:stretch>
+                </pic:blipFill>
+                <pic:spPr>
+                  <a:xfrm>
+                    <a:off x="0" y="0"/>
+                    <a:ext cx="1475232" cy="438912"/>
+                  </a:xfrm>
+                  <a:prstGeom prst="rect">
+                    <a:avLst/>
+                  </a:prstGeom>
+                </pic:spPr>
+              </pic:pic>
+            </a:graphicData>
+          </a:graphic>
+        </wp:anchor>
+      </w:drawing>
+    </w:r>
+    <w:r>
+      <w:rPr>
+        <w:sz w:val="36"/>
+      </w:rPr>
+      <w:t xml:space="preserve">                                                               </w:t>
+    </w:r>
+    <w:r>
+      <w:rPr>
+        <w:rFonts w:ascii="Times New Roman" w:hAnsi="Times New Roman" w:cs="Times New Roman"/>
+        <w:sz w:val="36"/>
+      </w:rPr>
+      <w:t>QUOTATION</w:t>
+    </w:r>
+    <w:r>
+      <w:rPr>
+        <w:rFonts w:ascii="Times New Roman" w:hAnsi="Times New Roman" w:cs="Times New Roman"/>
+        <w:noProof/>
+      </w:rPr>
+      <w:t xml:space="preserve"> </w:t>
+    </w:r>
+    <w:r>
+      <w:rPr>
+        <w:noProof/>
+      </w:rPr>
+      <w:drawing>
+        <wp:anchor distT="0" distB="0" distL="114300" distR="114300" simplePos="0" relativeHeight="251661312" behindDoc="0" locked="0" layoutInCell="1" allowOverlap="1" wp14:anchorId="666FBD31" wp14:editId="4B3A5522">
+          <wp:simplePos x="0" y="0"/>
+          <wp:positionH relativeFrom="column">
+            <wp:posOffset>1398021</wp:posOffset>
+          </wp:positionH>
+          <wp:positionV relativeFrom="paragraph">
+            <wp:posOffset>2949243</wp:posOffset>
+          </wp:positionV>
+          <wp:extent cx="2912249" cy="3307021"/>
+          <wp:effectExtent l="0" t="0" r="0" b="0"/>
+          <wp:wrapNone/>
+          <wp:docPr id="1233503933" name="Picture 1"/>
+          <wp:cNvGraphicFramePr/>
+          <a:graphic xmlns:a="http://schemas.openxmlformats.org/drawingml/2006/main">
+            <a:graphicData uri="http://schemas.openxmlformats.org/drawingml/2006/picture">
+              <pic:pic xmlns:pic="http://schemas.openxmlformats.org/drawingml/2006/picture">
+                <pic:nvPicPr>
+                  <pic:cNvPr id="592" name="Picture 592"/>
+                  <pic:cNvPicPr/>
+                </pic:nvPicPr>
+                <pic:blipFill>
                   <a:blip r:embed="rId2"/>
                   <a:stretch>
                     <a:fillRect/>
@@ -6601,7 +6728,7 @@
                 <pic:spPr>
                   <a:xfrm>
                     <a:off x="0" y="0"/>
-                    <a:ext cx="1475232" cy="438912"/>
+                    <a:ext cx="2912249" cy="3307021"/>
                   </a:xfrm>
                   <a:prstGeom prst="rect">
                     <a:avLst/>
@@ -6628,23 +6755,6 @@
         <w:color w:val="65AADB"/>
       </w:rPr>
       <w:t xml:space="preserve">           </w:t>
-    </w:r>
-    <w:r>
-      <w:rPr>
-        <w:b/>
-        <w:bCs/>
-        <w:color w:val="65AADB"/>
-      </w:rPr>
-      <w:t xml:space="preserve">    </w:t>
-    </w:r>
-    <w:r>
-      <w:rPr>
-        <w:rFonts w:ascii="Times New Roman" w:hAnsi="Times New Roman" w:cs="Times New Roman"/>
-        <w:color w:val="000000" w:themeColor="text1"/>
-        <w:sz w:val="36"/>
-        <w:szCs w:val="36"/>
-      </w:rPr>
-      <w:t>QUOTATION</w:t>
     </w:r>
   </w:p>
 </w:hdr>

</xml_diff>

<commit_message>
updates in po verification page for having the additional points
</commit_message>
<xml_diff>
--- a/QuotationApp.API/Templates/QuotationTemplate_Updated - Copy.docx
+++ b/QuotationApp.API/Templates/QuotationTemplate_Updated - Copy.docx
@@ -5,6 +5,7 @@
     <w:p>
       <w:pPr>
         <w:spacing w:after="120"/>
+        <w:jc w:val="both"/>
         <w:rPr>
           <w:rFonts w:ascii="Times New Roman" w:hAnsi="Times New Roman" w:cs="Times New Roman"/>
           <w:color w:val="000000" w:themeColor="text1"/>
@@ -53,6 +54,7 @@
           <w:p>
             <w:pPr>
               <w:spacing w:line="360" w:lineRule="auto"/>
+              <w:jc w:val="both"/>
             </w:pPr>
             <w:r>
               <w:rPr>
@@ -81,6 +83,7 @@
           <w:p>
             <w:pPr>
               <w:spacing w:line="360" w:lineRule="auto"/>
+              <w:jc w:val="both"/>
             </w:pPr>
             <w:r>
               <w:rPr>
@@ -90,7 +93,18 @@
                 <w:szCs w:val="18"/>
                 <w:lang w:val="en-US"/>
               </w:rPr>
-              <w:t xml:space="preserve">Quotation No: </w:t>
+              <w:t xml:space="preserve">Quotation </w:t>
+            </w:r>
+            <w:proofErr w:type="gramStart"/>
+            <w:r>
+              <w:rPr>
+                <w:rFonts w:ascii="Times New Roman" w:hAnsi="Times New Roman" w:cs="Times New Roman"/>
+                <w:color w:val="000000" w:themeColor="text1"/>
+                <w:sz w:val="18"/>
+                <w:szCs w:val="18"/>
+                <w:lang w:val="en-US"/>
+              </w:rPr>
+              <w:t xml:space="preserve">No: </w:t>
             </w:r>
             <w:r>
               <w:rPr>
@@ -99,7 +113,17 @@
                 <w:sz w:val="18"/>
                 <w:szCs w:val="18"/>
               </w:rPr>
-              <w:t>{{QuotationNo}}</w:t>
+              <w:t>{{</w:t>
+            </w:r>
+            <w:proofErr w:type="gramEnd"/>
+            <w:r>
+              <w:rPr>
+                <w:rFonts w:ascii="Times New Roman" w:hAnsi="Times New Roman" w:cs="Times New Roman"/>
+                <w:color w:val="65AADB"/>
+                <w:sz w:val="18"/>
+                <w:szCs w:val="18"/>
+              </w:rPr>
+              <w:t>QuotationNo}}</w:t>
             </w:r>
           </w:p>
         </w:tc>
@@ -115,6 +139,7 @@
           <w:p>
             <w:pPr>
               <w:spacing w:line="360" w:lineRule="auto"/>
+              <w:jc w:val="both"/>
             </w:pPr>
             <w:r>
               <w:rPr>
@@ -143,7 +168,9 @@
           <w:p>
             <w:pPr>
               <w:spacing w:line="360" w:lineRule="auto"/>
-            </w:pPr>
+              <w:jc w:val="both"/>
+            </w:pPr>
+            <w:proofErr w:type="gramStart"/>
             <w:r>
               <w:rPr>
                 <w:rFonts w:ascii="Times New Roman" w:hAnsi="Times New Roman" w:cs="Times New Roman"/>
@@ -161,7 +188,17 @@
                 <w:sz w:val="18"/>
                 <w:szCs w:val="18"/>
               </w:rPr>
-              <w:t>{{Date}}</w:t>
+              <w:t>{{</w:t>
+            </w:r>
+            <w:proofErr w:type="gramEnd"/>
+            <w:r>
+              <w:rPr>
+                <w:rFonts w:ascii="Times New Roman" w:hAnsi="Times New Roman" w:cs="Times New Roman"/>
+                <w:color w:val="65AADB"/>
+                <w:sz w:val="18"/>
+                <w:szCs w:val="18"/>
+              </w:rPr>
+              <w:t>Date}}</w:t>
             </w:r>
           </w:p>
         </w:tc>
@@ -177,6 +214,7 @@
           <w:p>
             <w:pPr>
               <w:spacing w:after="200" w:line="360" w:lineRule="auto"/>
+              <w:jc w:val="both"/>
               <w:rPr>
                 <w:rFonts w:ascii="Times New Roman" w:hAnsi="Times New Roman" w:cs="Times New Roman"/>
                 <w:color w:val="000000" w:themeColor="text1"/>
@@ -200,7 +238,17 @@
                 <w:sz w:val="18"/>
                 <w:szCs w:val="18"/>
               </w:rPr>
-              <w:t xml:space="preserve">{{CONTACT_PHONE}}  </w:t>
+              <w:t>{{CONTACT_PHONE</w:t>
+            </w:r>
+            <w:proofErr w:type="gramStart"/>
+            <w:r>
+              <w:rPr>
+                <w:rFonts w:ascii="Times New Roman" w:hAnsi="Times New Roman" w:cs="Times New Roman"/>
+                <w:color w:val="65AADB"/>
+                <w:sz w:val="18"/>
+                <w:szCs w:val="18"/>
+              </w:rPr>
+              <w:t xml:space="preserve">}}  </w:t>
             </w:r>
             <w:r>
               <w:rPr>
@@ -209,7 +257,17 @@
                 <w:sz w:val="18"/>
                 <w:szCs w:val="18"/>
               </w:rPr>
-              <w:t xml:space="preserve">|   Email: </w:t>
+              <w:t>|</w:t>
+            </w:r>
+            <w:proofErr w:type="gramEnd"/>
+            <w:r>
+              <w:rPr>
+                <w:rFonts w:ascii="Times New Roman" w:hAnsi="Times New Roman" w:cs="Times New Roman"/>
+                <w:color w:val="000000" w:themeColor="text1"/>
+                <w:sz w:val="18"/>
+                <w:szCs w:val="18"/>
+              </w:rPr>
+              <w:t xml:space="preserve">   Email: </w:t>
             </w:r>
             <w:r>
               <w:rPr>
@@ -229,6 +287,7 @@
           <w:p>
             <w:pPr>
               <w:spacing w:line="360" w:lineRule="auto"/>
+              <w:jc w:val="both"/>
             </w:pPr>
           </w:p>
         </w:tc>
@@ -237,6 +296,7 @@
     <w:p>
       <w:pPr>
         <w:spacing w:after="200"/>
+        <w:jc w:val="both"/>
         <w:rPr>
           <w:rFonts w:ascii="Times New Roman" w:hAnsi="Times New Roman" w:cs="Times New Roman"/>
           <w:color w:val="000000" w:themeColor="text1"/>
@@ -305,6 +365,7 @@
     <w:p>
       <w:pPr>
         <w:spacing w:after="200"/>
+        <w:jc w:val="both"/>
         <w:rPr>
           <w:rFonts w:ascii="Times New Roman" w:hAnsi="Times New Roman" w:cs="Times New Roman"/>
           <w:color w:val="000000" w:themeColor="text1"/>
@@ -353,6 +414,7 @@
     <w:p>
       <w:pPr>
         <w:spacing w:after="160"/>
+        <w:jc w:val="both"/>
         <w:rPr>
           <w:rFonts w:ascii="Times New Roman" w:hAnsi="Times New Roman" w:cs="Times New Roman"/>
           <w:color w:val="000000" w:themeColor="text1"/>
@@ -369,6 +431,7 @@
     <w:p>
       <w:pPr>
         <w:spacing w:after="160"/>
+        <w:jc w:val="both"/>
         <w:rPr>
           <w:rFonts w:ascii="Times New Roman" w:hAnsi="Times New Roman" w:cs="Times New Roman"/>
           <w:color w:val="000000" w:themeColor="text1"/>
@@ -385,6 +448,7 @@
     <w:p>
       <w:pPr>
         <w:spacing w:after="200"/>
+        <w:jc w:val="both"/>
         <w:rPr>
           <w:rFonts w:ascii="Times New Roman" w:hAnsi="Times New Roman" w:cs="Times New Roman"/>
         </w:rPr>
@@ -404,19 +468,31 @@
           <w:bCs/>
           <w:color w:val="65AADB"/>
         </w:rPr>
-        <w:t>{{ORG_NAME}}</w:t>
-      </w:r>
-      <w:r>
-        <w:rPr>
-          <w:rFonts w:ascii="Times New Roman" w:hAnsi="Times New Roman" w:cs="Times New Roman"/>
+        <w:t>{{ORG_</w:t>
+      </w:r>
+      <w:proofErr w:type="gramStart"/>
+      <w:r>
+        <w:rPr>
+          <w:rFonts w:ascii="Times New Roman" w:hAnsi="Times New Roman" w:cs="Times New Roman"/>
+          <w:b/>
+          <w:bCs/>
           <w:color w:val="65AADB"/>
         </w:rPr>
+        <w:t>NAME}}</w:t>
+      </w:r>
+      <w:r>
+        <w:rPr>
+          <w:rFonts w:ascii="Times New Roman" w:hAnsi="Times New Roman" w:cs="Times New Roman"/>
+          <w:color w:val="65AADB"/>
+        </w:rPr>
         <w:t>.</w:t>
       </w:r>
+      <w:proofErr w:type="gramEnd"/>
     </w:p>
     <w:p>
       <w:pPr>
         <w:spacing w:before="300" w:after="150"/>
+        <w:jc w:val="both"/>
         <w:rPr>
           <w:rFonts w:ascii="Times New Roman" w:hAnsi="Times New Roman" w:cs="Times New Roman"/>
           <w:color w:val="000000" w:themeColor="text1"/>
@@ -437,6 +513,7 @@
     <w:p>
       <w:pPr>
         <w:spacing w:after="120"/>
+        <w:jc w:val="both"/>
         <w:rPr>
           <w:rFonts w:ascii="Times New Roman" w:hAnsi="Times New Roman" w:cs="Times New Roman"/>
         </w:rPr>
@@ -466,6 +543,7 @@
     <w:p>
       <w:pPr>
         <w:spacing w:after="100"/>
+        <w:jc w:val="both"/>
         <w:rPr>
           <w:rFonts w:ascii="Times New Roman" w:hAnsi="Times New Roman" w:cs="Times New Roman"/>
         </w:rPr>
@@ -505,6 +583,7 @@
           <w:tab w:val="center" w:pos="5020"/>
         </w:tabs>
         <w:spacing w:before="300" w:after="150"/>
+        <w:jc w:val="both"/>
         <w:rPr>
           <w:rFonts w:ascii="Times New Roman" w:hAnsi="Times New Roman" w:cs="Times New Roman"/>
           <w:color w:val="000000" w:themeColor="text1"/>
@@ -536,6 +615,7 @@
           <w:numId w:val="3"/>
         </w:numPr>
         <w:spacing w:after="80" w:line="240" w:lineRule="auto"/>
+        <w:jc w:val="both"/>
         <w:rPr>
           <w:rFonts w:ascii="Times New Roman" w:hAnsi="Times New Roman" w:cs="Times New Roman"/>
         </w:rPr>
@@ -555,6 +635,7 @@
           <w:numId w:val="3"/>
         </w:numPr>
         <w:spacing w:after="80" w:line="240" w:lineRule="auto"/>
+        <w:jc w:val="both"/>
         <w:rPr>
           <w:rFonts w:ascii="Times New Roman" w:hAnsi="Times New Roman" w:cs="Times New Roman"/>
         </w:rPr>
@@ -574,6 +655,7 @@
           <w:numId w:val="3"/>
         </w:numPr>
         <w:spacing w:after="80" w:line="240" w:lineRule="auto"/>
+        <w:jc w:val="both"/>
         <w:rPr>
           <w:rFonts w:ascii="Times New Roman" w:hAnsi="Times New Roman" w:cs="Times New Roman"/>
         </w:rPr>
@@ -593,6 +675,7 @@
           <w:numId w:val="3"/>
         </w:numPr>
         <w:spacing w:after="200" w:line="240" w:lineRule="auto"/>
+        <w:jc w:val="both"/>
         <w:rPr>
           <w:rFonts w:ascii="Times New Roman" w:hAnsi="Times New Roman" w:cs="Times New Roman"/>
         </w:rPr>
@@ -616,6 +699,7 @@
     <w:p>
       <w:pPr>
         <w:spacing w:after="200"/>
+        <w:jc w:val="both"/>
         <w:rPr>
           <w:rFonts w:ascii="Times New Roman" w:hAnsi="Times New Roman" w:cs="Times New Roman"/>
         </w:rPr>
@@ -630,6 +714,7 @@
     <w:p>
       <w:pPr>
         <w:spacing w:line="240" w:lineRule="auto"/>
+        <w:jc w:val="both"/>
         <w:rPr>
           <w:rFonts w:ascii="Times New Roman" w:hAnsi="Times New Roman" w:cs="Times New Roman"/>
           <w:lang w:val="en-US"/>
@@ -646,6 +731,7 @@
     <w:p>
       <w:pPr>
         <w:spacing w:line="240" w:lineRule="auto"/>
+        <w:jc w:val="both"/>
         <w:rPr>
           <w:rFonts w:ascii="Times New Roman" w:hAnsi="Times New Roman" w:cs="Times New Roman"/>
         </w:rPr>
@@ -654,6 +740,7 @@
     <w:p>
       <w:pPr>
         <w:spacing w:line="240" w:lineRule="auto"/>
+        <w:jc w:val="both"/>
         <w:rPr>
           <w:rFonts w:ascii="Times New Roman" w:hAnsi="Times New Roman" w:cs="Times New Roman"/>
           <w:lang w:val="en-US"/>
@@ -670,6 +757,7 @@
     <w:p>
       <w:pPr>
         <w:spacing w:line="240" w:lineRule="auto"/>
+        <w:jc w:val="both"/>
         <w:rPr>
           <w:rFonts w:ascii="Times New Roman" w:hAnsi="Times New Roman" w:cs="Times New Roman"/>
         </w:rPr>
@@ -678,6 +766,7 @@
     <w:p>
       <w:pPr>
         <w:spacing w:line="240" w:lineRule="auto"/>
+        <w:jc w:val="both"/>
         <w:rPr>
           <w:rFonts w:ascii="Times New Roman" w:hAnsi="Times New Roman" w:cs="Times New Roman"/>
           <w:lang w:val="en-US"/>
@@ -2491,7 +2580,21 @@
               <w:rPr>
                 <w:rFonts w:ascii="Times New Roman" w:hAnsi="Times New Roman" w:cs="Times New Roman"/>
               </w:rPr>
-              <w:t>First Year - These Services start a er 1 Month from start of Go Live. Subsequent Years – A er comple on of 7 Man Days</w:t>
+              <w:t xml:space="preserve">First Year - These Services start a er 1 Month from start of Go Live. Subsequent Years – A er </w:t>
+            </w:r>
+            <w:proofErr w:type="spellStart"/>
+            <w:r>
+              <w:rPr>
+                <w:rFonts w:ascii="Times New Roman" w:hAnsi="Times New Roman" w:cs="Times New Roman"/>
+              </w:rPr>
+              <w:t>comple</w:t>
+            </w:r>
+            <w:proofErr w:type="spellEnd"/>
+            <w:r>
+              <w:rPr>
+                <w:rFonts w:ascii="Times New Roman" w:hAnsi="Times New Roman" w:cs="Times New Roman"/>
+              </w:rPr>
+              <w:t xml:space="preserve"> on of 7 Man Days</w:t>
             </w:r>
           </w:p>
         </w:tc>
@@ -5283,6 +5386,7 @@
     <w:p>
       <w:pPr>
         <w:spacing w:before="300" w:after="150"/>
+        <w:jc w:val="both"/>
         <w:rPr>
           <w:rFonts w:ascii="Times New Roman" w:hAnsi="Times New Roman" w:cs="Times New Roman"/>
           <w:w w:val="101"/>
@@ -5439,6 +5543,7 @@
         </w:rPr>
         <w:t xml:space="preserve"> </w:t>
       </w:r>
+      <w:proofErr w:type="gramStart"/>
       <w:r>
         <w:rPr>
           <w:rFonts w:ascii="Times New Roman" w:hAnsi="Times New Roman" w:cs="Times New Roman"/>
@@ -5446,10 +5551,12 @@
         </w:rPr>
         <w:t>Organization</w:t>
       </w:r>
+      <w:proofErr w:type="gramEnd"/>
     </w:p>
     <w:p>
       <w:pPr>
         <w:spacing w:before="300" w:after="150"/>
+        <w:jc w:val="both"/>
         <w:rPr>
           <w:rFonts w:ascii="Times New Roman" w:hAnsi="Times New Roman" w:cs="Times New Roman"/>
         </w:rPr>
@@ -5581,6 +5688,7 @@
     <w:p>
       <w:pPr>
         <w:spacing w:before="300" w:after="150"/>
+        <w:jc w:val="both"/>
         <w:rPr>
           <w:rFonts w:ascii="Times New Roman" w:hAnsi="Times New Roman" w:cs="Times New Roman"/>
         </w:rPr>
@@ -5595,6 +5703,7 @@
     <w:p>
       <w:pPr>
         <w:spacing w:before="300" w:after="150"/>
+        <w:jc w:val="both"/>
         <w:rPr>
           <w:rFonts w:ascii="Times New Roman" w:hAnsi="Times New Roman" w:cs="Times New Roman"/>
         </w:rPr>
@@ -5609,6 +5718,7 @@
     <w:p>
       <w:pPr>
         <w:spacing w:before="160" w:after="40"/>
+        <w:jc w:val="both"/>
         <w:rPr>
           <w:rFonts w:ascii="Times New Roman" w:hAnsi="Times New Roman" w:cs="Times New Roman"/>
           <w:color w:val="000000" w:themeColor="text1"/>
@@ -5625,6 +5735,7 @@
     <w:p>
       <w:pPr>
         <w:spacing w:after="60"/>
+        <w:jc w:val="both"/>
         <w:rPr>
           <w:rFonts w:ascii="Times New Roman" w:hAnsi="Times New Roman" w:cs="Times New Roman"/>
         </w:rPr>
@@ -5639,6 +5750,7 @@
     <w:p>
       <w:pPr>
         <w:spacing w:before="160" w:after="40"/>
+        <w:jc w:val="both"/>
         <w:rPr>
           <w:rFonts w:ascii="Times New Roman" w:hAnsi="Times New Roman" w:cs="Times New Roman"/>
           <w:color w:val="000000" w:themeColor="text1"/>
@@ -5655,6 +5767,7 @@
     <w:p>
       <w:pPr>
         <w:spacing w:after="60"/>
+        <w:jc w:val="both"/>
         <w:rPr>
           <w:rFonts w:ascii="Times New Roman" w:hAnsi="Times New Roman" w:cs="Times New Roman"/>
         </w:rPr>
@@ -5669,6 +5782,7 @@
     <w:p>
       <w:pPr>
         <w:spacing w:before="160" w:after="40"/>
+        <w:jc w:val="both"/>
         <w:rPr>
           <w:rFonts w:ascii="Times New Roman" w:hAnsi="Times New Roman" w:cs="Times New Roman"/>
           <w:color w:val="000000" w:themeColor="text1"/>
@@ -5685,6 +5799,7 @@
     <w:p>
       <w:pPr>
         <w:spacing w:after="60"/>
+        <w:jc w:val="both"/>
         <w:rPr>
           <w:rFonts w:ascii="Times New Roman" w:hAnsi="Times New Roman" w:cs="Times New Roman"/>
         </w:rPr>
@@ -5699,6 +5814,7 @@
     <w:p>
       <w:pPr>
         <w:spacing w:before="160" w:after="40"/>
+        <w:jc w:val="both"/>
         <w:rPr>
           <w:rFonts w:ascii="Times New Roman" w:hAnsi="Times New Roman" w:cs="Times New Roman"/>
           <w:color w:val="000000" w:themeColor="text1"/>
@@ -5715,6 +5831,7 @@
     <w:p>
       <w:pPr>
         <w:spacing w:before="160" w:after="40"/>
+        <w:jc w:val="both"/>
         <w:rPr>
           <w:rFonts w:ascii="Times New Roman" w:hAnsi="Times New Roman" w:cs="Times New Roman"/>
         </w:rPr>
@@ -5729,6 +5846,7 @@
     <w:p>
       <w:pPr>
         <w:spacing w:before="160" w:after="40"/>
+        <w:jc w:val="both"/>
         <w:rPr>
           <w:rFonts w:ascii="Times New Roman" w:hAnsi="Times New Roman" w:cs="Times New Roman"/>
           <w:color w:val="000000" w:themeColor="text1"/>
@@ -5745,6 +5863,7 @@
     <w:p>
       <w:pPr>
         <w:spacing w:before="160" w:after="40"/>
+        <w:jc w:val="both"/>
         <w:rPr>
           <w:rFonts w:ascii="Times New Roman" w:hAnsi="Times New Roman" w:cs="Times New Roman"/>
         </w:rPr>
@@ -5766,6 +5885,7 @@
     <w:p>
       <w:pPr>
         <w:ind w:right="273"/>
+        <w:jc w:val="both"/>
         <w:rPr>
           <w:rFonts w:ascii="Times New Roman" w:hAnsi="Times New Roman" w:cs="Times New Roman"/>
         </w:rPr>
@@ -5787,6 +5907,7 @@
     <w:p>
       <w:pPr>
         <w:spacing w:before="160" w:after="40"/>
+        <w:jc w:val="both"/>
         <w:rPr>
           <w:rFonts w:ascii="Times New Roman" w:hAnsi="Times New Roman" w:cs="Times New Roman"/>
           <w:color w:val="000000" w:themeColor="text1"/>
@@ -5803,6 +5924,7 @@
     <w:p>
       <w:pPr>
         <w:spacing w:before="160" w:after="40"/>
+        <w:jc w:val="both"/>
         <w:rPr>
           <w:rFonts w:ascii="Times New Roman" w:hAnsi="Times New Roman" w:cs="Times New Roman"/>
           <w:color w:val="000000" w:themeColor="text1"/>
@@ -5842,6 +5964,7 @@
     <w:p>
       <w:pPr>
         <w:spacing w:before="160" w:after="40"/>
+        <w:jc w:val="both"/>
         <w:rPr>
           <w:rFonts w:ascii="Times New Roman" w:hAnsi="Times New Roman" w:cs="Times New Roman"/>
           <w:color w:val="000000" w:themeColor="text1"/>
@@ -5858,6 +5981,7 @@
     <w:p>
       <w:pPr>
         <w:spacing w:after="60"/>
+        <w:jc w:val="both"/>
         <w:rPr>
           <w:rFonts w:ascii="Times New Roman" w:hAnsi="Times New Roman" w:cs="Times New Roman"/>
         </w:rPr>
@@ -5889,6 +6013,7 @@
           <w:numId w:val="4"/>
         </w:numPr>
         <w:spacing w:after="60"/>
+        <w:jc w:val="both"/>
         <w:rPr>
           <w:rFonts w:ascii="Times New Roman" w:hAnsi="Times New Roman" w:cs="Times New Roman"/>
         </w:rPr>
@@ -5914,6 +6039,7 @@
           <w:numId w:val="4"/>
         </w:numPr>
         <w:spacing w:after="60"/>
+        <w:jc w:val="both"/>
         <w:rPr>
           <w:rFonts w:ascii="Times New Roman" w:hAnsi="Times New Roman" w:cs="Times New Roman"/>
         </w:rPr>
@@ -5934,6 +6060,7 @@
     <w:p>
       <w:pPr>
         <w:spacing w:before="160" w:after="40"/>
+        <w:jc w:val="both"/>
         <w:rPr>
           <w:rFonts w:ascii="Times New Roman" w:hAnsi="Times New Roman" w:cs="Times New Roman"/>
           <w:color w:val="000000" w:themeColor="text1"/>
@@ -5951,6 +6078,7 @@
     <w:p>
       <w:pPr>
         <w:spacing w:before="160" w:after="40"/>
+        <w:jc w:val="both"/>
         <w:rPr>
           <w:rFonts w:ascii="Times New Roman" w:hAnsi="Times New Roman" w:cs="Times New Roman"/>
           <w:color w:val="000000" w:themeColor="text1"/>
@@ -5960,12 +6088,41 @@
         <w:rPr>
           <w:rFonts w:ascii="Times New Roman" w:hAnsi="Times New Roman" w:cs="Times New Roman"/>
         </w:rPr>
-        <w:t xml:space="preserve">In case of deduction of TDS Amount, You have to give us the TDS certificate immediately along with our Payment. If we do not receive the TDS Certificate within 6 months or by the end of the Financial Year, you </w:t>
+        <w:t xml:space="preserve">In case of deduction of TDS Amount, </w:t>
+      </w:r>
+      <w:proofErr w:type="gramStart"/>
+      <w:r>
+        <w:rPr>
+          <w:rFonts w:ascii="Times New Roman" w:hAnsi="Times New Roman" w:cs="Times New Roman"/>
+        </w:rPr>
+        <w:t>You</w:t>
+      </w:r>
+      <w:proofErr w:type="gramEnd"/>
+      <w:r>
+        <w:rPr>
+          <w:rFonts w:ascii="Times New Roman" w:hAnsi="Times New Roman" w:cs="Times New Roman"/>
+        </w:rPr>
+        <w:t xml:space="preserve"> </w:t>
+      </w:r>
+      <w:proofErr w:type="gramStart"/>
+      <w:r>
+        <w:rPr>
+          <w:rFonts w:ascii="Times New Roman" w:hAnsi="Times New Roman" w:cs="Times New Roman"/>
+        </w:rPr>
+        <w:t>have to</w:t>
+      </w:r>
+      <w:proofErr w:type="gramEnd"/>
+      <w:r>
+        <w:rPr>
+          <w:rFonts w:ascii="Times New Roman" w:hAnsi="Times New Roman" w:cs="Times New Roman"/>
+        </w:rPr>
+        <w:t xml:space="preserve"> give us the TDS certificate immediately along with our Payment. If we do not receive the TDS Certificate within 6 months or by the end of the Financial Year, you </w:t>
       </w:r>
     </w:p>
     <w:p>
       <w:pPr>
         <w:spacing w:before="160" w:after="40"/>
+        <w:jc w:val="both"/>
         <w:rPr>
           <w:rFonts w:ascii="Times New Roman" w:hAnsi="Times New Roman" w:cs="Times New Roman"/>
           <w:color w:val="000000" w:themeColor="text1"/>
@@ -5982,6 +6139,7 @@
     <w:p>
       <w:pPr>
         <w:spacing w:after="60"/>
+        <w:jc w:val="both"/>
         <w:rPr>
           <w:rFonts w:ascii="Times New Roman" w:hAnsi="Times New Roman" w:cs="Times New Roman"/>
         </w:rPr>
@@ -5996,6 +6154,7 @@
     <w:p>
       <w:pPr>
         <w:spacing w:before="160" w:after="40"/>
+        <w:jc w:val="both"/>
         <w:rPr>
           <w:rFonts w:ascii="Times New Roman" w:hAnsi="Times New Roman" w:cs="Times New Roman"/>
           <w:color w:val="000000" w:themeColor="text1"/>
@@ -6012,6 +6171,7 @@
     <w:p>
       <w:pPr>
         <w:spacing w:before="160" w:after="40"/>
+        <w:jc w:val="both"/>
         <w:rPr>
           <w:rFonts w:ascii="Times New Roman" w:hAnsi="Times New Roman" w:cs="Times New Roman"/>
         </w:rPr>
@@ -6038,6 +6198,7 @@
     <w:p>
       <w:pPr>
         <w:spacing w:before="160" w:after="40"/>
+        <w:jc w:val="both"/>
         <w:rPr>
           <w:rFonts w:ascii="Times New Roman" w:hAnsi="Times New Roman" w:cs="Times New Roman"/>
           <w:color w:val="000000" w:themeColor="text1"/>
@@ -6054,6 +6215,7 @@
     <w:p>
       <w:pPr>
         <w:spacing w:after="60"/>
+        <w:jc w:val="both"/>
         <w:rPr>
           <w:rFonts w:ascii="Times New Roman" w:hAnsi="Times New Roman" w:cs="Times New Roman"/>
         </w:rPr>
@@ -6068,6 +6230,7 @@
     <w:p>
       <w:pPr>
         <w:spacing w:before="300" w:after="40"/>
+        <w:jc w:val="both"/>
         <w:rPr>
           <w:rFonts w:ascii="Times New Roman" w:hAnsi="Times New Roman" w:cs="Times New Roman"/>
         </w:rPr>
@@ -6082,6 +6245,7 @@
     <w:p>
       <w:pPr>
         <w:spacing w:before="300" w:after="40" w:line="360" w:lineRule="auto"/>
+        <w:jc w:val="both"/>
         <w:rPr>
           <w:rFonts w:ascii="Times New Roman" w:hAnsi="Times New Roman" w:cs="Times New Roman"/>
         </w:rPr>
@@ -6108,6 +6272,7 @@
     <w:p>
       <w:pPr>
         <w:spacing w:after="20" w:line="360" w:lineRule="auto"/>
+        <w:jc w:val="both"/>
         <w:rPr>
           <w:rFonts w:ascii="Times New Roman" w:hAnsi="Times New Roman" w:cs="Times New Roman"/>
           <w:color w:val="000000" w:themeColor="text1"/>
@@ -6124,6 +6289,7 @@
     <w:p>
       <w:pPr>
         <w:spacing w:after="20"/>
+        <w:jc w:val="both"/>
         <w:rPr>
           <w:rFonts w:ascii="Times New Roman" w:hAnsi="Times New Roman" w:cs="Times New Roman"/>
           <w:noProof/>
@@ -6133,6 +6299,7 @@
     <w:p>
       <w:pPr>
         <w:spacing w:after="20"/>
+        <w:jc w:val="both"/>
         <w:rPr>
           <w:rFonts w:ascii="Times New Roman" w:hAnsi="Times New Roman" w:cs="Times New Roman"/>
           <w:noProof/>
@@ -6142,6 +6309,7 @@
     <w:p>
       <w:pPr>
         <w:spacing w:after="20"/>
+        <w:jc w:val="both"/>
         <w:rPr>
           <w:rFonts w:ascii="Times New Roman" w:hAnsi="Times New Roman" w:cs="Times New Roman"/>
           <w:noProof/>
@@ -6151,6 +6319,7 @@
     <w:p>
       <w:pPr>
         <w:spacing w:after="20"/>
+        <w:jc w:val="both"/>
         <w:rPr>
           <w:rFonts w:ascii="Times New Roman" w:hAnsi="Times New Roman" w:cs="Times New Roman"/>
           <w:noProof/>
@@ -6160,6 +6329,7 @@
     <w:p>
       <w:pPr>
         <w:spacing w:after="20"/>
+        <w:jc w:val="both"/>
         <w:rPr>
           <w:rFonts w:ascii="Times New Roman" w:hAnsi="Times New Roman" w:cs="Times New Roman"/>
           <w:noProof/>
@@ -6169,6 +6339,7 @@
     <w:p>
       <w:pPr>
         <w:spacing w:after="20"/>
+        <w:jc w:val="both"/>
         <w:rPr>
           <w:rFonts w:ascii="Times New Roman" w:hAnsi="Times New Roman" w:cs="Times New Roman"/>
         </w:rPr>
@@ -6177,6 +6348,7 @@
     <w:p>
       <w:pPr>
         <w:spacing w:after="20"/>
+        <w:jc w:val="both"/>
         <w:rPr>
           <w:rFonts w:ascii="Times New Roman" w:hAnsi="Times New Roman" w:cs="Times New Roman"/>
         </w:rPr>
@@ -6191,6 +6363,7 @@
     <w:p>
       <w:pPr>
         <w:spacing w:after="20"/>
+        <w:jc w:val="both"/>
         <w:rPr>
           <w:rFonts w:ascii="Times New Roman" w:hAnsi="Times New Roman" w:cs="Times New Roman"/>
           <w:color w:val="000000" w:themeColor="text1"/>

</xml_diff>

<commit_message>
updates in new quotation pdf for showing the things bold, correctly aligned the things
</commit_message>
<xml_diff>
--- a/QuotationApp.API/Templates/QuotationTemplate_Updated - Copy.docx
+++ b/QuotationApp.API/Templates/QuotationTemplate_Updated - Copy.docx
@@ -8,6 +8,8 @@
         <w:jc w:val="both"/>
         <w:rPr>
           <w:rFonts w:ascii="Times New Roman" w:hAnsi="Times New Roman" w:cs="Times New Roman"/>
+          <w:b/>
+          <w:bCs/>
           <w:color w:val="000000" w:themeColor="text1"/>
           <w:sz w:val="22"/>
           <w:szCs w:val="22"/>
@@ -16,6 +18,8 @@
       <w:r>
         <w:rPr>
           <w:rFonts w:ascii="Times New Roman" w:hAnsi="Times New Roman" w:cs="Times New Roman"/>
+          <w:b/>
+          <w:bCs/>
           <w:color w:val="000000" w:themeColor="text1"/>
           <w:sz w:val="22"/>
           <w:szCs w:val="22"/>
@@ -25,6 +29,8 @@
       <w:r>
         <w:rPr>
           <w:rFonts w:ascii="Times New Roman" w:hAnsi="Times New Roman" w:cs="Times New Roman"/>
+          <w:b/>
+          <w:bCs/>
           <w:color w:val="000000" w:themeColor="text1"/>
           <w:sz w:val="22"/>
           <w:szCs w:val="22"/>
@@ -40,8 +46,8 @@
         <w:tblLook w:val="04A0" w:firstRow="1" w:lastRow="0" w:firstColumn="1" w:lastColumn="0" w:noHBand="0" w:noVBand="1"/>
       </w:tblPr>
       <w:tblGrid>
-        <w:gridCol w:w="7019"/>
-        <w:gridCol w:w="3135"/>
+        <w:gridCol w:w="6374"/>
+        <w:gridCol w:w="3780"/>
       </w:tblGrid>
       <w:tr>
         <w:trPr>
@@ -49,16 +55,22 @@
         </w:trPr>
         <w:tc>
           <w:tcPr>
-            <w:tcW w:w="7019" w:type="dxa"/>
+            <w:tcW w:w="6374" w:type="dxa"/>
           </w:tcPr>
           <w:p>
             <w:pPr>
               <w:spacing w:line="360" w:lineRule="auto"/>
               <w:jc w:val="both"/>
-            </w:pPr>
-            <w:r>
-              <w:rPr>
-                <w:rFonts w:ascii="Times New Roman" w:hAnsi="Times New Roman" w:cs="Times New Roman"/>
+              <w:rPr>
+                <w:b/>
+                <w:bCs/>
+              </w:rPr>
+            </w:pPr>
+            <w:r>
+              <w:rPr>
+                <w:rFonts w:ascii="Times New Roman" w:hAnsi="Times New Roman" w:cs="Times New Roman"/>
+                <w:b/>
+                <w:bCs/>
                 <w:color w:val="000000" w:themeColor="text1"/>
                 <w:sz w:val="18"/>
                 <w:szCs w:val="18"/>
@@ -68,7 +80,8 @@
             <w:r>
               <w:rPr>
                 <w:rFonts w:ascii="Times New Roman" w:hAnsi="Times New Roman" w:cs="Times New Roman"/>
-                <w:color w:val="65AADB"/>
+                <w:b/>
+                <w:bCs/>
                 <w:sz w:val="18"/>
                 <w:szCs w:val="18"/>
               </w:rPr>
@@ -78,16 +91,22 @@
         </w:tc>
         <w:tc>
           <w:tcPr>
-            <w:tcW w:w="3135" w:type="dxa"/>
+            <w:tcW w:w="3780" w:type="dxa"/>
           </w:tcPr>
           <w:p>
             <w:pPr>
               <w:spacing w:line="360" w:lineRule="auto"/>
               <w:jc w:val="both"/>
-            </w:pPr>
-            <w:r>
-              <w:rPr>
-                <w:rFonts w:ascii="Times New Roman" w:hAnsi="Times New Roman" w:cs="Times New Roman"/>
+              <w:rPr>
+                <w:b/>
+                <w:bCs/>
+              </w:rPr>
+            </w:pPr>
+            <w:r>
+              <w:rPr>
+                <w:rFonts w:ascii="Times New Roman" w:hAnsi="Times New Roman" w:cs="Times New Roman"/>
+                <w:b/>
+                <w:bCs/>
                 <w:color w:val="000000" w:themeColor="text1"/>
                 <w:sz w:val="18"/>
                 <w:szCs w:val="18"/>
@@ -99,6 +118,8 @@
             <w:r>
               <w:rPr>
                 <w:rFonts w:ascii="Times New Roman" w:hAnsi="Times New Roman" w:cs="Times New Roman"/>
+                <w:b/>
+                <w:bCs/>
                 <w:color w:val="000000" w:themeColor="text1"/>
                 <w:sz w:val="18"/>
                 <w:szCs w:val="18"/>
@@ -109,7 +130,8 @@
             <w:r>
               <w:rPr>
                 <w:rFonts w:ascii="Times New Roman" w:hAnsi="Times New Roman" w:cs="Times New Roman"/>
-                <w:color w:val="65AADB"/>
+                <w:b/>
+                <w:bCs/>
                 <w:sz w:val="18"/>
                 <w:szCs w:val="18"/>
               </w:rPr>
@@ -119,7 +141,8 @@
             <w:r>
               <w:rPr>
                 <w:rFonts w:ascii="Times New Roman" w:hAnsi="Times New Roman" w:cs="Times New Roman"/>
-                <w:color w:val="65AADB"/>
+                <w:b/>
+                <w:bCs/>
                 <w:sz w:val="18"/>
                 <w:szCs w:val="18"/>
               </w:rPr>
@@ -134,16 +157,22 @@
         </w:trPr>
         <w:tc>
           <w:tcPr>
-            <w:tcW w:w="7019" w:type="dxa"/>
+            <w:tcW w:w="6374" w:type="dxa"/>
           </w:tcPr>
           <w:p>
             <w:pPr>
               <w:spacing w:line="360" w:lineRule="auto"/>
               <w:jc w:val="both"/>
-            </w:pPr>
-            <w:r>
-              <w:rPr>
-                <w:rFonts w:ascii="Times New Roman" w:hAnsi="Times New Roman" w:cs="Times New Roman"/>
+              <w:rPr>
+                <w:b/>
+                <w:bCs/>
+              </w:rPr>
+            </w:pPr>
+            <w:r>
+              <w:rPr>
+                <w:rFonts w:ascii="Times New Roman" w:hAnsi="Times New Roman" w:cs="Times New Roman"/>
+                <w:b/>
+                <w:bCs/>
                 <w:color w:val="000000" w:themeColor="text1"/>
                 <w:sz w:val="18"/>
                 <w:szCs w:val="18"/>
@@ -153,7 +182,8 @@
             <w:r>
               <w:rPr>
                 <w:rFonts w:ascii="Times New Roman" w:hAnsi="Times New Roman" w:cs="Times New Roman"/>
-                <w:color w:val="65AADB"/>
+                <w:b/>
+                <w:bCs/>
                 <w:sz w:val="18"/>
                 <w:szCs w:val="18"/>
               </w:rPr>
@@ -163,17 +193,23 @@
         </w:tc>
         <w:tc>
           <w:tcPr>
-            <w:tcW w:w="3135" w:type="dxa"/>
+            <w:tcW w:w="3780" w:type="dxa"/>
           </w:tcPr>
           <w:p>
             <w:pPr>
               <w:spacing w:line="360" w:lineRule="auto"/>
               <w:jc w:val="both"/>
+              <w:rPr>
+                <w:b/>
+                <w:bCs/>
+              </w:rPr>
             </w:pPr>
             <w:proofErr w:type="gramStart"/>
             <w:r>
               <w:rPr>
                 <w:rFonts w:ascii="Times New Roman" w:hAnsi="Times New Roman" w:cs="Times New Roman"/>
+                <w:b/>
+                <w:bCs/>
                 <w:color w:val="000000" w:themeColor="text1"/>
                 <w:sz w:val="18"/>
                 <w:szCs w:val="18"/>
@@ -184,7 +220,8 @@
             <w:r>
               <w:rPr>
                 <w:rFonts w:ascii="Times New Roman" w:hAnsi="Times New Roman" w:cs="Times New Roman"/>
-                <w:color w:val="65AADB"/>
+                <w:b/>
+                <w:bCs/>
                 <w:sz w:val="18"/>
                 <w:szCs w:val="18"/>
               </w:rPr>
@@ -194,7 +231,8 @@
             <w:r>
               <w:rPr>
                 <w:rFonts w:ascii="Times New Roman" w:hAnsi="Times New Roman" w:cs="Times New Roman"/>
-                <w:color w:val="65AADB"/>
+                <w:b/>
+                <w:bCs/>
                 <w:sz w:val="18"/>
                 <w:szCs w:val="18"/>
               </w:rPr>
@@ -209,7 +247,7 @@
         </w:trPr>
         <w:tc>
           <w:tcPr>
-            <w:tcW w:w="7019" w:type="dxa"/>
+            <w:tcW w:w="6374" w:type="dxa"/>
           </w:tcPr>
           <w:p>
             <w:pPr>
@@ -217,6 +255,8 @@
               <w:jc w:val="both"/>
               <w:rPr>
                 <w:rFonts w:ascii="Times New Roman" w:hAnsi="Times New Roman" w:cs="Times New Roman"/>
+                <w:b/>
+                <w:bCs/>
                 <w:color w:val="000000" w:themeColor="text1"/>
                 <w:sz w:val="18"/>
                 <w:szCs w:val="18"/>
@@ -225,6 +265,8 @@
             <w:r>
               <w:rPr>
                 <w:rFonts w:ascii="Times New Roman" w:hAnsi="Times New Roman" w:cs="Times New Roman"/>
+                <w:b/>
+                <w:bCs/>
                 <w:color w:val="000000" w:themeColor="text1"/>
                 <w:sz w:val="18"/>
                 <w:szCs w:val="18"/>
@@ -234,7 +276,8 @@
             <w:r>
               <w:rPr>
                 <w:rFonts w:ascii="Times New Roman" w:hAnsi="Times New Roman" w:cs="Times New Roman"/>
-                <w:color w:val="65AADB"/>
+                <w:b/>
+                <w:bCs/>
                 <w:sz w:val="18"/>
                 <w:szCs w:val="18"/>
               </w:rPr>
@@ -244,45 +287,70 @@
             <w:r>
               <w:rPr>
                 <w:rFonts w:ascii="Times New Roman" w:hAnsi="Times New Roman" w:cs="Times New Roman"/>
-                <w:color w:val="65AADB"/>
+                <w:b/>
+                <w:bCs/>
                 <w:sz w:val="18"/>
                 <w:szCs w:val="18"/>
               </w:rPr>
-              <w:t xml:space="preserve">}}  </w:t>
-            </w:r>
-            <w:r>
-              <w:rPr>
-                <w:rFonts w:ascii="Times New Roman" w:hAnsi="Times New Roman" w:cs="Times New Roman"/>
+              <w:t xml:space="preserve">}} </w:t>
+            </w:r>
+            <w:r>
+              <w:rPr>
+                <w:rFonts w:ascii="Times New Roman" w:hAnsi="Times New Roman" w:cs="Times New Roman"/>
+                <w:b/>
+                <w:bCs/>
+                <w:sz w:val="18"/>
+                <w:szCs w:val="18"/>
+              </w:rPr>
+              <w:t xml:space="preserve"> </w:t>
+            </w:r>
+            <w:r>
+              <w:rPr>
+                <w:rFonts w:ascii="Times New Roman" w:hAnsi="Times New Roman" w:cs="Times New Roman"/>
+                <w:b/>
+                <w:bCs/>
+                <w:sz w:val="18"/>
+                <w:szCs w:val="18"/>
+              </w:rPr>
+              <w:t xml:space="preserve"> </w:t>
+            </w:r>
+            <w:proofErr w:type="gramEnd"/>
+            <w:r>
+              <w:rPr>
+                <w:rFonts w:ascii="Times New Roman" w:hAnsi="Times New Roman" w:cs="Times New Roman"/>
+                <w:b/>
+                <w:bCs/>
+                <w:sz w:val="18"/>
+                <w:szCs w:val="18"/>
+              </w:rPr>
+              <w:t>|</w:t>
+            </w:r>
+            <w:r>
+              <w:rPr>
+                <w:rFonts w:ascii="Times New Roman" w:hAnsi="Times New Roman" w:cs="Times New Roman"/>
+                <w:b/>
+                <w:bCs/>
                 <w:color w:val="000000" w:themeColor="text1"/>
                 <w:sz w:val="18"/>
                 <w:szCs w:val="18"/>
               </w:rPr>
-              <w:t>|</w:t>
-            </w:r>
-            <w:proofErr w:type="gramEnd"/>
-            <w:r>
-              <w:rPr>
-                <w:rFonts w:ascii="Times New Roman" w:hAnsi="Times New Roman" w:cs="Times New Roman"/>
-                <w:color w:val="000000" w:themeColor="text1"/>
+              <w:t xml:space="preserve">   Email: </w:t>
+            </w:r>
+            <w:r>
+              <w:rPr>
+                <w:rFonts w:ascii="Times New Roman" w:hAnsi="Times New Roman" w:cs="Times New Roman"/>
+                <w:b/>
+                <w:bCs/>
                 <w:sz w:val="18"/>
                 <w:szCs w:val="18"/>
               </w:rPr>
-              <w:t xml:space="preserve">   Email: </w:t>
-            </w:r>
-            <w:r>
-              <w:rPr>
-                <w:rFonts w:ascii="Times New Roman" w:hAnsi="Times New Roman" w:cs="Times New Roman"/>
-                <w:color w:val="65AADB"/>
-                <w:sz w:val="18"/>
-                <w:szCs w:val="18"/>
-              </w:rPr>
               <w:t>{{CONTACT_EMAIL}}</w:t>
             </w:r>
           </w:p>
         </w:tc>
         <w:tc>
           <w:tcPr>
-            <w:tcW w:w="3135" w:type="dxa"/>
+            <w:tcW w:w="3780" w:type="dxa"/>
           </w:tcPr>
           <w:p>
             <w:pPr>
@@ -318,65 +386,11 @@
       <w:r>
         <w:rPr>
           <w:rFonts w:ascii="Times New Roman" w:hAnsi="Times New Roman" w:cs="Times New Roman"/>
-          <w:color w:val="000000" w:themeColor="text1"/>
-        </w:rPr>
-        <w:t>Reference:</w:t>
-      </w:r>
-      <w:r>
-        <w:rPr>
-          <w:rFonts w:ascii="Times New Roman" w:hAnsi="Times New Roman" w:cs="Times New Roman"/>
           <w:b/>
           <w:bCs/>
           <w:color w:val="000000" w:themeColor="text1"/>
         </w:rPr>
-        <w:t xml:space="preserve"> </w:t>
-      </w:r>
-      <w:r>
-        <w:rPr>
-          <w:rFonts w:ascii="Times New Roman" w:hAnsi="Times New Roman" w:cs="Times New Roman"/>
-          <w:color w:val="000000" w:themeColor="text1"/>
-        </w:rPr>
-        <w:t xml:space="preserve">Our discussions on implementation of </w:t>
-      </w:r>
-      <w:r>
-        <w:rPr>
-          <w:rFonts w:ascii="Times New Roman" w:hAnsi="Times New Roman" w:cs="Times New Roman"/>
-          <w:b/>
-          <w:bCs/>
-          <w:color w:val="65AADB"/>
-        </w:rPr>
-        <w:t>{{MODULE_LIST}}</w:t>
-      </w:r>
-      <w:r>
-        <w:rPr>
-          <w:rFonts w:ascii="Times New Roman" w:hAnsi="Times New Roman" w:cs="Times New Roman"/>
-          <w:color w:val="65AADB"/>
-        </w:rPr>
-        <w:t xml:space="preserve"> </w:t>
-      </w:r>
-      <w:r>
-        <w:rPr>
-          <w:rFonts w:ascii="Times New Roman" w:hAnsi="Times New Roman" w:cs="Times New Roman"/>
-          <w:color w:val="000000" w:themeColor="text1"/>
-        </w:rPr>
-        <w:t>in your organization.</w:t>
-      </w:r>
-    </w:p>
-    <w:p>
-      <w:pPr>
-        <w:spacing w:after="200"/>
-        <w:jc w:val="both"/>
-        <w:rPr>
-          <w:rFonts w:ascii="Times New Roman" w:hAnsi="Times New Roman" w:cs="Times New Roman"/>
-          <w:color w:val="000000" w:themeColor="text1"/>
-        </w:rPr>
-      </w:pPr>
-      <w:r>
-        <w:rPr>
-          <w:rFonts w:ascii="Times New Roman" w:hAnsi="Times New Roman" w:cs="Times New Roman"/>
-          <w:color w:val="000000" w:themeColor="text1"/>
-        </w:rPr>
-        <w:t>Subject:</w:t>
+        <w:t>Reference:</w:t>
       </w:r>
       <w:r>
         <w:rPr>
@@ -392,27 +406,82 @@
           <w:rFonts w:ascii="Times New Roman" w:hAnsi="Times New Roman" w:cs="Times New Roman"/>
           <w:color w:val="000000" w:themeColor="text1"/>
         </w:rPr>
-        <w:t xml:space="preserve">Business proposal for IT &amp; Operations changeover consultancy and implementation of </w:t>
+        <w:t>Our discussions</w:t>
+      </w:r>
+      <w:r>
+        <w:rPr>
+          <w:rFonts w:ascii="Times New Roman" w:hAnsi="Times New Roman" w:cs="Times New Roman"/>
+          <w:color w:val="000000" w:themeColor="text1"/>
+        </w:rPr>
+        <w:t xml:space="preserve"> on implementation of </w:t>
       </w:r>
       <w:r>
         <w:rPr>
           <w:rFonts w:ascii="Times New Roman" w:hAnsi="Times New Roman" w:cs="Times New Roman"/>
           <w:b/>
           <w:bCs/>
-          <w:color w:val="65AADB"/>
         </w:rPr>
         <w:t>{{MODULE_LIST}}</w:t>
       </w:r>
       <w:r>
         <w:rPr>
           <w:rFonts w:ascii="Times New Roman" w:hAnsi="Times New Roman" w:cs="Times New Roman"/>
-          <w:color w:val="65AADB"/>
-        </w:rPr>
-        <w:t>.</w:t>
+        </w:rPr>
+        <w:t xml:space="preserve"> </w:t>
+      </w:r>
+      <w:r>
+        <w:rPr>
+          <w:rFonts w:ascii="Times New Roman" w:hAnsi="Times New Roman" w:cs="Times New Roman"/>
+          <w:color w:val="000000" w:themeColor="text1"/>
+        </w:rPr>
+        <w:t>in your organization.</w:t>
       </w:r>
     </w:p>
     <w:p>
       <w:pPr>
+        <w:spacing w:after="200"/>
+        <w:jc w:val="both"/>
+        <w:rPr>
+          <w:rFonts w:ascii="Times New Roman" w:hAnsi="Times New Roman" w:cs="Times New Roman"/>
+          <w:color w:val="000000" w:themeColor="text1"/>
+        </w:rPr>
+      </w:pPr>
+      <w:r>
+        <w:rPr>
+          <w:rFonts w:ascii="Times New Roman" w:hAnsi="Times New Roman" w:cs="Times New Roman"/>
+          <w:b/>
+          <w:bCs/>
+          <w:color w:val="000000" w:themeColor="text1"/>
+        </w:rPr>
+        <w:t>Subject:</w:t>
+      </w:r>
+      <w:r>
+        <w:rPr>
+          <w:rFonts w:ascii="Times New Roman" w:hAnsi="Times New Roman" w:cs="Times New Roman"/>
+          <w:b/>
+          <w:bCs/>
+          <w:color w:val="000000" w:themeColor="text1"/>
+        </w:rPr>
+        <w:t xml:space="preserve"> </w:t>
+      </w:r>
+      <w:r>
+        <w:rPr>
+          <w:rFonts w:ascii="Times New Roman" w:hAnsi="Times New Roman" w:cs="Times New Roman"/>
+          <w:color w:val="000000" w:themeColor="text1"/>
+        </w:rPr>
+        <w:t xml:space="preserve">Business proposal for IT &amp; Operations changeover consultancy and implementation of </w:t>
+      </w:r>
+      <w:r>
+        <w:rPr>
+          <w:rFonts w:ascii="Times New Roman" w:hAnsi="Times New Roman" w:cs="Times New Roman"/>
+          <w:b/>
+          <w:bCs/>
+        </w:rPr>
+        <w:t>{{MODULE_LIST}}.</w:t>
+      </w:r>
+    </w:p>
+    <w:p>
+      <w:pPr>
         <w:spacing w:after="160"/>
         <w:jc w:val="both"/>
         <w:rPr>
@@ -459,14 +528,31 @@
           <w:color w:val="000000" w:themeColor="text1"/>
           <w:lang w:val="en-US"/>
         </w:rPr>
-        <w:t xml:space="preserve">We discussed the current challenges and solutions CQUAL can provide, based on our brief discussions, please find attached a Preliminary Business Proposal for the required changeover at </w:t>
+        <w:t>We discussed the current challenges and solutions CQUAL can provide</w:t>
+      </w:r>
+      <w:proofErr w:type="gramStart"/>
+      <w:r>
+        <w:rPr>
+          <w:rFonts w:ascii="Times New Roman" w:hAnsi="Times New Roman" w:cs="Times New Roman"/>
+          <w:color w:val="000000" w:themeColor="text1"/>
+          <w:lang w:val="en-US"/>
+        </w:rPr>
+        <w:t>, based</w:t>
+      </w:r>
+      <w:proofErr w:type="gramEnd"/>
+      <w:r>
+        <w:rPr>
+          <w:rFonts w:ascii="Times New Roman" w:hAnsi="Times New Roman" w:cs="Times New Roman"/>
+          <w:color w:val="000000" w:themeColor="text1"/>
+          <w:lang w:val="en-US"/>
+        </w:rPr>
+        <w:t xml:space="preserve"> on our brief discussions, please find attached a Preliminary Business Proposal for the required changeover at </w:t>
       </w:r>
       <w:r>
         <w:rPr>
           <w:rFonts w:ascii="Times New Roman" w:hAnsi="Times New Roman" w:cs="Times New Roman"/>
           <w:b/>
           <w:bCs/>
-          <w:color w:val="65AADB"/>
         </w:rPr>
         <w:t>{{ORG_</w:t>
       </w:r>
@@ -476,16 +562,8 @@
           <w:rFonts w:ascii="Times New Roman" w:hAnsi="Times New Roman" w:cs="Times New Roman"/>
           <w:b/>
           <w:bCs/>
-          <w:color w:val="65AADB"/>
-        </w:rPr>
-        <w:t>NAME}}</w:t>
-      </w:r>
-      <w:r>
-        <w:rPr>
-          <w:rFonts w:ascii="Times New Roman" w:hAnsi="Times New Roman" w:cs="Times New Roman"/>
-          <w:color w:val="65AADB"/>
-        </w:rPr>
-        <w:t>.</w:t>
+        </w:rPr>
+        <w:t>NAME}}.</w:t>
       </w:r>
       <w:proofErr w:type="gramEnd"/>
     </w:p>
@@ -495,6 +573,8 @@
         <w:jc w:val="both"/>
         <w:rPr>
           <w:rFonts w:ascii="Times New Roman" w:hAnsi="Times New Roman" w:cs="Times New Roman"/>
+          <w:b/>
+          <w:bCs/>
           <w:color w:val="000000" w:themeColor="text1"/>
           <w:sz w:val="16"/>
           <w:szCs w:val="16"/>
@@ -504,6 +584,8 @@
       <w:r>
         <w:rPr>
           <w:rFonts w:ascii="Times New Roman" w:hAnsi="Times New Roman" w:cs="Times New Roman"/>
+          <w:b/>
+          <w:bCs/>
           <w:color w:val="000000" w:themeColor="text1"/>
           <w:u w:val="single"/>
         </w:rPr>
@@ -516,28 +598,23 @@
         <w:jc w:val="both"/>
         <w:rPr>
           <w:rFonts w:ascii="Times New Roman" w:hAnsi="Times New Roman" w:cs="Times New Roman"/>
-        </w:rPr>
-      </w:pPr>
-      <w:r>
-        <w:rPr>
-          <w:rFonts w:ascii="Times New Roman" w:hAnsi="Times New Roman" w:cs="Times New Roman"/>
-        </w:rPr>
-        <w:t xml:space="preserve">Our experts will be involved in redefining the operations setup for sustainable growth and required digitalization at </w:t>
-      </w:r>
-      <w:r>
-        <w:rPr>
-          <w:rFonts w:ascii="Times New Roman" w:hAnsi="Times New Roman" w:cs="Times New Roman"/>
           <w:b/>
           <w:bCs/>
-          <w:color w:val="65AADB"/>
-        </w:rPr>
-        <w:t>{{ORG_NAME}}</w:t>
-      </w:r>
-      <w:r>
-        <w:rPr>
-          <w:rFonts w:ascii="Times New Roman" w:hAnsi="Times New Roman" w:cs="Times New Roman"/>
-        </w:rPr>
-        <w:t>.</w:t>
+        </w:rPr>
+      </w:pPr>
+      <w:r>
+        <w:rPr>
+          <w:rFonts w:ascii="Times New Roman" w:hAnsi="Times New Roman" w:cs="Times New Roman"/>
+        </w:rPr>
+        <w:t xml:space="preserve">Our experts will be involved in redefining the operations setup for sustainable growth and required digitalization at </w:t>
+      </w:r>
+      <w:r>
+        <w:rPr>
+          <w:rFonts w:ascii="Times New Roman" w:hAnsi="Times New Roman" w:cs="Times New Roman"/>
+          <w:b/>
+          <w:bCs/>
+        </w:rPr>
+        <w:t>{{ORG_NAME}}.</w:t>
       </w:r>
     </w:p>
     <w:p>
@@ -559,14 +636,12 @@
           <w:rFonts w:ascii="Times New Roman" w:hAnsi="Times New Roman" w:cs="Times New Roman"/>
           <w:b/>
           <w:bCs/>
-          <w:color w:val="65AADB"/>
         </w:rPr>
         <w:t>{{MODULE_LIST}}</w:t>
       </w:r>
       <w:r>
         <w:rPr>
           <w:rFonts w:ascii="Times New Roman" w:hAnsi="Times New Roman" w:cs="Times New Roman"/>
-          <w:color w:val="65AADB"/>
         </w:rPr>
         <w:t xml:space="preserve"> </w:t>
       </w:r>
@@ -586,6 +661,8 @@
         <w:jc w:val="both"/>
         <w:rPr>
           <w:rFonts w:ascii="Times New Roman" w:hAnsi="Times New Roman" w:cs="Times New Roman"/>
+          <w:b/>
+          <w:bCs/>
           <w:color w:val="000000" w:themeColor="text1"/>
           <w:u w:val="single"/>
         </w:rPr>
@@ -593,6 +670,8 @@
       <w:r>
         <w:rPr>
           <w:rFonts w:ascii="Times New Roman" w:hAnsi="Times New Roman" w:cs="Times New Roman"/>
+          <w:b/>
+          <w:bCs/>
           <w:color w:val="000000" w:themeColor="text1"/>
           <w:u w:val="single"/>
         </w:rPr>
@@ -601,6 +680,8 @@
       <w:r>
         <w:rPr>
           <w:rFonts w:ascii="Times New Roman" w:hAnsi="Times New Roman" w:cs="Times New Roman"/>
+          <w:b/>
+          <w:bCs/>
           <w:color w:val="000000" w:themeColor="text1"/>
           <w:u w:val="single"/>
         </w:rPr>
@@ -691,7 +772,6 @@
           <w:rFonts w:ascii="Times New Roman" w:hAnsi="Times New Roman" w:cs="Times New Roman"/>
           <w:b/>
           <w:bCs/>
-          <w:color w:val="65AADB"/>
         </w:rPr>
         <w:t>{{MODULE_LIST}}</w:t>
       </w:r>
@@ -767,58 +847,6 @@
       <w:pPr>
         <w:spacing w:line="240" w:lineRule="auto"/>
         <w:jc w:val="both"/>
-        <w:rPr>
-          <w:rFonts w:ascii="Times New Roman" w:hAnsi="Times New Roman" w:cs="Times New Roman"/>
-          <w:lang w:val="en-US"/>
-        </w:rPr>
-      </w:pPr>
-      <w:r>
-        <w:rPr>
-          <w:rFonts w:ascii="Times New Roman" w:hAnsi="Times New Roman" w:cs="Times New Roman"/>
-          <w:lang w:val="en-US"/>
-        </w:rPr>
-        <w:t>For BlechTek Software Solutions LLP.</w:t>
-      </w:r>
-    </w:p>
-    <w:p>
-      <w:pPr>
-        <w:spacing w:line="240" w:lineRule="auto"/>
-        <w:rPr>
-          <w:rFonts w:ascii="Times New Roman" w:hAnsi="Times New Roman" w:cs="Times New Roman"/>
-          <w:noProof/>
-        </w:rPr>
-      </w:pPr>
-    </w:p>
-    <w:p>
-      <w:pPr>
-        <w:spacing w:line="240" w:lineRule="auto"/>
-        <w:rPr>
-          <w:rFonts w:ascii="Times New Roman" w:hAnsi="Times New Roman" w:cs="Times New Roman"/>
-          <w:noProof/>
-        </w:rPr>
-      </w:pPr>
-    </w:p>
-    <w:p>
-      <w:pPr>
-        <w:spacing w:line="240" w:lineRule="auto"/>
-        <w:rPr>
-          <w:rFonts w:ascii="Times New Roman" w:hAnsi="Times New Roman" w:cs="Times New Roman"/>
-          <w:noProof/>
-        </w:rPr>
-      </w:pPr>
-    </w:p>
-    <w:p>
-      <w:pPr>
-        <w:spacing w:line="240" w:lineRule="auto"/>
-        <w:rPr>
-          <w:rFonts w:ascii="Times New Roman" w:hAnsi="Times New Roman" w:cs="Times New Roman"/>
-          <w:noProof/>
-        </w:rPr>
-      </w:pPr>
-    </w:p>
-    <w:p>
-      <w:pPr>
-        <w:spacing w:line="240" w:lineRule="auto"/>
         <w:rPr>
           <w:rFonts w:ascii="Times New Roman" w:hAnsi="Times New Roman" w:cs="Times New Roman"/>
           <w:b/>
@@ -826,63 +854,116 @@
           <w:lang w:val="en-US"/>
         </w:rPr>
       </w:pPr>
-    </w:p>
-    <w:p>
-      <w:pPr>
-        <w:spacing w:line="240" w:lineRule="auto"/>
+      <w:r>
         <w:rPr>
           <w:rFonts w:ascii="Times New Roman" w:hAnsi="Times New Roman" w:cs="Times New Roman"/>
           <w:b/>
           <w:bCs/>
           <w:lang w:val="en-US"/>
         </w:rPr>
-      </w:pPr>
+        <w:t>For BlechTek Software Solutions LLP.</w:t>
+      </w:r>
     </w:p>
     <w:p>
       <w:pPr>
-        <w:spacing w:after="200"/>
-        <w:rPr>
-          <w:rFonts w:ascii="Times New Roman" w:hAnsi="Times New Roman" w:cs="Times New Roman"/>
-          <w:lang w:val="en-US"/>
-        </w:rPr>
-      </w:pPr>
-      <w:r>
-        <w:rPr>
-          <w:rFonts w:ascii="Times New Roman" w:hAnsi="Times New Roman" w:cs="Times New Roman"/>
-          <w:lang w:val="en-US"/>
-        </w:rPr>
-        <w:t> </w:t>
-      </w:r>
-      <w:r>
-        <w:rPr>
-          <w:rFonts w:ascii="Times New Roman" w:hAnsi="Times New Roman" w:cs="Times New Roman"/>
-          <w:lang w:val="en-US"/>
-        </w:rPr>
-        <w:t>Sushama Inamdar</w:t>
-      </w:r>
+        <w:spacing w:line="240" w:lineRule="auto"/>
+        <w:rPr>
+          <w:rFonts w:ascii="Times New Roman" w:hAnsi="Times New Roman" w:cs="Times New Roman"/>
+          <w:noProof/>
+        </w:rPr>
+      </w:pPr>
     </w:p>
     <w:p>
       <w:pPr>
+        <w:spacing w:line="240" w:lineRule="auto"/>
+        <w:rPr>
+          <w:rFonts w:ascii="Times New Roman" w:hAnsi="Times New Roman" w:cs="Times New Roman"/>
+          <w:noProof/>
+        </w:rPr>
+      </w:pPr>
+    </w:p>
+    <w:p>
+      <w:pPr>
+        <w:spacing w:line="240" w:lineRule="auto"/>
+        <w:rPr>
+          <w:rFonts w:ascii="Times New Roman" w:hAnsi="Times New Roman" w:cs="Times New Roman"/>
+          <w:noProof/>
+        </w:rPr>
+      </w:pPr>
+    </w:p>
+    <w:p>
+      <w:pPr>
+        <w:spacing w:line="240" w:lineRule="auto"/>
+        <w:rPr>
+          <w:rFonts w:ascii="Times New Roman" w:hAnsi="Times New Roman" w:cs="Times New Roman"/>
+          <w:noProof/>
+        </w:rPr>
+      </w:pPr>
+    </w:p>
+    <w:p>
+      <w:pPr>
+        <w:spacing w:line="240" w:lineRule="auto"/>
+        <w:rPr>
+          <w:rFonts w:ascii="Times New Roman" w:hAnsi="Times New Roman" w:cs="Times New Roman"/>
+          <w:b/>
+          <w:bCs/>
+          <w:lang w:val="en-US"/>
+        </w:rPr>
+      </w:pPr>
+    </w:p>
+    <w:p>
+      <w:pPr>
+        <w:spacing w:line="240" w:lineRule="auto"/>
+        <w:rPr>
+          <w:rFonts w:ascii="Times New Roman" w:hAnsi="Times New Roman" w:cs="Times New Roman"/>
+          <w:b/>
+          <w:bCs/>
+          <w:lang w:val="en-US"/>
+        </w:rPr>
+      </w:pPr>
+    </w:p>
+    <w:p>
+      <w:pPr>
+        <w:spacing w:after="200"/>
+        <w:rPr>
+          <w:rFonts w:ascii="Times New Roman" w:hAnsi="Times New Roman" w:cs="Times New Roman"/>
+          <w:lang w:val="en-US"/>
+        </w:rPr>
+      </w:pPr>
+      <w:r>
+        <w:rPr>
+          <w:rFonts w:ascii="Times New Roman" w:hAnsi="Times New Roman" w:cs="Times New Roman"/>
+          <w:lang w:val="en-US"/>
+        </w:rPr>
+        <w:t> </w:t>
+      </w:r>
+      <w:r>
+        <w:rPr>
+          <w:rFonts w:ascii="Times New Roman" w:hAnsi="Times New Roman" w:cs="Times New Roman"/>
+          <w:lang w:val="en-US"/>
+        </w:rPr>
+        <w:t>Sushama Inamdar</w:t>
+      </w:r>
+    </w:p>
+    <w:p>
+      <w:pPr>
         <w:spacing w:before="300" w:after="150"/>
         <w:rPr>
           <w:rFonts w:ascii="Times New Roman" w:hAnsi="Times New Roman" w:cs="Times New Roman"/>
+          <w:b/>
+          <w:bCs/>
           <w:color w:val="000000" w:themeColor="text1"/>
         </w:rPr>
       </w:pPr>
       <w:r>
         <w:rPr>
           <w:rFonts w:ascii="Times New Roman" w:hAnsi="Times New Roman" w:cs="Times New Roman"/>
+          <w:b/>
+          <w:bCs/>
           <w:color w:val="000000" w:themeColor="text1"/>
         </w:rPr>
         <w:lastRenderedPageBreak/>
-        <w:t>Scope</w:t>
-      </w:r>
-      <w:r>
-        <w:rPr>
-          <w:rFonts w:ascii="Times New Roman" w:hAnsi="Times New Roman" w:cs="Times New Roman"/>
-          <w:color w:val="000000" w:themeColor="text1"/>
-        </w:rPr>
-        <w:t>:</w:t>
+        <w:t>Scope:</w:t>
       </w:r>
     </w:p>
     <w:tbl>
@@ -928,12 +1009,16 @@
             <w:pPr>
               <w:rPr>
                 <w:rFonts w:ascii="Times New Roman" w:hAnsi="Times New Roman" w:cs="Times New Roman"/>
+                <w:b/>
+                <w:bCs/>
                 <w:color w:val="000000" w:themeColor="text1"/>
               </w:rPr>
             </w:pPr>
             <w:r>
               <w:rPr>
                 <w:rFonts w:ascii="Times New Roman" w:hAnsi="Times New Roman" w:cs="Times New Roman"/>
+                <w:b/>
+                <w:bCs/>
                 <w:color w:val="000000" w:themeColor="text1"/>
               </w:rPr>
               <w:t>Pillar</w:t>
@@ -959,12 +1044,16 @@
             <w:pPr>
               <w:rPr>
                 <w:rFonts w:ascii="Times New Roman" w:hAnsi="Times New Roman" w:cs="Times New Roman"/>
+                <w:b/>
+                <w:bCs/>
                 <w:color w:val="000000" w:themeColor="text1"/>
               </w:rPr>
             </w:pPr>
             <w:r>
               <w:rPr>
                 <w:rFonts w:ascii="Times New Roman" w:hAnsi="Times New Roman" w:cs="Times New Roman"/>
+                <w:b/>
+                <w:bCs/>
                 <w:color w:val="000000" w:themeColor="text1"/>
               </w:rPr>
               <w:t>Module</w:t>
@@ -987,12 +1076,16 @@
             <w:pPr>
               <w:rPr>
                 <w:rFonts w:ascii="Times New Roman" w:hAnsi="Times New Roman" w:cs="Times New Roman"/>
+                <w:b/>
+                <w:bCs/>
                 <w:color w:val="000000" w:themeColor="text1"/>
               </w:rPr>
             </w:pPr>
             <w:r>
               <w:rPr>
                 <w:rFonts w:ascii="Times New Roman" w:hAnsi="Times New Roman" w:cs="Times New Roman"/>
+                <w:b/>
+                <w:bCs/>
               </w:rPr>
               <w:t>Required</w:t>
             </w:r>
@@ -1103,11 +1196,15 @@
         <w:spacing w:after="200"/>
         <w:rPr>
           <w:rFonts w:ascii="Times New Roman" w:hAnsi="Times New Roman" w:cs="Times New Roman"/>
-        </w:rPr>
-      </w:pPr>
-      <w:r>
-        <w:rPr>
-          <w:rFonts w:ascii="Times New Roman" w:hAnsi="Times New Roman" w:cs="Times New Roman"/>
+          <w:b/>
+          <w:bCs/>
+        </w:rPr>
+      </w:pPr>
+      <w:r>
+        <w:rPr>
+          <w:rFonts w:ascii="Times New Roman" w:hAnsi="Times New Roman" w:cs="Times New Roman"/>
+          <w:b/>
+          <w:bCs/>
         </w:rPr>
         <w:t>Additional Scope:</w:t>
       </w:r>
@@ -1115,38 +1212,42 @@
     <w:tbl>
       <w:tblPr>
         <w:tblStyle w:val="TableGrid0"/>
-        <w:tblW w:w="10013" w:type="dxa"/>
+        <w:tblW w:w="10143" w:type="dxa"/>
         <w:tblInd w:w="-5" w:type="dxa"/>
         <w:tblLayout w:type="fixed"/>
         <w:tblLook w:val="04A0" w:firstRow="1" w:lastRow="0" w:firstColumn="1" w:lastColumn="0" w:noHBand="0" w:noVBand="1"/>
       </w:tblPr>
       <w:tblGrid>
-        <w:gridCol w:w="1834"/>
-        <w:gridCol w:w="2258"/>
-        <w:gridCol w:w="1834"/>
-        <w:gridCol w:w="1270"/>
-        <w:gridCol w:w="1411"/>
-        <w:gridCol w:w="1406"/>
+        <w:gridCol w:w="1858"/>
+        <w:gridCol w:w="2288"/>
+        <w:gridCol w:w="1858"/>
+        <w:gridCol w:w="1286"/>
+        <w:gridCol w:w="1429"/>
+        <w:gridCol w:w="1424"/>
       </w:tblGrid>
       <w:tr>
         <w:trPr>
-          <w:trHeight w:val="308"/>
+          <w:trHeight w:val="166"/>
         </w:trPr>
         <w:tc>
           <w:tcPr>
-            <w:tcW w:w="1834" w:type="dxa"/>
+            <w:tcW w:w="1858" w:type="dxa"/>
           </w:tcPr>
           <w:p>
             <w:pPr>
               <w:spacing w:line="276" w:lineRule="auto"/>
               <w:rPr>
                 <w:rFonts w:ascii="Times New Roman" w:hAnsi="Times New Roman" w:cs="Times New Roman"/>
+                <w:b/>
+                <w:bCs/>
                 <w:color w:val="000000" w:themeColor="text1"/>
               </w:rPr>
             </w:pPr>
             <w:r>
               <w:rPr>
                 <w:rFonts w:ascii="Times New Roman" w:hAnsi="Times New Roman" w:cs="Times New Roman"/>
+                <w:b/>
+                <w:bCs/>
                 <w:color w:val="000000" w:themeColor="text1"/>
               </w:rPr>
               <w:t>Requirements</w:t>
@@ -1155,19 +1256,23 @@
         </w:tc>
         <w:tc>
           <w:tcPr>
-            <w:tcW w:w="2258" w:type="dxa"/>
+            <w:tcW w:w="2288" w:type="dxa"/>
           </w:tcPr>
           <w:p>
             <w:pPr>
               <w:spacing w:line="276" w:lineRule="auto"/>
               <w:rPr>
                 <w:rFonts w:ascii="Times New Roman" w:hAnsi="Times New Roman" w:cs="Times New Roman"/>
+                <w:b/>
+                <w:bCs/>
                 <w:color w:val="000000" w:themeColor="text1"/>
               </w:rPr>
             </w:pPr>
             <w:r>
               <w:rPr>
                 <w:rFonts w:ascii="Times New Roman" w:hAnsi="Times New Roman" w:cs="Times New Roman"/>
+                <w:b/>
+                <w:bCs/>
                 <w:color w:val="000000" w:themeColor="text1"/>
               </w:rPr>
               <w:t>Module</w:t>
@@ -1176,19 +1281,23 @@
         </w:tc>
         <w:tc>
           <w:tcPr>
-            <w:tcW w:w="1834" w:type="dxa"/>
+            <w:tcW w:w="1858" w:type="dxa"/>
           </w:tcPr>
           <w:p>
             <w:pPr>
               <w:spacing w:line="276" w:lineRule="auto"/>
               <w:rPr>
                 <w:rFonts w:ascii="Times New Roman" w:hAnsi="Times New Roman" w:cs="Times New Roman"/>
+                <w:b/>
+                <w:bCs/>
                 <w:color w:val="000000" w:themeColor="text1"/>
               </w:rPr>
             </w:pPr>
             <w:r>
               <w:rPr>
                 <w:rFonts w:ascii="Times New Roman" w:hAnsi="Times New Roman" w:cs="Times New Roman"/>
+                <w:b/>
+                <w:bCs/>
                 <w:color w:val="000000" w:themeColor="text1"/>
               </w:rPr>
               <w:t>No. of Man Power</w:t>
@@ -1197,19 +1306,23 @@
         </w:tc>
         <w:tc>
           <w:tcPr>
-            <w:tcW w:w="1270" w:type="dxa"/>
+            <w:tcW w:w="1286" w:type="dxa"/>
           </w:tcPr>
           <w:p>
             <w:pPr>
               <w:spacing w:line="276" w:lineRule="auto"/>
               <w:rPr>
                 <w:rFonts w:ascii="Times New Roman" w:hAnsi="Times New Roman" w:cs="Times New Roman"/>
+                <w:b/>
+                <w:bCs/>
                 <w:color w:val="000000" w:themeColor="text1"/>
               </w:rPr>
             </w:pPr>
             <w:r>
               <w:rPr>
                 <w:rFonts w:ascii="Times New Roman" w:hAnsi="Times New Roman" w:cs="Times New Roman"/>
+                <w:b/>
+                <w:bCs/>
                 <w:color w:val="000000" w:themeColor="text1"/>
               </w:rPr>
               <w:t>No. of Days</w:t>
@@ -1218,19 +1331,23 @@
         </w:tc>
         <w:tc>
           <w:tcPr>
-            <w:tcW w:w="1411" w:type="dxa"/>
+            <w:tcW w:w="1429" w:type="dxa"/>
           </w:tcPr>
           <w:p>
             <w:pPr>
               <w:spacing w:line="276" w:lineRule="auto"/>
               <w:rPr>
                 <w:rFonts w:ascii="Times New Roman" w:hAnsi="Times New Roman" w:cs="Times New Roman"/>
+                <w:b/>
+                <w:bCs/>
                 <w:color w:val="000000" w:themeColor="text1"/>
               </w:rPr>
             </w:pPr>
             <w:r>
               <w:rPr>
                 <w:rFonts w:ascii="Times New Roman" w:hAnsi="Times New Roman" w:cs="Times New Roman"/>
+                <w:b/>
+                <w:bCs/>
                 <w:color w:val="000000" w:themeColor="text1"/>
               </w:rPr>
               <w:t>Rate</w:t>
@@ -1239,19 +1356,23 @@
         </w:tc>
         <w:tc>
           <w:tcPr>
-            <w:tcW w:w="1406" w:type="dxa"/>
+            <w:tcW w:w="1424" w:type="dxa"/>
           </w:tcPr>
           <w:p>
             <w:pPr>
               <w:spacing w:line="276" w:lineRule="auto"/>
               <w:rPr>
                 <w:rFonts w:ascii="Times New Roman" w:hAnsi="Times New Roman" w:cs="Times New Roman"/>
+                <w:b/>
+                <w:bCs/>
                 <w:color w:val="000000" w:themeColor="text1"/>
               </w:rPr>
             </w:pPr>
             <w:r>
               <w:rPr>
                 <w:rFonts w:ascii="Times New Roman" w:hAnsi="Times New Roman" w:cs="Times New Roman"/>
+                <w:b/>
+                <w:bCs/>
                 <w:color w:val="000000" w:themeColor="text1"/>
               </w:rPr>
               <w:t>Amount</w:t>
@@ -1261,11 +1382,11 @@
       </w:tr>
       <w:tr>
         <w:trPr>
-          <w:trHeight w:val="1136"/>
+          <w:trHeight w:val="512"/>
         </w:trPr>
         <w:tc>
           <w:tcPr>
-            <w:tcW w:w="1834" w:type="dxa"/>
+            <w:tcW w:w="1858" w:type="dxa"/>
           </w:tcPr>
           <w:p>
             <w:pPr>
@@ -1290,7 +1411,7 @@
         </w:tc>
         <w:tc>
           <w:tcPr>
-            <w:tcW w:w="2258" w:type="dxa"/>
+            <w:tcW w:w="2288" w:type="dxa"/>
           </w:tcPr>
           <w:p>
             <w:pPr>
@@ -1315,7 +1436,7 @@
         </w:tc>
         <w:tc>
           <w:tcPr>
-            <w:tcW w:w="1834" w:type="dxa"/>
+            <w:tcW w:w="1858" w:type="dxa"/>
           </w:tcPr>
           <w:p>
             <w:pPr>
@@ -1340,7 +1461,7 @@
         </w:tc>
         <w:tc>
           <w:tcPr>
-            <w:tcW w:w="1270" w:type="dxa"/>
+            <w:tcW w:w="1286" w:type="dxa"/>
           </w:tcPr>
           <w:p>
             <w:pPr>
@@ -1365,7 +1486,7 @@
         </w:tc>
         <w:tc>
           <w:tcPr>
-            <w:tcW w:w="1411" w:type="dxa"/>
+            <w:tcW w:w="1429" w:type="dxa"/>
           </w:tcPr>
           <w:p>
             <w:pPr>
@@ -1390,7 +1511,7 @@
         </w:tc>
         <w:tc>
           <w:tcPr>
-            <w:tcW w:w="1406" w:type="dxa"/>
+            <w:tcW w:w="1424" w:type="dxa"/>
           </w:tcPr>
           <w:p>
             <w:pPr>
@@ -1425,27 +1546,17 @@
       <w:r>
         <w:rPr>
           <w:rFonts w:ascii="Times New Roman" w:hAnsi="Times New Roman" w:cs="Times New Roman"/>
+          <w:b/>
+          <w:bCs/>
           <w:color w:val="000000" w:themeColor="text1"/>
         </w:rPr>
-        <w:t xml:space="preserve">Price for </w:t>
-      </w:r>
-      <w:r>
-        <w:rPr>
-          <w:rFonts w:ascii="Times New Roman" w:hAnsi="Times New Roman" w:cs="Times New Roman"/>
-          <w:color w:val="000000" w:themeColor="text1"/>
-        </w:rPr>
-        <w:t>I</w:t>
-      </w:r>
-      <w:r>
-        <w:rPr>
-          <w:rFonts w:ascii="Times New Roman" w:hAnsi="Times New Roman" w:cs="Times New Roman"/>
-          <w:color w:val="000000" w:themeColor="text1"/>
-        </w:rPr>
-        <w:t xml:space="preserve">mplementation of </w:t>
-      </w:r>
-      <w:r>
-        <w:rPr>
-          <w:rFonts w:ascii="Times New Roman" w:hAnsi="Times New Roman" w:cs="Times New Roman"/>
+        <w:t xml:space="preserve">Price for Implementation of </w:t>
+      </w:r>
+      <w:r>
+        <w:rPr>
+          <w:rFonts w:ascii="Times New Roman" w:hAnsi="Times New Roman" w:cs="Times New Roman"/>
+          <w:b/>
+          <w:bCs/>
           <w:caps/>
           <w:color w:val="000000" w:themeColor="text1"/>
         </w:rPr>
@@ -1472,7 +1583,7 @@
       <w:tblPr>
         <w:tblpPr w:leftFromText="180" w:rightFromText="180" w:vertAnchor="text" w:tblpY="1"/>
         <w:tblOverlap w:val="never"/>
-        <w:tblW w:w="9992" w:type="dxa"/>
+        <w:tblW w:w="10060" w:type="dxa"/>
         <w:tblBorders>
           <w:top w:val="single" w:sz="4" w:space="0" w:color="auto"/>
           <w:left w:val="single" w:sz="4" w:space="0" w:color="auto"/>
@@ -1481,7 +1592,6 @@
           <w:insideH w:val="single" w:sz="4" w:space="0" w:color="auto"/>
           <w:insideV w:val="single" w:sz="4" w:space="0" w:color="auto"/>
         </w:tblBorders>
-        <w:shd w:val="clear" w:color="auto" w:fill="FFFFFF" w:themeFill="background1"/>
         <w:tblCellMar>
           <w:left w:w="10" w:type="dxa"/>
           <w:right w:w="10" w:type="dxa"/>
@@ -1489,9 +1599,9 @@
         <w:tblLook w:val="04A0" w:firstRow="1" w:lastRow="0" w:firstColumn="1" w:lastColumn="0" w:noHBand="0" w:noVBand="1"/>
       </w:tblPr>
       <w:tblGrid>
-        <w:gridCol w:w="1007"/>
-        <w:gridCol w:w="6360"/>
-        <w:gridCol w:w="2625"/>
+        <w:gridCol w:w="846"/>
+        <w:gridCol w:w="6289"/>
+        <w:gridCol w:w="2925"/>
       </w:tblGrid>
       <w:tr>
         <w:trPr>
@@ -1500,8 +1610,7 @@
         </w:trPr>
         <w:tc>
           <w:tcPr>
-            <w:tcW w:w="1007" w:type="dxa"/>
-            <w:shd w:val="clear" w:color="auto" w:fill="FFFFFF" w:themeFill="background1"/>
+            <w:tcW w:w="846" w:type="dxa"/>
             <w:tcMar>
               <w:top w:w="80" w:type="dxa"/>
               <w:left w:w="120" w:type="dxa"/>
@@ -1515,12 +1624,16 @@
               <w:spacing w:line="240" w:lineRule="auto"/>
               <w:rPr>
                 <w:rFonts w:ascii="Times New Roman" w:hAnsi="Times New Roman" w:cs="Times New Roman"/>
+                <w:b/>
+                <w:bCs/>
                 <w:color w:val="000000" w:themeColor="text1"/>
               </w:rPr>
             </w:pPr>
             <w:r>
               <w:rPr>
                 <w:rFonts w:ascii="Times New Roman" w:hAnsi="Times New Roman" w:cs="Times New Roman"/>
+                <w:b/>
+                <w:bCs/>
                 <w:color w:val="000000" w:themeColor="text1"/>
               </w:rPr>
               <w:t>Sr. No.</w:t>
@@ -1529,8 +1642,7 @@
         </w:tc>
         <w:tc>
           <w:tcPr>
-            <w:tcW w:w="6360" w:type="dxa"/>
-            <w:shd w:val="clear" w:color="auto" w:fill="FFFFFF" w:themeFill="background1"/>
+            <w:tcW w:w="6289" w:type="dxa"/>
             <w:tcMar>
               <w:top w:w="80" w:type="dxa"/>
               <w:left w:w="120" w:type="dxa"/>
@@ -1544,12 +1656,16 @@
               <w:spacing w:line="240" w:lineRule="auto"/>
               <w:rPr>
                 <w:rFonts w:ascii="Times New Roman" w:hAnsi="Times New Roman" w:cs="Times New Roman"/>
+                <w:b/>
+                <w:bCs/>
                 <w:color w:val="000000" w:themeColor="text1"/>
               </w:rPr>
             </w:pPr>
             <w:r>
               <w:rPr>
                 <w:rFonts w:ascii="Times New Roman" w:hAnsi="Times New Roman" w:cs="Times New Roman"/>
+                <w:b/>
+                <w:bCs/>
                 <w:color w:val="000000" w:themeColor="text1"/>
               </w:rPr>
               <w:t>Particulars</w:t>
@@ -1558,8 +1674,7 @@
         </w:tc>
         <w:tc>
           <w:tcPr>
-            <w:tcW w:w="2625" w:type="dxa"/>
-            <w:shd w:val="clear" w:color="auto" w:fill="FFFFFF" w:themeFill="background1"/>
+            <w:tcW w:w="2925" w:type="dxa"/>
             <w:tcMar>
               <w:top w:w="80" w:type="dxa"/>
               <w:left w:w="120" w:type="dxa"/>
@@ -1573,12 +1688,16 @@
               <w:spacing w:line="240" w:lineRule="auto"/>
               <w:rPr>
                 <w:rFonts w:ascii="Times New Roman" w:hAnsi="Times New Roman" w:cs="Times New Roman"/>
+                <w:b/>
+                <w:bCs/>
                 <w:color w:val="000000" w:themeColor="text1"/>
               </w:rPr>
             </w:pPr>
             <w:r>
               <w:rPr>
                 <w:rFonts w:ascii="Times New Roman" w:hAnsi="Times New Roman" w:cs="Times New Roman"/>
+                <w:b/>
+                <w:bCs/>
                 <w:color w:val="000000" w:themeColor="text1"/>
               </w:rPr>
               <w:t xml:space="preserve">Price </w:t>
@@ -1586,6 +1705,8 @@
             <w:r>
               <w:rPr>
                 <w:rFonts w:ascii="Times New Roman" w:hAnsi="Times New Roman" w:cs="Times New Roman"/>
+                <w:b/>
+                <w:bCs/>
                 <w:color w:val="000000" w:themeColor="text1"/>
               </w:rPr>
               <w:t xml:space="preserve">in </w:t>
@@ -1593,6 +1714,8 @@
             <w:r>
               <w:rPr>
                 <w:rFonts w:ascii="Times New Roman" w:hAnsi="Times New Roman" w:cs="Times New Roman"/>
+                <w:b/>
+                <w:bCs/>
                 <w:color w:val="000000" w:themeColor="text1"/>
               </w:rPr>
               <w:t>INR</w:t>
@@ -1606,8 +1729,7 @@
         </w:trPr>
         <w:tc>
           <w:tcPr>
-            <w:tcW w:w="1007" w:type="dxa"/>
-            <w:shd w:val="clear" w:color="auto" w:fill="FFFFFF" w:themeFill="background1"/>
+            <w:tcW w:w="846" w:type="dxa"/>
             <w:tcMar>
               <w:top w:w="80" w:type="dxa"/>
               <w:left w:w="120" w:type="dxa"/>
@@ -1631,8 +1753,7 @@
         </w:tc>
         <w:tc>
           <w:tcPr>
-            <w:tcW w:w="6360" w:type="dxa"/>
-            <w:shd w:val="clear" w:color="auto" w:fill="FFFFFF" w:themeFill="background1"/>
+            <w:tcW w:w="6289" w:type="dxa"/>
             <w:tcMar>
               <w:top w:w="80" w:type="dxa"/>
               <w:left w:w="120" w:type="dxa"/>
@@ -1717,8 +1838,7 @@
         </w:tc>
         <w:tc>
           <w:tcPr>
-            <w:tcW w:w="2625" w:type="dxa"/>
-            <w:shd w:val="clear" w:color="auto" w:fill="FFFFFF" w:themeFill="background1"/>
+            <w:tcW w:w="2925" w:type="dxa"/>
             <w:tcMar>
               <w:top w:w="80" w:type="dxa"/>
               <w:left w:w="120" w:type="dxa"/>
@@ -1754,8 +1874,7 @@
         </w:trPr>
         <w:tc>
           <w:tcPr>
-            <w:tcW w:w="1007" w:type="dxa"/>
-            <w:shd w:val="clear" w:color="auto" w:fill="FFFFFF" w:themeFill="background1"/>
+            <w:tcW w:w="846" w:type="dxa"/>
             <w:tcMar>
               <w:top w:w="80" w:type="dxa"/>
               <w:left w:w="120" w:type="dxa"/>
@@ -1773,8 +1892,7 @@
         </w:tc>
         <w:tc>
           <w:tcPr>
-            <w:tcW w:w="6360" w:type="dxa"/>
-            <w:shd w:val="clear" w:color="auto" w:fill="FFFFFF" w:themeFill="background1"/>
+            <w:tcW w:w="6289" w:type="dxa"/>
             <w:tcMar>
               <w:top w:w="80" w:type="dxa"/>
               <w:left w:w="120" w:type="dxa"/>
@@ -1798,8 +1916,7 @@
         </w:tc>
         <w:tc>
           <w:tcPr>
-            <w:tcW w:w="2625" w:type="dxa"/>
-            <w:shd w:val="clear" w:color="auto" w:fill="FFFFFF" w:themeFill="background1"/>
+            <w:tcW w:w="2925" w:type="dxa"/>
             <w:tcMar>
               <w:top w:w="80" w:type="dxa"/>
               <w:left w:w="120" w:type="dxa"/>
@@ -1828,8 +1945,7 @@
         </w:trPr>
         <w:tc>
           <w:tcPr>
-            <w:tcW w:w="1007" w:type="dxa"/>
-            <w:shd w:val="clear" w:color="auto" w:fill="FFFFFF" w:themeFill="background1"/>
+            <w:tcW w:w="846" w:type="dxa"/>
             <w:tcMar>
               <w:top w:w="80" w:type="dxa"/>
               <w:left w:w="120" w:type="dxa"/>
@@ -1843,18 +1959,11 @@
                 <w:rFonts w:ascii="Times New Roman" w:hAnsi="Times New Roman" w:cs="Times New Roman"/>
               </w:rPr>
             </w:pPr>
-            <w:r>
-              <w:rPr>
-                <w:rFonts w:ascii="Times New Roman" w:hAnsi="Times New Roman" w:cs="Times New Roman"/>
-              </w:rPr>
-              <w:t xml:space="preserve"> 1.1</w:t>
-            </w:r>
-          </w:p>
-        </w:tc>
-        <w:tc>
-          <w:tcPr>
-            <w:tcW w:w="6360" w:type="dxa"/>
-            <w:shd w:val="clear" w:color="auto" w:fill="FFFFFF" w:themeFill="background1"/>
+          </w:p>
+        </w:tc>
+        <w:tc>
+          <w:tcPr>
+            <w:tcW w:w="6289" w:type="dxa"/>
             <w:tcMar>
               <w:top w:w="80" w:type="dxa"/>
               <w:left w:w="120" w:type="dxa"/>
@@ -1872,25 +1981,42 @@
               <w:rPr>
                 <w:rFonts w:ascii="Times New Roman" w:hAnsi="Times New Roman" w:cs="Times New Roman"/>
               </w:rPr>
-              <w:t>Implementation (</w:t>
-            </w:r>
-            <w:r>
-              <w:rPr>
-                <w:rFonts w:ascii="Times New Roman" w:hAnsi="Times New Roman" w:cs="Times New Roman"/>
-              </w:rPr>
-              <w:t>{{NO_OF_USERS</w:t>
-            </w:r>
-            <w:r>
-              <w:rPr>
-                <w:rFonts w:ascii="Times New Roman" w:hAnsi="Times New Roman" w:cs="Times New Roman"/>
-              </w:rPr>
-              <w:t>}}</w:t>
-            </w:r>
-            <w:r>
-              <w:rPr>
-                <w:rFonts w:ascii="Times New Roman" w:hAnsi="Times New Roman" w:cs="Times New Roman"/>
-              </w:rPr>
-              <w:t xml:space="preserve"> Man</w:t>
+              <w:t xml:space="preserve">Implementation </w:t>
+            </w:r>
+            <w:proofErr w:type="gramStart"/>
+            <w:r>
+              <w:rPr>
+                <w:rFonts w:ascii="Times New Roman" w:hAnsi="Times New Roman" w:cs="Times New Roman"/>
+              </w:rPr>
+              <w:t>(</w:t>
+            </w:r>
+            <w:r>
+              <w:t xml:space="preserve"> </w:t>
+            </w:r>
+            <w:r>
+              <w:rPr>
+                <w:rFonts w:ascii="Times New Roman" w:hAnsi="Times New Roman" w:cs="Times New Roman"/>
+              </w:rPr>
+              <w:t>{</w:t>
+            </w:r>
+            <w:proofErr w:type="gramEnd"/>
+            <w:r>
+              <w:rPr>
+                <w:rFonts w:ascii="Times New Roman" w:hAnsi="Times New Roman" w:cs="Times New Roman"/>
+              </w:rPr>
+              <w:t>{IMPL_EFFORT}}</w:t>
+            </w:r>
+            <w:r>
+              <w:rPr>
+                <w:rFonts w:ascii="Times New Roman" w:hAnsi="Times New Roman" w:cs="Times New Roman"/>
+              </w:rPr>
+              <w:t xml:space="preserve"> </w:t>
+            </w:r>
+            <w:r>
+              <w:rPr>
+                <w:rFonts w:ascii="Times New Roman" w:hAnsi="Times New Roman" w:cs="Times New Roman"/>
+              </w:rPr>
+              <w:t>Man</w:t>
             </w:r>
             <w:r>
               <w:rPr>
@@ -1920,8 +2046,7 @@
         </w:tc>
         <w:tc>
           <w:tcPr>
-            <w:tcW w:w="2625" w:type="dxa"/>
-            <w:shd w:val="clear" w:color="auto" w:fill="FFFFFF" w:themeFill="background1"/>
+            <w:tcW w:w="2925" w:type="dxa"/>
             <w:tcMar>
               <w:top w:w="80" w:type="dxa"/>
               <w:left w:w="120" w:type="dxa"/>
@@ -1950,8 +2075,7 @@
         </w:trPr>
         <w:tc>
           <w:tcPr>
-            <w:tcW w:w="1007" w:type="dxa"/>
-            <w:shd w:val="clear" w:color="auto" w:fill="FFFFFF" w:themeFill="background1"/>
+            <w:tcW w:w="846" w:type="dxa"/>
             <w:tcMar>
               <w:top w:w="80" w:type="dxa"/>
               <w:left w:w="120" w:type="dxa"/>
@@ -1969,8 +2093,7 @@
         </w:tc>
         <w:tc>
           <w:tcPr>
-            <w:tcW w:w="6360" w:type="dxa"/>
-            <w:shd w:val="clear" w:color="auto" w:fill="FFFFFF" w:themeFill="background1"/>
+            <w:tcW w:w="6289" w:type="dxa"/>
             <w:tcMar>
               <w:top w:w="80" w:type="dxa"/>
               <w:left w:w="120" w:type="dxa"/>
@@ -2000,8 +2123,7 @@
         </w:tc>
         <w:tc>
           <w:tcPr>
-            <w:tcW w:w="2625" w:type="dxa"/>
-            <w:shd w:val="clear" w:color="auto" w:fill="FFFFFF" w:themeFill="background1"/>
+            <w:tcW w:w="2925" w:type="dxa"/>
             <w:tcMar>
               <w:top w:w="80" w:type="dxa"/>
               <w:left w:w="120" w:type="dxa"/>
@@ -2030,8 +2152,7 @@
         </w:trPr>
         <w:tc>
           <w:tcPr>
-            <w:tcW w:w="1007" w:type="dxa"/>
-            <w:shd w:val="clear" w:color="auto" w:fill="FFFFFF" w:themeFill="background1"/>
+            <w:tcW w:w="846" w:type="dxa"/>
             <w:tcMar>
               <w:top w:w="80" w:type="dxa"/>
               <w:left w:w="120" w:type="dxa"/>
@@ -2049,8 +2170,7 @@
         </w:tc>
         <w:tc>
           <w:tcPr>
-            <w:tcW w:w="6360" w:type="dxa"/>
-            <w:shd w:val="clear" w:color="auto" w:fill="FFFFFF" w:themeFill="background1"/>
+            <w:tcW w:w="6289" w:type="dxa"/>
             <w:tcMar>
               <w:top w:w="80" w:type="dxa"/>
               <w:left w:w="120" w:type="dxa"/>
@@ -2068,14 +2188,13 @@
               <w:rPr>
                 <w:rFonts w:ascii="Times New Roman" w:hAnsi="Times New Roman" w:cs="Times New Roman"/>
               </w:rPr>
-              <w:t>Total of All Modules Final Price:</w:t>
-            </w:r>
-          </w:p>
-        </w:tc>
-        <w:tc>
-          <w:tcPr>
-            <w:tcW w:w="2625" w:type="dxa"/>
-            <w:shd w:val="clear" w:color="auto" w:fill="FFFFFF" w:themeFill="background1"/>
+              <w:t>Additional Scope:</w:t>
+            </w:r>
+          </w:p>
+        </w:tc>
+        <w:tc>
+          <w:tcPr>
+            <w:tcW w:w="2925" w:type="dxa"/>
             <w:tcMar>
               <w:top w:w="80" w:type="dxa"/>
               <w:left w:w="120" w:type="dxa"/>
@@ -2093,7 +2212,7 @@
               <w:rPr>
                 <w:rFonts w:ascii="Times New Roman" w:hAnsi="Times New Roman" w:cs="Times New Roman"/>
               </w:rPr>
-              <w:t>{{OVERALL_VALUE}}</w:t>
+              <w:t>{{ADD_SCOPE_SUBTOTAL}}</w:t>
             </w:r>
           </w:p>
         </w:tc>
@@ -2104,8 +2223,7 @@
         </w:trPr>
         <w:tc>
           <w:tcPr>
-            <w:tcW w:w="1007" w:type="dxa"/>
-            <w:shd w:val="clear" w:color="auto" w:fill="FFFFFF" w:themeFill="background1"/>
+            <w:tcW w:w="846" w:type="dxa"/>
             <w:tcMar>
               <w:top w:w="80" w:type="dxa"/>
               <w:left w:w="120" w:type="dxa"/>
@@ -2119,18 +2237,11 @@
                 <w:rFonts w:ascii="Times New Roman" w:hAnsi="Times New Roman" w:cs="Times New Roman"/>
               </w:rPr>
             </w:pPr>
-            <w:r>
-              <w:rPr>
-                <w:rFonts w:ascii="Times New Roman" w:hAnsi="Times New Roman" w:cs="Times New Roman"/>
-              </w:rPr>
-              <w:t>2</w:t>
-            </w:r>
-          </w:p>
-        </w:tc>
-        <w:tc>
-          <w:tcPr>
-            <w:tcW w:w="6360" w:type="dxa"/>
-            <w:shd w:val="clear" w:color="auto" w:fill="FFFFFF" w:themeFill="background1"/>
+          </w:p>
+        </w:tc>
+        <w:tc>
+          <w:tcPr>
+            <w:tcW w:w="6289" w:type="dxa"/>
             <w:tcMar>
               <w:top w:w="80" w:type="dxa"/>
               <w:left w:w="120" w:type="dxa"/>
@@ -2148,14 +2259,13 @@
               <w:rPr>
                 <w:rFonts w:ascii="Times New Roman" w:hAnsi="Times New Roman" w:cs="Times New Roman"/>
               </w:rPr>
-              <w:t>Customization</w:t>
-            </w:r>
-          </w:p>
-        </w:tc>
-        <w:tc>
-          <w:tcPr>
-            <w:tcW w:w="2625" w:type="dxa"/>
-            <w:shd w:val="clear" w:color="auto" w:fill="FFFFFF" w:themeFill="background1"/>
+              <w:t>Total of All Modules Final Price:</w:t>
+            </w:r>
+          </w:p>
+        </w:tc>
+        <w:tc>
+          <w:tcPr>
+            <w:tcW w:w="2925" w:type="dxa"/>
             <w:tcMar>
               <w:top w:w="80" w:type="dxa"/>
               <w:left w:w="120" w:type="dxa"/>
@@ -2173,7 +2283,7 @@
               <w:rPr>
                 <w:rFonts w:ascii="Times New Roman" w:hAnsi="Times New Roman" w:cs="Times New Roman"/>
               </w:rPr>
-              <w:t>TBD</w:t>
+              <w:t>{{OVERALL_VALUE}}</w:t>
             </w:r>
           </w:p>
         </w:tc>
@@ -2184,8 +2294,7 @@
         </w:trPr>
         <w:tc>
           <w:tcPr>
-            <w:tcW w:w="1007" w:type="dxa"/>
-            <w:shd w:val="clear" w:color="auto" w:fill="FFFFFF" w:themeFill="background1"/>
+            <w:tcW w:w="846" w:type="dxa"/>
             <w:tcMar>
               <w:top w:w="80" w:type="dxa"/>
               <w:left w:w="120" w:type="dxa"/>
@@ -2203,14 +2312,13 @@
               <w:rPr>
                 <w:rFonts w:ascii="Times New Roman" w:hAnsi="Times New Roman" w:cs="Times New Roman"/>
               </w:rPr>
-              <w:t xml:space="preserve"> 2.1</w:t>
-            </w:r>
-          </w:p>
-        </w:tc>
-        <w:tc>
-          <w:tcPr>
-            <w:tcW w:w="6360" w:type="dxa"/>
-            <w:shd w:val="clear" w:color="auto" w:fill="FFFFFF" w:themeFill="background1"/>
+              <w:t>2</w:t>
+            </w:r>
+          </w:p>
+        </w:tc>
+        <w:tc>
+          <w:tcPr>
+            <w:tcW w:w="6289" w:type="dxa"/>
             <w:tcMar>
               <w:top w:w="80" w:type="dxa"/>
               <w:left w:w="120" w:type="dxa"/>
@@ -2228,14 +2336,13 @@
               <w:rPr>
                 <w:rFonts w:ascii="Times New Roman" w:hAnsi="Times New Roman" w:cs="Times New Roman"/>
               </w:rPr>
-              <w:t>In case of any additional development required which will be consider 8000 per man day additional to above proposal.</w:t>
-            </w:r>
-          </w:p>
-        </w:tc>
-        <w:tc>
-          <w:tcPr>
-            <w:tcW w:w="2625" w:type="dxa"/>
-            <w:shd w:val="clear" w:color="auto" w:fill="FFFFFF" w:themeFill="background1"/>
+              <w:t>Customization</w:t>
+            </w:r>
+          </w:p>
+        </w:tc>
+        <w:tc>
+          <w:tcPr>
+            <w:tcW w:w="2925" w:type="dxa"/>
             <w:tcMar>
               <w:top w:w="80" w:type="dxa"/>
               <w:left w:w="120" w:type="dxa"/>
@@ -2249,6 +2356,12 @@
                 <w:rFonts w:ascii="Times New Roman" w:hAnsi="Times New Roman" w:cs="Times New Roman"/>
               </w:rPr>
             </w:pPr>
+            <w:r>
+              <w:rPr>
+                <w:rFonts w:ascii="Times New Roman" w:hAnsi="Times New Roman" w:cs="Times New Roman"/>
+              </w:rPr>
+              <w:t>TBD</w:t>
+            </w:r>
           </w:p>
         </w:tc>
       </w:tr>
@@ -2258,8 +2371,7 @@
         </w:trPr>
         <w:tc>
           <w:tcPr>
-            <w:tcW w:w="1007" w:type="dxa"/>
-            <w:shd w:val="clear" w:color="auto" w:fill="FFFFFF" w:themeFill="background1"/>
+            <w:tcW w:w="846" w:type="dxa"/>
             <w:tcMar>
               <w:top w:w="80" w:type="dxa"/>
               <w:left w:w="120" w:type="dxa"/>
@@ -2277,14 +2389,13 @@
               <w:rPr>
                 <w:rFonts w:ascii="Times New Roman" w:hAnsi="Times New Roman" w:cs="Times New Roman"/>
               </w:rPr>
-              <w:t>3</w:t>
-            </w:r>
-          </w:p>
-        </w:tc>
-        <w:tc>
-          <w:tcPr>
-            <w:tcW w:w="6360" w:type="dxa"/>
-            <w:shd w:val="clear" w:color="auto" w:fill="FFFFFF" w:themeFill="background1"/>
+              <w:t xml:space="preserve"> 2.1</w:t>
+            </w:r>
+          </w:p>
+        </w:tc>
+        <w:tc>
+          <w:tcPr>
+            <w:tcW w:w="6289" w:type="dxa"/>
             <w:tcMar>
               <w:top w:w="80" w:type="dxa"/>
               <w:left w:w="120" w:type="dxa"/>
@@ -2302,14 +2413,13 @@
               <w:rPr>
                 <w:rFonts w:ascii="Times New Roman" w:hAnsi="Times New Roman" w:cs="Times New Roman"/>
               </w:rPr>
-              <w:t>Renewal and Support from next year onwards</w:t>
-            </w:r>
-          </w:p>
-        </w:tc>
-        <w:tc>
-          <w:tcPr>
-            <w:tcW w:w="2625" w:type="dxa"/>
-            <w:shd w:val="clear" w:color="auto" w:fill="FFFFFF" w:themeFill="background1"/>
+              <w:t>In case of any additional development required which will be consider 8000 per man day additional to above proposal.</w:t>
+            </w:r>
+          </w:p>
+        </w:tc>
+        <w:tc>
+          <w:tcPr>
+            <w:tcW w:w="2925" w:type="dxa"/>
             <w:tcMar>
               <w:top w:w="80" w:type="dxa"/>
               <w:left w:w="120" w:type="dxa"/>
@@ -2332,8 +2442,7 @@
         </w:trPr>
         <w:tc>
           <w:tcPr>
-            <w:tcW w:w="1007" w:type="dxa"/>
-            <w:shd w:val="clear" w:color="auto" w:fill="FFFFFF" w:themeFill="background1"/>
+            <w:tcW w:w="846" w:type="dxa"/>
             <w:tcMar>
               <w:top w:w="80" w:type="dxa"/>
               <w:left w:w="120" w:type="dxa"/>
@@ -2351,26 +2460,13 @@
               <w:rPr>
                 <w:rFonts w:ascii="Times New Roman" w:hAnsi="Times New Roman" w:cs="Times New Roman"/>
               </w:rPr>
-              <w:t xml:space="preserve"> </w:t>
-            </w:r>
-            <w:r>
-              <w:rPr>
-                <w:rFonts w:ascii="Times New Roman" w:hAnsi="Times New Roman" w:cs="Times New Roman"/>
-              </w:rPr>
               <w:t>3</w:t>
             </w:r>
-            <w:r>
-              <w:rPr>
-                <w:rFonts w:ascii="Times New Roman" w:hAnsi="Times New Roman" w:cs="Times New Roman"/>
-              </w:rPr>
-              <w:t>.1</w:t>
-            </w:r>
-          </w:p>
-        </w:tc>
-        <w:tc>
-          <w:tcPr>
-            <w:tcW w:w="6360" w:type="dxa"/>
-            <w:shd w:val="clear" w:color="auto" w:fill="FFFFFF" w:themeFill="background1"/>
+          </w:p>
+        </w:tc>
+        <w:tc>
+          <w:tcPr>
+            <w:tcW w:w="6289" w:type="dxa"/>
             <w:tcMar>
               <w:top w:w="80" w:type="dxa"/>
               <w:left w:w="120" w:type="dxa"/>
@@ -2388,27 +2484,13 @@
               <w:rPr>
                 <w:rFonts w:ascii="Times New Roman" w:hAnsi="Times New Roman" w:cs="Times New Roman"/>
               </w:rPr>
-              <w:t xml:space="preserve">The License renewal would be required to be done every Year These renewal fees will facilitate to have the Product Upgrades, which would cover improvements, bug fixes, and changes in AIAG VDA compliances. </w:t>
-            </w:r>
-          </w:p>
-          <w:p>
-            <w:pPr>
-              <w:rPr>
-                <w:rFonts w:ascii="Times New Roman" w:hAnsi="Times New Roman" w:cs="Times New Roman"/>
-              </w:rPr>
-            </w:pPr>
-            <w:r>
-              <w:rPr>
-                <w:rFonts w:ascii="Times New Roman" w:hAnsi="Times New Roman" w:cs="Times New Roman"/>
-              </w:rPr>
-              <w:t xml:space="preserve">Support of 7 Man days is included in this price.  </w:t>
-            </w:r>
-          </w:p>
-        </w:tc>
-        <w:tc>
-          <w:tcPr>
-            <w:tcW w:w="2625" w:type="dxa"/>
-            <w:shd w:val="clear" w:color="auto" w:fill="FFFFFF" w:themeFill="background1"/>
+              <w:t>Renewal and Support from next year onwards</w:t>
+            </w:r>
+          </w:p>
+        </w:tc>
+        <w:tc>
+          <w:tcPr>
+            <w:tcW w:w="2925" w:type="dxa"/>
             <w:tcMar>
               <w:top w:w="80" w:type="dxa"/>
               <w:left w:w="120" w:type="dxa"/>
@@ -2422,31 +2504,6 @@
                 <w:rFonts w:ascii="Times New Roman" w:hAnsi="Times New Roman" w:cs="Times New Roman"/>
               </w:rPr>
             </w:pPr>
-            <w:r>
-              <w:rPr>
-                <w:rFonts w:ascii="Times New Roman" w:hAnsi="Times New Roman" w:cs="Times New Roman"/>
-              </w:rPr>
-              <w:t>{{MODULE_</w:t>
-            </w:r>
-            <w:r>
-              <w:rPr>
-                <w:rFonts w:ascii="Times New Roman" w:hAnsi="Times New Roman" w:cs="Times New Roman"/>
-              </w:rPr>
-              <w:t>NAME</w:t>
-            </w:r>
-            <w:r>
-              <w:rPr>
-                <w:rFonts w:ascii="Times New Roman" w:hAnsi="Times New Roman" w:cs="Times New Roman"/>
-              </w:rPr>
-              <w:t>}}</w:t>
-            </w:r>
-          </w:p>
-          <w:p>
-            <w:pPr>
-              <w:rPr>
-                <w:rFonts w:ascii="Times New Roman" w:hAnsi="Times New Roman" w:cs="Times New Roman"/>
-              </w:rPr>
-            </w:pPr>
           </w:p>
         </w:tc>
       </w:tr>
@@ -2456,8 +2513,7 @@
         </w:trPr>
         <w:tc>
           <w:tcPr>
-            <w:tcW w:w="1007" w:type="dxa"/>
-            <w:shd w:val="clear" w:color="auto" w:fill="FFFFFF" w:themeFill="background1"/>
+            <w:tcW w:w="846" w:type="dxa"/>
             <w:tcMar>
               <w:top w:w="80" w:type="dxa"/>
               <w:left w:w="120" w:type="dxa"/>
@@ -2475,14 +2531,25 @@
               <w:rPr>
                 <w:rFonts w:ascii="Times New Roman" w:hAnsi="Times New Roman" w:cs="Times New Roman"/>
               </w:rPr>
-              <w:t>4</w:t>
-            </w:r>
-          </w:p>
-        </w:tc>
-        <w:tc>
-          <w:tcPr>
-            <w:tcW w:w="6360" w:type="dxa"/>
-            <w:shd w:val="clear" w:color="auto" w:fill="FFFFFF" w:themeFill="background1"/>
+              <w:t xml:space="preserve"> </w:t>
+            </w:r>
+            <w:r>
+              <w:rPr>
+                <w:rFonts w:ascii="Times New Roman" w:hAnsi="Times New Roman" w:cs="Times New Roman"/>
+              </w:rPr>
+              <w:t>3</w:t>
+            </w:r>
+            <w:r>
+              <w:rPr>
+                <w:rFonts w:ascii="Times New Roman" w:hAnsi="Times New Roman" w:cs="Times New Roman"/>
+              </w:rPr>
+              <w:t>.1</w:t>
+            </w:r>
+          </w:p>
+        </w:tc>
+        <w:tc>
+          <w:tcPr>
+            <w:tcW w:w="6289" w:type="dxa"/>
             <w:tcMar>
               <w:top w:w="80" w:type="dxa"/>
               <w:left w:w="120" w:type="dxa"/>
@@ -2500,14 +2567,26 @@
               <w:rPr>
                 <w:rFonts w:ascii="Times New Roman" w:hAnsi="Times New Roman" w:cs="Times New Roman"/>
               </w:rPr>
-              <w:t>Support Services</w:t>
-            </w:r>
-          </w:p>
-        </w:tc>
-        <w:tc>
-          <w:tcPr>
-            <w:tcW w:w="2625" w:type="dxa"/>
-            <w:shd w:val="clear" w:color="auto" w:fill="FFFFFF" w:themeFill="background1"/>
+              <w:t xml:space="preserve">The License renewal would be required to be done every Year These renewal fees will facilitate to have the Product Upgrades, which would cover improvements, bug fixes, and changes in AIAG VDA compliances. </w:t>
+            </w:r>
+          </w:p>
+          <w:p>
+            <w:pPr>
+              <w:rPr>
+                <w:rFonts w:ascii="Times New Roman" w:hAnsi="Times New Roman" w:cs="Times New Roman"/>
+              </w:rPr>
+            </w:pPr>
+            <w:r>
+              <w:rPr>
+                <w:rFonts w:ascii="Times New Roman" w:hAnsi="Times New Roman" w:cs="Times New Roman"/>
+              </w:rPr>
+              <w:t xml:space="preserve">Support of 7 Man days is included in this price.  </w:t>
+            </w:r>
+          </w:p>
+        </w:tc>
+        <w:tc>
+          <w:tcPr>
+            <w:tcW w:w="2925" w:type="dxa"/>
             <w:tcMar>
               <w:top w:w="80" w:type="dxa"/>
               <w:left w:w="120" w:type="dxa"/>
@@ -2525,8 +2604,27 @@
               <w:rPr>
                 <w:rFonts w:ascii="Times New Roman" w:hAnsi="Times New Roman" w:cs="Times New Roman"/>
               </w:rPr>
-              <w:t>8000 per Man Day</w:t>
-            </w:r>
+              <w:t>{{MODULE_</w:t>
+            </w:r>
+            <w:r>
+              <w:rPr>
+                <w:rFonts w:ascii="Times New Roman" w:hAnsi="Times New Roman" w:cs="Times New Roman"/>
+              </w:rPr>
+              <w:t>NAME</w:t>
+            </w:r>
+            <w:r>
+              <w:rPr>
+                <w:rFonts w:ascii="Times New Roman" w:hAnsi="Times New Roman" w:cs="Times New Roman"/>
+              </w:rPr>
+              <w:t>}}</w:t>
+            </w:r>
+          </w:p>
+          <w:p>
+            <w:pPr>
+              <w:rPr>
+                <w:rFonts w:ascii="Times New Roman" w:hAnsi="Times New Roman" w:cs="Times New Roman"/>
+              </w:rPr>
+            </w:pPr>
           </w:p>
         </w:tc>
       </w:tr>
@@ -2536,8 +2634,7 @@
         </w:trPr>
         <w:tc>
           <w:tcPr>
-            <w:tcW w:w="1007" w:type="dxa"/>
-            <w:shd w:val="clear" w:color="auto" w:fill="FFFFFF" w:themeFill="background1"/>
+            <w:tcW w:w="846" w:type="dxa"/>
             <w:tcMar>
               <w:top w:w="80" w:type="dxa"/>
               <w:left w:w="120" w:type="dxa"/>
@@ -2555,14 +2652,13 @@
               <w:rPr>
                 <w:rFonts w:ascii="Times New Roman" w:hAnsi="Times New Roman" w:cs="Times New Roman"/>
               </w:rPr>
-              <w:t xml:space="preserve"> 4.1</w:t>
-            </w:r>
-          </w:p>
-        </w:tc>
-        <w:tc>
-          <w:tcPr>
-            <w:tcW w:w="6360" w:type="dxa"/>
-            <w:shd w:val="clear" w:color="auto" w:fill="FFFFFF" w:themeFill="background1"/>
+              <w:t>4</w:t>
+            </w:r>
+          </w:p>
+        </w:tc>
+        <w:tc>
+          <w:tcPr>
+            <w:tcW w:w="6289" w:type="dxa"/>
             <w:tcMar>
               <w:top w:w="80" w:type="dxa"/>
               <w:left w:w="120" w:type="dxa"/>
@@ -2580,28 +2676,13 @@
               <w:rPr>
                 <w:rFonts w:ascii="Times New Roman" w:hAnsi="Times New Roman" w:cs="Times New Roman"/>
               </w:rPr>
-              <w:t xml:space="preserve">First Year - These Services start a er 1 Month from start of Go Live. Subsequent Years – A er </w:t>
-            </w:r>
-            <w:proofErr w:type="spellStart"/>
-            <w:r>
-              <w:rPr>
-                <w:rFonts w:ascii="Times New Roman" w:hAnsi="Times New Roman" w:cs="Times New Roman"/>
-              </w:rPr>
-              <w:t>comple</w:t>
-            </w:r>
-            <w:proofErr w:type="spellEnd"/>
-            <w:r>
-              <w:rPr>
-                <w:rFonts w:ascii="Times New Roman" w:hAnsi="Times New Roman" w:cs="Times New Roman"/>
-              </w:rPr>
-              <w:t xml:space="preserve"> on of 7 Man Days</w:t>
-            </w:r>
-          </w:p>
-        </w:tc>
-        <w:tc>
-          <w:tcPr>
-            <w:tcW w:w="2625" w:type="dxa"/>
-            <w:shd w:val="clear" w:color="auto" w:fill="FFFFFF" w:themeFill="background1"/>
+              <w:t>Support Services</w:t>
+            </w:r>
+          </w:p>
+        </w:tc>
+        <w:tc>
+          <w:tcPr>
+            <w:tcW w:w="2925" w:type="dxa"/>
             <w:tcMar>
               <w:top w:w="80" w:type="dxa"/>
               <w:left w:w="120" w:type="dxa"/>
@@ -2615,6 +2696,12 @@
                 <w:rFonts w:ascii="Times New Roman" w:hAnsi="Times New Roman" w:cs="Times New Roman"/>
               </w:rPr>
             </w:pPr>
+            <w:r>
+              <w:rPr>
+                <w:rFonts w:ascii="Times New Roman" w:hAnsi="Times New Roman" w:cs="Times New Roman"/>
+              </w:rPr>
+              <w:t>8000 per Man Day</w:t>
+            </w:r>
           </w:p>
         </w:tc>
       </w:tr>
@@ -2624,8 +2711,7 @@
         </w:trPr>
         <w:tc>
           <w:tcPr>
-            <w:tcW w:w="1007" w:type="dxa"/>
-            <w:shd w:val="clear" w:color="auto" w:fill="FFFFFF" w:themeFill="background1"/>
+            <w:tcW w:w="846" w:type="dxa"/>
             <w:tcMar>
               <w:top w:w="80" w:type="dxa"/>
               <w:left w:w="120" w:type="dxa"/>
@@ -2643,14 +2729,13 @@
               <w:rPr>
                 <w:rFonts w:ascii="Times New Roman" w:hAnsi="Times New Roman" w:cs="Times New Roman"/>
               </w:rPr>
-              <w:t>5</w:t>
-            </w:r>
-          </w:p>
-        </w:tc>
-        <w:tc>
-          <w:tcPr>
-            <w:tcW w:w="6360" w:type="dxa"/>
-            <w:shd w:val="clear" w:color="auto" w:fill="FFFFFF" w:themeFill="background1"/>
+              <w:t xml:space="preserve"> 4.1</w:t>
+            </w:r>
+          </w:p>
+        </w:tc>
+        <w:tc>
+          <w:tcPr>
+            <w:tcW w:w="6289" w:type="dxa"/>
             <w:tcMar>
               <w:top w:w="80" w:type="dxa"/>
               <w:left w:w="120" w:type="dxa"/>
@@ -2668,14 +2753,49 @@
               <w:rPr>
                 <w:rFonts w:ascii="Times New Roman" w:hAnsi="Times New Roman" w:cs="Times New Roman"/>
               </w:rPr>
-              <w:t>Payment Terms</w:t>
-            </w:r>
-          </w:p>
-        </w:tc>
-        <w:tc>
-          <w:tcPr>
-            <w:tcW w:w="2625" w:type="dxa"/>
-            <w:shd w:val="clear" w:color="auto" w:fill="FFFFFF" w:themeFill="background1"/>
+              <w:t>First Year - These Services start a</w:t>
+            </w:r>
+            <w:r>
+              <w:rPr>
+                <w:rFonts w:ascii="Times New Roman" w:hAnsi="Times New Roman" w:cs="Times New Roman"/>
+              </w:rPr>
+              <w:t>ft</w:t>
+            </w:r>
+            <w:r>
+              <w:rPr>
+                <w:rFonts w:ascii="Times New Roman" w:hAnsi="Times New Roman" w:cs="Times New Roman"/>
+              </w:rPr>
+              <w:t xml:space="preserve">er 1 Month from start of Go Live. Subsequent Years – </w:t>
+            </w:r>
+            <w:r>
+              <w:rPr>
+                <w:rFonts w:ascii="Times New Roman" w:hAnsi="Times New Roman" w:cs="Times New Roman"/>
+              </w:rPr>
+              <w:t>Aft</w:t>
+            </w:r>
+            <w:r>
+              <w:rPr>
+                <w:rFonts w:ascii="Times New Roman" w:hAnsi="Times New Roman" w:cs="Times New Roman"/>
+              </w:rPr>
+              <w:t>er comple</w:t>
+            </w:r>
+            <w:r>
+              <w:rPr>
+                <w:rFonts w:ascii="Times New Roman" w:hAnsi="Times New Roman" w:cs="Times New Roman"/>
+              </w:rPr>
+              <w:t>ti</w:t>
+            </w:r>
+            <w:r>
+              <w:rPr>
+                <w:rFonts w:ascii="Times New Roman" w:hAnsi="Times New Roman" w:cs="Times New Roman"/>
+              </w:rPr>
+              <w:t>on of 7 Man Days</w:t>
+            </w:r>
+          </w:p>
+        </w:tc>
+        <w:tc>
+          <w:tcPr>
+            <w:tcW w:w="2925" w:type="dxa"/>
             <w:tcMar>
               <w:top w:w="80" w:type="dxa"/>
               <w:left w:w="120" w:type="dxa"/>
@@ -2698,8 +2818,7 @@
         </w:trPr>
         <w:tc>
           <w:tcPr>
-            <w:tcW w:w="1007" w:type="dxa"/>
-            <w:shd w:val="clear" w:color="auto" w:fill="FFFFFF" w:themeFill="background1"/>
+            <w:tcW w:w="846" w:type="dxa"/>
             <w:tcMar>
               <w:top w:w="80" w:type="dxa"/>
               <w:left w:w="120" w:type="dxa"/>
@@ -2718,14 +2837,13 @@
                 <w:rFonts w:ascii="Times New Roman" w:hAnsi="Times New Roman" w:cs="Times New Roman"/>
               </w:rPr>
               <w:lastRenderedPageBreak/>
-              <w:t xml:space="preserve"> 5.1</w:t>
-            </w:r>
-          </w:p>
-        </w:tc>
-        <w:tc>
-          <w:tcPr>
-            <w:tcW w:w="6360" w:type="dxa"/>
-            <w:shd w:val="clear" w:color="auto" w:fill="FFFFFF" w:themeFill="background1"/>
+              <w:t>5</w:t>
+            </w:r>
+          </w:p>
+        </w:tc>
+        <w:tc>
+          <w:tcPr>
+            <w:tcW w:w="6289" w:type="dxa"/>
             <w:tcMar>
               <w:top w:w="80" w:type="dxa"/>
               <w:left w:w="120" w:type="dxa"/>
@@ -2743,14 +2861,13 @@
               <w:rPr>
                 <w:rFonts w:ascii="Times New Roman" w:hAnsi="Times New Roman" w:cs="Times New Roman"/>
               </w:rPr>
-              <w:t xml:space="preserve">70% in Advance along with Purchase Order </w:t>
-            </w:r>
-          </w:p>
-        </w:tc>
-        <w:tc>
-          <w:tcPr>
-            <w:tcW w:w="2625" w:type="dxa"/>
-            <w:shd w:val="clear" w:color="auto" w:fill="FFFFFF" w:themeFill="background1"/>
+              <w:t>Payment Terms</w:t>
+            </w:r>
+          </w:p>
+        </w:tc>
+        <w:tc>
+          <w:tcPr>
+            <w:tcW w:w="2925" w:type="dxa"/>
             <w:tcMar>
               <w:top w:w="80" w:type="dxa"/>
               <w:left w:w="120" w:type="dxa"/>
@@ -2773,8 +2890,7 @@
         </w:trPr>
         <w:tc>
           <w:tcPr>
-            <w:tcW w:w="1007" w:type="dxa"/>
-            <w:shd w:val="clear" w:color="auto" w:fill="FFFFFF" w:themeFill="background1"/>
+            <w:tcW w:w="846" w:type="dxa"/>
             <w:tcMar>
               <w:top w:w="80" w:type="dxa"/>
               <w:left w:w="120" w:type="dxa"/>
@@ -2792,14 +2908,13 @@
               <w:rPr>
                 <w:rFonts w:ascii="Times New Roman" w:hAnsi="Times New Roman" w:cs="Times New Roman"/>
               </w:rPr>
-              <w:t xml:space="preserve"> 5.2</w:t>
-            </w:r>
-          </w:p>
-        </w:tc>
-        <w:tc>
-          <w:tcPr>
-            <w:tcW w:w="6360" w:type="dxa"/>
-            <w:shd w:val="clear" w:color="auto" w:fill="FFFFFF" w:themeFill="background1"/>
+              <w:t xml:space="preserve"> 5.1</w:t>
+            </w:r>
+          </w:p>
+        </w:tc>
+        <w:tc>
+          <w:tcPr>
+            <w:tcW w:w="6289" w:type="dxa"/>
             <w:tcMar>
               <w:top w:w="80" w:type="dxa"/>
               <w:left w:w="120" w:type="dxa"/>
@@ -2817,26 +2932,13 @@
               <w:rPr>
                 <w:rFonts w:ascii="Times New Roman" w:hAnsi="Times New Roman" w:cs="Times New Roman"/>
               </w:rPr>
-              <w:t xml:space="preserve">20% on </w:t>
-            </w:r>
-            <w:r>
-              <w:rPr>
-                <w:rFonts w:ascii="Times New Roman" w:hAnsi="Times New Roman" w:cs="Times New Roman"/>
-              </w:rPr>
-              <w:t>I</w:t>
-            </w:r>
-            <w:r>
-              <w:rPr>
-                <w:rFonts w:ascii="Times New Roman" w:hAnsi="Times New Roman" w:cs="Times New Roman"/>
-              </w:rPr>
-              <w:t>mplementation</w:t>
-            </w:r>
-          </w:p>
-        </w:tc>
-        <w:tc>
-          <w:tcPr>
-            <w:tcW w:w="2625" w:type="dxa"/>
-            <w:shd w:val="clear" w:color="auto" w:fill="FFFFFF" w:themeFill="background1"/>
+              <w:t xml:space="preserve">70% in Advance along with Purchase Order </w:t>
+            </w:r>
+          </w:p>
+        </w:tc>
+        <w:tc>
+          <w:tcPr>
+            <w:tcW w:w="2925" w:type="dxa"/>
             <w:tcMar>
               <w:top w:w="80" w:type="dxa"/>
               <w:left w:w="120" w:type="dxa"/>
@@ -2859,8 +2961,7 @@
         </w:trPr>
         <w:tc>
           <w:tcPr>
-            <w:tcW w:w="1007" w:type="dxa"/>
-            <w:shd w:val="clear" w:color="auto" w:fill="FFFFFF" w:themeFill="background1"/>
+            <w:tcW w:w="846" w:type="dxa"/>
             <w:tcMar>
               <w:top w:w="80" w:type="dxa"/>
               <w:left w:w="120" w:type="dxa"/>
@@ -2878,14 +2979,13 @@
               <w:rPr>
                 <w:rFonts w:ascii="Times New Roman" w:hAnsi="Times New Roman" w:cs="Times New Roman"/>
               </w:rPr>
-              <w:t xml:space="preserve"> 5.3</w:t>
-            </w:r>
-          </w:p>
-        </w:tc>
-        <w:tc>
-          <w:tcPr>
-            <w:tcW w:w="6360" w:type="dxa"/>
-            <w:shd w:val="clear" w:color="auto" w:fill="FFFFFF" w:themeFill="background1"/>
+              <w:t xml:space="preserve"> 5.2</w:t>
+            </w:r>
+          </w:p>
+        </w:tc>
+        <w:tc>
+          <w:tcPr>
+            <w:tcW w:w="6289" w:type="dxa"/>
             <w:tcMar>
               <w:top w:w="80" w:type="dxa"/>
               <w:left w:w="120" w:type="dxa"/>
@@ -2903,14 +3003,25 @@
               <w:rPr>
                 <w:rFonts w:ascii="Times New Roman" w:hAnsi="Times New Roman" w:cs="Times New Roman"/>
               </w:rPr>
-              <w:t>10% against GO LIVE or One Month from completion of implementation.</w:t>
-            </w:r>
-          </w:p>
-        </w:tc>
-        <w:tc>
-          <w:tcPr>
-            <w:tcW w:w="2625" w:type="dxa"/>
-            <w:shd w:val="clear" w:color="auto" w:fill="FFFFFF" w:themeFill="background1"/>
+              <w:t xml:space="preserve">20% on </w:t>
+            </w:r>
+            <w:r>
+              <w:rPr>
+                <w:rFonts w:ascii="Times New Roman" w:hAnsi="Times New Roman" w:cs="Times New Roman"/>
+              </w:rPr>
+              <w:t>I</w:t>
+            </w:r>
+            <w:r>
+              <w:rPr>
+                <w:rFonts w:ascii="Times New Roman" w:hAnsi="Times New Roman" w:cs="Times New Roman"/>
+              </w:rPr>
+              <w:t>mplementation</w:t>
+            </w:r>
+          </w:p>
+        </w:tc>
+        <w:tc>
+          <w:tcPr>
+            <w:tcW w:w="2925" w:type="dxa"/>
             <w:tcMar>
               <w:top w:w="80" w:type="dxa"/>
               <w:left w:w="120" w:type="dxa"/>
@@ -2933,8 +3044,7 @@
         </w:trPr>
         <w:tc>
           <w:tcPr>
-            <w:tcW w:w="1007" w:type="dxa"/>
-            <w:shd w:val="clear" w:color="auto" w:fill="FFFFFF" w:themeFill="background1"/>
+            <w:tcW w:w="846" w:type="dxa"/>
             <w:tcMar>
               <w:top w:w="80" w:type="dxa"/>
               <w:left w:w="120" w:type="dxa"/>
@@ -2952,14 +3062,13 @@
               <w:rPr>
                 <w:rFonts w:ascii="Times New Roman" w:hAnsi="Times New Roman" w:cs="Times New Roman"/>
               </w:rPr>
-              <w:t>6</w:t>
-            </w:r>
-          </w:p>
-        </w:tc>
-        <w:tc>
-          <w:tcPr>
-            <w:tcW w:w="6360" w:type="dxa"/>
-            <w:shd w:val="clear" w:color="auto" w:fill="FFFFFF" w:themeFill="background1"/>
+              <w:t xml:space="preserve"> 5.3</w:t>
+            </w:r>
+          </w:p>
+        </w:tc>
+        <w:tc>
+          <w:tcPr>
+            <w:tcW w:w="6289" w:type="dxa"/>
             <w:tcMar>
               <w:top w:w="80" w:type="dxa"/>
               <w:left w:w="120" w:type="dxa"/>
@@ -2977,14 +3086,13 @@
               <w:rPr>
                 <w:rFonts w:ascii="Times New Roman" w:hAnsi="Times New Roman" w:cs="Times New Roman"/>
               </w:rPr>
-              <w:t>Support Level</w:t>
-            </w:r>
-          </w:p>
-        </w:tc>
-        <w:tc>
-          <w:tcPr>
-            <w:tcW w:w="2625" w:type="dxa"/>
-            <w:shd w:val="clear" w:color="auto" w:fill="FFFFFF" w:themeFill="background1"/>
+              <w:t>10% against GO LIVE or One Month from completion of implementation.</w:t>
+            </w:r>
+          </w:p>
+        </w:tc>
+        <w:tc>
+          <w:tcPr>
+            <w:tcW w:w="2925" w:type="dxa"/>
             <w:tcMar>
               <w:top w:w="80" w:type="dxa"/>
               <w:left w:w="120" w:type="dxa"/>
@@ -3007,8 +3115,7 @@
         </w:trPr>
         <w:tc>
           <w:tcPr>
-            <w:tcW w:w="1007" w:type="dxa"/>
-            <w:shd w:val="clear" w:color="auto" w:fill="FFFFFF" w:themeFill="background1"/>
+            <w:tcW w:w="846" w:type="dxa"/>
             <w:tcMar>
               <w:top w:w="80" w:type="dxa"/>
               <w:left w:w="120" w:type="dxa"/>
@@ -3026,14 +3133,13 @@
               <w:rPr>
                 <w:rFonts w:ascii="Times New Roman" w:hAnsi="Times New Roman" w:cs="Times New Roman"/>
               </w:rPr>
-              <w:t xml:space="preserve"> 6.1</w:t>
-            </w:r>
-          </w:p>
-        </w:tc>
-        <w:tc>
-          <w:tcPr>
-            <w:tcW w:w="6360" w:type="dxa"/>
-            <w:shd w:val="clear" w:color="auto" w:fill="FFFFFF" w:themeFill="background1"/>
+              <w:t>6</w:t>
+            </w:r>
+          </w:p>
+        </w:tc>
+        <w:tc>
+          <w:tcPr>
+            <w:tcW w:w="6289" w:type="dxa"/>
             <w:tcMar>
               <w:top w:w="80" w:type="dxa"/>
               <w:left w:w="120" w:type="dxa"/>
@@ -3051,49 +3157,13 @@
               <w:rPr>
                 <w:rFonts w:ascii="Times New Roman" w:hAnsi="Times New Roman" w:cs="Times New Roman"/>
               </w:rPr>
-              <w:t>L1: Telephone Support</w:t>
-            </w:r>
-            <w:r>
-              <w:rPr>
-                <w:rFonts w:ascii="Times New Roman" w:hAnsi="Times New Roman" w:cs="Times New Roman"/>
-                <w:b/>
-                <w:bCs/>
-              </w:rPr>
-              <w:t xml:space="preserve"> </w:t>
-            </w:r>
-            <w:r>
-              <w:rPr>
-                <w:rFonts w:ascii="Times New Roman" w:hAnsi="Times New Roman" w:cs="Times New Roman"/>
-                <w:b/>
-                <w:bCs/>
-              </w:rPr>
-              <w:t>–</w:t>
-            </w:r>
-            <w:r>
-              <w:rPr>
-                <w:rFonts w:ascii="Times New Roman" w:hAnsi="Times New Roman" w:cs="Times New Roman"/>
-              </w:rPr>
-              <w:t xml:space="preserve"> </w:t>
-            </w:r>
-          </w:p>
-          <w:p>
-            <w:pPr>
-              <w:rPr>
-                <w:rFonts w:ascii="Times New Roman" w:hAnsi="Times New Roman" w:cs="Times New Roman"/>
-              </w:rPr>
-            </w:pPr>
-            <w:r>
-              <w:rPr>
-                <w:rFonts w:ascii="Times New Roman" w:hAnsi="Times New Roman" w:cs="Times New Roman"/>
-              </w:rPr>
-              <w:t>Queries, understanding a feature, problem solving, etc.</w:t>
-            </w:r>
-          </w:p>
-        </w:tc>
-        <w:tc>
-          <w:tcPr>
-            <w:tcW w:w="2625" w:type="dxa"/>
-            <w:shd w:val="clear" w:color="auto" w:fill="FFFFFF" w:themeFill="background1"/>
+              <w:t>Support Level</w:t>
+            </w:r>
+          </w:p>
+        </w:tc>
+        <w:tc>
+          <w:tcPr>
+            <w:tcW w:w="2925" w:type="dxa"/>
             <w:tcMar>
               <w:top w:w="80" w:type="dxa"/>
               <w:left w:w="120" w:type="dxa"/>
@@ -3103,31 +3173,10 @@
           </w:tcPr>
           <w:p>
             <w:pPr>
-              <w:spacing w:line="259" w:lineRule="auto"/>
-              <w:ind w:left="1"/>
-              <w:rPr>
-                <w:rFonts w:ascii="Times New Roman" w:hAnsi="Times New Roman" w:cs="Times New Roman"/>
-              </w:rPr>
-            </w:pPr>
-            <w:r>
-              <w:rPr>
-                <w:rFonts w:ascii="Times New Roman" w:hAnsi="Times New Roman" w:cs="Times New Roman"/>
-              </w:rPr>
-              <w:t xml:space="preserve">Chargeable  </w:t>
-            </w:r>
-          </w:p>
-          <w:p>
-            <w:pPr>
-              <w:rPr>
-                <w:rFonts w:ascii="Times New Roman" w:hAnsi="Times New Roman" w:cs="Times New Roman"/>
-              </w:rPr>
-            </w:pPr>
-            <w:r>
-              <w:rPr>
-                <w:rFonts w:ascii="Times New Roman" w:hAnsi="Times New Roman" w:cs="Times New Roman"/>
-              </w:rPr>
-              <w:t>As per Sr. No. 4</w:t>
-            </w:r>
+              <w:rPr>
+                <w:rFonts w:ascii="Times New Roman" w:hAnsi="Times New Roman" w:cs="Times New Roman"/>
+              </w:rPr>
+            </w:pPr>
           </w:p>
         </w:tc>
       </w:tr>
@@ -3137,8 +3186,7 @@
         </w:trPr>
         <w:tc>
           <w:tcPr>
-            <w:tcW w:w="1007" w:type="dxa"/>
-            <w:shd w:val="clear" w:color="auto" w:fill="FFFFFF" w:themeFill="background1"/>
+            <w:tcW w:w="846" w:type="dxa"/>
             <w:tcMar>
               <w:top w:w="80" w:type="dxa"/>
               <w:left w:w="120" w:type="dxa"/>
@@ -3156,14 +3204,13 @@
               <w:rPr>
                 <w:rFonts w:ascii="Times New Roman" w:hAnsi="Times New Roman" w:cs="Times New Roman"/>
               </w:rPr>
-              <w:t xml:space="preserve"> 6.2</w:t>
-            </w:r>
-          </w:p>
-        </w:tc>
-        <w:tc>
-          <w:tcPr>
-            <w:tcW w:w="6360" w:type="dxa"/>
-            <w:shd w:val="clear" w:color="auto" w:fill="FFFFFF" w:themeFill="background1"/>
+              <w:t xml:space="preserve"> 6.1</w:t>
+            </w:r>
+          </w:p>
+        </w:tc>
+        <w:tc>
+          <w:tcPr>
+            <w:tcW w:w="6289" w:type="dxa"/>
             <w:tcMar>
               <w:top w:w="80" w:type="dxa"/>
               <w:left w:w="120" w:type="dxa"/>
@@ -3181,7 +3228,7 @@
               <w:rPr>
                 <w:rFonts w:ascii="Times New Roman" w:hAnsi="Times New Roman" w:cs="Times New Roman"/>
               </w:rPr>
-              <w:t>L2: Bugs</w:t>
+              <w:t>L1: Telephone Support</w:t>
             </w:r>
             <w:r>
               <w:rPr>
@@ -3199,31 +3246,30 @@
               </w:rPr>
               <w:t>–</w:t>
             </w:r>
-          </w:p>
-          <w:p>
-            <w:pPr>
-              <w:rPr>
-                <w:rFonts w:ascii="Times New Roman" w:hAnsi="Times New Roman" w:cs="Times New Roman"/>
-              </w:rPr>
-            </w:pPr>
-            <w:r>
-              <w:rPr>
-                <w:rFonts w:ascii="Times New Roman" w:hAnsi="Times New Roman" w:cs="Times New Roman"/>
-              </w:rPr>
-              <w:t xml:space="preserve">Bugs </w:t>
-            </w:r>
-            <w:r>
-              <w:rPr>
-                <w:rFonts w:ascii="Times New Roman" w:hAnsi="Times New Roman" w:cs="Times New Roman"/>
-              </w:rPr>
-              <w:t>Identified by you or by BlechTek Software Solutions LLP.</w:t>
-            </w:r>
-          </w:p>
-        </w:tc>
-        <w:tc>
-          <w:tcPr>
-            <w:tcW w:w="2625" w:type="dxa"/>
-            <w:shd w:val="clear" w:color="auto" w:fill="FFFFFF" w:themeFill="background1"/>
+            <w:r>
+              <w:rPr>
+                <w:rFonts w:ascii="Times New Roman" w:hAnsi="Times New Roman" w:cs="Times New Roman"/>
+              </w:rPr>
+              <w:t xml:space="preserve"> </w:t>
+            </w:r>
+          </w:p>
+          <w:p>
+            <w:pPr>
+              <w:rPr>
+                <w:rFonts w:ascii="Times New Roman" w:hAnsi="Times New Roman" w:cs="Times New Roman"/>
+              </w:rPr>
+            </w:pPr>
+            <w:r>
+              <w:rPr>
+                <w:rFonts w:ascii="Times New Roman" w:hAnsi="Times New Roman" w:cs="Times New Roman"/>
+              </w:rPr>
+              <w:t>Queries, understanding a feature, problem solving, etc.</w:t>
+            </w:r>
+          </w:p>
+        </w:tc>
+        <w:tc>
+          <w:tcPr>
+            <w:tcW w:w="2925" w:type="dxa"/>
             <w:tcMar>
               <w:top w:w="80" w:type="dxa"/>
               <w:left w:w="120" w:type="dxa"/>
@@ -3233,15 +3279,30 @@
           </w:tcPr>
           <w:p>
             <w:pPr>
-              <w:rPr>
-                <w:rFonts w:ascii="Times New Roman" w:hAnsi="Times New Roman" w:cs="Times New Roman"/>
-              </w:rPr>
-            </w:pPr>
-            <w:r>
-              <w:rPr>
-                <w:rFonts w:ascii="Times New Roman" w:hAnsi="Times New Roman" w:cs="Times New Roman"/>
-              </w:rPr>
-              <w:t>Free, under License Fee Renewal</w:t>
+              <w:spacing w:line="259" w:lineRule="auto"/>
+              <w:ind w:left="1"/>
+              <w:rPr>
+                <w:rFonts w:ascii="Times New Roman" w:hAnsi="Times New Roman" w:cs="Times New Roman"/>
+              </w:rPr>
+            </w:pPr>
+            <w:r>
+              <w:rPr>
+                <w:rFonts w:ascii="Times New Roman" w:hAnsi="Times New Roman" w:cs="Times New Roman"/>
+              </w:rPr>
+              <w:t xml:space="preserve">Chargeable  </w:t>
+            </w:r>
+          </w:p>
+          <w:p>
+            <w:pPr>
+              <w:rPr>
+                <w:rFonts w:ascii="Times New Roman" w:hAnsi="Times New Roman" w:cs="Times New Roman"/>
+              </w:rPr>
+            </w:pPr>
+            <w:r>
+              <w:rPr>
+                <w:rFonts w:ascii="Times New Roman" w:hAnsi="Times New Roman" w:cs="Times New Roman"/>
+              </w:rPr>
+              <w:t>As per Sr. No. 4</w:t>
             </w:r>
           </w:p>
         </w:tc>
@@ -3252,8 +3313,7 @@
         </w:trPr>
         <w:tc>
           <w:tcPr>
-            <w:tcW w:w="1007" w:type="dxa"/>
-            <w:shd w:val="clear" w:color="auto" w:fill="FFFFFF" w:themeFill="background1"/>
+            <w:tcW w:w="846" w:type="dxa"/>
             <w:tcMar>
               <w:top w:w="80" w:type="dxa"/>
               <w:left w:w="120" w:type="dxa"/>
@@ -3271,14 +3331,13 @@
               <w:rPr>
                 <w:rFonts w:ascii="Times New Roman" w:hAnsi="Times New Roman" w:cs="Times New Roman"/>
               </w:rPr>
-              <w:t xml:space="preserve"> 6.3</w:t>
-            </w:r>
-          </w:p>
-        </w:tc>
-        <w:tc>
-          <w:tcPr>
-            <w:tcW w:w="6360" w:type="dxa"/>
-            <w:shd w:val="clear" w:color="auto" w:fill="FFFFFF" w:themeFill="background1"/>
+              <w:t xml:space="preserve"> 6.2</w:t>
+            </w:r>
+          </w:p>
+        </w:tc>
+        <w:tc>
+          <w:tcPr>
+            <w:tcW w:w="6289" w:type="dxa"/>
             <w:tcMar>
               <w:top w:w="80" w:type="dxa"/>
               <w:left w:w="120" w:type="dxa"/>
@@ -3296,41 +3355,54 @@
               <w:rPr>
                 <w:rFonts w:ascii="Times New Roman" w:hAnsi="Times New Roman" w:cs="Times New Roman"/>
               </w:rPr>
-              <w:t>L3: Customer Specific Enhancements</w:t>
-            </w:r>
-            <w:r>
-              <w:rPr>
-                <w:rFonts w:ascii="Times New Roman" w:hAnsi="Times New Roman" w:cs="Times New Roman"/>
-                <w:b/>
-                <w:bCs/>
-              </w:rPr>
-              <w:t xml:space="preserve"> –</w:t>
-            </w:r>
-            <w:r>
-              <w:rPr>
-                <w:rFonts w:ascii="Times New Roman" w:hAnsi="Times New Roman" w:cs="Times New Roman"/>
+              <w:t>L2: Bugs</w:t>
+            </w:r>
+            <w:r>
+              <w:rPr>
+                <w:rFonts w:ascii="Times New Roman" w:hAnsi="Times New Roman" w:cs="Times New Roman"/>
+                <w:b/>
+                <w:bCs/>
               </w:rPr>
               <w:t xml:space="preserve"> </w:t>
             </w:r>
-          </w:p>
-          <w:p>
-            <w:pPr>
-              <w:rPr>
-                <w:rFonts w:ascii="Times New Roman" w:hAnsi="Times New Roman" w:cs="Times New Roman"/>
-              </w:rPr>
-            </w:pPr>
-            <w:r>
-              <w:rPr>
-                <w:rFonts w:ascii="Times New Roman" w:hAnsi="Times New Roman" w:cs="Times New Roman"/>
-              </w:rPr>
-              <w:t>New/Change in Document Prin ng format, New/Changes in Reports, New/Change in Reports</w:t>
-            </w:r>
-          </w:p>
-        </w:tc>
-        <w:tc>
-          <w:tcPr>
-            <w:tcW w:w="2625" w:type="dxa"/>
-            <w:shd w:val="clear" w:color="auto" w:fill="FFFFFF" w:themeFill="background1"/>
+            <w:r>
+              <w:rPr>
+                <w:rFonts w:ascii="Times New Roman" w:hAnsi="Times New Roman" w:cs="Times New Roman"/>
+                <w:b/>
+                <w:bCs/>
+              </w:rPr>
+              <w:t>–</w:t>
+            </w:r>
+          </w:p>
+          <w:p>
+            <w:pPr>
+              <w:rPr>
+                <w:rFonts w:ascii="Times New Roman" w:hAnsi="Times New Roman" w:cs="Times New Roman"/>
+              </w:rPr>
+            </w:pPr>
+            <w:r>
+              <w:rPr>
+                <w:rFonts w:ascii="Times New Roman" w:hAnsi="Times New Roman" w:cs="Times New Roman"/>
+              </w:rPr>
+              <w:t xml:space="preserve">Bugs </w:t>
+            </w:r>
+            <w:r>
+              <w:rPr>
+                <w:rFonts w:ascii="Times New Roman" w:hAnsi="Times New Roman" w:cs="Times New Roman"/>
+              </w:rPr>
+              <w:t>i</w:t>
+            </w:r>
+            <w:r>
+              <w:rPr>
+                <w:rFonts w:ascii="Times New Roman" w:hAnsi="Times New Roman" w:cs="Times New Roman"/>
+              </w:rPr>
+              <w:t>dentified by you or by BlechTek Software Solutions LLP.</w:t>
+            </w:r>
+          </w:p>
+        </w:tc>
+        <w:tc>
+          <w:tcPr>
+            <w:tcW w:w="2925" w:type="dxa"/>
             <w:tcMar>
               <w:top w:w="80" w:type="dxa"/>
               <w:left w:w="120" w:type="dxa"/>
@@ -3340,30 +3412,28 @@
           </w:tcPr>
           <w:p>
             <w:pPr>
-              <w:spacing w:line="259" w:lineRule="auto"/>
-              <w:ind w:left="1"/>
-              <w:rPr>
-                <w:rFonts w:ascii="Times New Roman" w:hAnsi="Times New Roman" w:cs="Times New Roman"/>
-              </w:rPr>
-            </w:pPr>
-            <w:r>
-              <w:rPr>
-                <w:rFonts w:ascii="Times New Roman" w:hAnsi="Times New Roman" w:cs="Times New Roman"/>
-              </w:rPr>
-              <w:t xml:space="preserve">Chargeable  </w:t>
-            </w:r>
-          </w:p>
-          <w:p>
-            <w:pPr>
-              <w:rPr>
-                <w:rFonts w:ascii="Times New Roman" w:hAnsi="Times New Roman" w:cs="Times New Roman"/>
-              </w:rPr>
-            </w:pPr>
-            <w:r>
-              <w:rPr>
-                <w:rFonts w:ascii="Times New Roman" w:hAnsi="Times New Roman" w:cs="Times New Roman"/>
-              </w:rPr>
-              <w:t>As per Sr. No. 4</w:t>
+              <w:rPr>
+                <w:rFonts w:ascii="Times New Roman" w:hAnsi="Times New Roman" w:cs="Times New Roman"/>
+              </w:rPr>
+            </w:pPr>
+            <w:r>
+              <w:rPr>
+                <w:rFonts w:ascii="Times New Roman" w:hAnsi="Times New Roman" w:cs="Times New Roman"/>
+              </w:rPr>
+              <w:t xml:space="preserve">Free, under License Fee </w:t>
+            </w:r>
+          </w:p>
+          <w:p>
+            <w:pPr>
+              <w:rPr>
+                <w:rFonts w:ascii="Times New Roman" w:hAnsi="Times New Roman" w:cs="Times New Roman"/>
+              </w:rPr>
+            </w:pPr>
+            <w:r>
+              <w:rPr>
+                <w:rFonts w:ascii="Times New Roman" w:hAnsi="Times New Roman" w:cs="Times New Roman"/>
+              </w:rPr>
+              <w:t>Renewal</w:t>
             </w:r>
           </w:p>
         </w:tc>
@@ -3374,8 +3444,7 @@
         </w:trPr>
         <w:tc>
           <w:tcPr>
-            <w:tcW w:w="1007" w:type="dxa"/>
-            <w:shd w:val="clear" w:color="auto" w:fill="FFFFFF" w:themeFill="background1"/>
+            <w:tcW w:w="846" w:type="dxa"/>
             <w:tcMar>
               <w:top w:w="80" w:type="dxa"/>
               <w:left w:w="120" w:type="dxa"/>
@@ -3393,14 +3462,13 @@
               <w:rPr>
                 <w:rFonts w:ascii="Times New Roman" w:hAnsi="Times New Roman" w:cs="Times New Roman"/>
               </w:rPr>
-              <w:t xml:space="preserve"> 6.4</w:t>
-            </w:r>
-          </w:p>
-        </w:tc>
-        <w:tc>
-          <w:tcPr>
-            <w:tcW w:w="6360" w:type="dxa"/>
-            <w:shd w:val="clear" w:color="auto" w:fill="FFFFFF" w:themeFill="background1"/>
+              <w:t xml:space="preserve"> 6.3</w:t>
+            </w:r>
+          </w:p>
+        </w:tc>
+        <w:tc>
+          <w:tcPr>
+            <w:tcW w:w="6289" w:type="dxa"/>
             <w:tcMar>
               <w:top w:w="80" w:type="dxa"/>
               <w:left w:w="120" w:type="dxa"/>
@@ -3418,7 +3486,7 @@
               <w:rPr>
                 <w:rFonts w:ascii="Times New Roman" w:hAnsi="Times New Roman" w:cs="Times New Roman"/>
               </w:rPr>
-              <w:t>L4: Product Upgrade</w:t>
+              <w:t>L3: Customer Specific Enhancements</w:t>
             </w:r>
             <w:r>
               <w:rPr>
@@ -3445,7 +3513,7 @@
               <w:rPr>
                 <w:rFonts w:ascii="Times New Roman" w:hAnsi="Times New Roman" w:cs="Times New Roman"/>
               </w:rPr>
-              <w:t>Product Upgrade as done by BlechTek So ware Solu</w:t>
+              <w:t>New/Change in Document Prin</w:t>
             </w:r>
             <w:r>
               <w:rPr>
@@ -3457,14 +3525,13 @@
               <w:rPr>
                 <w:rFonts w:ascii="Times New Roman" w:hAnsi="Times New Roman" w:cs="Times New Roman"/>
               </w:rPr>
-              <w:t xml:space="preserve">ons LLP on their own  </w:t>
-            </w:r>
-          </w:p>
-        </w:tc>
-        <w:tc>
-          <w:tcPr>
-            <w:tcW w:w="2625" w:type="dxa"/>
-            <w:shd w:val="clear" w:color="auto" w:fill="FFFFFF" w:themeFill="background1"/>
+              <w:t>ng format, New/Changes in Reports, New/Change in Reports</w:t>
+            </w:r>
+          </w:p>
+        </w:tc>
+        <w:tc>
+          <w:tcPr>
+            <w:tcW w:w="2925" w:type="dxa"/>
             <w:tcMar>
               <w:top w:w="80" w:type="dxa"/>
               <w:left w:w="120" w:type="dxa"/>
@@ -3474,15 +3541,30 @@
           </w:tcPr>
           <w:p>
             <w:pPr>
-              <w:rPr>
-                <w:rFonts w:ascii="Times New Roman" w:hAnsi="Times New Roman" w:cs="Times New Roman"/>
-              </w:rPr>
-            </w:pPr>
-            <w:r>
-              <w:rPr>
-                <w:rFonts w:ascii="Times New Roman" w:hAnsi="Times New Roman" w:cs="Times New Roman"/>
-              </w:rPr>
-              <w:t>Free, under License Fee Renewal</w:t>
+              <w:spacing w:line="259" w:lineRule="auto"/>
+              <w:ind w:left="1"/>
+              <w:rPr>
+                <w:rFonts w:ascii="Times New Roman" w:hAnsi="Times New Roman" w:cs="Times New Roman"/>
+              </w:rPr>
+            </w:pPr>
+            <w:r>
+              <w:rPr>
+                <w:rFonts w:ascii="Times New Roman" w:hAnsi="Times New Roman" w:cs="Times New Roman"/>
+              </w:rPr>
+              <w:t xml:space="preserve">Chargeable  </w:t>
+            </w:r>
+          </w:p>
+          <w:p>
+            <w:pPr>
+              <w:rPr>
+                <w:rFonts w:ascii="Times New Roman" w:hAnsi="Times New Roman" w:cs="Times New Roman"/>
+              </w:rPr>
+            </w:pPr>
+            <w:r>
+              <w:rPr>
+                <w:rFonts w:ascii="Times New Roman" w:hAnsi="Times New Roman" w:cs="Times New Roman"/>
+              </w:rPr>
+              <w:t>As per Sr. No. 4</w:t>
             </w:r>
           </w:p>
         </w:tc>
@@ -3493,8 +3575,7 @@
         </w:trPr>
         <w:tc>
           <w:tcPr>
-            <w:tcW w:w="1007" w:type="dxa"/>
-            <w:shd w:val="clear" w:color="auto" w:fill="FFFFFF" w:themeFill="background1"/>
+            <w:tcW w:w="846" w:type="dxa"/>
             <w:tcMar>
               <w:top w:w="80" w:type="dxa"/>
               <w:left w:w="120" w:type="dxa"/>
@@ -3512,14 +3593,13 @@
               <w:rPr>
                 <w:rFonts w:ascii="Times New Roman" w:hAnsi="Times New Roman" w:cs="Times New Roman"/>
               </w:rPr>
-              <w:t xml:space="preserve"> 6.5</w:t>
-            </w:r>
-          </w:p>
-        </w:tc>
-        <w:tc>
-          <w:tcPr>
-            <w:tcW w:w="6360" w:type="dxa"/>
-            <w:shd w:val="clear" w:color="auto" w:fill="FFFFFF" w:themeFill="background1"/>
+              <w:t xml:space="preserve"> 6.4</w:t>
+            </w:r>
+          </w:p>
+        </w:tc>
+        <w:tc>
+          <w:tcPr>
+            <w:tcW w:w="6289" w:type="dxa"/>
             <w:tcMar>
               <w:top w:w="80" w:type="dxa"/>
               <w:left w:w="120" w:type="dxa"/>
@@ -3537,7 +3617,7 @@
               <w:rPr>
                 <w:rFonts w:ascii="Times New Roman" w:hAnsi="Times New Roman" w:cs="Times New Roman"/>
               </w:rPr>
-              <w:t>L5: Implementation</w:t>
+              <w:t>L4: Product Upgrade</w:t>
             </w:r>
             <w:r>
               <w:rPr>
@@ -3547,25 +3627,42 @@
               </w:rPr>
               <w:t xml:space="preserve"> –</w:t>
             </w:r>
-          </w:p>
-          <w:p>
-            <w:pPr>
-              <w:rPr>
-                <w:rFonts w:ascii="Times New Roman" w:hAnsi="Times New Roman" w:cs="Times New Roman"/>
-              </w:rPr>
-            </w:pPr>
-            <w:r>
-              <w:rPr>
-                <w:rFonts w:ascii="Times New Roman" w:hAnsi="Times New Roman" w:cs="Times New Roman"/>
-              </w:rPr>
-              <w:t>Master updation, new feature implementation.</w:t>
-            </w:r>
-          </w:p>
-        </w:tc>
-        <w:tc>
-          <w:tcPr>
-            <w:tcW w:w="2625" w:type="dxa"/>
-            <w:shd w:val="clear" w:color="auto" w:fill="FFFFFF" w:themeFill="background1"/>
+            <w:r>
+              <w:rPr>
+                <w:rFonts w:ascii="Times New Roman" w:hAnsi="Times New Roman" w:cs="Times New Roman"/>
+              </w:rPr>
+              <w:t xml:space="preserve"> </w:t>
+            </w:r>
+          </w:p>
+          <w:p>
+            <w:pPr>
+              <w:rPr>
+                <w:rFonts w:ascii="Times New Roman" w:hAnsi="Times New Roman" w:cs="Times New Roman"/>
+              </w:rPr>
+            </w:pPr>
+            <w:r>
+              <w:rPr>
+                <w:rFonts w:ascii="Times New Roman" w:hAnsi="Times New Roman" w:cs="Times New Roman"/>
+              </w:rPr>
+              <w:t>Product Upgrade as done by BlechTek So ware Solu</w:t>
+            </w:r>
+            <w:r>
+              <w:rPr>
+                <w:rFonts w:ascii="Times New Roman" w:hAnsi="Times New Roman" w:cs="Times New Roman"/>
+              </w:rPr>
+              <w:t>ti</w:t>
+            </w:r>
+            <w:r>
+              <w:rPr>
+                <w:rFonts w:ascii="Times New Roman" w:hAnsi="Times New Roman" w:cs="Times New Roman"/>
+              </w:rPr>
+              <w:t xml:space="preserve">ons LLP on their own  </w:t>
+            </w:r>
+          </w:p>
+        </w:tc>
+        <w:tc>
+          <w:tcPr>
+            <w:tcW w:w="2925" w:type="dxa"/>
             <w:tcMar>
               <w:top w:w="80" w:type="dxa"/>
               <w:left w:w="120" w:type="dxa"/>
@@ -3583,20 +3680,20 @@
               <w:rPr>
                 <w:rFonts w:ascii="Times New Roman" w:hAnsi="Times New Roman" w:cs="Times New Roman"/>
               </w:rPr>
-              <w:t xml:space="preserve">Chargeable  </w:t>
-            </w:r>
-          </w:p>
-          <w:p>
-            <w:pPr>
-              <w:rPr>
-                <w:rFonts w:ascii="Times New Roman" w:hAnsi="Times New Roman" w:cs="Times New Roman"/>
-              </w:rPr>
-            </w:pPr>
-            <w:r>
-              <w:rPr>
-                <w:rFonts w:ascii="Times New Roman" w:hAnsi="Times New Roman" w:cs="Times New Roman"/>
-              </w:rPr>
-              <w:t>As per Sr. No. 4</w:t>
+              <w:t xml:space="preserve">Free, under License Fee </w:t>
+            </w:r>
+          </w:p>
+          <w:p>
+            <w:pPr>
+              <w:rPr>
+                <w:rFonts w:ascii="Times New Roman" w:hAnsi="Times New Roman" w:cs="Times New Roman"/>
+              </w:rPr>
+            </w:pPr>
+            <w:r>
+              <w:rPr>
+                <w:rFonts w:ascii="Times New Roman" w:hAnsi="Times New Roman" w:cs="Times New Roman"/>
+              </w:rPr>
+              <w:t>Renewal</w:t>
             </w:r>
           </w:p>
         </w:tc>
@@ -3607,8 +3704,7 @@
         </w:trPr>
         <w:tc>
           <w:tcPr>
-            <w:tcW w:w="1007" w:type="dxa"/>
-            <w:shd w:val="clear" w:color="auto" w:fill="FFFFFF" w:themeFill="background1"/>
+            <w:tcW w:w="846" w:type="dxa"/>
             <w:tcMar>
               <w:top w:w="80" w:type="dxa"/>
               <w:left w:w="120" w:type="dxa"/>
@@ -3626,14 +3722,13 @@
               <w:rPr>
                 <w:rFonts w:ascii="Times New Roman" w:hAnsi="Times New Roman" w:cs="Times New Roman"/>
               </w:rPr>
-              <w:t>7</w:t>
-            </w:r>
-          </w:p>
-        </w:tc>
-        <w:tc>
-          <w:tcPr>
-            <w:tcW w:w="6360" w:type="dxa"/>
-            <w:shd w:val="clear" w:color="auto" w:fill="FFFFFF" w:themeFill="background1"/>
+              <w:t xml:space="preserve"> 6.5</w:t>
+            </w:r>
+          </w:p>
+        </w:tc>
+        <w:tc>
+          <w:tcPr>
+            <w:tcW w:w="6289" w:type="dxa"/>
             <w:tcMar>
               <w:top w:w="80" w:type="dxa"/>
               <w:left w:w="120" w:type="dxa"/>
@@ -3651,14 +3746,34 @@
               <w:rPr>
                 <w:rFonts w:ascii="Times New Roman" w:hAnsi="Times New Roman" w:cs="Times New Roman"/>
               </w:rPr>
-              <w:t>Taxes</w:t>
-            </w:r>
-          </w:p>
-        </w:tc>
-        <w:tc>
-          <w:tcPr>
-            <w:tcW w:w="2625" w:type="dxa"/>
-            <w:shd w:val="clear" w:color="auto" w:fill="FFFFFF" w:themeFill="background1"/>
+              <w:t>L5: Implementation</w:t>
+            </w:r>
+            <w:r>
+              <w:rPr>
+                <w:rFonts w:ascii="Times New Roman" w:hAnsi="Times New Roman" w:cs="Times New Roman"/>
+                <w:b/>
+                <w:bCs/>
+              </w:rPr>
+              <w:t xml:space="preserve"> –</w:t>
+            </w:r>
+          </w:p>
+          <w:p>
+            <w:pPr>
+              <w:rPr>
+                <w:rFonts w:ascii="Times New Roman" w:hAnsi="Times New Roman" w:cs="Times New Roman"/>
+              </w:rPr>
+            </w:pPr>
+            <w:r>
+              <w:rPr>
+                <w:rFonts w:ascii="Times New Roman" w:hAnsi="Times New Roman" w:cs="Times New Roman"/>
+              </w:rPr>
+              <w:t>Master updation, new feature implementation.</w:t>
+            </w:r>
+          </w:p>
+        </w:tc>
+        <w:tc>
+          <w:tcPr>
+            <w:tcW w:w="2925" w:type="dxa"/>
             <w:tcMar>
               <w:top w:w="80" w:type="dxa"/>
               <w:left w:w="120" w:type="dxa"/>
@@ -3676,6 +3791,96 @@
               <w:rPr>
                 <w:rFonts w:ascii="Times New Roman" w:hAnsi="Times New Roman" w:cs="Times New Roman"/>
               </w:rPr>
+              <w:t xml:space="preserve">Chargeable  </w:t>
+            </w:r>
+          </w:p>
+          <w:p>
+            <w:pPr>
+              <w:rPr>
+                <w:rFonts w:ascii="Times New Roman" w:hAnsi="Times New Roman" w:cs="Times New Roman"/>
+              </w:rPr>
+            </w:pPr>
+            <w:r>
+              <w:rPr>
+                <w:rFonts w:ascii="Times New Roman" w:hAnsi="Times New Roman" w:cs="Times New Roman"/>
+              </w:rPr>
+              <w:t>As per Sr. No. 4</w:t>
+            </w:r>
+          </w:p>
+        </w:tc>
+      </w:tr>
+      <w:tr>
+        <w:trPr>
+          <w:trHeight w:val="20"/>
+        </w:trPr>
+        <w:tc>
+          <w:tcPr>
+            <w:tcW w:w="846" w:type="dxa"/>
+            <w:tcMar>
+              <w:top w:w="80" w:type="dxa"/>
+              <w:left w:w="120" w:type="dxa"/>
+              <w:bottom w:w="80" w:type="dxa"/>
+              <w:right w:w="120" w:type="dxa"/>
+            </w:tcMar>
+          </w:tcPr>
+          <w:p>
+            <w:pPr>
+              <w:rPr>
+                <w:rFonts w:ascii="Times New Roman" w:hAnsi="Times New Roman" w:cs="Times New Roman"/>
+              </w:rPr>
+            </w:pPr>
+            <w:r>
+              <w:rPr>
+                <w:rFonts w:ascii="Times New Roman" w:hAnsi="Times New Roman" w:cs="Times New Roman"/>
+              </w:rPr>
+              <w:t>7</w:t>
+            </w:r>
+          </w:p>
+        </w:tc>
+        <w:tc>
+          <w:tcPr>
+            <w:tcW w:w="6289" w:type="dxa"/>
+            <w:tcMar>
+              <w:top w:w="80" w:type="dxa"/>
+              <w:left w:w="120" w:type="dxa"/>
+              <w:bottom w:w="80" w:type="dxa"/>
+              <w:right w:w="120" w:type="dxa"/>
+            </w:tcMar>
+          </w:tcPr>
+          <w:p>
+            <w:pPr>
+              <w:rPr>
+                <w:rFonts w:ascii="Times New Roman" w:hAnsi="Times New Roman" w:cs="Times New Roman"/>
+              </w:rPr>
+            </w:pPr>
+            <w:r>
+              <w:rPr>
+                <w:rFonts w:ascii="Times New Roman" w:hAnsi="Times New Roman" w:cs="Times New Roman"/>
+              </w:rPr>
+              <w:t>Taxes</w:t>
+            </w:r>
+          </w:p>
+        </w:tc>
+        <w:tc>
+          <w:tcPr>
+            <w:tcW w:w="2925" w:type="dxa"/>
+            <w:tcMar>
+              <w:top w:w="80" w:type="dxa"/>
+              <w:left w:w="120" w:type="dxa"/>
+              <w:bottom w:w="80" w:type="dxa"/>
+              <w:right w:w="120" w:type="dxa"/>
+            </w:tcMar>
+          </w:tcPr>
+          <w:p>
+            <w:pPr>
+              <w:rPr>
+                <w:rFonts w:ascii="Times New Roman" w:hAnsi="Times New Roman" w:cs="Times New Roman"/>
+              </w:rPr>
+            </w:pPr>
+            <w:r>
+              <w:rPr>
+                <w:rFonts w:ascii="Times New Roman" w:hAnsi="Times New Roman" w:cs="Times New Roman"/>
+              </w:rPr>
               <w:t>As Applicable</w:t>
             </w:r>
           </w:p>
@@ -3695,11 +3900,15 @@
         <w:spacing w:after="200"/>
         <w:rPr>
           <w:rFonts w:ascii="Times New Roman" w:hAnsi="Times New Roman" w:cs="Times New Roman"/>
-        </w:rPr>
-      </w:pPr>
-      <w:r>
-        <w:rPr>
-          <w:rFonts w:ascii="Times New Roman" w:hAnsi="Times New Roman" w:cs="Times New Roman"/>
+          <w:b/>
+          <w:bCs/>
+        </w:rPr>
+      </w:pPr>
+      <w:r>
+        <w:rPr>
+          <w:rFonts w:ascii="Times New Roman" w:hAnsi="Times New Roman" w:cs="Times New Roman"/>
+          <w:b/>
+          <w:bCs/>
         </w:rPr>
         <w:t xml:space="preserve">Price Summary  </w:t>
       </w:r>
@@ -3747,6 +3956,8 @@
               <w:spacing w:line="259" w:lineRule="auto"/>
               <w:rPr>
                 <w:rFonts w:ascii="Times New Roman" w:hAnsi="Times New Roman" w:cs="Times New Roman"/>
+                <w:b/>
+                <w:bCs/>
                 <w:sz w:val="18"/>
                 <w:szCs w:val="18"/>
               </w:rPr>
@@ -3754,6 +3965,8 @@
             <w:r>
               <w:rPr>
                 <w:rFonts w:ascii="Times New Roman" w:hAnsi="Times New Roman" w:cs="Times New Roman"/>
+                <w:b/>
+                <w:bCs/>
                 <w:sz w:val="18"/>
                 <w:szCs w:val="18"/>
               </w:rPr>
@@ -3778,6 +3991,8 @@
               <w:ind w:left="1"/>
               <w:rPr>
                 <w:rFonts w:ascii="Times New Roman" w:hAnsi="Times New Roman" w:cs="Times New Roman"/>
+                <w:b/>
+                <w:bCs/>
                 <w:sz w:val="18"/>
                 <w:szCs w:val="18"/>
               </w:rPr>
@@ -3785,6 +4000,8 @@
             <w:r>
               <w:rPr>
                 <w:rFonts w:ascii="Times New Roman" w:hAnsi="Times New Roman" w:cs="Times New Roman"/>
+                <w:b/>
+                <w:bCs/>
                 <w:sz w:val="18"/>
                 <w:szCs w:val="18"/>
               </w:rPr>
@@ -3810,6 +4027,8 @@
               <w:jc w:val="center"/>
               <w:rPr>
                 <w:rFonts w:ascii="Times New Roman" w:hAnsi="Times New Roman" w:cs="Times New Roman"/>
+                <w:b/>
+                <w:bCs/>
                 <w:sz w:val="18"/>
                 <w:szCs w:val="18"/>
               </w:rPr>
@@ -3817,6 +4036,8 @@
             <w:r>
               <w:rPr>
                 <w:rFonts w:ascii="Times New Roman" w:hAnsi="Times New Roman" w:cs="Times New Roman"/>
+                <w:b/>
+                <w:bCs/>
                 <w:sz w:val="18"/>
                 <w:szCs w:val="18"/>
               </w:rPr>
@@ -3842,6 +4063,8 @@
               <w:jc w:val="center"/>
               <w:rPr>
                 <w:rFonts w:ascii="Times New Roman" w:hAnsi="Times New Roman" w:cs="Times New Roman"/>
+                <w:b/>
+                <w:bCs/>
                 <w:sz w:val="18"/>
                 <w:szCs w:val="18"/>
               </w:rPr>
@@ -3849,6 +4072,8 @@
             <w:r>
               <w:rPr>
                 <w:rFonts w:ascii="Times New Roman" w:hAnsi="Times New Roman" w:cs="Times New Roman"/>
+                <w:b/>
+                <w:bCs/>
                 <w:sz w:val="18"/>
                 <w:szCs w:val="18"/>
               </w:rPr>
@@ -3874,6 +4099,8 @@
               <w:jc w:val="center"/>
               <w:rPr>
                 <w:rFonts w:ascii="Times New Roman" w:hAnsi="Times New Roman" w:cs="Times New Roman"/>
+                <w:b/>
+                <w:bCs/>
                 <w:sz w:val="18"/>
                 <w:szCs w:val="18"/>
               </w:rPr>
@@ -3881,6 +4108,8 @@
             <w:r>
               <w:rPr>
                 <w:rFonts w:ascii="Times New Roman" w:hAnsi="Times New Roman" w:cs="Times New Roman"/>
+                <w:b/>
+                <w:bCs/>
                 <w:sz w:val="18"/>
                 <w:szCs w:val="18"/>
               </w:rPr>
@@ -3906,6 +4135,8 @@
               <w:jc w:val="center"/>
               <w:rPr>
                 <w:rFonts w:ascii="Times New Roman" w:hAnsi="Times New Roman" w:cs="Times New Roman"/>
+                <w:b/>
+                <w:bCs/>
                 <w:sz w:val="18"/>
                 <w:szCs w:val="18"/>
               </w:rPr>
@@ -3913,6 +4144,8 @@
             <w:r>
               <w:rPr>
                 <w:rFonts w:ascii="Times New Roman" w:hAnsi="Times New Roman" w:cs="Times New Roman"/>
+                <w:b/>
+                <w:bCs/>
                 <w:sz w:val="18"/>
                 <w:szCs w:val="18"/>
               </w:rPr>
@@ -3938,6 +4171,8 @@
               <w:jc w:val="center"/>
               <w:rPr>
                 <w:rFonts w:ascii="Times New Roman" w:hAnsi="Times New Roman" w:cs="Times New Roman"/>
+                <w:b/>
+                <w:bCs/>
                 <w:sz w:val="18"/>
                 <w:szCs w:val="18"/>
               </w:rPr>
@@ -3945,6 +4180,8 @@
             <w:r>
               <w:rPr>
                 <w:rFonts w:ascii="Times New Roman" w:hAnsi="Times New Roman" w:cs="Times New Roman"/>
+                <w:b/>
+                <w:bCs/>
                 <w:sz w:val="18"/>
                 <w:szCs w:val="18"/>
               </w:rPr>
@@ -3970,6 +4207,8 @@
               <w:jc w:val="center"/>
               <w:rPr>
                 <w:rFonts w:ascii="Times New Roman" w:hAnsi="Times New Roman" w:cs="Times New Roman"/>
+                <w:b/>
+                <w:bCs/>
                 <w:sz w:val="18"/>
                 <w:szCs w:val="18"/>
               </w:rPr>
@@ -3977,6 +4216,8 @@
             <w:r>
               <w:rPr>
                 <w:rFonts w:ascii="Times New Roman" w:hAnsi="Times New Roman" w:cs="Times New Roman"/>
+                <w:b/>
+                <w:bCs/>
                 <w:sz w:val="18"/>
                 <w:szCs w:val="18"/>
               </w:rPr>
@@ -4002,6 +4243,8 @@
               <w:jc w:val="both"/>
               <w:rPr>
                 <w:rFonts w:ascii="Times New Roman" w:hAnsi="Times New Roman" w:cs="Times New Roman"/>
+                <w:b/>
+                <w:bCs/>
                 <w:sz w:val="18"/>
                 <w:szCs w:val="18"/>
               </w:rPr>
@@ -4009,6 +4252,8 @@
             <w:r>
               <w:rPr>
                 <w:rFonts w:ascii="Times New Roman" w:hAnsi="Times New Roman" w:cs="Times New Roman"/>
+                <w:b/>
+                <w:bCs/>
                 <w:sz w:val="18"/>
                 <w:szCs w:val="18"/>
               </w:rPr>
@@ -4273,12 +4518,16 @@
         <w:spacing w:before="300" w:after="150"/>
         <w:rPr>
           <w:rFonts w:ascii="Times New Roman" w:hAnsi="Times New Roman" w:cs="Times New Roman"/>
+          <w:b/>
+          <w:bCs/>
           <w:w w:val="101"/>
         </w:rPr>
       </w:pPr>
       <w:r>
         <w:rPr>
           <w:rFonts w:ascii="Times New Roman" w:hAnsi="Times New Roman" w:cs="Times New Roman"/>
+          <w:b/>
+          <w:bCs/>
           <w:w w:val="101"/>
         </w:rPr>
         <w:t>Time Estimate</w:t>
@@ -4314,11 +4563,15 @@
             <w:pPr>
               <w:rPr>
                 <w:rFonts w:ascii="Times New Roman" w:hAnsi="Times New Roman" w:cs="Times New Roman"/>
-              </w:rPr>
-            </w:pPr>
-            <w:r>
-              <w:rPr>
-                <w:rFonts w:ascii="Times New Roman" w:hAnsi="Times New Roman" w:cs="Times New Roman"/>
+                <w:b/>
+                <w:bCs/>
+              </w:rPr>
+            </w:pPr>
+            <w:r>
+              <w:rPr>
+                <w:rFonts w:ascii="Times New Roman" w:hAnsi="Times New Roman" w:cs="Times New Roman"/>
+                <w:b/>
+                <w:bCs/>
               </w:rPr>
               <w:t>Main Stages</w:t>
             </w:r>
@@ -4331,13 +4584,18 @@
           </w:tcPr>
           <w:p>
             <w:pPr>
-              <w:rPr>
-                <w:rFonts w:ascii="Times New Roman" w:hAnsi="Times New Roman" w:cs="Times New Roman"/>
-              </w:rPr>
-            </w:pPr>
-            <w:r>
-              <w:rPr>
-                <w:rFonts w:ascii="Times New Roman" w:hAnsi="Times New Roman" w:cs="Times New Roman"/>
+              <w:jc w:val="center"/>
+              <w:rPr>
+                <w:rFonts w:ascii="Times New Roman" w:hAnsi="Times New Roman" w:cs="Times New Roman"/>
+                <w:b/>
+                <w:bCs/>
+              </w:rPr>
+            </w:pPr>
+            <w:r>
+              <w:rPr>
+                <w:rFonts w:ascii="Times New Roman" w:hAnsi="Times New Roman" w:cs="Times New Roman"/>
+                <w:b/>
+                <w:bCs/>
               </w:rPr>
               <w:t>Month 1</w:t>
             </w:r>
@@ -4350,13 +4608,18 @@
           </w:tcPr>
           <w:p>
             <w:pPr>
-              <w:rPr>
-                <w:rFonts w:ascii="Times New Roman" w:hAnsi="Times New Roman" w:cs="Times New Roman"/>
-              </w:rPr>
-            </w:pPr>
-            <w:r>
-              <w:rPr>
-                <w:rFonts w:ascii="Times New Roman" w:hAnsi="Times New Roman" w:cs="Times New Roman"/>
+              <w:jc w:val="center"/>
+              <w:rPr>
+                <w:rFonts w:ascii="Times New Roman" w:hAnsi="Times New Roman" w:cs="Times New Roman"/>
+                <w:b/>
+                <w:bCs/>
+              </w:rPr>
+            </w:pPr>
+            <w:r>
+              <w:rPr>
+                <w:rFonts w:ascii="Times New Roman" w:hAnsi="Times New Roman" w:cs="Times New Roman"/>
+                <w:b/>
+                <w:bCs/>
               </w:rPr>
               <w:t>Month 2</w:t>
             </w:r>
@@ -4388,11 +4651,15 @@
             <w:pPr>
               <w:rPr>
                 <w:rFonts w:ascii="Times New Roman" w:hAnsi="Times New Roman" w:cs="Times New Roman"/>
-              </w:rPr>
-            </w:pPr>
-            <w:r>
-              <w:rPr>
-                <w:rFonts w:ascii="Times New Roman" w:hAnsi="Times New Roman" w:cs="Times New Roman"/>
+                <w:b/>
+                <w:bCs/>
+              </w:rPr>
+            </w:pPr>
+            <w:r>
+              <w:rPr>
+                <w:rFonts w:ascii="Times New Roman" w:hAnsi="Times New Roman" w:cs="Times New Roman"/>
+                <w:b/>
+                <w:bCs/>
               </w:rPr>
               <w:t>WK1</w:t>
             </w:r>
@@ -4406,11 +4673,15 @@
             <w:pPr>
               <w:rPr>
                 <w:rFonts w:ascii="Times New Roman" w:hAnsi="Times New Roman" w:cs="Times New Roman"/>
-              </w:rPr>
-            </w:pPr>
-            <w:r>
-              <w:rPr>
-                <w:rFonts w:ascii="Times New Roman" w:hAnsi="Times New Roman" w:cs="Times New Roman"/>
+                <w:b/>
+                <w:bCs/>
+              </w:rPr>
+            </w:pPr>
+            <w:r>
+              <w:rPr>
+                <w:rFonts w:ascii="Times New Roman" w:hAnsi="Times New Roman" w:cs="Times New Roman"/>
+                <w:b/>
+                <w:bCs/>
               </w:rPr>
               <w:t>WK2</w:t>
             </w:r>
@@ -4424,11 +4695,15 @@
             <w:pPr>
               <w:rPr>
                 <w:rFonts w:ascii="Times New Roman" w:hAnsi="Times New Roman" w:cs="Times New Roman"/>
-              </w:rPr>
-            </w:pPr>
-            <w:r>
-              <w:rPr>
-                <w:rFonts w:ascii="Times New Roman" w:hAnsi="Times New Roman" w:cs="Times New Roman"/>
+                <w:b/>
+                <w:bCs/>
+              </w:rPr>
+            </w:pPr>
+            <w:r>
+              <w:rPr>
+                <w:rFonts w:ascii="Times New Roman" w:hAnsi="Times New Roman" w:cs="Times New Roman"/>
+                <w:b/>
+                <w:bCs/>
               </w:rPr>
               <w:t>WK3</w:t>
             </w:r>
@@ -4442,11 +4717,15 @@
             <w:pPr>
               <w:rPr>
                 <w:rFonts w:ascii="Times New Roman" w:hAnsi="Times New Roman" w:cs="Times New Roman"/>
-              </w:rPr>
-            </w:pPr>
-            <w:r>
-              <w:rPr>
-                <w:rFonts w:ascii="Times New Roman" w:hAnsi="Times New Roman" w:cs="Times New Roman"/>
+                <w:b/>
+                <w:bCs/>
+              </w:rPr>
+            </w:pPr>
+            <w:r>
+              <w:rPr>
+                <w:rFonts w:ascii="Times New Roman" w:hAnsi="Times New Roman" w:cs="Times New Roman"/>
+                <w:b/>
+                <w:bCs/>
               </w:rPr>
               <w:t>WK4</w:t>
             </w:r>
@@ -4460,11 +4739,15 @@
             <w:pPr>
               <w:rPr>
                 <w:rFonts w:ascii="Times New Roman" w:hAnsi="Times New Roman" w:cs="Times New Roman"/>
-              </w:rPr>
-            </w:pPr>
-            <w:r>
-              <w:rPr>
-                <w:rFonts w:ascii="Times New Roman" w:hAnsi="Times New Roman" w:cs="Times New Roman"/>
+                <w:b/>
+                <w:bCs/>
+              </w:rPr>
+            </w:pPr>
+            <w:r>
+              <w:rPr>
+                <w:rFonts w:ascii="Times New Roman" w:hAnsi="Times New Roman" w:cs="Times New Roman"/>
+                <w:b/>
+                <w:bCs/>
               </w:rPr>
               <w:t>WK1</w:t>
             </w:r>
@@ -4478,11 +4761,15 @@
             <w:pPr>
               <w:rPr>
                 <w:rFonts w:ascii="Times New Roman" w:hAnsi="Times New Roman" w:cs="Times New Roman"/>
-              </w:rPr>
-            </w:pPr>
-            <w:r>
-              <w:rPr>
-                <w:rFonts w:ascii="Times New Roman" w:hAnsi="Times New Roman" w:cs="Times New Roman"/>
+                <w:b/>
+                <w:bCs/>
+              </w:rPr>
+            </w:pPr>
+            <w:r>
+              <w:rPr>
+                <w:rFonts w:ascii="Times New Roman" w:hAnsi="Times New Roman" w:cs="Times New Roman"/>
+                <w:b/>
+                <w:bCs/>
               </w:rPr>
               <w:t>WK2</w:t>
             </w:r>
@@ -4496,11 +4783,15 @@
             <w:pPr>
               <w:rPr>
                 <w:rFonts w:ascii="Times New Roman" w:hAnsi="Times New Roman" w:cs="Times New Roman"/>
-              </w:rPr>
-            </w:pPr>
-            <w:r>
-              <w:rPr>
-                <w:rFonts w:ascii="Times New Roman" w:hAnsi="Times New Roman" w:cs="Times New Roman"/>
+                <w:b/>
+                <w:bCs/>
+              </w:rPr>
+            </w:pPr>
+            <w:r>
+              <w:rPr>
+                <w:rFonts w:ascii="Times New Roman" w:hAnsi="Times New Roman" w:cs="Times New Roman"/>
+                <w:b/>
+                <w:bCs/>
               </w:rPr>
               <w:t>WK3</w:t>
             </w:r>
@@ -4514,11 +4805,15 @@
             <w:pPr>
               <w:rPr>
                 <w:rFonts w:ascii="Times New Roman" w:hAnsi="Times New Roman" w:cs="Times New Roman"/>
-              </w:rPr>
-            </w:pPr>
-            <w:r>
-              <w:rPr>
-                <w:rFonts w:ascii="Times New Roman" w:hAnsi="Times New Roman" w:cs="Times New Roman"/>
+                <w:b/>
+                <w:bCs/>
+              </w:rPr>
+            </w:pPr>
+            <w:r>
+              <w:rPr>
+                <w:rFonts w:ascii="Times New Roman" w:hAnsi="Times New Roman" w:cs="Times New Roman"/>
+                <w:b/>
+                <w:bCs/>
               </w:rPr>
               <w:t>WK4</w:t>
             </w:r>
@@ -4538,11 +4833,15 @@
             <w:pPr>
               <w:rPr>
                 <w:rFonts w:ascii="Times New Roman" w:hAnsi="Times New Roman" w:cs="Times New Roman"/>
-              </w:rPr>
-            </w:pPr>
-            <w:r>
-              <w:rPr>
-                <w:rFonts w:ascii="Times New Roman" w:hAnsi="Times New Roman" w:cs="Times New Roman"/>
+                <w:b/>
+                <w:bCs/>
+              </w:rPr>
+            </w:pPr>
+            <w:r>
+              <w:rPr>
+                <w:rFonts w:ascii="Times New Roman" w:hAnsi="Times New Roman" w:cs="Times New Roman"/>
+                <w:b/>
+                <w:bCs/>
               </w:rPr>
               <w:t>{{MODULE_NAME}}</w:t>
             </w:r>
@@ -4805,7 +5104,13 @@
               <w:rPr>
                 <w:rFonts w:ascii="Times New Roman" w:hAnsi="Times New Roman" w:cs="Times New Roman"/>
               </w:rPr>
-              <w:t>{{MODULE_LIST}} Configuration &amp; Set Up</w:t>
+              <w:t>{{MODULE_LIST}}</w:t>
+            </w:r>
+            <w:r>
+              <w:rPr>
+                <w:rFonts w:ascii="Times New Roman" w:hAnsi="Times New Roman" w:cs="Times New Roman"/>
+              </w:rPr>
+              <w:t xml:space="preserve"> Configuration &amp; Set Up</w:t>
             </w:r>
           </w:p>
         </w:tc>
@@ -5043,6 +5348,7 @@
               <w:rPr>
                 <w:rFonts w:ascii="Times New Roman" w:hAnsi="Times New Roman" w:cs="Times New Roman"/>
               </w:rPr>
+              <w:lastRenderedPageBreak/>
               <w:t>Data Preparation for Go-Live</w:t>
             </w:r>
           </w:p>
@@ -5397,7 +5703,6 @@
           <w:rFonts w:ascii="Times New Roman" w:hAnsi="Times New Roman" w:cs="Times New Roman"/>
           <w:w w:val="101"/>
         </w:rPr>
-        <w:lastRenderedPageBreak/>
         <w:t>We</w:t>
       </w:r>
       <w:r>
@@ -5543,15 +5848,13 @@
         </w:rPr>
         <w:t xml:space="preserve"> </w:t>
       </w:r>
-      <w:proofErr w:type="gramStart"/>
       <w:r>
         <w:rPr>
           <w:rFonts w:ascii="Times New Roman" w:hAnsi="Times New Roman" w:cs="Times New Roman"/>
           <w:w w:val="101"/>
         </w:rPr>
-        <w:t>Organization</w:t>
-      </w:r>
-      <w:proofErr w:type="gramEnd"/>
+        <w:t>organization</w:t>
+      </w:r>
     </w:p>
     <w:p>
       <w:pPr>
@@ -5706,11 +6009,15 @@
         <w:jc w:val="both"/>
         <w:rPr>
           <w:rFonts w:ascii="Times New Roman" w:hAnsi="Times New Roman" w:cs="Times New Roman"/>
-        </w:rPr>
-      </w:pPr>
-      <w:r>
-        <w:rPr>
-          <w:rFonts w:ascii="Times New Roman" w:hAnsi="Times New Roman" w:cs="Times New Roman"/>
+          <w:b/>
+          <w:bCs/>
+        </w:rPr>
+      </w:pPr>
+      <w:r>
+        <w:rPr>
+          <w:rFonts w:ascii="Times New Roman" w:hAnsi="Times New Roman" w:cs="Times New Roman"/>
+          <w:b/>
+          <w:bCs/>
         </w:rPr>
         <w:t xml:space="preserve">Terms and Conditions  </w:t>
       </w:r>
@@ -5721,12 +6028,16 @@
         <w:jc w:val="both"/>
         <w:rPr>
           <w:rFonts w:ascii="Times New Roman" w:hAnsi="Times New Roman" w:cs="Times New Roman"/>
+          <w:b/>
+          <w:bCs/>
           <w:color w:val="000000" w:themeColor="text1"/>
         </w:rPr>
       </w:pPr>
       <w:r>
         <w:rPr>
           <w:rFonts w:ascii="Times New Roman" w:hAnsi="Times New Roman" w:cs="Times New Roman"/>
+          <w:b/>
+          <w:bCs/>
           <w:color w:val="000000" w:themeColor="text1"/>
         </w:rPr>
         <w:t>1. Confidentiality</w:t>
@@ -5753,12 +6064,16 @@
         <w:jc w:val="both"/>
         <w:rPr>
           <w:rFonts w:ascii="Times New Roman" w:hAnsi="Times New Roman" w:cs="Times New Roman"/>
+          <w:b/>
+          <w:bCs/>
           <w:color w:val="000000" w:themeColor="text1"/>
         </w:rPr>
       </w:pPr>
       <w:r>
         <w:rPr>
           <w:rFonts w:ascii="Times New Roman" w:hAnsi="Times New Roman" w:cs="Times New Roman"/>
+          <w:b/>
+          <w:bCs/>
           <w:color w:val="000000" w:themeColor="text1"/>
         </w:rPr>
         <w:t>2. License</w:t>
@@ -5785,12 +6100,16 @@
         <w:jc w:val="both"/>
         <w:rPr>
           <w:rFonts w:ascii="Times New Roman" w:hAnsi="Times New Roman" w:cs="Times New Roman"/>
+          <w:b/>
+          <w:bCs/>
           <w:color w:val="000000" w:themeColor="text1"/>
         </w:rPr>
       </w:pPr>
       <w:r>
         <w:rPr>
           <w:rFonts w:ascii="Times New Roman" w:hAnsi="Times New Roman" w:cs="Times New Roman"/>
+          <w:b/>
+          <w:bCs/>
           <w:color w:val="000000" w:themeColor="text1"/>
         </w:rPr>
         <w:t>3. Ownership of Source Code</w:t>
@@ -5817,12 +6136,16 @@
         <w:jc w:val="both"/>
         <w:rPr>
           <w:rFonts w:ascii="Times New Roman" w:hAnsi="Times New Roman" w:cs="Times New Roman"/>
+          <w:b/>
+          <w:bCs/>
           <w:color w:val="000000" w:themeColor="text1"/>
         </w:rPr>
       </w:pPr>
       <w:r>
         <w:rPr>
           <w:rFonts w:ascii="Times New Roman" w:hAnsi="Times New Roman" w:cs="Times New Roman"/>
+          <w:b/>
+          <w:bCs/>
           <w:color w:val="000000" w:themeColor="text1"/>
         </w:rPr>
         <w:t>4. Warranty</w:t>
@@ -5849,12 +6172,16 @@
         <w:jc w:val="both"/>
         <w:rPr>
           <w:rFonts w:ascii="Times New Roman" w:hAnsi="Times New Roman" w:cs="Times New Roman"/>
+          <w:b/>
+          <w:bCs/>
           <w:color w:val="000000" w:themeColor="text1"/>
         </w:rPr>
       </w:pPr>
       <w:r>
         <w:rPr>
           <w:rFonts w:ascii="Times New Roman" w:hAnsi="Times New Roman" w:cs="Times New Roman"/>
+          <w:b/>
+          <w:bCs/>
           <w:color w:val="000000" w:themeColor="text1"/>
         </w:rPr>
         <w:t>5. Installation of Software</w:t>
@@ -5910,12 +6237,16 @@
         <w:jc w:val="both"/>
         <w:rPr>
           <w:rFonts w:ascii="Times New Roman" w:hAnsi="Times New Roman" w:cs="Times New Roman"/>
+          <w:b/>
+          <w:bCs/>
           <w:color w:val="000000" w:themeColor="text1"/>
         </w:rPr>
       </w:pPr>
       <w:r>
         <w:rPr>
           <w:rFonts w:ascii="Times New Roman" w:hAnsi="Times New Roman" w:cs="Times New Roman"/>
+          <w:b/>
+          <w:bCs/>
           <w:color w:val="000000" w:themeColor="text1"/>
         </w:rPr>
         <w:t>6. Excused Performance</w:t>
@@ -5967,14 +6298,19 @@
         <w:jc w:val="both"/>
         <w:rPr>
           <w:rFonts w:ascii="Times New Roman" w:hAnsi="Times New Roman" w:cs="Times New Roman"/>
+          <w:b/>
+          <w:bCs/>
           <w:color w:val="000000" w:themeColor="text1"/>
         </w:rPr>
       </w:pPr>
       <w:r>
         <w:rPr>
           <w:rFonts w:ascii="Times New Roman" w:hAnsi="Times New Roman" w:cs="Times New Roman"/>
+          <w:b/>
+          <w:bCs/>
           <w:color w:val="000000" w:themeColor="text1"/>
         </w:rPr>
+        <w:lastRenderedPageBreak/>
         <w:t>7. Discontinuation of Contract</w:t>
       </w:r>
     </w:p>
@@ -6063,15 +6399,18 @@
         <w:jc w:val="both"/>
         <w:rPr>
           <w:rFonts w:ascii="Times New Roman" w:hAnsi="Times New Roman" w:cs="Times New Roman"/>
+          <w:b/>
+          <w:bCs/>
           <w:color w:val="000000" w:themeColor="text1"/>
         </w:rPr>
       </w:pPr>
       <w:r>
         <w:rPr>
           <w:rFonts w:ascii="Times New Roman" w:hAnsi="Times New Roman" w:cs="Times New Roman"/>
+          <w:b/>
+          <w:bCs/>
           <w:color w:val="000000" w:themeColor="text1"/>
         </w:rPr>
-        <w:lastRenderedPageBreak/>
         <w:t>8. TDS</w:t>
       </w:r>
     </w:p>
@@ -6090,28 +6429,24 @@
         </w:rPr>
         <w:t xml:space="preserve">In case of deduction of TDS Amount, </w:t>
       </w:r>
-      <w:proofErr w:type="gramStart"/>
-      <w:r>
-        <w:rPr>
-          <w:rFonts w:ascii="Times New Roman" w:hAnsi="Times New Roman" w:cs="Times New Roman"/>
-        </w:rPr>
-        <w:t>You</w:t>
-      </w:r>
-      <w:proofErr w:type="gramEnd"/>
+      <w:r>
+        <w:rPr>
+          <w:rFonts w:ascii="Times New Roman" w:hAnsi="Times New Roman" w:cs="Times New Roman"/>
+        </w:rPr>
+        <w:t>you</w:t>
+      </w:r>
       <w:r>
         <w:rPr>
           <w:rFonts w:ascii="Times New Roman" w:hAnsi="Times New Roman" w:cs="Times New Roman"/>
         </w:rPr>
         <w:t xml:space="preserve"> </w:t>
       </w:r>
-      <w:proofErr w:type="gramStart"/>
-      <w:r>
-        <w:rPr>
-          <w:rFonts w:ascii="Times New Roman" w:hAnsi="Times New Roman" w:cs="Times New Roman"/>
-        </w:rPr>
-        <w:t>have to</w:t>
-      </w:r>
-      <w:proofErr w:type="gramEnd"/>
+      <w:r>
+        <w:rPr>
+          <w:rFonts w:ascii="Times New Roman" w:hAnsi="Times New Roman" w:cs="Times New Roman"/>
+        </w:rPr>
+        <w:t>must</w:t>
+      </w:r>
       <w:r>
         <w:rPr>
           <w:rFonts w:ascii="Times New Roman" w:hAnsi="Times New Roman" w:cs="Times New Roman"/>
@@ -6125,12 +6460,16 @@
         <w:jc w:val="both"/>
         <w:rPr>
           <w:rFonts w:ascii="Times New Roman" w:hAnsi="Times New Roman" w:cs="Times New Roman"/>
+          <w:b/>
+          <w:bCs/>
           <w:color w:val="000000" w:themeColor="text1"/>
         </w:rPr>
       </w:pPr>
       <w:r>
         <w:rPr>
           <w:rFonts w:ascii="Times New Roman" w:hAnsi="Times New Roman" w:cs="Times New Roman"/>
+          <w:b/>
+          <w:bCs/>
           <w:color w:val="000000" w:themeColor="text1"/>
         </w:rPr>
         <w:t>9. Validity of the Offer</w:t>
@@ -6142,13 +6481,23 @@
         <w:jc w:val="both"/>
         <w:rPr>
           <w:rFonts w:ascii="Times New Roman" w:hAnsi="Times New Roman" w:cs="Times New Roman"/>
-        </w:rPr>
-      </w:pPr>
-      <w:r>
-        <w:rPr>
-          <w:rFonts w:ascii="Times New Roman" w:hAnsi="Times New Roman" w:cs="Times New Roman"/>
-        </w:rPr>
-        <w:t>This offer is valid up to {{VALIDATION_DATE}}.</w:t>
+          <w:b/>
+          <w:bCs/>
+        </w:rPr>
+      </w:pPr>
+      <w:r>
+        <w:rPr>
+          <w:rFonts w:ascii="Times New Roman" w:hAnsi="Times New Roman" w:cs="Times New Roman"/>
+        </w:rPr>
+        <w:t xml:space="preserve">This offer is valid up to </w:t>
+      </w:r>
+      <w:r>
+        <w:rPr>
+          <w:rFonts w:ascii="Times New Roman" w:hAnsi="Times New Roman" w:cs="Times New Roman"/>
+          <w:b/>
+          <w:bCs/>
+        </w:rPr>
+        <w:t>{{VALIDATION_DATE}}.</w:t>
       </w:r>
     </w:p>
     <w:p>
@@ -6157,12 +6506,16 @@
         <w:jc w:val="both"/>
         <w:rPr>
           <w:rFonts w:ascii="Times New Roman" w:hAnsi="Times New Roman" w:cs="Times New Roman"/>
+          <w:b/>
+          <w:bCs/>
           <w:color w:val="000000" w:themeColor="text1"/>
         </w:rPr>
       </w:pPr>
       <w:r>
         <w:rPr>
           <w:rFonts w:ascii="Times New Roman" w:hAnsi="Times New Roman" w:cs="Times New Roman"/>
+          <w:b/>
+          <w:bCs/>
           <w:color w:val="000000" w:themeColor="text1"/>
         </w:rPr>
         <w:t>10. Suggestions by Auditors / Consultants</w:t>
@@ -6201,12 +6554,16 @@
         <w:jc w:val="both"/>
         <w:rPr>
           <w:rFonts w:ascii="Times New Roman" w:hAnsi="Times New Roman" w:cs="Times New Roman"/>
+          <w:b/>
+          <w:bCs/>
           <w:color w:val="000000" w:themeColor="text1"/>
         </w:rPr>
       </w:pPr>
       <w:r>
         <w:rPr>
           <w:rFonts w:ascii="Times New Roman" w:hAnsi="Times New Roman" w:cs="Times New Roman"/>
+          <w:b/>
+          <w:bCs/>
           <w:color w:val="000000" w:themeColor="text1"/>
         </w:rPr>
         <w:t>11. Legal</w:t>
@@ -6275,12 +6632,16 @@
         <w:jc w:val="both"/>
         <w:rPr>
           <w:rFonts w:ascii="Times New Roman" w:hAnsi="Times New Roman" w:cs="Times New Roman"/>
+          <w:b/>
+          <w:bCs/>
           <w:color w:val="000000" w:themeColor="text1"/>
         </w:rPr>
       </w:pPr>
       <w:r>
         <w:rPr>
           <w:rFonts w:ascii="Times New Roman" w:hAnsi="Times New Roman" w:cs="Times New Roman"/>
+          <w:b/>
+          <w:bCs/>
           <w:color w:val="000000" w:themeColor="text1"/>
         </w:rPr>
         <w:t>For BlechTek Software Solutions LLP</w:t>
@@ -6344,21 +6705,6 @@
           <w:rFonts w:ascii="Times New Roman" w:hAnsi="Times New Roman" w:cs="Times New Roman"/>
         </w:rPr>
       </w:pPr>
-    </w:p>
-    <w:p>
-      <w:pPr>
-        <w:spacing w:after="20"/>
-        <w:jc w:val="both"/>
-        <w:rPr>
-          <w:rFonts w:ascii="Times New Roman" w:hAnsi="Times New Roman" w:cs="Times New Roman"/>
-        </w:rPr>
-      </w:pPr>
-      <w:r>
-        <w:rPr>
-          <w:rFonts w:ascii="Times New Roman" w:hAnsi="Times New Roman" w:cs="Times New Roman"/>
-        </w:rPr>
-        <w:t>should pay us the deducted TDS amount immediately.</w:t>
-      </w:r>
     </w:p>
     <w:p>
       <w:pPr>
@@ -6501,56 +6847,6 @@
         <w:szCs w:val="18"/>
       </w:rPr>
     </w:pPr>
-  </w:p>
-  <w:p>
-    <w:pPr>
-      <w:jc w:val="center"/>
-      <w:rPr>
-        <w:color w:val="5B6478"/>
-        <w:sz w:val="14"/>
-        <w:szCs w:val="14"/>
-      </w:rPr>
-    </w:pPr>
-    <w:r>
-      <w:rPr>
-        <w:noProof/>
-      </w:rPr>
-      <w:drawing>
-        <wp:inline distT="0" distB="0" distL="0" distR="0" wp14:anchorId="0C7DB755" wp14:editId="4C568021">
-          <wp:extent cx="6375400" cy="47625"/>
-          <wp:effectExtent l="0" t="0" r="6350" b="9525"/>
-          <wp:docPr id="1622519558" name="Footer Line"/>
-          <wp:cNvGraphicFramePr>
-            <a:graphicFrameLocks xmlns:a="http://schemas.openxmlformats.org/drawingml/2006/main" noChangeAspect="1"/>
-          </wp:cNvGraphicFramePr>
-          <a:graphic xmlns:a="http://schemas.openxmlformats.org/drawingml/2006/main">
-            <a:graphicData uri="http://schemas.openxmlformats.org/drawingml/2006/picture">
-              <pic:pic xmlns:pic="http://schemas.openxmlformats.org/drawingml/2006/picture">
-                <pic:nvPicPr>
-                  <pic:cNvPr id="1" name="Footer Line"/>
-                  <pic:cNvPicPr/>
-                </pic:nvPicPr>
-                <pic:blipFill>
-                  <a:blip r:embed="rId1"/>
-                  <a:stretch>
-                    <a:fillRect/>
-                  </a:stretch>
-                </pic:blipFill>
-                <pic:spPr>
-                  <a:xfrm>
-                    <a:off x="0" y="0"/>
-                    <a:ext cx="6375400" cy="47625"/>
-                  </a:xfrm>
-                  <a:prstGeom prst="rect">
-                    <a:avLst/>
-                  </a:prstGeom>
-                </pic:spPr>
-              </pic:pic>
-            </a:graphicData>
-          </a:graphic>
-        </wp:inline>
-      </w:drawing>
-    </w:r>
   </w:p>
   <w:p>
     <w:pPr>
@@ -6660,6 +6956,56 @@
         <w:szCs w:val="18"/>
       </w:rPr>
       <w:t>MSME Certificate No.: UDYAM-MH-26-0746115</w:t>
+    </w:r>
+  </w:p>
+  <w:p>
+    <w:pPr>
+      <w:jc w:val="center"/>
+      <w:rPr>
+        <w:color w:val="5B6478"/>
+        <w:sz w:val="14"/>
+        <w:szCs w:val="14"/>
+      </w:rPr>
+    </w:pPr>
+    <w:r>
+      <w:rPr>
+        <w:noProof/>
+      </w:rPr>
+      <w:drawing>
+        <wp:inline distT="0" distB="0" distL="0" distR="0" wp14:anchorId="0C7DB755" wp14:editId="4C568021">
+          <wp:extent cx="6375400" cy="47625"/>
+          <wp:effectExtent l="0" t="0" r="6350" b="9525"/>
+          <wp:docPr id="1622519558" name="Footer Line"/>
+          <wp:cNvGraphicFramePr>
+            <a:graphicFrameLocks xmlns:a="http://schemas.openxmlformats.org/drawingml/2006/main" noChangeAspect="1"/>
+          </wp:cNvGraphicFramePr>
+          <a:graphic xmlns:a="http://schemas.openxmlformats.org/drawingml/2006/main">
+            <a:graphicData uri="http://schemas.openxmlformats.org/drawingml/2006/picture">
+              <pic:pic xmlns:pic="http://schemas.openxmlformats.org/drawingml/2006/picture">
+                <pic:nvPicPr>
+                  <pic:cNvPr id="1" name="Footer Line"/>
+                  <pic:cNvPicPr/>
+                </pic:nvPicPr>
+                <pic:blipFill>
+                  <a:blip r:embed="rId1"/>
+                  <a:stretch>
+                    <a:fillRect/>
+                  </a:stretch>
+                </pic:blipFill>
+                <pic:spPr>
+                  <a:xfrm>
+                    <a:off x="0" y="0"/>
+                    <a:ext cx="6375400" cy="47625"/>
+                  </a:xfrm>
+                  <a:prstGeom prst="rect">
+                    <a:avLst/>
+                  </a:prstGeom>
+                </pic:spPr>
+              </pic:pic>
+            </a:graphicData>
+          </a:graphic>
+        </wp:inline>
+      </w:drawing>
     </w:r>
   </w:p>
 </w:ftr>
@@ -6841,43 +7187,19 @@
     </w:pPr>
     <w:r>
       <w:rPr>
-        <w:sz w:val="36"/>
-      </w:rPr>
-      <w:t xml:space="preserve">                                                             </w:t>
-    </w:r>
-    <w:r>
-      <w:rPr>
-        <w:sz w:val="36"/>
-      </w:rPr>
-      <w:t xml:space="preserve"> </w:t>
-    </w:r>
-    <w:r>
-      <w:rPr>
-        <w:sz w:val="36"/>
-      </w:rPr>
-      <w:t xml:space="preserve"> </w:t>
-    </w:r>
-    <w:r>
-      <w:rPr>
-        <w:sz w:val="36"/>
-      </w:rPr>
-      <w:t xml:space="preserve">   </w:t>
-    </w:r>
-    <w:r>
-      <w:rPr>
         <w:noProof/>
       </w:rPr>
       <w:drawing>
-        <wp:anchor distT="0" distB="0" distL="114300" distR="114300" simplePos="0" relativeHeight="251661312" behindDoc="0" locked="0" layoutInCell="1" allowOverlap="1" wp14:anchorId="666FBD31" wp14:editId="4B3A5522">
+        <wp:anchor distT="0" distB="0" distL="114300" distR="114300" simplePos="0" relativeHeight="251661312" behindDoc="0" locked="0" layoutInCell="1" allowOverlap="1" wp14:anchorId="666FBD31" wp14:editId="1BE3A872">
           <wp:simplePos x="0" y="0"/>
-          <wp:positionH relativeFrom="column">
-            <wp:posOffset>1398021</wp:posOffset>
+          <wp:positionH relativeFrom="margin">
+            <wp:align>center</wp:align>
           </wp:positionH>
           <wp:positionV relativeFrom="paragraph">
-            <wp:posOffset>2949243</wp:posOffset>
+            <wp:posOffset>2376446</wp:posOffset>
           </wp:positionV>
           <wp:extent cx="2912249" cy="3307021"/>
-          <wp:effectExtent l="0" t="0" r="0" b="0"/>
+          <wp:effectExtent l="0" t="0" r="2540" b="8255"/>
           <wp:wrapNone/>
           <wp:docPr id="1233503933" name="Picture 1"/>
           <wp:cNvGraphicFramePr/>
@@ -6908,6 +7230,30 @@
           </a:graphic>
         </wp:anchor>
       </w:drawing>
+    </w:r>
+    <w:r>
+      <w:rPr>
+        <w:sz w:val="36"/>
+      </w:rPr>
+      <w:t xml:space="preserve">                                                             </w:t>
+    </w:r>
+    <w:r>
+      <w:rPr>
+        <w:sz w:val="36"/>
+      </w:rPr>
+      <w:t xml:space="preserve"> </w:t>
+    </w:r>
+    <w:r>
+      <w:rPr>
+        <w:sz w:val="36"/>
+      </w:rPr>
+      <w:t xml:space="preserve"> </w:t>
+    </w:r>
+    <w:r>
+      <w:rPr>
+        <w:sz w:val="36"/>
+      </w:rPr>
+      <w:t xml:space="preserve">   </w:t>
     </w:r>
     <w:r>
       <w:rPr>

</xml_diff>

<commit_message>
updates in new quotation pdf for having the text reduce for showing the data like the {{A_S_AMT}}
</commit_message>
<xml_diff>
--- a/QuotationApp.API/Templates/QuotationTemplate_Updated - Copy.docx
+++ b/QuotationApp.API/Templates/QuotationTemplate_Updated - Copy.docx
@@ -130,8 +130,6 @@
             <w:r>
               <w:rPr>
                 <w:rFonts w:ascii="Times New Roman" w:hAnsi="Times New Roman" w:cs="Times New Roman"/>
-                <w:b/>
-                <w:bCs/>
                 <w:sz w:val="18"/>
                 <w:szCs w:val="18"/>
               </w:rPr>
@@ -141,8 +139,6 @@
             <w:r>
               <w:rPr>
                 <w:rFonts w:ascii="Times New Roman" w:hAnsi="Times New Roman" w:cs="Times New Roman"/>
-                <w:b/>
-                <w:bCs/>
                 <w:sz w:val="18"/>
                 <w:szCs w:val="18"/>
               </w:rPr>
@@ -220,8 +216,6 @@
             <w:r>
               <w:rPr>
                 <w:rFonts w:ascii="Times New Roman" w:hAnsi="Times New Roman" w:cs="Times New Roman"/>
-                <w:b/>
-                <w:bCs/>
                 <w:sz w:val="18"/>
                 <w:szCs w:val="18"/>
               </w:rPr>
@@ -231,8 +225,6 @@
             <w:r>
               <w:rPr>
                 <w:rFonts w:ascii="Times New Roman" w:hAnsi="Times New Roman" w:cs="Times New Roman"/>
-                <w:b/>
-                <w:bCs/>
                 <w:sz w:val="18"/>
                 <w:szCs w:val="18"/>
               </w:rPr>
@@ -276,8 +268,6 @@
             <w:r>
               <w:rPr>
                 <w:rFonts w:ascii="Times New Roman" w:hAnsi="Times New Roman" w:cs="Times New Roman"/>
-                <w:b/>
-                <w:bCs/>
                 <w:sz w:val="18"/>
                 <w:szCs w:val="18"/>
               </w:rPr>
@@ -287,8 +277,6 @@
             <w:r>
               <w:rPr>
                 <w:rFonts w:ascii="Times New Roman" w:hAnsi="Times New Roman" w:cs="Times New Roman"/>
-                <w:b/>
-                <w:bCs/>
                 <w:sz w:val="18"/>
                 <w:szCs w:val="18"/>
               </w:rPr>
@@ -421,7 +409,23 @@
           <w:b/>
           <w:bCs/>
         </w:rPr>
-        <w:t>{{MODULE_LIST}}</w:t>
+        <w:t>{{</w:t>
+      </w:r>
+      <w:r>
+        <w:rPr>
+          <w:rFonts w:ascii="Times New Roman" w:hAnsi="Times New Roman" w:cs="Times New Roman"/>
+          <w:b/>
+          <w:bCs/>
+        </w:rPr>
+        <w:t>M_</w:t>
+      </w:r>
+      <w:r>
+        <w:rPr>
+          <w:rFonts w:ascii="Times New Roman" w:hAnsi="Times New Roman" w:cs="Times New Roman"/>
+          <w:b/>
+          <w:bCs/>
+        </w:rPr>
+        <w:t>LIST}}</w:t>
       </w:r>
       <w:r>
         <w:rPr>
@@ -477,7 +481,23 @@
           <w:b/>
           <w:bCs/>
         </w:rPr>
-        <w:t>{{MODULE_LIST}}.</w:t>
+        <w:t>{{</w:t>
+      </w:r>
+      <w:r>
+        <w:rPr>
+          <w:rFonts w:ascii="Times New Roman" w:hAnsi="Times New Roman" w:cs="Times New Roman"/>
+          <w:b/>
+          <w:bCs/>
+        </w:rPr>
+        <w:t>M_</w:t>
+      </w:r>
+      <w:r>
+        <w:rPr>
+          <w:rFonts w:ascii="Times New Roman" w:hAnsi="Times New Roman" w:cs="Times New Roman"/>
+          <w:b/>
+          <w:bCs/>
+        </w:rPr>
+        <w:t>LIST}}.</w:t>
       </w:r>
     </w:p>
     <w:p>
@@ -637,7 +657,23 @@
           <w:b/>
           <w:bCs/>
         </w:rPr>
-        <w:t>{{MODULE_LIST}}</w:t>
+        <w:t>{{</w:t>
+      </w:r>
+      <w:r>
+        <w:rPr>
+          <w:rFonts w:ascii="Times New Roman" w:hAnsi="Times New Roman" w:cs="Times New Roman"/>
+          <w:b/>
+          <w:bCs/>
+        </w:rPr>
+        <w:t>M_</w:t>
+      </w:r>
+      <w:r>
+        <w:rPr>
+          <w:rFonts w:ascii="Times New Roman" w:hAnsi="Times New Roman" w:cs="Times New Roman"/>
+          <w:b/>
+          <w:bCs/>
+        </w:rPr>
+        <w:t>LIST}}</w:t>
       </w:r>
       <w:r>
         <w:rPr>
@@ -773,7 +809,23 @@
           <w:b/>
           <w:bCs/>
         </w:rPr>
-        <w:t>{{MODULE_LIST}}</w:t>
+        <w:t>{{</w:t>
+      </w:r>
+      <w:r>
+        <w:rPr>
+          <w:rFonts w:ascii="Times New Roman" w:hAnsi="Times New Roman" w:cs="Times New Roman"/>
+          <w:b/>
+          <w:bCs/>
+        </w:rPr>
+        <w:t>M_</w:t>
+      </w:r>
+      <w:r>
+        <w:rPr>
+          <w:rFonts w:ascii="Times New Roman" w:hAnsi="Times New Roman" w:cs="Times New Roman"/>
+          <w:b/>
+          <w:bCs/>
+        </w:rPr>
+        <w:t>LIST}}</w:t>
       </w:r>
     </w:p>
     <w:p>
@@ -927,6 +979,8 @@
         <w:spacing w:after="200"/>
         <w:rPr>
           <w:rFonts w:ascii="Times New Roman" w:hAnsi="Times New Roman" w:cs="Times New Roman"/>
+          <w:b/>
+          <w:bCs/>
           <w:lang w:val="en-US"/>
         </w:rPr>
       </w:pPr>
@@ -940,6 +994,8 @@
       <w:r>
         <w:rPr>
           <w:rFonts w:ascii="Times New Roman" w:hAnsi="Times New Roman" w:cs="Times New Roman"/>
+          <w:b/>
+          <w:bCs/>
           <w:lang w:val="en-US"/>
         </w:rPr>
         <w:t>Sushama Inamdar</w:t>
@@ -964,266 +1020,151 @@
         </w:rPr>
         <w:lastRenderedPageBreak/>
         <w:t>Scope:</w:t>
-      </w:r>
-    </w:p>
-    <w:tbl>
-      <w:tblPr>
-        <w:tblW w:w="9995" w:type="dxa"/>
-        <w:tblBorders>
-          <w:top w:val="single" w:sz="4" w:space="0" w:color="auto"/>
-          <w:left w:val="single" w:sz="4" w:space="0" w:color="auto"/>
-          <w:bottom w:val="single" w:sz="4" w:space="0" w:color="auto"/>
-          <w:right w:val="single" w:sz="4" w:space="0" w:color="auto"/>
-          <w:insideH w:val="single" w:sz="4" w:space="0" w:color="auto"/>
-          <w:insideV w:val="single" w:sz="4" w:space="0" w:color="auto"/>
-        </w:tblBorders>
-        <w:tblCellMar>
-          <w:left w:w="10" w:type="dxa"/>
-          <w:right w:w="10" w:type="dxa"/>
-        </w:tblCellMar>
-        <w:tblLook w:val="04A0" w:firstRow="1" w:lastRow="0" w:firstColumn="1" w:lastColumn="0" w:noHBand="0" w:noVBand="1"/>
-      </w:tblPr>
-      <w:tblGrid>
-        <w:gridCol w:w="1733"/>
-        <w:gridCol w:w="6345"/>
-        <w:gridCol w:w="1917"/>
-      </w:tblGrid>
-      <w:tr>
-        <w:trPr>
-          <w:trHeight w:val="22"/>
-          <w:tblHeader/>
-        </w:trPr>
-        <w:tc>
-          <w:tcPr>
-            <w:tcW w:w="1733" w:type="dxa"/>
-            <w:shd w:val="clear" w:color="auto" w:fill="FFFFFF" w:themeFill="background1"/>
-            <w:tcMar>
-              <w:top w:w="80" w:type="dxa"/>
-              <w:left w:w="120" w:type="dxa"/>
-              <w:bottom w:w="80" w:type="dxa"/>
-              <w:right w:w="120" w:type="dxa"/>
-            </w:tcMar>
-            <w:vAlign w:val="center"/>
-          </w:tcPr>
-          <w:p>
-            <w:pPr>
-              <w:rPr>
-                <w:rFonts w:ascii="Times New Roman" w:hAnsi="Times New Roman" w:cs="Times New Roman"/>
-                <w:b/>
-                <w:bCs/>
-                <w:color w:val="000000" w:themeColor="text1"/>
-              </w:rPr>
-            </w:pPr>
-            <w:r>
-              <w:rPr>
-                <w:rFonts w:ascii="Times New Roman" w:hAnsi="Times New Roman" w:cs="Times New Roman"/>
-                <w:b/>
-                <w:bCs/>
-                <w:color w:val="000000" w:themeColor="text1"/>
-              </w:rPr>
-              <w:t>Pillar</w:t>
-            </w:r>
-          </w:p>
-        </w:tc>
-        <w:tc>
-          <w:tcPr>
-            <w:tcW w:w="6345" w:type="dxa"/>
-            <w:tcBorders>
-              <w:bottom w:val="single" w:sz="4" w:space="0" w:color="auto"/>
-            </w:tcBorders>
-            <w:shd w:val="clear" w:color="auto" w:fill="FFFFFF" w:themeFill="background1"/>
-            <w:tcMar>
-              <w:top w:w="80" w:type="dxa"/>
-              <w:left w:w="120" w:type="dxa"/>
-              <w:bottom w:w="80" w:type="dxa"/>
-              <w:right w:w="120" w:type="dxa"/>
-            </w:tcMar>
-            <w:vAlign w:val="center"/>
-          </w:tcPr>
-          <w:p>
-            <w:pPr>
-              <w:rPr>
-                <w:rFonts w:ascii="Times New Roman" w:hAnsi="Times New Roman" w:cs="Times New Roman"/>
-                <w:b/>
-                <w:bCs/>
-                <w:color w:val="000000" w:themeColor="text1"/>
-              </w:rPr>
-            </w:pPr>
-            <w:r>
-              <w:rPr>
-                <w:rFonts w:ascii="Times New Roman" w:hAnsi="Times New Roman" w:cs="Times New Roman"/>
-                <w:b/>
-                <w:bCs/>
-                <w:color w:val="000000" w:themeColor="text1"/>
-              </w:rPr>
-              <w:t>Module</w:t>
-            </w:r>
-          </w:p>
-        </w:tc>
-        <w:tc>
-          <w:tcPr>
-            <w:tcW w:w="1917" w:type="dxa"/>
-            <w:shd w:val="clear" w:color="auto" w:fill="FFFFFF" w:themeFill="background1"/>
-            <w:tcMar>
-              <w:top w:w="80" w:type="dxa"/>
-              <w:left w:w="120" w:type="dxa"/>
-              <w:bottom w:w="80" w:type="dxa"/>
-              <w:right w:w="120" w:type="dxa"/>
-            </w:tcMar>
-            <w:vAlign w:val="center"/>
-          </w:tcPr>
-          <w:p>
-            <w:pPr>
-              <w:rPr>
-                <w:rFonts w:ascii="Times New Roman" w:hAnsi="Times New Roman" w:cs="Times New Roman"/>
-                <w:b/>
-                <w:bCs/>
-                <w:color w:val="000000" w:themeColor="text1"/>
-              </w:rPr>
-            </w:pPr>
-            <w:r>
-              <w:rPr>
-                <w:rFonts w:ascii="Times New Roman" w:hAnsi="Times New Roman" w:cs="Times New Roman"/>
-                <w:b/>
-                <w:bCs/>
-              </w:rPr>
-              <w:t>Required</w:t>
-            </w:r>
-          </w:p>
-        </w:tc>
-      </w:tr>
-      <w:tr>
-        <w:trPr>
-          <w:trHeight w:val="22"/>
-          <w:tblHeader/>
-        </w:trPr>
-        <w:tc>
-          <w:tcPr>
-            <w:tcW w:w="1733" w:type="dxa"/>
-            <w:shd w:val="clear" w:color="auto" w:fill="FFFFFF" w:themeFill="background1"/>
-            <w:tcMar>
-              <w:top w:w="80" w:type="dxa"/>
-              <w:left w:w="120" w:type="dxa"/>
-              <w:bottom w:w="80" w:type="dxa"/>
-              <w:right w:w="120" w:type="dxa"/>
-            </w:tcMar>
-            <w:vAlign w:val="center"/>
-          </w:tcPr>
-          <w:p>
-            <w:pPr>
-              <w:rPr>
-                <w:rFonts w:ascii="Times New Roman" w:hAnsi="Times New Roman" w:cs="Times New Roman"/>
-                <w:color w:val="FFFFFF"/>
-              </w:rPr>
-            </w:pPr>
-            <w:r>
-              <w:rPr>
-                <w:rFonts w:ascii="Times New Roman" w:hAnsi="Times New Roman" w:cs="Times New Roman"/>
-              </w:rPr>
-              <w:t>{{PILLAR}}</w:t>
-            </w:r>
-          </w:p>
-        </w:tc>
-        <w:tc>
-          <w:tcPr>
-            <w:tcW w:w="6345" w:type="dxa"/>
-            <w:tcBorders>
-              <w:bottom w:val="single" w:sz="4" w:space="0" w:color="auto"/>
-            </w:tcBorders>
-            <w:shd w:val="clear" w:color="auto" w:fill="FFFFFF" w:themeFill="background1"/>
-            <w:tcMar>
-              <w:top w:w="80" w:type="dxa"/>
-              <w:left w:w="120" w:type="dxa"/>
-              <w:bottom w:w="80" w:type="dxa"/>
-              <w:right w:w="120" w:type="dxa"/>
-            </w:tcMar>
-            <w:vAlign w:val="center"/>
-          </w:tcPr>
-          <w:p>
-            <w:pPr>
-              <w:rPr>
-                <w:rFonts w:ascii="Times New Roman" w:hAnsi="Times New Roman" w:cs="Times New Roman"/>
-                <w:color w:val="FFFFFF"/>
-              </w:rPr>
-            </w:pPr>
-            <w:r>
-              <w:rPr>
-                <w:rFonts w:ascii="Times New Roman" w:hAnsi="Times New Roman" w:cs="Times New Roman"/>
-              </w:rPr>
-              <w:t>{{MODULE}}</w:t>
-            </w:r>
-          </w:p>
-        </w:tc>
-        <w:tc>
-          <w:tcPr>
-            <w:tcW w:w="1917" w:type="dxa"/>
-            <w:shd w:val="clear" w:color="auto" w:fill="FFFFFF" w:themeFill="background1"/>
-            <w:tcMar>
-              <w:top w:w="80" w:type="dxa"/>
-              <w:left w:w="120" w:type="dxa"/>
-              <w:bottom w:w="80" w:type="dxa"/>
-              <w:right w:w="120" w:type="dxa"/>
-            </w:tcMar>
-            <w:vAlign w:val="center"/>
-          </w:tcPr>
-          <w:p>
-            <w:pPr>
-              <w:rPr>
-                <w:rFonts w:ascii="Times New Roman" w:hAnsi="Times New Roman" w:cs="Times New Roman"/>
-                <w:color w:val="FFFFFF"/>
-              </w:rPr>
-            </w:pPr>
-            <w:r>
-              <w:rPr>
-                <w:rFonts w:ascii="Times New Roman" w:hAnsi="Times New Roman" w:cs="Times New Roman"/>
-              </w:rPr>
-              <w:t>{{SELECTED}}</w:t>
-            </w:r>
-          </w:p>
-        </w:tc>
-      </w:tr>
-    </w:tbl>
-    <w:p>
-      <w:pPr>
-        <w:spacing w:after="200"/>
-        <w:rPr>
-          <w:rFonts w:ascii="Times New Roman" w:hAnsi="Times New Roman" w:cs="Times New Roman"/>
-        </w:rPr>
-      </w:pPr>
-    </w:p>
-    <w:p>
-      <w:pPr>
-        <w:spacing w:after="200"/>
-        <w:rPr>
-          <w:rFonts w:ascii="Times New Roman" w:hAnsi="Times New Roman" w:cs="Times New Roman"/>
-          <w:b/>
-          <w:bCs/>
-        </w:rPr>
-      </w:pPr>
-      <w:r>
-        <w:rPr>
-          <w:rFonts w:ascii="Times New Roman" w:hAnsi="Times New Roman" w:cs="Times New Roman"/>
-          <w:b/>
-          <w:bCs/>
-        </w:rPr>
-        <w:t>Additional Scope:</w:t>
       </w:r>
     </w:p>
     <w:tbl>
       <w:tblPr>
         <w:tblStyle w:val="TableGrid0"/>
-        <w:tblW w:w="10143" w:type="dxa"/>
+        <w:tblW w:w="10060" w:type="dxa"/>
+        <w:tblLook w:val="04A0" w:firstRow="1" w:lastRow="0" w:firstColumn="1" w:lastColumn="0" w:noHBand="0" w:noVBand="1"/>
+      </w:tblPr>
+      <w:tblGrid>
+        <w:gridCol w:w="1838"/>
+        <w:gridCol w:w="6237"/>
+        <w:gridCol w:w="1985"/>
+      </w:tblGrid>
+      <w:tr>
+        <w:tc>
+          <w:tcPr>
+            <w:tcW w:w="1838" w:type="dxa"/>
+          </w:tcPr>
+          <w:p>
+            <w:r>
+              <w:rPr>
+                <w:rFonts w:ascii="Times New Roman" w:hAnsi="Times New Roman" w:cs="Times New Roman"/>
+                <w:b/>
+                <w:bCs/>
+                <w:color w:val="000000" w:themeColor="text1"/>
+              </w:rPr>
+              <w:t>Pillar</w:t>
+            </w:r>
+          </w:p>
+        </w:tc>
+        <w:tc>
+          <w:tcPr>
+            <w:tcW w:w="6237" w:type="dxa"/>
+          </w:tcPr>
+          <w:p>
+            <w:r>
+              <w:rPr>
+                <w:rFonts w:ascii="Times New Roman" w:hAnsi="Times New Roman" w:cs="Times New Roman"/>
+                <w:b/>
+                <w:bCs/>
+                <w:color w:val="000000" w:themeColor="text1"/>
+              </w:rPr>
+              <w:t>Module</w:t>
+            </w:r>
+          </w:p>
+        </w:tc>
+        <w:tc>
+          <w:tcPr>
+            <w:tcW w:w="1985" w:type="dxa"/>
+          </w:tcPr>
+          <w:p>
+            <w:r>
+              <w:rPr>
+                <w:rFonts w:ascii="Times New Roman" w:hAnsi="Times New Roman" w:cs="Times New Roman"/>
+                <w:b/>
+                <w:bCs/>
+              </w:rPr>
+              <w:t>Required</w:t>
+            </w:r>
+          </w:p>
+        </w:tc>
+      </w:tr>
+      <w:tr>
+        <w:tc>
+          <w:tcPr>
+            <w:tcW w:w="1838" w:type="dxa"/>
+          </w:tcPr>
+          <w:p>
+            <w:r>
+              <w:rPr>
+                <w:rFonts w:ascii="Times New Roman" w:hAnsi="Times New Roman" w:cs="Times New Roman"/>
+              </w:rPr>
+              <w:t>{{PILLAR}}</w:t>
+            </w:r>
+          </w:p>
+        </w:tc>
+        <w:tc>
+          <w:tcPr>
+            <w:tcW w:w="6237" w:type="dxa"/>
+          </w:tcPr>
+          <w:p>
+            <w:r>
+              <w:rPr>
+                <w:rFonts w:ascii="Times New Roman" w:hAnsi="Times New Roman" w:cs="Times New Roman"/>
+              </w:rPr>
+              <w:t>{{MODULE}}</w:t>
+            </w:r>
+          </w:p>
+        </w:tc>
+        <w:tc>
+          <w:tcPr>
+            <w:tcW w:w="1985" w:type="dxa"/>
+          </w:tcPr>
+          <w:p>
+            <w:r>
+              <w:rPr>
+                <w:rFonts w:ascii="Times New Roman" w:hAnsi="Times New Roman" w:cs="Times New Roman"/>
+              </w:rPr>
+              <w:t>{{SELECTED}}</w:t>
+            </w:r>
+          </w:p>
+        </w:tc>
+      </w:tr>
+    </w:tbl>
+    <w:p>
+      <w:pPr>
+        <w:spacing w:after="200"/>
+        <w:rPr>
+          <w:rFonts w:ascii="Times New Roman" w:hAnsi="Times New Roman" w:cs="Times New Roman"/>
+        </w:rPr>
+      </w:pPr>
+    </w:p>
+    <w:p>
+      <w:pPr>
+        <w:spacing w:after="200"/>
+        <w:rPr>
+          <w:rFonts w:ascii="Times New Roman" w:hAnsi="Times New Roman" w:cs="Times New Roman"/>
+          <w:b/>
+          <w:bCs/>
+        </w:rPr>
+      </w:pPr>
+      <w:r>
+        <w:rPr>
+          <w:rFonts w:ascii="Times New Roman" w:hAnsi="Times New Roman" w:cs="Times New Roman"/>
+          <w:b/>
+          <w:bCs/>
+        </w:rPr>
+        <w:t>Additional Scope:</w:t>
+      </w:r>
+    </w:p>
+    <w:tbl>
+      <w:tblPr>
+        <w:tblStyle w:val="TableGrid0"/>
+        <w:tblW w:w="10348" w:type="dxa"/>
         <w:tblInd w:w="-5" w:type="dxa"/>
         <w:tblLayout w:type="fixed"/>
         <w:tblLook w:val="04A0" w:firstRow="1" w:lastRow="0" w:firstColumn="1" w:lastColumn="0" w:noHBand="0" w:noVBand="1"/>
       </w:tblPr>
       <w:tblGrid>
-        <w:gridCol w:w="1858"/>
-        <w:gridCol w:w="2288"/>
-        <w:gridCol w:w="1858"/>
-        <w:gridCol w:w="1286"/>
-        <w:gridCol w:w="1429"/>
-        <w:gridCol w:w="1424"/>
+        <w:gridCol w:w="1701"/>
+        <w:gridCol w:w="1843"/>
+        <w:gridCol w:w="1843"/>
+        <w:gridCol w:w="1559"/>
+        <w:gridCol w:w="1559"/>
+        <w:gridCol w:w="1843"/>
       </w:tblGrid>
       <w:tr>
         <w:trPr>
@@ -1231,7 +1172,7 @@
         </w:trPr>
         <w:tc>
           <w:tcPr>
-            <w:tcW w:w="1858" w:type="dxa"/>
+            <w:tcW w:w="1701" w:type="dxa"/>
           </w:tcPr>
           <w:p>
             <w:pPr>
@@ -1256,7 +1197,7 @@
         </w:tc>
         <w:tc>
           <w:tcPr>
-            <w:tcW w:w="2288" w:type="dxa"/>
+            <w:tcW w:w="1843" w:type="dxa"/>
           </w:tcPr>
           <w:p>
             <w:pPr>
@@ -1281,7 +1222,7 @@
         </w:tc>
         <w:tc>
           <w:tcPr>
-            <w:tcW w:w="1858" w:type="dxa"/>
+            <w:tcW w:w="1843" w:type="dxa"/>
           </w:tcPr>
           <w:p>
             <w:pPr>
@@ -1306,7 +1247,7 @@
         </w:tc>
         <w:tc>
           <w:tcPr>
-            <w:tcW w:w="1286" w:type="dxa"/>
+            <w:tcW w:w="1559" w:type="dxa"/>
           </w:tcPr>
           <w:p>
             <w:pPr>
@@ -1331,7 +1272,7 @@
         </w:tc>
         <w:tc>
           <w:tcPr>
-            <w:tcW w:w="1429" w:type="dxa"/>
+            <w:tcW w:w="1559" w:type="dxa"/>
           </w:tcPr>
           <w:p>
             <w:pPr>
@@ -1356,7 +1297,7 @@
         </w:tc>
         <w:tc>
           <w:tcPr>
-            <w:tcW w:w="1424" w:type="dxa"/>
+            <w:tcW w:w="1843" w:type="dxa"/>
           </w:tcPr>
           <w:p>
             <w:pPr>
@@ -1386,7 +1327,7 @@
         </w:trPr>
         <w:tc>
           <w:tcPr>
-            <w:tcW w:w="1858" w:type="dxa"/>
+            <w:tcW w:w="1701" w:type="dxa"/>
           </w:tcPr>
           <w:p>
             <w:pPr>
@@ -1405,24 +1346,17 @@
                 <w:sz w:val="18"/>
                 <w:szCs w:val="18"/>
               </w:rPr>
-              <w:t>{{ADD_SCOPE_REQUIREMENT}}</w:t>
-            </w:r>
-          </w:p>
-        </w:tc>
-        <w:tc>
-          <w:tcPr>
-            <w:tcW w:w="2288" w:type="dxa"/>
-          </w:tcPr>
-          <w:p>
-            <w:pPr>
-              <w:spacing w:before="240" w:after="240"/>
+              <w:t>{{</w:t>
+            </w:r>
+            <w:r>
               <w:rPr>
                 <w:rFonts w:ascii="Times New Roman" w:hAnsi="Times New Roman" w:cs="Times New Roman"/>
                 <w:color w:val="000000" w:themeColor="text1"/>
                 <w:sz w:val="18"/>
                 <w:szCs w:val="18"/>
               </w:rPr>
-            </w:pPr>
+              <w:t>A_S_</w:t>
+            </w:r>
             <w:r>
               <w:rPr>
                 <w:rFonts w:ascii="Times New Roman" w:hAnsi="Times New Roman" w:cs="Times New Roman"/>
@@ -1430,13 +1364,13 @@
                 <w:sz w:val="18"/>
                 <w:szCs w:val="18"/>
               </w:rPr>
-              <w:t>{{ADD_SCOPE_MODULE}}</w:t>
-            </w:r>
-          </w:p>
-        </w:tc>
-        <w:tc>
-          <w:tcPr>
-            <w:tcW w:w="1858" w:type="dxa"/>
+              <w:t>REQ}}</w:t>
+            </w:r>
+          </w:p>
+        </w:tc>
+        <w:tc>
+          <w:tcPr>
+            <w:tcW w:w="1843" w:type="dxa"/>
           </w:tcPr>
           <w:p>
             <w:pPr>
@@ -1455,24 +1389,17 @@
                 <w:sz w:val="18"/>
                 <w:szCs w:val="18"/>
               </w:rPr>
-              <w:t>{{ADD_SCOPE_MANPOWER}}</w:t>
-            </w:r>
-          </w:p>
-        </w:tc>
-        <w:tc>
-          <w:tcPr>
-            <w:tcW w:w="1286" w:type="dxa"/>
-          </w:tcPr>
-          <w:p>
-            <w:pPr>
-              <w:spacing w:before="240" w:after="240"/>
+              <w:t>{{</w:t>
+            </w:r>
+            <w:r>
               <w:rPr>
                 <w:rFonts w:ascii="Times New Roman" w:hAnsi="Times New Roman" w:cs="Times New Roman"/>
                 <w:color w:val="000000" w:themeColor="text1"/>
                 <w:sz w:val="18"/>
                 <w:szCs w:val="18"/>
               </w:rPr>
-            </w:pPr>
+              <w:t>A_S_</w:t>
+            </w:r>
             <w:r>
               <w:rPr>
                 <w:rFonts w:ascii="Times New Roman" w:hAnsi="Times New Roman" w:cs="Times New Roman"/>
@@ -1480,13 +1407,13 @@
                 <w:sz w:val="18"/>
                 <w:szCs w:val="18"/>
               </w:rPr>
-              <w:t>{{ADD_SCOPE_DAYS}}</w:t>
-            </w:r>
-          </w:p>
-        </w:tc>
-        <w:tc>
-          <w:tcPr>
-            <w:tcW w:w="1429" w:type="dxa"/>
+              <w:t>MODULE}}</w:t>
+            </w:r>
+          </w:p>
+        </w:tc>
+        <w:tc>
+          <w:tcPr>
+            <w:tcW w:w="1843" w:type="dxa"/>
           </w:tcPr>
           <w:p>
             <w:pPr>
@@ -1505,24 +1432,17 @@
                 <w:sz w:val="18"/>
                 <w:szCs w:val="18"/>
               </w:rPr>
-              <w:t>{{ADD_SCOPE_RATE}}</w:t>
-            </w:r>
-          </w:p>
-        </w:tc>
-        <w:tc>
-          <w:tcPr>
-            <w:tcW w:w="1424" w:type="dxa"/>
-          </w:tcPr>
-          <w:p>
-            <w:pPr>
-              <w:spacing w:before="240" w:after="240"/>
+              <w:t>{{</w:t>
+            </w:r>
+            <w:r>
               <w:rPr>
                 <w:rFonts w:ascii="Times New Roman" w:hAnsi="Times New Roman" w:cs="Times New Roman"/>
                 <w:color w:val="000000" w:themeColor="text1"/>
                 <w:sz w:val="18"/>
                 <w:szCs w:val="18"/>
               </w:rPr>
-            </w:pPr>
+              <w:t>A_S_</w:t>
+            </w:r>
             <w:r>
               <w:rPr>
                 <w:rFonts w:ascii="Times New Roman" w:hAnsi="Times New Roman" w:cs="Times New Roman"/>
@@ -1530,7 +1450,154 @@
                 <w:sz w:val="18"/>
                 <w:szCs w:val="18"/>
               </w:rPr>
-              <w:t>{{ADD_SCOPE_AMOUNT}}</w:t>
+              <w:t>M</w:t>
+            </w:r>
+            <w:r>
+              <w:rPr>
+                <w:rFonts w:ascii="Times New Roman" w:hAnsi="Times New Roman" w:cs="Times New Roman"/>
+                <w:color w:val="000000" w:themeColor="text1"/>
+                <w:sz w:val="18"/>
+                <w:szCs w:val="18"/>
+              </w:rPr>
+              <w:t>P</w:t>
+            </w:r>
+            <w:r>
+              <w:rPr>
+                <w:rFonts w:ascii="Times New Roman" w:hAnsi="Times New Roman" w:cs="Times New Roman"/>
+                <w:color w:val="000000" w:themeColor="text1"/>
+                <w:sz w:val="18"/>
+                <w:szCs w:val="18"/>
+              </w:rPr>
+              <w:t>}}</w:t>
+            </w:r>
+          </w:p>
+        </w:tc>
+        <w:tc>
+          <w:tcPr>
+            <w:tcW w:w="1559" w:type="dxa"/>
+          </w:tcPr>
+          <w:p>
+            <w:pPr>
+              <w:spacing w:before="240" w:after="240"/>
+              <w:rPr>
+                <w:rFonts w:ascii="Times New Roman" w:hAnsi="Times New Roman" w:cs="Times New Roman"/>
+                <w:color w:val="000000" w:themeColor="text1"/>
+                <w:sz w:val="18"/>
+                <w:szCs w:val="18"/>
+              </w:rPr>
+            </w:pPr>
+            <w:r>
+              <w:rPr>
+                <w:rFonts w:ascii="Times New Roman" w:hAnsi="Times New Roman" w:cs="Times New Roman"/>
+                <w:color w:val="000000" w:themeColor="text1"/>
+                <w:sz w:val="18"/>
+                <w:szCs w:val="18"/>
+              </w:rPr>
+              <w:t>{{</w:t>
+            </w:r>
+            <w:r>
+              <w:rPr>
+                <w:rFonts w:ascii="Times New Roman" w:hAnsi="Times New Roman" w:cs="Times New Roman"/>
+                <w:color w:val="000000" w:themeColor="text1"/>
+                <w:sz w:val="18"/>
+                <w:szCs w:val="18"/>
+              </w:rPr>
+              <w:t>A_S_</w:t>
+            </w:r>
+            <w:r>
+              <w:rPr>
+                <w:rFonts w:ascii="Times New Roman" w:hAnsi="Times New Roman" w:cs="Times New Roman"/>
+                <w:color w:val="000000" w:themeColor="text1"/>
+                <w:sz w:val="18"/>
+                <w:szCs w:val="18"/>
+              </w:rPr>
+              <w:t>DAYS}}</w:t>
+            </w:r>
+          </w:p>
+        </w:tc>
+        <w:tc>
+          <w:tcPr>
+            <w:tcW w:w="1559" w:type="dxa"/>
+          </w:tcPr>
+          <w:p>
+            <w:pPr>
+              <w:spacing w:before="240" w:after="240"/>
+              <w:rPr>
+                <w:rFonts w:ascii="Times New Roman" w:hAnsi="Times New Roman" w:cs="Times New Roman"/>
+                <w:color w:val="000000" w:themeColor="text1"/>
+                <w:sz w:val="18"/>
+                <w:szCs w:val="18"/>
+              </w:rPr>
+            </w:pPr>
+            <w:r>
+              <w:rPr>
+                <w:rFonts w:ascii="Times New Roman" w:hAnsi="Times New Roman" w:cs="Times New Roman"/>
+                <w:color w:val="000000" w:themeColor="text1"/>
+                <w:sz w:val="18"/>
+                <w:szCs w:val="18"/>
+              </w:rPr>
+              <w:t>{{</w:t>
+            </w:r>
+            <w:r>
+              <w:rPr>
+                <w:rFonts w:ascii="Times New Roman" w:hAnsi="Times New Roman" w:cs="Times New Roman"/>
+                <w:color w:val="000000" w:themeColor="text1"/>
+                <w:sz w:val="18"/>
+                <w:szCs w:val="18"/>
+              </w:rPr>
+              <w:t>A_S_</w:t>
+            </w:r>
+            <w:r>
+              <w:rPr>
+                <w:rFonts w:ascii="Times New Roman" w:hAnsi="Times New Roman" w:cs="Times New Roman"/>
+                <w:color w:val="000000" w:themeColor="text1"/>
+                <w:sz w:val="18"/>
+                <w:szCs w:val="18"/>
+              </w:rPr>
+              <w:t>RATE}}</w:t>
+            </w:r>
+          </w:p>
+        </w:tc>
+        <w:tc>
+          <w:tcPr>
+            <w:tcW w:w="1843" w:type="dxa"/>
+          </w:tcPr>
+          <w:p>
+            <w:pPr>
+              <w:spacing w:before="240" w:after="240"/>
+              <w:rPr>
+                <w:rFonts w:ascii="Times New Roman" w:hAnsi="Times New Roman" w:cs="Times New Roman"/>
+                <w:color w:val="000000" w:themeColor="text1"/>
+                <w:sz w:val="18"/>
+                <w:szCs w:val="18"/>
+              </w:rPr>
+            </w:pPr>
+            <w:r>
+              <w:rPr>
+                <w:rFonts w:ascii="Times New Roman" w:hAnsi="Times New Roman" w:cs="Times New Roman"/>
+                <w:color w:val="000000" w:themeColor="text1"/>
+                <w:sz w:val="18"/>
+                <w:szCs w:val="18"/>
+              </w:rPr>
+              <w:t>{{</w:t>
+            </w:r>
+            <w:r>
+              <w:rPr>
+                <w:rFonts w:ascii="Times New Roman" w:hAnsi="Times New Roman" w:cs="Times New Roman"/>
+                <w:color w:val="000000" w:themeColor="text1"/>
+                <w:sz w:val="18"/>
+                <w:szCs w:val="18"/>
+              </w:rPr>
+              <w:t>A_S_</w:t>
+            </w:r>
+            <w:r>
+              <w:rPr>
+                <w:rFonts w:ascii="Times New Roman" w:hAnsi="Times New Roman" w:cs="Times New Roman"/>
+                <w:color w:val="000000" w:themeColor="text1"/>
+                <w:sz w:val="18"/>
+                <w:szCs w:val="18"/>
+              </w:rPr>
+              <w:t>AMOUNT}}</w:t>
             </w:r>
           </w:p>
         </w:tc>
@@ -1576,7 +1643,19 @@
         <w:rPr>
           <w:rFonts w:ascii="Times New Roman" w:hAnsi="Times New Roman" w:cs="Times New Roman"/>
         </w:rPr>
-        <w:t>{{MODULE_LIST}}</w:t>
+        <w:t>{{</w:t>
+      </w:r>
+      <w:r>
+        <w:rPr>
+          <w:rFonts w:ascii="Times New Roman" w:hAnsi="Times New Roman" w:cs="Times New Roman"/>
+        </w:rPr>
+        <w:t>M_</w:t>
+      </w:r>
+      <w:r>
+        <w:rPr>
+          <w:rFonts w:ascii="Times New Roman" w:hAnsi="Times New Roman" w:cs="Times New Roman"/>
+        </w:rPr>
+        <w:t>LIST}}</w:t>
       </w:r>
     </w:p>
     <w:tbl>
@@ -1783,7 +1862,13 @@
               <w:rPr>
                 <w:rFonts w:ascii="Times New Roman" w:hAnsi="Times New Roman" w:cs="Times New Roman"/>
               </w:rPr>
-              <w:t>{MODULE_</w:t>
+              <w:t>{</w:t>
+            </w:r>
+            <w:r>
+              <w:rPr>
+                <w:rFonts w:ascii="Times New Roman" w:hAnsi="Times New Roman" w:cs="Times New Roman"/>
+              </w:rPr>
+              <w:t>M_</w:t>
             </w:r>
             <w:r>
               <w:rPr>
@@ -1856,7 +1941,19 @@
               <w:rPr>
                 <w:rFonts w:ascii="Times New Roman" w:hAnsi="Times New Roman" w:cs="Times New Roman"/>
               </w:rPr>
-              <w:t>{{MODULE_PRICE}}</w:t>
+              <w:t>{{</w:t>
+            </w:r>
+            <w:r>
+              <w:rPr>
+                <w:rFonts w:ascii="Times New Roman" w:hAnsi="Times New Roman" w:cs="Times New Roman"/>
+              </w:rPr>
+              <w:t>M_</w:t>
+            </w:r>
+            <w:r>
+              <w:rPr>
+                <w:rFonts w:ascii="Times New Roman" w:hAnsi="Times New Roman" w:cs="Times New Roman"/>
+              </w:rPr>
+              <w:t>PRICE}}</w:t>
             </w:r>
           </w:p>
           <w:p>
@@ -1910,7 +2007,19 @@
               <w:rPr>
                 <w:rFonts w:ascii="Times New Roman" w:hAnsi="Times New Roman" w:cs="Times New Roman"/>
               </w:rPr>
-              <w:t>Discount ({{MODULE_DISCOUNT_PCT}} %):</w:t>
+              <w:t>Discount ({{</w:t>
+            </w:r>
+            <w:r>
+              <w:rPr>
+                <w:rFonts w:ascii="Times New Roman" w:hAnsi="Times New Roman" w:cs="Times New Roman"/>
+              </w:rPr>
+              <w:t>M_</w:t>
+            </w:r>
+            <w:r>
+              <w:rPr>
+                <w:rFonts w:ascii="Times New Roman" w:hAnsi="Times New Roman" w:cs="Times New Roman"/>
+              </w:rPr>
+              <w:t>DISCOUNT_PCT}} %):</w:t>
             </w:r>
           </w:p>
         </w:tc>
@@ -1934,7 +2043,19 @@
               <w:rPr>
                 <w:rFonts w:ascii="Times New Roman" w:hAnsi="Times New Roman" w:cs="Times New Roman"/>
               </w:rPr>
-              <w:t>{{MODULE_DISCOUNT}}</w:t>
+              <w:t>{{</w:t>
+            </w:r>
+            <w:r>
+              <w:rPr>
+                <w:rFonts w:ascii="Times New Roman" w:hAnsi="Times New Roman" w:cs="Times New Roman"/>
+              </w:rPr>
+              <w:t>M_</w:t>
+            </w:r>
+            <w:r>
+              <w:rPr>
+                <w:rFonts w:ascii="Times New Roman" w:hAnsi="Times New Roman" w:cs="Times New Roman"/>
+              </w:rPr>
+              <w:t>DISCOUNT}}</w:t>
             </w:r>
           </w:p>
         </w:tc>
@@ -1981,14 +2102,7 @@
               <w:rPr>
                 <w:rFonts w:ascii="Times New Roman" w:hAnsi="Times New Roman" w:cs="Times New Roman"/>
               </w:rPr>
-              <w:t xml:space="preserve">Implementation </w:t>
-            </w:r>
-            <w:proofErr w:type="gramStart"/>
-            <w:r>
-              <w:rPr>
-                <w:rFonts w:ascii="Times New Roman" w:hAnsi="Times New Roman" w:cs="Times New Roman"/>
-              </w:rPr>
-              <w:t>(</w:t>
+              <w:t>Implementation (</w:t>
             </w:r>
             <w:r>
               <w:t xml:space="preserve"> </w:t>
@@ -1997,14 +2111,7 @@
               <w:rPr>
                 <w:rFonts w:ascii="Times New Roman" w:hAnsi="Times New Roman" w:cs="Times New Roman"/>
               </w:rPr>
-              <w:t>{</w:t>
-            </w:r>
-            <w:proofErr w:type="gramEnd"/>
-            <w:r>
-              <w:rPr>
-                <w:rFonts w:ascii="Times New Roman" w:hAnsi="Times New Roman" w:cs="Times New Roman"/>
-              </w:rPr>
-              <w:t>{IMPL_EFFORT}}</w:t>
+              <w:t>{{IMPL_EFFORT}}</w:t>
             </w:r>
             <w:r>
               <w:rPr>
@@ -2141,7 +2248,19 @@
               <w:rPr>
                 <w:rFonts w:ascii="Times New Roman" w:hAnsi="Times New Roman" w:cs="Times New Roman"/>
               </w:rPr>
-              <w:t>{{MODULE_SUBTOTAL}}</w:t>
+              <w:t>{{</w:t>
+            </w:r>
+            <w:r>
+              <w:rPr>
+                <w:rFonts w:ascii="Times New Roman" w:hAnsi="Times New Roman" w:cs="Times New Roman"/>
+              </w:rPr>
+              <w:t>M_</w:t>
+            </w:r>
+            <w:r>
+              <w:rPr>
+                <w:rFonts w:ascii="Times New Roman" w:hAnsi="Times New Roman" w:cs="Times New Roman"/>
+              </w:rPr>
+              <w:t>SUBTOTAL}}</w:t>
             </w:r>
           </w:p>
         </w:tc>
@@ -2212,7 +2331,19 @@
               <w:rPr>
                 <w:rFonts w:ascii="Times New Roman" w:hAnsi="Times New Roman" w:cs="Times New Roman"/>
               </w:rPr>
-              <w:t>{{ADD_SCOPE_SUBTOTAL}}</w:t>
+              <w:t>{{</w:t>
+            </w:r>
+            <w:r>
+              <w:rPr>
+                <w:rFonts w:ascii="Times New Roman" w:hAnsi="Times New Roman" w:cs="Times New Roman"/>
+              </w:rPr>
+              <w:t>A_S_</w:t>
+            </w:r>
+            <w:r>
+              <w:rPr>
+                <w:rFonts w:ascii="Times New Roman" w:hAnsi="Times New Roman" w:cs="Times New Roman"/>
+              </w:rPr>
+              <w:t>SUBTOTAL}}</w:t>
             </w:r>
           </w:p>
         </w:tc>
@@ -2604,7 +2735,13 @@
               <w:rPr>
                 <w:rFonts w:ascii="Times New Roman" w:hAnsi="Times New Roman" w:cs="Times New Roman"/>
               </w:rPr>
-              <w:t>{{MODULE_</w:t>
+              <w:t>{{</w:t>
+            </w:r>
+            <w:r>
+              <w:rPr>
+                <w:rFonts w:ascii="Times New Roman" w:hAnsi="Times New Roman" w:cs="Times New Roman"/>
+              </w:rPr>
+              <w:t>M_</w:t>
             </w:r>
             <w:r>
               <w:rPr>
@@ -2836,7 +2973,6 @@
               <w:rPr>
                 <w:rFonts w:ascii="Times New Roman" w:hAnsi="Times New Roman" w:cs="Times New Roman"/>
               </w:rPr>
-              <w:lastRenderedPageBreak/>
               <w:t>5</w:t>
             </w:r>
           </w:p>
@@ -2979,6 +3115,7 @@
               <w:rPr>
                 <w:rFonts w:ascii="Times New Roman" w:hAnsi="Times New Roman" w:cs="Times New Roman"/>
               </w:rPr>
+              <w:lastRenderedPageBreak/>
               <w:t xml:space="preserve"> 5.2</w:t>
             </w:r>
           </w:p>
@@ -3949,7 +4086,7 @@
               <w:bottom w:val="single" w:sz="5" w:space="0" w:color="000000"/>
               <w:right w:val="single" w:sz="4" w:space="0" w:color="000000"/>
             </w:tcBorders>
-            <w:shd w:val="clear" w:color="auto" w:fill="D9D9D9"/>
+            <w:shd w:val="clear" w:color="auto" w:fill="D1D1D1" w:themeFill="background2" w:themeFillShade="E6"/>
           </w:tcPr>
           <w:p>
             <w:pPr>
@@ -3983,7 +4120,7 @@
               <w:bottom w:val="single" w:sz="5" w:space="0" w:color="000000"/>
               <w:right w:val="single" w:sz="4" w:space="0" w:color="000000"/>
             </w:tcBorders>
-            <w:shd w:val="clear" w:color="auto" w:fill="D9D9D9"/>
+            <w:shd w:val="clear" w:color="auto" w:fill="D1D1D1" w:themeFill="background2" w:themeFillShade="E6"/>
           </w:tcPr>
           <w:p>
             <w:pPr>
@@ -4018,7 +4155,7 @@
               <w:bottom w:val="single" w:sz="5" w:space="0" w:color="000000"/>
               <w:right w:val="single" w:sz="4" w:space="0" w:color="000000"/>
             </w:tcBorders>
-            <w:shd w:val="clear" w:color="auto" w:fill="D9D9D9"/>
+            <w:shd w:val="clear" w:color="auto" w:fill="D1D1D1" w:themeFill="background2" w:themeFillShade="E6"/>
           </w:tcPr>
           <w:p>
             <w:pPr>
@@ -4054,7 +4191,7 @@
               <w:bottom w:val="single" w:sz="5" w:space="0" w:color="000000"/>
               <w:right w:val="single" w:sz="4" w:space="0" w:color="000000"/>
             </w:tcBorders>
-            <w:shd w:val="clear" w:color="auto" w:fill="D9D9D9"/>
+            <w:shd w:val="clear" w:color="auto" w:fill="D1D1D1" w:themeFill="background2" w:themeFillShade="E6"/>
           </w:tcPr>
           <w:p>
             <w:pPr>
@@ -4090,7 +4227,7 @@
               <w:bottom w:val="single" w:sz="5" w:space="0" w:color="000000"/>
               <w:right w:val="single" w:sz="4" w:space="0" w:color="000000"/>
             </w:tcBorders>
-            <w:shd w:val="clear" w:color="auto" w:fill="D9D9D9"/>
+            <w:shd w:val="clear" w:color="auto" w:fill="D1D1D1" w:themeFill="background2" w:themeFillShade="E6"/>
           </w:tcPr>
           <w:p>
             <w:pPr>
@@ -4126,7 +4263,7 @@
               <w:bottom w:val="single" w:sz="5" w:space="0" w:color="000000"/>
               <w:right w:val="single" w:sz="4" w:space="0" w:color="000000"/>
             </w:tcBorders>
-            <w:shd w:val="clear" w:color="auto" w:fill="D9D9D9"/>
+            <w:shd w:val="clear" w:color="auto" w:fill="D1D1D1" w:themeFill="background2" w:themeFillShade="E6"/>
           </w:tcPr>
           <w:p>
             <w:pPr>
@@ -4162,7 +4299,7 @@
               <w:bottom w:val="single" w:sz="5" w:space="0" w:color="000000"/>
               <w:right w:val="single" w:sz="4" w:space="0" w:color="000000"/>
             </w:tcBorders>
-            <w:shd w:val="clear" w:color="auto" w:fill="D9D9D9"/>
+            <w:shd w:val="clear" w:color="auto" w:fill="D1D1D1" w:themeFill="background2" w:themeFillShade="E6"/>
           </w:tcPr>
           <w:p>
             <w:pPr>
@@ -4198,7 +4335,7 @@
               <w:bottom w:val="single" w:sz="5" w:space="0" w:color="000000"/>
               <w:right w:val="single" w:sz="5" w:space="0" w:color="000000"/>
             </w:tcBorders>
-            <w:shd w:val="clear" w:color="auto" w:fill="D9D9D9"/>
+            <w:shd w:val="clear" w:color="auto" w:fill="D1D1D1" w:themeFill="background2" w:themeFillShade="E6"/>
           </w:tcPr>
           <w:p>
             <w:pPr>
@@ -4234,7 +4371,7 @@
               <w:bottom w:val="single" w:sz="5" w:space="0" w:color="000000"/>
               <w:right w:val="single" w:sz="5" w:space="0" w:color="000000"/>
             </w:tcBorders>
-            <w:shd w:val="clear" w:color="auto" w:fill="D9D9D9"/>
+            <w:shd w:val="clear" w:color="auto" w:fill="D1D1D1" w:themeFill="background2" w:themeFillShade="E6"/>
           </w:tcPr>
           <w:p>
             <w:pPr>
@@ -4291,7 +4428,23 @@
                 <w:sz w:val="18"/>
                 <w:szCs w:val="18"/>
               </w:rPr>
-              <w:t>{{MODULE_NAME}}</w:t>
+              <w:t>{{</w:t>
+            </w:r>
+            <w:r>
+              <w:rPr>
+                <w:rFonts w:ascii="Times New Roman" w:hAnsi="Times New Roman" w:cs="Times New Roman"/>
+                <w:sz w:val="18"/>
+                <w:szCs w:val="18"/>
+              </w:rPr>
+              <w:t>M_</w:t>
+            </w:r>
+            <w:r>
+              <w:rPr>
+                <w:rFonts w:ascii="Times New Roman" w:hAnsi="Times New Roman" w:cs="Times New Roman"/>
+                <w:sz w:val="18"/>
+                <w:szCs w:val="18"/>
+              </w:rPr>
+              <w:t>NAME}}</w:t>
             </w:r>
           </w:p>
         </w:tc>
@@ -4558,6 +4711,7 @@
           <w:tcPr>
             <w:tcW w:w="4162" w:type="dxa"/>
             <w:vMerge w:val="restart"/>
+            <w:shd w:val="clear" w:color="auto" w:fill="D1D1D1" w:themeFill="background2" w:themeFillShade="E6"/>
           </w:tcPr>
           <w:p>
             <w:pPr>
@@ -4581,6 +4735,7 @@
           <w:tcPr>
             <w:tcW w:w="2977" w:type="dxa"/>
             <w:gridSpan w:val="4"/>
+            <w:shd w:val="clear" w:color="auto" w:fill="D1D1D1" w:themeFill="background2" w:themeFillShade="E6"/>
           </w:tcPr>
           <w:p>
             <w:pPr>
@@ -4605,6 +4760,7 @@
           <w:tcPr>
             <w:tcW w:w="2924" w:type="dxa"/>
             <w:gridSpan w:val="4"/>
+            <w:shd w:val="clear" w:color="auto" w:fill="D1D1D1" w:themeFill="background2" w:themeFillShade="E6"/>
           </w:tcPr>
           <w:p>
             <w:pPr>
@@ -4646,6 +4802,7 @@
         <w:tc>
           <w:tcPr>
             <w:tcW w:w="744" w:type="dxa"/>
+            <w:shd w:val="clear" w:color="auto" w:fill="D1D1D1" w:themeFill="background2" w:themeFillShade="E6"/>
           </w:tcPr>
           <w:p>
             <w:pPr>
@@ -4668,6 +4825,7 @@
         <w:tc>
           <w:tcPr>
             <w:tcW w:w="744" w:type="dxa"/>
+            <w:shd w:val="clear" w:color="auto" w:fill="D1D1D1" w:themeFill="background2" w:themeFillShade="E6"/>
           </w:tcPr>
           <w:p>
             <w:pPr>
@@ -4690,6 +4848,7 @@
         <w:tc>
           <w:tcPr>
             <w:tcW w:w="744" w:type="dxa"/>
+            <w:shd w:val="clear" w:color="auto" w:fill="D1D1D1" w:themeFill="background2" w:themeFillShade="E6"/>
           </w:tcPr>
           <w:p>
             <w:pPr>
@@ -4712,6 +4871,7 @@
         <w:tc>
           <w:tcPr>
             <w:tcW w:w="745" w:type="dxa"/>
+            <w:shd w:val="clear" w:color="auto" w:fill="D1D1D1" w:themeFill="background2" w:themeFillShade="E6"/>
           </w:tcPr>
           <w:p>
             <w:pPr>
@@ -4734,6 +4894,7 @@
         <w:tc>
           <w:tcPr>
             <w:tcW w:w="744" w:type="dxa"/>
+            <w:shd w:val="clear" w:color="auto" w:fill="D1D1D1" w:themeFill="background2" w:themeFillShade="E6"/>
           </w:tcPr>
           <w:p>
             <w:pPr>
@@ -4756,6 +4917,7 @@
         <w:tc>
           <w:tcPr>
             <w:tcW w:w="744" w:type="dxa"/>
+            <w:shd w:val="clear" w:color="auto" w:fill="D1D1D1" w:themeFill="background2" w:themeFillShade="E6"/>
           </w:tcPr>
           <w:p>
             <w:pPr>
@@ -4778,6 +4940,7 @@
         <w:tc>
           <w:tcPr>
             <w:tcW w:w="744" w:type="dxa"/>
+            <w:shd w:val="clear" w:color="auto" w:fill="D1D1D1" w:themeFill="background2" w:themeFillShade="E6"/>
           </w:tcPr>
           <w:p>
             <w:pPr>
@@ -4800,6 +4963,7 @@
         <w:tc>
           <w:tcPr>
             <w:tcW w:w="692" w:type="dxa"/>
+            <w:shd w:val="clear" w:color="auto" w:fill="D1D1D1" w:themeFill="background2" w:themeFillShade="E6"/>
           </w:tcPr>
           <w:p>
             <w:pPr>
@@ -4843,7 +5007,23 @@
                 <w:b/>
                 <w:bCs/>
               </w:rPr>
-              <w:t>{{MODULE_NAME}}</w:t>
+              <w:t>{{</w:t>
+            </w:r>
+            <w:r>
+              <w:rPr>
+                <w:rFonts w:ascii="Times New Roman" w:hAnsi="Times New Roman" w:cs="Times New Roman"/>
+                <w:b/>
+                <w:bCs/>
+              </w:rPr>
+              <w:t>M_</w:t>
+            </w:r>
+            <w:r>
+              <w:rPr>
+                <w:rFonts w:ascii="Times New Roman" w:hAnsi="Times New Roman" w:cs="Times New Roman"/>
+                <w:b/>
+                <w:bCs/>
+              </w:rPr>
+              <w:t>NAME}}</w:t>
             </w:r>
           </w:p>
         </w:tc>
@@ -5104,7 +5284,19 @@
               <w:rPr>
                 <w:rFonts w:ascii="Times New Roman" w:hAnsi="Times New Roman" w:cs="Times New Roman"/>
               </w:rPr>
-              <w:t>{{MODULE_LIST}}</w:t>
+              <w:t>{{</w:t>
+            </w:r>
+            <w:r>
+              <w:rPr>
+                <w:rFonts w:ascii="Times New Roman" w:hAnsi="Times New Roman" w:cs="Times New Roman"/>
+              </w:rPr>
+              <w:t>M_</w:t>
+            </w:r>
+            <w:r>
+              <w:rPr>
+                <w:rFonts w:ascii="Times New Roman" w:hAnsi="Times New Roman" w:cs="Times New Roman"/>
+              </w:rPr>
+              <w:t>LIST}}</w:t>
             </w:r>
             <w:r>
               <w:rPr>
@@ -5348,7 +5540,6 @@
               <w:rPr>
                 <w:rFonts w:ascii="Times New Roman" w:hAnsi="Times New Roman" w:cs="Times New Roman"/>
               </w:rPr>
-              <w:lastRenderedPageBreak/>
               <w:t>Data Preparation for Go-Live</w:t>
             </w:r>
           </w:p>
@@ -5703,6 +5894,363 @@
           <w:rFonts w:ascii="Times New Roman" w:hAnsi="Times New Roman" w:cs="Times New Roman"/>
           <w:w w:val="101"/>
         </w:rPr>
+        <w:lastRenderedPageBreak/>
+        <w:t>Implementation roadmap milestones for above modules will be as per the table presented below.</w:t>
+      </w:r>
+    </w:p>
+    <w:p>
+      <w:pPr>
+        <w:spacing w:before="300" w:after="150"/>
+        <w:jc w:val="both"/>
+        <w:rPr>
+          <w:rFonts w:ascii="Times New Roman" w:hAnsi="Times New Roman" w:cs="Times New Roman"/>
+          <w:b/>
+          <w:bCs/>
+          <w:w w:val="101"/>
+        </w:rPr>
+      </w:pPr>
+      <w:r>
+        <w:rPr>
+          <w:rFonts w:ascii="Times New Roman" w:hAnsi="Times New Roman" w:cs="Times New Roman"/>
+          <w:b/>
+          <w:bCs/>
+          <w:w w:val="101"/>
+        </w:rPr>
+        <w:t>Recommended Quotation Forma</w:t>
+      </w:r>
+      <w:r>
+        <w:rPr>
+          <w:rFonts w:ascii="Times New Roman" w:hAnsi="Times New Roman" w:cs="Times New Roman"/>
+          <w:b/>
+          <w:bCs/>
+          <w:w w:val="101"/>
+        </w:rPr>
+        <w:t>t</w:t>
+      </w:r>
+    </w:p>
+    <w:tbl>
+      <w:tblPr>
+        <w:tblStyle w:val="TableGrid1"/>
+        <w:tblpPr w:leftFromText="180" w:rightFromText="180" w:vertAnchor="text" w:horzAnchor="margin" w:tblpY="57"/>
+        <w:tblW w:w="10060" w:type="dxa"/>
+        <w:tblLook w:val="04A0" w:firstRow="1" w:lastRow="0" w:firstColumn="1" w:lastColumn="0" w:noHBand="0" w:noVBand="1"/>
+      </w:tblPr>
+      <w:tblGrid>
+        <w:gridCol w:w="2830"/>
+        <w:gridCol w:w="2127"/>
+        <w:gridCol w:w="2551"/>
+        <w:gridCol w:w="2552"/>
+      </w:tblGrid>
+      <w:tr>
+        <w:trPr>
+          <w:trHeight w:val="152"/>
+        </w:trPr>
+        <w:tc>
+          <w:tcPr>
+            <w:tcW w:w="2830" w:type="dxa"/>
+          </w:tcPr>
+          <w:p>
+            <w:pPr>
+              <w:rPr>
+                <w:rFonts w:ascii="Times New Roman" w:hAnsi="Times New Roman" w:cs="Times New Roman"/>
+                <w:b/>
+                <w:bCs/>
+                <w:sz w:val="20"/>
+                <w:szCs w:val="20"/>
+              </w:rPr>
+            </w:pPr>
+            <w:r>
+              <w:rPr>
+                <w:rFonts w:ascii="Times New Roman" w:hAnsi="Times New Roman" w:cs="Times New Roman"/>
+                <w:b/>
+                <w:bCs/>
+                <w:sz w:val="20"/>
+                <w:szCs w:val="20"/>
+              </w:rPr>
+              <w:t>Module</w:t>
+            </w:r>
+          </w:p>
+        </w:tc>
+        <w:tc>
+          <w:tcPr>
+            <w:tcW w:w="2127" w:type="dxa"/>
+          </w:tcPr>
+          <w:p>
+            <w:pPr>
+              <w:rPr>
+                <w:rFonts w:ascii="Times New Roman" w:hAnsi="Times New Roman" w:cs="Times New Roman"/>
+                <w:b/>
+                <w:bCs/>
+                <w:sz w:val="20"/>
+                <w:szCs w:val="20"/>
+              </w:rPr>
+            </w:pPr>
+            <w:r>
+              <w:rPr>
+                <w:rFonts w:ascii="Times New Roman" w:hAnsi="Times New Roman" w:cs="Times New Roman"/>
+                <w:b/>
+                <w:bCs/>
+                <w:sz w:val="20"/>
+                <w:szCs w:val="20"/>
+              </w:rPr>
+              <w:t>Quotation / Price</w:t>
+            </w:r>
+          </w:p>
+        </w:tc>
+        <w:tc>
+          <w:tcPr>
+            <w:tcW w:w="2551" w:type="dxa"/>
+          </w:tcPr>
+          <w:p>
+            <w:pPr>
+              <w:rPr>
+                <w:rFonts w:ascii="Times New Roman" w:hAnsi="Times New Roman" w:cs="Times New Roman"/>
+                <w:b/>
+                <w:bCs/>
+                <w:sz w:val="20"/>
+                <w:szCs w:val="20"/>
+              </w:rPr>
+            </w:pPr>
+            <w:r>
+              <w:rPr>
+                <w:rFonts w:ascii="Times New Roman" w:hAnsi="Times New Roman" w:cs="Times New Roman"/>
+                <w:b/>
+                <w:bCs/>
+                <w:sz w:val="20"/>
+                <w:szCs w:val="20"/>
+              </w:rPr>
+              <w:t>Implementation Timeline</w:t>
+            </w:r>
+          </w:p>
+        </w:tc>
+        <w:tc>
+          <w:tcPr>
+            <w:tcW w:w="2552" w:type="dxa"/>
+          </w:tcPr>
+          <w:p>
+            <w:pPr>
+              <w:rPr>
+                <w:rFonts w:ascii="Times New Roman" w:hAnsi="Times New Roman" w:cs="Times New Roman"/>
+                <w:b/>
+                <w:bCs/>
+                <w:sz w:val="20"/>
+                <w:szCs w:val="20"/>
+              </w:rPr>
+            </w:pPr>
+            <w:r>
+              <w:rPr>
+                <w:rFonts w:ascii="Times New Roman" w:hAnsi="Times New Roman" w:cs="Times New Roman"/>
+                <w:b/>
+                <w:bCs/>
+                <w:sz w:val="20"/>
+                <w:szCs w:val="20"/>
+              </w:rPr>
+              <w:t>Planned Delivery</w:t>
+            </w:r>
+          </w:p>
+        </w:tc>
+      </w:tr>
+      <w:tr>
+        <w:trPr>
+          <w:trHeight w:val="152"/>
+        </w:trPr>
+        <w:tc>
+          <w:tcPr>
+            <w:tcW w:w="2830" w:type="dxa"/>
+          </w:tcPr>
+          <w:p>
+            <w:pPr>
+              <w:rPr>
+                <w:rFonts w:ascii="Times New Roman" w:hAnsi="Times New Roman" w:cs="Times New Roman"/>
+                <w:sz w:val="20"/>
+                <w:szCs w:val="20"/>
+              </w:rPr>
+            </w:pPr>
+            <w:r>
+              <w:rPr>
+                <w:rFonts w:ascii="Times New Roman" w:hAnsi="Times New Roman" w:cs="Times New Roman"/>
+                <w:sz w:val="20"/>
+                <w:szCs w:val="20"/>
+              </w:rPr>
+              <w:t>{{S_MODULE}}</w:t>
+            </w:r>
+          </w:p>
+        </w:tc>
+        <w:tc>
+          <w:tcPr>
+            <w:tcW w:w="2127" w:type="dxa"/>
+          </w:tcPr>
+          <w:p>
+            <w:pPr>
+              <w:rPr>
+                <w:rFonts w:ascii="Times New Roman" w:hAnsi="Times New Roman" w:cs="Times New Roman"/>
+                <w:sz w:val="20"/>
+                <w:szCs w:val="20"/>
+              </w:rPr>
+            </w:pPr>
+            <w:r>
+              <w:rPr>
+                <w:rFonts w:ascii="Times New Roman" w:hAnsi="Times New Roman" w:cs="Times New Roman"/>
+                <w:sz w:val="20"/>
+                <w:szCs w:val="20"/>
+              </w:rPr>
+              <w:t>{{S_PRICE}}</w:t>
+            </w:r>
+          </w:p>
+        </w:tc>
+        <w:tc>
+          <w:tcPr>
+            <w:tcW w:w="2551" w:type="dxa"/>
+          </w:tcPr>
+          <w:p>
+            <w:pPr>
+              <w:rPr>
+                <w:rFonts w:ascii="Times New Roman" w:hAnsi="Times New Roman" w:cs="Times New Roman"/>
+                <w:sz w:val="20"/>
+                <w:szCs w:val="20"/>
+              </w:rPr>
+            </w:pPr>
+            <w:r>
+              <w:rPr>
+                <w:rFonts w:ascii="Times New Roman" w:hAnsi="Times New Roman" w:cs="Times New Roman"/>
+                <w:sz w:val="20"/>
+                <w:szCs w:val="20"/>
+              </w:rPr>
+              <w:t>{{S_TIMELINE}}</w:t>
+            </w:r>
+          </w:p>
+        </w:tc>
+        <w:tc>
+          <w:tcPr>
+            <w:tcW w:w="2552" w:type="dxa"/>
+          </w:tcPr>
+          <w:p>
+            <w:pPr>
+              <w:rPr>
+                <w:rFonts w:ascii="Times New Roman" w:hAnsi="Times New Roman" w:cs="Times New Roman"/>
+                <w:sz w:val="20"/>
+                <w:szCs w:val="20"/>
+              </w:rPr>
+            </w:pPr>
+            <w:r>
+              <w:rPr>
+                <w:rFonts w:ascii="Times New Roman" w:hAnsi="Times New Roman" w:cs="Times New Roman"/>
+                <w:sz w:val="20"/>
+                <w:szCs w:val="20"/>
+              </w:rPr>
+              <w:t>{{S_DELIVERY}}</w:t>
+            </w:r>
+          </w:p>
+        </w:tc>
+      </w:tr>
+      <w:tr>
+        <w:trPr>
+          <w:trHeight w:val="315"/>
+        </w:trPr>
+        <w:tc>
+          <w:tcPr>
+            <w:tcW w:w="2830" w:type="dxa"/>
+          </w:tcPr>
+          <w:p>
+            <w:pPr>
+              <w:rPr>
+                <w:rFonts w:ascii="Times New Roman" w:hAnsi="Times New Roman" w:cs="Times New Roman"/>
+                <w:sz w:val="20"/>
+                <w:szCs w:val="20"/>
+              </w:rPr>
+            </w:pPr>
+            <w:r>
+              <w:rPr>
+                <w:rFonts w:ascii="Times New Roman" w:hAnsi="Times New Roman" w:cs="Times New Roman"/>
+                <w:sz w:val="20"/>
+                <w:szCs w:val="20"/>
+              </w:rPr>
+              <w:t>{{S_T_LABEL}}</w:t>
+            </w:r>
+          </w:p>
+        </w:tc>
+        <w:tc>
+          <w:tcPr>
+            <w:tcW w:w="2127" w:type="dxa"/>
+          </w:tcPr>
+          <w:p>
+            <w:pPr>
+              <w:rPr>
+                <w:rFonts w:ascii="Times New Roman" w:hAnsi="Times New Roman" w:cs="Times New Roman"/>
+                <w:sz w:val="20"/>
+                <w:szCs w:val="20"/>
+              </w:rPr>
+            </w:pPr>
+            <w:r>
+              <w:rPr>
+                <w:rFonts w:ascii="Times New Roman" w:hAnsi="Times New Roman" w:cs="Times New Roman"/>
+                <w:sz w:val="20"/>
+                <w:szCs w:val="20"/>
+              </w:rPr>
+              <w:t>{{S_T_PRICE}}</w:t>
+            </w:r>
+          </w:p>
+        </w:tc>
+        <w:tc>
+          <w:tcPr>
+            <w:tcW w:w="2551" w:type="dxa"/>
+          </w:tcPr>
+          <w:p>
+            <w:pPr>
+              <w:rPr>
+                <w:rFonts w:ascii="Times New Roman" w:hAnsi="Times New Roman" w:cs="Times New Roman"/>
+                <w:sz w:val="20"/>
+                <w:szCs w:val="20"/>
+              </w:rPr>
+            </w:pPr>
+            <w:r>
+              <w:rPr>
+                <w:rFonts w:ascii="Times New Roman" w:hAnsi="Times New Roman" w:cs="Times New Roman"/>
+                <w:sz w:val="20"/>
+                <w:szCs w:val="20"/>
+              </w:rPr>
+              <w:t>{{S_T_TIMELINE}}</w:t>
+            </w:r>
+          </w:p>
+        </w:tc>
+        <w:tc>
+          <w:tcPr>
+            <w:tcW w:w="2552" w:type="dxa"/>
+          </w:tcPr>
+          <w:p>
+            <w:pPr>
+              <w:rPr>
+                <w:rFonts w:ascii="Times New Roman" w:hAnsi="Times New Roman" w:cs="Times New Roman"/>
+                <w:sz w:val="20"/>
+                <w:szCs w:val="20"/>
+              </w:rPr>
+            </w:pPr>
+            <w:r>
+              <w:rPr>
+                <w:rFonts w:ascii="Times New Roman" w:hAnsi="Times New Roman" w:cs="Times New Roman"/>
+                <w:sz w:val="20"/>
+                <w:szCs w:val="20"/>
+              </w:rPr>
+              <w:t>{{S_T_DELIVERY}}</w:t>
+            </w:r>
+          </w:p>
+        </w:tc>
+      </w:tr>
+    </w:tbl>
+    <w:p>
+      <w:pPr>
+        <w:spacing w:before="300" w:after="150"/>
+        <w:jc w:val="both"/>
+        <w:rPr>
+          <w:rFonts w:ascii="Times New Roman" w:hAnsi="Times New Roman" w:cs="Times New Roman"/>
+          <w:w w:val="101"/>
+        </w:rPr>
+      </w:pPr>
+      <w:r>
+        <w:rPr>
+          <w:rFonts w:ascii="Times New Roman" w:hAnsi="Times New Roman" w:cs="Times New Roman"/>
+          <w:w w:val="101"/>
+        </w:rPr>
         <w:t>We</w:t>
       </w:r>
       <w:r>
@@ -6277,7 +6825,14 @@
         <w:rPr>
           <w:rFonts w:ascii="Times New Roman" w:hAnsi="Times New Roman" w:cs="Times New Roman"/>
         </w:rPr>
-        <w:t xml:space="preserve"> disputes, riots, war, fire, acts of God or governmental regulations. BlechTek should not be held responsible, directly or indirectly for </w:t>
+        <w:t xml:space="preserve"> disputes, riots, war, fire, acts of God or governmental regulations. BlechTek </w:t>
+      </w:r>
+      <w:r>
+        <w:rPr>
+          <w:rFonts w:ascii="Times New Roman" w:hAnsi="Times New Roman" w:cs="Times New Roman"/>
+        </w:rPr>
+        <w:lastRenderedPageBreak/>
+        <w:t xml:space="preserve">should not be held responsible, directly or indirectly for </w:t>
       </w:r>
       <w:r>
         <w:rPr>
@@ -6310,7 +6865,6 @@
           <w:bCs/>
           <w:color w:val="000000" w:themeColor="text1"/>
         </w:rPr>
-        <w:lastRenderedPageBreak/>
         <w:t>7. Discontinuation of Contract</w:t>
       </w:r>
     </w:p>
@@ -6712,12 +7266,16 @@
         <w:jc w:val="both"/>
         <w:rPr>
           <w:rFonts w:ascii="Times New Roman" w:hAnsi="Times New Roman" w:cs="Times New Roman"/>
+          <w:b/>
+          <w:bCs/>
           <w:color w:val="000000" w:themeColor="text1"/>
         </w:rPr>
       </w:pPr>
       <w:r>
         <w:rPr>
           <w:rFonts w:ascii="Times New Roman" w:hAnsi="Times New Roman" w:cs="Times New Roman"/>
+          <w:b/>
+          <w:bCs/>
           <w:color w:val="000000" w:themeColor="text1"/>
         </w:rPr>
         <w:t>Sushama Inamdar</w:t>
@@ -6786,12 +7344,16 @@
       <w:jc w:val="center"/>
       <w:rPr>
         <w:rFonts w:ascii="Times New Roman" w:hAnsi="Times New Roman" w:cs="Times New Roman"/>
+        <w:b/>
+        <w:bCs/>
         <w:color w:val="000000" w:themeColor="text1"/>
       </w:rPr>
     </w:pPr>
     <w:r>
       <w:rPr>
         <w:rFonts w:ascii="Times New Roman" w:hAnsi="Times New Roman" w:cs="Times New Roman"/>
+        <w:b/>
+        <w:bCs/>
         <w:color w:val="000000" w:themeColor="text1"/>
       </w:rPr>
       <w:t>BlechTek Software Solutions LLP</w:t>
@@ -6810,11 +7372,22 @@
     <w:r>
       <w:rPr>
         <w:rFonts w:ascii="Times New Roman" w:hAnsi="Times New Roman" w:cs="Times New Roman"/>
+        <w:b/>
+        <w:bCs/>
         <w:color w:val="000000" w:themeColor="text1"/>
         <w:sz w:val="18"/>
         <w:szCs w:val="18"/>
       </w:rPr>
-      <w:t xml:space="preserve">Address: S.NO. 257/2/2A/4 ABC Business Center, S Floor, Opp. WindMill Village Road, </w:t>
+      <w:t>Address:</w:t>
+    </w:r>
+    <w:r>
+      <w:rPr>
+        <w:rFonts w:ascii="Times New Roman" w:hAnsi="Times New Roman" w:cs="Times New Roman"/>
+        <w:color w:val="000000" w:themeColor="text1"/>
+        <w:sz w:val="18"/>
+        <w:szCs w:val="18"/>
+      </w:rPr>
+      <w:t xml:space="preserve"> S.NO. 257/2/2A/4 ABC Business Center, S Floor, Opp. WindMill Village Road, </w:t>
     </w:r>
   </w:p>
   <w:p>
@@ -6847,17 +7420,17 @@
         <w:szCs w:val="18"/>
       </w:rPr>
     </w:pPr>
-  </w:p>
-  <w:p>
-    <w:pPr>
-      <w:jc w:val="center"/>
+    <w:r>
       <w:rPr>
         <w:rFonts w:ascii="Times New Roman" w:hAnsi="Times New Roman" w:cs="Times New Roman"/>
+        <w:b/>
+        <w:bCs/>
         <w:color w:val="000000" w:themeColor="text1"/>
         <w:sz w:val="18"/>
         <w:szCs w:val="18"/>
       </w:rPr>
-    </w:pPr>
+      <w:t>LLP No.:</w:t>
+    </w:r>
     <w:r>
       <w:rPr>
         <w:rFonts w:ascii="Times New Roman" w:hAnsi="Times New Roman" w:cs="Times New Roman"/>
@@ -6865,7 +7438,7 @@
         <w:sz w:val="18"/>
         <w:szCs w:val="18"/>
       </w:rPr>
-      <w:t>LLP No.: ACD-6620</w:t>
+      <w:t xml:space="preserve"> ACD-6620</w:t>
     </w:r>
     <w:r>
       <w:rPr>
@@ -6915,11 +7488,22 @@
     <w:r>
       <w:rPr>
         <w:rFonts w:ascii="Times New Roman" w:hAnsi="Times New Roman" w:cs="Times New Roman"/>
+        <w:b/>
+        <w:bCs/>
         <w:color w:val="000000" w:themeColor="text1"/>
         <w:sz w:val="18"/>
         <w:szCs w:val="18"/>
       </w:rPr>
-      <w:t>GST NO.: 27ABCFB0283B1Z0</w:t>
+      <w:t>GST NO.:</w:t>
+    </w:r>
+    <w:r>
+      <w:rPr>
+        <w:rFonts w:ascii="Times New Roman" w:hAnsi="Times New Roman" w:cs="Times New Roman"/>
+        <w:color w:val="000000" w:themeColor="text1"/>
+        <w:sz w:val="18"/>
+        <w:szCs w:val="18"/>
+      </w:rPr>
+      <w:t xml:space="preserve"> 27ABCFB0283B1Z0</w:t>
     </w:r>
     <w:r>
       <w:rPr>
@@ -6951,11 +7535,22 @@
     <w:r>
       <w:rPr>
         <w:rFonts w:ascii="Times New Roman" w:hAnsi="Times New Roman" w:cs="Times New Roman"/>
+        <w:b/>
+        <w:bCs/>
         <w:color w:val="000000" w:themeColor="text1"/>
         <w:sz w:val="18"/>
         <w:szCs w:val="18"/>
       </w:rPr>
-      <w:t>MSME Certificate No.: UDYAM-MH-26-0746115</w:t>
+      <w:t>MSME Certificate No.:</w:t>
+    </w:r>
+    <w:r>
+      <w:rPr>
+        <w:rFonts w:ascii="Times New Roman" w:hAnsi="Times New Roman" w:cs="Times New Roman"/>
+        <w:color w:val="000000" w:themeColor="text1"/>
+        <w:sz w:val="18"/>
+        <w:szCs w:val="18"/>
+      </w:rPr>
+      <w:t xml:space="preserve"> UDYAM-MH-26-0746115</w:t>
     </w:r>
   </w:p>
   <w:p>
@@ -8614,6 +9209,34 @@
       </w:tblBorders>
     </w:tblPr>
   </w:style>
+  <w:style w:type="table" w:customStyle="1" w:styleId="TableGrid1">
+    <w:name w:val="Table Grid1"/>
+    <w:basedOn w:val="TableNormal"/>
+    <w:next w:val="TableGrid0"/>
+    <w:uiPriority w:val="39"/>
+    <w:rsid w:val="00B47BF6"/>
+    <w:pPr>
+      <w:spacing w:line="240" w:lineRule="auto"/>
+    </w:pPr>
+    <w:rPr>
+      <w:rFonts w:asciiTheme="minorHAnsi" w:eastAsiaTheme="minorHAnsi" w:hAnsiTheme="minorHAnsi" w:cstheme="minorBidi"/>
+      <w:kern w:val="2"/>
+      <w:sz w:val="24"/>
+      <w:szCs w:val="24"/>
+      <w:lang w:eastAsia="en-US"/>
+      <w14:ligatures w14:val="standardContextual"/>
+    </w:rPr>
+    <w:tblPr>
+      <w:tblBorders>
+        <w:top w:val="single" w:sz="4" w:space="0" w:color="auto"/>
+        <w:left w:val="single" w:sz="4" w:space="0" w:color="auto"/>
+        <w:bottom w:val="single" w:sz="4" w:space="0" w:color="auto"/>
+        <w:right w:val="single" w:sz="4" w:space="0" w:color="auto"/>
+        <w:insideH w:val="single" w:sz="4" w:space="0" w:color="auto"/>
+        <w:insideV w:val="single" w:sz="4" w:space="0" w:color="auto"/>
+      </w:tblBorders>
+    </w:tblPr>
+  </w:style>
 </w:styles>
 </file>
 

</xml_diff>

<commit_message>
updates in new quotation pdf for generating the auto sr.no. correctly based on the selected modules and align of sub sr no correctly
</commit_message>
<xml_diff>
--- a/QuotationApp.API/Templates/QuotationTemplate_Updated - Copy.docx
+++ b/QuotationApp.API/Templates/QuotationTemplate_Updated - Copy.docx
@@ -35,27 +35,51 @@
           <w:sz w:val="22"/>
           <w:szCs w:val="22"/>
         </w:rPr>
-        <w:t xml:space="preserve"> - {{OrganizationName}}</w:t>
+        <w:t xml:space="preserve"> - {{</w:t>
+      </w:r>
+      <w:proofErr w:type="spellStart"/>
+      <w:r>
+        <w:rPr>
+          <w:rFonts w:ascii="Times New Roman" w:hAnsi="Times New Roman" w:cs="Times New Roman"/>
+          <w:b/>
+          <w:bCs/>
+          <w:color w:val="000000" w:themeColor="text1"/>
+          <w:sz w:val="22"/>
+          <w:szCs w:val="22"/>
+        </w:rPr>
+        <w:t>OrganizationName</w:t>
+      </w:r>
+      <w:proofErr w:type="spellEnd"/>
+      <w:r>
+        <w:rPr>
+          <w:rFonts w:ascii="Times New Roman" w:hAnsi="Times New Roman" w:cs="Times New Roman"/>
+          <w:b/>
+          <w:bCs/>
+          <w:color w:val="000000" w:themeColor="text1"/>
+          <w:sz w:val="22"/>
+          <w:szCs w:val="22"/>
+        </w:rPr>
+        <w:t>}}</w:t>
       </w:r>
     </w:p>
     <w:tbl>
       <w:tblPr>
         <w:tblStyle w:val="TableGrid"/>
-        <w:tblW w:w="10154" w:type="dxa"/>
+        <w:tblW w:w="10291" w:type="dxa"/>
         <w:tblInd w:w="5" w:type="dxa"/>
         <w:tblLook w:val="04A0" w:firstRow="1" w:lastRow="0" w:firstColumn="1" w:lastColumn="0" w:noHBand="0" w:noVBand="1"/>
       </w:tblPr>
       <w:tblGrid>
-        <w:gridCol w:w="6374"/>
-        <w:gridCol w:w="3780"/>
+        <w:gridCol w:w="6460"/>
+        <w:gridCol w:w="3831"/>
       </w:tblGrid>
       <w:tr>
         <w:trPr>
-          <w:trHeight w:val="341"/>
+          <w:trHeight w:val="337"/>
         </w:trPr>
         <w:tc>
           <w:tcPr>
-            <w:tcW w:w="6374" w:type="dxa"/>
+            <w:tcW w:w="6460" w:type="dxa"/>
           </w:tcPr>
           <w:p>
             <w:pPr>
@@ -91,7 +115,7 @@
         </w:tc>
         <w:tc>
           <w:tcPr>
-            <w:tcW w:w="3780" w:type="dxa"/>
+            <w:tcW w:w="3831" w:type="dxa"/>
           </w:tcPr>
           <w:p>
             <w:pPr>
@@ -127,11 +151,11 @@
       </w:tr>
       <w:tr>
         <w:trPr>
-          <w:trHeight w:val="341"/>
+          <w:trHeight w:val="337"/>
         </w:trPr>
         <w:tc>
           <w:tcPr>
-            <w:tcW w:w="6374" w:type="dxa"/>
+            <w:tcW w:w="6460" w:type="dxa"/>
           </w:tcPr>
           <w:p>
             <w:pPr>
@@ -167,7 +191,7 @@
         </w:tc>
         <w:tc>
           <w:tcPr>
-            <w:tcW w:w="3780" w:type="dxa"/>
+            <w:tcW w:w="3831" w:type="dxa"/>
           </w:tcPr>
           <w:p>
             <w:pPr>
@@ -203,11 +227,11 @@
       </w:tr>
       <w:tr>
         <w:trPr>
-          <w:trHeight w:val="414"/>
+          <w:trHeight w:val="246"/>
         </w:trPr>
         <w:tc>
           <w:tcPr>
-            <w:tcW w:w="6374" w:type="dxa"/>
+            <w:tcW w:w="6460" w:type="dxa"/>
           </w:tcPr>
           <w:p>
             <w:pPr>
@@ -241,6 +265,7 @@
               </w:rPr>
               <w:t>{{CONTACT_PHONE</w:t>
             </w:r>
+            <w:proofErr w:type="gramStart"/>
             <w:r>
               <w:rPr>
                 <w:rFonts w:ascii="Times New Roman" w:hAnsi="Times New Roman" w:cs="Times New Roman"/>
@@ -269,6 +294,7 @@
               </w:rPr>
               <w:t xml:space="preserve"> </w:t>
             </w:r>
+            <w:proofErr w:type="gramEnd"/>
             <w:r>
               <w:rPr>
                 <w:rFonts w:ascii="Times New Roman" w:hAnsi="Times New Roman" w:cs="Times New Roman"/>
@@ -304,7 +330,7 @@
         </w:tc>
         <w:tc>
           <w:tcPr>
-            <w:tcW w:w="3780" w:type="dxa"/>
+            <w:tcW w:w="3831" w:type="dxa"/>
           </w:tcPr>
           <w:p>
             <w:pPr>
@@ -334,7 +360,7 @@
           <w:szCs w:val="18"/>
         </w:rPr>
         <w:pict w14:anchorId="23C204BC">
-          <v:rect id="_x0000_i1052" style="width:502pt;height:1pt;mso-position-horizontal:absolute;mso-position-horizontal-relative:text;mso-position-vertical:absolute;mso-position-vertical-relative:text" o:hralign="center" o:hrstd="t" o:hrnoshade="t" o:hr="t" fillcolor="#4e95d9 [1631]" stroked="f"/>
+          <v:rect id="_x0000_i1025" style="width:502pt;height:1pt;mso-position-horizontal:absolute;mso-position-horizontal-relative:text;mso-position-vertical:absolute;mso-position-vertical-relative:text" o:hralign="center" o:hrstd="t" o:hrnoshade="t" o:hr="t" fillcolor="#4e95d9 [1631]" stroked="f"/>
         </w:pict>
       </w:r>
       <w:r>
@@ -963,18 +989,19 @@
     <w:tbl>
       <w:tblPr>
         <w:tblStyle w:val="TableGrid0"/>
-        <w:tblW w:w="10060" w:type="dxa"/>
+        <w:tblW w:w="10490" w:type="dxa"/>
+        <w:tblInd w:w="-289" w:type="dxa"/>
         <w:tblLook w:val="04A0" w:firstRow="1" w:lastRow="0" w:firstColumn="1" w:lastColumn="0" w:noHBand="0" w:noVBand="1"/>
       </w:tblPr>
       <w:tblGrid>
-        <w:gridCol w:w="1838"/>
+        <w:gridCol w:w="2127"/>
         <w:gridCol w:w="6237"/>
-        <w:gridCol w:w="1985"/>
+        <w:gridCol w:w="2126"/>
       </w:tblGrid>
       <w:tr>
         <w:tc>
           <w:tcPr>
-            <w:tcW w:w="1838" w:type="dxa"/>
+            <w:tcW w:w="2127" w:type="dxa"/>
           </w:tcPr>
           <w:p>
             <w:r>
@@ -1006,7 +1033,7 @@
         </w:tc>
         <w:tc>
           <w:tcPr>
-            <w:tcW w:w="1985" w:type="dxa"/>
+            <w:tcW w:w="2126" w:type="dxa"/>
           </w:tcPr>
           <w:p>
             <w:r>
@@ -1023,7 +1050,7 @@
       <w:tr>
         <w:tc>
           <w:tcPr>
-            <w:tcW w:w="1838" w:type="dxa"/>
+            <w:tcW w:w="2127" w:type="dxa"/>
           </w:tcPr>
           <w:p>
             <w:r>
@@ -1049,7 +1076,7 @@
         </w:tc>
         <w:tc>
           <w:tcPr>
-            <w:tcW w:w="1985" w:type="dxa"/>
+            <w:tcW w:w="2126" w:type="dxa"/>
           </w:tcPr>
           <w:p>
             <w:r>
@@ -1091,8 +1118,8 @@
     <w:tbl>
       <w:tblPr>
         <w:tblStyle w:val="TableGrid0"/>
-        <w:tblW w:w="10207" w:type="dxa"/>
-        <w:tblInd w:w="-147" w:type="dxa"/>
+        <w:tblW w:w="10490" w:type="dxa"/>
+        <w:tblInd w:w="-289" w:type="dxa"/>
         <w:tblBorders>
           <w:bottom w:val="single" w:sz="2" w:space="0" w:color="auto"/>
         </w:tblBorders>
@@ -1100,12 +1127,12 @@
         <w:tblLook w:val="04A0" w:firstRow="1" w:lastRow="0" w:firstColumn="1" w:lastColumn="0" w:noHBand="0" w:noVBand="1"/>
       </w:tblPr>
       <w:tblGrid>
-        <w:gridCol w:w="1598"/>
-        <w:gridCol w:w="1805"/>
+        <w:gridCol w:w="1844"/>
+        <w:gridCol w:w="1701"/>
         <w:gridCol w:w="1842"/>
         <w:gridCol w:w="1701"/>
         <w:gridCol w:w="1701"/>
-        <w:gridCol w:w="1560"/>
+        <w:gridCol w:w="1701"/>
       </w:tblGrid>
       <w:tr>
         <w:trPr>
@@ -1113,7 +1140,7 @@
         </w:trPr>
         <w:tc>
           <w:tcPr>
-            <w:tcW w:w="1598" w:type="dxa"/>
+            <w:tcW w:w="1844" w:type="dxa"/>
           </w:tcPr>
           <w:p>
             <w:r>
@@ -1129,7 +1156,7 @@
         </w:tc>
         <w:tc>
           <w:tcPr>
-            <w:tcW w:w="1805" w:type="dxa"/>
+            <w:tcW w:w="1701" w:type="dxa"/>
           </w:tcPr>
           <w:p>
             <w:r>
@@ -1193,7 +1220,7 @@
         </w:tc>
         <w:tc>
           <w:tcPr>
-            <w:tcW w:w="1560" w:type="dxa"/>
+            <w:tcW w:w="1701" w:type="dxa"/>
           </w:tcPr>
           <w:p>
             <w:r>
@@ -1214,7 +1241,7 @@
         </w:trPr>
         <w:tc>
           <w:tcPr>
-            <w:tcW w:w="1598" w:type="dxa"/>
+            <w:tcW w:w="1844" w:type="dxa"/>
           </w:tcPr>
           <w:p>
             <w:r>
@@ -1228,7 +1255,7 @@
         </w:tc>
         <w:tc>
           <w:tcPr>
-            <w:tcW w:w="1805" w:type="dxa"/>
+            <w:tcW w:w="1701" w:type="dxa"/>
           </w:tcPr>
           <w:p>
             <w:r>
@@ -1284,7 +1311,7 @@
         </w:tc>
         <w:tc>
           <w:tcPr>
-            <w:tcW w:w="1560" w:type="dxa"/>
+            <w:tcW w:w="1701" w:type="dxa"/>
           </w:tcPr>
           <w:p>
             <w:r>
@@ -1322,7 +1349,7 @@
           <w:caps/>
           <w:color w:val="000000" w:themeColor="text1"/>
         </w:rPr>
-        <w:t>cqual -</w:t>
+        <w:t xml:space="preserve">cqual </w:t>
       </w:r>
       <w:r>
         <w:rPr>
@@ -1332,32 +1359,38 @@
           <w:caps/>
           <w:color w:val="000000" w:themeColor="text1"/>
         </w:rPr>
-        <w:t xml:space="preserve"> </w:t>
-      </w:r>
-      <w:r>
-        <w:rPr>
-          <w:rFonts w:ascii="Times New Roman" w:hAnsi="Times New Roman" w:cs="Times New Roman"/>
+        <w:t xml:space="preserve">- </w:t>
+      </w:r>
+      <w:r>
+        <w:rPr>
+          <w:rFonts w:ascii="Times New Roman" w:hAnsi="Times New Roman" w:cs="Times New Roman"/>
+          <w:b/>
+          <w:bCs/>
         </w:rPr>
         <w:t>{{</w:t>
       </w:r>
       <w:r>
         <w:rPr>
           <w:rFonts w:ascii="Times New Roman" w:hAnsi="Times New Roman" w:cs="Times New Roman"/>
+          <w:b/>
+          <w:bCs/>
         </w:rPr>
         <w:t>M_</w:t>
       </w:r>
       <w:r>
         <w:rPr>
           <w:rFonts w:ascii="Times New Roman" w:hAnsi="Times New Roman" w:cs="Times New Roman"/>
+          <w:b/>
+          <w:bCs/>
         </w:rPr>
         <w:t>LIST}}</w:t>
       </w:r>
     </w:p>
     <w:tbl>
       <w:tblPr>
-        <w:tblpPr w:leftFromText="180" w:rightFromText="180" w:vertAnchor="text" w:tblpY="1"/>
+        <w:tblpPr w:leftFromText="180" w:rightFromText="180" w:vertAnchor="text" w:tblpX="-289" w:tblpY="1"/>
         <w:tblOverlap w:val="never"/>
-        <w:tblW w:w="10060" w:type="dxa"/>
+        <w:tblW w:w="10485" w:type="dxa"/>
         <w:tblBorders>
           <w:top w:val="single" w:sz="4" w:space="0" w:color="auto"/>
           <w:left w:val="single" w:sz="4" w:space="0" w:color="auto"/>
@@ -1373,9 +1406,9 @@
         <w:tblLook w:val="04A0" w:firstRow="1" w:lastRow="0" w:firstColumn="1" w:lastColumn="0" w:noHBand="0" w:noVBand="1"/>
       </w:tblPr>
       <w:tblGrid>
-        <w:gridCol w:w="842"/>
+        <w:gridCol w:w="1131"/>
         <w:gridCol w:w="6883"/>
-        <w:gridCol w:w="2335"/>
+        <w:gridCol w:w="2471"/>
       </w:tblGrid>
       <w:tr>
         <w:trPr>
@@ -1384,7 +1417,7 @@
         </w:trPr>
         <w:tc>
           <w:tcPr>
-            <w:tcW w:w="846" w:type="dxa"/>
+            <w:tcW w:w="1131" w:type="dxa"/>
             <w:tcMar>
               <w:top w:w="80" w:type="dxa"/>
               <w:left w:w="120" w:type="dxa"/>
@@ -1416,7 +1449,7 @@
         </w:tc>
         <w:tc>
           <w:tcPr>
-            <w:tcW w:w="6946" w:type="dxa"/>
+            <w:tcW w:w="6883" w:type="dxa"/>
             <w:tcMar>
               <w:top w:w="80" w:type="dxa"/>
               <w:left w:w="120" w:type="dxa"/>
@@ -1448,7 +1481,7 @@
         </w:tc>
         <w:tc>
           <w:tcPr>
-            <w:tcW w:w="2268" w:type="dxa"/>
+            <w:tcW w:w="2471" w:type="dxa"/>
             <w:tcMar>
               <w:top w:w="80" w:type="dxa"/>
               <w:left w:w="120" w:type="dxa"/>
@@ -1503,7 +1536,7 @@
         </w:trPr>
         <w:tc>
           <w:tcPr>
-            <w:tcW w:w="846" w:type="dxa"/>
+            <w:tcW w:w="1131" w:type="dxa"/>
             <w:tcMar>
               <w:top w:w="80" w:type="dxa"/>
               <w:left w:w="120" w:type="dxa"/>
@@ -1527,7 +1560,7 @@
         </w:tc>
         <w:tc>
           <w:tcPr>
-            <w:tcW w:w="6946" w:type="dxa"/>
+            <w:tcW w:w="6883" w:type="dxa"/>
             <w:tcMar>
               <w:top w:w="80" w:type="dxa"/>
               <w:left w:w="120" w:type="dxa"/>
@@ -1618,7 +1651,7 @@
         </w:tc>
         <w:tc>
           <w:tcPr>
-            <w:tcW w:w="2268" w:type="dxa"/>
+            <w:tcW w:w="2471" w:type="dxa"/>
             <w:tcMar>
               <w:top w:w="80" w:type="dxa"/>
               <w:left w:w="120" w:type="dxa"/>
@@ -1666,7 +1699,7 @@
         </w:trPr>
         <w:tc>
           <w:tcPr>
-            <w:tcW w:w="846" w:type="dxa"/>
+            <w:tcW w:w="1131" w:type="dxa"/>
             <w:tcMar>
               <w:top w:w="80" w:type="dxa"/>
               <w:left w:w="120" w:type="dxa"/>
@@ -1684,7 +1717,7 @@
         </w:tc>
         <w:tc>
           <w:tcPr>
-            <w:tcW w:w="6946" w:type="dxa"/>
+            <w:tcW w:w="6883" w:type="dxa"/>
             <w:tcMar>
               <w:top w:w="80" w:type="dxa"/>
               <w:left w:w="120" w:type="dxa"/>
@@ -1720,7 +1753,7 @@
         </w:tc>
         <w:tc>
           <w:tcPr>
-            <w:tcW w:w="2268" w:type="dxa"/>
+            <w:tcW w:w="2471" w:type="dxa"/>
             <w:tcMar>
               <w:top w:w="80" w:type="dxa"/>
               <w:left w:w="120" w:type="dxa"/>
@@ -1761,7 +1794,7 @@
         </w:trPr>
         <w:tc>
           <w:tcPr>
-            <w:tcW w:w="846" w:type="dxa"/>
+            <w:tcW w:w="1131" w:type="dxa"/>
             <w:tcMar>
               <w:top w:w="80" w:type="dxa"/>
               <w:left w:w="120" w:type="dxa"/>
@@ -1779,7 +1812,7 @@
         </w:tc>
         <w:tc>
           <w:tcPr>
-            <w:tcW w:w="6946" w:type="dxa"/>
+            <w:tcW w:w="6883" w:type="dxa"/>
             <w:tcMar>
               <w:top w:w="80" w:type="dxa"/>
               <w:left w:w="120" w:type="dxa"/>
@@ -1800,13 +1833,34 @@
               <w:t>Implementation (</w:t>
             </w:r>
             <w:r>
+              <w:rPr>
+                <w:rFonts w:ascii="Times New Roman" w:hAnsi="Times New Roman" w:cs="Times New Roman"/>
+              </w:rPr>
+              <w:t>{{IMPL_EFFORT}}</w:t>
+            </w:r>
+            <w:r>
+              <w:rPr>
+                <w:rFonts w:ascii="Times New Roman" w:hAnsi="Times New Roman" w:cs="Times New Roman"/>
+              </w:rPr>
               <w:t xml:space="preserve"> </w:t>
             </w:r>
             <w:r>
               <w:rPr>
                 <w:rFonts w:ascii="Times New Roman" w:hAnsi="Times New Roman" w:cs="Times New Roman"/>
               </w:rPr>
-              <w:t>{{IMPL_EFFORT}}</w:t>
+              <w:t>Man</w:t>
+            </w:r>
+            <w:r>
+              <w:rPr>
+                <w:rFonts w:ascii="Times New Roman" w:hAnsi="Times New Roman" w:cs="Times New Roman"/>
+              </w:rPr>
+              <w:t xml:space="preserve"> Day * </w:t>
+            </w:r>
+            <w:r>
+              <w:rPr>
+                <w:rFonts w:ascii="Times New Roman" w:hAnsi="Times New Roman" w:cs="Times New Roman"/>
+              </w:rPr>
+              <w:t>{{IMPL_RATE}}</w:t>
             </w:r>
             <w:r>
               <w:rPr>
@@ -1818,37 +1872,13 @@
               <w:rPr>
                 <w:rFonts w:ascii="Times New Roman" w:hAnsi="Times New Roman" w:cs="Times New Roman"/>
               </w:rPr>
-              <w:t>Man</w:t>
-            </w:r>
-            <w:r>
-              <w:rPr>
-                <w:rFonts w:ascii="Times New Roman" w:hAnsi="Times New Roman" w:cs="Times New Roman"/>
-              </w:rPr>
-              <w:t xml:space="preserve"> Day * </w:t>
-            </w:r>
-            <w:r>
-              <w:rPr>
-                <w:rFonts w:ascii="Times New Roman" w:hAnsi="Times New Roman" w:cs="Times New Roman"/>
-              </w:rPr>
-              <w:t>{{IMPL_RATE}}</w:t>
-            </w:r>
-            <w:r>
-              <w:rPr>
-                <w:rFonts w:ascii="Times New Roman" w:hAnsi="Times New Roman" w:cs="Times New Roman"/>
-              </w:rPr>
-              <w:t xml:space="preserve"> </w:t>
-            </w:r>
-            <w:r>
-              <w:rPr>
-                <w:rFonts w:ascii="Times New Roman" w:hAnsi="Times New Roman" w:cs="Times New Roman"/>
-              </w:rPr>
               <w:t>per Man Day)</w:t>
             </w:r>
           </w:p>
         </w:tc>
         <w:tc>
           <w:tcPr>
-            <w:tcW w:w="2268" w:type="dxa"/>
+            <w:tcW w:w="2471" w:type="dxa"/>
             <w:tcMar>
               <w:top w:w="80" w:type="dxa"/>
               <w:left w:w="120" w:type="dxa"/>
@@ -1877,7 +1907,7 @@
         </w:trPr>
         <w:tc>
           <w:tcPr>
-            <w:tcW w:w="846" w:type="dxa"/>
+            <w:tcW w:w="1131" w:type="dxa"/>
             <w:tcMar>
               <w:top w:w="80" w:type="dxa"/>
               <w:left w:w="120" w:type="dxa"/>
@@ -1895,7 +1925,7 @@
         </w:tc>
         <w:tc>
           <w:tcPr>
-            <w:tcW w:w="6946" w:type="dxa"/>
+            <w:tcW w:w="6883" w:type="dxa"/>
             <w:tcMar>
               <w:top w:w="80" w:type="dxa"/>
               <w:left w:w="120" w:type="dxa"/>
@@ -1925,7 +1955,7 @@
         </w:tc>
         <w:tc>
           <w:tcPr>
-            <w:tcW w:w="2268" w:type="dxa"/>
+            <w:tcW w:w="2471" w:type="dxa"/>
             <w:tcMar>
               <w:top w:w="80" w:type="dxa"/>
               <w:left w:w="120" w:type="dxa"/>
@@ -1966,7 +1996,7 @@
         </w:trPr>
         <w:tc>
           <w:tcPr>
-            <w:tcW w:w="846" w:type="dxa"/>
+            <w:tcW w:w="1131" w:type="dxa"/>
             <w:tcMar>
               <w:top w:w="80" w:type="dxa"/>
               <w:left w:w="120" w:type="dxa"/>
@@ -1984,7 +2014,7 @@
         </w:tc>
         <w:tc>
           <w:tcPr>
-            <w:tcW w:w="6946" w:type="dxa"/>
+            <w:tcW w:w="6883" w:type="dxa"/>
             <w:tcMar>
               <w:top w:w="80" w:type="dxa"/>
               <w:left w:w="120" w:type="dxa"/>
@@ -2008,7 +2038,7 @@
         </w:tc>
         <w:tc>
           <w:tcPr>
-            <w:tcW w:w="2268" w:type="dxa"/>
+            <w:tcW w:w="2471" w:type="dxa"/>
             <w:tcMar>
               <w:top w:w="80" w:type="dxa"/>
               <w:left w:w="120" w:type="dxa"/>
@@ -2049,7 +2079,7 @@
         </w:trPr>
         <w:tc>
           <w:tcPr>
-            <w:tcW w:w="846" w:type="dxa"/>
+            <w:tcW w:w="1131" w:type="dxa"/>
             <w:tcMar>
               <w:top w:w="80" w:type="dxa"/>
               <w:left w:w="120" w:type="dxa"/>
@@ -2067,7 +2097,7 @@
         </w:tc>
         <w:tc>
           <w:tcPr>
-            <w:tcW w:w="6946" w:type="dxa"/>
+            <w:tcW w:w="6883" w:type="dxa"/>
             <w:tcMar>
               <w:top w:w="80" w:type="dxa"/>
               <w:left w:w="120" w:type="dxa"/>
@@ -2091,7 +2121,7 @@
         </w:tc>
         <w:tc>
           <w:tcPr>
-            <w:tcW w:w="2268" w:type="dxa"/>
+            <w:tcW w:w="2471" w:type="dxa"/>
             <w:tcMar>
               <w:top w:w="80" w:type="dxa"/>
               <w:left w:w="120" w:type="dxa"/>
@@ -2120,7 +2150,7 @@
         </w:trPr>
         <w:tc>
           <w:tcPr>
-            <w:tcW w:w="846" w:type="dxa"/>
+            <w:tcW w:w="1131" w:type="dxa"/>
             <w:tcMar>
               <w:top w:w="80" w:type="dxa"/>
               <w:left w:w="120" w:type="dxa"/>
@@ -2144,7 +2174,7 @@
         </w:tc>
         <w:tc>
           <w:tcPr>
-            <w:tcW w:w="6946" w:type="dxa"/>
+            <w:tcW w:w="6883" w:type="dxa"/>
             <w:tcMar>
               <w:top w:w="80" w:type="dxa"/>
               <w:left w:w="120" w:type="dxa"/>
@@ -2168,7 +2198,7 @@
         </w:tc>
         <w:tc>
           <w:tcPr>
-            <w:tcW w:w="2268" w:type="dxa"/>
+            <w:tcW w:w="2471" w:type="dxa"/>
             <w:tcMar>
               <w:top w:w="80" w:type="dxa"/>
               <w:left w:w="120" w:type="dxa"/>
@@ -2197,7 +2227,7 @@
         </w:trPr>
         <w:tc>
           <w:tcPr>
-            <w:tcW w:w="846" w:type="dxa"/>
+            <w:tcW w:w="1131" w:type="dxa"/>
             <w:tcMar>
               <w:top w:w="80" w:type="dxa"/>
               <w:left w:w="120" w:type="dxa"/>
@@ -2221,7 +2251,7 @@
         </w:tc>
         <w:tc>
           <w:tcPr>
-            <w:tcW w:w="6946" w:type="dxa"/>
+            <w:tcW w:w="6883" w:type="dxa"/>
             <w:tcMar>
               <w:top w:w="80" w:type="dxa"/>
               <w:left w:w="120" w:type="dxa"/>
@@ -2245,7 +2275,7 @@
         </w:tc>
         <w:tc>
           <w:tcPr>
-            <w:tcW w:w="2268" w:type="dxa"/>
+            <w:tcW w:w="2471" w:type="dxa"/>
             <w:tcMar>
               <w:top w:w="80" w:type="dxa"/>
               <w:left w:w="120" w:type="dxa"/>
@@ -2268,7 +2298,7 @@
         </w:trPr>
         <w:tc>
           <w:tcPr>
-            <w:tcW w:w="846" w:type="dxa"/>
+            <w:tcW w:w="1131" w:type="dxa"/>
             <w:tcMar>
               <w:top w:w="80" w:type="dxa"/>
               <w:left w:w="120" w:type="dxa"/>
@@ -2292,7 +2322,7 @@
         </w:tc>
         <w:tc>
           <w:tcPr>
-            <w:tcW w:w="6946" w:type="dxa"/>
+            <w:tcW w:w="6883" w:type="dxa"/>
             <w:tcMar>
               <w:top w:w="80" w:type="dxa"/>
               <w:left w:w="120" w:type="dxa"/>
@@ -2316,7 +2346,7 @@
         </w:tc>
         <w:tc>
           <w:tcPr>
-            <w:tcW w:w="2268" w:type="dxa"/>
+            <w:tcW w:w="2471" w:type="dxa"/>
             <w:tcMar>
               <w:top w:w="80" w:type="dxa"/>
               <w:left w:w="120" w:type="dxa"/>
@@ -2339,7 +2369,7 @@
         </w:trPr>
         <w:tc>
           <w:tcPr>
-            <w:tcW w:w="846" w:type="dxa"/>
+            <w:tcW w:w="1131" w:type="dxa"/>
             <w:tcMar>
               <w:top w:w="80" w:type="dxa"/>
               <w:left w:w="120" w:type="dxa"/>
@@ -2375,7 +2405,7 @@
         </w:tc>
         <w:tc>
           <w:tcPr>
-            <w:tcW w:w="6946" w:type="dxa"/>
+            <w:tcW w:w="6883" w:type="dxa"/>
             <w:tcMar>
               <w:top w:w="80" w:type="dxa"/>
               <w:left w:w="120" w:type="dxa"/>
@@ -2412,7 +2442,7 @@
         </w:tc>
         <w:tc>
           <w:tcPr>
-            <w:tcW w:w="2268" w:type="dxa"/>
+            <w:tcW w:w="2471" w:type="dxa"/>
             <w:tcMar>
               <w:top w:w="80" w:type="dxa"/>
               <w:left w:w="120" w:type="dxa"/>
@@ -2466,7 +2496,7 @@
         </w:trPr>
         <w:tc>
           <w:tcPr>
-            <w:tcW w:w="846" w:type="dxa"/>
+            <w:tcW w:w="1131" w:type="dxa"/>
             <w:tcMar>
               <w:top w:w="80" w:type="dxa"/>
               <w:left w:w="120" w:type="dxa"/>
@@ -2490,7 +2520,7 @@
         </w:tc>
         <w:tc>
           <w:tcPr>
-            <w:tcW w:w="6946" w:type="dxa"/>
+            <w:tcW w:w="6883" w:type="dxa"/>
             <w:tcMar>
               <w:top w:w="80" w:type="dxa"/>
               <w:left w:w="120" w:type="dxa"/>
@@ -2514,7 +2544,7 @@
         </w:tc>
         <w:tc>
           <w:tcPr>
-            <w:tcW w:w="2268" w:type="dxa"/>
+            <w:tcW w:w="2471" w:type="dxa"/>
             <w:tcMar>
               <w:top w:w="80" w:type="dxa"/>
               <w:left w:w="120" w:type="dxa"/>
@@ -2543,7 +2573,7 @@
         </w:trPr>
         <w:tc>
           <w:tcPr>
-            <w:tcW w:w="846" w:type="dxa"/>
+            <w:tcW w:w="1131" w:type="dxa"/>
             <w:tcMar>
               <w:top w:w="80" w:type="dxa"/>
               <w:left w:w="120" w:type="dxa"/>
@@ -2567,7 +2597,7 @@
         </w:tc>
         <w:tc>
           <w:tcPr>
-            <w:tcW w:w="6946" w:type="dxa"/>
+            <w:tcW w:w="6883" w:type="dxa"/>
             <w:tcMar>
               <w:top w:w="80" w:type="dxa"/>
               <w:left w:w="120" w:type="dxa"/>
@@ -2627,7 +2657,7 @@
         </w:tc>
         <w:tc>
           <w:tcPr>
-            <w:tcW w:w="2268" w:type="dxa"/>
+            <w:tcW w:w="2471" w:type="dxa"/>
             <w:tcMar>
               <w:top w:w="80" w:type="dxa"/>
               <w:left w:w="120" w:type="dxa"/>
@@ -2650,7 +2680,7 @@
         </w:trPr>
         <w:tc>
           <w:tcPr>
-            <w:tcW w:w="846" w:type="dxa"/>
+            <w:tcW w:w="1131" w:type="dxa"/>
             <w:tcMar>
               <w:top w:w="80" w:type="dxa"/>
               <w:left w:w="120" w:type="dxa"/>
@@ -2674,7 +2704,7 @@
         </w:tc>
         <w:tc>
           <w:tcPr>
-            <w:tcW w:w="6946" w:type="dxa"/>
+            <w:tcW w:w="6883" w:type="dxa"/>
             <w:tcMar>
               <w:top w:w="80" w:type="dxa"/>
               <w:left w:w="120" w:type="dxa"/>
@@ -2698,7 +2728,7 @@
         </w:tc>
         <w:tc>
           <w:tcPr>
-            <w:tcW w:w="2268" w:type="dxa"/>
+            <w:tcW w:w="2471" w:type="dxa"/>
             <w:tcMar>
               <w:top w:w="80" w:type="dxa"/>
               <w:left w:w="120" w:type="dxa"/>
@@ -2721,7 +2751,7 @@
         </w:trPr>
         <w:tc>
           <w:tcPr>
-            <w:tcW w:w="846" w:type="dxa"/>
+            <w:tcW w:w="1131" w:type="dxa"/>
             <w:tcMar>
               <w:top w:w="80" w:type="dxa"/>
               <w:left w:w="120" w:type="dxa"/>
@@ -2745,7 +2775,7 @@
         </w:tc>
         <w:tc>
           <w:tcPr>
-            <w:tcW w:w="6946" w:type="dxa"/>
+            <w:tcW w:w="6883" w:type="dxa"/>
             <w:tcMar>
               <w:top w:w="80" w:type="dxa"/>
               <w:left w:w="120" w:type="dxa"/>
@@ -2769,7 +2799,7 @@
         </w:tc>
         <w:tc>
           <w:tcPr>
-            <w:tcW w:w="2268" w:type="dxa"/>
+            <w:tcW w:w="2471" w:type="dxa"/>
             <w:tcMar>
               <w:top w:w="80" w:type="dxa"/>
               <w:left w:w="120" w:type="dxa"/>
@@ -2792,7 +2822,7 @@
         </w:trPr>
         <w:tc>
           <w:tcPr>
-            <w:tcW w:w="846" w:type="dxa"/>
+            <w:tcW w:w="1131" w:type="dxa"/>
             <w:tcMar>
               <w:top w:w="80" w:type="dxa"/>
               <w:left w:w="120" w:type="dxa"/>
@@ -2816,7 +2846,7 @@
         </w:tc>
         <w:tc>
           <w:tcPr>
-            <w:tcW w:w="6946" w:type="dxa"/>
+            <w:tcW w:w="6883" w:type="dxa"/>
             <w:tcMar>
               <w:top w:w="80" w:type="dxa"/>
               <w:left w:w="120" w:type="dxa"/>
@@ -2852,7 +2882,7 @@
         </w:tc>
         <w:tc>
           <w:tcPr>
-            <w:tcW w:w="2268" w:type="dxa"/>
+            <w:tcW w:w="2471" w:type="dxa"/>
             <w:tcMar>
               <w:top w:w="80" w:type="dxa"/>
               <w:left w:w="120" w:type="dxa"/>
@@ -2875,7 +2905,7 @@
         </w:trPr>
         <w:tc>
           <w:tcPr>
-            <w:tcW w:w="846" w:type="dxa"/>
+            <w:tcW w:w="1131" w:type="dxa"/>
             <w:tcMar>
               <w:top w:w="80" w:type="dxa"/>
               <w:left w:w="120" w:type="dxa"/>
@@ -2900,7 +2930,7 @@
         </w:tc>
         <w:tc>
           <w:tcPr>
-            <w:tcW w:w="6946" w:type="dxa"/>
+            <w:tcW w:w="6883" w:type="dxa"/>
             <w:tcMar>
               <w:top w:w="80" w:type="dxa"/>
               <w:left w:w="120" w:type="dxa"/>
@@ -2924,7 +2954,7 @@
         </w:tc>
         <w:tc>
           <w:tcPr>
-            <w:tcW w:w="2268" w:type="dxa"/>
+            <w:tcW w:w="2471" w:type="dxa"/>
             <w:tcMar>
               <w:top w:w="80" w:type="dxa"/>
               <w:left w:w="120" w:type="dxa"/>
@@ -2947,7 +2977,7 @@
         </w:trPr>
         <w:tc>
           <w:tcPr>
-            <w:tcW w:w="846" w:type="dxa"/>
+            <w:tcW w:w="1131" w:type="dxa"/>
             <w:tcMar>
               <w:top w:w="80" w:type="dxa"/>
               <w:left w:w="120" w:type="dxa"/>
@@ -2971,7 +3001,7 @@
         </w:tc>
         <w:tc>
           <w:tcPr>
-            <w:tcW w:w="6946" w:type="dxa"/>
+            <w:tcW w:w="6883" w:type="dxa"/>
             <w:tcMar>
               <w:top w:w="80" w:type="dxa"/>
               <w:left w:w="120" w:type="dxa"/>
@@ -2995,7 +3025,7 @@
         </w:tc>
         <w:tc>
           <w:tcPr>
-            <w:tcW w:w="2268" w:type="dxa"/>
+            <w:tcW w:w="2471" w:type="dxa"/>
             <w:tcMar>
               <w:top w:w="80" w:type="dxa"/>
               <w:left w:w="120" w:type="dxa"/>
@@ -3018,7 +3048,7 @@
         </w:trPr>
         <w:tc>
           <w:tcPr>
-            <w:tcW w:w="846" w:type="dxa"/>
+            <w:tcW w:w="1131" w:type="dxa"/>
             <w:tcMar>
               <w:top w:w="80" w:type="dxa"/>
               <w:left w:w="120" w:type="dxa"/>
@@ -3042,7 +3072,7 @@
         </w:tc>
         <w:tc>
           <w:tcPr>
-            <w:tcW w:w="6946" w:type="dxa"/>
+            <w:tcW w:w="6883" w:type="dxa"/>
             <w:tcMar>
               <w:top w:w="80" w:type="dxa"/>
               <w:left w:w="120" w:type="dxa"/>
@@ -3101,7 +3131,7 @@
         </w:tc>
         <w:tc>
           <w:tcPr>
-            <w:tcW w:w="2268" w:type="dxa"/>
+            <w:tcW w:w="2471" w:type="dxa"/>
             <w:tcMar>
               <w:top w:w="80" w:type="dxa"/>
               <w:left w:w="120" w:type="dxa"/>
@@ -3145,7 +3175,7 @@
         </w:trPr>
         <w:tc>
           <w:tcPr>
-            <w:tcW w:w="846" w:type="dxa"/>
+            <w:tcW w:w="1131" w:type="dxa"/>
             <w:tcMar>
               <w:top w:w="80" w:type="dxa"/>
               <w:left w:w="120" w:type="dxa"/>
@@ -3169,7 +3199,7 @@
         </w:tc>
         <w:tc>
           <w:tcPr>
-            <w:tcW w:w="6946" w:type="dxa"/>
+            <w:tcW w:w="6883" w:type="dxa"/>
             <w:tcMar>
               <w:top w:w="80" w:type="dxa"/>
               <w:left w:w="120" w:type="dxa"/>
@@ -3234,7 +3264,7 @@
         </w:tc>
         <w:tc>
           <w:tcPr>
-            <w:tcW w:w="2268" w:type="dxa"/>
+            <w:tcW w:w="2471" w:type="dxa"/>
             <w:tcMar>
               <w:top w:w="80" w:type="dxa"/>
               <w:left w:w="120" w:type="dxa"/>
@@ -3276,7 +3306,7 @@
         </w:trPr>
         <w:tc>
           <w:tcPr>
-            <w:tcW w:w="846" w:type="dxa"/>
+            <w:tcW w:w="1131" w:type="dxa"/>
             <w:tcMar>
               <w:top w:w="80" w:type="dxa"/>
               <w:left w:w="120" w:type="dxa"/>
@@ -3300,7 +3330,7 @@
         </w:tc>
         <w:tc>
           <w:tcPr>
-            <w:tcW w:w="6946" w:type="dxa"/>
+            <w:tcW w:w="6883" w:type="dxa"/>
             <w:tcMar>
               <w:top w:w="80" w:type="dxa"/>
               <w:left w:w="120" w:type="dxa"/>
@@ -3363,7 +3393,7 @@
         </w:tc>
         <w:tc>
           <w:tcPr>
-            <w:tcW w:w="2268" w:type="dxa"/>
+            <w:tcW w:w="2471" w:type="dxa"/>
             <w:tcMar>
               <w:top w:w="80" w:type="dxa"/>
               <w:left w:w="120" w:type="dxa"/>
@@ -3407,7 +3437,7 @@
         </w:trPr>
         <w:tc>
           <w:tcPr>
-            <w:tcW w:w="846" w:type="dxa"/>
+            <w:tcW w:w="1131" w:type="dxa"/>
             <w:tcMar>
               <w:top w:w="80" w:type="dxa"/>
               <w:left w:w="120" w:type="dxa"/>
@@ -3431,7 +3461,7 @@
         </w:tc>
         <w:tc>
           <w:tcPr>
-            <w:tcW w:w="6946" w:type="dxa"/>
+            <w:tcW w:w="6883" w:type="dxa"/>
             <w:tcMar>
               <w:top w:w="80" w:type="dxa"/>
               <w:left w:w="120" w:type="dxa"/>
@@ -3494,7 +3524,7 @@
         </w:tc>
         <w:tc>
           <w:tcPr>
-            <w:tcW w:w="2268" w:type="dxa"/>
+            <w:tcW w:w="2471" w:type="dxa"/>
             <w:tcMar>
               <w:top w:w="80" w:type="dxa"/>
               <w:left w:w="120" w:type="dxa"/>
@@ -3536,7 +3566,7 @@
         </w:trPr>
         <w:tc>
           <w:tcPr>
-            <w:tcW w:w="846" w:type="dxa"/>
+            <w:tcW w:w="1131" w:type="dxa"/>
             <w:tcMar>
               <w:top w:w="80" w:type="dxa"/>
               <w:left w:w="120" w:type="dxa"/>
@@ -3560,7 +3590,7 @@
         </w:tc>
         <w:tc>
           <w:tcPr>
-            <w:tcW w:w="6946" w:type="dxa"/>
+            <w:tcW w:w="6883" w:type="dxa"/>
             <w:tcMar>
               <w:top w:w="80" w:type="dxa"/>
               <w:left w:w="120" w:type="dxa"/>
@@ -3605,7 +3635,7 @@
         </w:tc>
         <w:tc>
           <w:tcPr>
-            <w:tcW w:w="2268" w:type="dxa"/>
+            <w:tcW w:w="2471" w:type="dxa"/>
             <w:tcMar>
               <w:top w:w="80" w:type="dxa"/>
               <w:left w:w="120" w:type="dxa"/>
@@ -3647,7 +3677,7 @@
         </w:trPr>
         <w:tc>
           <w:tcPr>
-            <w:tcW w:w="846" w:type="dxa"/>
+            <w:tcW w:w="1131" w:type="dxa"/>
             <w:tcMar>
               <w:top w:w="80" w:type="dxa"/>
               <w:left w:w="120" w:type="dxa"/>
@@ -3671,7 +3701,7 @@
         </w:tc>
         <w:tc>
           <w:tcPr>
-            <w:tcW w:w="6946" w:type="dxa"/>
+            <w:tcW w:w="6883" w:type="dxa"/>
             <w:tcMar>
               <w:top w:w="80" w:type="dxa"/>
               <w:left w:w="120" w:type="dxa"/>
@@ -3695,7 +3725,7 @@
         </w:tc>
         <w:tc>
           <w:tcPr>
-            <w:tcW w:w="2268" w:type="dxa"/>
+            <w:tcW w:w="2471" w:type="dxa"/>
             <w:tcMar>
               <w:top w:w="80" w:type="dxa"/>
               <w:left w:w="120" w:type="dxa"/>
@@ -3748,8 +3778,8 @@
     <w:tbl>
       <w:tblPr>
         <w:tblStyle w:val="TableGrid"/>
-        <w:tblW w:w="10036" w:type="dxa"/>
-        <w:tblInd w:w="-5" w:type="dxa"/>
+        <w:tblW w:w="10490" w:type="dxa"/>
+        <w:tblInd w:w="-289" w:type="dxa"/>
         <w:tblCellMar>
           <w:top w:w="14" w:type="dxa"/>
           <w:left w:w="28" w:type="dxa"/>
@@ -3758,15 +3788,15 @@
         <w:tblLook w:val="04A0" w:firstRow="1" w:lastRow="0" w:firstColumn="1" w:lastColumn="0" w:noHBand="0" w:noVBand="1"/>
       </w:tblPr>
       <w:tblGrid>
-        <w:gridCol w:w="2029"/>
-        <w:gridCol w:w="1591"/>
-        <w:gridCol w:w="916"/>
-        <w:gridCol w:w="851"/>
-        <w:gridCol w:w="850"/>
-        <w:gridCol w:w="851"/>
+        <w:gridCol w:w="2127"/>
+        <w:gridCol w:w="1276"/>
         <w:gridCol w:w="992"/>
         <w:gridCol w:w="992"/>
-        <w:gridCol w:w="964"/>
+        <w:gridCol w:w="993"/>
+        <w:gridCol w:w="992"/>
+        <w:gridCol w:w="992"/>
+        <w:gridCol w:w="1134"/>
+        <w:gridCol w:w="992"/>
       </w:tblGrid>
       <w:tr>
         <w:trPr>
@@ -3774,7 +3804,7 @@
         </w:trPr>
         <w:tc>
           <w:tcPr>
-            <w:tcW w:w="2029" w:type="dxa"/>
+            <w:tcW w:w="2127" w:type="dxa"/>
             <w:tcBorders>
               <w:top w:val="single" w:sz="4" w:space="0" w:color="000000"/>
               <w:left w:val="single" w:sz="4" w:space="0" w:color="000000"/>
@@ -3808,7 +3838,7 @@
         </w:tc>
         <w:tc>
           <w:tcPr>
-            <w:tcW w:w="1591" w:type="dxa"/>
+            <w:tcW w:w="1276" w:type="dxa"/>
             <w:tcBorders>
               <w:top w:val="single" w:sz="4" w:space="0" w:color="000000"/>
               <w:left w:val="single" w:sz="4" w:space="0" w:color="000000"/>
@@ -3838,150 +3868,6 @@
                 <w:szCs w:val="18"/>
               </w:rPr>
               <w:t>No of Users</w:t>
-            </w:r>
-          </w:p>
-        </w:tc>
-        <w:tc>
-          <w:tcPr>
-            <w:tcW w:w="916" w:type="dxa"/>
-            <w:tcBorders>
-              <w:top w:val="single" w:sz="4" w:space="0" w:color="000000"/>
-              <w:left w:val="single" w:sz="4" w:space="0" w:color="000000"/>
-              <w:bottom w:val="single" w:sz="5" w:space="0" w:color="000000"/>
-              <w:right w:val="single" w:sz="4" w:space="0" w:color="000000"/>
-            </w:tcBorders>
-            <w:shd w:val="clear" w:color="auto" w:fill="D1D1D1" w:themeFill="background2" w:themeFillShade="E6"/>
-          </w:tcPr>
-          <w:p>
-            <w:pPr>
-              <w:spacing w:line="259" w:lineRule="auto"/>
-              <w:ind w:left="28"/>
-              <w:jc w:val="center"/>
-              <w:rPr>
-                <w:rFonts w:ascii="Times New Roman" w:hAnsi="Times New Roman" w:cs="Times New Roman"/>
-                <w:b/>
-                <w:bCs/>
-                <w:sz w:val="18"/>
-                <w:szCs w:val="18"/>
-              </w:rPr>
-            </w:pPr>
-            <w:r>
-              <w:rPr>
-                <w:rFonts w:ascii="Times New Roman" w:hAnsi="Times New Roman" w:cs="Times New Roman"/>
-                <w:b/>
-                <w:bCs/>
-                <w:sz w:val="18"/>
-                <w:szCs w:val="18"/>
-              </w:rPr>
-              <w:t>Y1</w:t>
-            </w:r>
-          </w:p>
-        </w:tc>
-        <w:tc>
-          <w:tcPr>
-            <w:tcW w:w="851" w:type="dxa"/>
-            <w:tcBorders>
-              <w:top w:val="single" w:sz="4" w:space="0" w:color="000000"/>
-              <w:left w:val="single" w:sz="4" w:space="0" w:color="000000"/>
-              <w:bottom w:val="single" w:sz="5" w:space="0" w:color="000000"/>
-              <w:right w:val="single" w:sz="4" w:space="0" w:color="000000"/>
-            </w:tcBorders>
-            <w:shd w:val="clear" w:color="auto" w:fill="D1D1D1" w:themeFill="background2" w:themeFillShade="E6"/>
-          </w:tcPr>
-          <w:p>
-            <w:pPr>
-              <w:spacing w:line="259" w:lineRule="auto"/>
-              <w:ind w:left="32"/>
-              <w:jc w:val="center"/>
-              <w:rPr>
-                <w:rFonts w:ascii="Times New Roman" w:hAnsi="Times New Roman" w:cs="Times New Roman"/>
-                <w:b/>
-                <w:bCs/>
-                <w:sz w:val="18"/>
-                <w:szCs w:val="18"/>
-              </w:rPr>
-            </w:pPr>
-            <w:r>
-              <w:rPr>
-                <w:rFonts w:ascii="Times New Roman" w:hAnsi="Times New Roman" w:cs="Times New Roman"/>
-                <w:b/>
-                <w:bCs/>
-                <w:sz w:val="18"/>
-                <w:szCs w:val="18"/>
-              </w:rPr>
-              <w:t>Y2</w:t>
-            </w:r>
-          </w:p>
-        </w:tc>
-        <w:tc>
-          <w:tcPr>
-            <w:tcW w:w="850" w:type="dxa"/>
-            <w:tcBorders>
-              <w:top w:val="single" w:sz="4" w:space="0" w:color="000000"/>
-              <w:left w:val="single" w:sz="4" w:space="0" w:color="000000"/>
-              <w:bottom w:val="single" w:sz="5" w:space="0" w:color="000000"/>
-              <w:right w:val="single" w:sz="4" w:space="0" w:color="000000"/>
-            </w:tcBorders>
-            <w:shd w:val="clear" w:color="auto" w:fill="D1D1D1" w:themeFill="background2" w:themeFillShade="E6"/>
-          </w:tcPr>
-          <w:p>
-            <w:pPr>
-              <w:spacing w:line="259" w:lineRule="auto"/>
-              <w:ind w:left="33"/>
-              <w:jc w:val="center"/>
-              <w:rPr>
-                <w:rFonts w:ascii="Times New Roman" w:hAnsi="Times New Roman" w:cs="Times New Roman"/>
-                <w:b/>
-                <w:bCs/>
-                <w:sz w:val="18"/>
-                <w:szCs w:val="18"/>
-              </w:rPr>
-            </w:pPr>
-            <w:r>
-              <w:rPr>
-                <w:rFonts w:ascii="Times New Roman" w:hAnsi="Times New Roman" w:cs="Times New Roman"/>
-                <w:b/>
-                <w:bCs/>
-                <w:sz w:val="18"/>
-                <w:szCs w:val="18"/>
-              </w:rPr>
-              <w:t>Y3</w:t>
-            </w:r>
-          </w:p>
-        </w:tc>
-        <w:tc>
-          <w:tcPr>
-            <w:tcW w:w="851" w:type="dxa"/>
-            <w:tcBorders>
-              <w:top w:val="single" w:sz="4" w:space="0" w:color="000000"/>
-              <w:left w:val="single" w:sz="4" w:space="0" w:color="000000"/>
-              <w:bottom w:val="single" w:sz="5" w:space="0" w:color="000000"/>
-              <w:right w:val="single" w:sz="4" w:space="0" w:color="000000"/>
-            </w:tcBorders>
-            <w:shd w:val="clear" w:color="auto" w:fill="D1D1D1" w:themeFill="background2" w:themeFillShade="E6"/>
-          </w:tcPr>
-          <w:p>
-            <w:pPr>
-              <w:spacing w:line="259" w:lineRule="auto"/>
-              <w:ind w:left="31"/>
-              <w:jc w:val="center"/>
-              <w:rPr>
-                <w:rFonts w:ascii="Times New Roman" w:hAnsi="Times New Roman" w:cs="Times New Roman"/>
-                <w:b/>
-                <w:bCs/>
-                <w:sz w:val="18"/>
-                <w:szCs w:val="18"/>
-              </w:rPr>
-            </w:pPr>
-            <w:r>
-              <w:rPr>
-                <w:rFonts w:ascii="Times New Roman" w:hAnsi="Times New Roman" w:cs="Times New Roman"/>
-                <w:b/>
-                <w:bCs/>
-                <w:sz w:val="18"/>
-                <w:szCs w:val="18"/>
-              </w:rPr>
-              <w:t>Y4</w:t>
             </w:r>
           </w:p>
         </w:tc>
@@ -3999,7 +3885,7 @@
           <w:p>
             <w:pPr>
               <w:spacing w:line="259" w:lineRule="auto"/>
-              <w:ind w:left="32"/>
+              <w:ind w:left="28"/>
               <w:jc w:val="center"/>
               <w:rPr>
                 <w:rFonts w:ascii="Times New Roman" w:hAnsi="Times New Roman" w:cs="Times New Roman"/>
@@ -4017,13 +3903,157 @@
                 <w:sz w:val="18"/>
                 <w:szCs w:val="18"/>
               </w:rPr>
+              <w:t>Y1</w:t>
+            </w:r>
+          </w:p>
+        </w:tc>
+        <w:tc>
+          <w:tcPr>
+            <w:tcW w:w="992" w:type="dxa"/>
+            <w:tcBorders>
+              <w:top w:val="single" w:sz="4" w:space="0" w:color="000000"/>
+              <w:left w:val="single" w:sz="4" w:space="0" w:color="000000"/>
+              <w:bottom w:val="single" w:sz="5" w:space="0" w:color="000000"/>
+              <w:right w:val="single" w:sz="4" w:space="0" w:color="000000"/>
+            </w:tcBorders>
+            <w:shd w:val="clear" w:color="auto" w:fill="D1D1D1" w:themeFill="background2" w:themeFillShade="E6"/>
+          </w:tcPr>
+          <w:p>
+            <w:pPr>
+              <w:spacing w:line="259" w:lineRule="auto"/>
+              <w:ind w:left="32"/>
+              <w:jc w:val="center"/>
+              <w:rPr>
+                <w:rFonts w:ascii="Times New Roman" w:hAnsi="Times New Roman" w:cs="Times New Roman"/>
+                <w:b/>
+                <w:bCs/>
+                <w:sz w:val="18"/>
+                <w:szCs w:val="18"/>
+              </w:rPr>
+            </w:pPr>
+            <w:r>
+              <w:rPr>
+                <w:rFonts w:ascii="Times New Roman" w:hAnsi="Times New Roman" w:cs="Times New Roman"/>
+                <w:b/>
+                <w:bCs/>
+                <w:sz w:val="18"/>
+                <w:szCs w:val="18"/>
+              </w:rPr>
+              <w:t>Y2</w:t>
+            </w:r>
+          </w:p>
+        </w:tc>
+        <w:tc>
+          <w:tcPr>
+            <w:tcW w:w="993" w:type="dxa"/>
+            <w:tcBorders>
+              <w:top w:val="single" w:sz="4" w:space="0" w:color="000000"/>
+              <w:left w:val="single" w:sz="4" w:space="0" w:color="000000"/>
+              <w:bottom w:val="single" w:sz="5" w:space="0" w:color="000000"/>
+              <w:right w:val="single" w:sz="4" w:space="0" w:color="000000"/>
+            </w:tcBorders>
+            <w:shd w:val="clear" w:color="auto" w:fill="D1D1D1" w:themeFill="background2" w:themeFillShade="E6"/>
+          </w:tcPr>
+          <w:p>
+            <w:pPr>
+              <w:spacing w:line="259" w:lineRule="auto"/>
+              <w:ind w:left="33"/>
+              <w:jc w:val="center"/>
+              <w:rPr>
+                <w:rFonts w:ascii="Times New Roman" w:hAnsi="Times New Roman" w:cs="Times New Roman"/>
+                <w:b/>
+                <w:bCs/>
+                <w:sz w:val="18"/>
+                <w:szCs w:val="18"/>
+              </w:rPr>
+            </w:pPr>
+            <w:r>
+              <w:rPr>
+                <w:rFonts w:ascii="Times New Roman" w:hAnsi="Times New Roman" w:cs="Times New Roman"/>
+                <w:b/>
+                <w:bCs/>
+                <w:sz w:val="18"/>
+                <w:szCs w:val="18"/>
+              </w:rPr>
+              <w:t>Y3</w:t>
+            </w:r>
+          </w:p>
+        </w:tc>
+        <w:tc>
+          <w:tcPr>
+            <w:tcW w:w="992" w:type="dxa"/>
+            <w:tcBorders>
+              <w:top w:val="single" w:sz="4" w:space="0" w:color="000000"/>
+              <w:left w:val="single" w:sz="4" w:space="0" w:color="000000"/>
+              <w:bottom w:val="single" w:sz="5" w:space="0" w:color="000000"/>
+              <w:right w:val="single" w:sz="4" w:space="0" w:color="000000"/>
+            </w:tcBorders>
+            <w:shd w:val="clear" w:color="auto" w:fill="D1D1D1" w:themeFill="background2" w:themeFillShade="E6"/>
+          </w:tcPr>
+          <w:p>
+            <w:pPr>
+              <w:spacing w:line="259" w:lineRule="auto"/>
+              <w:ind w:left="31"/>
+              <w:jc w:val="center"/>
+              <w:rPr>
+                <w:rFonts w:ascii="Times New Roman" w:hAnsi="Times New Roman" w:cs="Times New Roman"/>
+                <w:b/>
+                <w:bCs/>
+                <w:sz w:val="18"/>
+                <w:szCs w:val="18"/>
+              </w:rPr>
+            </w:pPr>
+            <w:r>
+              <w:rPr>
+                <w:rFonts w:ascii="Times New Roman" w:hAnsi="Times New Roman" w:cs="Times New Roman"/>
+                <w:b/>
+                <w:bCs/>
+                <w:sz w:val="18"/>
+                <w:szCs w:val="18"/>
+              </w:rPr>
+              <w:t>Y4</w:t>
+            </w:r>
+          </w:p>
+        </w:tc>
+        <w:tc>
+          <w:tcPr>
+            <w:tcW w:w="992" w:type="dxa"/>
+            <w:tcBorders>
+              <w:top w:val="single" w:sz="4" w:space="0" w:color="000000"/>
+              <w:left w:val="single" w:sz="4" w:space="0" w:color="000000"/>
+              <w:bottom w:val="single" w:sz="5" w:space="0" w:color="000000"/>
+              <w:right w:val="single" w:sz="4" w:space="0" w:color="000000"/>
+            </w:tcBorders>
+            <w:shd w:val="clear" w:color="auto" w:fill="D1D1D1" w:themeFill="background2" w:themeFillShade="E6"/>
+          </w:tcPr>
+          <w:p>
+            <w:pPr>
+              <w:spacing w:line="259" w:lineRule="auto"/>
+              <w:ind w:left="32"/>
+              <w:jc w:val="center"/>
+              <w:rPr>
+                <w:rFonts w:ascii="Times New Roman" w:hAnsi="Times New Roman" w:cs="Times New Roman"/>
+                <w:b/>
+                <w:bCs/>
+                <w:sz w:val="18"/>
+                <w:szCs w:val="18"/>
+              </w:rPr>
+            </w:pPr>
+            <w:r>
+              <w:rPr>
+                <w:rFonts w:ascii="Times New Roman" w:hAnsi="Times New Roman" w:cs="Times New Roman"/>
+                <w:b/>
+                <w:bCs/>
+                <w:sz w:val="18"/>
+                <w:szCs w:val="18"/>
+              </w:rPr>
               <w:t>Y5</w:t>
             </w:r>
           </w:p>
         </w:tc>
         <w:tc>
           <w:tcPr>
-            <w:tcW w:w="992" w:type="dxa"/>
+            <w:tcW w:w="1134" w:type="dxa"/>
             <w:tcBorders>
               <w:top w:val="single" w:sz="4" w:space="0" w:color="000000"/>
               <w:left w:val="single" w:sz="4" w:space="0" w:color="000000"/>
@@ -4059,7 +4089,7 @@
         </w:tc>
         <w:tc>
           <w:tcPr>
-            <w:tcW w:w="964" w:type="dxa"/>
+            <w:tcW w:w="992" w:type="dxa"/>
             <w:tcBorders>
               <w:top w:val="single" w:sz="4" w:space="0" w:color="000000"/>
               <w:left w:val="single" w:sz="5" w:space="0" w:color="000000"/>
@@ -4100,14 +4130,14 @@
         </w:trPr>
         <w:tc>
           <w:tcPr>
-            <w:tcW w:w="2029" w:type="dxa"/>
+            <w:tcW w:w="2127" w:type="dxa"/>
             <w:tcBorders>
               <w:top w:val="single" w:sz="5" w:space="0" w:color="000000"/>
               <w:left w:val="single" w:sz="4" w:space="0" w:color="000000"/>
               <w:bottom w:val="single" w:sz="5" w:space="0" w:color="000000"/>
               <w:right w:val="single" w:sz="4" w:space="0" w:color="000000"/>
             </w:tcBorders>
-            <w:shd w:val="clear" w:color="auto" w:fill="DAE9F8"/>
+            <w:shd w:val="clear" w:color="auto" w:fill="DAE9F7" w:themeFill="text2" w:themeFillTint="1A"/>
           </w:tcPr>
           <w:p>
             <w:pPr>
@@ -4117,42 +4147,18 @@
                 <w:szCs w:val="18"/>
               </w:rPr>
             </w:pPr>
-            <w:r>
-              <w:rPr>
-                <w:rFonts w:ascii="Times New Roman" w:hAnsi="Times New Roman" w:cs="Times New Roman"/>
-                <w:sz w:val="18"/>
-                <w:szCs w:val="18"/>
-              </w:rPr>
-              <w:t>{{</w:t>
-            </w:r>
-            <w:r>
-              <w:rPr>
-                <w:rFonts w:ascii="Times New Roman" w:hAnsi="Times New Roman" w:cs="Times New Roman"/>
-                <w:sz w:val="18"/>
-                <w:szCs w:val="18"/>
-              </w:rPr>
-              <w:t>M_</w:t>
-            </w:r>
-            <w:r>
-              <w:rPr>
-                <w:rFonts w:ascii="Times New Roman" w:hAnsi="Times New Roman" w:cs="Times New Roman"/>
-                <w:sz w:val="18"/>
-                <w:szCs w:val="18"/>
-              </w:rPr>
-              <w:t>NAME}}</w:t>
-            </w:r>
-          </w:p>
-        </w:tc>
-        <w:tc>
-          <w:tcPr>
-            <w:tcW w:w="1591" w:type="dxa"/>
+          </w:p>
+        </w:tc>
+        <w:tc>
+          <w:tcPr>
+            <w:tcW w:w="1276" w:type="dxa"/>
             <w:tcBorders>
               <w:top w:val="single" w:sz="5" w:space="0" w:color="000000"/>
               <w:left w:val="single" w:sz="4" w:space="0" w:color="000000"/>
               <w:bottom w:val="single" w:sz="5" w:space="0" w:color="000000"/>
               <w:right w:val="single" w:sz="4" w:space="0" w:color="000000"/>
             </w:tcBorders>
-            <w:shd w:val="clear" w:color="auto" w:fill="DAE9F8"/>
+            <w:shd w:val="clear" w:color="auto" w:fill="DAE9F7" w:themeFill="text2" w:themeFillTint="1A"/>
           </w:tcPr>
           <w:p>
             <w:pPr>
@@ -4173,120 +4179,8 @@
                 <w:sz w:val="18"/>
                 <w:szCs w:val="18"/>
               </w:rPr>
-              <w:t>{{NO_OF_USERS}}</w:t>
-            </w:r>
-          </w:p>
-        </w:tc>
-        <w:tc>
-          <w:tcPr>
-            <w:tcW w:w="916" w:type="dxa"/>
-            <w:tcBorders>
-              <w:top w:val="single" w:sz="5" w:space="0" w:color="000000"/>
-              <w:left w:val="single" w:sz="4" w:space="0" w:color="000000"/>
-              <w:bottom w:val="single" w:sz="5" w:space="0" w:color="000000"/>
-              <w:right w:val="single" w:sz="4" w:space="0" w:color="000000"/>
-            </w:tcBorders>
-            <w:shd w:val="clear" w:color="auto" w:fill="DAE9F8"/>
-          </w:tcPr>
-          <w:p>
-            <w:pPr>
-              <w:spacing w:line="259" w:lineRule="auto"/>
-              <w:ind w:left="25"/>
-              <w:jc w:val="both"/>
-              <w:rPr>
-                <w:rFonts w:ascii="Times New Roman" w:hAnsi="Times New Roman" w:cs="Times New Roman"/>
-                <w:sz w:val="18"/>
-                <w:szCs w:val="18"/>
-              </w:rPr>
-            </w:pPr>
-            <w:r>
-              <w:rPr>
-                <w:rFonts w:ascii="Times New Roman" w:hAnsi="Times New Roman" w:cs="Times New Roman"/>
-                <w:sz w:val="18"/>
-                <w:szCs w:val="18"/>
-              </w:rPr>
-              <w:t xml:space="preserve">    </w:t>
-            </w:r>
-          </w:p>
-        </w:tc>
-        <w:tc>
-          <w:tcPr>
-            <w:tcW w:w="851" w:type="dxa"/>
-            <w:tcBorders>
-              <w:top w:val="single" w:sz="5" w:space="0" w:color="000000"/>
-              <w:left w:val="single" w:sz="4" w:space="0" w:color="000000"/>
-              <w:bottom w:val="single" w:sz="5" w:space="0" w:color="000000"/>
-              <w:right w:val="single" w:sz="4" w:space="0" w:color="000000"/>
-            </w:tcBorders>
-            <w:shd w:val="clear" w:color="auto" w:fill="DAE9F8"/>
-          </w:tcPr>
-          <w:p>
-            <w:pPr>
-              <w:spacing w:line="259" w:lineRule="auto"/>
-              <w:ind w:left="25"/>
-              <w:jc w:val="both"/>
-              <w:rPr>
-                <w:rFonts w:ascii="Times New Roman" w:hAnsi="Times New Roman" w:cs="Times New Roman"/>
-                <w:sz w:val="18"/>
-                <w:szCs w:val="18"/>
-              </w:rPr>
-            </w:pPr>
-            <w:r>
-              <w:rPr>
-                <w:rFonts w:ascii="Times New Roman" w:hAnsi="Times New Roman" w:cs="Times New Roman"/>
-                <w:sz w:val="18"/>
-                <w:szCs w:val="18"/>
-              </w:rPr>
-              <w:t xml:space="preserve"> </w:t>
-            </w:r>
-          </w:p>
-        </w:tc>
-        <w:tc>
-          <w:tcPr>
-            <w:tcW w:w="850" w:type="dxa"/>
-            <w:tcBorders>
-              <w:top w:val="single" w:sz="5" w:space="0" w:color="000000"/>
-              <w:left w:val="single" w:sz="4" w:space="0" w:color="000000"/>
-              <w:bottom w:val="single" w:sz="5" w:space="0" w:color="000000"/>
-              <w:right w:val="single" w:sz="4" w:space="0" w:color="000000"/>
-            </w:tcBorders>
-            <w:shd w:val="clear" w:color="auto" w:fill="DAE9F8"/>
-          </w:tcPr>
-          <w:p>
-            <w:pPr>
-              <w:spacing w:line="259" w:lineRule="auto"/>
-              <w:ind w:left="25"/>
-              <w:jc w:val="both"/>
-              <w:rPr>
-                <w:rFonts w:ascii="Times New Roman" w:hAnsi="Times New Roman" w:cs="Times New Roman"/>
-                <w:sz w:val="18"/>
-                <w:szCs w:val="18"/>
-              </w:rPr>
-            </w:pPr>
-          </w:p>
-        </w:tc>
-        <w:tc>
-          <w:tcPr>
-            <w:tcW w:w="851" w:type="dxa"/>
-            <w:tcBorders>
-              <w:top w:val="single" w:sz="5" w:space="0" w:color="000000"/>
-              <w:left w:val="single" w:sz="4" w:space="0" w:color="000000"/>
-              <w:bottom w:val="single" w:sz="5" w:space="0" w:color="000000"/>
-              <w:right w:val="single" w:sz="4" w:space="0" w:color="000000"/>
-            </w:tcBorders>
-            <w:shd w:val="clear" w:color="auto" w:fill="DAE9F8"/>
-          </w:tcPr>
-          <w:p>
-            <w:pPr>
-              <w:spacing w:line="259" w:lineRule="auto"/>
-              <w:ind w:left="25"/>
-              <w:jc w:val="both"/>
-              <w:rPr>
-                <w:rFonts w:ascii="Times New Roman" w:hAnsi="Times New Roman" w:cs="Times New Roman"/>
-                <w:sz w:val="18"/>
-                <w:szCs w:val="18"/>
-              </w:rPr>
-            </w:pPr>
+              <w:t>{{NO_OF_U}}</w:t>
+            </w:r>
           </w:p>
         </w:tc>
         <w:tc>
@@ -4298,7 +4192,7 @@
               <w:bottom w:val="single" w:sz="5" w:space="0" w:color="000000"/>
               <w:right w:val="single" w:sz="4" w:space="0" w:color="000000"/>
             </w:tcBorders>
-            <w:shd w:val="clear" w:color="auto" w:fill="DAE9F8"/>
+            <w:shd w:val="clear" w:color="auto" w:fill="DAE9F7" w:themeFill="text2" w:themeFillTint="1A"/>
           </w:tcPr>
           <w:p>
             <w:pPr>
@@ -4311,18 +4205,130 @@
                 <w:szCs w:val="18"/>
               </w:rPr>
             </w:pPr>
+            <w:r>
+              <w:rPr>
+                <w:rFonts w:ascii="Times New Roman" w:hAnsi="Times New Roman" w:cs="Times New Roman"/>
+                <w:sz w:val="18"/>
+                <w:szCs w:val="18"/>
+              </w:rPr>
+              <w:t xml:space="preserve">    </w:t>
+            </w:r>
           </w:p>
         </w:tc>
         <w:tc>
           <w:tcPr>
             <w:tcW w:w="992" w:type="dxa"/>
+            <w:tcBorders>
+              <w:top w:val="single" w:sz="5" w:space="0" w:color="000000"/>
+              <w:left w:val="single" w:sz="4" w:space="0" w:color="000000"/>
+              <w:bottom w:val="single" w:sz="5" w:space="0" w:color="000000"/>
+              <w:right w:val="single" w:sz="4" w:space="0" w:color="000000"/>
+            </w:tcBorders>
+            <w:shd w:val="clear" w:color="auto" w:fill="DAE9F7" w:themeFill="text2" w:themeFillTint="1A"/>
+          </w:tcPr>
+          <w:p>
+            <w:pPr>
+              <w:spacing w:line="259" w:lineRule="auto"/>
+              <w:ind w:left="25"/>
+              <w:jc w:val="both"/>
+              <w:rPr>
+                <w:rFonts w:ascii="Times New Roman" w:hAnsi="Times New Roman" w:cs="Times New Roman"/>
+                <w:sz w:val="18"/>
+                <w:szCs w:val="18"/>
+              </w:rPr>
+            </w:pPr>
+            <w:r>
+              <w:rPr>
+                <w:rFonts w:ascii="Times New Roman" w:hAnsi="Times New Roman" w:cs="Times New Roman"/>
+                <w:sz w:val="18"/>
+                <w:szCs w:val="18"/>
+              </w:rPr>
+              <w:t xml:space="preserve"> </w:t>
+            </w:r>
+          </w:p>
+        </w:tc>
+        <w:tc>
+          <w:tcPr>
+            <w:tcW w:w="993" w:type="dxa"/>
+            <w:tcBorders>
+              <w:top w:val="single" w:sz="5" w:space="0" w:color="000000"/>
+              <w:left w:val="single" w:sz="4" w:space="0" w:color="000000"/>
+              <w:bottom w:val="single" w:sz="5" w:space="0" w:color="000000"/>
+              <w:right w:val="single" w:sz="4" w:space="0" w:color="000000"/>
+            </w:tcBorders>
+            <w:shd w:val="clear" w:color="auto" w:fill="DAE9F7" w:themeFill="text2" w:themeFillTint="1A"/>
+          </w:tcPr>
+          <w:p>
+            <w:pPr>
+              <w:spacing w:line="259" w:lineRule="auto"/>
+              <w:ind w:left="25"/>
+              <w:jc w:val="both"/>
+              <w:rPr>
+                <w:rFonts w:ascii="Times New Roman" w:hAnsi="Times New Roman" w:cs="Times New Roman"/>
+                <w:sz w:val="18"/>
+                <w:szCs w:val="18"/>
+              </w:rPr>
+            </w:pPr>
+          </w:p>
+        </w:tc>
+        <w:tc>
+          <w:tcPr>
+            <w:tcW w:w="992" w:type="dxa"/>
+            <w:tcBorders>
+              <w:top w:val="single" w:sz="5" w:space="0" w:color="000000"/>
+              <w:left w:val="single" w:sz="4" w:space="0" w:color="000000"/>
+              <w:bottom w:val="single" w:sz="5" w:space="0" w:color="000000"/>
+              <w:right w:val="single" w:sz="4" w:space="0" w:color="000000"/>
+            </w:tcBorders>
+            <w:shd w:val="clear" w:color="auto" w:fill="DAE9F7" w:themeFill="text2" w:themeFillTint="1A"/>
+          </w:tcPr>
+          <w:p>
+            <w:pPr>
+              <w:spacing w:line="259" w:lineRule="auto"/>
+              <w:ind w:left="25"/>
+              <w:jc w:val="both"/>
+              <w:rPr>
+                <w:rFonts w:ascii="Times New Roman" w:hAnsi="Times New Roman" w:cs="Times New Roman"/>
+                <w:sz w:val="18"/>
+                <w:szCs w:val="18"/>
+              </w:rPr>
+            </w:pPr>
+          </w:p>
+        </w:tc>
+        <w:tc>
+          <w:tcPr>
+            <w:tcW w:w="992" w:type="dxa"/>
+            <w:tcBorders>
+              <w:top w:val="single" w:sz="5" w:space="0" w:color="000000"/>
+              <w:left w:val="single" w:sz="4" w:space="0" w:color="000000"/>
+              <w:bottom w:val="single" w:sz="5" w:space="0" w:color="000000"/>
+              <w:right w:val="single" w:sz="4" w:space="0" w:color="000000"/>
+            </w:tcBorders>
+            <w:shd w:val="clear" w:color="auto" w:fill="DAE9F7" w:themeFill="text2" w:themeFillTint="1A"/>
+          </w:tcPr>
+          <w:p>
+            <w:pPr>
+              <w:spacing w:line="259" w:lineRule="auto"/>
+              <w:ind w:left="25"/>
+              <w:jc w:val="both"/>
+              <w:rPr>
+                <w:rFonts w:ascii="Times New Roman" w:hAnsi="Times New Roman" w:cs="Times New Roman"/>
+                <w:sz w:val="18"/>
+                <w:szCs w:val="18"/>
+              </w:rPr>
+            </w:pPr>
+          </w:p>
+        </w:tc>
+        <w:tc>
+          <w:tcPr>
+            <w:tcW w:w="1134" w:type="dxa"/>
             <w:tcBorders>
               <w:top w:val="single" w:sz="5" w:space="0" w:color="000000"/>
               <w:left w:val="single" w:sz="4" w:space="0" w:color="000000"/>
               <w:bottom w:val="single" w:sz="5" w:space="0" w:color="000000"/>
               <w:right w:val="single" w:sz="5" w:space="0" w:color="000000"/>
             </w:tcBorders>
-            <w:shd w:val="clear" w:color="auto" w:fill="DAE9F8"/>
+            <w:shd w:val="clear" w:color="auto" w:fill="DAE9F7" w:themeFill="text2" w:themeFillTint="1A"/>
           </w:tcPr>
           <w:p>
             <w:pPr>
@@ -4338,14 +4344,14 @@
         </w:tc>
         <w:tc>
           <w:tcPr>
-            <w:tcW w:w="964" w:type="dxa"/>
+            <w:tcW w:w="992" w:type="dxa"/>
             <w:tcBorders>
               <w:top w:val="single" w:sz="5" w:space="0" w:color="000000"/>
               <w:left w:val="single" w:sz="5" w:space="0" w:color="000000"/>
               <w:bottom w:val="single" w:sz="5" w:space="0" w:color="000000"/>
               <w:right w:val="single" w:sz="5" w:space="0" w:color="000000"/>
             </w:tcBorders>
-            <w:shd w:val="clear" w:color="auto" w:fill="DAE9F8"/>
+            <w:shd w:val="clear" w:color="auto" w:fill="DAE9F7" w:themeFill="text2" w:themeFillTint="1A"/>
           </w:tcPr>
           <w:p>
             <w:pPr>
@@ -4384,11 +4390,12 @@
     <w:tbl>
       <w:tblPr>
         <w:tblStyle w:val="TableGrid0"/>
-        <w:tblW w:w="10063" w:type="dxa"/>
+        <w:tblW w:w="10490" w:type="dxa"/>
+        <w:tblInd w:w="-289" w:type="dxa"/>
         <w:tblLook w:val="04A0" w:firstRow="1" w:lastRow="0" w:firstColumn="1" w:lastColumn="0" w:noHBand="0" w:noVBand="1"/>
       </w:tblPr>
       <w:tblGrid>
-        <w:gridCol w:w="4162"/>
+        <w:gridCol w:w="4451"/>
         <w:gridCol w:w="744"/>
         <w:gridCol w:w="744"/>
         <w:gridCol w:w="744"/>
@@ -4396,7 +4403,7 @@
         <w:gridCol w:w="744"/>
         <w:gridCol w:w="744"/>
         <w:gridCol w:w="744"/>
-        <w:gridCol w:w="692"/>
+        <w:gridCol w:w="830"/>
       </w:tblGrid>
       <w:tr>
         <w:trPr>
@@ -4404,9 +4411,9 @@
         </w:trPr>
         <w:tc>
           <w:tcPr>
-            <w:tcW w:w="4162" w:type="dxa"/>
+            <w:tcW w:w="4451" w:type="dxa"/>
             <w:vMerge w:val="restart"/>
-            <w:shd w:val="clear" w:color="auto" w:fill="D1D1D1" w:themeFill="background2" w:themeFillShade="E6"/>
+            <w:shd w:val="clear" w:color="auto" w:fill="DAE9F7" w:themeFill="text2" w:themeFillTint="1A"/>
           </w:tcPr>
           <w:p>
             <w:pPr>
@@ -4430,7 +4437,7 @@
           <w:tcPr>
             <w:tcW w:w="2977" w:type="dxa"/>
             <w:gridSpan w:val="4"/>
-            <w:shd w:val="clear" w:color="auto" w:fill="D1D1D1" w:themeFill="background2" w:themeFillShade="E6"/>
+            <w:shd w:val="clear" w:color="auto" w:fill="DAE9F7" w:themeFill="text2" w:themeFillTint="1A"/>
           </w:tcPr>
           <w:p>
             <w:pPr>
@@ -4453,9 +4460,9 @@
         </w:tc>
         <w:tc>
           <w:tcPr>
-            <w:tcW w:w="2924" w:type="dxa"/>
+            <w:tcW w:w="3062" w:type="dxa"/>
             <w:gridSpan w:val="4"/>
-            <w:shd w:val="clear" w:color="auto" w:fill="D1D1D1" w:themeFill="background2" w:themeFillShade="E6"/>
+            <w:shd w:val="clear" w:color="auto" w:fill="DAE9F7" w:themeFill="text2" w:themeFillTint="1A"/>
           </w:tcPr>
           <w:p>
             <w:pPr>
@@ -4483,7 +4490,7 @@
         </w:trPr>
         <w:tc>
           <w:tcPr>
-            <w:tcW w:w="4162" w:type="dxa"/>
+            <w:tcW w:w="4451" w:type="dxa"/>
             <w:vMerge/>
           </w:tcPr>
           <w:p>
@@ -4497,7 +4504,7 @@
         <w:tc>
           <w:tcPr>
             <w:tcW w:w="744" w:type="dxa"/>
-            <w:shd w:val="clear" w:color="auto" w:fill="D1D1D1" w:themeFill="background2" w:themeFillShade="E6"/>
+            <w:shd w:val="clear" w:color="auto" w:fill="DAE9F7" w:themeFill="text2" w:themeFillTint="1A"/>
           </w:tcPr>
           <w:p>
             <w:pPr>
@@ -4520,7 +4527,7 @@
         <w:tc>
           <w:tcPr>
             <w:tcW w:w="744" w:type="dxa"/>
-            <w:shd w:val="clear" w:color="auto" w:fill="D1D1D1" w:themeFill="background2" w:themeFillShade="E6"/>
+            <w:shd w:val="clear" w:color="auto" w:fill="DAE9F7" w:themeFill="text2" w:themeFillTint="1A"/>
           </w:tcPr>
           <w:p>
             <w:pPr>
@@ -4543,7 +4550,7 @@
         <w:tc>
           <w:tcPr>
             <w:tcW w:w="744" w:type="dxa"/>
-            <w:shd w:val="clear" w:color="auto" w:fill="D1D1D1" w:themeFill="background2" w:themeFillShade="E6"/>
+            <w:shd w:val="clear" w:color="auto" w:fill="DAE9F7" w:themeFill="text2" w:themeFillTint="1A"/>
           </w:tcPr>
           <w:p>
             <w:pPr>
@@ -4566,7 +4573,7 @@
         <w:tc>
           <w:tcPr>
             <w:tcW w:w="745" w:type="dxa"/>
-            <w:shd w:val="clear" w:color="auto" w:fill="D1D1D1" w:themeFill="background2" w:themeFillShade="E6"/>
+            <w:shd w:val="clear" w:color="auto" w:fill="DAE9F7" w:themeFill="text2" w:themeFillTint="1A"/>
           </w:tcPr>
           <w:p>
             <w:pPr>
@@ -4589,7 +4596,7 @@
         <w:tc>
           <w:tcPr>
             <w:tcW w:w="744" w:type="dxa"/>
-            <w:shd w:val="clear" w:color="auto" w:fill="D1D1D1" w:themeFill="background2" w:themeFillShade="E6"/>
+            <w:shd w:val="clear" w:color="auto" w:fill="DAE9F7" w:themeFill="text2" w:themeFillTint="1A"/>
           </w:tcPr>
           <w:p>
             <w:pPr>
@@ -4612,7 +4619,7 @@
         <w:tc>
           <w:tcPr>
             <w:tcW w:w="744" w:type="dxa"/>
-            <w:shd w:val="clear" w:color="auto" w:fill="D1D1D1" w:themeFill="background2" w:themeFillShade="E6"/>
+            <w:shd w:val="clear" w:color="auto" w:fill="DAE9F7" w:themeFill="text2" w:themeFillTint="1A"/>
           </w:tcPr>
           <w:p>
             <w:pPr>
@@ -4635,7 +4642,7 @@
         <w:tc>
           <w:tcPr>
             <w:tcW w:w="744" w:type="dxa"/>
-            <w:shd w:val="clear" w:color="auto" w:fill="D1D1D1" w:themeFill="background2" w:themeFillShade="E6"/>
+            <w:shd w:val="clear" w:color="auto" w:fill="DAE9F7" w:themeFill="text2" w:themeFillTint="1A"/>
           </w:tcPr>
           <w:p>
             <w:pPr>
@@ -4657,8 +4664,8 @@
         </w:tc>
         <w:tc>
           <w:tcPr>
-            <w:tcW w:w="692" w:type="dxa"/>
-            <w:shd w:val="clear" w:color="auto" w:fill="D1D1D1" w:themeFill="background2" w:themeFillShade="E6"/>
+            <w:tcW w:w="830" w:type="dxa"/>
+            <w:shd w:val="clear" w:color="auto" w:fill="DAE9F7" w:themeFill="text2" w:themeFillTint="1A"/>
           </w:tcPr>
           <w:p>
             <w:pPr>
@@ -4685,7 +4692,7 @@
         </w:trPr>
         <w:tc>
           <w:tcPr>
-            <w:tcW w:w="10063" w:type="dxa"/>
+            <w:tcW w:w="10490" w:type="dxa"/>
             <w:gridSpan w:val="9"/>
           </w:tcPr>
           <w:p>
@@ -4729,7 +4736,7 @@
         </w:trPr>
         <w:tc>
           <w:tcPr>
-            <w:tcW w:w="4162" w:type="dxa"/>
+            <w:tcW w:w="4451" w:type="dxa"/>
           </w:tcPr>
           <w:p>
             <w:pPr>
@@ -4831,7 +4838,7 @@
         </w:tc>
         <w:tc>
           <w:tcPr>
-            <w:tcW w:w="692" w:type="dxa"/>
+            <w:tcW w:w="830" w:type="dxa"/>
           </w:tcPr>
           <w:p>
             <w:pPr>
@@ -4848,7 +4855,7 @@
         </w:trPr>
         <w:tc>
           <w:tcPr>
-            <w:tcW w:w="4162" w:type="dxa"/>
+            <w:tcW w:w="4451" w:type="dxa"/>
           </w:tcPr>
           <w:p>
             <w:pPr>
@@ -4950,7 +4957,7 @@
         </w:tc>
         <w:tc>
           <w:tcPr>
-            <w:tcW w:w="692" w:type="dxa"/>
+            <w:tcW w:w="830" w:type="dxa"/>
           </w:tcPr>
           <w:p>
             <w:pPr>
@@ -4967,7 +4974,7 @@
         </w:trPr>
         <w:tc>
           <w:tcPr>
-            <w:tcW w:w="4162" w:type="dxa"/>
+            <w:tcW w:w="4451" w:type="dxa"/>
           </w:tcPr>
           <w:p>
             <w:pPr>
@@ -5087,7 +5094,7 @@
         </w:tc>
         <w:tc>
           <w:tcPr>
-            <w:tcW w:w="692" w:type="dxa"/>
+            <w:tcW w:w="830" w:type="dxa"/>
           </w:tcPr>
           <w:p>
             <w:pPr>
@@ -5104,7 +5111,7 @@
         </w:trPr>
         <w:tc>
           <w:tcPr>
-            <w:tcW w:w="4162" w:type="dxa"/>
+            <w:tcW w:w="4451" w:type="dxa"/>
           </w:tcPr>
           <w:p>
             <w:pPr>
@@ -5206,7 +5213,7 @@
         </w:tc>
         <w:tc>
           <w:tcPr>
-            <w:tcW w:w="692" w:type="dxa"/>
+            <w:tcW w:w="830" w:type="dxa"/>
           </w:tcPr>
           <w:p>
             <w:pPr>
@@ -5223,7 +5230,7 @@
         </w:trPr>
         <w:tc>
           <w:tcPr>
-            <w:tcW w:w="4162" w:type="dxa"/>
+            <w:tcW w:w="4451" w:type="dxa"/>
           </w:tcPr>
           <w:p>
             <w:pPr>
@@ -5325,7 +5332,7 @@
         </w:tc>
         <w:tc>
           <w:tcPr>
-            <w:tcW w:w="692" w:type="dxa"/>
+            <w:tcW w:w="830" w:type="dxa"/>
           </w:tcPr>
           <w:p>
             <w:pPr>
@@ -5342,7 +5349,7 @@
         </w:trPr>
         <w:tc>
           <w:tcPr>
-            <w:tcW w:w="4162" w:type="dxa"/>
+            <w:tcW w:w="4451" w:type="dxa"/>
           </w:tcPr>
           <w:p>
             <w:pPr>
@@ -5444,7 +5451,7 @@
         </w:tc>
         <w:tc>
           <w:tcPr>
-            <w:tcW w:w="692" w:type="dxa"/>
+            <w:tcW w:w="830" w:type="dxa"/>
           </w:tcPr>
           <w:p>
             <w:pPr>
@@ -5461,7 +5468,7 @@
         </w:trPr>
         <w:tc>
           <w:tcPr>
-            <w:tcW w:w="4162" w:type="dxa"/>
+            <w:tcW w:w="4451" w:type="dxa"/>
           </w:tcPr>
           <w:p>
             <w:pPr>
@@ -5563,7 +5570,7 @@
         </w:tc>
         <w:tc>
           <w:tcPr>
-            <w:tcW w:w="692" w:type="dxa"/>
+            <w:tcW w:w="830" w:type="dxa"/>
           </w:tcPr>
           <w:p>
             <w:pPr>
@@ -5625,15 +5632,15 @@
     <w:tbl>
       <w:tblPr>
         <w:tblStyle w:val="TableGrid1"/>
-        <w:tblpPr w:leftFromText="180" w:rightFromText="180" w:vertAnchor="text" w:horzAnchor="margin" w:tblpY="57"/>
-        <w:tblW w:w="10060" w:type="dxa"/>
+        <w:tblpPr w:leftFromText="180" w:rightFromText="180" w:vertAnchor="text" w:horzAnchor="margin" w:tblpX="-289" w:tblpY="57"/>
+        <w:tblW w:w="10485" w:type="dxa"/>
         <w:tblLook w:val="04A0" w:firstRow="1" w:lastRow="0" w:firstColumn="1" w:lastColumn="0" w:noHBand="0" w:noVBand="1"/>
       </w:tblPr>
       <w:tblGrid>
-        <w:gridCol w:w="2830"/>
+        <w:gridCol w:w="3119"/>
         <w:gridCol w:w="2127"/>
         <w:gridCol w:w="2551"/>
-        <w:gridCol w:w="2552"/>
+        <w:gridCol w:w="2688"/>
       </w:tblGrid>
       <w:tr>
         <w:trPr>
@@ -5641,7 +5648,7 @@
         </w:trPr>
         <w:tc>
           <w:tcPr>
-            <w:tcW w:w="2830" w:type="dxa"/>
+            <w:tcW w:w="3119" w:type="dxa"/>
           </w:tcPr>
           <w:p>
             <w:pPr>
@@ -5720,7 +5727,7 @@
         </w:tc>
         <w:tc>
           <w:tcPr>
-            <w:tcW w:w="2552" w:type="dxa"/>
+            <w:tcW w:w="2688" w:type="dxa"/>
           </w:tcPr>
           <w:p>
             <w:pPr>
@@ -5751,7 +5758,7 @@
         </w:trPr>
         <w:tc>
           <w:tcPr>
-            <w:tcW w:w="2830" w:type="dxa"/>
+            <w:tcW w:w="3119" w:type="dxa"/>
           </w:tcPr>
           <w:p>
             <w:pPr>
@@ -5817,7 +5824,7 @@
         </w:tc>
         <w:tc>
           <w:tcPr>
-            <w:tcW w:w="2552" w:type="dxa"/>
+            <w:tcW w:w="2688" w:type="dxa"/>
           </w:tcPr>
           <w:p>
             <w:pPr>
@@ -5844,7 +5851,7 @@
         </w:trPr>
         <w:tc>
           <w:tcPr>
-            <w:tcW w:w="2830" w:type="dxa"/>
+            <w:tcW w:w="3119" w:type="dxa"/>
           </w:tcPr>
           <w:p>
             <w:pPr>
@@ -5910,7 +5917,7 @@
         </w:tc>
         <w:tc>
           <w:tcPr>
-            <w:tcW w:w="2552" w:type="dxa"/>
+            <w:tcW w:w="2688" w:type="dxa"/>
           </w:tcPr>
           <w:p>
             <w:pPr>
@@ -6971,12 +6978,8 @@
       </w:r>
     </w:p>
     <w:sectPr>
-      <w:headerReference w:type="even" r:id="rId8"/>
-      <w:headerReference w:type="default" r:id="rId9"/>
-      <w:footerReference w:type="even" r:id="rId10"/>
-      <w:footerReference w:type="default" r:id="rId11"/>
-      <w:headerReference w:type="first" r:id="rId12"/>
-      <w:footerReference w:type="first" r:id="rId13"/>
+      <w:headerReference w:type="default" r:id="rId8"/>
+      <w:footerReference w:type="default" r:id="rId9"/>
       <w:pgSz w:w="12240" w:h="15840"/>
       <w:pgMar w:top="1000" w:right="1100" w:bottom="1000" w:left="1100" w:header="737" w:footer="227" w:gutter="0"/>
       <w:cols w:space="720"/>
@@ -7012,16 +7015,6 @@
 </file>
 
 <file path=word/footer1.xml><?xml version="1.0" encoding="utf-8"?>
-<w:ftr xmlns:wpc="http://schemas.microsoft.com/office/word/2010/wordprocessingCanvas" xmlns:cx="http://schemas.microsoft.com/office/drawing/2014/chartex" xmlns:cx1="http://schemas.microsoft.com/office/drawing/2015/9/8/chartex" xmlns:cx2="http://schemas.microsoft.com/office/drawing/2015/10/21/chartex" xmlns:cx3="http://schemas.microsoft.com/office/drawing/2016/5/9/chartex" xmlns:cx4="http://schemas.microsoft.com/office/drawing/2016/5/10/chartex" xmlns:cx5="http://schemas.microsoft.com/office/drawing/2016/5/11/chartex" xmlns:cx6="http://schemas.microsoft.com/office/drawing/2016/5/12/chartex" xmlns:cx7="http://schemas.microsoft.com/office/drawing/2016/5/13/chartex" xmlns:cx8="http://schemas.microsoft.com/office/drawing/2016/5/14/chartex" xmlns:mc="http://schemas.openxmlformats.org/markup-compatibility/2006" xmlns:aink="http://schemas.microsoft.com/office/drawing/2016/ink" xmlns:am3d="http://schemas.microsoft.com/office/drawing/2017/model3d" xmlns:o="urn:schemas-microsoft-com:office:office" xmlns:oel="http://schemas.microsoft.com/office/2019/extlst" xmlns:r="http://schemas.openxmlformats.org/officeDocument/2006/relationships" xmlns:m="http://schemas.openxmlformats.org/officeDocument/2006/math" xmlns:v="urn:schemas-microsoft-com:vml" xmlns:wp14="http://schemas.microsoft.com/office/word/2010/wordprocessingDrawing" xmlns:wp="http://schemas.openxmlformats.org/drawingml/2006/wordprocessingDrawing" xmlns:w10="urn:schemas-microsoft-com:office:word" xmlns:w="http://schemas.openxmlformats.org/wordprocessingml/2006/main" xmlns:w14="http://schemas.microsoft.com/office/word/2010/wordml" xmlns:w15="http://schemas.microsoft.com/office/word/2012/wordml" xmlns:w16cex="http://schemas.microsoft.com/office/word/2018/wordml/cex" xmlns:w16cid="http://schemas.microsoft.com/office/word/2016/wordml/cid" xmlns:w16="http://schemas.microsoft.com/office/word/2018/wordml" xmlns:w16du="http://schemas.microsoft.com/office/word/2023/wordml/word16du" xmlns:w16sdtdh="http://schemas.microsoft.com/office/word/2020/wordml/sdtdatahash" xmlns:w16sdtfl="http://schemas.microsoft.com/office/word/2024/wordml/sdtformatlock" xmlns:w16se="http://schemas.microsoft.com/office/word/2015/wordml/symex" xmlns:wpg="http://schemas.microsoft.com/office/word/2010/wordprocessingGroup" xmlns:wpi="http://schemas.microsoft.com/office/word/2010/wordprocessingInk" xmlns:wne="http://schemas.microsoft.com/office/word/2006/wordml" xmlns:wps="http://schemas.microsoft.com/office/word/2010/wordprocessingShape" mc:Ignorable="w14 w15 w16se w16cid w16 w16cex w16sdtdh w16sdtfl w16du wp14">
-  <w:p>
-    <w:pPr>
-      <w:pStyle w:val="Footer"/>
-    </w:pPr>
-  </w:p>
-</w:ftr>
-</file>
-
-<file path=word/footer2.xml><?xml version="1.0" encoding="utf-8"?>
 <w:ftr xmlns:wpc="http://schemas.microsoft.com/office/word/2010/wordprocessingCanvas" xmlns:cx="http://schemas.microsoft.com/office/drawing/2014/chartex" xmlns:cx1="http://schemas.microsoft.com/office/drawing/2015/9/8/chartex" xmlns:cx2="http://schemas.microsoft.com/office/drawing/2015/10/21/chartex" xmlns:cx3="http://schemas.microsoft.com/office/drawing/2016/5/9/chartex" xmlns:cx4="http://schemas.microsoft.com/office/drawing/2016/5/10/chartex" xmlns:cx5="http://schemas.microsoft.com/office/drawing/2016/5/11/chartex" xmlns:cx6="http://schemas.microsoft.com/office/drawing/2016/5/12/chartex" xmlns:cx7="http://schemas.microsoft.com/office/drawing/2016/5/13/chartex" xmlns:cx8="http://schemas.microsoft.com/office/drawing/2016/5/14/chartex" xmlns:mc="http://schemas.openxmlformats.org/markup-compatibility/2006" xmlns:aink="http://schemas.microsoft.com/office/drawing/2016/ink" xmlns:am3d="http://schemas.microsoft.com/office/drawing/2017/model3d" xmlns:o="urn:schemas-microsoft-com:office:office" xmlns:oel="http://schemas.microsoft.com/office/2019/extlst" xmlns:r="http://schemas.openxmlformats.org/officeDocument/2006/relationships" xmlns:m="http://schemas.openxmlformats.org/officeDocument/2006/math" xmlns:v="urn:schemas-microsoft-com:vml" xmlns:wp14="http://schemas.microsoft.com/office/word/2010/wordprocessingDrawing" xmlns:wp="http://schemas.openxmlformats.org/drawingml/2006/wordprocessingDrawing" xmlns:w10="urn:schemas-microsoft-com:office:word" xmlns:w="http://schemas.openxmlformats.org/wordprocessingml/2006/main" xmlns:w14="http://schemas.microsoft.com/office/word/2010/wordml" xmlns:w15="http://schemas.microsoft.com/office/word/2012/wordml" xmlns:w16cex="http://schemas.microsoft.com/office/word/2018/wordml/cex" xmlns:w16cid="http://schemas.microsoft.com/office/word/2016/wordml/cid" xmlns:w16="http://schemas.microsoft.com/office/word/2018/wordml" xmlns:w16du="http://schemas.microsoft.com/office/word/2023/wordml/word16du" xmlns:w16sdtdh="http://schemas.microsoft.com/office/word/2020/wordml/sdtdatahash" xmlns:w16sdtfl="http://schemas.microsoft.com/office/word/2024/wordml/sdtformatlock" xmlns:w16se="http://schemas.microsoft.com/office/word/2015/wordml/symex" xmlns:wpg="http://schemas.microsoft.com/office/word/2010/wordprocessingGroup" xmlns:wpi="http://schemas.microsoft.com/office/word/2010/wordprocessingInk" xmlns:wne="http://schemas.microsoft.com/office/word/2006/wordml" xmlns:wps="http://schemas.microsoft.com/office/word/2010/wordprocessingShape" mc:Ignorable="w14 w15 w16se w16cid w16 w16cex w16sdtdh w16sdtfl w16du wp14">
   <w:p>
     <w:pPr>
@@ -7295,16 +7288,6 @@
 </w:ftr>
 </file>
 
-<file path=word/footer3.xml><?xml version="1.0" encoding="utf-8"?>
-<w:ftr xmlns:wpc="http://schemas.microsoft.com/office/word/2010/wordprocessingCanvas" xmlns:cx="http://schemas.microsoft.com/office/drawing/2014/chartex" xmlns:cx1="http://schemas.microsoft.com/office/drawing/2015/9/8/chartex" xmlns:cx2="http://schemas.microsoft.com/office/drawing/2015/10/21/chartex" xmlns:cx3="http://schemas.microsoft.com/office/drawing/2016/5/9/chartex" xmlns:cx4="http://schemas.microsoft.com/office/drawing/2016/5/10/chartex" xmlns:cx5="http://schemas.microsoft.com/office/drawing/2016/5/11/chartex" xmlns:cx6="http://schemas.microsoft.com/office/drawing/2016/5/12/chartex" xmlns:cx7="http://schemas.microsoft.com/office/drawing/2016/5/13/chartex" xmlns:cx8="http://schemas.microsoft.com/office/drawing/2016/5/14/chartex" xmlns:mc="http://schemas.openxmlformats.org/markup-compatibility/2006" xmlns:aink="http://schemas.microsoft.com/office/drawing/2016/ink" xmlns:am3d="http://schemas.microsoft.com/office/drawing/2017/model3d" xmlns:o="urn:schemas-microsoft-com:office:office" xmlns:oel="http://schemas.microsoft.com/office/2019/extlst" xmlns:r="http://schemas.openxmlformats.org/officeDocument/2006/relationships" xmlns:m="http://schemas.openxmlformats.org/officeDocument/2006/math" xmlns:v="urn:schemas-microsoft-com:vml" xmlns:wp14="http://schemas.microsoft.com/office/word/2010/wordprocessingDrawing" xmlns:wp="http://schemas.openxmlformats.org/drawingml/2006/wordprocessingDrawing" xmlns:w10="urn:schemas-microsoft-com:office:word" xmlns:w="http://schemas.openxmlformats.org/wordprocessingml/2006/main" xmlns:w14="http://schemas.microsoft.com/office/word/2010/wordml" xmlns:w15="http://schemas.microsoft.com/office/word/2012/wordml" xmlns:w16cex="http://schemas.microsoft.com/office/word/2018/wordml/cex" xmlns:w16cid="http://schemas.microsoft.com/office/word/2016/wordml/cid" xmlns:w16="http://schemas.microsoft.com/office/word/2018/wordml" xmlns:w16du="http://schemas.microsoft.com/office/word/2023/wordml/word16du" xmlns:w16sdtdh="http://schemas.microsoft.com/office/word/2020/wordml/sdtdatahash" xmlns:w16sdtfl="http://schemas.microsoft.com/office/word/2024/wordml/sdtformatlock" xmlns:w16se="http://schemas.microsoft.com/office/word/2015/wordml/symex" xmlns:wpg="http://schemas.microsoft.com/office/word/2010/wordprocessingGroup" xmlns:wpi="http://schemas.microsoft.com/office/word/2010/wordprocessingInk" xmlns:wne="http://schemas.microsoft.com/office/word/2006/wordml" xmlns:wps="http://schemas.microsoft.com/office/word/2010/wordprocessingShape" mc:Ignorable="w14 w15 w16se w16cid w16 w16cex w16sdtdh w16sdtfl w16du wp14">
-  <w:p>
-    <w:pPr>
-      <w:pStyle w:val="Footer"/>
-    </w:pPr>
-  </w:p>
-</w:ftr>
-</file>
-
 <file path=word/footnotes.xml><?xml version="1.0" encoding="utf-8"?>
 <w:footnotes xmlns:wpc="http://schemas.microsoft.com/office/word/2010/wordprocessingCanvas" xmlns:cx="http://schemas.microsoft.com/office/drawing/2014/chartex" xmlns:cx1="http://schemas.microsoft.com/office/drawing/2015/9/8/chartex" xmlns:cx2="http://schemas.microsoft.com/office/drawing/2015/10/21/chartex" xmlns:cx3="http://schemas.microsoft.com/office/drawing/2016/5/9/chartex" xmlns:cx4="http://schemas.microsoft.com/office/drawing/2016/5/10/chartex" xmlns:cx5="http://schemas.microsoft.com/office/drawing/2016/5/11/chartex" xmlns:cx6="http://schemas.microsoft.com/office/drawing/2016/5/12/chartex" xmlns:cx7="http://schemas.microsoft.com/office/drawing/2016/5/13/chartex" xmlns:cx8="http://schemas.microsoft.com/office/drawing/2016/5/14/chartex" xmlns:mc="http://schemas.openxmlformats.org/markup-compatibility/2006" xmlns:aink="http://schemas.microsoft.com/office/drawing/2016/ink" xmlns:am3d="http://schemas.microsoft.com/office/drawing/2017/model3d" xmlns:o="urn:schemas-microsoft-com:office:office" xmlns:oel="http://schemas.microsoft.com/office/2019/extlst" xmlns:r="http://schemas.openxmlformats.org/officeDocument/2006/relationships" xmlns:m="http://schemas.openxmlformats.org/officeDocument/2006/math" xmlns:v="urn:schemas-microsoft-com:vml" xmlns:wp14="http://schemas.microsoft.com/office/word/2010/wordprocessingDrawing" xmlns:wp="http://schemas.openxmlformats.org/drawingml/2006/wordprocessingDrawing" xmlns:w10="urn:schemas-microsoft-com:office:word" xmlns:w="http://schemas.openxmlformats.org/wordprocessingml/2006/main" xmlns:w14="http://schemas.microsoft.com/office/word/2010/wordml" xmlns:w15="http://schemas.microsoft.com/office/word/2012/wordml" xmlns:w16cex="http://schemas.microsoft.com/office/word/2018/wordml/cex" xmlns:w16cid="http://schemas.microsoft.com/office/word/2016/wordml/cid" xmlns:w16="http://schemas.microsoft.com/office/word/2018/wordml" xmlns:w16du="http://schemas.microsoft.com/office/word/2023/wordml/word16du" xmlns:w16sdtdh="http://schemas.microsoft.com/office/word/2020/wordml/sdtdatahash" xmlns:w16sdtfl="http://schemas.microsoft.com/office/word/2024/wordml/sdtformatlock" xmlns:w16se="http://schemas.microsoft.com/office/word/2015/wordml/symex" xmlns:wpg="http://schemas.microsoft.com/office/word/2010/wordprocessingGroup" xmlns:wpi="http://schemas.microsoft.com/office/word/2010/wordprocessingInk" xmlns:wne="http://schemas.microsoft.com/office/word/2006/wordml" xmlns:wps="http://schemas.microsoft.com/office/word/2010/wordprocessingShape" mc:Ignorable="w14 w15 w16se w16cid w16 w16cex w16sdtdh w16sdtfl w16du wp14">
   <w:footnote w:type="separator" w:id="-1">
@@ -7331,16 +7314,6 @@
 </file>
 
 <file path=word/header1.xml><?xml version="1.0" encoding="utf-8"?>
-<w:hdr xmlns:wpc="http://schemas.microsoft.com/office/word/2010/wordprocessingCanvas" xmlns:cx="http://schemas.microsoft.com/office/drawing/2014/chartex" xmlns:cx1="http://schemas.microsoft.com/office/drawing/2015/9/8/chartex" xmlns:cx2="http://schemas.microsoft.com/office/drawing/2015/10/21/chartex" xmlns:cx3="http://schemas.microsoft.com/office/drawing/2016/5/9/chartex" xmlns:cx4="http://schemas.microsoft.com/office/drawing/2016/5/10/chartex" xmlns:cx5="http://schemas.microsoft.com/office/drawing/2016/5/11/chartex" xmlns:cx6="http://schemas.microsoft.com/office/drawing/2016/5/12/chartex" xmlns:cx7="http://schemas.microsoft.com/office/drawing/2016/5/13/chartex" xmlns:cx8="http://schemas.microsoft.com/office/drawing/2016/5/14/chartex" xmlns:mc="http://schemas.openxmlformats.org/markup-compatibility/2006" xmlns:aink="http://schemas.microsoft.com/office/drawing/2016/ink" xmlns:am3d="http://schemas.microsoft.com/office/drawing/2017/model3d" xmlns:o="urn:schemas-microsoft-com:office:office" xmlns:oel="http://schemas.microsoft.com/office/2019/extlst" xmlns:r="http://schemas.openxmlformats.org/officeDocument/2006/relationships" xmlns:m="http://schemas.openxmlformats.org/officeDocument/2006/math" xmlns:v="urn:schemas-microsoft-com:vml" xmlns:wp14="http://schemas.microsoft.com/office/word/2010/wordprocessingDrawing" xmlns:wp="http://schemas.openxmlformats.org/drawingml/2006/wordprocessingDrawing" xmlns:w10="urn:schemas-microsoft-com:office:word" xmlns:w="http://schemas.openxmlformats.org/wordprocessingml/2006/main" xmlns:w14="http://schemas.microsoft.com/office/word/2010/wordml" xmlns:w15="http://schemas.microsoft.com/office/word/2012/wordml" xmlns:w16cex="http://schemas.microsoft.com/office/word/2018/wordml/cex" xmlns:w16cid="http://schemas.microsoft.com/office/word/2016/wordml/cid" xmlns:w16="http://schemas.microsoft.com/office/word/2018/wordml" xmlns:w16du="http://schemas.microsoft.com/office/word/2023/wordml/word16du" xmlns:w16sdtdh="http://schemas.microsoft.com/office/word/2020/wordml/sdtdatahash" xmlns:w16sdtfl="http://schemas.microsoft.com/office/word/2024/wordml/sdtformatlock" xmlns:w16se="http://schemas.microsoft.com/office/word/2015/wordml/symex" xmlns:wpg="http://schemas.microsoft.com/office/word/2010/wordprocessingGroup" xmlns:wpi="http://schemas.microsoft.com/office/word/2010/wordprocessingInk" xmlns:wne="http://schemas.microsoft.com/office/word/2006/wordml" xmlns:wps="http://schemas.microsoft.com/office/word/2010/wordprocessingShape" mc:Ignorable="w14 w15 w16se w16cid w16 w16cex w16sdtdh w16sdtfl w16du wp14">
-  <w:p>
-    <w:pPr>
-      <w:pStyle w:val="Header"/>
-    </w:pPr>
-  </w:p>
-</w:hdr>
-</file>
-
-<file path=word/header2.xml><?xml version="1.0" encoding="utf-8"?>
 <w:hdr xmlns:wpc="http://schemas.microsoft.com/office/word/2010/wordprocessingCanvas" xmlns:cx="http://schemas.microsoft.com/office/drawing/2014/chartex" xmlns:cx1="http://schemas.microsoft.com/office/drawing/2015/9/8/chartex" xmlns:cx2="http://schemas.microsoft.com/office/drawing/2015/10/21/chartex" xmlns:cx3="http://schemas.microsoft.com/office/drawing/2016/5/9/chartex" xmlns:cx4="http://schemas.microsoft.com/office/drawing/2016/5/10/chartex" xmlns:cx5="http://schemas.microsoft.com/office/drawing/2016/5/11/chartex" xmlns:cx6="http://schemas.microsoft.com/office/drawing/2016/5/12/chartex" xmlns:cx7="http://schemas.microsoft.com/office/drawing/2016/5/13/chartex" xmlns:cx8="http://schemas.microsoft.com/office/drawing/2016/5/14/chartex" xmlns:mc="http://schemas.openxmlformats.org/markup-compatibility/2006" xmlns:aink="http://schemas.microsoft.com/office/drawing/2016/ink" xmlns:am3d="http://schemas.microsoft.com/office/drawing/2017/model3d" xmlns:o="urn:schemas-microsoft-com:office:office" xmlns:oel="http://schemas.microsoft.com/office/2019/extlst" xmlns:r="http://schemas.openxmlformats.org/officeDocument/2006/relationships" xmlns:m="http://schemas.openxmlformats.org/officeDocument/2006/math" xmlns:v="urn:schemas-microsoft-com:vml" xmlns:wp14="http://schemas.microsoft.com/office/word/2010/wordprocessingDrawing" xmlns:wp="http://schemas.openxmlformats.org/drawingml/2006/wordprocessingDrawing" xmlns:w10="urn:schemas-microsoft-com:office:word" xmlns:w="http://schemas.openxmlformats.org/wordprocessingml/2006/main" xmlns:w14="http://schemas.microsoft.com/office/word/2010/wordml" xmlns:w15="http://schemas.microsoft.com/office/word/2012/wordml" xmlns:w16cex="http://schemas.microsoft.com/office/word/2018/wordml/cex" xmlns:w16cid="http://schemas.microsoft.com/office/word/2016/wordml/cid" xmlns:w16="http://schemas.microsoft.com/office/word/2018/wordml" xmlns:w16du="http://schemas.microsoft.com/office/word/2023/wordml/word16du" xmlns:w16sdtdh="http://schemas.microsoft.com/office/word/2020/wordml/sdtdatahash" xmlns:w16sdtfl="http://schemas.microsoft.com/office/word/2024/wordml/sdtformatlock" xmlns:w16se="http://schemas.microsoft.com/office/word/2015/wordml/symex" xmlns:wpg="http://schemas.microsoft.com/office/word/2010/wordprocessingGroup" xmlns:wpi="http://schemas.microsoft.com/office/word/2010/wordprocessingInk" xmlns:wne="http://schemas.microsoft.com/office/word/2006/wordml" xmlns:wps="http://schemas.microsoft.com/office/word/2010/wordprocessingShape" mc:Ignorable="w14 w15 w16se w16cid w16 w16cex w16sdtdh w16sdtfl w16du wp14">
   <w:tbl>
     <w:tblPr>
@@ -7555,16 +7528,6 @@
       </w:rPr>
       <w:t xml:space="preserve">           </w:t>
     </w:r>
-  </w:p>
-</w:hdr>
-</file>
-
-<file path=word/header3.xml><?xml version="1.0" encoding="utf-8"?>
-<w:hdr xmlns:wpc="http://schemas.microsoft.com/office/word/2010/wordprocessingCanvas" xmlns:cx="http://schemas.microsoft.com/office/drawing/2014/chartex" xmlns:cx1="http://schemas.microsoft.com/office/drawing/2015/9/8/chartex" xmlns:cx2="http://schemas.microsoft.com/office/drawing/2015/10/21/chartex" xmlns:cx3="http://schemas.microsoft.com/office/drawing/2016/5/9/chartex" xmlns:cx4="http://schemas.microsoft.com/office/drawing/2016/5/10/chartex" xmlns:cx5="http://schemas.microsoft.com/office/drawing/2016/5/11/chartex" xmlns:cx6="http://schemas.microsoft.com/office/drawing/2016/5/12/chartex" xmlns:cx7="http://schemas.microsoft.com/office/drawing/2016/5/13/chartex" xmlns:cx8="http://schemas.microsoft.com/office/drawing/2016/5/14/chartex" xmlns:mc="http://schemas.openxmlformats.org/markup-compatibility/2006" xmlns:aink="http://schemas.microsoft.com/office/drawing/2016/ink" xmlns:am3d="http://schemas.microsoft.com/office/drawing/2017/model3d" xmlns:o="urn:schemas-microsoft-com:office:office" xmlns:oel="http://schemas.microsoft.com/office/2019/extlst" xmlns:r="http://schemas.openxmlformats.org/officeDocument/2006/relationships" xmlns:m="http://schemas.openxmlformats.org/officeDocument/2006/math" xmlns:v="urn:schemas-microsoft-com:vml" xmlns:wp14="http://schemas.microsoft.com/office/word/2010/wordprocessingDrawing" xmlns:wp="http://schemas.openxmlformats.org/drawingml/2006/wordprocessingDrawing" xmlns:w10="urn:schemas-microsoft-com:office:word" xmlns:w="http://schemas.openxmlformats.org/wordprocessingml/2006/main" xmlns:w14="http://schemas.microsoft.com/office/word/2010/wordml" xmlns:w15="http://schemas.microsoft.com/office/word/2012/wordml" xmlns:w16cex="http://schemas.microsoft.com/office/word/2018/wordml/cex" xmlns:w16cid="http://schemas.microsoft.com/office/word/2016/wordml/cid" xmlns:w16="http://schemas.microsoft.com/office/word/2018/wordml" xmlns:w16du="http://schemas.microsoft.com/office/word/2023/wordml/word16du" xmlns:w16sdtdh="http://schemas.microsoft.com/office/word/2020/wordml/sdtdatahash" xmlns:w16sdtfl="http://schemas.microsoft.com/office/word/2024/wordml/sdtformatlock" xmlns:w16se="http://schemas.microsoft.com/office/word/2015/wordml/symex" xmlns:wpg="http://schemas.microsoft.com/office/word/2010/wordprocessingGroup" xmlns:wpi="http://schemas.microsoft.com/office/word/2010/wordprocessingInk" xmlns:wne="http://schemas.microsoft.com/office/word/2006/wordml" xmlns:wps="http://schemas.microsoft.com/office/word/2010/wordprocessingShape" mc:Ignorable="w14 w15 w16se w16cid w16 w16cex w16sdtdh w16sdtfl w16du wp14">
-  <w:p>
-    <w:pPr>
-      <w:pStyle w:val="Header"/>
-    </w:pPr>
   </w:p>
 </w:hdr>
 </file>
@@ -8420,6 +8383,7 @@
   <w:style w:type="character" w:default="1" w:styleId="DefaultParagraphFont">
     <w:name w:val="Default Paragraph Font"/>
     <w:uiPriority w:val="1"/>
+    <w:semiHidden/>
     <w:unhideWhenUsed/>
   </w:style>
   <w:style w:type="table" w:default="1" w:styleId="TableNormal">

</xml_diff>